<commit_message>
Add numerical solver suite (Newton-Raphson/RK4/Brent/Monte-Carlo); expand report with 8 figures + computational-methods chapter; remove em dashes and working-vocabulary from the report
</commit_message>
<xml_diff>
--- a/report/Report_II_Complete.docx
+++ b/report/Report_II_Complete.docx
@@ -7,7 +7,7 @@
         <w:pStyle w:val="Title"/>
       </w:pPr>
       <w:r>
-        <w:t xml:space="preserve">Space-Based AI Data Centers — A Complete Engineering Treatise</w:t>
+        <w:t xml:space="preserve">Space-Based AI Data Centers: Physics, Mathematics, Simulation, and Economics</w:t>
       </w:r>
     </w:p>
     <w:p>
@@ -54,22 +54,22 @@
       </w:r>
     </w:p>
     <w:bookmarkEnd w:id="9"/>
-    <w:bookmarkStart w:id="15" w:name="Xc58ad7804e53dfe39aacb646a3438f14cb00fc6"/>
+    <w:bookmarkStart w:id="15" w:name="X28b2bf3b339e81b4a97f7607c71cb41c89883dc"/>
     <w:p>
       <w:pPr>
         <w:pStyle w:val="Heading1"/>
       </w:pPr>
       <w:r>
-        <w:t xml:space="preserve">A Complete Engineering Treatise: Physics, Mathematics, Simulation, and Economics</w:t>
+        <w:t xml:space="preserve">Physics, Mathematics, Simulation, and Economics of an Orbital Compute Constellation</w:t>
       </w:r>
     </w:p>
-    <w:bookmarkStart w:id="10" w:name="Xa64f18bd16f6f6cdca44580b9429618ba31e13a"/>
+    <w:bookmarkStart w:id="10" w:name="X0fca302d1f2b914d4f84859951de71781469df3"/>
     <w:p>
       <w:pPr>
         <w:pStyle w:val="Heading3"/>
       </w:pPr>
       <w:r>
-        <w:t xml:space="preserve">Report II (Complete Edition) — a book-length systems study</w:t>
+        <w:t xml:space="preserve">An engineering analysis of a space-based AI compute constellation</w:t>
       </w:r>
     </w:p>
     <w:p>
@@ -97,13 +97,13 @@
           <w:b/>
           <w:bCs/>
         </w:rPr>
-        <w:t xml:space="preserve">Edition:</w:t>
-      </w:r>
-      <w:r>
-        <w:t xml:space="preserve"> </w:t>
-      </w:r>
-      <w:r>
-        <w:t xml:space="preserve">June 2026 · verified-data, research-backed, fully reproducible</w:t>
+        <w:t xml:space="preserve">Date:</w:t>
+      </w:r>
+      <w:r>
+        <w:t xml:space="preserve"> </w:t>
+      </w:r>
+      <w:r>
+        <w:t xml:space="preserve">June 2026</w:t>
       </w:r>
       <w:r>
         <w:t xml:space="preserve"> </w:t>
@@ -135,7 +135,7 @@
         <w:t xml:space="preserve"> </w:t>
       </w:r>
       <w:r>
-        <w:t xml:space="preserve">github.com/Samarjithbiswas/space-based-ai-datacenter (17-subsystem model, 108 tests)</w:t>
+        <w:t xml:space="preserve">github.com/Samarjithbiswas/space-based-ai-datacenter (20-module model, 118 tests)</w:t>
       </w:r>
     </w:p>
     <w:p>
@@ -166,7 +166,7 @@
         <w:t xml:space="preserve"> </w:t>
       </w:r>
       <w:r>
-        <w:t xml:space="preserve">2025-2026. This treatise is a single, self-contained engineering volume that derives, from first</w:t>
+        <w:t xml:space="preserve">2025-2026. This document derives, from first</w:t>
       </w:r>
       <w:r>
         <w:t xml:space="preserve"> </w:t>
@@ -178,13 +178,13 @@
         <w:t xml:space="preserve"> </w:t>
       </w:r>
       <w:r>
-        <w:t xml:space="preserve">every model in open and validated code, and reports the results, sensitivities, and predictions.</w:t>
-      </w:r>
-      <w:r>
-        <w:t xml:space="preserve"> </w:t>
-      </w:r>
-      <w:r>
-        <w:t xml:space="preserve">It spans seventeen subsystems — orbital mechanics, the neutral atmosphere and orbital decay, the</w:t>
+        <w:t xml:space="preserve">every model in open and validated code, and reports the results, sensitivities, and forecasts.</w:t>
+      </w:r>
+      <w:r>
+        <w:t xml:space="preserve"> </w:t>
+      </w:r>
+      <w:r>
+        <w:t xml:space="preserve">It spans seventeen subsystems, orbital mechanics, the neutral atmosphere and orbital decay, the</w:t>
       </w:r>
       <w:r>
         <w:t xml:space="preserve"> </w:t>
@@ -202,7 +202,7 @@
         <w:t xml:space="preserve"> </w:t>
       </w:r>
       <w:r>
-        <w:t xml:space="preserve">disposal, reliability, compute and workload, and techno-economics — and closes them into one</w:t>
+        <w:t xml:space="preserve">disposal, reliability, compute and workload, and techno-economics, and closes them into one</w:t>
       </w:r>
       <w:r>
         <w:t xml:space="preserve"> </w:t>
@@ -250,13 +250,7 @@
         <w:t xml:space="preserve"> </w:t>
       </w:r>
       <w:r>
-        <w:t xml:space="preserve">number is flagged as a projection, and every figure and number is regenerated by the accompanying</w:t>
-      </w:r>
-      <w:r>
-        <w:t xml:space="preserve"> </w:t>
-      </w:r>
-      <w:r>
-        <w:t xml:space="preserve">open-source model.</w:t>
+        <w:t xml:space="preserve">number is flagged as a projection, and every figure and number is generated by the accompanying open-source model.</w:t>
       </w:r>
     </w:p>
     <w:p>
@@ -288,10 +282,7 @@
         <w:t xml:space="preserve">Front matter</w:t>
       </w:r>
       <w:r>
-        <w:t xml:space="preserve"> </w:t>
-      </w:r>
-      <w:r>
-        <w:t xml:space="preserve">— Abstract · Nomenclature · Physical constants</w:t>
+        <w:t xml:space="preserve">, Abstract · Nomenclature · Physical constants</w:t>
       </w:r>
     </w:p>
     <w:p>
@@ -303,7 +294,7 @@
           <w:b/>
           <w:bCs/>
         </w:rPr>
-        <w:t xml:space="preserve">Part I — Introduction and context</w:t>
+        <w:t xml:space="preserve">Part I, Introduction and context</w:t>
       </w:r>
       <w:r>
         <w:t xml:space="preserve"> </w:t>
@@ -315,7 +306,7 @@
         <w:t xml:space="preserve"> </w:t>
       </w:r>
       <w:r>
-        <w:t xml:space="preserve">2. The state of the art (verified, 2025-2026)</w:t>
+        <w:t xml:space="preserve">2. The state of the art (2025-2026)</w:t>
       </w:r>
       <w:r>
         <w:t xml:space="preserve"> </w:t>
@@ -333,7 +324,7 @@
           <w:b/>
           <w:bCs/>
         </w:rPr>
-        <w:t xml:space="preserve">Part II — The orbital environment</w:t>
+        <w:t xml:space="preserve">Part II, The orbital environment</w:t>
       </w:r>
       <w:r>
         <w:t xml:space="preserve"> </w:t>
@@ -381,7 +372,7 @@
           <w:b/>
           <w:bCs/>
         </w:rPr>
-        <w:t xml:space="preserve">Part III — Spacecraft subsystems</w:t>
+        <w:t xml:space="preserve">Part III, Spacecraft subsystems</w:t>
       </w:r>
       <w:r>
         <w:t xml:space="preserve"> </w:t>
@@ -441,7 +432,7 @@
           <w:b/>
           <w:bCs/>
         </w:rPr>
-        <w:t xml:space="preserve">Part IV — Integration, simulation, and results</w:t>
+        <w:t xml:space="preserve">Part IV, Integration, simulation, and results</w:t>
       </w:r>
       <w:r>
         <w:t xml:space="preserve"> </w:t>
@@ -471,7 +462,7 @@
           <w:b/>
           <w:bCs/>
         </w:rPr>
-        <w:t xml:space="preserve">Part V — Economics and predictions</w:t>
+        <w:t xml:space="preserve">Part V, Economics and predictions</w:t>
       </w:r>
       <w:r>
         <w:t xml:space="preserve"> </w:t>
@@ -501,13 +492,13 @@
           <w:b/>
           <w:bCs/>
         </w:rPr>
-        <w:t xml:space="preserve">Part VI — Synthesis</w:t>
-      </w:r>
-      <w:r>
-        <w:t xml:space="preserve"> </w:t>
-      </w:r>
-      <w:r>
-        <w:t xml:space="preserve">24. Honest caveats and limitations</w:t>
+        <w:t xml:space="preserve">Part VI, Synthesis</w:t>
+      </w:r>
+      <w:r>
+        <w:t xml:space="preserve"> </w:t>
+      </w:r>
+      <w:r>
+        <w:t xml:space="preserve">24. Caveats and limitations</w:t>
       </w:r>
       <w:r>
         <w:t xml:space="preserve"> </w:t>
@@ -525,7 +516,7 @@
           <w:b/>
           <w:bCs/>
         </w:rPr>
-        <w:t xml:space="preserve">Part VII — Detailed results, data, and worked computations</w:t>
+        <w:t xml:space="preserve">Part VII, Detailed results, data, and worked computations</w:t>
       </w:r>
       <w:r>
         <w:t xml:space="preserve"> </w:t>
@@ -564,10 +555,7 @@
         <w:t xml:space="preserve">Back matter</w:t>
       </w:r>
       <w:r>
-        <w:t xml:space="preserve"> </w:t>
-      </w:r>
-      <w:r>
-        <w:t xml:space="preserve">— References · Appendix A: master equation list · Appendix B: nomenclature ·</w:t>
+        <w:t xml:space="preserve">, References · Appendix A: master equation list · Appendix B: nomenclature ·</w:t>
       </w:r>
       <w:r>
         <w:t xml:space="preserve"> </w:t>
@@ -1226,7 +1214,7 @@
               <w:pStyle w:val="Compact"/>
             </w:pPr>
             <w:r>
-              <w:t xml:space="preserve">– ,</w:t>
+              <w:t xml:space="preserve">–,</w:t>
             </w:r>
             <w:r>
               <w:t xml:space="preserve"> </w:t>
@@ -1387,7 +1375,7 @@
               </m:sSup>
             </m:oMath>
             <w:r>
-              <w:t xml:space="preserve">, – , –</w:t>
+              <w:t xml:space="preserve">, –, –</w:t>
             </w:r>
           </w:p>
         </w:tc>
@@ -1639,7 +1627,7 @@
               </m:sSup>
             </m:oMath>
             <w:r>
-              <w:t xml:space="preserve">, – , –</w:t>
+              <w:t xml:space="preserve">, –, –</w:t>
             </w:r>
           </w:p>
         </w:tc>
@@ -1777,7 +1765,7 @@
               </m:sSup>
             </m:oMath>
             <w:r>
-              <w:t xml:space="preserve">, – ,</w:t>
+              <w:t xml:space="preserve">, –,</w:t>
             </w:r>
             <w:r>
               <w:t xml:space="preserve"> </w:t>
@@ -2242,7 +2230,7 @@
               <w:pStyle w:val="Compact"/>
             </w:pPr>
             <w:r>
-              <w:t xml:space="preserve">– , – , USD</w:t>
+              <w:t xml:space="preserve">–, –, USD</w:t>
             </w:r>
           </w:p>
         </w:tc>
@@ -3191,7 +3179,7 @@
         <w:pStyle w:val="Heading1"/>
       </w:pPr>
       <w:r>
-        <w:t xml:space="preserve">PART I — INTRODUCTION AND CONTEXT</w:t>
+        <w:t xml:space="preserve">PART I, INTRODUCTION AND CONTEXT</w:t>
       </w:r>
     </w:p>
     <w:bookmarkStart w:id="16" w:name="introduction-and-motivation"/>
@@ -3270,7 +3258,7 @@
         <w:pStyle w:val="BodyText"/>
       </w:pPr>
       <w:r>
-        <w:t xml:space="preserve">The purpose of this treatise is neither advocacy nor dismissal. It is to build the complete</w:t>
+        <w:t xml:space="preserve">The purpose of this analysis is neither advocacy nor dismissal. It is to build the complete</w:t>
       </w:r>
       <w:r>
         <w:t xml:space="preserve"> </w:t>
@@ -3282,19 +3270,19 @@
         <w:t xml:space="preserve"> </w:t>
       </w:r>
       <w:r>
-        <w:t xml:space="preserve">honestly, and to state plainly which problems are solved and which are not. The first report in this</w:t>
-      </w:r>
-      <w:r>
-        <w:t xml:space="preserve"> </w:t>
-      </w:r>
-      <w:r>
-        <w:t xml:space="preserve">series (November 2025) examined a single question — whether passive radiative cooling can keep a</w:t>
-      </w:r>
-      <w:r>
-        <w:t xml:space="preserve"> </w:t>
-      </w:r>
-      <w:r>
-        <w:t xml:space="preserve">processor within its junction-temperature limit in low Earth orbit — and answered yes. This complete</w:t>
+        <w:t xml:space="preserve">carefully, and to state plainly which problems are solved and which are not. The first report in this</w:t>
+      </w:r>
+      <w:r>
+        <w:t xml:space="preserve"> </w:t>
+      </w:r>
+      <w:r>
+        <w:t xml:space="preserve">series (November 2025) examined a single question, whether passive radiative cooling can keep a</w:t>
+      </w:r>
+      <w:r>
+        <w:t xml:space="preserve"> </w:t>
+      </w:r>
+      <w:r>
+        <w:t xml:space="preserve">processor within its junction-temperature limit in low Earth orbit, and answered yes. This complete</w:t>
       </w:r>
       <w:r>
         <w:t xml:space="preserve"> </w:t>
@@ -3348,13 +3336,13 @@
       </w:r>
     </w:p>
     <w:bookmarkEnd w:id="16"/>
-    <w:bookmarkStart w:id="17" w:name="the-state-of-the-art-verified-2025-2026"/>
+    <w:bookmarkStart w:id="17" w:name="the-state-of-the-art-2025-2026"/>
     <w:p>
       <w:pPr>
         <w:pStyle w:val="Heading2"/>
       </w:pPr>
       <w:r>
-        <w:t xml:space="preserve">2. The state of the art (verified, 2025-2026)</w:t>
+        <w:t xml:space="preserve">2. The state of the art (2025-2026)</w:t>
       </w:r>
     </w:p>
     <w:p>
@@ -3362,13 +3350,7 @@
         <w:pStyle w:val="FirstParagraph"/>
       </w:pPr>
       <w:r>
-        <w:t xml:space="preserve">Three programs anchor the field as of mid-2026, and their status has been verified against primary</w:t>
-      </w:r>
-      <w:r>
-        <w:t xml:space="preserve"> </w:t>
-      </w:r>
-      <w:r>
-        <w:t xml:space="preserve">sources through an adversarial fact-checking process.</w:t>
+        <w:t xml:space="preserve">Three programs anchor the field as of mid-2026. Their status here is drawn from primary sources.</w:t>
       </w:r>
     </w:p>
     <w:p>
@@ -3458,13 +3440,13 @@
         <w:t xml:space="preserve"> </w:t>
       </w:r>
       <w:r>
-        <w:t xml:space="preserve">In a significant demonstration, Starcloud flew an NVIDIA H100 GPU — the highest-power</w:t>
-      </w:r>
-      <w:r>
-        <w:t xml:space="preserve"> </w:t>
-      </w:r>
-      <w:r>
-        <w:t xml:space="preserve">data-center-class processor flown to date — aboard the approximately sixty-kilogram Starcloud-1</w:t>
+        <w:t xml:space="preserve">In a significant demonstration, Starcloud flew an NVIDIA H100 GPU, the highest-power</w:t>
+      </w:r>
+      <w:r>
+        <w:t xml:space="preserve"> </w:t>
+      </w:r>
+      <w:r>
+        <w:t xml:space="preserve">data-center-class processor flown to date, aboard the approximately sixty-kilogram Starcloud-1</w:t>
       </w:r>
       <w:r>
         <w:t xml:space="preserve"> </w:t>
@@ -3556,7 +3538,7 @@
         <w:pStyle w:val="BodyText"/>
       </w:pPr>
       <w:r>
-        <w:t xml:space="preserve">The honest summary of the state of the art is a clear gap between what has been demonstrated — one</w:t>
+        <w:t xml:space="preserve">The state of the art shows a clear gap between what has been demonstrated, one</w:t>
       </w:r>
       <w:r>
         <w:t xml:space="preserve"> </w:t>
@@ -3568,7 +3550,7 @@
         <w:t xml:space="preserve"> </w:t>
       </w:r>
       <w:r>
-        <w:t xml:space="preserve">optical link, and initial kilowatt-class nodes — and what the vision requires — megawatt-to-gigawatt</w:t>
+        <w:t xml:space="preserve">optical link, and initial kilowatt-class nodes, and what the vision requires, megawatt-to-gigawatt</w:t>
       </w:r>
       <w:r>
         <w:t xml:space="preserve"> </w:t>
@@ -3598,7 +3580,7 @@
         <w:pStyle w:val="FirstParagraph"/>
       </w:pPr>
       <w:r>
-        <w:t xml:space="preserve">Throughout this treatise the reference design follows the Suncatcher parameters: a dawn-dusk</w:t>
+        <w:t xml:space="preserve">Throughout this analysis the reference design follows the Suncatcher parameters: a dawn-dusk</w:t>
       </w:r>
       <w:r>
         <w:t xml:space="preserve"> </w:t>
@@ -3648,7 +3630,7 @@
         <w:t xml:space="preserve"> </w:t>
       </w:r>
       <w:r>
-        <w:t xml:space="preserve">intent is to size each subsystem, rank the risks, and quantify the trades — not to produce a</w:t>
+        <w:t xml:space="preserve">intent is to size each subsystem, rank the risks, and quantify the trades, not to produce a</w:t>
       </w:r>
       <w:r>
         <w:t xml:space="preserve"> </w:t>
@@ -3672,19 +3654,13 @@
         <w:t xml:space="preserve"> </w:t>
       </w:r>
       <w:r>
-        <w:t xml:space="preserve">agency debris and radiation tools) are out of scope and are identified as such in Chapter 24. This</w:t>
-      </w:r>
-      <w:r>
-        <w:t xml:space="preserve"> </w:t>
-      </w:r>
-      <w:r>
-        <w:t xml:space="preserve">honesty about fidelity is essential: the value of the model lies in its breadth, its transparency,</w:t>
-      </w:r>
-      <w:r>
-        <w:t xml:space="preserve"> </w:t>
-      </w:r>
-      <w:r>
-        <w:t xml:space="preserve">and its reproducibility, not in a false claim of flight accuracy.</w:t>
+        <w:t xml:space="preserve">agency debris and radiation tools) are out of scope and are identified as such in Chapter 24. Stating the fidelity plainly is essential: the value of the model lies in its breadth and its</w:t>
+      </w:r>
+      <w:r>
+        <w:t xml:space="preserve"> </w:t>
+      </w:r>
+      <w:r>
+        <w:t xml:space="preserve">transparency, not in a claim of flight accuracy.</w:t>
       </w:r>
     </w:p>
     <w:p>
@@ -3696,13 +3672,13 @@
     </w:p>
     <w:bookmarkEnd w:id="18"/>
     <w:bookmarkEnd w:id="19"/>
-    <w:bookmarkStart w:id="29" w:name="part-ii-the-orbital-environment"/>
+    <w:bookmarkStart w:id="35" w:name="part-ii-the-orbital-environment"/>
     <w:p>
       <w:pPr>
         <w:pStyle w:val="Heading1"/>
       </w:pPr>
       <w:r>
-        <w:t xml:space="preserve">PART II — THE ORBITAL ENVIRONMENT</w:t>
+        <w:t xml:space="preserve">PART II, THE ORBITAL ENVIRONMENT</w:t>
       </w:r>
     </w:p>
     <w:bookmarkStart w:id="20" w:name="orbital-mechanics-of-a-circular-orbit"/>
@@ -5390,10 +5366,7 @@
         </m:sSup>
       </m:oMath>
       <w:r>
-        <w:t xml:space="preserve"> </w:t>
-      </w:r>
-      <w:r>
-        <w:t xml:space="preserve">— a retrograde, near-polar orbit. At 650 km,</w:t>
+        <w:t xml:space="preserve">, a retrograde, near-polar orbit. At 650 km,</w:t>
       </w:r>
       <w:r>
         <w:t xml:space="preserve"> </w:t>
@@ -5549,7 +5522,7 @@
         <w:t xml:space="preserve"> </w:t>
       </w:r>
       <w:r>
-        <w:t xml:space="preserve">terminator, which (Chapter 6) yields nearly continuous sunlight and minimal thermal cycling — a</w:t>
+        <w:t xml:space="preserve">terminator, which (Chapter 6) yields nearly continuous sunlight and minimal thermal cycling, a</w:t>
       </w:r>
       <w:r>
         <w:t xml:space="preserve"> </w:t>
@@ -5559,7 +5532,7 @@
       </w:r>
     </w:p>
     <w:bookmarkEnd w:id="21"/>
-    <w:bookmarkStart w:id="22" w:name="X5d8eb5df9ce872601c783d8f232c04d346f88c7"/>
+    <w:bookmarkStart w:id="25" w:name="X5d8eb5df9ce872601c783d8f232c04d346f88c7"/>
     <w:p>
       <w:pPr>
         <w:pStyle w:val="Heading2"/>
@@ -6224,8 +6197,63 @@
         <w:t xml:space="preserve">This is the single most favorable environmental choice available to the architecture.</w:t>
       </w:r>
     </w:p>
-    <w:bookmarkEnd w:id="22"/>
-    <w:bookmarkStart w:id="26" w:name="the-neutral-atmosphere-and-orbital-decay"/>
+    <w:p>
+      <w:pPr>
+        <w:pStyle w:val="CaptionedFigure"/>
+      </w:pPr>
+      <w:r>
+        <w:drawing>
+          <wp:inline>
+            <wp:extent cx="5334000" cy="2456668"/>
+            <wp:effectExtent b="0" l="0" r="0" t="0"/>
+            <wp:docPr descr="Fig. 6.1 Critical beta angle versus altitude, and eclipse fraction versus beta at 650 km. A dawn-dusk orbit holds the beta angle high, so the satellite stays sunlit." title="" id="23" name="Picture"/>
+            <a:graphic>
+              <a:graphicData uri="http://schemas.openxmlformats.org/drawingml/2006/picture">
+                <pic:pic>
+                  <pic:nvPicPr>
+                    <pic:cNvPr descr="figures2/figA1_eclipse.png" id="24" name="Picture"/>
+                    <pic:cNvPicPr>
+                      <a:picLocks noChangeArrowheads="1" noChangeAspect="1"/>
+                    </pic:cNvPicPr>
+                  </pic:nvPicPr>
+                  <pic:blipFill>
+                    <a:blip r:embed="rId22"/>
+                    <a:stretch>
+                      <a:fillRect/>
+                    </a:stretch>
+                  </pic:blipFill>
+                  <pic:spPr bwMode="auto">
+                    <a:xfrm>
+                      <a:off x="0" y="0"/>
+                      <a:ext cx="5334000" cy="2456668"/>
+                    </a:xfrm>
+                    <a:prstGeom prst="rect">
+                      <a:avLst/>
+                    </a:prstGeom>
+                    <a:noFill/>
+                    <a:ln w="9525">
+                      <a:noFill/>
+                      <a:headEnd/>
+                      <a:tailEnd/>
+                    </a:ln>
+                  </pic:spPr>
+                </pic:pic>
+              </a:graphicData>
+            </a:graphic>
+          </wp:inline>
+        </w:drawing>
+      </w:r>
+    </w:p>
+    <w:p>
+      <w:pPr>
+        <w:pStyle w:val="ImageCaption"/>
+      </w:pPr>
+      <w:r>
+        <w:t xml:space="preserve">Fig. 6.1 Critical beta angle versus altitude, and eclipse fraction versus beta at 650 km. A dawn-dusk orbit holds the beta angle high, so the satellite stays sunlit.</w:t>
+      </w:r>
+    </w:p>
+    <w:bookmarkEnd w:id="25"/>
+    <w:bookmarkStart w:id="29" w:name="the-neutral-atmosphere-and-orbital-decay"/>
     <w:p>
       <w:pPr>
         <w:pStyle w:val="Heading2"/>
@@ -7700,10 +7728,7 @@
         <w:t xml:space="preserve">de-orbit propulsion is therefore mandatory, not optional</w:t>
       </w:r>
       <w:r>
-        <w:t xml:space="preserve"> </w:t>
-      </w:r>
-      <w:r>
-        <w:t xml:space="preserve">— a conclusion that propagates into the</w:t>
+        <w:t xml:space="preserve">, a conclusion that propagates into the</w:t>
       </w:r>
       <w:r>
         <w:t xml:space="preserve"> </w:t>
@@ -7721,18 +7746,18 @@
           <wp:inline>
             <wp:extent cx="5334000" cy="3698864"/>
             <wp:effectExtent b="0" l="0" r="0" t="0"/>
-            <wp:docPr descr="Fig. 7.1 — Natural orbital lifetime versus altitude with the solar-cycle uncertainty band; at 650 km the realistic lifetime fails the five-year disposal rule." title="" id="24" name="Picture"/>
+            <wp:docPr descr="Fig. 7.1, Natural orbital lifetime versus altitude with the solar-cycle uncertainty band; at 650 km the realistic lifetime fails the five-year disposal rule." title="" id="27" name="Picture"/>
             <a:graphic>
               <a:graphicData uri="http://schemas.openxmlformats.org/drawingml/2006/picture">
                 <pic:pic>
                   <pic:nvPicPr>
-                    <pic:cNvPr descr="figures/fig1_orbital_decay.png" id="25" name="Picture"/>
+                    <pic:cNvPr descr="figures/fig1_orbital_decay.png" id="28" name="Picture"/>
                     <pic:cNvPicPr>
                       <a:picLocks noChangeArrowheads="1" noChangeAspect="1"/>
                     </pic:cNvPicPr>
                   </pic:nvPicPr>
                   <pic:blipFill>
-                    <a:blip r:embed="rId23"/>
+                    <a:blip r:embed="rId26"/>
                     <a:stretch>
                       <a:fillRect/>
                     </a:stretch>
@@ -7764,11 +7789,11 @@
         <w:pStyle w:val="ImageCaption"/>
       </w:pPr>
       <w:r>
-        <w:t xml:space="preserve">Fig. 7.1 — Natural orbital lifetime versus altitude with the solar-cycle uncertainty band; at 650 km the realistic lifetime fails the five-year disposal rule.</w:t>
+        <w:t xml:space="preserve">Fig. 7.1, Natural orbital lifetime versus altitude with the solar-cycle uncertainty band; at 650 km the realistic lifetime fails the five-year disposal rule.</w:t>
       </w:r>
     </w:p>
-    <w:bookmarkEnd w:id="26"/>
-    <w:bookmarkStart w:id="27" w:name="the-ionizing-radiation-environment"/>
+    <w:bookmarkEnd w:id="29"/>
+    <w:bookmarkStart w:id="33" w:name="the-ionizing-radiation-environment"/>
     <w:p>
       <w:pPr>
         <w:pStyle w:val="Heading2"/>
@@ -8033,13 +8058,13 @@
         <w:t xml:space="preserve"> </w:t>
       </w:r>
       <w:r>
-        <w:t xml:space="preserve">high-bandwidth memory, first showed irregularities at 2 krad(Si) — about three times the 750</w:t>
-      </w:r>
-      <w:r>
-        <w:t xml:space="preserve"> </w:t>
-      </w:r>
-      <w:r>
-        <w:t xml:space="preserve">rad(Si) five-year requirement — and exhibited no hard failures up to the maximum tested dose of 15</w:t>
+        <w:t xml:space="preserve">high-bandwidth memory, first showed irregularities at 2 krad(Si), about three times the 750</w:t>
+      </w:r>
+      <w:r>
+        <w:t xml:space="preserve"> </w:t>
+      </w:r>
+      <w:r>
+        <w:t xml:space="preserve">rad(Si) five-year requirement, and exhibited no hard failures up to the maximum tested dose of 15</w:t>
       </w:r>
       <w:r>
         <w:t xml:space="preserve"> </w:t>
@@ -8058,6 +8083,61 @@
       </w:r>
       <w:r>
         <w:t xml:space="preserve">survivable for a five-year mission with sensible shielding.</w:t>
+      </w:r>
+    </w:p>
+    <w:p>
+      <w:pPr>
+        <w:pStyle w:val="CaptionedFigure"/>
+      </w:pPr>
+      <w:r>
+        <w:drawing>
+          <wp:inline>
+            <wp:extent cx="5334000" cy="3427984"/>
+            <wp:effectExtent b="0" l="0" r="0" t="0"/>
+            <wp:docPr descr="Fig. 8.1 Cumulative five-year ionizing dose versus aluminium shielding, with the memory tolerance and the mission requirement marked. Ten millimeters of aluminium keeps the dose well below the first-irregularity threshold." title="" id="31" name="Picture"/>
+            <a:graphic>
+              <a:graphicData uri="http://schemas.openxmlformats.org/drawingml/2006/picture">
+                <pic:pic>
+                  <pic:nvPicPr>
+                    <pic:cNvPr descr="figures2/figA5_dose.png" id="32" name="Picture"/>
+                    <pic:cNvPicPr>
+                      <a:picLocks noChangeArrowheads="1" noChangeAspect="1"/>
+                    </pic:cNvPicPr>
+                  </pic:nvPicPr>
+                  <pic:blipFill>
+                    <a:blip r:embed="rId30"/>
+                    <a:stretch>
+                      <a:fillRect/>
+                    </a:stretch>
+                  </pic:blipFill>
+                  <pic:spPr bwMode="auto">
+                    <a:xfrm>
+                      <a:off x="0" y="0"/>
+                      <a:ext cx="5334000" cy="3427984"/>
+                    </a:xfrm>
+                    <a:prstGeom prst="rect">
+                      <a:avLst/>
+                    </a:prstGeom>
+                    <a:noFill/>
+                    <a:ln w="9525">
+                      <a:noFill/>
+                      <a:headEnd/>
+                      <a:tailEnd/>
+                    </a:ln>
+                  </pic:spPr>
+                </pic:pic>
+              </a:graphicData>
+            </a:graphic>
+          </wp:inline>
+        </w:drawing>
+      </w:r>
+    </w:p>
+    <w:p>
+      <w:pPr>
+        <w:pStyle w:val="ImageCaption"/>
+      </w:pPr>
+      <w:r>
+        <w:t xml:space="preserve">Fig. 8.1 Cumulative five-year ionizing dose versus aluminium shielding, with the memory tolerance and the mission requirement marked. Ten millimeters of aluminium keeps the dose well below the first-irregularity threshold.</w:t>
       </w:r>
     </w:p>
     <w:p>
@@ -8230,8 +8310,8 @@
         <w:t xml:space="preserve">twenty percent, which must be carried explicitly in any efficiency figure.</w:t>
       </w:r>
     </w:p>
-    <w:bookmarkEnd w:id="27"/>
-    <w:bookmarkStart w:id="28" w:name="the-orbital-debris-environment"/>
+    <w:bookmarkEnd w:id="33"/>
+    <w:bookmarkStart w:id="34" w:name="the-orbital-debris-environment"/>
     <w:p>
       <w:pPr>
         <w:pStyle w:val="Heading2"/>
@@ -8785,13 +8865,13 @@
         <w:t xml:space="preserve"> </w:t>
       </w:r>
       <w:r>
-        <w:t xml:space="preserve">percent, with a model band from six to forty-six percent. The development of the cascade mechanism —</w:t>
-      </w:r>
-      <w:r>
-        <w:t xml:space="preserve"> </w:t>
-      </w:r>
-      <w:r>
-        <w:t xml:space="preserve">the reason the tight formation is dangerous — is given in Chapter 13 and the risk synthesis. The</w:t>
+        <w:t xml:space="preserve">percent, with a model band from six to forty-six percent. The development of the cascade mechanism,</w:t>
+      </w:r>
+      <w:r>
+        <w:t xml:space="preserve"> </w:t>
+      </w:r>
+      <w:r>
+        <w:t xml:space="preserve">the reason the tight formation is dangerous, is given in Chapter 13 and the risk synthesis. The</w:t>
       </w:r>
       <w:r>
         <w:t xml:space="preserve"> </w:t>
@@ -8813,18 +8893,18 @@
         </w:pict>
       </w:r>
     </w:p>
-    <w:bookmarkEnd w:id="28"/>
-    <w:bookmarkEnd w:id="29"/>
-    <w:bookmarkStart w:id="56" w:name="part-iii-spacecraft-subsystems"/>
+    <w:bookmarkEnd w:id="34"/>
+    <w:bookmarkEnd w:id="35"/>
+    <w:bookmarkStart w:id="74" w:name="part-iii-spacecraft-subsystems"/>
     <w:p>
       <w:pPr>
         <w:pStyle w:val="Heading1"/>
       </w:pPr>
       <w:r>
-        <w:t xml:space="preserve">PART III — SPACECRAFT SUBSYSTEMS</w:t>
+        <w:t xml:space="preserve">PART III, SPACECRAFT SUBSYSTEMS</w:t>
       </w:r>
     </w:p>
-    <w:bookmarkStart w:id="33" w:name="thermal-control"/>
+    <w:bookmarkStart w:id="45" w:name="thermal-control"/>
     <w:p>
       <w:pPr>
         <w:pStyle w:val="Heading2"/>
@@ -8844,7 +8924,7 @@
         <w:t xml:space="preserve"> </w:t>
       </w:r>
       <w:r>
-        <w:t xml:space="preserve">solved at the single-node scale — but it does not scale for free, and a second, sharper limit</w:t>
+        <w:t xml:space="preserve">solved at the single-node scale, but it does not scale for free, and a second, sharper limit</w:t>
       </w:r>
       <w:r>
         <w:t xml:space="preserve"> </w:t>
@@ -10245,6 +10325,61 @@
     </w:p>
     <w:p>
       <w:pPr>
+        <w:pStyle w:val="CaptionedFigure"/>
+      </w:pPr>
+      <w:r>
+        <w:drawing>
+          <wp:inline>
+            <wp:extent cx="5334000" cy="2456668"/>
+            <wp:effectExtent b="0" l="0" r="0" t="0"/>
+            <wp:docPr descr="Fig. 10.1 Radiator equilibrium temperature versus heat flux, and the radiator area required for one megawatt versus operating temperature. Running hotter reduces area at the cost of silicon lifetime." title="" id="37" name="Picture"/>
+            <a:graphic>
+              <a:graphicData uri="http://schemas.openxmlformats.org/drawingml/2006/picture">
+                <pic:pic>
+                  <pic:nvPicPr>
+                    <pic:cNvPr descr="figures2/figA3_radiator.png" id="38" name="Picture"/>
+                    <pic:cNvPicPr>
+                      <a:picLocks noChangeArrowheads="1" noChangeAspect="1"/>
+                    </pic:cNvPicPr>
+                  </pic:nvPicPr>
+                  <pic:blipFill>
+                    <a:blip r:embed="rId36"/>
+                    <a:stretch>
+                      <a:fillRect/>
+                    </a:stretch>
+                  </pic:blipFill>
+                  <pic:spPr bwMode="auto">
+                    <a:xfrm>
+                      <a:off x="0" y="0"/>
+                      <a:ext cx="5334000" cy="2456668"/>
+                    </a:xfrm>
+                    <a:prstGeom prst="rect">
+                      <a:avLst/>
+                    </a:prstGeom>
+                    <a:noFill/>
+                    <a:ln w="9525">
+                      <a:noFill/>
+                      <a:headEnd/>
+                      <a:tailEnd/>
+                    </a:ln>
+                  </pic:spPr>
+                </pic:pic>
+              </a:graphicData>
+            </a:graphic>
+          </wp:inline>
+        </w:drawing>
+      </w:r>
+    </w:p>
+    <w:p>
+      <w:pPr>
+        <w:pStyle w:val="ImageCaption"/>
+      </w:pPr>
+      <w:r>
+        <w:t xml:space="preserve">Fig. 10.1 Radiator equilibrium temperature versus heat flux, and the radiator area required for one megawatt versus operating temperature. Running hotter reduces area at the cost of silicon lifetime.</w:t>
+      </w:r>
+    </w:p>
+    <w:p>
+      <w:pPr>
         <w:pStyle w:val="BodyText"/>
       </w:pPr>
       <w:r>
@@ -10688,229 +10823,57 @@
     </w:p>
     <w:p>
       <w:pPr>
-        <w:pStyle w:val="BodyText"/>
+        <w:pStyle w:val="CaptionedFigure"/>
       </w:pPr>
       <w:r>
-        <w:rPr>
-          <w:b/>
-          <w:bCs/>
-        </w:rPr>
-        <w:t xml:space="preserve">Inverse problem and Newton-Raphson.</w:t>
-      </w:r>
-      <w:r>
-        <w:t xml:space="preserve"> </w:t>
-      </w:r>
-      <w:r>
-        <w:t xml:space="preserve">When the area is fixed and the temperature is sought, (10.3)</w:t>
-      </w:r>
-      <w:r>
-        <w:t xml:space="preserve"> </w:t>
-      </w:r>
-      <w:r>
-        <w:t xml:space="preserve">becomes a quartic, solved by Newton-Raphson on</w:t>
-      </w:r>
-      <w:r>
-        <w:t xml:space="preserve"> </w:t>
-      </w:r>
-      <m:oMath>
-        <m:r>
-          <m:t>f</m:t>
-        </m:r>
-        <m:r>
-          <m:rPr>
-            <m:sty m:val="p"/>
-          </m:rPr>
-          <m:t>(</m:t>
-        </m:r>
-        <m:r>
-          <m:t>T</m:t>
-        </m:r>
-        <m:r>
-          <m:rPr>
-            <m:sty m:val="p"/>
-          </m:rPr>
-          <m:t>)</m:t>
-        </m:r>
-        <m:r>
-          <m:rPr>
-            <m:sty m:val="p"/>
-          </m:rPr>
-          <m:t>=</m:t>
-        </m:r>
-        <m:r>
-          <m:t>Q</m:t>
-        </m:r>
-        <m:r>
-          <m:rPr>
-            <m:sty m:val="p"/>
-          </m:rPr>
-          <m:t>−</m:t>
-        </m:r>
-        <m:r>
-          <m:t>ε</m:t>
-        </m:r>
-        <m:r>
-          <m:t>σ</m:t>
-        </m:r>
-        <m:r>
-          <m:t>A</m:t>
-        </m:r>
-        <m:sSup>
-          <m:e>
-            <m:r>
-              <m:t>T</m:t>
-            </m:r>
-          </m:e>
-          <m:sup>
-            <m:r>
-              <m:t>4</m:t>
-            </m:r>
-          </m:sup>
-        </m:sSup>
-      </m:oMath>
-      <w:r>
-        <w:t xml:space="preserve"> </w:t>
-      </w:r>
-      <w:r>
-        <w:t xml:space="preserve">with</w:t>
-      </w:r>
-      <w:r>
-        <w:t xml:space="preserve"> </w:t>
-      </w:r>
-      <m:oMath>
-        <m:sSup>
-          <m:e>
-            <m:r>
-              <m:t>f</m:t>
-            </m:r>
-          </m:e>
-          <m:sup>
-            <m:r>
-              <m:rPr>
-                <m:sty m:val="p"/>
-              </m:rPr>
-              <m:t>′</m:t>
-            </m:r>
-          </m:sup>
-        </m:sSup>
-        <m:r>
-          <m:rPr>
-            <m:sty m:val="p"/>
-          </m:rPr>
-          <m:t>(</m:t>
-        </m:r>
-        <m:r>
-          <m:t>T</m:t>
-        </m:r>
-        <m:r>
-          <m:rPr>
-            <m:sty m:val="p"/>
-          </m:rPr>
-          <m:t>)</m:t>
-        </m:r>
-        <m:r>
-          <m:rPr>
-            <m:sty m:val="p"/>
-          </m:rPr>
-          <m:t>=</m:t>
-        </m:r>
-        <m:r>
-          <m:rPr>
-            <m:sty m:val="p"/>
-          </m:rPr>
-          <m:t>−</m:t>
-        </m:r>
-        <m:r>
-          <m:t>4</m:t>
-        </m:r>
-        <m:r>
-          <m:t>ε</m:t>
-        </m:r>
-        <m:r>
-          <m:t>σ</m:t>
-        </m:r>
-        <m:r>
-          <m:t>A</m:t>
-        </m:r>
-        <m:sSup>
-          <m:e>
-            <m:r>
-              <m:t>T</m:t>
-            </m:r>
-          </m:e>
-          <m:sup>
-            <m:r>
-              <m:t>3</m:t>
-            </m:r>
-          </m:sup>
-        </m:sSup>
-      </m:oMath>
-      <w:r>
-        <w:t xml:space="preserve">, converging in two to four iterations from</w:t>
-      </w:r>
-      <w:r>
-        <w:t xml:space="preserve"> </w:t>
-      </w:r>
-      <m:oMath>
-        <m:sSub>
-          <m:e>
-            <m:r>
-              <m:t>T</m:t>
-            </m:r>
-          </m:e>
-          <m:sub>
-            <m:r>
-              <m:t>0</m:t>
-            </m:r>
-          </m:sub>
-        </m:sSub>
-        <m:r>
-          <m:rPr>
-            <m:sty m:val="p"/>
-          </m:rPr>
-          <m:t>=</m:t>
-        </m:r>
-        <m:r>
-          <m:t>300</m:t>
-        </m:r>
-      </m:oMath>
-      <w:r>
-        <w:t xml:space="preserve"> </w:t>
-      </w:r>
-      <w:r>
-        <w:t xml:space="preserve">K. The</w:t>
-      </w:r>
-      <w:r>
-        <w:t xml:space="preserve"> </w:t>
-      </w:r>
-      <w:r>
-        <w:t xml:space="preserve">first report’s baseline (1450 W on 4 m²,</w:t>
-      </w:r>
-      <w:r>
-        <w:t xml:space="preserve"> </w:t>
-      </w:r>
-      <m:oMath>
-        <m:r>
-          <m:t>ε</m:t>
-        </m:r>
-        <m:r>
-          <m:rPr>
-            <m:sty m:val="p"/>
-          </m:rPr>
-          <m:t>=</m:t>
-        </m:r>
-        <m:r>
-          <m:t>0.85</m:t>
-        </m:r>
-      </m:oMath>
-      <w:r>
-        <w:t xml:space="preserve">, single-sided) yields a radiator</w:t>
-      </w:r>
-      <w:r>
-        <w:t xml:space="preserve"> </w:t>
-      </w:r>
-      <w:r>
-        <w:t xml:space="preserve">temperature of 21.4 C.</w:t>
+        <w:drawing>
+          <wp:inline>
+            <wp:extent cx="5334000" cy="2459772"/>
+            <wp:effectExtent b="0" l="0" r="0" t="0"/>
+            <wp:docPr descr="Fig. 10.2 Earth view factor versus altitude, and the combined albedo, Earth-infrared, and solar load on a four-square-meter surface. External loads set the parasitic fraction in the radiator sizing." title="" id="40" name="Picture"/>
+            <a:graphic>
+              <a:graphicData uri="http://schemas.openxmlformats.org/drawingml/2006/picture">
+                <pic:pic>
+                  <pic:nvPicPr>
+                    <pic:cNvPr descr="figures2/figA2_loads.png" id="41" name="Picture"/>
+                    <pic:cNvPicPr>
+                      <a:picLocks noChangeArrowheads="1" noChangeAspect="1"/>
+                    </pic:cNvPicPr>
+                  </pic:nvPicPr>
+                  <pic:blipFill>
+                    <a:blip r:embed="rId39"/>
+                    <a:stretch>
+                      <a:fillRect/>
+                    </a:stretch>
+                  </pic:blipFill>
+                  <pic:spPr bwMode="auto">
+                    <a:xfrm>
+                      <a:off x="0" y="0"/>
+                      <a:ext cx="5334000" cy="2459772"/>
+                    </a:xfrm>
+                    <a:prstGeom prst="rect">
+                      <a:avLst/>
+                    </a:prstGeom>
+                    <a:noFill/>
+                    <a:ln w="9525">
+                      <a:noFill/>
+                      <a:headEnd/>
+                      <a:tailEnd/>
+                    </a:ln>
+                  </pic:spPr>
+                </pic:pic>
+              </a:graphicData>
+            </a:graphic>
+          </wp:inline>
+        </w:drawing>
+      </w:r>
+    </w:p>
+    <w:p>
+      <w:pPr>
+        <w:pStyle w:val="ImageCaption"/>
+      </w:pPr>
+      <w:r>
+        <w:t xml:space="preserve">Fig. 10.2 Earth view factor versus altitude, and the combined albedo, Earth-infrared, and solar load on a four-square-meter surface. External loads set the parasitic fraction in the radiator sizing.</w:t>
       </w:r>
     </w:p>
     <w:p>
@@ -10922,6 +10885,233 @@
           <w:b/>
           <w:bCs/>
         </w:rPr>
+        <w:t xml:space="preserve">Inverse problem and Newton-Raphson.</w:t>
+      </w:r>
+      <w:r>
+        <w:t xml:space="preserve"> </w:t>
+      </w:r>
+      <w:r>
+        <w:t xml:space="preserve">When the area is fixed and the temperature is sought, (10.3)</w:t>
+      </w:r>
+      <w:r>
+        <w:t xml:space="preserve"> </w:t>
+      </w:r>
+      <w:r>
+        <w:t xml:space="preserve">becomes a quartic, solved by Newton-Raphson on</w:t>
+      </w:r>
+      <w:r>
+        <w:t xml:space="preserve"> </w:t>
+      </w:r>
+      <m:oMath>
+        <m:r>
+          <m:t>f</m:t>
+        </m:r>
+        <m:r>
+          <m:rPr>
+            <m:sty m:val="p"/>
+          </m:rPr>
+          <m:t>(</m:t>
+        </m:r>
+        <m:r>
+          <m:t>T</m:t>
+        </m:r>
+        <m:r>
+          <m:rPr>
+            <m:sty m:val="p"/>
+          </m:rPr>
+          <m:t>)</m:t>
+        </m:r>
+        <m:r>
+          <m:rPr>
+            <m:sty m:val="p"/>
+          </m:rPr>
+          <m:t>=</m:t>
+        </m:r>
+        <m:r>
+          <m:t>Q</m:t>
+        </m:r>
+        <m:r>
+          <m:rPr>
+            <m:sty m:val="p"/>
+          </m:rPr>
+          <m:t>−</m:t>
+        </m:r>
+        <m:r>
+          <m:t>ε</m:t>
+        </m:r>
+        <m:r>
+          <m:t>σ</m:t>
+        </m:r>
+        <m:r>
+          <m:t>A</m:t>
+        </m:r>
+        <m:sSup>
+          <m:e>
+            <m:r>
+              <m:t>T</m:t>
+            </m:r>
+          </m:e>
+          <m:sup>
+            <m:r>
+              <m:t>4</m:t>
+            </m:r>
+          </m:sup>
+        </m:sSup>
+      </m:oMath>
+      <w:r>
+        <w:t xml:space="preserve"> </w:t>
+      </w:r>
+      <w:r>
+        <w:t xml:space="preserve">with</w:t>
+      </w:r>
+      <w:r>
+        <w:t xml:space="preserve"> </w:t>
+      </w:r>
+      <m:oMath>
+        <m:sSup>
+          <m:e>
+            <m:r>
+              <m:t>f</m:t>
+            </m:r>
+          </m:e>
+          <m:sup>
+            <m:r>
+              <m:rPr>
+                <m:sty m:val="p"/>
+              </m:rPr>
+              <m:t>′</m:t>
+            </m:r>
+          </m:sup>
+        </m:sSup>
+        <m:r>
+          <m:rPr>
+            <m:sty m:val="p"/>
+          </m:rPr>
+          <m:t>(</m:t>
+        </m:r>
+        <m:r>
+          <m:t>T</m:t>
+        </m:r>
+        <m:r>
+          <m:rPr>
+            <m:sty m:val="p"/>
+          </m:rPr>
+          <m:t>)</m:t>
+        </m:r>
+        <m:r>
+          <m:rPr>
+            <m:sty m:val="p"/>
+          </m:rPr>
+          <m:t>=</m:t>
+        </m:r>
+        <m:r>
+          <m:rPr>
+            <m:sty m:val="p"/>
+          </m:rPr>
+          <m:t>−</m:t>
+        </m:r>
+        <m:r>
+          <m:t>4</m:t>
+        </m:r>
+        <m:r>
+          <m:t>ε</m:t>
+        </m:r>
+        <m:r>
+          <m:t>σ</m:t>
+        </m:r>
+        <m:r>
+          <m:t>A</m:t>
+        </m:r>
+        <m:sSup>
+          <m:e>
+            <m:r>
+              <m:t>T</m:t>
+            </m:r>
+          </m:e>
+          <m:sup>
+            <m:r>
+              <m:t>3</m:t>
+            </m:r>
+          </m:sup>
+        </m:sSup>
+      </m:oMath>
+      <w:r>
+        <w:t xml:space="preserve">, converging in two to four iterations from</w:t>
+      </w:r>
+      <w:r>
+        <w:t xml:space="preserve"> </w:t>
+      </w:r>
+      <m:oMath>
+        <m:sSub>
+          <m:e>
+            <m:r>
+              <m:t>T</m:t>
+            </m:r>
+          </m:e>
+          <m:sub>
+            <m:r>
+              <m:t>0</m:t>
+            </m:r>
+          </m:sub>
+        </m:sSub>
+        <m:r>
+          <m:rPr>
+            <m:sty m:val="p"/>
+          </m:rPr>
+          <m:t>=</m:t>
+        </m:r>
+        <m:r>
+          <m:t>300</m:t>
+        </m:r>
+      </m:oMath>
+      <w:r>
+        <w:t xml:space="preserve"> </w:t>
+      </w:r>
+      <w:r>
+        <w:t xml:space="preserve">K. The</w:t>
+      </w:r>
+      <w:r>
+        <w:t xml:space="preserve"> </w:t>
+      </w:r>
+      <w:r>
+        <w:t xml:space="preserve">first report’s baseline (1450 W on 4 m²,</w:t>
+      </w:r>
+      <w:r>
+        <w:t xml:space="preserve"> </w:t>
+      </w:r>
+      <m:oMath>
+        <m:r>
+          <m:t>ε</m:t>
+        </m:r>
+        <m:r>
+          <m:rPr>
+            <m:sty m:val="p"/>
+          </m:rPr>
+          <m:t>=</m:t>
+        </m:r>
+        <m:r>
+          <m:t>0.85</m:t>
+        </m:r>
+      </m:oMath>
+      <w:r>
+        <w:t xml:space="preserve">, single-sided) yields a radiator</w:t>
+      </w:r>
+      <w:r>
+        <w:t xml:space="preserve"> </w:t>
+      </w:r>
+      <w:r>
+        <w:t xml:space="preserve">temperature of 21.4 C.</w:t>
+      </w:r>
+    </w:p>
+    <w:p>
+      <w:pPr>
+        <w:pStyle w:val="BodyText"/>
+      </w:pPr>
+      <w:r>
+        <w:rPr>
+          <w:b/>
+          <w:bCs/>
+        </w:rPr>
         <w:t xml:space="preserve">The conductive chain and the interface wall.</w:t>
       </w:r>
       <w:r>
@@ -11147,10 +11337,7 @@
         </m:r>
       </m:oMath>
       <w:r>
-        <w:t xml:space="preserve"> </w:t>
-      </w:r>
-      <w:r>
-        <w:t xml:space="preserve">— that is,</w:t>
+        <w:t xml:space="preserve">, that is,</w:t>
       </w:r>
       <w:r>
         <w:t xml:space="preserve"> </w:t>
@@ -11179,10 +11366,7 @@
         </m:r>
       </m:oMath>
       <w:r>
-        <w:t xml:space="preserve"> </w:t>
-      </w:r>
-      <w:r>
-        <w:t xml:space="preserve">— cannot be cooled passively at any</w:t>
+        <w:t xml:space="preserve">, cannot be cooled passively at any</w:t>
       </w:r>
       <w:r>
         <w:t xml:space="preserve"> </w:t>
@@ -11212,18 +11396,18 @@
           <wp:inline>
             <wp:extent cx="5334000" cy="3459634"/>
             <wp:effectExtent b="0" l="0" r="0" t="0"/>
-            <wp:docPr descr="Fig. 10.1 — (a) Radiator area is linear in heat load; (b) the passive thermal chain saturates above ~400 W, forcing chip-level active cooling." title="" id="31" name="Picture"/>
+            <wp:docPr descr="Fig. 10.1, (a) Radiator area is linear in heat load; (b) the passive thermal chain saturates above ~400 W, forcing chip-level active cooling." title="" id="43" name="Picture"/>
             <a:graphic>
               <a:graphicData uri="http://schemas.openxmlformats.org/drawingml/2006/picture">
                 <pic:pic>
                   <pic:nvPicPr>
-                    <pic:cNvPr descr="figures/fig2_thermal_wall.png" id="32" name="Picture"/>
+                    <pic:cNvPr descr="figures/fig2_thermal_wall.png" id="44" name="Picture"/>
                     <pic:cNvPicPr>
                       <a:picLocks noChangeArrowheads="1" noChangeAspect="1"/>
                     </pic:cNvPicPr>
                   </pic:nvPicPr>
                   <pic:blipFill>
-                    <a:blip r:embed="rId30"/>
+                    <a:blip r:embed="rId42"/>
                     <a:stretch>
                       <a:fillRect/>
                     </a:stretch>
@@ -11255,11 +11439,11 @@
         <w:pStyle w:val="ImageCaption"/>
       </w:pPr>
       <w:r>
-        <w:t xml:space="preserve">Fig. 10.1 — (a) Radiator area is linear in heat load; (b) the passive thermal chain saturates above ~400 W, forcing chip-level active cooling.</w:t>
+        <w:t xml:space="preserve">Fig. 10.1, (a) Radiator area is linear in heat load; (b) the passive thermal chain saturates above ~400 W, forcing chip-level active cooling.</w:t>
       </w:r>
     </w:p>
-    <w:bookmarkEnd w:id="33"/>
-    <w:bookmarkStart w:id="37" w:name="electrical-power"/>
+    <w:bookmarkEnd w:id="45"/>
+    <w:bookmarkStart w:id="49" w:name="electrical-power"/>
     <w:p>
       <w:pPr>
         <w:pStyle w:val="Heading2"/>
@@ -12260,7 +12444,7 @@
         <w:t xml:space="preserve"> </w:t>
       </w:r>
       <w:r>
-        <w:t xml:space="preserve">and seasonal, so the battery is light — a major mass saving over a generic low orbit with sixteen</w:t>
+        <w:t xml:space="preserve">and seasonal, so the battery is light, a major mass saving over a generic low orbit with sixteen</w:t>
       </w:r>
       <w:r>
         <w:t xml:space="preserve"> </w:t>
@@ -12284,18 +12468,18 @@
           <wp:inline>
             <wp:extent cx="5334000" cy="2608107"/>
             <wp:effectExtent b="0" l="0" r="0" t="0"/>
-            <wp:docPr descr="Fig. 11.1 — Array area versus load, and triple-junction degradation over the mission." title="" id="35" name="Picture"/>
+            <wp:docPr descr="Fig. 11.1, Array area versus load, and triple-junction degradation over the mission." title="" id="47" name="Picture"/>
             <a:graphic>
               <a:graphicData uri="http://schemas.openxmlformats.org/drawingml/2006/picture">
                 <pic:pic>
                   <pic:nvPicPr>
-                    <pic:cNvPr descr="systems_figs/fig_power.png" id="36" name="Picture"/>
+                    <pic:cNvPr descr="systems_figs/fig_power.png" id="48" name="Picture"/>
                     <pic:cNvPicPr>
                       <a:picLocks noChangeArrowheads="1" noChangeAspect="1"/>
                     </pic:cNvPicPr>
                   </pic:nvPicPr>
                   <pic:blipFill>
-                    <a:blip r:embed="rId34"/>
+                    <a:blip r:embed="rId46"/>
                     <a:stretch>
                       <a:fillRect/>
                     </a:stretch>
@@ -12327,11 +12511,11 @@
         <w:pStyle w:val="ImageCaption"/>
       </w:pPr>
       <w:r>
-        <w:t xml:space="preserve">Fig. 11.1 — Array area versus load, and triple-junction degradation over the mission.</w:t>
+        <w:t xml:space="preserve">Fig. 11.1, Array area versus load, and triple-junction degradation over the mission.</w:t>
       </w:r>
     </w:p>
-    <w:bookmarkEnd w:id="37"/>
-    <w:bookmarkStart w:id="38" w:name="structures-and-mass"/>
+    <w:bookmarkEnd w:id="49"/>
+    <w:bookmarkStart w:id="53" w:name="structures-and-mass"/>
     <w:p>
       <w:pPr>
         <w:pStyle w:val="Heading2"/>
@@ -13196,8 +13380,63 @@
         <w:t xml:space="preserve">The reference four-chip satellite closes at roughly 270 to 290 kg dry.</w:t>
       </w:r>
     </w:p>
-    <w:bookmarkEnd w:id="38"/>
-    <w:bookmarkStart w:id="39" w:name="X63cb9f37665b9f150c1577425ead9308a982ab3"/>
+    <w:p>
+      <w:pPr>
+        <w:pStyle w:val="CaptionedFigure"/>
+      </w:pPr>
+      <w:r>
+        <w:drawing>
+          <wp:inline>
+            <wp:extent cx="5334000" cy="4681880"/>
+            <wp:effectExtent b="0" l="0" r="0" t="0"/>
+            <wp:docPr descr="Fig. 12.1 Reference satellite dry-mass breakdown by subsystem, closed self-consistently by the integrated model." title="" id="51" name="Picture"/>
+            <a:graphic>
+              <a:graphicData uri="http://schemas.openxmlformats.org/drawingml/2006/picture">
+                <pic:pic>
+                  <pic:nvPicPr>
+                    <pic:cNvPr descr="figures2/figA8_mass.png" id="52" name="Picture"/>
+                    <pic:cNvPicPr>
+                      <a:picLocks noChangeArrowheads="1" noChangeAspect="1"/>
+                    </pic:cNvPicPr>
+                  </pic:nvPicPr>
+                  <pic:blipFill>
+                    <a:blip r:embed="rId50"/>
+                    <a:stretch>
+                      <a:fillRect/>
+                    </a:stretch>
+                  </pic:blipFill>
+                  <pic:spPr bwMode="auto">
+                    <a:xfrm>
+                      <a:off x="0" y="0"/>
+                      <a:ext cx="5334000" cy="4681880"/>
+                    </a:xfrm>
+                    <a:prstGeom prst="rect">
+                      <a:avLst/>
+                    </a:prstGeom>
+                    <a:noFill/>
+                    <a:ln w="9525">
+                      <a:noFill/>
+                      <a:headEnd/>
+                      <a:tailEnd/>
+                    </a:ln>
+                  </pic:spPr>
+                </pic:pic>
+              </a:graphicData>
+            </a:graphic>
+          </wp:inline>
+        </w:drawing>
+      </w:r>
+    </w:p>
+    <w:p>
+      <w:pPr>
+        <w:pStyle w:val="ImageCaption"/>
+      </w:pPr>
+      <w:r>
+        <w:t xml:space="preserve">Fig. 12.1 Reference satellite dry-mass breakdown by subsystem, closed self-consistently by the integrated model.</w:t>
+      </w:r>
+    </w:p>
+    <w:bookmarkEnd w:id="53"/>
+    <w:bookmarkStart w:id="54" w:name="X63cb9f37665b9f150c1577425ead9308a982ab3"/>
     <w:p>
       <w:pPr>
         <w:pStyle w:val="Heading2"/>
@@ -13894,7 +14133,7 @@
         <w:t xml:space="preserve"> </w:t>
       </w:r>
       <w:r>
-        <w:t xml:space="preserve">or roughly ten microradians — an order of magnitude too coarse. The bus alone cannot hold the beam;</w:t>
+        <w:t xml:space="preserve">or roughly ten microradians, an order of magnitude too coarse. The bus alone cannot hold the beam;</w:t>
       </w:r>
       <w:r>
         <w:t xml:space="preserve"> </w:t>
@@ -13921,8 +14160,8 @@
         <w:t xml:space="preserve">link and any long inter-satellite hop.</w:t>
       </w:r>
     </w:p>
-    <w:bookmarkEnd w:id="39"/>
-    <w:bookmarkStart w:id="43" w:name="X6ae4c679d3cd8d01d6fb60e2d3c40a4ea80d1a8"/>
+    <w:bookmarkEnd w:id="54"/>
+    <w:bookmarkStart w:id="61" w:name="X6ae4c679d3cd8d01d6fb60e2d3c40a4ea80d1a8"/>
     <w:p>
       <w:pPr>
         <w:pStyle w:val="Heading2"/>
@@ -14410,7 +14649,7 @@
         <w:t xml:space="preserve"> </w:t>
       </w:r>
       <w:r>
-        <w:t xml:space="preserve">decibels per decade of range — from 34 mW required at 1,000 km to 3.41 W at 10,000 km, against a</w:t>
+        <w:t xml:space="preserve">decibels per decade of range, from 34 mW required at 1,000 km to 3.41 W at 10,000 km, against a</w:t>
       </w:r>
       <w:r>
         <w:t xml:space="preserve"> </w:t>
@@ -14441,6 +14680,61 @@
       </w:r>
       <w:r>
         <w:t xml:space="preserve">inverse-square link physics, not chosen for convenience.</w:t>
+      </w:r>
+    </w:p>
+    <w:p>
+      <w:pPr>
+        <w:pStyle w:val="CaptionedFigure"/>
+      </w:pPr>
+      <w:r>
+        <w:drawing>
+          <wp:inline>
+            <wp:extent cx="5334000" cy="2456668"/>
+            <wp:effectExtent b="0" l="0" r="0" t="0"/>
+            <wp:docPr descr="Fig. 14.2 Transmit power required to hold a three-decibel link margin versus range, against the one-watt terminal limit, and the pointing-loss sensitivity to jitter. Range and pointing together force the tight formation." title="" id="56" name="Picture"/>
+            <a:graphic>
+              <a:graphicData uri="http://schemas.openxmlformats.org/drawingml/2006/picture">
+                <pic:pic>
+                  <pic:nvPicPr>
+                    <pic:cNvPr descr="figures2/figA4_link.png" id="57" name="Picture"/>
+                    <pic:cNvPicPr>
+                      <a:picLocks noChangeArrowheads="1" noChangeAspect="1"/>
+                    </pic:cNvPicPr>
+                  </pic:nvPicPr>
+                  <pic:blipFill>
+                    <a:blip r:embed="rId55"/>
+                    <a:stretch>
+                      <a:fillRect/>
+                    </a:stretch>
+                  </pic:blipFill>
+                  <pic:spPr bwMode="auto">
+                    <a:xfrm>
+                      <a:off x="0" y="0"/>
+                      <a:ext cx="5334000" cy="2456668"/>
+                    </a:xfrm>
+                    <a:prstGeom prst="rect">
+                      <a:avLst/>
+                    </a:prstGeom>
+                    <a:noFill/>
+                    <a:ln w="9525">
+                      <a:noFill/>
+                      <a:headEnd/>
+                      <a:tailEnd/>
+                    </a:ln>
+                  </pic:spPr>
+                </pic:pic>
+              </a:graphicData>
+            </a:graphic>
+          </wp:inline>
+        </w:drawing>
+      </w:r>
+    </w:p>
+    <w:p>
+      <w:pPr>
+        <w:pStyle w:val="ImageCaption"/>
+      </w:pPr>
+      <w:r>
+        <w:t xml:space="preserve">Fig. 14.2 Transmit power required to hold a three-decibel link margin versus range, against the one-watt terminal limit, and the pointing-loss sensitivity to jitter. Range and pointing together force the tight formation.</w:t>
       </w:r>
     </w:p>
     <w:p>
@@ -14973,7 +15267,7 @@
         <w:t xml:space="preserve"> </w:t>
       </w:r>
       <w:r>
-        <w:t xml:space="preserve">beyond roughly 3,000 km — a genuine advantage for long-haul, latency-sensitive traffic.</w:t>
+        <w:t xml:space="preserve">beyond roughly 3,000 km, a genuine advantage for long-haul, latency-sensitive traffic.</w:t>
       </w:r>
     </w:p>
     <w:p>
@@ -14985,18 +15279,18 @@
           <wp:inline>
             <wp:extent cx="5334000" cy="2604741"/>
             <wp:effectExtent b="0" l="0" r="0" t="0"/>
-            <wp:docPr descr="Fig. 14.1 — Inter-satellite free-space loss versus range and pointing-loss sensitivity." title="" id="41" name="Picture"/>
+            <wp:docPr descr="Fig. 14.1, Inter-satellite free-space loss versus range and pointing-loss sensitivity." title="" id="59" name="Picture"/>
             <a:graphic>
               <a:graphicData uri="http://schemas.openxmlformats.org/drawingml/2006/picture">
                 <pic:pic>
                   <pic:nvPicPr>
-                    <pic:cNvPr descr="systems_figs/fig_comms.png" id="42" name="Picture"/>
+                    <pic:cNvPr descr="systems_figs/fig_comms.png" id="60" name="Picture"/>
                     <pic:cNvPicPr>
                       <a:picLocks noChangeArrowheads="1" noChangeAspect="1"/>
                     </pic:cNvPicPr>
                   </pic:nvPicPr>
                   <pic:blipFill>
-                    <a:blip r:embed="rId40"/>
+                    <a:blip r:embed="rId58"/>
                     <a:stretch>
                       <a:fillRect/>
                     </a:stretch>
@@ -15028,11 +15322,11 @@
         <w:pStyle w:val="ImageCaption"/>
       </w:pPr>
       <w:r>
-        <w:t xml:space="preserve">Fig. 14.1 — Inter-satellite free-space loss versus range and pointing-loss sensitivity.</w:t>
+        <w:t xml:space="preserve">Fig. 14.1, Inter-satellite free-space loss versus range and pointing-loss sensitivity.</w:t>
       </w:r>
     </w:p>
-    <w:bookmarkEnd w:id="43"/>
-    <w:bookmarkStart w:id="47" w:name="propulsion-and-end-of-life-disposal"/>
+    <w:bookmarkEnd w:id="61"/>
+    <w:bookmarkStart w:id="65" w:name="propulsion-and-end-of-life-disposal"/>
     <w:p>
       <w:pPr>
         <w:pStyle w:val="Heading2"/>
@@ -15046,7 +15340,7 @@
         <w:pStyle w:val="FirstParagraph"/>
       </w:pPr>
       <w:r>
-        <w:t xml:space="preserve">Propulsion must make up drag, maintain the formation, enable collision avoidance, and — decisively —</w:t>
+        <w:t xml:space="preserve">Propulsion must make up drag, maintain the formation, enable collision avoidance, and, decisively,</w:t>
       </w:r>
       <w:r>
         <w:t xml:space="preserve"> </w:t>
@@ -16102,18 +16396,18 @@
           <wp:inline>
             <wp:extent cx="5334000" cy="3251761"/>
             <wp:effectExtent b="0" l="0" r="0" t="0"/>
-            <wp:docPr descr="Fig. 15.1 — Per-satellite Δv budget (de-orbit dominates) and propellant mass by propulsion type." title="" id="45" name="Picture"/>
+            <wp:docPr descr="Fig. 15.1, Per-satellite Δv budget (de-orbit dominates) and propellant mass by propulsion type." title="" id="63" name="Picture"/>
             <a:graphic>
               <a:graphicData uri="http://schemas.openxmlformats.org/drawingml/2006/picture">
                 <pic:pic>
                   <pic:nvPicPr>
-                    <pic:cNvPr descr="figures/fig5_deltav.png" id="46" name="Picture"/>
+                    <pic:cNvPr descr="figures/fig5_deltav.png" id="64" name="Picture"/>
                     <pic:cNvPicPr>
                       <a:picLocks noChangeArrowheads="1" noChangeAspect="1"/>
                     </pic:cNvPicPr>
                   </pic:nvPicPr>
                   <pic:blipFill>
-                    <a:blip r:embed="rId44"/>
+                    <a:blip r:embed="rId62"/>
                     <a:stretch>
                       <a:fillRect/>
                     </a:stretch>
@@ -16145,11 +16439,11 @@
         <w:pStyle w:val="ImageCaption"/>
       </w:pPr>
       <w:r>
-        <w:t xml:space="preserve">Fig. 15.1 — Per-satellite Δv budget (de-orbit dominates) and propellant mass by propulsion type.</w:t>
+        <w:t xml:space="preserve">Fig. 15.1, Per-satellite Δv budget (de-orbit dominates) and propellant mass by propulsion type.</w:t>
       </w:r>
     </w:p>
-    <w:bookmarkEnd w:id="47"/>
-    <w:bookmarkStart w:id="51" w:name="X72d468b889d4049fe64ab25e8d7aac33b521080"/>
+    <w:bookmarkEnd w:id="65"/>
+    <w:bookmarkStart w:id="69" w:name="X72d468b889d4049fe64ab25e8d7aac33b521080"/>
     <w:p>
       <w:pPr>
         <w:pStyle w:val="Heading2"/>
@@ -16791,7 +17085,7 @@
         <w:t xml:space="preserve"> </w:t>
       </w:r>
       <w:r>
-        <w:t xml:space="preserve">of the design life — about twenty percent per year for a five-year life. The associated replenishment</w:t>
+        <w:t xml:space="preserve">of the design life, about twenty percent per year for a five-year life. The associated replenishment</w:t>
       </w:r>
       <w:r>
         <w:t xml:space="preserve"> </w:t>
@@ -16809,18 +17103,18 @@
           <wp:inline>
             <wp:extent cx="5334000" cy="2604741"/>
             <wp:effectExtent b="0" l="0" r="0" t="0"/>
-            <wp:docPr descr="Fig. 16.1 — Per-node reliability versus time and the over-provisioning needed to hold capacity." title="" id="49" name="Picture"/>
+            <wp:docPr descr="Fig. 16.1, Per-node reliability versus time and the over-provisioning needed to hold capacity." title="" id="67" name="Picture"/>
             <a:graphic>
               <a:graphicData uri="http://schemas.openxmlformats.org/drawingml/2006/picture">
                 <pic:pic>
                   <pic:nvPicPr>
-                    <pic:cNvPr descr="systems_figs/fig_reliability.png" id="50" name="Picture"/>
+                    <pic:cNvPr descr="systems_figs/fig_reliability.png" id="68" name="Picture"/>
                     <pic:cNvPicPr>
                       <a:picLocks noChangeArrowheads="1" noChangeAspect="1"/>
                     </pic:cNvPicPr>
                   </pic:nvPicPr>
                   <pic:blipFill>
-                    <a:blip r:embed="rId48"/>
+                    <a:blip r:embed="rId66"/>
                     <a:stretch>
                       <a:fillRect/>
                     </a:stretch>
@@ -16852,11 +17146,11 @@
         <w:pStyle w:val="ImageCaption"/>
       </w:pPr>
       <w:r>
-        <w:t xml:space="preserve">Fig. 16.1 — Per-node reliability versus time and the over-provisioning needed to hold capacity.</w:t>
+        <w:t xml:space="preserve">Fig. 16.1, Per-node reliability versus time and the over-provisioning needed to hold capacity.</w:t>
       </w:r>
     </w:p>
-    <w:bookmarkEnd w:id="51"/>
-    <w:bookmarkStart w:id="55" w:name="compute-and-workload"/>
+    <w:bookmarkEnd w:id="69"/>
+    <w:bookmarkStart w:id="73" w:name="compute-and-workload"/>
     <w:p>
       <w:pPr>
         <w:pStyle w:val="Heading2"/>
@@ -16870,7 +17164,7 @@
         <w:pStyle w:val="FirstParagraph"/>
       </w:pPr>
       <w:r>
-        <w:t xml:space="preserve">The purpose of the system is useful computation, and the honest figure of merit is delivered useful</w:t>
+        <w:t xml:space="preserve">The purpose of the system is useful computation, and the appropriate figure of merit is delivered useful</w:t>
       </w:r>
       <w:r>
         <w:t xml:space="preserve"> </w:t>
@@ -17118,13 +17412,13 @@
         <w:t xml:space="preserve"> </w:t>
       </w:r>
       <w:r>
-        <w:t xml:space="preserve">cooling, a 700-W H100 throttles by roughly ninety percent — the interface wall of Chapter 10 made</w:t>
-      </w:r>
-      <w:r>
-        <w:t xml:space="preserve"> </w:t>
-      </w:r>
-      <w:r>
-        <w:t xml:space="preserve">visible in the time domain — while a low-power TPU runs essentially un-throttled. This is the</w:t>
+        <w:t xml:space="preserve">cooling, a 700-W H100 throttles by roughly ninety percent, the interface wall of Chapter 10 made</w:t>
+      </w:r>
+      <w:r>
+        <w:t xml:space="preserve"> </w:t>
+      </w:r>
+      <w:r>
+        <w:t xml:space="preserve">visible in the time domain, while a low-power TPU runs essentially un-throttled. This is the</w:t>
       </w:r>
       <w:r>
         <w:t xml:space="preserve"> </w:t>
@@ -17148,7 +17442,7 @@
         <w:t xml:space="preserve"> </w:t>
       </w:r>
       <w:r>
-        <w:t xml:space="preserve">The honest efficiency metric is an effective power-usage effectiveness that</w:t>
+        <w:t xml:space="preserve">The appropriate efficiency metric is an effective power-usage effectiveness that</w:t>
       </w:r>
       <w:r>
         <w:t xml:space="preserve"> </w:t>
@@ -17336,7 +17630,7 @@
         </m:sSub>
       </m:oMath>
       <w:r>
-        <w:t xml:space="preserve">, and the honest cost metric is dollars per useful petaflop-hour, which at</w:t>
+        <w:t xml:space="preserve">, and the relevant cost metric is dollars per useful petaflop-hour, which at</w:t>
       </w:r>
       <w:r>
         <w:t xml:space="preserve"> </w:t>
@@ -17354,18 +17648,18 @@
           <wp:inline>
             <wp:extent cx="5334000" cy="4019504"/>
             <wp:effectExtent b="0" l="0" r="0" t="0"/>
-            <wp:docPr descr="Fig. 17.1 — Added subsystems: passive thermal-throttle by chip, ground-station site diversity, latency crossover, and the discounted-cash-flow breakeven." title="" id="53" name="Picture"/>
+            <wp:docPr descr="Fig. 17.1, Added subsystems: passive thermal-throttle by chip, ground-station site diversity, latency crossover, and the discounted-cash-flow breakeven." title="" id="71" name="Picture"/>
             <a:graphic>
               <a:graphicData uri="http://schemas.openxmlformats.org/drawingml/2006/picture">
                 <pic:pic>
                   <pic:nvPicPr>
-                    <pic:cNvPr descr="systems_figs/fig_new_subsystems.png" id="54" name="Picture"/>
+                    <pic:cNvPr descr="systems_figs/fig_new_subsystems.png" id="72" name="Picture"/>
                     <pic:cNvPicPr>
                       <a:picLocks noChangeArrowheads="1" noChangeAspect="1"/>
                     </pic:cNvPicPr>
                   </pic:nvPicPr>
                   <pic:blipFill>
-                    <a:blip r:embed="rId52"/>
+                    <a:blip r:embed="rId70"/>
                     <a:stretch>
                       <a:fillRect/>
                     </a:stretch>
@@ -17397,7 +17691,7 @@
         <w:pStyle w:val="ImageCaption"/>
       </w:pPr>
       <w:r>
-        <w:t xml:space="preserve">Fig. 17.1 — Added subsystems: passive thermal-throttle by chip, ground-station site diversity, latency crossover, and the discounted-cash-flow breakeven.</w:t>
+        <w:t xml:space="preserve">Fig. 17.1, Added subsystems: passive thermal-throttle by chip, ground-station site diversity, latency crossover, and the discounted-cash-flow breakeven.</w:t>
       </w:r>
     </w:p>
     <w:p>
@@ -17407,18 +17701,18 @@
         </w:pict>
       </w:r>
     </w:p>
-    <w:bookmarkEnd w:id="55"/>
-    <w:bookmarkEnd w:id="56"/>
-    <w:bookmarkStart w:id="72" w:name="Xe5ea88703363ae012ea2f87a0aad981517e6b12"/>
+    <w:bookmarkEnd w:id="73"/>
+    <w:bookmarkEnd w:id="74"/>
+    <w:bookmarkStart w:id="91" w:name="Xe5ea88703363ae012ea2f87a0aad981517e6b12"/>
     <w:p>
       <w:pPr>
         <w:pStyle w:val="Heading1"/>
       </w:pPr>
       <w:r>
-        <w:t xml:space="preserve">PART IV — INTEGRATION, SIMULATION, AND RESULTS</w:t>
+        <w:t xml:space="preserve">PART IV, INTEGRATION, SIMULATION, AND RESULTS</w:t>
       </w:r>
     </w:p>
-    <w:bookmarkStart w:id="60" w:name="the-integrated-system-model"/>
+    <w:bookmarkStart w:id="78" w:name="the-integrated-system-model"/>
     <w:p>
       <w:pPr>
         <w:pStyle w:val="Heading2"/>
@@ -17438,7 +17732,7 @@
         <w:t xml:space="preserve"> </w:t>
       </w:r>
       <w:r>
-        <w:t xml:space="preserve">mutual dependencies are satisfied. The integrated model takes top-level choices — the number and</w:t>
+        <w:t xml:space="preserve">mutual dependencies are satisfied. The integrated model takes top-level choices, the number and</w:t>
       </w:r>
       <w:r>
         <w:t xml:space="preserve"> </w:t>
@@ -17450,7 +17744,7 @@
         <w:t xml:space="preserve"> </w:t>
       </w:r>
       <w:r>
-        <w:t xml:space="preserve">utilization, fault-protection level, solar-activity scenario, and launch price — and executes the</w:t>
+        <w:t xml:space="preserve">utilization, fault-protection level, solar-activity scenario, and launch price, and executes the</w:t>
       </w:r>
       <w:r>
         <w:t xml:space="preserve"> </w:t>
@@ -17568,18 +17862,18 @@
           <wp:inline>
             <wp:extent cx="5334000" cy="3797310"/>
             <wp:effectExtent b="0" l="0" r="0" t="0"/>
-            <wp:docPr descr="Fig. 18.1 — Integrated dry-mass budget, closed self-consistently by the system model." title="" id="58" name="Picture"/>
+            <wp:docPr descr="Fig. 18.1, Integrated dry-mass budget, closed self-consistently by the system model." title="" id="76" name="Picture"/>
             <a:graphic>
               <a:graphicData uri="http://schemas.openxmlformats.org/drawingml/2006/picture">
                 <pic:pic>
                   <pic:nvPicPr>
-                    <pic:cNvPr descr="systems_figs/fig_mass_budget.png" id="59" name="Picture"/>
+                    <pic:cNvPr descr="systems_figs/fig_mass_budget.png" id="77" name="Picture"/>
                     <pic:cNvPicPr>
                       <a:picLocks noChangeArrowheads="1" noChangeAspect="1"/>
                     </pic:cNvPicPr>
                   </pic:nvPicPr>
                   <pic:blipFill>
-                    <a:blip r:embed="rId57"/>
+                    <a:blip r:embed="rId75"/>
                     <a:stretch>
                       <a:fillRect/>
                     </a:stretch>
@@ -17611,17 +17905,17 @@
         <w:pStyle w:val="ImageCaption"/>
       </w:pPr>
       <w:r>
-        <w:t xml:space="preserve">Fig. 18.1 — Integrated dry-mass budget, closed self-consistently by the system model.</w:t>
+        <w:t xml:space="preserve">Fig. 18.1, Integrated dry-mass budget, closed self-consistently by the system model.</w:t>
       </w:r>
     </w:p>
-    <w:bookmarkEnd w:id="60"/>
-    <w:bookmarkStart w:id="64" w:name="X23f703a5b3167e168d574605adab1b76f34ca68"/>
+    <w:bookmarkEnd w:id="78"/>
+    <w:bookmarkStart w:id="79" w:name="Xfed2044479baa4c639d53a9e82ee4edbe317219"/>
     <w:p>
       <w:pPr>
         <w:pStyle w:val="Heading2"/>
       </w:pPr>
       <w:r>
-        <w:t xml:space="preserve">19. Uncertainty quantification and sensitivity</w:t>
+        <w:t xml:space="preserve">18A. Computational methods and numerical solvers</w:t>
       </w:r>
     </w:p>
     <w:p>
@@ -17629,6 +17923,1312 @@
         <w:pStyle w:val="FirstParagraph"/>
       </w:pPr>
       <w:r>
+        <w:t xml:space="preserve">The governing equations are not only evaluated in closed form; each is solved with an explicit</w:t>
+      </w:r>
+      <w:r>
+        <w:t xml:space="preserve"> </w:t>
+      </w:r>
+      <w:r>
+        <w:t xml:space="preserve">numerical method in an open solver suite. The quartic radiator energy balance is solved by</w:t>
+      </w:r>
+      <w:r>
+        <w:t xml:space="preserve"> </w:t>
+      </w:r>
+      <w:r>
+        <w:t xml:space="preserve">Newton-Raphson. The drag-decay and eclipse-transient differential equations are integrated by a</w:t>
+      </w:r>
+      <w:r>
+        <w:t xml:space="preserve"> </w:t>
+      </w:r>
+      <w:r>
+        <w:t xml:space="preserve">fourth-order Runge-Kutta scheme. The optical-link range and the internal rate of return are found</w:t>
+      </w:r>
+      <w:r>
+        <w:t xml:space="preserve"> </w:t>
+      </w:r>
+      <w:r>
+        <w:t xml:space="preserve">by Brent root-finding. The launch-cost-parity year is obtained by Monte-Carlo over the uncertain</w:t>
+      </w:r>
+      <w:r>
+        <w:t xml:space="preserve"> </w:t>
+      </w:r>
+      <w:r>
+        <w:t xml:space="preserve">assumptions, because that forecast is skewed and a single point would misrepresent it. Solving the</w:t>
+      </w:r>
+      <w:r>
+        <w:t xml:space="preserve"> </w:t>
+      </w:r>
+      <w:r>
+        <w:t xml:space="preserve">reference mission end to end produces one consistent solution set.</w:t>
+      </w:r>
+    </w:p>
+    <w:tbl>
+      <w:tblPr>
+        <w:tblStyle w:val="Table"/>
+        <w:tblW w:type="pct" w:w="5000"/>
+        <w:tblLayout w:type="fixed"/>
+        <w:tblLook w:firstRow="1" w:lastRow="0" w:firstColumn="0" w:lastColumn="0" w:noHBand="0" w:noVBand="0" w:val="0020"/>
+      </w:tblPr>
+      <w:tblGrid>
+        <w:gridCol w:w="2640"/>
+        <w:gridCol w:w="2640"/>
+        <w:gridCol w:w="2640"/>
+      </w:tblGrid>
+      <w:tr>
+        <w:trPr>
+          <w:tblHeader w:val="on"/>
+        </w:trPr>
+        <w:tc>
+          <w:tcPr/>
+          <w:p>
+            <w:pPr>
+              <w:pStyle w:val="Compact"/>
+            </w:pPr>
+            <w:r>
+              <w:t xml:space="preserve">Quantity</w:t>
+            </w:r>
+          </w:p>
+        </w:tc>
+        <w:tc>
+          <w:tcPr/>
+          <w:p>
+            <w:pPr>
+              <w:pStyle w:val="Compact"/>
+            </w:pPr>
+            <w:r>
+              <w:t xml:space="preserve">Numerical method</w:t>
+            </w:r>
+          </w:p>
+        </w:tc>
+        <w:tc>
+          <w:tcPr/>
+          <w:p>
+            <w:pPr>
+              <w:pStyle w:val="Compact"/>
+            </w:pPr>
+            <w:r>
+              <w:t xml:space="preserve">Solution</w:t>
+            </w:r>
+          </w:p>
+        </w:tc>
+      </w:tr>
+      <w:tr>
+        <w:tc>
+          <w:tcPr/>
+          <w:p>
+            <w:pPr>
+              <w:pStyle w:val="Compact"/>
+            </w:pPr>
+            <w:r>
+              <w:t xml:space="preserve">Radiator temperature</w:t>
+            </w:r>
+          </w:p>
+        </w:tc>
+        <w:tc>
+          <w:tcPr/>
+          <w:p>
+            <w:pPr>
+              <w:pStyle w:val="Compact"/>
+            </w:pPr>
+            <w:r>
+              <w:t xml:space="preserve">Newton-Raphson (4 iterations)</w:t>
+            </w:r>
+          </w:p>
+        </w:tc>
+        <w:tc>
+          <w:tcPr/>
+          <w:p>
+            <w:pPr>
+              <w:pStyle w:val="Compact"/>
+            </w:pPr>
+            <w:r>
+              <w:t xml:space="preserve">21.3 C</w:t>
+            </w:r>
+          </w:p>
+        </w:tc>
+      </w:tr>
+      <w:tr>
+        <w:tc>
+          <w:tcPr/>
+          <w:p>
+            <w:pPr>
+              <w:pStyle w:val="Compact"/>
+            </w:pPr>
+            <w:r>
+              <w:t xml:space="preserve">Natural lifetime at 650 km</w:t>
+            </w:r>
+          </w:p>
+        </w:tc>
+        <w:tc>
+          <w:tcPr/>
+          <w:p>
+            <w:pPr>
+              <w:pStyle w:val="Compact"/>
+            </w:pPr>
+            <w:r>
+              <w:t xml:space="preserve">Runge-Kutta decay integration</w:t>
+            </w:r>
+          </w:p>
+        </w:tc>
+        <w:tc>
+          <w:tcPr/>
+          <w:p>
+            <w:pPr>
+              <w:pStyle w:val="Compact"/>
+            </w:pPr>
+            <w:r>
+              <w:t xml:space="preserve">19.6 yr</w:t>
+            </w:r>
+          </w:p>
+        </w:tc>
+      </w:tr>
+      <w:tr>
+        <w:tc>
+          <w:tcPr/>
+          <w:p>
+            <w:pPr>
+              <w:pStyle w:val="Compact"/>
+            </w:pPr>
+            <w:r>
+              <w:t xml:space="preserve">Eclipse temperature drop</w:t>
+            </w:r>
+          </w:p>
+        </w:tc>
+        <w:tc>
+          <w:tcPr/>
+          <w:p>
+            <w:pPr>
+              <w:pStyle w:val="Compact"/>
+            </w:pPr>
+            <w:r>
+              <w:t xml:space="preserve">Runge-Kutta transient</w:t>
+            </w:r>
+          </w:p>
+        </w:tc>
+        <w:tc>
+          <w:tcPr/>
+          <w:p>
+            <w:pPr>
+              <w:pStyle w:val="Compact"/>
+            </w:pPr>
+            <w:r>
+              <w:t xml:space="preserve">minus 0.6 C</w:t>
+            </w:r>
+          </w:p>
+        </w:tc>
+      </w:tr>
+      <w:tr>
+        <w:tc>
+          <w:tcPr/>
+          <w:p>
+            <w:pPr>
+              <w:pStyle w:val="Compact"/>
+            </w:pPr>
+            <w:r>
+              <w:t xml:space="preserve">Controlled de-orbit delta-v</w:t>
+            </w:r>
+          </w:p>
+        </w:tc>
+        <w:tc>
+          <w:tcPr/>
+          <w:p>
+            <w:pPr>
+              <w:pStyle w:val="Compact"/>
+            </w:pPr>
+            <w:r>
+              <w:t xml:space="preserve">Hohmann (vis-viva)</w:t>
+            </w:r>
+          </w:p>
+        </w:tc>
+        <w:tc>
+          <w:tcPr/>
+          <w:p>
+            <w:pPr>
+              <w:pStyle w:val="Compact"/>
+            </w:pPr>
+            <w:r>
+              <w:t xml:space="preserve">131.6 m/s</w:t>
+            </w:r>
+          </w:p>
+        </w:tc>
+      </w:tr>
+      <w:tr>
+        <w:tc>
+          <w:tcPr/>
+          <w:p>
+            <w:pPr>
+              <w:pStyle w:val="Compact"/>
+            </w:pPr>
+            <w:r>
+              <w:t xml:space="preserve">Optical link range, 3 dB then 0 dB margin</w:t>
+            </w:r>
+          </w:p>
+        </w:tc>
+        <w:tc>
+          <w:tcPr/>
+          <w:p>
+            <w:pPr>
+              <w:pStyle w:val="Compact"/>
+            </w:pPr>
+            <w:r>
+              <w:t xml:space="preserve">Brent root</w:t>
+            </w:r>
+          </w:p>
+        </w:tc>
+        <w:tc>
+          <w:tcPr/>
+          <w:p>
+            <w:pPr>
+              <w:pStyle w:val="Compact"/>
+            </w:pPr>
+            <w:r>
+              <w:t xml:space="preserve">5,419 then 7,655 km</w:t>
+            </w:r>
+          </w:p>
+        </w:tc>
+      </w:tr>
+      <w:tr>
+        <w:tc>
+          <w:tcPr/>
+          <w:p>
+            <w:pPr>
+              <w:pStyle w:val="Compact"/>
+            </w:pPr>
+            <w:r>
+              <w:t xml:space="preserve">Launch-cost parity year</w:t>
+            </w:r>
+          </w:p>
+        </w:tc>
+        <w:tc>
+          <w:tcPr/>
+          <w:p>
+            <w:pPr>
+              <w:pStyle w:val="Compact"/>
+            </w:pPr>
+            <w:r>
+              <w:t xml:space="preserve">Monte-Carlo</w:t>
+            </w:r>
+          </w:p>
+        </w:tc>
+        <w:tc>
+          <w:tcPr/>
+          <w:p>
+            <w:pPr>
+              <w:pStyle w:val="Compact"/>
+            </w:pPr>
+            <w:r>
+              <w:t xml:space="preserve">mid-2040s for the minority of scenarios that reach 200 dollars per kilogram within the horizon</w:t>
+            </w:r>
+          </w:p>
+        </w:tc>
+      </w:tr>
+    </w:tbl>
+    <w:p>
+      <w:pPr>
+        <w:pStyle w:val="BodyText"/>
+      </w:pPr>
+      <w:r>
+        <w:t xml:space="preserve">The numerical primitives are general-purpose and documented. The Newton-Raphson core, used for the</w:t>
+      </w:r>
+      <w:r>
+        <w:t xml:space="preserve"> </w:t>
+      </w:r>
+      <w:r>
+        <w:t xml:space="preserve">radiator quartic, is</w:t>
+      </w:r>
+    </w:p>
+    <w:p>
+      <w:pPr>
+        <w:pStyle w:val="SourceCode"/>
+      </w:pPr>
+      <w:r>
+        <w:rPr>
+          <w:rStyle w:val="KeywordTok"/>
+        </w:rPr>
+        <w:t xml:space="preserve">def</w:t>
+      </w:r>
+      <w:r>
+        <w:rPr>
+          <w:rStyle w:val="NormalTok"/>
+        </w:rPr>
+        <w:t xml:space="preserve"> newton_raphson(f, fprime, x0, tol</w:t>
+      </w:r>
+      <w:r>
+        <w:rPr>
+          <w:rStyle w:val="OperatorTok"/>
+        </w:rPr>
+        <w:t xml:space="preserve">=</w:t>
+      </w:r>
+      <w:r>
+        <w:rPr>
+          <w:rStyle w:val="FloatTok"/>
+        </w:rPr>
+        <w:t xml:space="preserve">1e-8</w:t>
+      </w:r>
+      <w:r>
+        <w:rPr>
+          <w:rStyle w:val="NormalTok"/>
+        </w:rPr>
+        <w:t xml:space="preserve">, max_iter</w:t>
+      </w:r>
+      <w:r>
+        <w:rPr>
+          <w:rStyle w:val="OperatorTok"/>
+        </w:rPr>
+        <w:t xml:space="preserve">=</w:t>
+      </w:r>
+      <w:r>
+        <w:rPr>
+          <w:rStyle w:val="DecValTok"/>
+        </w:rPr>
+        <w:t xml:space="preserve">100</w:t>
+      </w:r>
+      <w:r>
+        <w:rPr>
+          <w:rStyle w:val="NormalTok"/>
+        </w:rPr>
+        <w:t xml:space="preserve">):</w:t>
+      </w:r>
+      <w:r>
+        <w:br/>
+      </w:r>
+      <w:r>
+        <w:rPr>
+          <w:rStyle w:val="NormalTok"/>
+        </w:rPr>
+        <w:t xml:space="preserve">    x </w:t>
+      </w:r>
+      <w:r>
+        <w:rPr>
+          <w:rStyle w:val="OperatorTok"/>
+        </w:rPr>
+        <w:t xml:space="preserve">=</w:t>
+      </w:r>
+      <w:r>
+        <w:rPr>
+          <w:rStyle w:val="NormalTok"/>
+        </w:rPr>
+        <w:t xml:space="preserve"> </w:t>
+      </w:r>
+      <w:r>
+        <w:rPr>
+          <w:rStyle w:val="BuiltInTok"/>
+        </w:rPr>
+        <w:t xml:space="preserve">float</w:t>
+      </w:r>
+      <w:r>
+        <w:rPr>
+          <w:rStyle w:val="NormalTok"/>
+        </w:rPr>
+        <w:t xml:space="preserve">(x0)</w:t>
+      </w:r>
+      <w:r>
+        <w:br/>
+      </w:r>
+      <w:r>
+        <w:rPr>
+          <w:rStyle w:val="NormalTok"/>
+        </w:rPr>
+        <w:t xml:space="preserve">    </w:t>
+      </w:r>
+      <w:r>
+        <w:rPr>
+          <w:rStyle w:val="ControlFlowTok"/>
+        </w:rPr>
+        <w:t xml:space="preserve">for</w:t>
+      </w:r>
+      <w:r>
+        <w:rPr>
+          <w:rStyle w:val="NormalTok"/>
+        </w:rPr>
+        <w:t xml:space="preserve"> k </w:t>
+      </w:r>
+      <w:r>
+        <w:rPr>
+          <w:rStyle w:val="KeywordTok"/>
+        </w:rPr>
+        <w:t xml:space="preserve">in</w:t>
+      </w:r>
+      <w:r>
+        <w:rPr>
+          <w:rStyle w:val="NormalTok"/>
+        </w:rPr>
+        <w:t xml:space="preserve"> </w:t>
+      </w:r>
+      <w:r>
+        <w:rPr>
+          <w:rStyle w:val="BuiltInTok"/>
+        </w:rPr>
+        <w:t xml:space="preserve">range</w:t>
+      </w:r>
+      <w:r>
+        <w:rPr>
+          <w:rStyle w:val="NormalTok"/>
+        </w:rPr>
+        <w:t xml:space="preserve">(</w:t>
+      </w:r>
+      <w:r>
+        <w:rPr>
+          <w:rStyle w:val="DecValTok"/>
+        </w:rPr>
+        <w:t xml:space="preserve">1</w:t>
+      </w:r>
+      <w:r>
+        <w:rPr>
+          <w:rStyle w:val="NormalTok"/>
+        </w:rPr>
+        <w:t xml:space="preserve">, max_iter </w:t>
+      </w:r>
+      <w:r>
+        <w:rPr>
+          <w:rStyle w:val="OperatorTok"/>
+        </w:rPr>
+        <w:t xml:space="preserve">+</w:t>
+      </w:r>
+      <w:r>
+        <w:rPr>
+          <w:rStyle w:val="NormalTok"/>
+        </w:rPr>
+        <w:t xml:space="preserve"> </w:t>
+      </w:r>
+      <w:r>
+        <w:rPr>
+          <w:rStyle w:val="DecValTok"/>
+        </w:rPr>
+        <w:t xml:space="preserve">1</w:t>
+      </w:r>
+      <w:r>
+        <w:rPr>
+          <w:rStyle w:val="NormalTok"/>
+        </w:rPr>
+        <w:t xml:space="preserve">):</w:t>
+      </w:r>
+      <w:r>
+        <w:br/>
+      </w:r>
+      <w:r>
+        <w:rPr>
+          <w:rStyle w:val="NormalTok"/>
+        </w:rPr>
+        <w:t xml:space="preserve">        fx </w:t>
+      </w:r>
+      <w:r>
+        <w:rPr>
+          <w:rStyle w:val="OperatorTok"/>
+        </w:rPr>
+        <w:t xml:space="preserve">=</w:t>
+      </w:r>
+      <w:r>
+        <w:rPr>
+          <w:rStyle w:val="NormalTok"/>
+        </w:rPr>
+        <w:t xml:space="preserve"> f(x)</w:t>
+      </w:r>
+      <w:r>
+        <w:br/>
+      </w:r>
+      <w:r>
+        <w:rPr>
+          <w:rStyle w:val="NormalTok"/>
+        </w:rPr>
+        <w:t xml:space="preserve">        </w:t>
+      </w:r>
+      <w:r>
+        <w:rPr>
+          <w:rStyle w:val="ControlFlowTok"/>
+        </w:rPr>
+        <w:t xml:space="preserve">if</w:t>
+      </w:r>
+      <w:r>
+        <w:rPr>
+          <w:rStyle w:val="NormalTok"/>
+        </w:rPr>
+        <w:t xml:space="preserve"> </w:t>
+      </w:r>
+      <w:r>
+        <w:rPr>
+          <w:rStyle w:val="BuiltInTok"/>
+        </w:rPr>
+        <w:t xml:space="preserve">abs</w:t>
+      </w:r>
+      <w:r>
+        <w:rPr>
+          <w:rStyle w:val="NormalTok"/>
+        </w:rPr>
+        <w:t xml:space="preserve">(fx) </w:t>
+      </w:r>
+      <w:r>
+        <w:rPr>
+          <w:rStyle w:val="OperatorTok"/>
+        </w:rPr>
+        <w:t xml:space="preserve">&lt;</w:t>
+      </w:r>
+      <w:r>
+        <w:rPr>
+          <w:rStyle w:val="NormalTok"/>
+        </w:rPr>
+        <w:t xml:space="preserve"> tol:</w:t>
+      </w:r>
+      <w:r>
+        <w:br/>
+      </w:r>
+      <w:r>
+        <w:rPr>
+          <w:rStyle w:val="NormalTok"/>
+        </w:rPr>
+        <w:t xml:space="preserve">            </w:t>
+      </w:r>
+      <w:r>
+        <w:rPr>
+          <w:rStyle w:val="ControlFlowTok"/>
+        </w:rPr>
+        <w:t xml:space="preserve">return</w:t>
+      </w:r>
+      <w:r>
+        <w:rPr>
+          <w:rStyle w:val="NormalTok"/>
+        </w:rPr>
+        <w:t xml:space="preserve"> x, k</w:t>
+      </w:r>
+      <w:r>
+        <w:br/>
+      </w:r>
+      <w:r>
+        <w:rPr>
+          <w:rStyle w:val="NormalTok"/>
+        </w:rPr>
+        <w:t xml:space="preserve">        x </w:t>
+      </w:r>
+      <w:r>
+        <w:rPr>
+          <w:rStyle w:val="OperatorTok"/>
+        </w:rPr>
+        <w:t xml:space="preserve">-=</w:t>
+      </w:r>
+      <w:r>
+        <w:rPr>
+          <w:rStyle w:val="NormalTok"/>
+        </w:rPr>
+        <w:t xml:space="preserve"> fx </w:t>
+      </w:r>
+      <w:r>
+        <w:rPr>
+          <w:rStyle w:val="OperatorTok"/>
+        </w:rPr>
+        <w:t xml:space="preserve">/</w:t>
+      </w:r>
+      <w:r>
+        <w:rPr>
+          <w:rStyle w:val="NormalTok"/>
+        </w:rPr>
+        <w:t xml:space="preserve"> fprime(x)</w:t>
+      </w:r>
+      <w:r>
+        <w:br/>
+      </w:r>
+      <w:r>
+        <w:rPr>
+          <w:rStyle w:val="NormalTok"/>
+        </w:rPr>
+        <w:t xml:space="preserve">    </w:t>
+      </w:r>
+      <w:r>
+        <w:rPr>
+          <w:rStyle w:val="ControlFlowTok"/>
+        </w:rPr>
+        <w:t xml:space="preserve">return</w:t>
+      </w:r>
+      <w:r>
+        <w:rPr>
+          <w:rStyle w:val="NormalTok"/>
+        </w:rPr>
+        <w:t xml:space="preserve"> x, max_iter</w:t>
+      </w:r>
+    </w:p>
+    <w:p>
+      <w:pPr>
+        <w:pStyle w:val="FirstParagraph"/>
+      </w:pPr>
+      <w:r>
+        <w:t xml:space="preserve">and the fourth-order Runge-Kutta integrator, used for orbital decay and the eclipse transient, is</w:t>
+      </w:r>
+    </w:p>
+    <w:p>
+      <w:pPr>
+        <w:pStyle w:val="SourceCode"/>
+      </w:pPr>
+      <w:r>
+        <w:rPr>
+          <w:rStyle w:val="KeywordTok"/>
+        </w:rPr>
+        <w:t xml:space="preserve">def</w:t>
+      </w:r>
+      <w:r>
+        <w:rPr>
+          <w:rStyle w:val="NormalTok"/>
+        </w:rPr>
+        <w:t xml:space="preserve"> rk4_integrate(rhs, y0, t0, t1, dt, stop</w:t>
+      </w:r>
+      <w:r>
+        <w:rPr>
+          <w:rStyle w:val="OperatorTok"/>
+        </w:rPr>
+        <w:t xml:space="preserve">=</w:t>
+      </w:r>
+      <w:r>
+        <w:rPr>
+          <w:rStyle w:val="VariableTok"/>
+        </w:rPr>
+        <w:t xml:space="preserve">None</w:t>
+      </w:r>
+      <w:r>
+        <w:rPr>
+          <w:rStyle w:val="NormalTok"/>
+        </w:rPr>
+        <w:t xml:space="preserve">):</w:t>
+      </w:r>
+      <w:r>
+        <w:br/>
+      </w:r>
+      <w:r>
+        <w:rPr>
+          <w:rStyle w:val="NormalTok"/>
+        </w:rPr>
+        <w:t xml:space="preserve">    t, y, ts, ys </w:t>
+      </w:r>
+      <w:r>
+        <w:rPr>
+          <w:rStyle w:val="OperatorTok"/>
+        </w:rPr>
+        <w:t xml:space="preserve">=</w:t>
+      </w:r>
+      <w:r>
+        <w:rPr>
+          <w:rStyle w:val="NormalTok"/>
+        </w:rPr>
+        <w:t xml:space="preserve"> t0, </w:t>
+      </w:r>
+      <w:r>
+        <w:rPr>
+          <w:rStyle w:val="BuiltInTok"/>
+        </w:rPr>
+        <w:t xml:space="preserve">float</w:t>
+      </w:r>
+      <w:r>
+        <w:rPr>
+          <w:rStyle w:val="NormalTok"/>
+        </w:rPr>
+        <w:t xml:space="preserve">(y0), [t0], [</w:t>
+      </w:r>
+      <w:r>
+        <w:rPr>
+          <w:rStyle w:val="BuiltInTok"/>
+        </w:rPr>
+        <w:t xml:space="preserve">float</w:t>
+      </w:r>
+      <w:r>
+        <w:rPr>
+          <w:rStyle w:val="NormalTok"/>
+        </w:rPr>
+        <w:t xml:space="preserve">(y0)]</w:t>
+      </w:r>
+      <w:r>
+        <w:br/>
+      </w:r>
+      <w:r>
+        <w:rPr>
+          <w:rStyle w:val="NormalTok"/>
+        </w:rPr>
+        <w:t xml:space="preserve">    </w:t>
+      </w:r>
+      <w:r>
+        <w:rPr>
+          <w:rStyle w:val="ControlFlowTok"/>
+        </w:rPr>
+        <w:t xml:space="preserve">for</w:t>
+      </w:r>
+      <w:r>
+        <w:rPr>
+          <w:rStyle w:val="NormalTok"/>
+        </w:rPr>
+        <w:t xml:space="preserve"> _ </w:t>
+      </w:r>
+      <w:r>
+        <w:rPr>
+          <w:rStyle w:val="KeywordTok"/>
+        </w:rPr>
+        <w:t xml:space="preserve">in</w:t>
+      </w:r>
+      <w:r>
+        <w:rPr>
+          <w:rStyle w:val="NormalTok"/>
+        </w:rPr>
+        <w:t xml:space="preserve"> </w:t>
+      </w:r>
+      <w:r>
+        <w:rPr>
+          <w:rStyle w:val="BuiltInTok"/>
+        </w:rPr>
+        <w:t xml:space="preserve">range</w:t>
+      </w:r>
+      <w:r>
+        <w:rPr>
+          <w:rStyle w:val="NormalTok"/>
+        </w:rPr>
+        <w:t xml:space="preserve">(</w:t>
+      </w:r>
+      <w:r>
+        <w:rPr>
+          <w:rStyle w:val="BuiltInTok"/>
+        </w:rPr>
+        <w:t xml:space="preserve">int</w:t>
+      </w:r>
+      <w:r>
+        <w:rPr>
+          <w:rStyle w:val="NormalTok"/>
+        </w:rPr>
+        <w:t xml:space="preserve">((t1 </w:t>
+      </w:r>
+      <w:r>
+        <w:rPr>
+          <w:rStyle w:val="OperatorTok"/>
+        </w:rPr>
+        <w:t xml:space="preserve">-</w:t>
+      </w:r>
+      <w:r>
+        <w:rPr>
+          <w:rStyle w:val="NormalTok"/>
+        </w:rPr>
+        <w:t xml:space="preserve"> t0) </w:t>
+      </w:r>
+      <w:r>
+        <w:rPr>
+          <w:rStyle w:val="OperatorTok"/>
+        </w:rPr>
+        <w:t xml:space="preserve">/</w:t>
+      </w:r>
+      <w:r>
+        <w:rPr>
+          <w:rStyle w:val="NormalTok"/>
+        </w:rPr>
+        <w:t xml:space="preserve"> dt)):</w:t>
+      </w:r>
+      <w:r>
+        <w:br/>
+      </w:r>
+      <w:r>
+        <w:rPr>
+          <w:rStyle w:val="NormalTok"/>
+        </w:rPr>
+        <w:t xml:space="preserve">        k1 </w:t>
+      </w:r>
+      <w:r>
+        <w:rPr>
+          <w:rStyle w:val="OperatorTok"/>
+        </w:rPr>
+        <w:t xml:space="preserve">=</w:t>
+      </w:r>
+      <w:r>
+        <w:rPr>
+          <w:rStyle w:val="NormalTok"/>
+        </w:rPr>
+        <w:t xml:space="preserve"> rhs(t, y)</w:t>
+      </w:r>
+      <w:r>
+        <w:rPr>
+          <w:rStyle w:val="OperatorTok"/>
+        </w:rPr>
+        <w:t xml:space="preserve">;</w:t>
+      </w:r>
+      <w:r>
+        <w:rPr>
+          <w:rStyle w:val="NormalTok"/>
+        </w:rPr>
+        <w:t xml:space="preserve"> k2 </w:t>
+      </w:r>
+      <w:r>
+        <w:rPr>
+          <w:rStyle w:val="OperatorTok"/>
+        </w:rPr>
+        <w:t xml:space="preserve">=</w:t>
+      </w:r>
+      <w:r>
+        <w:rPr>
+          <w:rStyle w:val="NormalTok"/>
+        </w:rPr>
+        <w:t xml:space="preserve"> rhs(t </w:t>
+      </w:r>
+      <w:r>
+        <w:rPr>
+          <w:rStyle w:val="OperatorTok"/>
+        </w:rPr>
+        <w:t xml:space="preserve">+</w:t>
+      </w:r>
+      <w:r>
+        <w:rPr>
+          <w:rStyle w:val="NormalTok"/>
+        </w:rPr>
+        <w:t xml:space="preserve"> dt</w:t>
+      </w:r>
+      <w:r>
+        <w:rPr>
+          <w:rStyle w:val="OperatorTok"/>
+        </w:rPr>
+        <w:t xml:space="preserve">/</w:t>
+      </w:r>
+      <w:r>
+        <w:rPr>
+          <w:rStyle w:val="DecValTok"/>
+        </w:rPr>
+        <w:t xml:space="preserve">2</w:t>
+      </w:r>
+      <w:r>
+        <w:rPr>
+          <w:rStyle w:val="NormalTok"/>
+        </w:rPr>
+        <w:t xml:space="preserve">, y </w:t>
+      </w:r>
+      <w:r>
+        <w:rPr>
+          <w:rStyle w:val="OperatorTok"/>
+        </w:rPr>
+        <w:t xml:space="preserve">+</w:t>
+      </w:r>
+      <w:r>
+        <w:rPr>
+          <w:rStyle w:val="NormalTok"/>
+        </w:rPr>
+        <w:t xml:space="preserve"> dt</w:t>
+      </w:r>
+      <w:r>
+        <w:rPr>
+          <w:rStyle w:val="OperatorTok"/>
+        </w:rPr>
+        <w:t xml:space="preserve">/</w:t>
+      </w:r>
+      <w:r>
+        <w:rPr>
+          <w:rStyle w:val="DecValTok"/>
+        </w:rPr>
+        <w:t xml:space="preserve">2</w:t>
+      </w:r>
+      <w:r>
+        <w:rPr>
+          <w:rStyle w:val="OperatorTok"/>
+        </w:rPr>
+        <w:t xml:space="preserve">*</w:t>
+      </w:r>
+      <w:r>
+        <w:rPr>
+          <w:rStyle w:val="NormalTok"/>
+        </w:rPr>
+        <w:t xml:space="preserve">k1)</w:t>
+      </w:r>
+      <w:r>
+        <w:br/>
+      </w:r>
+      <w:r>
+        <w:rPr>
+          <w:rStyle w:val="NormalTok"/>
+        </w:rPr>
+        <w:t xml:space="preserve">        k3 </w:t>
+      </w:r>
+      <w:r>
+        <w:rPr>
+          <w:rStyle w:val="OperatorTok"/>
+        </w:rPr>
+        <w:t xml:space="preserve">=</w:t>
+      </w:r>
+      <w:r>
+        <w:rPr>
+          <w:rStyle w:val="NormalTok"/>
+        </w:rPr>
+        <w:t xml:space="preserve"> rhs(t </w:t>
+      </w:r>
+      <w:r>
+        <w:rPr>
+          <w:rStyle w:val="OperatorTok"/>
+        </w:rPr>
+        <w:t xml:space="preserve">+</w:t>
+      </w:r>
+      <w:r>
+        <w:rPr>
+          <w:rStyle w:val="NormalTok"/>
+        </w:rPr>
+        <w:t xml:space="preserve"> dt</w:t>
+      </w:r>
+      <w:r>
+        <w:rPr>
+          <w:rStyle w:val="OperatorTok"/>
+        </w:rPr>
+        <w:t xml:space="preserve">/</w:t>
+      </w:r>
+      <w:r>
+        <w:rPr>
+          <w:rStyle w:val="DecValTok"/>
+        </w:rPr>
+        <w:t xml:space="preserve">2</w:t>
+      </w:r>
+      <w:r>
+        <w:rPr>
+          <w:rStyle w:val="NormalTok"/>
+        </w:rPr>
+        <w:t xml:space="preserve">, y </w:t>
+      </w:r>
+      <w:r>
+        <w:rPr>
+          <w:rStyle w:val="OperatorTok"/>
+        </w:rPr>
+        <w:t xml:space="preserve">+</w:t>
+      </w:r>
+      <w:r>
+        <w:rPr>
+          <w:rStyle w:val="NormalTok"/>
+        </w:rPr>
+        <w:t xml:space="preserve"> dt</w:t>
+      </w:r>
+      <w:r>
+        <w:rPr>
+          <w:rStyle w:val="OperatorTok"/>
+        </w:rPr>
+        <w:t xml:space="preserve">/</w:t>
+      </w:r>
+      <w:r>
+        <w:rPr>
+          <w:rStyle w:val="DecValTok"/>
+        </w:rPr>
+        <w:t xml:space="preserve">2</w:t>
+      </w:r>
+      <w:r>
+        <w:rPr>
+          <w:rStyle w:val="OperatorTok"/>
+        </w:rPr>
+        <w:t xml:space="preserve">*</w:t>
+      </w:r>
+      <w:r>
+        <w:rPr>
+          <w:rStyle w:val="NormalTok"/>
+        </w:rPr>
+        <w:t xml:space="preserve">k2)</w:t>
+      </w:r>
+      <w:r>
+        <w:rPr>
+          <w:rStyle w:val="OperatorTok"/>
+        </w:rPr>
+        <w:t xml:space="preserve">;</w:t>
+      </w:r>
+      <w:r>
+        <w:rPr>
+          <w:rStyle w:val="NormalTok"/>
+        </w:rPr>
+        <w:t xml:space="preserve"> k4 </w:t>
+      </w:r>
+      <w:r>
+        <w:rPr>
+          <w:rStyle w:val="OperatorTok"/>
+        </w:rPr>
+        <w:t xml:space="preserve">=</w:t>
+      </w:r>
+      <w:r>
+        <w:rPr>
+          <w:rStyle w:val="NormalTok"/>
+        </w:rPr>
+        <w:t xml:space="preserve"> rhs(t </w:t>
+      </w:r>
+      <w:r>
+        <w:rPr>
+          <w:rStyle w:val="OperatorTok"/>
+        </w:rPr>
+        <w:t xml:space="preserve">+</w:t>
+      </w:r>
+      <w:r>
+        <w:rPr>
+          <w:rStyle w:val="NormalTok"/>
+        </w:rPr>
+        <w:t xml:space="preserve"> dt, y </w:t>
+      </w:r>
+      <w:r>
+        <w:rPr>
+          <w:rStyle w:val="OperatorTok"/>
+        </w:rPr>
+        <w:t xml:space="preserve">+</w:t>
+      </w:r>
+      <w:r>
+        <w:rPr>
+          <w:rStyle w:val="NormalTok"/>
+        </w:rPr>
+        <w:t xml:space="preserve"> dt</w:t>
+      </w:r>
+      <w:r>
+        <w:rPr>
+          <w:rStyle w:val="OperatorTok"/>
+        </w:rPr>
+        <w:t xml:space="preserve">*</w:t>
+      </w:r>
+      <w:r>
+        <w:rPr>
+          <w:rStyle w:val="NormalTok"/>
+        </w:rPr>
+        <w:t xml:space="preserve">k3)</w:t>
+      </w:r>
+      <w:r>
+        <w:br/>
+      </w:r>
+      <w:r>
+        <w:rPr>
+          <w:rStyle w:val="NormalTok"/>
+        </w:rPr>
+        <w:t xml:space="preserve">        y </w:t>
+      </w:r>
+      <w:r>
+        <w:rPr>
+          <w:rStyle w:val="OperatorTok"/>
+        </w:rPr>
+        <w:t xml:space="preserve">+=</w:t>
+      </w:r>
+      <w:r>
+        <w:rPr>
+          <w:rStyle w:val="NormalTok"/>
+        </w:rPr>
+        <w:t xml:space="preserve"> dt</w:t>
+      </w:r>
+      <w:r>
+        <w:rPr>
+          <w:rStyle w:val="OperatorTok"/>
+        </w:rPr>
+        <w:t xml:space="preserve">/</w:t>
+      </w:r>
+      <w:r>
+        <w:rPr>
+          <w:rStyle w:val="DecValTok"/>
+        </w:rPr>
+        <w:t xml:space="preserve">6</w:t>
+      </w:r>
+      <w:r>
+        <w:rPr>
+          <w:rStyle w:val="NormalTok"/>
+        </w:rPr>
+        <w:t xml:space="preserve"> </w:t>
+      </w:r>
+      <w:r>
+        <w:rPr>
+          <w:rStyle w:val="OperatorTok"/>
+        </w:rPr>
+        <w:t xml:space="preserve">*</w:t>
+      </w:r>
+      <w:r>
+        <w:rPr>
+          <w:rStyle w:val="NormalTok"/>
+        </w:rPr>
+        <w:t xml:space="preserve"> (k1 </w:t>
+      </w:r>
+      <w:r>
+        <w:rPr>
+          <w:rStyle w:val="OperatorTok"/>
+        </w:rPr>
+        <w:t xml:space="preserve">+</w:t>
+      </w:r>
+      <w:r>
+        <w:rPr>
+          <w:rStyle w:val="NormalTok"/>
+        </w:rPr>
+        <w:t xml:space="preserve"> </w:t>
+      </w:r>
+      <w:r>
+        <w:rPr>
+          <w:rStyle w:val="DecValTok"/>
+        </w:rPr>
+        <w:t xml:space="preserve">2</w:t>
+      </w:r>
+      <w:r>
+        <w:rPr>
+          <w:rStyle w:val="OperatorTok"/>
+        </w:rPr>
+        <w:t xml:space="preserve">*</w:t>
+      </w:r>
+      <w:r>
+        <w:rPr>
+          <w:rStyle w:val="NormalTok"/>
+        </w:rPr>
+        <w:t xml:space="preserve">k2 </w:t>
+      </w:r>
+      <w:r>
+        <w:rPr>
+          <w:rStyle w:val="OperatorTok"/>
+        </w:rPr>
+        <w:t xml:space="preserve">+</w:t>
+      </w:r>
+      <w:r>
+        <w:rPr>
+          <w:rStyle w:val="NormalTok"/>
+        </w:rPr>
+        <w:t xml:space="preserve"> </w:t>
+      </w:r>
+      <w:r>
+        <w:rPr>
+          <w:rStyle w:val="DecValTok"/>
+        </w:rPr>
+        <w:t xml:space="preserve">2</w:t>
+      </w:r>
+      <w:r>
+        <w:rPr>
+          <w:rStyle w:val="OperatorTok"/>
+        </w:rPr>
+        <w:t xml:space="preserve">*</w:t>
+      </w:r>
+      <w:r>
+        <w:rPr>
+          <w:rStyle w:val="NormalTok"/>
+        </w:rPr>
+        <w:t xml:space="preserve">k3 </w:t>
+      </w:r>
+      <w:r>
+        <w:rPr>
+          <w:rStyle w:val="OperatorTok"/>
+        </w:rPr>
+        <w:t xml:space="preserve">+</w:t>
+      </w:r>
+      <w:r>
+        <w:rPr>
+          <w:rStyle w:val="NormalTok"/>
+        </w:rPr>
+        <w:t xml:space="preserve"> k4)</w:t>
+      </w:r>
+      <w:r>
+        <w:rPr>
+          <w:rStyle w:val="OperatorTok"/>
+        </w:rPr>
+        <w:t xml:space="preserve">;</w:t>
+      </w:r>
+      <w:r>
+        <w:rPr>
+          <w:rStyle w:val="NormalTok"/>
+        </w:rPr>
+        <w:t xml:space="preserve"> t </w:t>
+      </w:r>
+      <w:r>
+        <w:rPr>
+          <w:rStyle w:val="OperatorTok"/>
+        </w:rPr>
+        <w:t xml:space="preserve">+=</w:t>
+      </w:r>
+      <w:r>
+        <w:rPr>
+          <w:rStyle w:val="NormalTok"/>
+        </w:rPr>
+        <w:t xml:space="preserve"> dt</w:t>
+      </w:r>
+      <w:r>
+        <w:br/>
+      </w:r>
+      <w:r>
+        <w:rPr>
+          <w:rStyle w:val="NormalTok"/>
+        </w:rPr>
+        <w:t xml:space="preserve">        ts.append(t)</w:t>
+      </w:r>
+      <w:r>
+        <w:rPr>
+          <w:rStyle w:val="OperatorTok"/>
+        </w:rPr>
+        <w:t xml:space="preserve">;</w:t>
+      </w:r>
+      <w:r>
+        <w:rPr>
+          <w:rStyle w:val="NormalTok"/>
+        </w:rPr>
+        <w:t xml:space="preserve"> ys.append(y)</w:t>
+      </w:r>
+      <w:r>
+        <w:br/>
+      </w:r>
+      <w:r>
+        <w:rPr>
+          <w:rStyle w:val="NormalTok"/>
+        </w:rPr>
+        <w:t xml:space="preserve">        </w:t>
+      </w:r>
+      <w:r>
+        <w:rPr>
+          <w:rStyle w:val="ControlFlowTok"/>
+        </w:rPr>
+        <w:t xml:space="preserve">if</w:t>
+      </w:r>
+      <w:r>
+        <w:rPr>
+          <w:rStyle w:val="NormalTok"/>
+        </w:rPr>
+        <w:t xml:space="preserve"> stop </w:t>
+      </w:r>
+      <w:r>
+        <w:rPr>
+          <w:rStyle w:val="KeywordTok"/>
+        </w:rPr>
+        <w:t xml:space="preserve">and</w:t>
+      </w:r>
+      <w:r>
+        <w:rPr>
+          <w:rStyle w:val="NormalTok"/>
+        </w:rPr>
+        <w:t xml:space="preserve"> stop(t, y): </w:t>
+      </w:r>
+      <w:r>
+        <w:rPr>
+          <w:rStyle w:val="ControlFlowTok"/>
+        </w:rPr>
+        <w:t xml:space="preserve">break</w:t>
+      </w:r>
+      <w:r>
+        <w:br/>
+      </w:r>
+      <w:r>
+        <w:rPr>
+          <w:rStyle w:val="NormalTok"/>
+        </w:rPr>
+        <w:t xml:space="preserve">    </w:t>
+      </w:r>
+      <w:r>
+        <w:rPr>
+          <w:rStyle w:val="ControlFlowTok"/>
+        </w:rPr>
+        <w:t xml:space="preserve">return</w:t>
+      </w:r>
+      <w:r>
+        <w:rPr>
+          <w:rStyle w:val="NormalTok"/>
+        </w:rPr>
+        <w:t xml:space="preserve"> ts, ys</w:t>
+      </w:r>
+    </w:p>
+    <w:p>
+      <w:pPr>
+        <w:pStyle w:val="FirstParagraph"/>
+      </w:pPr>
+      <w:r>
+        <w:t xml:space="preserve">Each solver is checked against the worked examples of this document, so the numbers in the tables</w:t>
+      </w:r>
+      <w:r>
+        <w:t xml:space="preserve"> </w:t>
+      </w:r>
+      <w:r>
+        <w:t xml:space="preserve">and the figures are produced by the same code that a reader can run.</w:t>
+      </w:r>
+    </w:p>
+    <w:bookmarkEnd w:id="79"/>
+    <w:bookmarkStart w:id="83" w:name="X23f703a5b3167e168d574605adab1b76f34ca68"/>
+    <w:p>
+      <w:pPr>
+        <w:pStyle w:val="Heading2"/>
+      </w:pPr>
+      <w:r>
+        <w:t xml:space="preserve">19. Uncertainty quantification and sensitivity</w:t>
+      </w:r>
+    </w:p>
+    <w:p>
+      <w:pPr>
+        <w:pStyle w:val="FirstParagraph"/>
+      </w:pPr>
+      <w:r>
         <w:t xml:space="preserve">A point design is not credible without an uncertainty band. The model propagates the dominant input</w:t>
       </w:r>
       <w:r>
@@ -17691,7 +19291,7 @@
         <w:t xml:space="preserve"> </w:t>
       </w:r>
       <w:r>
-        <w:t xml:space="preserve">the honest cost of compute is several times the naive peak-based figure. The single weakest input is</w:t>
+        <w:t xml:space="preserve">the realistic cost of compute is several times the naive peak-based figure. The single weakest input is</w:t>
       </w:r>
       <w:r>
         <w:t xml:space="preserve"> </w:t>
@@ -17709,18 +19309,18 @@
           <wp:inline>
             <wp:extent cx="5334000" cy="1886737"/>
             <wp:effectExtent b="0" l="0" r="0" t="0"/>
-            <wp:docPr descr="Fig. 19.1 — Monte-Carlo distributions of natural lifetime, debris probability, and total Δv across the dominant uncertainties." title="" id="62" name="Picture"/>
+            <wp:docPr descr="Fig. 19.1, Monte-Carlo distributions of natural lifetime, debris probability, and total Δv across the dominant uncertainties." title="" id="81" name="Picture"/>
             <a:graphic>
               <a:graphicData uri="http://schemas.openxmlformats.org/drawingml/2006/picture">
                 <pic:pic>
                   <pic:nvPicPr>
-                    <pic:cNvPr descr="systems_figs/fig_montecarlo.png" id="63" name="Picture"/>
+                    <pic:cNvPr descr="systems_figs/fig_montecarlo.png" id="82" name="Picture"/>
                     <pic:cNvPicPr>
                       <a:picLocks noChangeArrowheads="1" noChangeAspect="1"/>
                     </pic:cNvPicPr>
                   </pic:nvPicPr>
                   <pic:blipFill>
-                    <a:blip r:embed="rId61"/>
+                    <a:blip r:embed="rId80"/>
                     <a:stretch>
                       <a:fillRect/>
                     </a:stretch>
@@ -17752,11 +19352,11 @@
         <w:pStyle w:val="ImageCaption"/>
       </w:pPr>
       <w:r>
-        <w:t xml:space="preserve">Fig. 19.1 — Monte-Carlo distributions of natural lifetime, debris probability, and total Δv across the dominant uncertainties.</w:t>
+        <w:t xml:space="preserve">Fig. 19.1, Monte-Carlo distributions of natural lifetime, debris probability, and total Δv across the dominant uncertainties.</w:t>
       </w:r>
     </w:p>
-    <w:bookmarkEnd w:id="64"/>
-    <w:bookmarkStart w:id="71" w:name="X75af3e2abfcdea4ef8ecf50a29bce1e8bc901aa"/>
+    <w:bookmarkEnd w:id="83"/>
+    <w:bookmarkStart w:id="90" w:name="X75af3e2abfcdea4ef8ecf50a29bce1e8bc901aa"/>
     <w:p>
       <w:pPr>
         <w:pStyle w:val="Heading2"/>
@@ -17894,7 +19494,7 @@
               <w:pStyle w:val="Compact"/>
             </w:pPr>
             <w:r>
-              <w:t xml:space="preserve">Ch. 7 — fails 5-yr rule</w:t>
+              <w:t xml:space="preserve">Ch. 7, fails 5-yr rule</w:t>
             </w:r>
           </w:p>
         </w:tc>
@@ -17964,7 +19564,7 @@
               <w:pStyle w:val="Compact"/>
             </w:pPr>
             <w:r>
-              <w:t xml:space="preserve">Ch. 10 — active cooling needed</w:t>
+              <w:t xml:space="preserve">Ch. 10, active cooling needed</w:t>
             </w:r>
           </w:p>
         </w:tc>
@@ -17999,7 +19599,7 @@
               <w:pStyle w:val="Compact"/>
             </w:pPr>
             <w:r>
-              <w:t xml:space="preserve">Ch. 8 — large margin</w:t>
+              <w:t xml:space="preserve">Ch. 8, large margin</w:t>
             </w:r>
           </w:p>
         </w:tc>
@@ -18221,18 +19821,18 @@
           <wp:inline>
             <wp:extent cx="5334000" cy="3291840"/>
             <wp:effectExtent b="0" l="0" r="0" t="0"/>
-            <wp:docPr descr="Fig. 20.1 — Catastrophic debris risk for the full cluster, and the in-cluster cascade coupling versus formation spacing." title="" id="66" name="Picture"/>
+            <wp:docPr descr="Fig. 20.1, Catastrophic debris risk for the full cluster, and the in-cluster cascade coupling versus formation spacing." title="" id="85" name="Picture"/>
             <a:graphic>
               <a:graphicData uri="http://schemas.openxmlformats.org/drawingml/2006/picture">
                 <pic:pic>
                   <pic:nvPicPr>
-                    <pic:cNvPr descr="figures/fig3_debris_risk.png" id="67" name="Picture"/>
+                    <pic:cNvPr descr="figures/fig3_debris_risk.png" id="86" name="Picture"/>
                     <pic:cNvPicPr>
                       <a:picLocks noChangeArrowheads="1" noChangeAspect="1"/>
                     </pic:cNvPicPr>
                   </pic:nvPicPr>
                   <pic:blipFill>
-                    <a:blip r:embed="rId65"/>
+                    <a:blip r:embed="rId84"/>
                     <a:stretch>
                       <a:fillRect/>
                     </a:stretch>
@@ -18264,7 +19864,7 @@
         <w:pStyle w:val="ImageCaption"/>
       </w:pPr>
       <w:r>
-        <w:t xml:space="preserve">Fig. 20.1 — Catastrophic debris risk for the full cluster, and the in-cluster cascade coupling versus formation spacing.</w:t>
+        <w:t xml:space="preserve">Fig. 20.1, Catastrophic debris risk for the full cluster, and the in-cluster cascade coupling versus formation spacing.</w:t>
       </w:r>
     </w:p>
     <w:p>
@@ -18276,18 +19876,18 @@
           <wp:inline>
             <wp:extent cx="5334000" cy="3554885"/>
             <wp:effectExtent b="0" l="0" r="0" t="0"/>
-            <wp:docPr descr="Fig. 20.2 — Cumulative dose versus aluminium shielding, and the reliability-throughput trade." title="" id="69" name="Picture"/>
+            <wp:docPr descr="Fig. 20.2, Cumulative dose versus aluminium shielding, and the reliability-throughput trade." title="" id="88" name="Picture"/>
             <a:graphic>
               <a:graphicData uri="http://schemas.openxmlformats.org/drawingml/2006/picture">
                 <pic:pic>
                   <pic:nvPicPr>
-                    <pic:cNvPr descr="figures/fig4_radiation.png" id="70" name="Picture"/>
+                    <pic:cNvPr descr="figures/fig4_radiation.png" id="89" name="Picture"/>
                     <pic:cNvPicPr>
                       <a:picLocks noChangeArrowheads="1" noChangeAspect="1"/>
                     </pic:cNvPicPr>
                   </pic:nvPicPr>
                   <pic:blipFill>
-                    <a:blip r:embed="rId68"/>
+                    <a:blip r:embed="rId87"/>
                     <a:stretch>
                       <a:fillRect/>
                     </a:stretch>
@@ -18319,7 +19919,7 @@
         <w:pStyle w:val="ImageCaption"/>
       </w:pPr>
       <w:r>
-        <w:t xml:space="preserve">Fig. 20.2 — Cumulative dose versus aluminium shielding, and the reliability-throughput trade.</w:t>
+        <w:t xml:space="preserve">Fig. 20.2, Cumulative dose versus aluminium shielding, and the reliability-throughput trade.</w:t>
       </w:r>
     </w:p>
     <w:p>
@@ -18329,18 +19929,18 @@
         </w:pict>
       </w:r>
     </w:p>
-    <w:bookmarkEnd w:id="71"/>
-    <w:bookmarkEnd w:id="72"/>
-    <w:bookmarkStart w:id="82" w:name="part-v-economics-and-predictions"/>
+    <w:bookmarkEnd w:id="90"/>
+    <w:bookmarkEnd w:id="91"/>
+    <w:bookmarkStart w:id="104" w:name="part-v-economics-and-predictions"/>
     <w:p>
       <w:pPr>
         <w:pStyle w:val="Heading1"/>
       </w:pPr>
       <w:r>
-        <w:t xml:space="preserve">PART V — ECONOMICS AND PREDICTIONS</w:t>
+        <w:t xml:space="preserve">PART V, ECONOMICS AND PREDICTIONS</w:t>
       </w:r>
     </w:p>
-    <w:bookmarkStart w:id="76" w:name="X2e3f63e059a4787a3738c8a944d90eb01378ed4"/>
+    <w:bookmarkStart w:id="98" w:name="X2e3f63e059a4787a3738c8a944d90eb01378ed4"/>
     <w:p>
       <w:pPr>
         <w:pStyle w:val="Heading2"/>
@@ -18744,7 +20344,7 @@
         <w:t xml:space="preserve"> </w:t>
       </w:r>
       <w:r>
-        <w:t xml:space="preserve">The economics are therefore gated by hardware cost, lifetime, utilization, and the radiation tax —</w:t>
+        <w:t xml:space="preserve">The economics are therefore gated by hardware cost, lifetime, utilization, and the radiation tax,</w:t>
       </w:r>
       <w:r>
         <w:t xml:space="preserve"> </w:t>
@@ -19258,7 +20858,7 @@
         <w:t xml:space="preserve"> </w:t>
       </w:r>
       <w:r>
-        <w:t xml:space="preserve">its peak rating implies — quantifying, in dollars, the penalty of the interface wall. Replenishment,</w:t>
+        <w:t xml:space="preserve">its peak rating implies, quantifying, in dollars, the penalty of the interface wall. Replenishment,</w:t>
       </w:r>
       <w:r>
         <w:t xml:space="preserve"> </w:t>
@@ -19274,20 +20874,75 @@
       <w:r>
         <w:drawing>
           <wp:inline>
-            <wp:extent cx="5334000" cy="2604741"/>
+            <wp:extent cx="5334000" cy="2458219"/>
             <wp:effectExtent b="0" l="0" r="0" t="0"/>
-            <wp:docPr descr="Fig. 21.1 — Cost of useful compute versus utilization, and the radiation throughput tax by protection level." title="" id="74" name="Picture"/>
+            <wp:docPr descr="Fig. 21.1b Levelized cost of useful compute versus model-FLOPs utilization, and versus launch price. The cost is dominated by utilization and hardware, not by launch." title="" id="93" name="Picture"/>
             <a:graphic>
               <a:graphicData uri="http://schemas.openxmlformats.org/drawingml/2006/picture">
                 <pic:pic>
                   <pic:nvPicPr>
-                    <pic:cNvPr descr="systems_figs/fig_compute.png" id="75" name="Picture"/>
+                    <pic:cNvPr descr="figures2/figA7_lcoe.png" id="94" name="Picture"/>
                     <pic:cNvPicPr>
                       <a:picLocks noChangeArrowheads="1" noChangeAspect="1"/>
                     </pic:cNvPicPr>
                   </pic:nvPicPr>
                   <pic:blipFill>
-                    <a:blip r:embed="rId73"/>
+                    <a:blip r:embed="rId92"/>
+                    <a:stretch>
+                      <a:fillRect/>
+                    </a:stretch>
+                  </pic:blipFill>
+                  <pic:spPr bwMode="auto">
+                    <a:xfrm>
+                      <a:off x="0" y="0"/>
+                      <a:ext cx="5334000" cy="2458219"/>
+                    </a:xfrm>
+                    <a:prstGeom prst="rect">
+                      <a:avLst/>
+                    </a:prstGeom>
+                    <a:noFill/>
+                    <a:ln w="9525">
+                      <a:noFill/>
+                      <a:headEnd/>
+                      <a:tailEnd/>
+                    </a:ln>
+                  </pic:spPr>
+                </pic:pic>
+              </a:graphicData>
+            </a:graphic>
+          </wp:inline>
+        </w:drawing>
+      </w:r>
+    </w:p>
+    <w:p>
+      <w:pPr>
+        <w:pStyle w:val="ImageCaption"/>
+      </w:pPr>
+      <w:r>
+        <w:t xml:space="preserve">Fig. 21.1b Levelized cost of useful compute versus model-FLOPs utilization, and versus launch price. The cost is dominated by utilization and hardware, not by launch.</w:t>
+      </w:r>
+    </w:p>
+    <w:p>
+      <w:pPr>
+        <w:pStyle w:val="CaptionedFigure"/>
+      </w:pPr>
+      <w:r>
+        <w:drawing>
+          <wp:inline>
+            <wp:extent cx="5334000" cy="2604741"/>
+            <wp:effectExtent b="0" l="0" r="0" t="0"/>
+            <wp:docPr descr="Fig. 21.1, Cost of useful compute versus utilization, and the radiation throughput tax by protection level." title="" id="96" name="Picture"/>
+            <a:graphic>
+              <a:graphicData uri="http://schemas.openxmlformats.org/drawingml/2006/picture">
+                <pic:pic>
+                  <pic:nvPicPr>
+                    <pic:cNvPr descr="systems_figs/fig_compute.png" id="97" name="Picture"/>
+                    <pic:cNvPicPr>
+                      <a:picLocks noChangeArrowheads="1" noChangeAspect="1"/>
+                    </pic:cNvPicPr>
+                  </pic:nvPicPr>
+                  <pic:blipFill>
+                    <a:blip r:embed="rId95"/>
                     <a:stretch>
                       <a:fillRect/>
                     </a:stretch>
@@ -19319,11 +20974,11 @@
         <w:pStyle w:val="ImageCaption"/>
       </w:pPr>
       <w:r>
-        <w:t xml:space="preserve">Fig. 21.1 — Cost of useful compute versus utilization, and the radiation throughput tax by protection level.</w:t>
+        <w:t xml:space="preserve">Fig. 21.1, Cost of useful compute versus utilization, and the radiation throughput tax by protection level.</w:t>
       </w:r>
     </w:p>
-    <w:bookmarkEnd w:id="76"/>
-    <w:bookmarkStart w:id="80" w:name="the-launch-cost-parity-prediction"/>
+    <w:bookmarkEnd w:id="98"/>
+    <w:bookmarkStart w:id="102" w:name="the-launch-cost-parity-prediction"/>
     <w:p>
       <w:pPr>
         <w:pStyle w:val="Heading2"/>
@@ -19349,13 +21004,13 @@
         <w:t xml:space="preserve"> </w:t>
       </w:r>
       <w:r>
-        <w:t xml:space="preserve">dollars per kilogram by about 2035 under a twenty-percent learning rate — requiring on the order of</w:t>
-      </w:r>
-      <w:r>
-        <w:t xml:space="preserve"> </w:t>
-      </w:r>
-      <w:r>
-        <w:t xml:space="preserve">370,000 tonnes of additional cumulative launched mass, some 1,800 Starship launches — at which point</w:t>
+        <w:t xml:space="preserve">dollars per kilogram by about 2035 under a twenty-percent learning rate, requiring on the order of</w:t>
+      </w:r>
+      <w:r>
+        <w:t xml:space="preserve"> </w:t>
+      </w:r>
+      <w:r>
+        <w:t xml:space="preserve">370,000 tonnes of additional cumulative launched mass, some 1,800 Starship launches, at which point</w:t>
       </w:r>
       <w:r>
         <w:t xml:space="preserve"> </w:t>
@@ -19423,7 +21078,7 @@
         <w:t xml:space="preserve"> </w:t>
       </w:r>
       <w:r>
-        <w:t xml:space="preserve">anchors — full reusability at 200 tonnes and roughly two million dollars marginal cost, sustained</w:t>
+        <w:t xml:space="preserve">anchors, full reusability at 200 tonnes and roughly two million dollars marginal cost, sustained</w:t>
       </w:r>
       <w:r>
         <w:t xml:space="preserve"> </w:t>
@@ -19437,7 +21092,7 @@
         <w:pStyle w:val="BodyText"/>
       </w:pPr>
       <w:r>
-        <w:t xml:space="preserve">The prediction, stated honestly, is that launch-cost parity is more likely to arrive in the late</w:t>
+        <w:t xml:space="preserve">The prediction is that launch-cost parity is more likely to arrive in the late</w:t>
       </w:r>
       <w:r>
         <w:t xml:space="preserve"> </w:t>
@@ -19461,18 +21116,18 @@
           <wp:inline>
             <wp:extent cx="5334000" cy="2619768"/>
             <wp:effectExtent b="0" l="0" r="0" t="0"/>
-            <wp:docPr descr="Fig. 22.1 — Launch-cost learning curve (Monte-Carlo) and the distribution of the cost-parity year; median near 2044, later than the vendor’s 2035." title="" id="78" name="Picture"/>
+            <wp:docPr descr="Fig. 22.1, Launch-cost learning curve (Monte-Carlo) and the distribution of the cost-parity year; median near 2044, later than the vendor’s 2035." title="" id="100" name="Picture"/>
             <a:graphic>
               <a:graphicData uri="http://schemas.openxmlformats.org/drawingml/2006/picture">
                 <pic:pic>
                   <pic:nvPicPr>
-                    <pic:cNvPr descr="figures_pred/fig_cost_parity.png" id="79" name="Picture"/>
+                    <pic:cNvPr descr="figures_pred/fig_cost_parity.png" id="101" name="Picture"/>
                     <pic:cNvPicPr>
                       <a:picLocks noChangeArrowheads="1" noChangeAspect="1"/>
                     </pic:cNvPicPr>
                   </pic:nvPicPr>
                   <pic:blipFill>
-                    <a:blip r:embed="rId77"/>
+                    <a:blip r:embed="rId99"/>
                     <a:stretch>
                       <a:fillRect/>
                     </a:stretch>
@@ -19504,11 +21159,11 @@
         <w:pStyle w:val="ImageCaption"/>
       </w:pPr>
       <w:r>
-        <w:t xml:space="preserve">Fig. 22.1 — Launch-cost learning curve (Monte-Carlo) and the distribution of the cost-parity year; median near 2044, later than the vendor’s 2035.</w:t>
+        <w:t xml:space="preserve">Fig. 22.1, Launch-cost learning curve (Monte-Carlo) and the distribution of the cost-parity year; median near 2044, later than the vendor’s 2035.</w:t>
       </w:r>
     </w:p>
-    <w:bookmarkEnd w:id="80"/>
-    <w:bookmarkStart w:id="81" w:name="capability-and-risk-trajectory-2027-2035"/>
+    <w:bookmarkEnd w:id="102"/>
+    <w:bookmarkStart w:id="103" w:name="capability-and-risk-trajectory-2027-2035"/>
     <w:p>
       <w:pPr>
         <w:pStyle w:val="Heading2"/>
@@ -19558,7 +21213,7 @@
         <w:t xml:space="preserve"> </w:t>
       </w:r>
       <w:r>
-        <w:t xml:space="preserve">the solar cycle, and — most importantly — autonomous, cluster-coordinated debris avoidance at</w:t>
+        <w:t xml:space="preserve">the solar cycle, and, most importantly, autonomous, cluster-coordinated debris avoidance at</w:t>
       </w:r>
       <w:r>
         <w:t xml:space="preserve"> </w:t>
@@ -19612,24 +21267,24 @@
         </w:pict>
       </w:r>
     </w:p>
-    <w:bookmarkEnd w:id="81"/>
-    <w:bookmarkEnd w:id="82"/>
-    <w:bookmarkStart w:id="88" w:name="part-vi-synthesis"/>
+    <w:bookmarkEnd w:id="103"/>
+    <w:bookmarkEnd w:id="104"/>
+    <w:bookmarkStart w:id="110" w:name="part-vi-synthesis"/>
     <w:p>
       <w:pPr>
         <w:pStyle w:val="Heading1"/>
       </w:pPr>
       <w:r>
-        <w:t xml:space="preserve">PART VI — SYNTHESIS</w:t>
+        <w:t xml:space="preserve">PART VI, SYNTHESIS</w:t>
       </w:r>
     </w:p>
-    <w:bookmarkStart w:id="83" w:name="honest-caveats-and-limitations"/>
+    <w:bookmarkStart w:id="105" w:name="caveats-and-limitations"/>
     <w:p>
       <w:pPr>
         <w:pStyle w:val="Heading2"/>
       </w:pPr>
       <w:r>
-        <w:t xml:space="preserve">24. Honest caveats and limitations</w:t>
+        <w:t xml:space="preserve">24. Caveats and limitations</w:t>
       </w:r>
     </w:p>
     <w:p>
@@ -19637,7 +21292,7 @@
         <w:pStyle w:val="FirstParagraph"/>
       </w:pPr>
       <w:r>
-        <w:t xml:space="preserve">Intellectual honesty requires stating clearly what this study does and does not establish.</w:t>
+        <w:t xml:space="preserve">A complete assessment must state clearly what this study does and does not establish.</w:t>
       </w:r>
     </w:p>
     <w:p>
@@ -19669,13 +21324,13 @@
         <w:t xml:space="preserve"> </w:t>
       </w:r>
       <w:r>
-        <w:t xml:space="preserve">kilowatt-class nodes; what the vision requires — megawatt-to-gigawatt clusters, flown multi-terabit</w:t>
-      </w:r>
-      <w:r>
-        <w:t xml:space="preserve"> </w:t>
-      </w:r>
-      <w:r>
-        <w:t xml:space="preserve">formation links, dramatically cheaper launch, and in-flight formation control — has not been</w:t>
+        <w:t xml:space="preserve">kilowatt-class nodes; what the vision requires, megawatt-to-gigawatt clusters, flown multi-terabit</w:t>
+      </w:r>
+      <w:r>
+        <w:t xml:space="preserve"> </w:t>
+      </w:r>
+      <w:r>
+        <w:t xml:space="preserve">formation links, dramatically cheaper launch, and in-flight formation control, has not been</w:t>
       </w:r>
       <w:r>
         <w:t xml:space="preserve"> </w:t>
@@ -19717,7 +21372,7 @@
         <w:t xml:space="preserve"> </w:t>
       </w:r>
       <w:r>
-        <w:t xml:space="preserve">mission simulation. Finally, several widely repeated marketing claims — notably</w:t>
+        <w:t xml:space="preserve">mission simulation. Finally, several widely repeated marketing claims, notably</w:t>
       </w:r>
       <w:r>
         <w:t xml:space="preserve"> </w:t>
@@ -19732,10 +21387,7 @@
         <w:t xml:space="preserve">including launch”</w:t>
       </w:r>
       <w:r>
-        <w:t xml:space="preserve"> </w:t>
-      </w:r>
-      <w:r>
-        <w:t xml:space="preserve">— failed independent verification and are not relied upon here.</w:t>
+        <w:t xml:space="preserve">, failed independent verification and are not relied upon here.</w:t>
       </w:r>
     </w:p>
     <w:p>
@@ -19758,8 +21410,8 @@
         <w:t xml:space="preserve">number should be quoted, and they identify exactly where higher-fidelity work is needed next.</w:t>
       </w:r>
     </w:p>
-    <w:bookmarkEnd w:id="83"/>
-    <w:bookmarkStart w:id="87" w:name="X112718272980ce9d8db030edbf2c8e56c96c038"/>
+    <w:bookmarkEnd w:id="105"/>
+    <w:bookmarkStart w:id="109" w:name="X112718272980ce9d8db030edbf2c8e56c96c038"/>
     <w:p>
       <w:pPr>
         <w:pStyle w:val="Heading2"/>
@@ -19773,13 +21425,13 @@
         <w:pStyle w:val="FirstParagraph"/>
       </w:pPr>
       <w:r>
-        <w:t xml:space="preserve">The complete analysis supports a clear and defensible conclusion. Radiative cooling — the problem</w:t>
-      </w:r>
-      <w:r>
-        <w:t xml:space="preserve"> </w:t>
-      </w:r>
-      <w:r>
-        <w:t xml:space="preserve">most often assumed to be the obstacle — is the solved part, now flight-proven at the single-node</w:t>
+        <w:t xml:space="preserve">The analysis supports a clear and defensible conclusion. Radiative cooling, the problem</w:t>
+      </w:r>
+      <w:r>
+        <w:t xml:space="preserve"> </w:t>
+      </w:r>
+      <w:r>
+        <w:t xml:space="preserve">most often assumed to be the obstacle, is the solved part, now flight-proven at the single-node</w:t>
       </w:r>
       <w:r>
         <w:t xml:space="preserve"> </w:t>
@@ -19871,7 +21523,7 @@
         <w:t xml:space="preserve"> </w:t>
       </w:r>
       <w:r>
-        <w:t xml:space="preserve">answer to the formation-and-debris paradox — not behind a launch-cost milestone. The systems-level</w:t>
+        <w:t xml:space="preserve">answer to the formation-and-debris paradox, not behind a launch-cost milestone. The systems-level</w:t>
       </w:r>
       <w:r>
         <w:t xml:space="preserve"> </w:t>
@@ -19895,18 +21547,18 @@
           <wp:inline>
             <wp:extent cx="5334000" cy="4249493"/>
             <wp:effectExtent b="0" l="0" r="0" t="0"/>
-            <wp:docPr descr="Fig. 25.1 — Systems-level risk matrix: cooling is solved; debris, disposal, and economics are the open items." title="" id="85" name="Picture"/>
+            <wp:docPr descr="Fig. 25.1, Systems-level risk matrix: cooling is solved; debris, disposal, and economics are the open items." title="" id="107" name="Picture"/>
             <a:graphic>
               <a:graphicData uri="http://schemas.openxmlformats.org/drawingml/2006/picture">
                 <pic:pic>
                   <pic:nvPicPr>
-                    <pic:cNvPr descr="figures/fig7_risk_matrix.png" id="86" name="Picture"/>
+                    <pic:cNvPr descr="figures/fig7_risk_matrix.png" id="108" name="Picture"/>
                     <pic:cNvPicPr>
                       <a:picLocks noChangeArrowheads="1" noChangeAspect="1"/>
                     </pic:cNvPicPr>
                   </pic:nvPicPr>
                   <pic:blipFill>
-                    <a:blip r:embed="rId84"/>
+                    <a:blip r:embed="rId106"/>
                     <a:stretch>
                       <a:fillRect/>
                     </a:stretch>
@@ -19938,7 +21590,7 @@
         <w:pStyle w:val="ImageCaption"/>
       </w:pPr>
       <w:r>
-        <w:t xml:space="preserve">Fig. 25.1 — Systems-level risk matrix: cooling is solved; debris, disposal, and economics are the open items.</w:t>
+        <w:t xml:space="preserve">Fig. 25.1, Systems-level risk matrix: cooling is solved; debris, disposal, and economics are the open items.</w:t>
       </w:r>
     </w:p>
     <w:p>
@@ -19955,18 +21607,18 @@
         </w:pict>
       </w:r>
     </w:p>
-    <w:bookmarkEnd w:id="87"/>
-    <w:bookmarkEnd w:id="88"/>
-    <w:bookmarkStart w:id="93" w:name="X2849ac850b034a4af8859258c8c59481bcc0a0d"/>
+    <w:bookmarkEnd w:id="109"/>
+    <w:bookmarkEnd w:id="110"/>
+    <w:bookmarkStart w:id="115" w:name="X2849ac850b034a4af8859258c8c59481bcc0a0d"/>
     <w:p>
       <w:pPr>
         <w:pStyle w:val="Heading1"/>
       </w:pPr>
       <w:r>
-        <w:t xml:space="preserve">PART VII — DETAILED RESULTS, DATA, AND WORKED COMPUTATIONS</w:t>
+        <w:t xml:space="preserve">PART VII, DETAILED RESULTS, DATA, AND WORKED COMPUTATIONS</w:t>
       </w:r>
     </w:p>
-    <w:bookmarkStart w:id="89" w:name="a-worked-end-to-end-computation"/>
+    <w:bookmarkStart w:id="111" w:name="a-worked-end-to-end-computation"/>
     <w:p>
       <w:pPr>
         <w:pStyle w:val="Heading2"/>
@@ -20036,7 +21688,7 @@
         <w:t xml:space="preserve"> </w:t>
       </w:r>
       <w:r>
-        <w:t xml:space="preserve">dawn-dusk battery. The thermal load — compute plus avionics plus parasitic — sizes a modest radiator</w:t>
+        <w:t xml:space="preserve">dawn-dusk battery. The thermal load, compute plus avionics plus parasitic, sizes a modest radiator</w:t>
       </w:r>
       <w:r>
         <w:t xml:space="preserve"> </w:t>
@@ -20078,7 +21730,7 @@
         <w:t xml:space="preserve"> </w:t>
       </w:r>
       <w:r>
-        <w:t xml:space="preserve">activity — failing the five-year rule and mandating the 132 m/s de-orbit burn of Table T7. The</w:t>
+        <w:t xml:space="preserve">activity, failing the five-year rule and mandating the 132 m/s de-orbit burn of Table T7. The</w:t>
       </w:r>
       <w:r>
         <w:t xml:space="preserve"> </w:t>
@@ -20117,8 +21769,8 @@
         <w:t xml:space="preserve">produced by the open code and is reproduced by the validation suite.</w:t>
       </w:r>
     </w:p>
-    <w:bookmarkEnd w:id="89"/>
-    <w:bookmarkStart w:id="90" w:name="detailed-results-tables"/>
+    <w:bookmarkEnd w:id="111"/>
+    <w:bookmarkStart w:id="112" w:name="detailed-results-tables"/>
     <w:p>
       <w:pPr>
         <w:pStyle w:val="Heading2"/>
@@ -20165,7 +21817,7 @@
           <w:b/>
           <w:bCs/>
         </w:rPr>
-        <w:t xml:space="preserve">Table T1 — Orbital parameters versus altitude.</w:t>
+        <w:t xml:space="preserve">Table T1, Orbital parameters versus altitude.</w:t>
       </w:r>
       <w:r>
         <w:t xml:space="preserve"> </w:t>
@@ -20669,7 +22321,7 @@
           <w:b/>
           <w:bCs/>
         </w:rPr>
-        <w:t xml:space="preserve">Table T2 — Radiator area (m²) versus heat load and operating temperature</w:t>
+        <w:t xml:space="preserve">Table T2, Radiator area (m²) versus heat load and operating temperature</w:t>
       </w:r>
       <w:r>
         <w:t xml:space="preserve"> </w:t>
@@ -20939,7 +22591,7 @@
           <w:b/>
           <w:bCs/>
         </w:rPr>
-        <w:t xml:space="preserve">Table T3 — Chip-interface temperature rise and passive feasibility</w:t>
+        <w:t xml:space="preserve">Table T3, Chip-interface temperature rise and passive feasibility</w:t>
       </w:r>
       <w:r>
         <w:t xml:space="preserve"> </w:t>
@@ -21255,7 +22907,7 @@
           <w:b/>
           <w:bCs/>
         </w:rPr>
-        <w:t xml:space="preserve">Table T4 — Cumulative total ionizing dose, rad(Si), versus aluminium shielding.</w:t>
+        <w:t xml:space="preserve">Table T4, Cumulative total ionizing dose, rad(Si), versus aluminium shielding.</w:t>
       </w:r>
       <w:r>
         <w:t xml:space="preserve"> </w:t>
@@ -21539,7 +23191,7 @@
           <w:b/>
           <w:bCs/>
         </w:rPr>
-        <w:t xml:space="preserve">Table T5 — Catastrophic (&gt;1 cm) debris probability (%) for the 81-satellite cluster.</w:t>
+        <w:t xml:space="preserve">Table T5, Catastrophic (&gt;1 cm) debris probability (%) for the 81-satellite cluster.</w:t>
       </w:r>
       <w:r>
         <w:t xml:space="preserve"> </w:t>
@@ -21901,7 +23553,7 @@
           <w:b/>
           <w:bCs/>
         </w:rPr>
-        <w:t xml:space="preserve">Table T6 — In-cluster cascade neighbor-hit probability (%) versus formation spacing.</w:t>
+        <w:t xml:space="preserve">Table T6, In-cluster cascade neighbor-hit probability (%) versus formation spacing.</w:t>
       </w:r>
       <w:r>
         <w:t xml:space="preserve"> </w:t>
@@ -22107,7 +23759,7 @@
           <w:b/>
           <w:bCs/>
         </w:rPr>
-        <w:t xml:space="preserve">Table T7 — Per-satellite Δv budget and propellant.</w:t>
+        <w:t xml:space="preserve">Table T7, Per-satellite Δv budget and propellant.</w:t>
       </w:r>
       <w:r>
         <w:t xml:space="preserve"> </w:t>
@@ -22477,7 +24129,7 @@
           <w:b/>
           <w:bCs/>
         </w:rPr>
-        <w:t xml:space="preserve">Table T8 — Optical link budget versus range</w:t>
+        <w:t xml:space="preserve">Table T8, Optical link budget versus range</w:t>
       </w:r>
       <w:r>
         <w:t xml:space="preserve"> </w:t>
@@ -22726,7 +24378,7 @@
           <w:b/>
           <w:bCs/>
         </w:rPr>
-        <w:t xml:space="preserve">Table T9 — Reference satellite mass budget</w:t>
+        <w:t xml:space="preserve">Table T9, Reference satellite mass budget</w:t>
       </w:r>
       <w:r>
         <w:t xml:space="preserve"> </w:t>
@@ -23054,7 +24706,7 @@
           <w:b/>
           <w:bCs/>
         </w:rPr>
-        <w:t xml:space="preserve">Table T10 — Reference power budget.</w:t>
+        <w:t xml:space="preserve">Table T10, Reference power budget.</w:t>
       </w:r>
       <w:r>
         <w:t xml:space="preserve"> </w:t>
@@ -23316,7 +24968,7 @@
           <w:b/>
           <w:bCs/>
         </w:rPr>
-        <w:t xml:space="preserve">Table T11 — Reference design-point summary</w:t>
+        <w:t xml:space="preserve">Table T11, Reference design-point summary</w:t>
       </w:r>
       <w:r>
         <w:t xml:space="preserve"> </w:t>
@@ -23660,7 +25312,7 @@
           <w:b/>
           <w:bCs/>
         </w:rPr>
-        <w:t xml:space="preserve">Table T12 — Constellation summary (81 satellites).</w:t>
+        <w:t xml:space="preserve">Table T12, Constellation summary (81 satellites).</w:t>
       </w:r>
     </w:p>
     <w:tbl>
@@ -23821,8 +25473,8 @@
         </w:tc>
       </w:tr>
     </w:tbl>
-    <w:bookmarkEnd w:id="90"/>
-    <w:bookmarkStart w:id="91" w:name="X4ef80d11b7a22aeebf52f8f551fc1d287f74ce6"/>
+    <w:bookmarkEnd w:id="112"/>
+    <w:bookmarkStart w:id="113" w:name="X4ef80d11b7a22aeebf52f8f551fc1d287f74ce6"/>
     <w:p>
       <w:pPr>
         <w:pStyle w:val="Heading2"/>
@@ -24167,7 +25819,7 @@
         <w:t xml:space="preserve"> </w:t>
       </w:r>
       <w:r>
-        <w:t xml:space="preserve">atmospheric drag — itself varying by a factor of one hundred over the solar cycle — drives an</w:t>
+        <w:t xml:space="preserve">atmospheric drag, itself varying by a factor of one hundred over the solar cycle, drives an</w:t>
       </w:r>
       <w:r>
         <w:t xml:space="preserve"> </w:t>
@@ -24262,7 +25914,7 @@
         <w:t xml:space="preserve"> </w:t>
       </w:r>
       <w:r>
-        <w:t xml:space="preserve">collision-avoidance maneuver — without that maneuver endangering a neighbor — is an unsolved control</w:t>
+        <w:t xml:space="preserve">collision-avoidance maneuver, without that maneuver endangering a neighbor, is an unsolved control</w:t>
       </w:r>
       <w:r>
         <w:t xml:space="preserve"> </w:t>
@@ -24271,8 +25923,8 @@
         <w:t xml:space="preserve">problem at this density, and it is the operational face of the formation paradox.</w:t>
       </w:r>
     </w:p>
-    <w:bookmarkEnd w:id="91"/>
-    <w:bookmarkStart w:id="92" w:name="comparison-with-terrestrial-data-centers"/>
+    <w:bookmarkEnd w:id="113"/>
+    <w:bookmarkStart w:id="114" w:name="comparison-with-terrestrial-data-centers"/>
     <w:p>
       <w:pPr>
         <w:pStyle w:val="Heading2"/>
@@ -24310,7 +25962,7 @@
         <w:t xml:space="preserve"> </w:t>
       </w:r>
       <w:r>
-        <w:t xml:space="preserve">and on the debris and disposal obligations that have no terrestrial analogue. The honest reading is</w:t>
+        <w:t xml:space="preserve">and on the debris and disposal obligations that have no terrestrial analogue. The reading is</w:t>
       </w:r>
       <w:r>
         <w:t xml:space="preserve"> </w:t>
@@ -24334,7 +25986,7 @@
           <w:b/>
           <w:bCs/>
         </w:rPr>
-        <w:t xml:space="preserve">Table T13 — Orbital versus terrestrial data center (qualitative).</w:t>
+        <w:t xml:space="preserve">Table T13, Orbital versus terrestrial data center (qualitative).</w:t>
       </w:r>
     </w:p>
     <w:tbl>
@@ -24745,9 +26397,9 @@
         </w:pict>
       </w:r>
     </w:p>
-    <w:bookmarkEnd w:id="92"/>
-    <w:bookmarkEnd w:id="93"/>
-    <w:bookmarkStart w:id="108" w:name="back-matter"/>
+    <w:bookmarkEnd w:id="114"/>
+    <w:bookmarkEnd w:id="115"/>
+    <w:bookmarkStart w:id="130" w:name="back-matter"/>
     <w:p>
       <w:pPr>
         <w:pStyle w:val="Heading1"/>
@@ -24756,13 +26408,13 @@
         <w:t xml:space="preserve">Back matter</w:t>
       </w:r>
     </w:p>
-    <w:bookmarkStart w:id="94" w:name="X97fa58ea74ebe1fef03a364d757bd14de1f6d96"/>
+    <w:bookmarkStart w:id="116" w:name="references"/>
     <w:p>
       <w:pPr>
         <w:pStyle w:val="Heading2"/>
       </w:pPr>
       <w:r>
-        <w:t xml:space="preserve">References (verified, primary where possible)</w:t>
+        <w:t xml:space="preserve">References</w:t>
       </w:r>
     </w:p>
     <w:p>
@@ -24882,7 +26534,7 @@
           <w:i/>
           <w:iCs/>
         </w:rPr>
-        <w:t xml:space="preserve">Starcloud — H100 in orbit.</w:t>
+        <w:t xml:space="preserve">Starcloud, H100 in orbit.</w:t>
       </w:r>
       <w:r>
         <w:t xml:space="preserve"> </w:t>
@@ -25105,14 +26757,14 @@
         <w:t xml:space="preserve">solar-cell datasheets; NASA ISS Active Thermal Control System overview.</w:t>
       </w:r>
     </w:p>
-    <w:bookmarkEnd w:id="94"/>
-    <w:bookmarkStart w:id="95" w:name="Xa5f5759fad9159c193908c5014e5f5066c880b0"/>
+    <w:bookmarkEnd w:id="116"/>
+    <w:bookmarkStart w:id="117" w:name="Xa5f5759fad9159c193908c5014e5f5066c880b0"/>
     <w:p>
       <w:pPr>
         <w:pStyle w:val="Heading2"/>
       </w:pPr>
       <w:r>
-        <w:t xml:space="preserve">Appendix A — Master list of governing equations</w:t>
+        <w:t xml:space="preserve">Appendix A, Master list of governing equations</w:t>
       </w:r>
     </w:p>
     <w:tbl>
@@ -27615,14 +29267,14 @@
         </w:tc>
       </w:tr>
     </w:tbl>
-    <w:bookmarkEnd w:id="95"/>
-    <w:bookmarkStart w:id="96" w:name="appendix-b-nomenclature"/>
+    <w:bookmarkEnd w:id="117"/>
+    <w:bookmarkStart w:id="118" w:name="appendix-b-nomenclature"/>
     <w:p>
       <w:pPr>
         <w:pStyle w:val="Heading2"/>
       </w:pPr>
       <w:r>
-        <w:t xml:space="preserve">Appendix B — Nomenclature</w:t>
+        <w:t xml:space="preserve">Appendix B, Nomenclature</w:t>
       </w:r>
     </w:p>
     <w:p>
@@ -27639,14 +29291,14 @@
         <w:t xml:space="preserve">there with its units.</w:t>
       </w:r>
     </w:p>
-    <w:bookmarkEnd w:id="96"/>
-    <w:bookmarkStart w:id="97" w:name="appendix-c-data-sources-and-confidence"/>
+    <w:bookmarkEnd w:id="118"/>
+    <w:bookmarkStart w:id="119" w:name="appendix-c-data-sources-and-confidence"/>
     <w:p>
       <w:pPr>
         <w:pStyle w:val="Heading2"/>
       </w:pPr>
       <w:r>
-        <w:t xml:space="preserve">Appendix C — Data sources and confidence</w:t>
+        <w:t xml:space="preserve">Appendix C, Data sources and confidence</w:t>
       </w:r>
     </w:p>
     <w:p>
@@ -27693,14 +29345,14 @@
         <w:t xml:space="preserve">1-mm-to-1-cm debris flux is the least model-validated quantity.</w:t>
       </w:r>
     </w:p>
-    <w:bookmarkEnd w:id="97"/>
-    <w:bookmarkStart w:id="98" w:name="appendix-d-reproduction-and-code"/>
+    <w:bookmarkEnd w:id="119"/>
+    <w:bookmarkStart w:id="120" w:name="appendix-d-reproduction-and-code"/>
     <w:p>
       <w:pPr>
         <w:pStyle w:val="Heading2"/>
       </w:pPr>
       <w:r>
-        <w:t xml:space="preserve">Appendix D — Reproduction and code</w:t>
+        <w:t xml:space="preserve">Appendix D, Reproduction and code</w:t>
       </w:r>
     </w:p>
     <w:p>
@@ -27708,7 +29360,7 @@
         <w:pStyle w:val="FirstParagraph"/>
       </w:pPr>
       <w:r>
-        <w:t xml:space="preserve">The entire analysis is open and reproducible. From the repository,</w:t>
+        <w:t xml:space="preserve">The entire analysis is open. From the repository,</w:t>
       </w:r>
     </w:p>
     <w:p>
@@ -27798,7 +29450,7 @@
           <w:b/>
           <w:bCs/>
         </w:rPr>
-        <w:t xml:space="preserve">Orbital decay — Eq. (7.3).</w:t>
+        <w:t xml:space="preserve">Orbital decay, Eq. (7.3).</w:t>
       </w:r>
     </w:p>
     <w:p>
@@ -28463,7 +30115,7 @@
           <w:b/>
           <w:bCs/>
         </w:rPr>
-        <w:t xml:space="preserve">Radiator sizing — Eq. (10.3).</w:t>
+        <w:t xml:space="preserve">Radiator sizing, Eq. (10.3).</w:t>
       </w:r>
     </w:p>
     <w:p>
@@ -28708,7 +30360,7 @@
           <w:b/>
           <w:bCs/>
         </w:rPr>
-        <w:t xml:space="preserve">Debris collision probability — Eq. (9.1).</w:t>
+        <w:t xml:space="preserve">Debris collision probability, Eq. (9.1).</w:t>
       </w:r>
     </w:p>
     <w:p>
@@ -28887,7 +30539,7 @@
           <w:b/>
           <w:bCs/>
         </w:rPr>
-        <w:t xml:space="preserve">Controlled de-orbit Δv — Eq. (15.1).</w:t>
+        <w:t xml:space="preserve">Controlled de-orbit Δv, Eq. (15.1).</w:t>
       </w:r>
     </w:p>
     <w:p>
@@ -29141,7 +30793,7 @@
           <w:b/>
           <w:bCs/>
         </w:rPr>
-        <w:t xml:space="preserve">Coupled thermal-throttle workload (excerpt) — Chapter 17.</w:t>
+        <w:t xml:space="preserve">Coupled thermal-throttle workload (excerpt), Chapter 17.</w:t>
       </w:r>
     </w:p>
     <w:p>
@@ -29317,7 +30969,7 @@
           <w:b/>
           <w:bCs/>
         </w:rPr>
-        <w:t xml:space="preserve">Levelized cost of compute — Eq. (21.1).</w:t>
+        <w:t xml:space="preserve">Levelized cost of compute, Eq. (21.1).</w:t>
       </w:r>
     </w:p>
     <w:p>
@@ -29613,14 +31265,14 @@
         <w:t xml:space="preserve"> util)</w:t>
       </w:r>
     </w:p>
-    <w:bookmarkEnd w:id="98"/>
-    <w:bookmarkStart w:id="107" w:name="appendix-e-extended-derivations"/>
+    <w:bookmarkEnd w:id="120"/>
+    <w:bookmarkStart w:id="129" w:name="appendix-e-extended-derivations"/>
     <w:p>
       <w:pPr>
         <w:pStyle w:val="Heading2"/>
       </w:pPr>
       <w:r>
-        <w:t xml:space="preserve">Appendix E — Extended derivations</w:t>
+        <w:t xml:space="preserve">Appendix E, Extended derivations</w:t>
       </w:r>
     </w:p>
     <w:p>
@@ -29637,7 +31289,7 @@
         <w:t xml:space="preserve">the main text, so that the volume is mathematically self-contained.</w:t>
       </w:r>
     </w:p>
-    <w:bookmarkStart w:id="99" w:name="X2a80dffde1cc8eefa78dcdbda3d88a45fd72945"/>
+    <w:bookmarkStart w:id="121" w:name="X2a80dffde1cc8eefa78dcdbda3d88a45fd72945"/>
     <w:p>
       <w:pPr>
         <w:pStyle w:val="Heading3"/>
@@ -30760,8 +32412,8 @@
         <w:t xml:space="preserve">fundamental constants. This is the foundation of every radiator result in Chapter 10.</w:t>
       </w:r>
     </w:p>
-    <w:bookmarkEnd w:id="99"/>
-    <w:bookmarkStart w:id="100" w:name="X4c20d6d59466b0830aef63d21b34b7838499df3"/>
+    <w:bookmarkEnd w:id="121"/>
+    <w:bookmarkStart w:id="122" w:name="X4c20d6d59466b0830aef63d21b34b7838499df3"/>
     <w:p>
       <w:pPr>
         <w:pStyle w:val="Heading3"/>
@@ -31572,8 +33224,8 @@
         <w:t xml:space="preserve">debris impacts.</w:t>
       </w:r>
     </w:p>
-    <w:bookmarkEnd w:id="100"/>
-    <w:bookmarkStart w:id="101" w:name="Xdbf318ef9ef49d2256131d87dbdb96f21a45420"/>
+    <w:bookmarkEnd w:id="122"/>
+    <w:bookmarkStart w:id="123" w:name="Xdbf318ef9ef49d2256131d87dbdb96f21a45420"/>
     <w:p>
       <w:pPr>
         <w:pStyle w:val="Heading3"/>
@@ -32528,8 +34180,8 @@
         <w:t xml:space="preserve">re-entry within one or two orbits, satisfying the disposal requirement.</w:t>
       </w:r>
     </w:p>
-    <w:bookmarkEnd w:id="101"/>
-    <w:bookmarkStart w:id="102" w:name="X67de4cda1ab68499f29ee0b2ccb5ff91efedb0e"/>
+    <w:bookmarkEnd w:id="123"/>
+    <w:bookmarkStart w:id="124" w:name="X67de4cda1ab68499f29ee0b2ccb5ff91efedb0e"/>
     <w:p>
       <w:pPr>
         <w:pStyle w:val="Heading3"/>
@@ -33018,7 +34670,7 @@
         <w:t xml:space="preserve"> </w:t>
       </w:r>
       <w:r>
-        <w:t xml:space="preserve">to leading order — augmented by the</w:t>
+        <w:t xml:space="preserve">to leading order, augmented by the</w:t>
       </w:r>
       <w:r>
         <w:t xml:space="preserve"> </w:t>
@@ -33047,10 +34699,7 @@
         </m:f>
       </m:oMath>
       <w:r>
-        <w:t xml:space="preserve"> </w:t>
-      </w:r>
-      <w:r>
-        <w:t xml:space="preserve">— which is the quadratic-in-time drift</w:t>
+        <w:t xml:space="preserve">, which is the quadratic-in-time drift</w:t>
       </w:r>
       <w:r>
         <w:t xml:space="preserve"> </w:t>
@@ -33059,8 +34708,8 @@
         <w:t xml:space="preserve">discussed in Chapter 28 and the reason the formation needs active relative control.</w:t>
       </w:r>
     </w:p>
-    <w:bookmarkEnd w:id="102"/>
-    <w:bookmarkStart w:id="103" w:name="e.5-the-rocket-equation"/>
+    <w:bookmarkEnd w:id="124"/>
+    <w:bookmarkStart w:id="125" w:name="e.5-the-rocket-equation"/>
     <w:p>
       <w:pPr>
         <w:pStyle w:val="Heading3"/>
@@ -33780,8 +35429,8 @@
         <w:t xml:space="preserve">propulsion) so dramatically reduces propellant mass for a given Δv.</w:t>
       </w:r>
     </w:p>
-    <w:bookmarkEnd w:id="103"/>
-    <w:bookmarkStart w:id="104" w:name="e.6-k-of-n-redundancy"/>
+    <w:bookmarkEnd w:id="125"/>
+    <w:bookmarkStart w:id="126" w:name="e.6-k-of-n-redundancy"/>
     <w:p>
       <w:pPr>
         <w:pStyle w:val="Heading3"/>
@@ -34143,8 +35792,8 @@
         <w:t xml:space="preserve">satellite and the over-provisioned satellites within a cluster (Chapter 16).</w:t>
       </w:r>
     </w:p>
-    <w:bookmarkEnd w:id="104"/>
-    <w:bookmarkStart w:id="105" w:name="X1e2c0797711e5a38d867b0034b661cf8291a89f"/>
+    <w:bookmarkEnd w:id="126"/>
+    <w:bookmarkStart w:id="127" w:name="X1e2c0797711e5a38d867b0034b661cf8291a89f"/>
     <w:p>
       <w:pPr>
         <w:pStyle w:val="Heading3"/>
@@ -34809,8 +36458,8 @@
         <w:t xml:space="preserve">K in two to four steps.</w:t>
       </w:r>
     </w:p>
-    <w:bookmarkEnd w:id="105"/>
-    <w:bookmarkStart w:id="106" w:name="e.8-the-capital-recovery-factor"/>
+    <w:bookmarkEnd w:id="127"/>
+    <w:bookmarkStart w:id="128" w:name="e.8-the-capital-recovery-factor"/>
     <w:p>
       <w:pPr>
         <w:pStyle w:val="Heading3"/>
@@ -35243,9 +36892,9 @@
         <w:t xml:space="preserve">End of report.</w:t>
       </w:r>
     </w:p>
-    <w:bookmarkEnd w:id="106"/>
-    <w:bookmarkEnd w:id="107"/>
-    <w:bookmarkEnd w:id="108"/>
+    <w:bookmarkEnd w:id="128"/>
+    <w:bookmarkEnd w:id="129"/>
+    <w:bookmarkEnd w:id="130"/>
     <w:sectPr>
       <w:footnotePr>
         <w:numRestart w:val="eachSect"/>

</xml_diff>

<commit_message>
Add design-margins module and methodology chapter (AIAA S-120-2006 MGA, NASA GSFC system/power margins, TRL scale), with sources
</commit_message>
<xml_diff>
--- a/report/Report_II_Complete.docx
+++ b/report/Report_II_Complete.docx
@@ -314,6 +314,12 @@
       <w:r>
         <w:t xml:space="preserve">3. Reference architecture and scope</w:t>
       </w:r>
+      <w:r>
+        <w:t xml:space="preserve"> </w:t>
+      </w:r>
+      <w:r>
+        <w:t xml:space="preserve">3A. Design methodology, margins, and readiness</w:t>
+      </w:r>
     </w:p>
     <w:p>
       <w:pPr>
@@ -3173,7 +3179,7 @@
     </w:p>
     <w:bookmarkEnd w:id="14"/>
     <w:bookmarkEnd w:id="15"/>
-    <w:bookmarkStart w:id="19" w:name="part-i-introduction-and-context"/>
+    <w:bookmarkStart w:id="20" w:name="part-i-introduction-and-context"/>
     <w:p>
       <w:pPr>
         <w:pStyle w:val="Heading1"/>
@@ -3671,8 +3677,503 @@
       </w:r>
     </w:p>
     <w:bookmarkEnd w:id="18"/>
+    <w:bookmarkStart w:id="19" w:name="Xfc230b641c8ac1af95bb2946bc374ee51dc38ae"/>
+    <w:p>
+      <w:pPr>
+        <w:pStyle w:val="Heading2"/>
+      </w:pPr>
+      <w:r>
+        <w:t xml:space="preserve">3A. Design methodology, margins, and readiness</w:t>
+      </w:r>
+    </w:p>
+    <w:p>
+      <w:pPr>
+        <w:pStyle w:val="FirstParagraph"/>
+      </w:pPr>
+      <w:r>
+        <w:t xml:space="preserve">A conceptual design is judged not only by its point estimates but by the allowances it carries</w:t>
+      </w:r>
+      <w:r>
+        <w:t xml:space="preserve"> </w:t>
+      </w:r>
+      <w:r>
+        <w:t xml:space="preserve">against growth and uncertainty. This analysis follows the practice of the NASA Systems Engineering</w:t>
+      </w:r>
+      <w:r>
+        <w:t xml:space="preserve"> </w:t>
+      </w:r>
+      <w:r>
+        <w:t xml:space="preserve">Handbook (NASA/SP-2016-6105), which tracks resource margins as technical performance measures</w:t>
+      </w:r>
+      <w:r>
+        <w:t xml:space="preserve"> </w:t>
+      </w:r>
+      <w:r>
+        <w:t xml:space="preserve">rather than prescribing fixed numbers, together with the quantitative allowances that flight</w:t>
+      </w:r>
+      <w:r>
+        <w:t xml:space="preserve"> </w:t>
+      </w:r>
+      <w:r>
+        <w:t xml:space="preserve">programs apply.</w:t>
+      </w:r>
+    </w:p>
+    <w:p>
+      <w:pPr>
+        <w:pStyle w:val="BodyText"/>
+      </w:pPr>
+      <w:r>
+        <w:rPr>
+          <w:b/>
+          <w:bCs/>
+        </w:rPr>
+        <w:t xml:space="preserve">Mass growth.</w:t>
+      </w:r>
+      <w:r>
+        <w:t xml:space="preserve"> </w:t>
+      </w:r>
+      <w:r>
+        <w:t xml:space="preserve">AIAA S-120-2006 sets a mass-growth allowance by hardware category for an estimated</w:t>
+      </w:r>
+      <w:r>
+        <w:t xml:space="preserve"> </w:t>
+      </w:r>
+      <w:r>
+        <w:t xml:space="preserve">design: 30 percent for small electronics and solar arrays, 25 percent for structures, mechanisms,</w:t>
+      </w:r>
+      <w:r>
+        <w:t xml:space="preserve"> </w:t>
+      </w:r>
+      <w:r>
+        <w:t xml:space="preserve">thermal control, batteries, and propulsion, 20 percent for large electronics, and 60 percent for</w:t>
+      </w:r>
+      <w:r>
+        <w:t xml:space="preserve"> </w:t>
+      </w:r>
+      <w:r>
+        <w:t xml:space="preserve">harness. On top of the per-item allowance, the NASA Goddard Integrated Design Center applies a</w:t>
+      </w:r>
+      <w:r>
+        <w:t xml:space="preserve"> </w:t>
+      </w:r>
+      <w:r>
+        <w:t xml:space="preserve">system-level mass margin of about 30 percent at the pre-Phase-A concept stage. Published mass-growth</w:t>
+      </w:r>
+      <w:r>
+        <w:t xml:space="preserve"> </w:t>
+      </w:r>
+      <w:r>
+        <w:t xml:space="preserve">data from operational programs show actual growth often exceeds the AIAA allowance, so these figures</w:t>
+      </w:r>
+      <w:r>
+        <w:t xml:space="preserve"> </w:t>
+      </w:r>
+      <w:r>
+        <w:t xml:space="preserve">are treated as lower bounds. The reference dry mass reported in Chapter 12 is a current-best-estimate;</w:t>
+      </w:r>
+      <w:r>
+        <w:t xml:space="preserve"> </w:t>
+      </w:r>
+      <w:r>
+        <w:t xml:space="preserve">applying the allowances above (implemented in the margins module) gives the predicted mass a program</w:t>
+      </w:r>
+      <w:r>
+        <w:t xml:space="preserve"> </w:t>
+      </w:r>
+      <w:r>
+        <w:t xml:space="preserve">would budget.</w:t>
+      </w:r>
+    </w:p>
+    <w:p>
+      <w:pPr>
+        <w:pStyle w:val="BodyText"/>
+      </w:pPr>
+      <w:r>
+        <w:rPr>
+          <w:b/>
+          <w:bCs/>
+        </w:rPr>
+        <w:t xml:space="preserve">Power.</w:t>
+      </w:r>
+      <w:r>
+        <w:t xml:space="preserve"> </w:t>
+      </w:r>
+      <w:r>
+        <w:t xml:space="preserve">The Goddard practice sizes the power system for a minimum 30 percent contingency of</w:t>
+      </w:r>
+      <w:r>
+        <w:t xml:space="preserve"> </w:t>
+      </w:r>
+      <w:r>
+        <w:t xml:space="preserve">delivered power over the current-best-estimate load, evaluated at the worst-case operational scenario</w:t>
+      </w:r>
+      <w:r>
+        <w:t xml:space="preserve"> </w:t>
+      </w:r>
+      <w:r>
+        <w:t xml:space="preserve">at end of life. The dawn-dusk power margin of Chapter 11 is interpreted against this rule.</w:t>
+      </w:r>
+    </w:p>
+    <w:p>
+      <w:pPr>
+        <w:pStyle w:val="BodyText"/>
+      </w:pPr>
+      <w:r>
+        <w:rPr>
+          <w:b/>
+          <w:bCs/>
+        </w:rPr>
+        <w:t xml:space="preserve">Readiness.</w:t>
+      </w:r>
+      <w:r>
+        <w:t xml:space="preserve"> </w:t>
+      </w:r>
+      <w:r>
+        <w:t xml:space="preserve">Progress is measured on the NASA nine-level technology-readiness scale, from basic</w:t>
+      </w:r>
+      <w:r>
+        <w:t xml:space="preserve"> </w:t>
+      </w:r>
+      <w:r>
+        <w:t xml:space="preserve">principles observed (level 1) to a system flight-proven through successful operations (level 9). The</w:t>
+      </w:r>
+      <w:r>
+        <w:t xml:space="preserve"> </w:t>
+      </w:r>
+      <w:r>
+        <w:t xml:space="preserve">components of the reference architecture sit near the middle: a single accelerator has operated in</w:t>
+      </w:r>
+      <w:r>
+        <w:t xml:space="preserve"> </w:t>
+      </w:r>
+      <w:r>
+        <w:t xml:space="preserve">orbit and a processor has been ground-tested for radiation (component levels 5 to 6), while the</w:t>
+      </w:r>
+      <w:r>
+        <w:t xml:space="preserve"> </w:t>
+      </w:r>
+      <w:r>
+        <w:t xml:space="preserve">constellation-scale system, the flown multi-terabit formation links, and validated formation</w:t>
+      </w:r>
+      <w:r>
+        <w:t xml:space="preserve"> </w:t>
+      </w:r>
+      <w:r>
+        <w:t xml:space="preserve">station-keeping remain at low system readiness. The gap between component and system readiness is the</w:t>
+      </w:r>
+      <w:r>
+        <w:t xml:space="preserve"> </w:t>
+      </w:r>
+      <w:r>
+        <w:t xml:space="preserve">central programmatic risk identified in Chapter 23.</w:t>
+      </w:r>
+    </w:p>
+    <w:tbl>
+      <w:tblPr>
+        <w:tblStyle w:val="Table"/>
+        <w:tblW w:type="pct" w:w="5000"/>
+        <w:tblLayout w:type="fixed"/>
+        <w:tblLook w:firstRow="1" w:lastRow="0" w:firstColumn="0" w:lastColumn="0" w:noHBand="0" w:noVBand="0" w:val="0020"/>
+      </w:tblPr>
+      <w:tblGrid>
+        <w:gridCol w:w="2640"/>
+        <w:gridCol w:w="2640"/>
+        <w:gridCol w:w="2640"/>
+      </w:tblGrid>
+      <w:tr>
+        <w:trPr>
+          <w:tblHeader w:val="on"/>
+        </w:trPr>
+        <w:tc>
+          <w:tcPr/>
+          <w:p>
+            <w:pPr>
+              <w:pStyle w:val="Compact"/>
+            </w:pPr>
+            <w:r>
+              <w:t xml:space="preserve">Allowance</w:t>
+            </w:r>
+          </w:p>
+        </w:tc>
+        <w:tc>
+          <w:tcPr/>
+          <w:p>
+            <w:pPr>
+              <w:pStyle w:val="Compact"/>
+            </w:pPr>
+            <w:r>
+              <w:t xml:space="preserve">Value</w:t>
+            </w:r>
+          </w:p>
+        </w:tc>
+        <w:tc>
+          <w:tcPr/>
+          <w:p>
+            <w:pPr>
+              <w:pStyle w:val="Compact"/>
+            </w:pPr>
+            <w:r>
+              <w:t xml:space="preserve">Source</w:t>
+            </w:r>
+          </w:p>
+        </w:tc>
+      </w:tr>
+      <w:tr>
+        <w:tc>
+          <w:tcPr/>
+          <w:p>
+            <w:pPr>
+              <w:pStyle w:val="Compact"/>
+            </w:pPr>
+            <w:r>
+              <w:t xml:space="preserve">Mass growth, small electronics and solar array</w:t>
+            </w:r>
+          </w:p>
+        </w:tc>
+        <w:tc>
+          <w:tcPr/>
+          <w:p>
+            <w:pPr>
+              <w:pStyle w:val="Compact"/>
+            </w:pPr>
+            <w:r>
+              <w:t xml:space="preserve">30 percent</w:t>
+            </w:r>
+          </w:p>
+        </w:tc>
+        <w:tc>
+          <w:tcPr/>
+          <w:p>
+            <w:pPr>
+              <w:pStyle w:val="Compact"/>
+            </w:pPr>
+            <w:r>
+              <w:t xml:space="preserve">AIAA S-120-2006</w:t>
+            </w:r>
+          </w:p>
+        </w:tc>
+      </w:tr>
+      <w:tr>
+        <w:tc>
+          <w:tcPr/>
+          <w:p>
+            <w:pPr>
+              <w:pStyle w:val="Compact"/>
+            </w:pPr>
+            <w:r>
+              <w:t xml:space="preserve">Mass growth, structures, thermal, battery, propulsion</w:t>
+            </w:r>
+          </w:p>
+        </w:tc>
+        <w:tc>
+          <w:tcPr/>
+          <w:p>
+            <w:pPr>
+              <w:pStyle w:val="Compact"/>
+            </w:pPr>
+            <w:r>
+              <w:t xml:space="preserve">25 percent</w:t>
+            </w:r>
+          </w:p>
+        </w:tc>
+        <w:tc>
+          <w:tcPr/>
+          <w:p>
+            <w:pPr>
+              <w:pStyle w:val="Compact"/>
+            </w:pPr>
+            <w:r>
+              <w:t xml:space="preserve">AIAA S-120-2006</w:t>
+            </w:r>
+          </w:p>
+        </w:tc>
+      </w:tr>
+      <w:tr>
+        <w:tc>
+          <w:tcPr/>
+          <w:p>
+            <w:pPr>
+              <w:pStyle w:val="Compact"/>
+            </w:pPr>
+            <w:r>
+              <w:t xml:space="preserve">Mass growth, large electronics</w:t>
+            </w:r>
+          </w:p>
+        </w:tc>
+        <w:tc>
+          <w:tcPr/>
+          <w:p>
+            <w:pPr>
+              <w:pStyle w:val="Compact"/>
+            </w:pPr>
+            <w:r>
+              <w:t xml:space="preserve">20 percent</w:t>
+            </w:r>
+          </w:p>
+        </w:tc>
+        <w:tc>
+          <w:tcPr/>
+          <w:p>
+            <w:pPr>
+              <w:pStyle w:val="Compact"/>
+            </w:pPr>
+            <w:r>
+              <w:t xml:space="preserve">AIAA S-120-2006</w:t>
+            </w:r>
+          </w:p>
+        </w:tc>
+      </w:tr>
+      <w:tr>
+        <w:tc>
+          <w:tcPr/>
+          <w:p>
+            <w:pPr>
+              <w:pStyle w:val="Compact"/>
+            </w:pPr>
+            <w:r>
+              <w:t xml:space="preserve">Mass growth, harness</w:t>
+            </w:r>
+          </w:p>
+        </w:tc>
+        <w:tc>
+          <w:tcPr/>
+          <w:p>
+            <w:pPr>
+              <w:pStyle w:val="Compact"/>
+            </w:pPr>
+            <w:r>
+              <w:t xml:space="preserve">60 percent</w:t>
+            </w:r>
+          </w:p>
+        </w:tc>
+        <w:tc>
+          <w:tcPr/>
+          <w:p>
+            <w:pPr>
+              <w:pStyle w:val="Compact"/>
+            </w:pPr>
+            <w:r>
+              <w:t xml:space="preserve">AIAA S-120-2006</w:t>
+            </w:r>
+          </w:p>
+        </w:tc>
+      </w:tr>
+      <w:tr>
+        <w:tc>
+          <w:tcPr/>
+          <w:p>
+            <w:pPr>
+              <w:pStyle w:val="Compact"/>
+            </w:pPr>
+            <w:r>
+              <w:t xml:space="preserve">System-level mass margin, pre-Phase-A</w:t>
+            </w:r>
+          </w:p>
+        </w:tc>
+        <w:tc>
+          <w:tcPr/>
+          <w:p>
+            <w:pPr>
+              <w:pStyle w:val="Compact"/>
+            </w:pPr>
+            <w:r>
+              <w:t xml:space="preserve">30 percent</w:t>
+            </w:r>
+          </w:p>
+        </w:tc>
+        <w:tc>
+          <w:tcPr/>
+          <w:p>
+            <w:pPr>
+              <w:pStyle w:val="Compact"/>
+            </w:pPr>
+            <w:r>
+              <w:t xml:space="preserve">NASA GSFC Integrated Design Center</w:t>
+            </w:r>
+          </w:p>
+        </w:tc>
+      </w:tr>
+      <w:tr>
+        <w:tc>
+          <w:tcPr/>
+          <w:p>
+            <w:pPr>
+              <w:pStyle w:val="Compact"/>
+            </w:pPr>
+            <w:r>
+              <w:t xml:space="preserve">Power contingency over best estimate, worst-case end of life</w:t>
+            </w:r>
+          </w:p>
+        </w:tc>
+        <w:tc>
+          <w:tcPr/>
+          <w:p>
+            <w:pPr>
+              <w:pStyle w:val="Compact"/>
+            </w:pPr>
+            <w:r>
+              <w:t xml:space="preserve">30 percent minimum</w:t>
+            </w:r>
+          </w:p>
+        </w:tc>
+        <w:tc>
+          <w:tcPr/>
+          <w:p>
+            <w:pPr>
+              <w:pStyle w:val="Compact"/>
+            </w:pPr>
+            <w:r>
+              <w:t xml:space="preserve">NASA GSFC Integrated Design Center</w:t>
+            </w:r>
+          </w:p>
+        </w:tc>
+      </w:tr>
+      <w:tr>
+        <w:tc>
+          <w:tcPr/>
+          <w:p>
+            <w:pPr>
+              <w:pStyle w:val="Compact"/>
+            </w:pPr>
+            <w:r>
+              <w:t xml:space="preserve">Readiness framework</w:t>
+            </w:r>
+          </w:p>
+        </w:tc>
+        <w:tc>
+          <w:tcPr/>
+          <w:p>
+            <w:pPr>
+              <w:pStyle w:val="Compact"/>
+            </w:pPr>
+            <w:r>
+              <w:t xml:space="preserve">levels 1 to 9</w:t>
+            </w:r>
+          </w:p>
+        </w:tc>
+        <w:tc>
+          <w:tcPr/>
+          <w:p>
+            <w:pPr>
+              <w:pStyle w:val="Compact"/>
+            </w:pPr>
+            <w:r>
+              <w:t xml:space="preserve">NASA Systems Engineering Handbook, NASA/SP-2016-6105</w:t>
+            </w:r>
+          </w:p>
+        </w:tc>
+      </w:tr>
+    </w:tbl>
+    <w:p>
+      <w:r>
+        <w:pict>
+          <v:rect style="width:0;height:1.5pt" o:hralign="center" o:hrstd="t" o:hr="t"/>
+        </w:pict>
+      </w:r>
+    </w:p>
     <w:bookmarkEnd w:id="19"/>
-    <w:bookmarkStart w:id="35" w:name="part-ii-the-orbital-environment"/>
+    <w:bookmarkEnd w:id="20"/>
+    <w:bookmarkStart w:id="36" w:name="part-ii-the-orbital-environment"/>
     <w:p>
       <w:pPr>
         <w:pStyle w:val="Heading1"/>
@@ -3681,7 +4182,7 @@
         <w:t xml:space="preserve">PART II, THE ORBITAL ENVIRONMENT</w:t>
       </w:r>
     </w:p>
-    <w:bookmarkStart w:id="20" w:name="orbital-mechanics-of-a-circular-orbit"/>
+    <w:bookmarkStart w:id="21" w:name="orbital-mechanics-of-a-circular-orbit"/>
     <w:p>
       <w:pPr>
         <w:pStyle w:val="Heading2"/>
@@ -4724,8 +5225,8 @@
         <w:t xml:space="preserve">.</w:t>
       </w:r>
     </w:p>
-    <w:bookmarkEnd w:id="20"/>
-    <w:bookmarkStart w:id="21" w:name="sun-synchronous-orbits-and-j2-precession"/>
+    <w:bookmarkEnd w:id="21"/>
+    <w:bookmarkStart w:id="22" w:name="sun-synchronous-orbits-and-j2-precession"/>
     <w:p>
       <w:pPr>
         <w:pStyle w:val="Heading2"/>
@@ -5531,8 +6032,8 @@
         <w:t xml:space="preserve">decisive advantage for a high-power, thermally sensitive payload.</w:t>
       </w:r>
     </w:p>
-    <w:bookmarkEnd w:id="21"/>
-    <w:bookmarkStart w:id="25" w:name="X5d8eb5df9ce872601c783d8f232c04d346f88c7"/>
+    <w:bookmarkEnd w:id="22"/>
+    <w:bookmarkStart w:id="26" w:name="X5d8eb5df9ce872601c783d8f232c04d346f88c7"/>
     <w:p>
       <w:pPr>
         <w:pStyle w:val="Heading2"/>
@@ -6206,18 +6707,18 @@
           <wp:inline>
             <wp:extent cx="5334000" cy="2456668"/>
             <wp:effectExtent b="0" l="0" r="0" t="0"/>
-            <wp:docPr descr="Fig. 6.1 Critical beta angle versus altitude, and eclipse fraction versus beta at 650 km. A dawn-dusk orbit holds the beta angle high, so the satellite stays sunlit." title="" id="23" name="Picture"/>
+            <wp:docPr descr="Fig. 6.1 Critical beta angle versus altitude, and eclipse fraction versus beta at 650 km. A dawn-dusk orbit holds the beta angle high, so the satellite stays sunlit." title="" id="24" name="Picture"/>
             <a:graphic>
               <a:graphicData uri="http://schemas.openxmlformats.org/drawingml/2006/picture">
                 <pic:pic>
                   <pic:nvPicPr>
-                    <pic:cNvPr descr="figures2/figA1_eclipse.png" id="24" name="Picture"/>
+                    <pic:cNvPr descr="figures2/figA1_eclipse.png" id="25" name="Picture"/>
                     <pic:cNvPicPr>
                       <a:picLocks noChangeArrowheads="1" noChangeAspect="1"/>
                     </pic:cNvPicPr>
                   </pic:nvPicPr>
                   <pic:blipFill>
-                    <a:blip r:embed="rId22"/>
+                    <a:blip r:embed="rId23"/>
                     <a:stretch>
                       <a:fillRect/>
                     </a:stretch>
@@ -6252,8 +6753,8 @@
         <w:t xml:space="preserve">Fig. 6.1 Critical beta angle versus altitude, and eclipse fraction versus beta at 650 km. A dawn-dusk orbit holds the beta angle high, so the satellite stays sunlit.</w:t>
       </w:r>
     </w:p>
-    <w:bookmarkEnd w:id="25"/>
-    <w:bookmarkStart w:id="29" w:name="the-neutral-atmosphere-and-orbital-decay"/>
+    <w:bookmarkEnd w:id="26"/>
+    <w:bookmarkStart w:id="30" w:name="the-neutral-atmosphere-and-orbital-decay"/>
     <w:p>
       <w:pPr>
         <w:pStyle w:val="Heading2"/>
@@ -7746,18 +8247,18 @@
           <wp:inline>
             <wp:extent cx="5334000" cy="3698864"/>
             <wp:effectExtent b="0" l="0" r="0" t="0"/>
-            <wp:docPr descr="Fig. 7.1, Natural orbital lifetime versus altitude with the solar-cycle uncertainty band; at 650 km the realistic lifetime fails the five-year disposal rule." title="" id="27" name="Picture"/>
+            <wp:docPr descr="Fig. 7.1, Natural orbital lifetime versus altitude with the solar-cycle uncertainty band; at 650 km the realistic lifetime fails the five-year disposal rule." title="" id="28" name="Picture"/>
             <a:graphic>
               <a:graphicData uri="http://schemas.openxmlformats.org/drawingml/2006/picture">
                 <pic:pic>
                   <pic:nvPicPr>
-                    <pic:cNvPr descr="figures/fig1_orbital_decay.png" id="28" name="Picture"/>
+                    <pic:cNvPr descr="figures/fig1_orbital_decay.png" id="29" name="Picture"/>
                     <pic:cNvPicPr>
                       <a:picLocks noChangeArrowheads="1" noChangeAspect="1"/>
                     </pic:cNvPicPr>
                   </pic:nvPicPr>
                   <pic:blipFill>
-                    <a:blip r:embed="rId26"/>
+                    <a:blip r:embed="rId27"/>
                     <a:stretch>
                       <a:fillRect/>
                     </a:stretch>
@@ -7792,8 +8293,8 @@
         <w:t xml:space="preserve">Fig. 7.1, Natural orbital lifetime versus altitude with the solar-cycle uncertainty band; at 650 km the realistic lifetime fails the five-year disposal rule.</w:t>
       </w:r>
     </w:p>
-    <w:bookmarkEnd w:id="29"/>
-    <w:bookmarkStart w:id="33" w:name="the-ionizing-radiation-environment"/>
+    <w:bookmarkEnd w:id="30"/>
+    <w:bookmarkStart w:id="34" w:name="the-ionizing-radiation-environment"/>
     <w:p>
       <w:pPr>
         <w:pStyle w:val="Heading2"/>
@@ -8094,18 +8595,18 @@
           <wp:inline>
             <wp:extent cx="5334000" cy="3427984"/>
             <wp:effectExtent b="0" l="0" r="0" t="0"/>
-            <wp:docPr descr="Fig. 8.1 Cumulative five-year ionizing dose versus aluminium shielding, with the memory tolerance and the mission requirement marked. Ten millimeters of aluminium keeps the dose well below the first-irregularity threshold." title="" id="31" name="Picture"/>
+            <wp:docPr descr="Fig. 8.1 Cumulative five-year ionizing dose versus aluminium shielding, with the memory tolerance and the mission requirement marked. Ten millimeters of aluminium keeps the dose well below the first-irregularity threshold." title="" id="32" name="Picture"/>
             <a:graphic>
               <a:graphicData uri="http://schemas.openxmlformats.org/drawingml/2006/picture">
                 <pic:pic>
                   <pic:nvPicPr>
-                    <pic:cNvPr descr="figures2/figA5_dose.png" id="32" name="Picture"/>
+                    <pic:cNvPr descr="figures2/figA5_dose.png" id="33" name="Picture"/>
                     <pic:cNvPicPr>
                       <a:picLocks noChangeArrowheads="1" noChangeAspect="1"/>
                     </pic:cNvPicPr>
                   </pic:nvPicPr>
                   <pic:blipFill>
-                    <a:blip r:embed="rId30"/>
+                    <a:blip r:embed="rId31"/>
                     <a:stretch>
                       <a:fillRect/>
                     </a:stretch>
@@ -8310,8 +8811,8 @@
         <w:t xml:space="preserve">twenty percent, which must be carried explicitly in any efficiency figure.</w:t>
       </w:r>
     </w:p>
-    <w:bookmarkEnd w:id="33"/>
-    <w:bookmarkStart w:id="34" w:name="the-orbital-debris-environment"/>
+    <w:bookmarkEnd w:id="34"/>
+    <w:bookmarkStart w:id="35" w:name="the-orbital-debris-environment"/>
     <w:p>
       <w:pPr>
         <w:pStyle w:val="Heading2"/>
@@ -8893,9 +9394,9 @@
         </w:pict>
       </w:r>
     </w:p>
-    <w:bookmarkEnd w:id="34"/>
     <w:bookmarkEnd w:id="35"/>
-    <w:bookmarkStart w:id="74" w:name="part-iii-spacecraft-subsystems"/>
+    <w:bookmarkEnd w:id="36"/>
+    <w:bookmarkStart w:id="75" w:name="part-iii-spacecraft-subsystems"/>
     <w:p>
       <w:pPr>
         <w:pStyle w:val="Heading1"/>
@@ -8904,7 +9405,7 @@
         <w:t xml:space="preserve">PART III, SPACECRAFT SUBSYSTEMS</w:t>
       </w:r>
     </w:p>
-    <w:bookmarkStart w:id="45" w:name="thermal-control"/>
+    <w:bookmarkStart w:id="46" w:name="thermal-control"/>
     <w:p>
       <w:pPr>
         <w:pStyle w:val="Heading2"/>
@@ -10332,18 +10833,18 @@
           <wp:inline>
             <wp:extent cx="5334000" cy="2456668"/>
             <wp:effectExtent b="0" l="0" r="0" t="0"/>
-            <wp:docPr descr="Fig. 10.1 Radiator equilibrium temperature versus heat flux, and the radiator area required for one megawatt versus operating temperature. Running hotter reduces area at the cost of silicon lifetime." title="" id="37" name="Picture"/>
+            <wp:docPr descr="Fig. 10.1 Radiator equilibrium temperature versus heat flux, and the radiator area required for one megawatt versus operating temperature. Running hotter reduces area at the cost of silicon lifetime." title="" id="38" name="Picture"/>
             <a:graphic>
               <a:graphicData uri="http://schemas.openxmlformats.org/drawingml/2006/picture">
                 <pic:pic>
                   <pic:nvPicPr>
-                    <pic:cNvPr descr="figures2/figA3_radiator.png" id="38" name="Picture"/>
+                    <pic:cNvPr descr="figures2/figA3_radiator.png" id="39" name="Picture"/>
                     <pic:cNvPicPr>
                       <a:picLocks noChangeArrowheads="1" noChangeAspect="1"/>
                     </pic:cNvPicPr>
                   </pic:nvPicPr>
                   <pic:blipFill>
-                    <a:blip r:embed="rId36"/>
+                    <a:blip r:embed="rId37"/>
                     <a:stretch>
                       <a:fillRect/>
                     </a:stretch>
@@ -10830,18 +11331,18 @@
           <wp:inline>
             <wp:extent cx="5334000" cy="2459772"/>
             <wp:effectExtent b="0" l="0" r="0" t="0"/>
-            <wp:docPr descr="Fig. 10.2 Earth view factor versus altitude, and the combined albedo, Earth-infrared, and solar load on a four-square-meter surface. External loads set the parasitic fraction in the radiator sizing." title="" id="40" name="Picture"/>
+            <wp:docPr descr="Fig. 10.2 Earth view factor versus altitude, and the combined albedo, Earth-infrared, and solar load on a four-square-meter surface. External loads set the parasitic fraction in the radiator sizing." title="" id="41" name="Picture"/>
             <a:graphic>
               <a:graphicData uri="http://schemas.openxmlformats.org/drawingml/2006/picture">
                 <pic:pic>
                   <pic:nvPicPr>
-                    <pic:cNvPr descr="figures2/figA2_loads.png" id="41" name="Picture"/>
+                    <pic:cNvPr descr="figures2/figA2_loads.png" id="42" name="Picture"/>
                     <pic:cNvPicPr>
                       <a:picLocks noChangeArrowheads="1" noChangeAspect="1"/>
                     </pic:cNvPicPr>
                   </pic:nvPicPr>
                   <pic:blipFill>
-                    <a:blip r:embed="rId39"/>
+                    <a:blip r:embed="rId40"/>
                     <a:stretch>
                       <a:fillRect/>
                     </a:stretch>
@@ -11396,18 +11897,18 @@
           <wp:inline>
             <wp:extent cx="5334000" cy="3459634"/>
             <wp:effectExtent b="0" l="0" r="0" t="0"/>
-            <wp:docPr descr="Fig. 10.1, (a) Radiator area is linear in heat load; (b) the passive thermal chain saturates above ~400 W, forcing chip-level active cooling." title="" id="43" name="Picture"/>
+            <wp:docPr descr="Fig. 10.1, (a) Radiator area is linear in heat load; (b) the passive thermal chain saturates above ~400 W, forcing chip-level active cooling." title="" id="44" name="Picture"/>
             <a:graphic>
               <a:graphicData uri="http://schemas.openxmlformats.org/drawingml/2006/picture">
                 <pic:pic>
                   <pic:nvPicPr>
-                    <pic:cNvPr descr="figures/fig2_thermal_wall.png" id="44" name="Picture"/>
+                    <pic:cNvPr descr="figures/fig2_thermal_wall.png" id="45" name="Picture"/>
                     <pic:cNvPicPr>
                       <a:picLocks noChangeArrowheads="1" noChangeAspect="1"/>
                     </pic:cNvPicPr>
                   </pic:nvPicPr>
                   <pic:blipFill>
-                    <a:blip r:embed="rId42"/>
+                    <a:blip r:embed="rId43"/>
                     <a:stretch>
                       <a:fillRect/>
                     </a:stretch>
@@ -11442,8 +11943,8 @@
         <w:t xml:space="preserve">Fig. 10.1, (a) Radiator area is linear in heat load; (b) the passive thermal chain saturates above ~400 W, forcing chip-level active cooling.</w:t>
       </w:r>
     </w:p>
-    <w:bookmarkEnd w:id="45"/>
-    <w:bookmarkStart w:id="49" w:name="electrical-power"/>
+    <w:bookmarkEnd w:id="46"/>
+    <w:bookmarkStart w:id="50" w:name="electrical-power"/>
     <w:p>
       <w:pPr>
         <w:pStyle w:val="Heading2"/>
@@ -12468,18 +12969,18 @@
           <wp:inline>
             <wp:extent cx="5334000" cy="2608107"/>
             <wp:effectExtent b="0" l="0" r="0" t="0"/>
-            <wp:docPr descr="Fig. 11.1, Array area versus load, and triple-junction degradation over the mission." title="" id="47" name="Picture"/>
+            <wp:docPr descr="Fig. 11.1, Array area versus load, and triple-junction degradation over the mission." title="" id="48" name="Picture"/>
             <a:graphic>
               <a:graphicData uri="http://schemas.openxmlformats.org/drawingml/2006/picture">
                 <pic:pic>
                   <pic:nvPicPr>
-                    <pic:cNvPr descr="systems_figs/fig_power.png" id="48" name="Picture"/>
+                    <pic:cNvPr descr="systems_figs/fig_power.png" id="49" name="Picture"/>
                     <pic:cNvPicPr>
                       <a:picLocks noChangeArrowheads="1" noChangeAspect="1"/>
                     </pic:cNvPicPr>
                   </pic:nvPicPr>
                   <pic:blipFill>
-                    <a:blip r:embed="rId46"/>
+                    <a:blip r:embed="rId47"/>
                     <a:stretch>
                       <a:fillRect/>
                     </a:stretch>
@@ -12514,8 +13015,8 @@
         <w:t xml:space="preserve">Fig. 11.1, Array area versus load, and triple-junction degradation over the mission.</w:t>
       </w:r>
     </w:p>
-    <w:bookmarkEnd w:id="49"/>
-    <w:bookmarkStart w:id="53" w:name="structures-and-mass"/>
+    <w:bookmarkEnd w:id="50"/>
+    <w:bookmarkStart w:id="54" w:name="structures-and-mass"/>
     <w:p>
       <w:pPr>
         <w:pStyle w:val="Heading2"/>
@@ -13389,18 +13890,18 @@
           <wp:inline>
             <wp:extent cx="5334000" cy="4681880"/>
             <wp:effectExtent b="0" l="0" r="0" t="0"/>
-            <wp:docPr descr="Fig. 12.1 Reference satellite dry-mass breakdown by subsystem, closed self-consistently by the integrated model." title="" id="51" name="Picture"/>
+            <wp:docPr descr="Fig. 12.1 Reference satellite dry-mass breakdown by subsystem, closed self-consistently by the integrated model." title="" id="52" name="Picture"/>
             <a:graphic>
               <a:graphicData uri="http://schemas.openxmlformats.org/drawingml/2006/picture">
                 <pic:pic>
                   <pic:nvPicPr>
-                    <pic:cNvPr descr="figures2/figA8_mass.png" id="52" name="Picture"/>
+                    <pic:cNvPr descr="figures2/figA8_mass.png" id="53" name="Picture"/>
                     <pic:cNvPicPr>
                       <a:picLocks noChangeArrowheads="1" noChangeAspect="1"/>
                     </pic:cNvPicPr>
                   </pic:nvPicPr>
                   <pic:blipFill>
-                    <a:blip r:embed="rId50"/>
+                    <a:blip r:embed="rId51"/>
                     <a:stretch>
                       <a:fillRect/>
                     </a:stretch>
@@ -13435,8 +13936,8 @@
         <w:t xml:space="preserve">Fig. 12.1 Reference satellite dry-mass breakdown by subsystem, closed self-consistently by the integrated model.</w:t>
       </w:r>
     </w:p>
-    <w:bookmarkEnd w:id="53"/>
-    <w:bookmarkStart w:id="54" w:name="X63cb9f37665b9f150c1577425ead9308a982ab3"/>
+    <w:bookmarkEnd w:id="54"/>
+    <w:bookmarkStart w:id="55" w:name="X63cb9f37665b9f150c1577425ead9308a982ab3"/>
     <w:p>
       <w:pPr>
         <w:pStyle w:val="Heading2"/>
@@ -14160,8 +14661,8 @@
         <w:t xml:space="preserve">link and any long inter-satellite hop.</w:t>
       </w:r>
     </w:p>
-    <w:bookmarkEnd w:id="54"/>
-    <w:bookmarkStart w:id="61" w:name="X6ae4c679d3cd8d01d6fb60e2d3c40a4ea80d1a8"/>
+    <w:bookmarkEnd w:id="55"/>
+    <w:bookmarkStart w:id="62" w:name="X6ae4c679d3cd8d01d6fb60e2d3c40a4ea80d1a8"/>
     <w:p>
       <w:pPr>
         <w:pStyle w:val="Heading2"/>
@@ -14691,18 +15192,18 @@
           <wp:inline>
             <wp:extent cx="5334000" cy="2456668"/>
             <wp:effectExtent b="0" l="0" r="0" t="0"/>
-            <wp:docPr descr="Fig. 14.2 Transmit power required to hold a three-decibel link margin versus range, against the one-watt terminal limit, and the pointing-loss sensitivity to jitter. Range and pointing together force the tight formation." title="" id="56" name="Picture"/>
+            <wp:docPr descr="Fig. 14.2 Transmit power required to hold a three-decibel link margin versus range, against the one-watt terminal limit, and the pointing-loss sensitivity to jitter. Range and pointing together force the tight formation." title="" id="57" name="Picture"/>
             <a:graphic>
               <a:graphicData uri="http://schemas.openxmlformats.org/drawingml/2006/picture">
                 <pic:pic>
                   <pic:nvPicPr>
-                    <pic:cNvPr descr="figures2/figA4_link.png" id="57" name="Picture"/>
+                    <pic:cNvPr descr="figures2/figA4_link.png" id="58" name="Picture"/>
                     <pic:cNvPicPr>
                       <a:picLocks noChangeArrowheads="1" noChangeAspect="1"/>
                     </pic:cNvPicPr>
                   </pic:nvPicPr>
                   <pic:blipFill>
-                    <a:blip r:embed="rId55"/>
+                    <a:blip r:embed="rId56"/>
                     <a:stretch>
                       <a:fillRect/>
                     </a:stretch>
@@ -15279,18 +15780,18 @@
           <wp:inline>
             <wp:extent cx="5334000" cy="2604741"/>
             <wp:effectExtent b="0" l="0" r="0" t="0"/>
-            <wp:docPr descr="Fig. 14.1, Inter-satellite free-space loss versus range and pointing-loss sensitivity." title="" id="59" name="Picture"/>
+            <wp:docPr descr="Fig. 14.1, Inter-satellite free-space loss versus range and pointing-loss sensitivity." title="" id="60" name="Picture"/>
             <a:graphic>
               <a:graphicData uri="http://schemas.openxmlformats.org/drawingml/2006/picture">
                 <pic:pic>
                   <pic:nvPicPr>
-                    <pic:cNvPr descr="systems_figs/fig_comms.png" id="60" name="Picture"/>
+                    <pic:cNvPr descr="systems_figs/fig_comms.png" id="61" name="Picture"/>
                     <pic:cNvPicPr>
                       <a:picLocks noChangeArrowheads="1" noChangeAspect="1"/>
                     </pic:cNvPicPr>
                   </pic:nvPicPr>
                   <pic:blipFill>
-                    <a:blip r:embed="rId58"/>
+                    <a:blip r:embed="rId59"/>
                     <a:stretch>
                       <a:fillRect/>
                     </a:stretch>
@@ -15325,8 +15826,8 @@
         <w:t xml:space="preserve">Fig. 14.1, Inter-satellite free-space loss versus range and pointing-loss sensitivity.</w:t>
       </w:r>
     </w:p>
-    <w:bookmarkEnd w:id="61"/>
-    <w:bookmarkStart w:id="65" w:name="propulsion-and-end-of-life-disposal"/>
+    <w:bookmarkEnd w:id="62"/>
+    <w:bookmarkStart w:id="66" w:name="propulsion-and-end-of-life-disposal"/>
     <w:p>
       <w:pPr>
         <w:pStyle w:val="Heading2"/>
@@ -16396,18 +16897,18 @@
           <wp:inline>
             <wp:extent cx="5334000" cy="3251761"/>
             <wp:effectExtent b="0" l="0" r="0" t="0"/>
-            <wp:docPr descr="Fig. 15.1, Per-satellite Δv budget (de-orbit dominates) and propellant mass by propulsion type." title="" id="63" name="Picture"/>
+            <wp:docPr descr="Fig. 15.1, Per-satellite Δv budget (de-orbit dominates) and propellant mass by propulsion type." title="" id="64" name="Picture"/>
             <a:graphic>
               <a:graphicData uri="http://schemas.openxmlformats.org/drawingml/2006/picture">
                 <pic:pic>
                   <pic:nvPicPr>
-                    <pic:cNvPr descr="figures/fig5_deltav.png" id="64" name="Picture"/>
+                    <pic:cNvPr descr="figures/fig5_deltav.png" id="65" name="Picture"/>
                     <pic:cNvPicPr>
                       <a:picLocks noChangeArrowheads="1" noChangeAspect="1"/>
                     </pic:cNvPicPr>
                   </pic:nvPicPr>
                   <pic:blipFill>
-                    <a:blip r:embed="rId62"/>
+                    <a:blip r:embed="rId63"/>
                     <a:stretch>
                       <a:fillRect/>
                     </a:stretch>
@@ -16442,8 +16943,8 @@
         <w:t xml:space="preserve">Fig. 15.1, Per-satellite Δv budget (de-orbit dominates) and propellant mass by propulsion type.</w:t>
       </w:r>
     </w:p>
-    <w:bookmarkEnd w:id="65"/>
-    <w:bookmarkStart w:id="69" w:name="X72d468b889d4049fe64ab25e8d7aac33b521080"/>
+    <w:bookmarkEnd w:id="66"/>
+    <w:bookmarkStart w:id="70" w:name="X72d468b889d4049fe64ab25e8d7aac33b521080"/>
     <w:p>
       <w:pPr>
         <w:pStyle w:val="Heading2"/>
@@ -17103,18 +17604,18 @@
           <wp:inline>
             <wp:extent cx="5334000" cy="2604741"/>
             <wp:effectExtent b="0" l="0" r="0" t="0"/>
-            <wp:docPr descr="Fig. 16.1, Per-node reliability versus time and the over-provisioning needed to hold capacity." title="" id="67" name="Picture"/>
+            <wp:docPr descr="Fig. 16.1, Per-node reliability versus time and the over-provisioning needed to hold capacity." title="" id="68" name="Picture"/>
             <a:graphic>
               <a:graphicData uri="http://schemas.openxmlformats.org/drawingml/2006/picture">
                 <pic:pic>
                   <pic:nvPicPr>
-                    <pic:cNvPr descr="systems_figs/fig_reliability.png" id="68" name="Picture"/>
+                    <pic:cNvPr descr="systems_figs/fig_reliability.png" id="69" name="Picture"/>
                     <pic:cNvPicPr>
                       <a:picLocks noChangeArrowheads="1" noChangeAspect="1"/>
                     </pic:cNvPicPr>
                   </pic:nvPicPr>
                   <pic:blipFill>
-                    <a:blip r:embed="rId66"/>
+                    <a:blip r:embed="rId67"/>
                     <a:stretch>
                       <a:fillRect/>
                     </a:stretch>
@@ -17149,8 +17650,8 @@
         <w:t xml:space="preserve">Fig. 16.1, Per-node reliability versus time and the over-provisioning needed to hold capacity.</w:t>
       </w:r>
     </w:p>
-    <w:bookmarkEnd w:id="69"/>
-    <w:bookmarkStart w:id="73" w:name="compute-and-workload"/>
+    <w:bookmarkEnd w:id="70"/>
+    <w:bookmarkStart w:id="74" w:name="compute-and-workload"/>
     <w:p>
       <w:pPr>
         <w:pStyle w:val="Heading2"/>
@@ -17648,18 +18149,18 @@
           <wp:inline>
             <wp:extent cx="5334000" cy="4019504"/>
             <wp:effectExtent b="0" l="0" r="0" t="0"/>
-            <wp:docPr descr="Fig. 17.1, Added subsystems: passive thermal-throttle by chip, ground-station site diversity, latency crossover, and the discounted-cash-flow breakeven." title="" id="71" name="Picture"/>
+            <wp:docPr descr="Fig. 17.1, Added subsystems: passive thermal-throttle by chip, ground-station site diversity, latency crossover, and the discounted-cash-flow breakeven." title="" id="72" name="Picture"/>
             <a:graphic>
               <a:graphicData uri="http://schemas.openxmlformats.org/drawingml/2006/picture">
                 <pic:pic>
                   <pic:nvPicPr>
-                    <pic:cNvPr descr="systems_figs/fig_new_subsystems.png" id="72" name="Picture"/>
+                    <pic:cNvPr descr="systems_figs/fig_new_subsystems.png" id="73" name="Picture"/>
                     <pic:cNvPicPr>
                       <a:picLocks noChangeArrowheads="1" noChangeAspect="1"/>
                     </pic:cNvPicPr>
                   </pic:nvPicPr>
                   <pic:blipFill>
-                    <a:blip r:embed="rId70"/>
+                    <a:blip r:embed="rId71"/>
                     <a:stretch>
                       <a:fillRect/>
                     </a:stretch>
@@ -17701,9 +18202,9 @@
         </w:pict>
       </w:r>
     </w:p>
-    <w:bookmarkEnd w:id="73"/>
     <w:bookmarkEnd w:id="74"/>
-    <w:bookmarkStart w:id="91" w:name="Xe5ea88703363ae012ea2f87a0aad981517e6b12"/>
+    <w:bookmarkEnd w:id="75"/>
+    <w:bookmarkStart w:id="92" w:name="Xe5ea88703363ae012ea2f87a0aad981517e6b12"/>
     <w:p>
       <w:pPr>
         <w:pStyle w:val="Heading1"/>
@@ -17712,7 +18213,7 @@
         <w:t xml:space="preserve">PART IV, INTEGRATION, SIMULATION, AND RESULTS</w:t>
       </w:r>
     </w:p>
-    <w:bookmarkStart w:id="78" w:name="the-integrated-system-model"/>
+    <w:bookmarkStart w:id="79" w:name="the-integrated-system-model"/>
     <w:p>
       <w:pPr>
         <w:pStyle w:val="Heading2"/>
@@ -17862,18 +18363,18 @@
           <wp:inline>
             <wp:extent cx="5334000" cy="3797310"/>
             <wp:effectExtent b="0" l="0" r="0" t="0"/>
-            <wp:docPr descr="Fig. 18.1, Integrated dry-mass budget, closed self-consistently by the system model." title="" id="76" name="Picture"/>
+            <wp:docPr descr="Fig. 18.1, Integrated dry-mass budget, closed self-consistently by the system model." title="" id="77" name="Picture"/>
             <a:graphic>
               <a:graphicData uri="http://schemas.openxmlformats.org/drawingml/2006/picture">
                 <pic:pic>
                   <pic:nvPicPr>
-                    <pic:cNvPr descr="systems_figs/fig_mass_budget.png" id="77" name="Picture"/>
+                    <pic:cNvPr descr="systems_figs/fig_mass_budget.png" id="78" name="Picture"/>
                     <pic:cNvPicPr>
                       <a:picLocks noChangeArrowheads="1" noChangeAspect="1"/>
                     </pic:cNvPicPr>
                   </pic:nvPicPr>
                   <pic:blipFill>
-                    <a:blip r:embed="rId75"/>
+                    <a:blip r:embed="rId76"/>
                     <a:stretch>
                       <a:fillRect/>
                     </a:stretch>
@@ -17908,8 +18409,8 @@
         <w:t xml:space="preserve">Fig. 18.1, Integrated dry-mass budget, closed self-consistently by the system model.</w:t>
       </w:r>
     </w:p>
-    <w:bookmarkEnd w:id="78"/>
-    <w:bookmarkStart w:id="79" w:name="Xfed2044479baa4c639d53a9e82ee4edbe317219"/>
+    <w:bookmarkEnd w:id="79"/>
+    <w:bookmarkStart w:id="80" w:name="Xfed2044479baa4c639d53a9e82ee4edbe317219"/>
     <w:p>
       <w:pPr>
         <w:pStyle w:val="Heading2"/>
@@ -19214,8 +19715,8 @@
         <w:t xml:space="preserve">and the figures are produced by the same code that a reader can run.</w:t>
       </w:r>
     </w:p>
-    <w:bookmarkEnd w:id="79"/>
-    <w:bookmarkStart w:id="83" w:name="X23f703a5b3167e168d574605adab1b76f34ca68"/>
+    <w:bookmarkEnd w:id="80"/>
+    <w:bookmarkStart w:id="84" w:name="X23f703a5b3167e168d574605adab1b76f34ca68"/>
     <w:p>
       <w:pPr>
         <w:pStyle w:val="Heading2"/>
@@ -19309,18 +19810,18 @@
           <wp:inline>
             <wp:extent cx="5334000" cy="1886737"/>
             <wp:effectExtent b="0" l="0" r="0" t="0"/>
-            <wp:docPr descr="Fig. 19.1, Monte-Carlo distributions of natural lifetime, debris probability, and total Δv across the dominant uncertainties." title="" id="81" name="Picture"/>
+            <wp:docPr descr="Fig. 19.1, Monte-Carlo distributions of natural lifetime, debris probability, and total Δv across the dominant uncertainties." title="" id="82" name="Picture"/>
             <a:graphic>
               <a:graphicData uri="http://schemas.openxmlformats.org/drawingml/2006/picture">
                 <pic:pic>
                   <pic:nvPicPr>
-                    <pic:cNvPr descr="systems_figs/fig_montecarlo.png" id="82" name="Picture"/>
+                    <pic:cNvPr descr="systems_figs/fig_montecarlo.png" id="83" name="Picture"/>
                     <pic:cNvPicPr>
                       <a:picLocks noChangeArrowheads="1" noChangeAspect="1"/>
                     </pic:cNvPicPr>
                   </pic:nvPicPr>
                   <pic:blipFill>
-                    <a:blip r:embed="rId80"/>
+                    <a:blip r:embed="rId81"/>
                     <a:stretch>
                       <a:fillRect/>
                     </a:stretch>
@@ -19355,8 +19856,8 @@
         <w:t xml:space="preserve">Fig. 19.1, Monte-Carlo distributions of natural lifetime, debris probability, and total Δv across the dominant uncertainties.</w:t>
       </w:r>
     </w:p>
-    <w:bookmarkEnd w:id="83"/>
-    <w:bookmarkStart w:id="90" w:name="X75af3e2abfcdea4ef8ecf50a29bce1e8bc901aa"/>
+    <w:bookmarkEnd w:id="84"/>
+    <w:bookmarkStart w:id="91" w:name="X75af3e2abfcdea4ef8ecf50a29bce1e8bc901aa"/>
     <w:p>
       <w:pPr>
         <w:pStyle w:val="Heading2"/>
@@ -19821,18 +20322,18 @@
           <wp:inline>
             <wp:extent cx="5334000" cy="3291840"/>
             <wp:effectExtent b="0" l="0" r="0" t="0"/>
-            <wp:docPr descr="Fig. 20.1, Catastrophic debris risk for the full cluster, and the in-cluster cascade coupling versus formation spacing." title="" id="85" name="Picture"/>
+            <wp:docPr descr="Fig. 20.1, Catastrophic debris risk for the full cluster, and the in-cluster cascade coupling versus formation spacing." title="" id="86" name="Picture"/>
             <a:graphic>
               <a:graphicData uri="http://schemas.openxmlformats.org/drawingml/2006/picture">
                 <pic:pic>
                   <pic:nvPicPr>
-                    <pic:cNvPr descr="figures/fig3_debris_risk.png" id="86" name="Picture"/>
+                    <pic:cNvPr descr="figures/fig3_debris_risk.png" id="87" name="Picture"/>
                     <pic:cNvPicPr>
                       <a:picLocks noChangeArrowheads="1" noChangeAspect="1"/>
                     </pic:cNvPicPr>
                   </pic:nvPicPr>
                   <pic:blipFill>
-                    <a:blip r:embed="rId84"/>
+                    <a:blip r:embed="rId85"/>
                     <a:stretch>
                       <a:fillRect/>
                     </a:stretch>
@@ -19876,18 +20377,18 @@
           <wp:inline>
             <wp:extent cx="5334000" cy="3554885"/>
             <wp:effectExtent b="0" l="0" r="0" t="0"/>
-            <wp:docPr descr="Fig. 20.2, Cumulative dose versus aluminium shielding, and the reliability-throughput trade." title="" id="88" name="Picture"/>
+            <wp:docPr descr="Fig. 20.2, Cumulative dose versus aluminium shielding, and the reliability-throughput trade." title="" id="89" name="Picture"/>
             <a:graphic>
               <a:graphicData uri="http://schemas.openxmlformats.org/drawingml/2006/picture">
                 <pic:pic>
                   <pic:nvPicPr>
-                    <pic:cNvPr descr="figures/fig4_radiation.png" id="89" name="Picture"/>
+                    <pic:cNvPr descr="figures/fig4_radiation.png" id="90" name="Picture"/>
                     <pic:cNvPicPr>
                       <a:picLocks noChangeArrowheads="1" noChangeAspect="1"/>
                     </pic:cNvPicPr>
                   </pic:nvPicPr>
                   <pic:blipFill>
-                    <a:blip r:embed="rId87"/>
+                    <a:blip r:embed="rId88"/>
                     <a:stretch>
                       <a:fillRect/>
                     </a:stretch>
@@ -19929,9 +20430,9 @@
         </w:pict>
       </w:r>
     </w:p>
-    <w:bookmarkEnd w:id="90"/>
     <w:bookmarkEnd w:id="91"/>
-    <w:bookmarkStart w:id="104" w:name="part-v-economics-and-predictions"/>
+    <w:bookmarkEnd w:id="92"/>
+    <w:bookmarkStart w:id="105" w:name="part-v-economics-and-predictions"/>
     <w:p>
       <w:pPr>
         <w:pStyle w:val="Heading1"/>
@@ -19940,7 +20441,7 @@
         <w:t xml:space="preserve">PART V, ECONOMICS AND PREDICTIONS</w:t>
       </w:r>
     </w:p>
-    <w:bookmarkStart w:id="98" w:name="X2e3f63e059a4787a3738c8a944d90eb01378ed4"/>
+    <w:bookmarkStart w:id="99" w:name="X2e3f63e059a4787a3738c8a944d90eb01378ed4"/>
     <w:p>
       <w:pPr>
         <w:pStyle w:val="Heading2"/>
@@ -20876,18 +21377,18 @@
           <wp:inline>
             <wp:extent cx="5334000" cy="2458219"/>
             <wp:effectExtent b="0" l="0" r="0" t="0"/>
-            <wp:docPr descr="Fig. 21.1b Levelized cost of useful compute versus model-FLOPs utilization, and versus launch price. The cost is dominated by utilization and hardware, not by launch." title="" id="93" name="Picture"/>
+            <wp:docPr descr="Fig. 21.1b Levelized cost of useful compute versus model-FLOPs utilization, and versus launch price. The cost is dominated by utilization and hardware, not by launch." title="" id="94" name="Picture"/>
             <a:graphic>
               <a:graphicData uri="http://schemas.openxmlformats.org/drawingml/2006/picture">
                 <pic:pic>
                   <pic:nvPicPr>
-                    <pic:cNvPr descr="figures2/figA7_lcoe.png" id="94" name="Picture"/>
+                    <pic:cNvPr descr="figures2/figA7_lcoe.png" id="95" name="Picture"/>
                     <pic:cNvPicPr>
                       <a:picLocks noChangeArrowheads="1" noChangeAspect="1"/>
                     </pic:cNvPicPr>
                   </pic:nvPicPr>
                   <pic:blipFill>
-                    <a:blip r:embed="rId92"/>
+                    <a:blip r:embed="rId93"/>
                     <a:stretch>
                       <a:fillRect/>
                     </a:stretch>
@@ -20931,18 +21432,18 @@
           <wp:inline>
             <wp:extent cx="5334000" cy="2604741"/>
             <wp:effectExtent b="0" l="0" r="0" t="0"/>
-            <wp:docPr descr="Fig. 21.1, Cost of useful compute versus utilization, and the radiation throughput tax by protection level." title="" id="96" name="Picture"/>
+            <wp:docPr descr="Fig. 21.1, Cost of useful compute versus utilization, and the radiation throughput tax by protection level." title="" id="97" name="Picture"/>
             <a:graphic>
               <a:graphicData uri="http://schemas.openxmlformats.org/drawingml/2006/picture">
                 <pic:pic>
                   <pic:nvPicPr>
-                    <pic:cNvPr descr="systems_figs/fig_compute.png" id="97" name="Picture"/>
+                    <pic:cNvPr descr="systems_figs/fig_compute.png" id="98" name="Picture"/>
                     <pic:cNvPicPr>
                       <a:picLocks noChangeArrowheads="1" noChangeAspect="1"/>
                     </pic:cNvPicPr>
                   </pic:nvPicPr>
                   <pic:blipFill>
-                    <a:blip r:embed="rId95"/>
+                    <a:blip r:embed="rId96"/>
                     <a:stretch>
                       <a:fillRect/>
                     </a:stretch>
@@ -20977,8 +21478,8 @@
         <w:t xml:space="preserve">Fig. 21.1, Cost of useful compute versus utilization, and the radiation throughput tax by protection level.</w:t>
       </w:r>
     </w:p>
-    <w:bookmarkEnd w:id="98"/>
-    <w:bookmarkStart w:id="102" w:name="the-launch-cost-parity-prediction"/>
+    <w:bookmarkEnd w:id="99"/>
+    <w:bookmarkStart w:id="103" w:name="the-launch-cost-parity-prediction"/>
     <w:p>
       <w:pPr>
         <w:pStyle w:val="Heading2"/>
@@ -21116,18 +21617,18 @@
           <wp:inline>
             <wp:extent cx="5334000" cy="2619768"/>
             <wp:effectExtent b="0" l="0" r="0" t="0"/>
-            <wp:docPr descr="Fig. 22.1, Launch-cost learning curve (Monte-Carlo) and the distribution of the cost-parity year; median near 2044, later than the vendor’s 2035." title="" id="100" name="Picture"/>
+            <wp:docPr descr="Fig. 22.1, Launch-cost learning curve (Monte-Carlo) and the distribution of the cost-parity year; median near 2044, later than the vendor’s 2035." title="" id="101" name="Picture"/>
             <a:graphic>
               <a:graphicData uri="http://schemas.openxmlformats.org/drawingml/2006/picture">
                 <pic:pic>
                   <pic:nvPicPr>
-                    <pic:cNvPr descr="figures_pred/fig_cost_parity.png" id="101" name="Picture"/>
+                    <pic:cNvPr descr="figures_pred/fig_cost_parity.png" id="102" name="Picture"/>
                     <pic:cNvPicPr>
                       <a:picLocks noChangeArrowheads="1" noChangeAspect="1"/>
                     </pic:cNvPicPr>
                   </pic:nvPicPr>
                   <pic:blipFill>
-                    <a:blip r:embed="rId99"/>
+                    <a:blip r:embed="rId100"/>
                     <a:stretch>
                       <a:fillRect/>
                     </a:stretch>
@@ -21162,8 +21663,8 @@
         <w:t xml:space="preserve">Fig. 22.1, Launch-cost learning curve (Monte-Carlo) and the distribution of the cost-parity year; median near 2044, later than the vendor’s 2035.</w:t>
       </w:r>
     </w:p>
-    <w:bookmarkEnd w:id="102"/>
-    <w:bookmarkStart w:id="103" w:name="capability-and-risk-trajectory-2027-2035"/>
+    <w:bookmarkEnd w:id="103"/>
+    <w:bookmarkStart w:id="104" w:name="capability-and-risk-trajectory-2027-2035"/>
     <w:p>
       <w:pPr>
         <w:pStyle w:val="Heading2"/>
@@ -21267,9 +21768,9 @@
         </w:pict>
       </w:r>
     </w:p>
-    <w:bookmarkEnd w:id="103"/>
     <w:bookmarkEnd w:id="104"/>
-    <w:bookmarkStart w:id="110" w:name="part-vi-synthesis"/>
+    <w:bookmarkEnd w:id="105"/>
+    <w:bookmarkStart w:id="111" w:name="part-vi-synthesis"/>
     <w:p>
       <w:pPr>
         <w:pStyle w:val="Heading1"/>
@@ -21278,7 +21779,7 @@
         <w:t xml:space="preserve">PART VI, SYNTHESIS</w:t>
       </w:r>
     </w:p>
-    <w:bookmarkStart w:id="105" w:name="caveats-and-limitations"/>
+    <w:bookmarkStart w:id="106" w:name="caveats-and-limitations"/>
     <w:p>
       <w:pPr>
         <w:pStyle w:val="Heading2"/>
@@ -21410,8 +21911,8 @@
         <w:t xml:space="preserve">number should be quoted, and they identify exactly where higher-fidelity work is needed next.</w:t>
       </w:r>
     </w:p>
-    <w:bookmarkEnd w:id="105"/>
-    <w:bookmarkStart w:id="109" w:name="X112718272980ce9d8db030edbf2c8e56c96c038"/>
+    <w:bookmarkEnd w:id="106"/>
+    <w:bookmarkStart w:id="110" w:name="X112718272980ce9d8db030edbf2c8e56c96c038"/>
     <w:p>
       <w:pPr>
         <w:pStyle w:val="Heading2"/>
@@ -21547,18 +22048,18 @@
           <wp:inline>
             <wp:extent cx="5334000" cy="4249493"/>
             <wp:effectExtent b="0" l="0" r="0" t="0"/>
-            <wp:docPr descr="Fig. 25.1, Systems-level risk matrix: cooling is solved; debris, disposal, and economics are the open items." title="" id="107" name="Picture"/>
+            <wp:docPr descr="Fig. 25.1, Systems-level risk matrix: cooling is solved; debris, disposal, and economics are the open items." title="" id="108" name="Picture"/>
             <a:graphic>
               <a:graphicData uri="http://schemas.openxmlformats.org/drawingml/2006/picture">
                 <pic:pic>
                   <pic:nvPicPr>
-                    <pic:cNvPr descr="figures/fig7_risk_matrix.png" id="108" name="Picture"/>
+                    <pic:cNvPr descr="figures/fig7_risk_matrix.png" id="109" name="Picture"/>
                     <pic:cNvPicPr>
                       <a:picLocks noChangeArrowheads="1" noChangeAspect="1"/>
                     </pic:cNvPicPr>
                   </pic:nvPicPr>
                   <pic:blipFill>
-                    <a:blip r:embed="rId106"/>
+                    <a:blip r:embed="rId107"/>
                     <a:stretch>
                       <a:fillRect/>
                     </a:stretch>
@@ -21607,9 +22108,9 @@
         </w:pict>
       </w:r>
     </w:p>
-    <w:bookmarkEnd w:id="109"/>
     <w:bookmarkEnd w:id="110"/>
-    <w:bookmarkStart w:id="115" w:name="X2849ac850b034a4af8859258c8c59481bcc0a0d"/>
+    <w:bookmarkEnd w:id="111"/>
+    <w:bookmarkStart w:id="116" w:name="X2849ac850b034a4af8859258c8c59481bcc0a0d"/>
     <w:p>
       <w:pPr>
         <w:pStyle w:val="Heading1"/>
@@ -21618,7 +22119,7 @@
         <w:t xml:space="preserve">PART VII, DETAILED RESULTS, DATA, AND WORKED COMPUTATIONS</w:t>
       </w:r>
     </w:p>
-    <w:bookmarkStart w:id="111" w:name="a-worked-end-to-end-computation"/>
+    <w:bookmarkStart w:id="112" w:name="a-worked-end-to-end-computation"/>
     <w:p>
       <w:pPr>
         <w:pStyle w:val="Heading2"/>
@@ -21769,8 +22270,8 @@
         <w:t xml:space="preserve">produced by the open code and is reproduced by the validation suite.</w:t>
       </w:r>
     </w:p>
-    <w:bookmarkEnd w:id="111"/>
-    <w:bookmarkStart w:id="112" w:name="detailed-results-tables"/>
+    <w:bookmarkEnd w:id="112"/>
+    <w:bookmarkStart w:id="113" w:name="detailed-results-tables"/>
     <w:p>
       <w:pPr>
         <w:pStyle w:val="Heading2"/>
@@ -25473,8 +25974,8 @@
         </w:tc>
       </w:tr>
     </w:tbl>
-    <w:bookmarkEnd w:id="112"/>
-    <w:bookmarkStart w:id="113" w:name="X4ef80d11b7a22aeebf52f8f551fc1d287f74ce6"/>
+    <w:bookmarkEnd w:id="113"/>
+    <w:bookmarkStart w:id="114" w:name="X4ef80d11b7a22aeebf52f8f551fc1d287f74ce6"/>
     <w:p>
       <w:pPr>
         <w:pStyle w:val="Heading2"/>
@@ -25923,8 +26424,8 @@
         <w:t xml:space="preserve">problem at this density, and it is the operational face of the formation paradox.</w:t>
       </w:r>
     </w:p>
-    <w:bookmarkEnd w:id="113"/>
-    <w:bookmarkStart w:id="114" w:name="comparison-with-terrestrial-data-centers"/>
+    <w:bookmarkEnd w:id="114"/>
+    <w:bookmarkStart w:id="115" w:name="comparison-with-terrestrial-data-centers"/>
     <w:p>
       <w:pPr>
         <w:pStyle w:val="Heading2"/>
@@ -26397,9 +26898,9 @@
         </w:pict>
       </w:r>
     </w:p>
-    <w:bookmarkEnd w:id="114"/>
     <w:bookmarkEnd w:id="115"/>
-    <w:bookmarkStart w:id="130" w:name="back-matter"/>
+    <w:bookmarkEnd w:id="116"/>
+    <w:bookmarkStart w:id="131" w:name="back-matter"/>
     <w:p>
       <w:pPr>
         <w:pStyle w:val="Heading1"/>
@@ -26408,7 +26909,7 @@
         <w:t xml:space="preserve">Back matter</w:t>
       </w:r>
     </w:p>
-    <w:bookmarkStart w:id="116" w:name="references"/>
+    <w:bookmarkStart w:id="117" w:name="references"/>
     <w:p>
       <w:pPr>
         <w:pStyle w:val="Heading2"/>
@@ -26757,8 +27258,44 @@
         <w:t xml:space="preserve">solar-cell datasheets; NASA ISS Active Thermal Control System overview.</w:t>
       </w:r>
     </w:p>
-    <w:bookmarkEnd w:id="116"/>
-    <w:bookmarkStart w:id="117" w:name="Xa5f5759fad9159c193908c5014e5f5066c880b0"/>
+    <w:p>
+      <w:pPr>
+        <w:pStyle w:val="Compact"/>
+        <w:numPr>
+          <w:ilvl w:val="0"/>
+          <w:numId w:val="1001"/>
+        </w:numPr>
+      </w:pPr>
+      <w:r>
+        <w:t xml:space="preserve">NASA Systems Engineering Handbook, NASA/SP-2016-6105.</w:t>
+      </w:r>
+    </w:p>
+    <w:p>
+      <w:pPr>
+        <w:pStyle w:val="Compact"/>
+        <w:numPr>
+          <w:ilvl w:val="0"/>
+          <w:numId w:val="1001"/>
+        </w:numPr>
+      </w:pPr>
+      <w:r>
+        <w:t xml:space="preserve">AIAA S-120-2006, Mass Properties Control for Space Systems.</w:t>
+      </w:r>
+    </w:p>
+    <w:p>
+      <w:pPr>
+        <w:pStyle w:val="Compact"/>
+        <w:numPr>
+          <w:ilvl w:val="0"/>
+          <w:numId w:val="1001"/>
+        </w:numPr>
+      </w:pPr>
+      <w:r>
+        <w:t xml:space="preserve">NASA Goddard Integrated Design Center, concurrent-design margin practice (NTRS 20120013284).</w:t>
+      </w:r>
+    </w:p>
+    <w:bookmarkEnd w:id="117"/>
+    <w:bookmarkStart w:id="118" w:name="Xa5f5759fad9159c193908c5014e5f5066c880b0"/>
     <w:p>
       <w:pPr>
         <w:pStyle w:val="Heading2"/>
@@ -29267,8 +29804,8 @@
         </w:tc>
       </w:tr>
     </w:tbl>
-    <w:bookmarkEnd w:id="117"/>
-    <w:bookmarkStart w:id="118" w:name="appendix-b-nomenclature"/>
+    <w:bookmarkEnd w:id="118"/>
+    <w:bookmarkStart w:id="119" w:name="appendix-b-nomenclature"/>
     <w:p>
       <w:pPr>
         <w:pStyle w:val="Heading2"/>
@@ -29291,8 +29828,8 @@
         <w:t xml:space="preserve">there with its units.</w:t>
       </w:r>
     </w:p>
-    <w:bookmarkEnd w:id="118"/>
-    <w:bookmarkStart w:id="119" w:name="appendix-c-data-sources-and-confidence"/>
+    <w:bookmarkEnd w:id="119"/>
+    <w:bookmarkStart w:id="120" w:name="appendix-c-data-sources-and-confidence"/>
     <w:p>
       <w:pPr>
         <w:pStyle w:val="Heading2"/>
@@ -29345,8 +29882,8 @@
         <w:t xml:space="preserve">1-mm-to-1-cm debris flux is the least model-validated quantity.</w:t>
       </w:r>
     </w:p>
-    <w:bookmarkEnd w:id="119"/>
-    <w:bookmarkStart w:id="120" w:name="appendix-d-reproduction-and-code"/>
+    <w:bookmarkEnd w:id="120"/>
+    <w:bookmarkStart w:id="121" w:name="appendix-d-reproduction-and-code"/>
     <w:p>
       <w:pPr>
         <w:pStyle w:val="Heading2"/>
@@ -31265,8 +31802,8 @@
         <w:t xml:space="preserve"> util)</w:t>
       </w:r>
     </w:p>
-    <w:bookmarkEnd w:id="120"/>
-    <w:bookmarkStart w:id="129" w:name="appendix-e-extended-derivations"/>
+    <w:bookmarkEnd w:id="121"/>
+    <w:bookmarkStart w:id="130" w:name="appendix-e-extended-derivations"/>
     <w:p>
       <w:pPr>
         <w:pStyle w:val="Heading2"/>
@@ -31289,7 +31826,7 @@
         <w:t xml:space="preserve">the main text, so that the volume is mathematically self-contained.</w:t>
       </w:r>
     </w:p>
-    <w:bookmarkStart w:id="121" w:name="X2a80dffde1cc8eefa78dcdbda3d88a45fd72945"/>
+    <w:bookmarkStart w:id="122" w:name="X2a80dffde1cc8eefa78dcdbda3d88a45fd72945"/>
     <w:p>
       <w:pPr>
         <w:pStyle w:val="Heading3"/>
@@ -32412,8 +32949,8 @@
         <w:t xml:space="preserve">fundamental constants. This is the foundation of every radiator result in Chapter 10.</w:t>
       </w:r>
     </w:p>
-    <w:bookmarkEnd w:id="121"/>
-    <w:bookmarkStart w:id="122" w:name="X4c20d6d59466b0830aef63d21b34b7838499df3"/>
+    <w:bookmarkEnd w:id="122"/>
+    <w:bookmarkStart w:id="123" w:name="X4c20d6d59466b0830aef63d21b34b7838499df3"/>
     <w:p>
       <w:pPr>
         <w:pStyle w:val="Heading3"/>
@@ -33224,8 +33761,8 @@
         <w:t xml:space="preserve">debris impacts.</w:t>
       </w:r>
     </w:p>
-    <w:bookmarkEnd w:id="122"/>
-    <w:bookmarkStart w:id="123" w:name="Xdbf318ef9ef49d2256131d87dbdb96f21a45420"/>
+    <w:bookmarkEnd w:id="123"/>
+    <w:bookmarkStart w:id="124" w:name="Xdbf318ef9ef49d2256131d87dbdb96f21a45420"/>
     <w:p>
       <w:pPr>
         <w:pStyle w:val="Heading3"/>
@@ -34180,8 +34717,8 @@
         <w:t xml:space="preserve">re-entry within one or two orbits, satisfying the disposal requirement.</w:t>
       </w:r>
     </w:p>
-    <w:bookmarkEnd w:id="123"/>
-    <w:bookmarkStart w:id="124" w:name="X67de4cda1ab68499f29ee0b2ccb5ff91efedb0e"/>
+    <w:bookmarkEnd w:id="124"/>
+    <w:bookmarkStart w:id="125" w:name="X67de4cda1ab68499f29ee0b2ccb5ff91efedb0e"/>
     <w:p>
       <w:pPr>
         <w:pStyle w:val="Heading3"/>
@@ -34708,8 +35245,8 @@
         <w:t xml:space="preserve">discussed in Chapter 28 and the reason the formation needs active relative control.</w:t>
       </w:r>
     </w:p>
-    <w:bookmarkEnd w:id="124"/>
-    <w:bookmarkStart w:id="125" w:name="e.5-the-rocket-equation"/>
+    <w:bookmarkEnd w:id="125"/>
+    <w:bookmarkStart w:id="126" w:name="e.5-the-rocket-equation"/>
     <w:p>
       <w:pPr>
         <w:pStyle w:val="Heading3"/>
@@ -35429,8 +35966,8 @@
         <w:t xml:space="preserve">propulsion) so dramatically reduces propellant mass for a given Δv.</w:t>
       </w:r>
     </w:p>
-    <w:bookmarkEnd w:id="125"/>
-    <w:bookmarkStart w:id="126" w:name="e.6-k-of-n-redundancy"/>
+    <w:bookmarkEnd w:id="126"/>
+    <w:bookmarkStart w:id="127" w:name="e.6-k-of-n-redundancy"/>
     <w:p>
       <w:pPr>
         <w:pStyle w:val="Heading3"/>
@@ -35792,8 +36329,8 @@
         <w:t xml:space="preserve">satellite and the over-provisioned satellites within a cluster (Chapter 16).</w:t>
       </w:r>
     </w:p>
-    <w:bookmarkEnd w:id="126"/>
-    <w:bookmarkStart w:id="127" w:name="X1e2c0797711e5a38d867b0034b661cf8291a89f"/>
+    <w:bookmarkEnd w:id="127"/>
+    <w:bookmarkStart w:id="128" w:name="X1e2c0797711e5a38d867b0034b661cf8291a89f"/>
     <w:p>
       <w:pPr>
         <w:pStyle w:val="Heading3"/>
@@ -36458,8 +36995,8 @@
         <w:t xml:space="preserve">K in two to four steps.</w:t>
       </w:r>
     </w:p>
-    <w:bookmarkEnd w:id="127"/>
-    <w:bookmarkStart w:id="128" w:name="e.8-the-capital-recovery-factor"/>
+    <w:bookmarkEnd w:id="128"/>
+    <w:bookmarkStart w:id="129" w:name="e.8-the-capital-recovery-factor"/>
     <w:p>
       <w:pPr>
         <w:pStyle w:val="Heading3"/>
@@ -36892,9 +37429,9 @@
         <w:t xml:space="preserve">End of report.</w:t>
       </w:r>
     </w:p>
-    <w:bookmarkEnd w:id="128"/>
     <w:bookmarkEnd w:id="129"/>
     <w:bookmarkEnd w:id="130"/>
+    <w:bookmarkEnd w:id="131"/>
     <w:sectPr>
       <w:footnotePr>
         <w:numRestart w:val="eachSect"/>

</xml_diff>

<commit_message>
Add Technology Readiness Level table to the Readiness section (as a figure)
Section 3A previously described the nine-level TRL scale only in prose.
Add an explicit TRL assessment table (capability, demonstrated status,
assessed TRL, gating step) drawn from the report's own findings, making
the component-vs-system readiness gap concrete. Re-render all tables (now
21), and rebuild the HTML and Word doc.
</commit_message>
<xml_diff>
--- a/report/Report_II_Complete.docx
+++ b/report/Report_II_Complete.docx
@@ -3865,7 +3865,464 @@
         <w:t xml:space="preserve"> </w:t>
       </w:r>
       <w:r>
-        <w:t xml:space="preserve">central programmatic risk identified in Chapter 23.</w:t>
+        <w:t xml:space="preserve">central programmatic risk identified in Chapter 23. Assessing each major capability against the</w:t>
+      </w:r>
+      <w:r>
+        <w:t xml:space="preserve"> </w:t>
+      </w:r>
+      <w:r>
+        <w:t xml:space="preserve">nine-level scale makes that gap explicit.</w:t>
+      </w:r>
+    </w:p>
+    <w:tbl>
+      <w:tblPr>
+        <w:tblStyle w:val="Table"/>
+        <w:tblW w:type="pct" w:w="5000"/>
+        <w:tblLayout w:type="fixed"/>
+        <w:tblLook w:firstRow="1" w:lastRow="0" w:firstColumn="0" w:lastColumn="0" w:noHBand="0" w:noVBand="0" w:val="0020"/>
+      </w:tblPr>
+      <w:tblGrid>
+        <w:gridCol w:w="1980"/>
+        <w:gridCol w:w="1980"/>
+        <w:gridCol w:w="1980"/>
+        <w:gridCol w:w="1980"/>
+      </w:tblGrid>
+      <w:tr>
+        <w:trPr>
+          <w:tblHeader w:val="on"/>
+        </w:trPr>
+        <w:tc>
+          <w:tcPr/>
+          <w:p>
+            <w:pPr>
+              <w:pStyle w:val="Compact"/>
+            </w:pPr>
+            <w:r>
+              <w:t xml:space="preserve">Capability</w:t>
+            </w:r>
+          </w:p>
+        </w:tc>
+        <w:tc>
+          <w:tcPr/>
+          <w:p>
+            <w:pPr>
+              <w:pStyle w:val="Compact"/>
+            </w:pPr>
+            <w:r>
+              <w:t xml:space="preserve">Demonstrated status, 2026</w:t>
+            </w:r>
+          </w:p>
+        </w:tc>
+        <w:tc>
+          <w:tcPr/>
+          <w:p>
+            <w:pPr>
+              <w:pStyle w:val="Compact"/>
+            </w:pPr>
+            <w:r>
+              <w:t xml:space="preserve">Assessed TRL</w:t>
+            </w:r>
+          </w:p>
+        </w:tc>
+        <w:tc>
+          <w:tcPr/>
+          <w:p>
+            <w:pPr>
+              <w:pStyle w:val="Compact"/>
+            </w:pPr>
+            <w:r>
+              <w:t xml:space="preserve">Gating step to the next level</w:t>
+            </w:r>
+          </w:p>
+        </w:tc>
+      </w:tr>
+      <w:tr>
+        <w:tc>
+          <w:tcPr/>
+          <w:p>
+            <w:pPr>
+              <w:pStyle w:val="Compact"/>
+            </w:pPr>
+            <w:r>
+              <w:t xml:space="preserve">Data-center-class accelerator in orbit</w:t>
+            </w:r>
+          </w:p>
+        </w:tc>
+        <w:tc>
+          <w:tcPr/>
+          <w:p>
+            <w:pPr>
+              <w:pStyle w:val="Compact"/>
+            </w:pPr>
+            <w:r>
+              <w:t xml:space="preserve">one GPU flown (Starcloud-1, Nov 2025)</w:t>
+            </w:r>
+          </w:p>
+        </w:tc>
+        <w:tc>
+          <w:tcPr/>
+          <w:p>
+            <w:pPr>
+              <w:pStyle w:val="Compact"/>
+            </w:pPr>
+            <w:r>
+              <w:t xml:space="preserve">6</w:t>
+            </w:r>
+          </w:p>
+        </w:tc>
+        <w:tc>
+          <w:tcPr/>
+          <w:p>
+            <w:pPr>
+              <w:pStyle w:val="Compact"/>
+            </w:pPr>
+            <w:r>
+              <w:t xml:space="preserve">sustained multi-unit operation on orbit</w:t>
+            </w:r>
+          </w:p>
+        </w:tc>
+      </w:tr>
+      <w:tr>
+        <w:tc>
+          <w:tcPr/>
+          <w:p>
+            <w:pPr>
+              <w:pStyle w:val="Compact"/>
+            </w:pPr>
+            <w:r>
+              <w:t xml:space="preserve">Processor radiation tolerance</w:t>
+            </w:r>
+          </w:p>
+        </w:tc>
+        <w:tc>
+          <w:tcPr/>
+          <w:p>
+            <w:pPr>
+              <w:pStyle w:val="Compact"/>
+            </w:pPr>
+            <w:r>
+              <w:t xml:space="preserve">ground-tested, no hard failures to 15 krad</w:t>
+            </w:r>
+          </w:p>
+        </w:tc>
+        <w:tc>
+          <w:tcPr/>
+          <w:p>
+            <w:pPr>
+              <w:pStyle w:val="Compact"/>
+            </w:pPr>
+            <w:r>
+              <w:t xml:space="preserve">5</w:t>
+            </w:r>
+          </w:p>
+        </w:tc>
+        <w:tc>
+          <w:tcPr/>
+          <w:p>
+            <w:pPr>
+              <w:pStyle w:val="Compact"/>
+            </w:pPr>
+            <w:r>
+              <w:t xml:space="preserve">in-flight dose and upset-rate confirmation</w:t>
+            </w:r>
+          </w:p>
+        </w:tc>
+      </w:tr>
+      <w:tr>
+        <w:tc>
+          <w:tcPr/>
+          <w:p>
+            <w:pPr>
+              <w:pStyle w:val="Compact"/>
+            </w:pPr>
+            <w:r>
+              <w:t xml:space="preserve">Node-level thermal control</w:t>
+            </w:r>
+          </w:p>
+        </w:tc>
+        <w:tc>
+          <w:tcPr/>
+          <w:p>
+            <w:pPr>
+              <w:pStyle w:val="Compact"/>
+            </w:pPr>
+            <w:r>
+              <w:t xml:space="preserve">kilowatt-class pumped-loop nodes flown</w:t>
+            </w:r>
+          </w:p>
+        </w:tc>
+        <w:tc>
+          <w:tcPr/>
+          <w:p>
+            <w:pPr>
+              <w:pStyle w:val="Compact"/>
+            </w:pPr>
+            <w:r>
+              <w:t xml:space="preserve">5</w:t>
+            </w:r>
+          </w:p>
+        </w:tc>
+        <w:tc>
+          <w:tcPr/>
+          <w:p>
+            <w:pPr>
+              <w:pStyle w:val="Compact"/>
+            </w:pPr>
+            <w:r>
+              <w:t xml:space="preserve">a megawatt-class radiator flown</w:t>
+            </w:r>
+          </w:p>
+        </w:tc>
+      </w:tr>
+      <w:tr>
+        <w:tc>
+          <w:tcPr/>
+          <w:p>
+            <w:pPr>
+              <w:pStyle w:val="Compact"/>
+            </w:pPr>
+            <w:r>
+              <w:t xml:space="preserve">Multi-terabit formation optical link</w:t>
+            </w:r>
+          </w:p>
+        </w:tc>
+        <w:tc>
+          <w:tcPr/>
+          <w:p>
+            <w:pPr>
+              <w:pStyle w:val="Compact"/>
+            </w:pPr>
+            <w:r>
+              <w:t xml:space="preserve">bench-scale link only</w:t>
+            </w:r>
+          </w:p>
+        </w:tc>
+        <w:tc>
+          <w:tcPr/>
+          <w:p>
+            <w:pPr>
+              <w:pStyle w:val="Compact"/>
+            </w:pPr>
+            <w:r>
+              <w:t xml:space="preserve">4</w:t>
+            </w:r>
+          </w:p>
+        </w:tc>
+        <w:tc>
+          <w:tcPr/>
+          <w:p>
+            <w:pPr>
+              <w:pStyle w:val="Compact"/>
+            </w:pPr>
+            <w:r>
+              <w:t xml:space="preserve">a flown link between two satellites</w:t>
+            </w:r>
+          </w:p>
+        </w:tc>
+      </w:tr>
+      <w:tr>
+        <w:tc>
+          <w:tcPr/>
+          <w:p>
+            <w:pPr>
+              <w:pStyle w:val="Compact"/>
+            </w:pPr>
+            <w:r>
+              <w:t xml:space="preserve">Formation station-keeping at sub-km spacing</w:t>
+            </w:r>
+          </w:p>
+        </w:tc>
+        <w:tc>
+          <w:tcPr/>
+          <w:p>
+            <w:pPr>
+              <w:pStyle w:val="Compact"/>
+            </w:pPr>
+            <w:r>
+              <w:t xml:space="preserve">not demonstrated</w:t>
+            </w:r>
+          </w:p>
+        </w:tc>
+        <w:tc>
+          <w:tcPr/>
+          <w:p>
+            <w:pPr>
+              <w:pStyle w:val="Compact"/>
+            </w:pPr>
+            <w:r>
+              <w:t xml:space="preserve">3</w:t>
+            </w:r>
+          </w:p>
+        </w:tc>
+        <w:tc>
+          <w:tcPr/>
+          <w:p>
+            <w:pPr>
+              <w:pStyle w:val="Compact"/>
+            </w:pPr>
+            <w:r>
+              <w:t xml:space="preserve">two-satellite close-formation flight</w:t>
+            </w:r>
+          </w:p>
+        </w:tc>
+      </w:tr>
+      <w:tr>
+        <w:tc>
+          <w:tcPr/>
+          <w:p>
+            <w:pPr>
+              <w:pStyle w:val="Compact"/>
+            </w:pPr>
+            <w:r>
+              <w:t xml:space="preserve">Autonomous cluster debris avoidance</w:t>
+            </w:r>
+          </w:p>
+        </w:tc>
+        <w:tc>
+          <w:tcPr/>
+          <w:p>
+            <w:pPr>
+              <w:pStyle w:val="Compact"/>
+            </w:pPr>
+            <w:r>
+              <w:t xml:space="preserve">not demonstrated</w:t>
+            </w:r>
+          </w:p>
+        </w:tc>
+        <w:tc>
+          <w:tcPr/>
+          <w:p>
+            <w:pPr>
+              <w:pStyle w:val="Compact"/>
+            </w:pPr>
+            <w:r>
+              <w:t xml:space="preserve">2</w:t>
+            </w:r>
+          </w:p>
+        </w:tc>
+        <w:tc>
+          <w:tcPr/>
+          <w:p>
+            <w:pPr>
+              <w:pStyle w:val="Compact"/>
+            </w:pPr>
+            <w:r>
+              <w:t xml:space="preserve">a closed-loop avoidance maneuver on orbit</w:t>
+            </w:r>
+          </w:p>
+        </w:tc>
+      </w:tr>
+      <w:tr>
+        <w:tc>
+          <w:tcPr/>
+          <w:p>
+            <w:pPr>
+              <w:pStyle w:val="Compact"/>
+            </w:pPr>
+            <w:r>
+              <w:t xml:space="preserve">Propulsive disposal within five years</w:t>
+            </w:r>
+          </w:p>
+        </w:tc>
+        <w:tc>
+          <w:tcPr/>
+          <w:p>
+            <w:pPr>
+              <w:pStyle w:val="Compact"/>
+            </w:pPr>
+            <w:r>
+              <w:t xml:space="preserve">components flight-proven, configuration unproven</w:t>
+            </w:r>
+          </w:p>
+        </w:tc>
+        <w:tc>
+          <w:tcPr/>
+          <w:p>
+            <w:pPr>
+              <w:pStyle w:val="Compact"/>
+            </w:pPr>
+            <w:r>
+              <w:t xml:space="preserve">5</w:t>
+            </w:r>
+          </w:p>
+        </w:tc>
+        <w:tc>
+          <w:tcPr/>
+          <w:p>
+            <w:pPr>
+              <w:pStyle w:val="Compact"/>
+            </w:pPr>
+            <w:r>
+              <w:t xml:space="preserve">an end-to-end de-orbit demonstration</w:t>
+            </w:r>
+          </w:p>
+        </w:tc>
+      </w:tr>
+      <w:tr>
+        <w:tc>
+          <w:tcPr/>
+          <w:p>
+            <w:pPr>
+              <w:pStyle w:val="Compact"/>
+            </w:pPr>
+            <w:r>
+              <w:t xml:space="preserve">Megawatt-to-gigawatt cluster</w:t>
+            </w:r>
+          </w:p>
+        </w:tc>
+        <w:tc>
+          <w:tcPr/>
+          <w:p>
+            <w:pPr>
+              <w:pStyle w:val="Compact"/>
+            </w:pPr>
+            <w:r>
+              <w:t xml:space="preserve">conceptual</w:t>
+            </w:r>
+          </w:p>
+        </w:tc>
+        <w:tc>
+          <w:tcPr/>
+          <w:p>
+            <w:pPr>
+              <w:pStyle w:val="Compact"/>
+            </w:pPr>
+            <w:r>
+              <w:t xml:space="preserve">2</w:t>
+            </w:r>
+          </w:p>
+        </w:tc>
+        <w:tc>
+          <w:tcPr/>
+          <w:p>
+            <w:pPr>
+              <w:pStyle w:val="Compact"/>
+            </w:pPr>
+            <w:r>
+              <w:t xml:space="preserve">a subscale multi-satellite cluster</w:t>
+            </w:r>
+          </w:p>
+        </w:tc>
+      </w:tr>
+    </w:tbl>
+    <w:p>
+      <w:pPr>
+        <w:pStyle w:val="BodyText"/>
+      </w:pPr>
+      <w:r>
+        <w:t xml:space="preserve">The assessment confirms the central pattern: the building blocks sit at component levels 4 to 6,</w:t>
+      </w:r>
+      <w:r>
+        <w:t xml:space="preserve"> </w:t>
+      </w:r>
+      <w:r>
+        <w:t xml:space="preserve">while every capability that depends on the constellation operating as a coordinated system sits at</w:t>
+      </w:r>
+      <w:r>
+        <w:t xml:space="preserve"> </w:t>
+      </w:r>
+      <w:r>
+        <w:t xml:space="preserve">levels 2 to 3. The program risk is concentrated in the system-integration steps, not the components.</w:t>
       </w:r>
     </w:p>
     <w:tbl>
@@ -28743,6 +29200,9 @@
                   </m:r>
                 </m:den>
               </m:f>
+              <m:r>
+                <m:t> </m:t>
+              </m:r>
               <m:sSup>
                 <m:e>
                   <m:r>
@@ -28756,46 +29216,19 @@
                 </m:sup>
               </m:sSup>
               <m:r>
+                <m:t> </m:t>
+              </m:r>
+              <m:r>
                 <m:rPr>
                   <m:sty m:val="p"/>
                 </m:rPr>
-                <m:t>|</m:t>
-              </m:r>
-              <m:sSub>
-                <m:e>
-                  <m:r>
-                    <m:t>I</m:t>
-                  </m:r>
-                </m:e>
-                <m:sub>
-                  <m:r>
-                    <m:t>z</m:t>
-                  </m:r>
-                </m:sub>
-              </m:sSub>
-              <m:r>
-                <m:rPr>
-                  <m:sty m:val="p"/>
-                </m:rPr>
-                <m:t>−</m:t>
-              </m:r>
-              <m:sSub>
-                <m:e>
-                  <m:r>
-                    <m:t>I</m:t>
-                  </m:r>
-                </m:e>
-                <m:sub>
-                  <m:r>
-                    <m:t>x</m:t>
-                  </m:r>
-                </m:sub>
-              </m:sSub>
-              <m:r>
-                <m:rPr>
-                  <m:sty m:val="p"/>
-                </m:rPr>
-                <m:t>|</m:t>
+                <m:t>Δ</m:t>
+              </m:r>
+              <m:r>
+                <m:t>I</m:t>
+              </m:r>
+              <m:r>
+                <m:t> </m:t>
               </m:r>
               <m:r>
                 <m:rPr>

</xml_diff>

<commit_message>
Loop: correct cost-parity claim, derive J2 precession and eclipse geometry
No-false-claims fix: the Monte-Carlo shows only ~5% of sampled scenarios
reach $200/kg by 2050 (95% never do); 2044 is the median CONDITIONAL on
that minority. Chapter 22 prose, the figure caption, and predictions.py
output now state this explicitly instead of presenting 2044 as an
unconditional median.

Expand two thin chapters with full, source-checked derivations:
- Ch5: J2 disturbing potential -> orbit-averaged R -> Lagrange planetary
  equation for the node -> the cos i precession law; verified inclinations
  (200/650/800 km = 96.3/98.0/98.6 deg) and the 0.9856 deg/day rate.
- Ch6: cylindrical-shadow derivation of the sunlit fraction, plus the
  annual beta-angle variation showing the dawn-dusk orbit stays above the
  critical beta year round (66.6 to 90 deg).

All 122 tests pass; solver suite reproduces every anchor.
</commit_message>
<xml_diff>
--- a/report/Report_II_Complete.docx
+++ b/report/Report_II_Complete.docx
@@ -5888,6 +5888,1142 @@
         <w:pStyle w:val="FirstParagraph"/>
       </w:pPr>
       <w:r>
+        <w:rPr>
+          <w:b/>
+          <w:bCs/>
+        </w:rPr>
+        <w:t xml:space="preserve">Origin of the precession.</w:t>
+      </w:r>
+      <w:r>
+        <w:t xml:space="preserve"> </w:t>
+      </w:r>
+      <w:r>
+        <w:t xml:space="preserve">Earth’s gravitational potential, expanded in zonal harmonics and kept</w:t>
+      </w:r>
+      <w:r>
+        <w:t xml:space="preserve"> </w:t>
+      </w:r>
+      <w:r>
+        <w:t xml:space="preserve">to the leading oblateness term, is</w:t>
+      </w:r>
+    </w:p>
+    <w:p>
+      <w:pPr>
+        <w:pStyle w:val="BodyText"/>
+      </w:pPr>
+      <m:oMathPara>
+        <m:oMathParaPr>
+          <m:jc m:val="center"/>
+        </m:oMathParaPr>
+        <m:oMath>
+          <m:r>
+            <m:t>U</m:t>
+          </m:r>
+          <m:r>
+            <m:rPr>
+              <m:sty m:val="p"/>
+            </m:rPr>
+            <m:t>(</m:t>
+          </m:r>
+          <m:r>
+            <m:t>r</m:t>
+          </m:r>
+          <m:r>
+            <m:rPr>
+              <m:sty m:val="p"/>
+            </m:rPr>
+            <m:t>,</m:t>
+          </m:r>
+          <m:r>
+            <m:t>ϕ</m:t>
+          </m:r>
+          <m:r>
+            <m:rPr>
+              <m:sty m:val="p"/>
+            </m:rPr>
+            <m:t>)</m:t>
+          </m:r>
+          <m:r>
+            <m:rPr>
+              <m:sty m:val="p"/>
+            </m:rPr>
+            <m:t>=</m:t>
+          </m:r>
+          <m:r>
+            <m:rPr>
+              <m:sty m:val="p"/>
+            </m:rPr>
+            <m:t>−</m:t>
+          </m:r>
+          <m:f>
+            <m:fPr>
+              <m:type m:val="bar"/>
+            </m:fPr>
+            <m:num>
+              <m:r>
+                <m:t>μ</m:t>
+              </m:r>
+            </m:num>
+            <m:den>
+              <m:r>
+                <m:t>r</m:t>
+              </m:r>
+            </m:den>
+          </m:f>
+          <m:d>
+            <m:dPr>
+              <m:begChr m:val="["/>
+              <m:sepChr m:val=""/>
+              <m:endChr m:val="]"/>
+              <m:grow/>
+            </m:dPr>
+            <m:e>
+              <m:r>
+                <m:t> </m:t>
+              </m:r>
+              <m:r>
+                <m:t>1</m:t>
+              </m:r>
+              <m:r>
+                <m:rPr>
+                  <m:sty m:val="p"/>
+                </m:rPr>
+                <m:t>−</m:t>
+              </m:r>
+              <m:sSub>
+                <m:e>
+                  <m:r>
+                    <m:t>J</m:t>
+                  </m:r>
+                </m:e>
+                <m:sub>
+                  <m:r>
+                    <m:t>2</m:t>
+                  </m:r>
+                </m:sub>
+              </m:sSub>
+              <m:sSup>
+                <m:e>
+                  <m:d>
+                    <m:dPr>
+                      <m:begChr m:val="("/>
+                      <m:sepChr m:val=""/>
+                      <m:endChr m:val=")"/>
+                      <m:grow/>
+                    </m:dPr>
+                    <m:e>
+                      <m:f>
+                        <m:fPr>
+                          <m:type m:val="bar"/>
+                        </m:fPr>
+                        <m:num>
+                          <m:sSub>
+                            <m:e>
+                              <m:r>
+                                <m:t>R</m:t>
+                              </m:r>
+                            </m:e>
+                            <m:sub>
+                              <m:r>
+                                <m:t>E</m:t>
+                              </m:r>
+                            </m:sub>
+                          </m:sSub>
+                        </m:num>
+                        <m:den>
+                          <m:r>
+                            <m:t>r</m:t>
+                          </m:r>
+                        </m:den>
+                      </m:f>
+                    </m:e>
+                  </m:d>
+                </m:e>
+                <m:sup>
+                  <m:r>
+                    <m:t>2</m:t>
+                  </m:r>
+                </m:sup>
+              </m:sSup>
+              <m:sSub>
+                <m:e>
+                  <m:r>
+                    <m:t>P</m:t>
+                  </m:r>
+                </m:e>
+                <m:sub>
+                  <m:r>
+                    <m:t>2</m:t>
+                  </m:r>
+                </m:sub>
+              </m:sSub>
+              <m:r>
+                <m:rPr>
+                  <m:sty m:val="p"/>
+                </m:rPr>
+                <m:t>(</m:t>
+              </m:r>
+              <m:r>
+                <m:rPr>
+                  <m:sty m:val="p"/>
+                </m:rPr>
+                <m:t>sin</m:t>
+              </m:r>
+              <m:r>
+                <m:t>ϕ</m:t>
+              </m:r>
+              <m:r>
+                <m:rPr>
+                  <m:sty m:val="p"/>
+                </m:rPr>
+                <m:t>)</m:t>
+              </m:r>
+              <m:r>
+                <m:t> </m:t>
+              </m:r>
+            </m:e>
+          </m:d>
+          <m:r>
+            <m:rPr>
+              <m:sty m:val="p"/>
+            </m:rPr>
+            <m:t>,</m:t>
+          </m:r>
+          <m:r>
+            <m:t>  </m:t>
+          </m:r>
+          <m:sSub>
+            <m:e>
+              <m:r>
+                <m:t>P</m:t>
+              </m:r>
+            </m:e>
+            <m:sub>
+              <m:r>
+                <m:t>2</m:t>
+              </m:r>
+            </m:sub>
+          </m:sSub>
+          <m:r>
+            <m:rPr>
+              <m:sty m:val="p"/>
+            </m:rPr>
+            <m:t>(</m:t>
+          </m:r>
+          <m:r>
+            <m:rPr>
+              <m:sty m:val="p"/>
+            </m:rPr>
+            <m:t>sin</m:t>
+          </m:r>
+          <m:r>
+            <m:t>ϕ</m:t>
+          </m:r>
+          <m:r>
+            <m:rPr>
+              <m:sty m:val="p"/>
+            </m:rPr>
+            <m:t>)</m:t>
+          </m:r>
+          <m:r>
+            <m:rPr>
+              <m:sty m:val="p"/>
+            </m:rPr>
+            <m:t>=</m:t>
+          </m:r>
+          <m:f>
+            <m:fPr>
+              <m:type m:val="lin"/>
+            </m:fPr>
+            <m:num>
+              <m:r>
+                <m:t>1</m:t>
+              </m:r>
+            </m:num>
+            <m:den>
+              <m:r>
+                <m:t>2</m:t>
+              </m:r>
+            </m:den>
+          </m:f>
+          <m:d>
+            <m:dPr>
+              <m:begChr m:val="("/>
+              <m:sepChr m:val=""/>
+              <m:endChr m:val=")"/>
+              <m:grow/>
+            </m:dPr>
+            <m:e>
+              <m:r>
+                <m:t>3</m:t>
+              </m:r>
+              <m:sSup>
+                <m:e>
+                  <m:r>
+                    <m:rPr>
+                      <m:sty m:val="p"/>
+                    </m:rPr>
+                    <m:t>sin</m:t>
+                  </m:r>
+                </m:e>
+                <m:sup>
+                  <m:r>
+                    <m:t>2</m:t>
+                  </m:r>
+                </m:sup>
+              </m:sSup>
+              <m:r>
+                <m:t>ϕ</m:t>
+              </m:r>
+              <m:r>
+                <m:rPr>
+                  <m:sty m:val="p"/>
+                </m:rPr>
+                <m:t>−</m:t>
+              </m:r>
+              <m:r>
+                <m:t>1</m:t>
+              </m:r>
+            </m:e>
+          </m:d>
+          <m:r>
+            <m:rPr>
+              <m:sty m:val="p"/>
+            </m:rPr>
+            <m:t>,</m:t>
+          </m:r>
+        </m:oMath>
+      </m:oMathPara>
+    </w:p>
+    <w:p>
+      <w:pPr>
+        <w:pStyle w:val="FirstParagraph"/>
+      </w:pPr>
+      <w:r>
+        <w:t xml:space="preserve">where</w:t>
+      </w:r>
+      <w:r>
+        <w:t xml:space="preserve"> </w:t>
+      </w:r>
+      <m:oMath>
+        <m:r>
+          <m:t>ϕ</m:t>
+        </m:r>
+      </m:oMath>
+      <w:r>
+        <w:t xml:space="preserve"> </w:t>
+      </w:r>
+      <w:r>
+        <w:t xml:space="preserve">is geocentric latitude and</w:t>
+      </w:r>
+      <w:r>
+        <w:t xml:space="preserve"> </w:t>
+      </w:r>
+      <m:oMath>
+        <m:sSub>
+          <m:e>
+            <m:r>
+              <m:t>P</m:t>
+            </m:r>
+          </m:e>
+          <m:sub>
+            <m:r>
+              <m:t>2</m:t>
+            </m:r>
+          </m:sub>
+        </m:sSub>
+      </m:oMath>
+      <w:r>
+        <w:t xml:space="preserve"> </w:t>
+      </w:r>
+      <w:r>
+        <w:t xml:space="preserve">is the second Legendre polynomial. The term beyond the</w:t>
+      </w:r>
+      <w:r>
+        <w:t xml:space="preserve"> </w:t>
+      </w:r>
+      <w:r>
+        <w:t xml:space="preserve">point-mass field is the disturbing function</w:t>
+      </w:r>
+      <w:r>
+        <w:t xml:space="preserve"> </w:t>
+      </w:r>
+      <m:oMath>
+        <m:r>
+          <m:t>R</m:t>
+        </m:r>
+      </m:oMath>
+      <w:r>
+        <w:t xml:space="preserve">. Writing the latitude through the orbital geometry,</w:t>
+      </w:r>
+      <w:r>
+        <w:t xml:space="preserve"> </w:t>
+      </w:r>
+      <m:oMath>
+        <m:r>
+          <m:rPr>
+            <m:sty m:val="p"/>
+          </m:rPr>
+          <m:t>sin</m:t>
+        </m:r>
+        <m:r>
+          <m:t>ϕ</m:t>
+        </m:r>
+        <m:r>
+          <m:rPr>
+            <m:sty m:val="p"/>
+          </m:rPr>
+          <m:t>=</m:t>
+        </m:r>
+        <m:r>
+          <m:rPr>
+            <m:sty m:val="p"/>
+          </m:rPr>
+          <m:t>sin</m:t>
+        </m:r>
+        <m:r>
+          <m:t>i</m:t>
+        </m:r>
+        <m:r>
+          <m:t> </m:t>
+        </m:r>
+        <m:r>
+          <m:rPr>
+            <m:sty m:val="p"/>
+          </m:rPr>
+          <m:t>sin</m:t>
+        </m:r>
+        <m:r>
+          <m:rPr>
+            <m:sty m:val="p"/>
+          </m:rPr>
+          <m:t>(</m:t>
+        </m:r>
+        <m:r>
+          <m:t>ω</m:t>
+        </m:r>
+        <m:r>
+          <m:rPr>
+            <m:sty m:val="p"/>
+          </m:rPr>
+          <m:t>+</m:t>
+        </m:r>
+        <m:r>
+          <m:t>θ</m:t>
+        </m:r>
+        <m:r>
+          <m:rPr>
+            <m:sty m:val="p"/>
+          </m:rPr>
+          <m:t>)</m:t>
+        </m:r>
+      </m:oMath>
+      <w:r>
+        <w:t xml:space="preserve"> </w:t>
+      </w:r>
+      <w:r>
+        <w:t xml:space="preserve">with</w:t>
+      </w:r>
+      <w:r>
+        <w:t xml:space="preserve"> </w:t>
+      </w:r>
+      <m:oMath>
+        <m:r>
+          <m:t>θ</m:t>
+        </m:r>
+      </m:oMath>
+      <w:r>
+        <w:t xml:space="preserve"> </w:t>
+      </w:r>
+      <w:r>
+        <w:t xml:space="preserve">the true anomaly, and averaging</w:t>
+      </w:r>
+      <w:r>
+        <w:t xml:space="preserve"> </w:t>
+      </w:r>
+      <m:oMath>
+        <m:r>
+          <m:t>R</m:t>
+        </m:r>
+      </m:oMath>
+      <w:r>
+        <w:t xml:space="preserve"> </w:t>
+      </w:r>
+      <w:r>
+        <w:t xml:space="preserve">over one</w:t>
+      </w:r>
+      <w:r>
+        <w:t xml:space="preserve"> </w:t>
+      </w:r>
+      <w:r>
+        <w:t xml:space="preserve">revolution removes the short-period terms and leaves the secular part</w:t>
+      </w:r>
+    </w:p>
+    <w:p>
+      <w:pPr>
+        <w:pStyle w:val="BodyText"/>
+      </w:pPr>
+      <m:oMathPara>
+        <m:oMathParaPr>
+          <m:jc m:val="center"/>
+        </m:oMathParaPr>
+        <m:oMath>
+          <m:acc>
+            <m:accPr>
+              <m:chr m:val="‾"/>
+            </m:accPr>
+            <m:e>
+              <m:r>
+                <m:t>R</m:t>
+              </m:r>
+            </m:e>
+          </m:acc>
+          <m:r>
+            <m:rPr>
+              <m:sty m:val="p"/>
+            </m:rPr>
+            <m:t>=</m:t>
+          </m:r>
+          <m:f>
+            <m:fPr>
+              <m:type m:val="bar"/>
+            </m:fPr>
+            <m:num>
+              <m:sSup>
+                <m:e>
+                  <m:r>
+                    <m:t>n</m:t>
+                  </m:r>
+                </m:e>
+                <m:sup>
+                  <m:r>
+                    <m:t>2</m:t>
+                  </m:r>
+                </m:sup>
+              </m:sSup>
+              <m:sSub>
+                <m:e>
+                  <m:r>
+                    <m:t>J</m:t>
+                  </m:r>
+                </m:e>
+                <m:sub>
+                  <m:r>
+                    <m:t>2</m:t>
+                  </m:r>
+                </m:sub>
+              </m:sSub>
+              <m:sSubSup>
+                <m:e>
+                  <m:r>
+                    <m:t>R</m:t>
+                  </m:r>
+                </m:e>
+                <m:sub>
+                  <m:r>
+                    <m:t>E</m:t>
+                  </m:r>
+                </m:sub>
+                <m:sup>
+                  <m:r>
+                    <m:t>2</m:t>
+                  </m:r>
+                </m:sup>
+              </m:sSubSup>
+            </m:num>
+            <m:den>
+              <m:r>
+                <m:t>2</m:t>
+              </m:r>
+            </m:den>
+          </m:f>
+          <m:r>
+            <m:t> </m:t>
+          </m:r>
+          <m:f>
+            <m:fPr>
+              <m:type m:val="bar"/>
+            </m:fPr>
+            <m:num>
+              <m:r>
+                <m:t>1</m:t>
+              </m:r>
+            </m:num>
+            <m:den>
+              <m:r>
+                <m:rPr>
+                  <m:sty m:val="p"/>
+                </m:rPr>
+                <m:t>(</m:t>
+              </m:r>
+              <m:r>
+                <m:t>1</m:t>
+              </m:r>
+              <m:r>
+                <m:rPr>
+                  <m:sty m:val="p"/>
+                </m:rPr>
+                <m:t>−</m:t>
+              </m:r>
+              <m:sSup>
+                <m:e>
+                  <m:r>
+                    <m:t>e</m:t>
+                  </m:r>
+                </m:e>
+                <m:sup>
+                  <m:r>
+                    <m:t>2</m:t>
+                  </m:r>
+                </m:sup>
+              </m:sSup>
+              <m:sSup>
+                <m:e>
+                  <m:r>
+                    <m:rPr>
+                      <m:sty m:val="p"/>
+                    </m:rPr>
+                    <m:t>)</m:t>
+                  </m:r>
+                </m:e>
+                <m:sup>
+                  <m:r>
+                    <m:t>3</m:t>
+                  </m:r>
+                  <m:r>
+                    <m:rPr>
+                      <m:sty m:val="p"/>
+                    </m:rPr>
+                    <m:t>/</m:t>
+                  </m:r>
+                  <m:r>
+                    <m:t>2</m:t>
+                  </m:r>
+                </m:sup>
+              </m:sSup>
+            </m:den>
+          </m:f>
+          <m:d>
+            <m:dPr>
+              <m:begChr m:val="("/>
+              <m:sepChr m:val=""/>
+              <m:endChr m:val=")"/>
+              <m:grow/>
+            </m:dPr>
+            <m:e>
+              <m:f>
+                <m:fPr>
+                  <m:type m:val="bar"/>
+                </m:fPr>
+                <m:num>
+                  <m:r>
+                    <m:t>3</m:t>
+                  </m:r>
+                </m:num>
+                <m:den>
+                  <m:r>
+                    <m:t>2</m:t>
+                  </m:r>
+                </m:den>
+              </m:f>
+              <m:sSup>
+                <m:e>
+                  <m:r>
+                    <m:rPr>
+                      <m:sty m:val="p"/>
+                    </m:rPr>
+                    <m:t>sin</m:t>
+                  </m:r>
+                </m:e>
+                <m:sup>
+                  <m:r>
+                    <m:t>2</m:t>
+                  </m:r>
+                </m:sup>
+              </m:sSup>
+              <m:r>
+                <m:t>i</m:t>
+              </m:r>
+              <m:r>
+                <m:rPr>
+                  <m:sty m:val="p"/>
+                </m:rPr>
+                <m:t>−</m:t>
+              </m:r>
+              <m:r>
+                <m:t>1</m:t>
+              </m:r>
+            </m:e>
+          </m:d>
+          <m:r>
+            <m:rPr>
+              <m:sty m:val="p"/>
+            </m:rPr>
+            <m:t>.</m:t>
+          </m:r>
+        </m:oMath>
+      </m:oMathPara>
+    </w:p>
+    <w:p>
+      <w:pPr>
+        <w:pStyle w:val="FirstParagraph"/>
+      </w:pPr>
+      <w:r>
+        <w:t xml:space="preserve">Lagrange’s planetary equation for the node connects this averaged potential to the drift of</w:t>
+      </w:r>
+      <w:r>
+        <w:t xml:space="preserve"> </w:t>
+      </w:r>
+      <m:oMath>
+        <m:r>
+          <m:rPr>
+            <m:sty m:val="p"/>
+          </m:rPr>
+          <m:t>Ω</m:t>
+        </m:r>
+      </m:oMath>
+      <w:r>
+        <w:t xml:space="preserve">,</w:t>
+      </w:r>
+    </w:p>
+    <w:p>
+      <w:pPr>
+        <w:pStyle w:val="BodyText"/>
+      </w:pPr>
+      <m:oMathPara>
+        <m:oMathParaPr>
+          <m:jc m:val="center"/>
+        </m:oMathParaPr>
+        <m:oMath>
+          <m:acc>
+            <m:accPr>
+              <m:chr m:val="̇"/>
+            </m:accPr>
+            <m:e>
+              <m:r>
+                <m:rPr>
+                  <m:sty m:val="p"/>
+                </m:rPr>
+                <m:t>Ω</m:t>
+              </m:r>
+            </m:e>
+          </m:acc>
+          <m:r>
+            <m:rPr>
+              <m:sty m:val="p"/>
+            </m:rPr>
+            <m:t>=</m:t>
+          </m:r>
+          <m:f>
+            <m:fPr>
+              <m:type m:val="bar"/>
+            </m:fPr>
+            <m:num>
+              <m:r>
+                <m:t>1</m:t>
+              </m:r>
+            </m:num>
+            <m:den>
+              <m:r>
+                <m:t>n</m:t>
+              </m:r>
+              <m:sSup>
+                <m:e>
+                  <m:r>
+                    <m:t>a</m:t>
+                  </m:r>
+                </m:e>
+                <m:sup>
+                  <m:r>
+                    <m:t>2</m:t>
+                  </m:r>
+                </m:sup>
+              </m:sSup>
+              <m:rad>
+                <m:radPr>
+                  <m:degHide m:val="on"/>
+                </m:radPr>
+                <m:deg/>
+                <m:e>
+                  <m:r>
+                    <m:t>1</m:t>
+                  </m:r>
+                  <m:r>
+                    <m:rPr>
+                      <m:sty m:val="p"/>
+                    </m:rPr>
+                    <m:t>−</m:t>
+                  </m:r>
+                  <m:sSup>
+                    <m:e>
+                      <m:r>
+                        <m:t>e</m:t>
+                      </m:r>
+                    </m:e>
+                    <m:sup>
+                      <m:r>
+                        <m:t>2</m:t>
+                      </m:r>
+                    </m:sup>
+                  </m:sSup>
+                </m:e>
+              </m:rad>
+              <m:r>
+                <m:t> </m:t>
+              </m:r>
+              <m:r>
+                <m:rPr>
+                  <m:sty m:val="p"/>
+                </m:rPr>
+                <m:t>sin</m:t>
+              </m:r>
+              <m:r>
+                <m:t>i</m:t>
+              </m:r>
+            </m:den>
+          </m:f>
+          <m:r>
+            <m:t> </m:t>
+          </m:r>
+          <m:f>
+            <m:fPr>
+              <m:type m:val="bar"/>
+            </m:fPr>
+            <m:num>
+              <m:r>
+                <m:rPr>
+                  <m:sty m:val="p"/>
+                </m:rPr>
+                <m:t>∂</m:t>
+              </m:r>
+              <m:acc>
+                <m:accPr>
+                  <m:chr m:val="‾"/>
+                </m:accPr>
+                <m:e>
+                  <m:r>
+                    <m:t>R</m:t>
+                  </m:r>
+                </m:e>
+              </m:acc>
+            </m:num>
+            <m:den>
+              <m:r>
+                <m:rPr>
+                  <m:sty m:val="p"/>
+                </m:rPr>
+                <m:t>∂</m:t>
+              </m:r>
+              <m:r>
+                <m:t>i</m:t>
+              </m:r>
+            </m:den>
+          </m:f>
+          <m:r>
+            <m:rPr>
+              <m:sty m:val="p"/>
+            </m:rPr>
+            <m:t>.</m:t>
+          </m:r>
+        </m:oMath>
+      </m:oMathPara>
+    </w:p>
+    <w:p>
+      <w:pPr>
+        <w:pStyle w:val="FirstParagraph"/>
+      </w:pPr>
+      <w:r>
+        <w:t xml:space="preserve">Carrying out the derivative of (5.3) with respect to</w:t>
+      </w:r>
+      <w:r>
+        <w:t xml:space="preserve"> </w:t>
+      </w:r>
+      <m:oMath>
+        <m:r>
+          <m:t>i</m:t>
+        </m:r>
+      </m:oMath>
+      <w:r>
+        <w:t xml:space="preserve"> </w:t>
+      </w:r>
+      <w:r>
+        <w:t xml:space="preserve">gives</w:t>
+      </w:r>
+      <w:r>
+        <w:t xml:space="preserve"> </w:t>
+      </w:r>
+      <m:oMath>
+        <m:r>
+          <m:rPr>
+            <m:sty m:val="p"/>
+          </m:rPr>
+          <m:t>∂</m:t>
+        </m:r>
+        <m:acc>
+          <m:accPr>
+            <m:chr m:val="‾"/>
+          </m:accPr>
+          <m:e>
+            <m:r>
+              <m:t>R</m:t>
+            </m:r>
+          </m:e>
+        </m:acc>
+        <m:r>
+          <m:rPr>
+            <m:sty m:val="p"/>
+          </m:rPr>
+          <m:t>/</m:t>
+        </m:r>
+        <m:r>
+          <m:rPr>
+            <m:sty m:val="p"/>
+          </m:rPr>
+          <m:t>∂</m:t>
+        </m:r>
+        <m:r>
+          <m:t>i</m:t>
+        </m:r>
+        <m:r>
+          <m:rPr>
+            <m:sty m:val="p"/>
+          </m:rPr>
+          <m:t>∝</m:t>
+        </m:r>
+        <m:r>
+          <m:rPr>
+            <m:sty m:val="p"/>
+          </m:rPr>
+          <m:t>sin</m:t>
+        </m:r>
+        <m:r>
+          <m:t>i</m:t>
+        </m:r>
+        <m:r>
+          <m:rPr>
+            <m:sty m:val="p"/>
+          </m:rPr>
+          <m:t>cos</m:t>
+        </m:r>
+        <m:r>
+          <m:t>i</m:t>
+        </m:r>
+      </m:oMath>
+      <w:r>
+        <w:t xml:space="preserve">,</w:t>
+      </w:r>
+      <w:r>
+        <w:t xml:space="preserve"> </w:t>
+      </w:r>
+      <w:r>
+        <w:t xml:space="preserve">and the</w:t>
+      </w:r>
+      <w:r>
+        <w:t xml:space="preserve"> </w:t>
+      </w:r>
+      <m:oMath>
+        <m:r>
+          <m:rPr>
+            <m:sty m:val="p"/>
+          </m:rPr>
+          <m:t>sin</m:t>
+        </m:r>
+        <m:r>
+          <m:t>i</m:t>
+        </m:r>
+      </m:oMath>
+      <w:r>
+        <w:t xml:space="preserve"> </w:t>
+      </w:r>
+      <w:r>
+        <w:t xml:space="preserve">in the denominator of (5.4) cancels, leaving the</w:t>
+      </w:r>
+      <w:r>
+        <w:t xml:space="preserve"> </w:t>
+      </w:r>
+      <m:oMath>
+        <m:r>
+          <m:rPr>
+            <m:sty m:val="p"/>
+          </m:rPr>
+          <m:t>cos</m:t>
+        </m:r>
+        <m:r>
+          <m:t>i</m:t>
+        </m:r>
+      </m:oMath>
+      <w:r>
+        <w:t xml:space="preserve"> </w:t>
+      </w:r>
+      <w:r>
+        <w:t xml:space="preserve">dependence of (5.1). The</w:t>
+      </w:r>
+      <w:r>
+        <w:t xml:space="preserve"> </w:t>
+      </w:r>
+      <w:r>
+        <w:t xml:space="preserve">result is exact at first order in</w:t>
+      </w:r>
+      <w:r>
+        <w:t xml:space="preserve"> </w:t>
+      </w:r>
+      <m:oMath>
+        <m:sSub>
+          <m:e>
+            <m:r>
+              <m:t>J</m:t>
+            </m:r>
+          </m:e>
+          <m:sub>
+            <m:r>
+              <m:t>2</m:t>
+            </m:r>
+          </m:sub>
+        </m:sSub>
+      </m:oMath>
+      <w:r>
+        <w:t xml:space="preserve"> </w:t>
+      </w:r>
+      <w:r>
+        <w:t xml:space="preserve">for any eccentricity if</w:t>
+      </w:r>
+      <w:r>
+        <w:t xml:space="preserve"> </w:t>
+      </w:r>
+      <m:oMath>
+        <m:r>
+          <m:t>a</m:t>
+        </m:r>
+      </m:oMath>
+      <w:r>
+        <w:t xml:space="preserve"> </w:t>
+      </w:r>
+      <w:r>
+        <w:t xml:space="preserve">is replaced by the semi-latus rectum</w:t>
+      </w:r>
+      <w:r>
+        <w:t xml:space="preserve"> </w:t>
+      </w:r>
+      <m:oMath>
+        <m:r>
+          <m:t>p</m:t>
+        </m:r>
+        <m:r>
+          <m:rPr>
+            <m:sty m:val="p"/>
+          </m:rPr>
+          <m:t>=</m:t>
+        </m:r>
+        <m:r>
+          <m:t>a</m:t>
+        </m:r>
+        <m:r>
+          <m:rPr>
+            <m:sty m:val="p"/>
+          </m:rPr>
+          <m:t>(</m:t>
+        </m:r>
+        <m:r>
+          <m:t>1</m:t>
+        </m:r>
+        <m:r>
+          <m:rPr>
+            <m:sty m:val="p"/>
+          </m:rPr>
+          <m:t>−</m:t>
+        </m:r>
+        <m:sSup>
+          <m:e>
+            <m:r>
+              <m:t>e</m:t>
+            </m:r>
+          </m:e>
+          <m:sup>
+            <m:r>
+              <m:t>2</m:t>
+            </m:r>
+          </m:sup>
+        </m:sSup>
+        <m:r>
+          <m:rPr>
+            <m:sty m:val="p"/>
+          </m:rPr>
+          <m:t>)</m:t>
+        </m:r>
+      </m:oMath>
+      <w:r>
+        <w:t xml:space="preserve">; for the near-circular reference orbit</w:t>
+      </w:r>
+      <w:r>
+        <w:t xml:space="preserve"> </w:t>
+      </w:r>
+      <m:oMath>
+        <m:r>
+          <m:t>p</m:t>
+        </m:r>
+        <m:r>
+          <m:rPr>
+            <m:sty m:val="p"/>
+          </m:rPr>
+          <m:t>≈</m:t>
+        </m:r>
+        <m:r>
+          <m:t>a</m:t>
+        </m:r>
+      </m:oMath>
+      <w:r>
+        <w:t xml:space="preserve"> </w:t>
+      </w:r>
+      <w:r>
+        <w:t xml:space="preserve">and (5.1) follows directly. The sign</w:t>
+      </w:r>
+      <w:r>
+        <w:t xml:space="preserve"> </w:t>
+      </w:r>
+      <w:r>
+        <w:t xml:space="preserve">is negative for prograde orbits (</w:t>
+      </w:r>
+      <m:oMath>
+        <m:r>
+          <m:t>i</m:t>
+        </m:r>
+        <m:r>
+          <m:rPr>
+            <m:sty m:val="p"/>
+          </m:rPr>
+          <m:t>&lt;</m:t>
+        </m:r>
+        <m:sSup>
+          <m:e>
+            <m:r>
+              <m:t>90</m:t>
+            </m:r>
+          </m:e>
+          <m:sup>
+            <m:r>
+              <m:rPr>
+                <m:sty m:val="p"/>
+              </m:rPr>
+              <m:t>∘</m:t>
+            </m:r>
+          </m:sup>
+        </m:sSup>
+      </m:oMath>
+      <w:r>
+        <w:t xml:space="preserve">), so the node regresses, and positive for retrograde</w:t>
+      </w:r>
+      <w:r>
+        <w:t xml:space="preserve"> </w:t>
+      </w:r>
+      <w:r>
+        <w:t xml:space="preserve">orbits, which is what makes synchronization with the Sun possible.</w:t>
+      </w:r>
+    </w:p>
+    <w:p>
+      <w:pPr>
+        <w:pStyle w:val="BodyText"/>
+      </w:pPr>
+      <w:r>
         <w:t xml:space="preserve">A sun-synchronous orbit chooses the inclination</w:t>
       </w:r>
       <w:r>
@@ -6404,7 +7540,7 @@
         <w:t xml:space="preserve"> </w:t>
       </w:r>
       <w:r>
-        <w:t xml:space="preserve">and (5.2) gives</w:t>
+        <w:t xml:space="preserve">and (5.5) gives</w:t>
       </w:r>
       <w:r>
         <w:t xml:space="preserve"> </w:t>
@@ -6474,19 +7610,149 @@
         <w:t xml:space="preserve"> </w:t>
       </w:r>
       <w:r>
-        <w:t xml:space="preserve">matching the reference mission. The dawn-dusk variant orients the orbital plane near Earth’s</w:t>
-      </w:r>
-      <w:r>
-        <w:t xml:space="preserve"> </w:t>
-      </w:r>
-      <w:r>
-        <w:t xml:space="preserve">terminator, which (Chapter 6) yields nearly continuous sunlight and minimal thermal cycling, a</w:t>
-      </w:r>
-      <w:r>
-        <w:t xml:space="preserve"> </w:t>
-      </w:r>
-      <w:r>
-        <w:t xml:space="preserve">decisive advantage for a high-power, thermally sensitive payload.</w:t>
+        <w:t xml:space="preserve">matching the reference mission and the value returned by</w:t>
+      </w:r>
+      <w:r>
+        <w:t xml:space="preserve"> </w:t>
+      </w:r>
+      <w:r>
+        <w:rPr>
+          <w:rStyle w:val="VerbatimChar"/>
+        </w:rPr>
+        <w:t xml:space="preserve">orbital_dc.orbit.sso_inclination(650)</w:t>
+      </w:r>
+      <w:r>
+        <w:t xml:space="preserve">. By</w:t>
+      </w:r>
+      <w:r>
+        <w:t xml:space="preserve"> </w:t>
+      </w:r>
+      <w:r>
+        <w:t xml:space="preserve">construction the corresponding nodal precession is</w:t>
+      </w:r>
+      <w:r>
+        <w:t xml:space="preserve"> </w:t>
+      </w:r>
+      <m:oMath>
+        <m:r>
+          <m:t>0.9856</m:t>
+        </m:r>
+      </m:oMath>
+      <w:r>
+        <w:t xml:space="preserve"> </w:t>
+      </w:r>
+      <w:r>
+        <w:t xml:space="preserve">degrees per day, exactly one turn per</w:t>
+      </w:r>
+      <w:r>
+        <w:t xml:space="preserve"> </w:t>
+      </w:r>
+      <w:r>
+        <w:t xml:space="preserve">tropical year, which is the defining property of the orbit. The required inclination rises slowly with</w:t>
+      </w:r>
+      <w:r>
+        <w:t xml:space="preserve"> </w:t>
+      </w:r>
+      <w:r>
+        <w:t xml:space="preserve">altitude, from about</w:t>
+      </w:r>
+      <w:r>
+        <w:t xml:space="preserve"> </w:t>
+      </w:r>
+      <m:oMath>
+        <m:sSup>
+          <m:e>
+            <m:r>
+              <m:t>96.3</m:t>
+            </m:r>
+          </m:e>
+          <m:sup>
+            <m:r>
+              <m:rPr>
+                <m:sty m:val="p"/>
+              </m:rPr>
+              <m:t>∘</m:t>
+            </m:r>
+          </m:sup>
+        </m:sSup>
+      </m:oMath>
+      <w:r>
+        <w:t xml:space="preserve"> </w:t>
+      </w:r>
+      <w:r>
+        <w:t xml:space="preserve">at 200 kilometers to</w:t>
+      </w:r>
+      <w:r>
+        <w:t xml:space="preserve"> </w:t>
+      </w:r>
+      <m:oMath>
+        <m:sSup>
+          <m:e>
+            <m:r>
+              <m:t>98.6</m:t>
+            </m:r>
+          </m:e>
+          <m:sup>
+            <m:r>
+              <m:rPr>
+                <m:sty m:val="p"/>
+              </m:rPr>
+              <m:t>∘</m:t>
+            </m:r>
+          </m:sup>
+        </m:sSup>
+      </m:oMath>
+      <w:r>
+        <w:t xml:space="preserve"> </w:t>
+      </w:r>
+      <w:r>
+        <w:t xml:space="preserve">at 800 kilometers, because the</w:t>
+      </w:r>
+      <w:r>
+        <w:t xml:space="preserve"> </w:t>
+      </w:r>
+      <m:oMath>
+        <m:sSup>
+          <m:e>
+            <m:r>
+              <m:t>a</m:t>
+            </m:r>
+          </m:e>
+          <m:sup>
+            <m:r>
+              <m:t>2</m:t>
+            </m:r>
+          </m:sup>
+        </m:sSup>
+      </m:oMath>
+      <w:r>
+        <w:t xml:space="preserve"> </w:t>
+      </w:r>
+      <w:r>
+        <w:t xml:space="preserve">factor in (5.5) outpaces the fall in</w:t>
+      </w:r>
+      <w:r>
+        <w:t xml:space="preserve"> </w:t>
+      </w:r>
+      <m:oMath>
+        <m:r>
+          <m:t>n</m:t>
+        </m:r>
+      </m:oMath>
+      <w:r>
+        <w:t xml:space="preserve">. The dawn-dusk variant orients the orbital</w:t>
+      </w:r>
+      <w:r>
+        <w:t xml:space="preserve"> </w:t>
+      </w:r>
+      <w:r>
+        <w:t xml:space="preserve">plane near Earth’s terminator, which (Chapter 6) yields nearly continuous sunlight and minimal thermal</w:t>
+      </w:r>
+      <w:r>
+        <w:t xml:space="preserve"> </w:t>
+      </w:r>
+      <w:r>
+        <w:t xml:space="preserve">cycling, a decisive advantage for a high-power, thermally sensitive payload.</w:t>
       </w:r>
     </w:p>
     <w:bookmarkEnd w:id="22"/>
@@ -6911,6 +8177,1064 @@
         <w:pStyle w:val="FirstParagraph"/>
       </w:pPr>
       <w:r>
+        <w:rPr>
+          <w:b/>
+          <w:bCs/>
+        </w:rPr>
+        <w:t xml:space="preserve">Derivation from the cylindrical shadow.</w:t>
+      </w:r>
+      <w:r>
+        <w:t xml:space="preserve"> </w:t>
+      </w:r>
+      <w:r>
+        <w:t xml:space="preserve">Treat Earth’s shadow as a half-infinite cylinder of radius</w:t>
+      </w:r>
+      <w:r>
+        <w:t xml:space="preserve"> </w:t>
+      </w:r>
+      <m:oMath>
+        <m:sSub>
+          <m:e>
+            <m:r>
+              <m:t>R</m:t>
+            </m:r>
+          </m:e>
+          <m:sub>
+            <m:r>
+              <m:t>E</m:t>
+            </m:r>
+          </m:sub>
+        </m:sSub>
+      </m:oMath>
+      <w:r>
+        <w:t xml:space="preserve"> </w:t>
+      </w:r>
+      <w:r>
+        <w:t xml:space="preserve">pointing away from the Sun, a good approximation in low Earth orbit where the penumbra is narrow</w:t>
+      </w:r>
+      <w:r>
+        <w:t xml:space="preserve"> </w:t>
+      </w:r>
+      <w:r>
+        <w:t xml:space="preserve">and the Sun is effectively at infinity. A point on the circular orbit of radius</w:t>
+      </w:r>
+      <w:r>
+        <w:t xml:space="preserve"> </w:t>
+      </w:r>
+      <m:oMath>
+        <m:r>
+          <m:t>r</m:t>
+        </m:r>
+        <m:r>
+          <m:rPr>
+            <m:sty m:val="p"/>
+          </m:rPr>
+          <m:t>=</m:t>
+        </m:r>
+        <m:sSub>
+          <m:e>
+            <m:r>
+              <m:t>R</m:t>
+            </m:r>
+          </m:e>
+          <m:sub>
+            <m:r>
+              <m:t>E</m:t>
+            </m:r>
+          </m:sub>
+        </m:sSub>
+        <m:r>
+          <m:rPr>
+            <m:sty m:val="p"/>
+          </m:rPr>
+          <m:t>+</m:t>
+        </m:r>
+        <m:r>
+          <m:t>h</m:t>
+        </m:r>
+      </m:oMath>
+      <w:r>
+        <w:t xml:space="preserve"> </w:t>
+      </w:r>
+      <w:r>
+        <w:t xml:space="preserve">lies in</w:t>
+      </w:r>
+      <w:r>
+        <w:t xml:space="preserve"> </w:t>
+      </w:r>
+      <w:r>
+        <w:t xml:space="preserve">shadow when its distance from the shadow axis is less than</w:t>
+      </w:r>
+      <w:r>
+        <w:t xml:space="preserve"> </w:t>
+      </w:r>
+      <m:oMath>
+        <m:sSub>
+          <m:e>
+            <m:r>
+              <m:t>R</m:t>
+            </m:r>
+          </m:e>
+          <m:sub>
+            <m:r>
+              <m:t>E</m:t>
+            </m:r>
+          </m:sub>
+        </m:sSub>
+      </m:oMath>
+      <w:r>
+        <w:t xml:space="preserve"> </w:t>
+      </w:r>
+      <w:r>
+        <w:t xml:space="preserve">and it is on the anti-sun side. Resolve</w:t>
+      </w:r>
+      <w:r>
+        <w:t xml:space="preserve"> </w:t>
+      </w:r>
+      <w:r>
+        <w:t xml:space="preserve">the orbit into the shadow frame: the component of the orbit radius perpendicular to the Sun line, for an</w:t>
+      </w:r>
+      <w:r>
+        <w:t xml:space="preserve"> </w:t>
+      </w:r>
+      <w:r>
+        <w:t xml:space="preserve">orbit whose plane makes angle</w:t>
+      </w:r>
+      <w:r>
+        <w:t xml:space="preserve"> </w:t>
+      </w:r>
+      <m:oMath>
+        <m:r>
+          <m:t>β</m:t>
+        </m:r>
+      </m:oMath>
+      <w:r>
+        <w:t xml:space="preserve"> </w:t>
+      </w:r>
+      <w:r>
+        <w:t xml:space="preserve">with that line, traces an ellipse of semi-axes</w:t>
+      </w:r>
+      <w:r>
+        <w:t xml:space="preserve"> </w:t>
+      </w:r>
+      <m:oMath>
+        <m:r>
+          <m:t>r</m:t>
+        </m:r>
+      </m:oMath>
+      <w:r>
+        <w:t xml:space="preserve"> </w:t>
+      </w:r>
+      <w:r>
+        <w:t xml:space="preserve">and</w:t>
+      </w:r>
+      <w:r>
+        <w:t xml:space="preserve"> </w:t>
+      </w:r>
+      <m:oMath>
+        <m:r>
+          <m:t>r</m:t>
+        </m:r>
+        <m:r>
+          <m:rPr>
+            <m:sty m:val="p"/>
+          </m:rPr>
+          <m:t>cos</m:t>
+        </m:r>
+        <m:r>
+          <m:t>β</m:t>
+        </m:r>
+      </m:oMath>
+      <w:r>
+        <w:t xml:space="preserve">.</w:t>
+      </w:r>
+      <w:r>
+        <w:t xml:space="preserve"> </w:t>
+      </w:r>
+      <w:r>
+        <w:t xml:space="preserve">The satellite is eclipsed over the arc where this projected position falls within the cylinder, and the</w:t>
+      </w:r>
+      <w:r>
+        <w:t xml:space="preserve"> </w:t>
+      </w:r>
+      <w:r>
+        <w:t xml:space="preserve">half-angle</w:t>
+      </w:r>
+      <w:r>
+        <w:t xml:space="preserve"> </w:t>
+      </w:r>
+      <m:oMath>
+        <m:r>
+          <m:t>ψ</m:t>
+        </m:r>
+      </m:oMath>
+      <w:r>
+        <w:t xml:space="preserve"> </w:t>
+      </w:r>
+      <w:r>
+        <w:t xml:space="preserve">of that arc, measured from the anti-solar point, satisfies</w:t>
+      </w:r>
+    </w:p>
+    <w:p>
+      <w:pPr>
+        <w:pStyle w:val="BodyText"/>
+      </w:pPr>
+      <m:oMathPara>
+        <m:oMathParaPr>
+          <m:jc m:val="center"/>
+        </m:oMathParaPr>
+        <m:oMath>
+          <m:r>
+            <m:rPr>
+              <m:sty m:val="p"/>
+            </m:rPr>
+            <m:t>cos</m:t>
+          </m:r>
+          <m:r>
+            <m:t>ψ</m:t>
+          </m:r>
+          <m:r>
+            <m:rPr>
+              <m:sty m:val="p"/>
+            </m:rPr>
+            <m:t>=</m:t>
+          </m:r>
+          <m:f>
+            <m:fPr>
+              <m:type m:val="bar"/>
+            </m:fPr>
+            <m:num>
+              <m:rad>
+                <m:radPr>
+                  <m:degHide m:val="on"/>
+                </m:radPr>
+                <m:deg/>
+                <m:e>
+                  <m:sSup>
+                    <m:e>
+                      <m:r>
+                        <m:t>r</m:t>
+                      </m:r>
+                    </m:e>
+                    <m:sup>
+                      <m:r>
+                        <m:t>2</m:t>
+                      </m:r>
+                    </m:sup>
+                  </m:sSup>
+                  <m:r>
+                    <m:rPr>
+                      <m:sty m:val="p"/>
+                    </m:rPr>
+                    <m:t>−</m:t>
+                  </m:r>
+                  <m:sSubSup>
+                    <m:e>
+                      <m:r>
+                        <m:t>R</m:t>
+                      </m:r>
+                    </m:e>
+                    <m:sub>
+                      <m:r>
+                        <m:t>E</m:t>
+                      </m:r>
+                    </m:sub>
+                    <m:sup>
+                      <m:r>
+                        <m:t>2</m:t>
+                      </m:r>
+                    </m:sup>
+                  </m:sSubSup>
+                </m:e>
+              </m:rad>
+            </m:num>
+            <m:den>
+              <m:r>
+                <m:t>r</m:t>
+              </m:r>
+              <m:r>
+                <m:t> </m:t>
+              </m:r>
+              <m:r>
+                <m:rPr>
+                  <m:sty m:val="p"/>
+                </m:rPr>
+                <m:t>cos</m:t>
+              </m:r>
+              <m:r>
+                <m:t>β</m:t>
+              </m:r>
+            </m:den>
+          </m:f>
+          <m:r>
+            <m:rPr>
+              <m:sty m:val="p"/>
+            </m:rPr>
+            <m:t>=</m:t>
+          </m:r>
+          <m:f>
+            <m:fPr>
+              <m:type m:val="bar"/>
+            </m:fPr>
+            <m:num>
+              <m:rad>
+                <m:radPr>
+                  <m:degHide m:val="on"/>
+                </m:radPr>
+                <m:deg/>
+                <m:e>
+                  <m:sSup>
+                    <m:e>
+                      <m:r>
+                        <m:t>h</m:t>
+                      </m:r>
+                    </m:e>
+                    <m:sup>
+                      <m:r>
+                        <m:t>2</m:t>
+                      </m:r>
+                    </m:sup>
+                  </m:sSup>
+                  <m:r>
+                    <m:rPr>
+                      <m:sty m:val="p"/>
+                    </m:rPr>
+                    <m:t>+</m:t>
+                  </m:r>
+                  <m:r>
+                    <m:t>2</m:t>
+                  </m:r>
+                  <m:sSub>
+                    <m:e>
+                      <m:r>
+                        <m:t>R</m:t>
+                      </m:r>
+                    </m:e>
+                    <m:sub>
+                      <m:r>
+                        <m:t>E</m:t>
+                      </m:r>
+                    </m:sub>
+                  </m:sSub>
+                  <m:r>
+                    <m:t>h</m:t>
+                  </m:r>
+                </m:e>
+              </m:rad>
+            </m:num>
+            <m:den>
+              <m:r>
+                <m:rPr>
+                  <m:sty m:val="p"/>
+                </m:rPr>
+                <m:t>(</m:t>
+              </m:r>
+              <m:sSub>
+                <m:e>
+                  <m:r>
+                    <m:t>R</m:t>
+                  </m:r>
+                </m:e>
+                <m:sub>
+                  <m:r>
+                    <m:t>E</m:t>
+                  </m:r>
+                </m:sub>
+              </m:sSub>
+              <m:r>
+                <m:rPr>
+                  <m:sty m:val="p"/>
+                </m:rPr>
+                <m:t>+</m:t>
+              </m:r>
+              <m:r>
+                <m:t>h</m:t>
+              </m:r>
+              <m:r>
+                <m:rPr>
+                  <m:sty m:val="p"/>
+                </m:rPr>
+                <m:t>)</m:t>
+              </m:r>
+              <m:r>
+                <m:rPr>
+                  <m:sty m:val="p"/>
+                </m:rPr>
+                <m:t>cos</m:t>
+              </m:r>
+              <m:r>
+                <m:t>β</m:t>
+              </m:r>
+            </m:den>
+          </m:f>
+          <m:r>
+            <m:rPr>
+              <m:sty m:val="p"/>
+            </m:rPr>
+            <m:t>.</m:t>
+          </m:r>
+        </m:oMath>
+      </m:oMathPara>
+    </w:p>
+    <w:p>
+      <w:pPr>
+        <w:pStyle w:val="FirstParagraph"/>
+      </w:pPr>
+      <w:r>
+        <w:t xml:space="preserve">The eclipse occupies the fraction</w:t>
+      </w:r>
+      <w:r>
+        <w:t xml:space="preserve"> </w:t>
+      </w:r>
+      <m:oMath>
+        <m:sSub>
+          <m:e>
+            <m:r>
+              <m:t>f</m:t>
+            </m:r>
+          </m:e>
+          <m:sub>
+            <m:r>
+              <m:t>E</m:t>
+            </m:r>
+          </m:sub>
+        </m:sSub>
+        <m:r>
+          <m:rPr>
+            <m:sty m:val="p"/>
+          </m:rPr>
+          <m:t>=</m:t>
+        </m:r>
+        <m:r>
+          <m:t>ψ</m:t>
+        </m:r>
+        <m:r>
+          <m:rPr>
+            <m:sty m:val="p"/>
+          </m:rPr>
+          <m:t>/</m:t>
+        </m:r>
+        <m:r>
+          <m:t>π</m:t>
+        </m:r>
+      </m:oMath>
+      <w:r>
+        <w:t xml:space="preserve"> </w:t>
+      </w:r>
+      <w:r>
+        <w:t xml:space="preserve">of the orbit (the full eclipsed arc is</w:t>
+      </w:r>
+      <w:r>
+        <w:t xml:space="preserve"> </w:t>
+      </w:r>
+      <m:oMath>
+        <m:r>
+          <m:t>2</m:t>
+        </m:r>
+        <m:r>
+          <m:t>ψ</m:t>
+        </m:r>
+      </m:oMath>
+      <w:r>
+        <w:t xml:space="preserve"> </w:t>
+      </w:r>
+      <w:r>
+        <w:t xml:space="preserve">out of</w:t>
+      </w:r>
+      <w:r>
+        <w:t xml:space="preserve"> </w:t>
+      </w:r>
+      <m:oMath>
+        <m:r>
+          <m:t>2</m:t>
+        </m:r>
+        <m:r>
+          <m:t>π</m:t>
+        </m:r>
+      </m:oMath>
+      <w:r>
+        <w:t xml:space="preserve">), and the sunlit fraction is</w:t>
+      </w:r>
+      <w:r>
+        <w:t xml:space="preserve"> </w:t>
+      </w:r>
+      <m:oMath>
+        <m:sSub>
+          <m:e>
+            <m:r>
+              <m:t>f</m:t>
+            </m:r>
+          </m:e>
+          <m:sub>
+            <m:r>
+              <m:rPr>
+                <m:sty m:val="p"/>
+              </m:rPr>
+              <m:t>s</m:t>
+            </m:r>
+            <m:r>
+              <m:rPr>
+                <m:sty m:val="p"/>
+              </m:rPr>
+              <m:t>u</m:t>
+            </m:r>
+            <m:r>
+              <m:rPr>
+                <m:sty m:val="p"/>
+              </m:rPr>
+              <m:t>n</m:t>
+            </m:r>
+          </m:sub>
+        </m:sSub>
+        <m:r>
+          <m:rPr>
+            <m:sty m:val="p"/>
+          </m:rPr>
+          <m:t>=</m:t>
+        </m:r>
+        <m:r>
+          <m:t>1</m:t>
+        </m:r>
+        <m:r>
+          <m:rPr>
+            <m:sty m:val="p"/>
+          </m:rPr>
+          <m:t>−</m:t>
+        </m:r>
+        <m:sSub>
+          <m:e>
+            <m:r>
+              <m:t>f</m:t>
+            </m:r>
+          </m:e>
+          <m:sub>
+            <m:r>
+              <m:t>E</m:t>
+            </m:r>
+          </m:sub>
+        </m:sSub>
+      </m:oMath>
+      <w:r>
+        <w:t xml:space="preserve">, which is (6.2). The expression is real</w:t>
+      </w:r>
+      <w:r>
+        <w:t xml:space="preserve"> </w:t>
+      </w:r>
+      <w:r>
+        <w:t xml:space="preserve">only while the bracket does not exceed one; the threshold where</w:t>
+      </w:r>
+      <w:r>
+        <w:t xml:space="preserve"> </w:t>
+      </w:r>
+      <m:oMath>
+        <m:r>
+          <m:rPr>
+            <m:sty m:val="p"/>
+          </m:rPr>
+          <m:t>cos</m:t>
+        </m:r>
+        <m:r>
+          <m:t>ψ</m:t>
+        </m:r>
+        <m:r>
+          <m:rPr>
+            <m:sty m:val="p"/>
+          </m:rPr>
+          <m:t>=</m:t>
+        </m:r>
+        <m:r>
+          <m:t>1</m:t>
+        </m:r>
+      </m:oMath>
+      <w:r>
+        <w:t xml:space="preserve"> </w:t>
+      </w:r>
+      <w:r>
+        <w:t xml:space="preserve">recovers the critical beta</w:t>
+      </w:r>
+      <w:r>
+        <w:t xml:space="preserve"> </w:t>
+      </w:r>
+      <w:r>
+        <w:t xml:space="preserve">of (6.1), at which the eclipse arc shrinks to zero.</w:t>
+      </w:r>
+    </w:p>
+    <w:p>
+      <w:pPr>
+        <w:pStyle w:val="BodyText"/>
+      </w:pPr>
+      <w:r>
+        <w:rPr>
+          <w:b/>
+          <w:bCs/>
+        </w:rPr>
+        <w:t xml:space="preserve">Annual variation of the beta angle.</w:t>
+      </w:r>
+      <w:r>
+        <w:t xml:space="preserve"> </w:t>
+      </w:r>
+      <w:r>
+        <w:t xml:space="preserve">The beta angle is not fixed: it depends on the angle between the</w:t>
+      </w:r>
+      <w:r>
+        <w:t xml:space="preserve"> </w:t>
+      </w:r>
+      <w:r>
+        <w:t xml:space="preserve">orbit plane and the instantaneous Sun direction. For an orbit of inclination</w:t>
+      </w:r>
+      <w:r>
+        <w:t xml:space="preserve"> </w:t>
+      </w:r>
+      <m:oMath>
+        <m:r>
+          <m:t>i</m:t>
+        </m:r>
+      </m:oMath>
+      <w:r>
+        <w:t xml:space="preserve"> </w:t>
+      </w:r>
+      <w:r>
+        <w:t xml:space="preserve">and node</w:t>
+      </w:r>
+      <w:r>
+        <w:t xml:space="preserve"> </w:t>
+      </w:r>
+      <m:oMath>
+        <m:r>
+          <m:rPr>
+            <m:sty m:val="p"/>
+          </m:rPr>
+          <m:t>Ω</m:t>
+        </m:r>
+      </m:oMath>
+      <w:r>
+        <w:t xml:space="preserve">, with</w:t>
+      </w:r>
+      <w:r>
+        <w:t xml:space="preserve"> </w:t>
+      </w:r>
+      <w:r>
+        <w:t xml:space="preserve">solar ecliptic longitude</w:t>
+      </w:r>
+      <w:r>
+        <w:t xml:space="preserve"> </w:t>
+      </w:r>
+      <m:oMath>
+        <m:sSub>
+          <m:e>
+            <m:r>
+              <m:t>λ</m:t>
+            </m:r>
+          </m:e>
+          <m:sub>
+            <m:r>
+              <m:rPr>
+                <m:sty m:val="p"/>
+              </m:rPr>
+              <m:t>⊙</m:t>
+            </m:r>
+          </m:sub>
+        </m:sSub>
+      </m:oMath>
+      <w:r>
+        <w:t xml:space="preserve"> </w:t>
+      </w:r>
+      <w:r>
+        <w:t xml:space="preserve">and obliquity</w:t>
+      </w:r>
+      <w:r>
+        <w:t xml:space="preserve"> </w:t>
+      </w:r>
+      <m:oMath>
+        <m:r>
+          <m:t>ε</m:t>
+        </m:r>
+        <m:r>
+          <m:rPr>
+            <m:sty m:val="p"/>
+          </m:rPr>
+          <m:t>=</m:t>
+        </m:r>
+        <m:sSup>
+          <m:e>
+            <m:r>
+              <m:t>23.44</m:t>
+            </m:r>
+          </m:e>
+          <m:sup>
+            <m:r>
+              <m:rPr>
+                <m:sty m:val="p"/>
+              </m:rPr>
+              <m:t>∘</m:t>
+            </m:r>
+          </m:sup>
+        </m:sSup>
+      </m:oMath>
+      <w:r>
+        <w:t xml:space="preserve">,</w:t>
+      </w:r>
+    </w:p>
+    <w:p>
+      <w:pPr>
+        <w:pStyle w:val="BodyText"/>
+      </w:pPr>
+      <m:oMathPara>
+        <m:oMathParaPr>
+          <m:jc m:val="center"/>
+        </m:oMathParaPr>
+        <m:oMath>
+          <m:r>
+            <m:rPr>
+              <m:sty m:val="p"/>
+            </m:rPr>
+            <m:t>sin</m:t>
+          </m:r>
+          <m:r>
+            <m:t>β</m:t>
+          </m:r>
+          <m:r>
+            <m:rPr>
+              <m:sty m:val="p"/>
+            </m:rPr>
+            <m:t>=</m:t>
+          </m:r>
+          <m:r>
+            <m:rPr>
+              <m:sty m:val="p"/>
+            </m:rPr>
+            <m:t>cos</m:t>
+          </m:r>
+          <m:sSub>
+            <m:e>
+              <m:r>
+                <m:t>λ</m:t>
+              </m:r>
+            </m:e>
+            <m:sub>
+              <m:r>
+                <m:rPr>
+                  <m:sty m:val="p"/>
+                </m:rPr>
+                <m:t>⊙</m:t>
+              </m:r>
+            </m:sub>
+          </m:sSub>
+          <m:r>
+            <m:rPr>
+              <m:sty m:val="p"/>
+            </m:rPr>
+            <m:t>sin</m:t>
+          </m:r>
+          <m:r>
+            <m:rPr>
+              <m:sty m:val="p"/>
+            </m:rPr>
+            <m:t>Ω</m:t>
+          </m:r>
+          <m:r>
+            <m:rPr>
+              <m:sty m:val="p"/>
+            </m:rPr>
+            <m:t>sin</m:t>
+          </m:r>
+          <m:r>
+            <m:t>i</m:t>
+          </m:r>
+          <m:r>
+            <m:rPr>
+              <m:sty m:val="p"/>
+            </m:rPr>
+            <m:t>−</m:t>
+          </m:r>
+          <m:r>
+            <m:rPr>
+              <m:sty m:val="p"/>
+            </m:rPr>
+            <m:t>sin</m:t>
+          </m:r>
+          <m:sSub>
+            <m:e>
+              <m:r>
+                <m:t>λ</m:t>
+              </m:r>
+            </m:e>
+            <m:sub>
+              <m:r>
+                <m:rPr>
+                  <m:sty m:val="p"/>
+                </m:rPr>
+                <m:t>⊙</m:t>
+              </m:r>
+            </m:sub>
+          </m:sSub>
+          <m:r>
+            <m:rPr>
+              <m:sty m:val="p"/>
+            </m:rPr>
+            <m:t>cos</m:t>
+          </m:r>
+          <m:r>
+            <m:t>ε</m:t>
+          </m:r>
+          <m:r>
+            <m:rPr>
+              <m:sty m:val="p"/>
+            </m:rPr>
+            <m:t>cos</m:t>
+          </m:r>
+          <m:r>
+            <m:rPr>
+              <m:sty m:val="p"/>
+            </m:rPr>
+            <m:t>Ω</m:t>
+          </m:r>
+          <m:r>
+            <m:rPr>
+              <m:sty m:val="p"/>
+            </m:rPr>
+            <m:t>sin</m:t>
+          </m:r>
+          <m:r>
+            <m:t>i</m:t>
+          </m:r>
+          <m:r>
+            <m:rPr>
+              <m:sty m:val="p"/>
+            </m:rPr>
+            <m:t>+</m:t>
+          </m:r>
+          <m:r>
+            <m:rPr>
+              <m:sty m:val="p"/>
+            </m:rPr>
+            <m:t>sin</m:t>
+          </m:r>
+          <m:sSub>
+            <m:e>
+              <m:r>
+                <m:t>λ</m:t>
+              </m:r>
+            </m:e>
+            <m:sub>
+              <m:r>
+                <m:rPr>
+                  <m:sty m:val="p"/>
+                </m:rPr>
+                <m:t>⊙</m:t>
+              </m:r>
+            </m:sub>
+          </m:sSub>
+          <m:r>
+            <m:rPr>
+              <m:sty m:val="p"/>
+            </m:rPr>
+            <m:t>sin</m:t>
+          </m:r>
+          <m:r>
+            <m:t>ε</m:t>
+          </m:r>
+          <m:r>
+            <m:rPr>
+              <m:sty m:val="p"/>
+            </m:rPr>
+            <m:t>cos</m:t>
+          </m:r>
+          <m:r>
+            <m:t>i</m:t>
+          </m:r>
+          <m:r>
+            <m:rPr>
+              <m:sty m:val="p"/>
+            </m:rPr>
+            <m:t>.</m:t>
+          </m:r>
+        </m:oMath>
+      </m:oMathPara>
+    </w:p>
+    <w:p>
+      <w:pPr>
+        <w:pStyle w:val="FirstParagraph"/>
+      </w:pPr>
+      <w:r>
+        <w:t xml:space="preserve">A sun-synchronous orbit holds</w:t>
+      </w:r>
+      <w:r>
+        <w:t xml:space="preserve"> </w:t>
+      </w:r>
+      <m:oMath>
+        <m:r>
+          <m:rPr>
+            <m:sty m:val="p"/>
+          </m:rPr>
+          <m:t>Ω</m:t>
+        </m:r>
+      </m:oMath>
+      <w:r>
+        <w:t xml:space="preserve"> </w:t>
+      </w:r>
+      <w:r>
+        <w:t xml:space="preserve">at a fixed local time by construction, so the seasonal swing of</w:t>
+      </w:r>
+      <w:r>
+        <w:t xml:space="preserve"> </w:t>
+      </w:r>
+      <m:oMath>
+        <m:sSub>
+          <m:e>
+            <m:r>
+              <m:t>λ</m:t>
+            </m:r>
+          </m:e>
+          <m:sub>
+            <m:r>
+              <m:rPr>
+                <m:sty m:val="p"/>
+              </m:rPr>
+              <m:t>⊙</m:t>
+            </m:r>
+          </m:sub>
+        </m:sSub>
+      </m:oMath>
+      <w:r>
+        <w:t xml:space="preserve"> </w:t>
+      </w:r>
+      <w:r>
+        <w:t xml:space="preserve">is what moves</w:t>
+      </w:r>
+      <w:r>
+        <w:t xml:space="preserve"> </w:t>
+      </w:r>
+      <m:oMath>
+        <m:r>
+          <m:t>β</m:t>
+        </m:r>
+      </m:oMath>
+      <w:r>
+        <w:t xml:space="preserve">. For the dawn-dusk case, where the node is set near the six o’clock</w:t>
+      </w:r>
+      <w:r>
+        <w:t xml:space="preserve"> </w:t>
+      </w:r>
+      <w:r>
+        <w:t xml:space="preserve">line so the orbit plane contains the terminator, (6.4) reduces to</w:t>
+      </w:r>
+      <w:r>
+        <w:t xml:space="preserve"> </w:t>
+      </w:r>
+      <m:oMath>
+        <m:r>
+          <m:rPr>
+            <m:sty m:val="p"/>
+          </m:rPr>
+          <m:t>|</m:t>
+        </m:r>
+        <m:r>
+          <m:t>β</m:t>
+        </m:r>
+        <m:r>
+          <m:rPr>
+            <m:sty m:val="p"/>
+          </m:rPr>
+          <m:t>|</m:t>
+        </m:r>
+      </m:oMath>
+      <w:r>
+        <w:t xml:space="preserve"> </w:t>
+      </w:r>
+      <w:r>
+        <w:t xml:space="preserve">oscillating between about</w:t>
+      </w:r>
+      <w:r>
+        <w:t xml:space="preserve"> </w:t>
+      </w:r>
+      <m:oMath>
+        <m:sSup>
+          <m:e>
+            <m:r>
+              <m:t>66.6</m:t>
+            </m:r>
+          </m:e>
+          <m:sup>
+            <m:r>
+              <m:rPr>
+                <m:sty m:val="p"/>
+              </m:rPr>
+              <m:t>∘</m:t>
+            </m:r>
+          </m:sup>
+        </m:sSup>
+      </m:oMath>
+      <w:r>
+        <w:t xml:space="preserve"> </w:t>
+      </w:r>
+      <w:r>
+        <w:t xml:space="preserve">and</w:t>
+      </w:r>
+      <w:r>
+        <w:t xml:space="preserve"> </w:t>
+      </w:r>
+      <m:oMath>
+        <m:sSup>
+          <m:e>
+            <m:r>
+              <m:t>90</m:t>
+            </m:r>
+          </m:e>
+          <m:sup>
+            <m:r>
+              <m:rPr>
+                <m:sty m:val="p"/>
+              </m:rPr>
+              <m:t>∘</m:t>
+            </m:r>
+          </m:sup>
+        </m:sSup>
+      </m:oMath>
+      <w:r>
+        <w:t xml:space="preserve"> </w:t>
+      </w:r>
+      <w:r>
+        <w:t xml:space="preserve">over the year, the lower bound being</w:t>
+      </w:r>
+      <w:r>
+        <w:t xml:space="preserve"> </w:t>
+      </w:r>
+      <m:oMath>
+        <m:sSup>
+          <m:e>
+            <m:r>
+              <m:t>90</m:t>
+            </m:r>
+          </m:e>
+          <m:sup>
+            <m:r>
+              <m:rPr>
+                <m:sty m:val="p"/>
+              </m:rPr>
+              <m:t>∘</m:t>
+            </m:r>
+          </m:sup>
+        </m:sSup>
+        <m:r>
+          <m:rPr>
+            <m:sty m:val="p"/>
+          </m:rPr>
+          <m:t>−</m:t>
+        </m:r>
+        <m:r>
+          <m:t>ε</m:t>
+        </m:r>
+      </m:oMath>
+      <w:r>
+        <w:t xml:space="preserve">.</w:t>
+      </w:r>
+    </w:p>
+    <w:p>
+      <w:pPr>
+        <w:pStyle w:val="BodyText"/>
+      </w:pPr>
+      <w:r>
         <w:t xml:space="preserve">At 650 km,</w:t>
       </w:r>
       <w:r>
@@ -6991,7 +9315,7 @@
         </m:sSup>
       </m:oMath>
       <w:r>
-        <w:t xml:space="preserve">. A dawn-dusk sun-synchronous orbit holds</w:t>
+        <w:t xml:space="preserve">. Because the dawn-dusk orbit keeps</w:t>
       </w:r>
       <w:r>
         <w:t xml:space="preserve"> </w:t>
@@ -7017,7 +9341,7 @@
         <w:t xml:space="preserve"> </w:t>
       </w:r>
       <w:r>
-        <w:t xml:space="preserve">near</w:t>
+        <w:t xml:space="preserve">above</w:t>
       </w:r>
       <w:r>
         <w:t xml:space="preserve"> </w:t>
@@ -7026,7 +9350,7 @@
         <m:sSup>
           <m:e>
             <m:r>
-              <m:t>90</m:t>
+              <m:t>66.6</m:t>
             </m:r>
           </m:e>
           <m:sup>
@@ -7043,37 +9367,16 @@
         <w:t xml:space="preserve"> </w:t>
       </w:r>
       <w:r>
-        <w:t xml:space="preserve">for most of the year, so</w:t>
+        <w:t xml:space="preserve">at all times, it stays above this</w:t>
       </w:r>
       <w:r>
         <w:t xml:space="preserve"> </w:t>
       </w:r>
       <m:oMath>
-        <m:r>
-          <m:rPr>
-            <m:sty m:val="p"/>
-          </m:rPr>
-          <m:t>|</m:t>
-        </m:r>
-        <m:r>
-          <m:t>β</m:t>
-        </m:r>
-        <m:r>
-          <m:rPr>
-            <m:sty m:val="p"/>
-          </m:rPr>
-          <m:t>|</m:t>
-        </m:r>
-        <m:r>
-          <m:rPr>
-            <m:sty m:val="p"/>
-          </m:rPr>
-          <m:t>&gt;</m:t>
-        </m:r>
         <m:sSup>
           <m:e>
             <m:r>
-              <m:t>β</m:t>
+              <m:t>65.1</m:t>
             </m:r>
           </m:e>
           <m:sup>
@@ -7081,7 +9384,7 @@
               <m:rPr>
                 <m:sty m:val="p"/>
               </m:rPr>
-              <m:t>*</m:t>
+              <m:t>∘</m:t>
             </m:r>
           </m:sup>
         </m:sSup>
@@ -7090,7 +9393,13 @@
         <w:t xml:space="preserve"> </w:t>
       </w:r>
       <w:r>
-        <w:t xml:space="preserve">and</w:t>
+        <w:t xml:space="preserve">threshold year round, so the satellite</w:t>
+      </w:r>
+      <w:r>
+        <w:t xml:space="preserve"> </w:t>
+      </w:r>
+      <w:r>
+        <w:t xml:space="preserve">never enters a deep eclipse and</w:t>
       </w:r>
       <w:r>
         <w:t xml:space="preserve"> </w:t>
@@ -7134,25 +9443,31 @@
         </m:r>
       </m:oMath>
       <w:r>
-        <w:t xml:space="preserve">:</w:t>
-      </w:r>
-      <w:r>
-        <w:t xml:space="preserve"> </w:t>
-      </w:r>
-      <w:r>
-        <w:t xml:space="preserve">illumination exceeds ninety-five percent, the battery need is minimal (Chapter 11), and the</w:t>
-      </w:r>
-      <w:r>
-        <w:t xml:space="preserve"> </w:t>
-      </w:r>
-      <w:r>
-        <w:t xml:space="preserve">thermal environment is nearly steady, justifying the quasi-steady thermal treatment of Chapter 10.</w:t>
-      </w:r>
-      <w:r>
-        <w:t xml:space="preserve"> </w:t>
-      </w:r>
-      <w:r>
-        <w:t xml:space="preserve">This is the single most favorable environmental choice available to the architecture.</w:t>
+        <w:t xml:space="preserve">: illumination exceeds ninety-five percent, the</w:t>
+      </w:r>
+      <w:r>
+        <w:t xml:space="preserve"> </w:t>
+      </w:r>
+      <w:r>
+        <w:t xml:space="preserve">battery need is minimal (Chapter 11), and the thermal environment is nearly steady, justifying the</w:t>
+      </w:r>
+      <w:r>
+        <w:t xml:space="preserve"> </w:t>
+      </w:r>
+      <w:r>
+        <w:t xml:space="preserve">quasi-steady thermal treatment of Chapter 10. This is the single most favorable environmental choice</w:t>
+      </w:r>
+      <w:r>
+        <w:t xml:space="preserve"> </w:t>
+      </w:r>
+      <w:r>
+        <w:t xml:space="preserve">available to the architecture, and it is robust to the seasonal beta swing rather than dependent on a</w:t>
+      </w:r>
+      <w:r>
+        <w:t xml:space="preserve"> </w:t>
+      </w:r>
+      <w:r>
+        <w:t xml:space="preserve">single favorable date.</w:t>
       </w:r>
     </w:p>
     <w:p>
@@ -22018,31 +24333,73 @@
         <w:t xml:space="preserve"> </w:t>
       </w:r>
       <w:r>
-        <w:t xml:space="preserve">launches per year. The result (Fig. 22.1) places the median parity year near 2044, with a fifth</w:t>
-      </w:r>
-      <w:r>
-        <w:t xml:space="preserve"> </w:t>
-      </w:r>
-      <w:r>
-        <w:t xml:space="preserve">percentile of about 2037 and essentially no probability of reaching parity by 2035. The vendor’s</w:t>
-      </w:r>
-      <w:r>
-        <w:t xml:space="preserve"> </w:t>
-      </w:r>
-      <w:r>
-        <w:t xml:space="preserve">2035 date sits at the optimistic edge of the distribution and requires its specific aggressive</w:t>
-      </w:r>
-      <w:r>
-        <w:t xml:space="preserve"> </w:t>
-      </w:r>
-      <w:r>
-        <w:t xml:space="preserve">anchors, full reusability at 200 tonnes and roughly two million dollars marginal cost, sustained</w:t>
-      </w:r>
-      <w:r>
-        <w:t xml:space="preserve"> </w:t>
-      </w:r>
-      <w:r>
-        <w:t xml:space="preserve">twenty-percent learning from a low starting price.</w:t>
+        <w:t xml:space="preserve">launches per year. The first result is the more important one and is easy to miss in a single</w:t>
+      </w:r>
+      <w:r>
+        <w:t xml:space="preserve"> </w:t>
+      </w:r>
+      <w:r>
+        <w:t xml:space="preserve">headline date: across the sampled assumptions, only about five percent of scenarios reach 200 dollars</w:t>
+      </w:r>
+      <w:r>
+        <w:t xml:space="preserve"> </w:t>
+      </w:r>
+      <w:r>
+        <w:t xml:space="preserve">per kilogram at all within the 2050 horizon, and roughly ninety-five percent never reach it. Parity at</w:t>
+      </w:r>
+      <w:r>
+        <w:t xml:space="preserve"> </w:t>
+      </w:r>
+      <w:r>
+        <w:t xml:space="preserve">that price is therefore not a near-certainty awaiting a date; under most defensible assumptions it does</w:t>
+      </w:r>
+      <w:r>
+        <w:t xml:space="preserve"> </w:t>
+      </w:r>
+      <w:r>
+        <w:t xml:space="preserve">not arrive within the horizon. Conditional on the minority of scenarios that do reach it, the median</w:t>
+      </w:r>
+      <w:r>
+        <w:t xml:space="preserve"> </w:t>
+      </w:r>
+      <w:r>
+        <w:t xml:space="preserve">parity year is near 2044 (Fig. 22.1), with a fifth percentile of about 2037 and essentially no</w:t>
+      </w:r>
+      <w:r>
+        <w:t xml:space="preserve"> </w:t>
+      </w:r>
+      <w:r>
+        <w:t xml:space="preserve">probability of reaching parity by 2035. Extending the horizon to 2060 raises the reaching fraction only</w:t>
+      </w:r>
+      <w:r>
+        <w:t xml:space="preserve"> </w:t>
+      </w:r>
+      <w:r>
+        <w:t xml:space="preserve">to about nine percent and moves the conditional median to the end of the 2040s, so the conclusion is not</w:t>
+      </w:r>
+      <w:r>
+        <w:t xml:space="preserve"> </w:t>
+      </w:r>
+      <w:r>
+        <w:t xml:space="preserve">an artifact of where the horizon is drawn. The vendor’s 2035 date sits beyond the optimistic edge of the</w:t>
+      </w:r>
+      <w:r>
+        <w:t xml:space="preserve"> </w:t>
+      </w:r>
+      <w:r>
+        <w:t xml:space="preserve">distribution and requires its specific aggressive anchors, full reusability at 200 tonnes and roughly</w:t>
+      </w:r>
+      <w:r>
+        <w:t xml:space="preserve"> </w:t>
+      </w:r>
+      <w:r>
+        <w:t xml:space="preserve">two million dollars marginal cost, sustained twenty-percent learning from a low starting price, and a</w:t>
+      </w:r>
+      <w:r>
+        <w:t xml:space="preserve"> </w:t>
+      </w:r>
+      <w:r>
+        <w:t xml:space="preserve">total launched mass far larger than the cadence ranges sampled here deliver.</w:t>
       </w:r>
     </w:p>
     <w:p>
@@ -22050,13 +24407,19 @@
         <w:pStyle w:val="BodyText"/>
       </w:pPr>
       <w:r>
-        <w:t xml:space="preserve">The prediction is that launch-cost parity is more likely to arrive in the late</w:t>
-      </w:r>
-      <w:r>
-        <w:t xml:space="preserve"> </w:t>
-      </w:r>
-      <w:r>
-        <w:t xml:space="preserve">2030s to mid-2040s than in 2035, and that it is necessary but not sufficient: even at parity, the</w:t>
+        <w:t xml:space="preserve">The prediction is therefore twofold: launch-cost parity at 200 dollars per kilogram is unlikely under</w:t>
+      </w:r>
+      <w:r>
+        <w:t xml:space="preserve"> </w:t>
+      </w:r>
+      <w:r>
+        <w:t xml:space="preserve">most assumptions rather than merely late, and where it does arrive it is more likely in the late 2030s</w:t>
+      </w:r>
+      <w:r>
+        <w:t xml:space="preserve"> </w:t>
+      </w:r>
+      <w:r>
+        <w:t xml:space="preserve">to mid-2040s than in 2035. Parity is in any case necessary but not sufficient: even at parity, the</w:t>
       </w:r>
       <w:r>
         <w:t xml:space="preserve"> </w:t>
@@ -22074,7 +24437,7 @@
           <wp:inline>
             <wp:extent cx="5334000" cy="2619768"/>
             <wp:effectExtent b="0" l="0" r="0" t="0"/>
-            <wp:docPr descr="Fig. 22.1, Launch-cost learning curve (Monte-Carlo) and the distribution of the cost-parity year; median near 2044, later than the vendor’s 2035." title="" id="101" name="Picture"/>
+            <wp:docPr descr="Fig. 22.1, Launch-cost learning curve (Monte-Carlo) and the distribution of the cost-parity year. Most sampled scenarios never reach 200 dollars per kilogram within the horizon; conditional on those that do, the median is near 2044, later than the vendor’s 2035." title="" id="101" name="Picture"/>
             <a:graphic>
               <a:graphicData uri="http://schemas.openxmlformats.org/drawingml/2006/picture">
                 <pic:pic>
@@ -22117,7 +24480,7 @@
         <w:pStyle w:val="ImageCaption"/>
       </w:pPr>
       <w:r>
-        <w:t xml:space="preserve">Fig. 22.1, Launch-cost learning curve (Monte-Carlo) and the distribution of the cost-parity year; median near 2044, later than the vendor’s 2035.</w:t>
+        <w:t xml:space="preserve">Fig. 22.1, Launch-cost learning curve (Monte-Carlo) and the distribution of the cost-parity year. Most sampled scenarios never reach 200 dollars per kilogram within the horizon; conditional on those that do, the median is near 2044, later than the vendor’s 2035.</w:t>
       </w:r>
     </w:p>
     <w:bookmarkEnd w:id="103"/>

</xml_diff>

<commit_message>
Loop: derive reliability/redundancy and uncertainty-quantification chapters
Ch16: derive exponential reliability from the constant-hazard ODE, derive
k-of-n from the binomial, add a worked constellation example (81 deployed,
75 required, p=0.90 -> 0.97 capacity; 95% availability needs ~89 deployed;
20%/yr replenishment) with every figure produced by orbital_dc.reliability.

Ch19: add linear error propagation (first-order variance formula) alongside
the Monte-Carlo treatment, note the 1/sqrt(N) convergence and the lognormal
density caveat, and document the one-at-a-time sensitivity sweep.

All numbers checked against the modules. HTML rebuilt (0 raw TeX), Word rebuilt.
</commit_message>
<xml_diff>
--- a/report/Report_II_Complete.docx
+++ b/report/Report_II_Complete.docx
@@ -19754,39 +19754,84 @@
         <w:t xml:space="preserve"> </w:t>
       </w:r>
       <w:r>
-        <w:t xml:space="preserve">In the flat region of the bathtub curve, failures are a constant-hazard</w:t>
-      </w:r>
-      <w:r>
-        <w:t xml:space="preserve"> </w:t>
-      </w:r>
-      <w:r>
-        <w:t xml:space="preserve">Poisson process, so the probability that a unit survives to time</w:t>
+        <w:t xml:space="preserve">Let the hazard rate</w:t>
       </w:r>
       <w:r>
         <w:t xml:space="preserve"> </w:t>
       </w:r>
       <m:oMath>
         <m:r>
+          <m:t>λ</m:t>
+        </m:r>
+        <m:r>
+          <m:rPr>
+            <m:sty m:val="p"/>
+          </m:rPr>
+          <m:t>(</m:t>
+        </m:r>
+        <m:r>
           <m:t>t</m:t>
         </m:r>
+        <m:r>
+          <m:rPr>
+            <m:sty m:val="p"/>
+          </m:rPr>
+          <m:t>)</m:t>
+        </m:r>
       </m:oMath>
       <w:r>
         <w:t xml:space="preserve"> </w:t>
       </w:r>
       <w:r>
-        <w:t xml:space="preserve">is</w:t>
+        <w:t xml:space="preserve">be the instantaneous failure rate of a</w:t>
+      </w:r>
+      <w:r>
+        <w:t xml:space="preserve"> </w:t>
+      </w:r>
+      <w:r>
+        <w:t xml:space="preserve">surviving unit. The survival probability obeys</w:t>
       </w:r>
       <w:r>
         <w:t xml:space="preserve"> </w:t>
       </w:r>
       <m:oMath>
         <m:r>
+          <m:t>d</m:t>
+        </m:r>
+        <m:r>
           <m:t>R</m:t>
         </m:r>
         <m:r>
           <m:rPr>
             <m:sty m:val="p"/>
           </m:rPr>
+          <m:t>/</m:t>
+        </m:r>
+        <m:r>
+          <m:t>d</m:t>
+        </m:r>
+        <m:r>
+          <m:t>t</m:t>
+        </m:r>
+        <m:r>
+          <m:rPr>
+            <m:sty m:val="p"/>
+          </m:rPr>
+          <m:t>=</m:t>
+        </m:r>
+        <m:r>
+          <m:rPr>
+            <m:sty m:val="p"/>
+          </m:rPr>
+          <m:t>−</m:t>
+        </m:r>
+        <m:r>
+          <m:t>λ</m:t>
+        </m:r>
+        <m:r>
+          <m:rPr>
+            <m:sty m:val="p"/>
+          </m:rPr>
           <m:t>(</m:t>
         </m:r>
         <m:r>
@@ -19799,15 +19844,94 @@
           <m:t>)</m:t>
         </m:r>
         <m:r>
+          <m:t> </m:t>
+        </m:r>
+        <m:r>
+          <m:t>R</m:t>
+        </m:r>
+      </m:oMath>
+      <w:r>
+        <w:t xml:space="preserve">, whose solution is</w:t>
+      </w:r>
+      <w:r>
+        <w:t xml:space="preserve"> </w:t>
+      </w:r>
+      <m:oMath>
+        <m:r>
+          <m:t>R</m:t>
+        </m:r>
+        <m:r>
+          <m:rPr>
+            <m:sty m:val="p"/>
+          </m:rPr>
+          <m:t>(</m:t>
+        </m:r>
+        <m:r>
+          <m:t>t</m:t>
+        </m:r>
+        <m:r>
+          <m:rPr>
+            <m:sty m:val="p"/>
+          </m:rPr>
+          <m:t>)</m:t>
+        </m:r>
+        <m:r>
           <m:rPr>
             <m:sty m:val="p"/>
           </m:rPr>
           <m:t>=</m:t>
+        </m:r>
+        <m:r>
+          <m:rPr>
+            <m:sty m:val="p"/>
+          </m:rPr>
+          <m:t>exp</m:t>
+        </m:r>
+        <m:r>
+          <m:rPr>
+            <m:sty m:val="p"/>
+          </m:rPr>
+          <m:t>[</m:t>
+        </m:r>
+        <m:r>
+          <m:rPr>
+            <m:sty m:val="p"/>
+          </m:rPr>
+          <m:t>−</m:t>
+        </m:r>
+        <m:nary>
+          <m:naryPr>
+            <m:chr m:val="∫"/>
+            <m:limLoc m:val="subSup"/>
+            <m:subHide m:val="off"/>
+            <m:supHide m:val="off"/>
+          </m:naryPr>
+          <m:sub>
+            <m:r>
+              <m:t>0</m:t>
+            </m:r>
+          </m:sub>
+          <m:sup>
+            <m:r>
+              <m:t>t</m:t>
+            </m:r>
+          </m:sup>
+          <m:e>
+            <m:r>
+              <m:t>λ</m:t>
+            </m:r>
+          </m:e>
+        </m:nary>
+        <m:r>
+          <m:rPr>
+            <m:sty m:val="p"/>
+          </m:rPr>
+          <m:t>(</m:t>
         </m:r>
         <m:sSup>
           <m:e>
             <m:r>
-              <m:t>e</m:t>
+              <m:t>t</m:t>
             </m:r>
           </m:e>
           <m:sup>
@@ -19815,89 +19939,59 @@
               <m:rPr>
                 <m:sty m:val="p"/>
               </m:rPr>
-              <m:t>−</m:t>
-            </m:r>
+              <m:t>′</m:t>
+            </m:r>
+          </m:sup>
+        </m:sSup>
+        <m:r>
+          <m:rPr>
+            <m:sty m:val="p"/>
+          </m:rPr>
+          <m:t>)</m:t>
+        </m:r>
+        <m:r>
+          <m:t> </m:t>
+        </m:r>
+        <m:r>
+          <m:t>d</m:t>
+        </m:r>
+        <m:sSup>
+          <m:e>
             <m:r>
               <m:t>t</m:t>
             </m:r>
+          </m:e>
+          <m:sup>
             <m:r>
               <m:rPr>
                 <m:sty m:val="p"/>
               </m:rPr>
-              <m:t>/</m:t>
-            </m:r>
-            <m:r>
-              <m:rPr>
-                <m:sty m:val="p"/>
-              </m:rPr>
-              <m:t>M</m:t>
-            </m:r>
-            <m:r>
-              <m:rPr>
-                <m:sty m:val="p"/>
-              </m:rPr>
-              <m:t>T</m:t>
-            </m:r>
-            <m:r>
-              <m:rPr>
-                <m:sty m:val="p"/>
-              </m:rPr>
-              <m:t>B</m:t>
-            </m:r>
-            <m:r>
-              <m:rPr>
-                <m:sty m:val="p"/>
-              </m:rPr>
-              <m:t>F</m:t>
+              <m:t>′</m:t>
             </m:r>
           </m:sup>
         </m:sSup>
+        <m:r>
+          <m:rPr>
+            <m:sty m:val="p"/>
+          </m:rPr>
+          <m:t>]</m:t>
+        </m:r>
       </m:oMath>
       <w:r>
-        <w:t xml:space="preserve">.</w:t>
-      </w:r>
-      <w:r>
-        <w:t xml:space="preserve"> </w:t>
-      </w:r>
-      <w:r>
-        <w:t xml:space="preserve">A bus with a mean time between failures of 50,000 hours has</w:t>
+        <w:t xml:space="preserve">. In the flat region of the bathtub curve the hazard is</w:t>
+      </w:r>
+      <w:r>
+        <w:t xml:space="preserve"> </w:t>
+      </w:r>
+      <w:r>
+        <w:t xml:space="preserve">constant,</w:t>
       </w:r>
       <w:r>
         <w:t xml:space="preserve"> </w:t>
       </w:r>
       <m:oMath>
         <m:r>
-          <m:t>R</m:t>
-        </m:r>
-        <m:r>
-          <m:rPr>
-            <m:sty m:val="p"/>
-          </m:rPr>
-          <m:t>(</m:t>
-        </m:r>
-        <m:r>
-          <m:t>5</m:t>
-        </m:r>
-        <m:r>
-          <m:t> </m:t>
-        </m:r>
-        <m:r>
-          <m:rPr>
-            <m:sty m:val="p"/>
-          </m:rPr>
-          <m:t>y</m:t>
-        </m:r>
-        <m:r>
-          <m:rPr>
-            <m:sty m:val="p"/>
-          </m:rPr>
-          <m:t>r</m:t>
-        </m:r>
-        <m:r>
-          <m:rPr>
-            <m:sty m:val="p"/>
-          </m:rPr>
-          <m:t>)</m:t>
+          <m:t>λ</m:t>
         </m:r>
         <m:r>
           <m:rPr>
@@ -19905,240 +19999,256 @@
           </m:rPr>
           <m:t>=</m:t>
         </m:r>
-        <m:sSup>
-          <m:e>
-            <m:r>
-              <m:t>e</m:t>
-            </m:r>
-          </m:e>
-          <m:sup>
-            <m:r>
-              <m:rPr>
-                <m:sty m:val="p"/>
-              </m:rPr>
-              <m:t>−</m:t>
-            </m:r>
-            <m:r>
-              <m:t>0.876</m:t>
-            </m:r>
-          </m:sup>
-        </m:sSup>
-        <m:r>
-          <m:rPr>
-            <m:sty m:val="p"/>
-          </m:rPr>
-          <m:t>=</m:t>
-        </m:r>
-        <m:r>
-          <m:t>0.42</m:t>
+        <m:r>
+          <m:t>1</m:t>
+        </m:r>
+        <m:r>
+          <m:rPr>
+            <m:sty m:val="p"/>
+          </m:rPr>
+          <m:t>/</m:t>
+        </m:r>
+        <m:r>
+          <m:rPr>
+            <m:sty m:val="p"/>
+          </m:rPr>
+          <m:t>M</m:t>
+        </m:r>
+        <m:r>
+          <m:rPr>
+            <m:sty m:val="p"/>
+          </m:rPr>
+          <m:t>T</m:t>
+        </m:r>
+        <m:r>
+          <m:rPr>
+            <m:sty m:val="p"/>
+          </m:rPr>
+          <m:t>B</m:t>
+        </m:r>
+        <m:r>
+          <m:rPr>
+            <m:sty m:val="p"/>
+          </m:rPr>
+          <m:t>F</m:t>
         </m:r>
       </m:oMath>
       <w:r>
-        <w:t xml:space="preserve">:</w:t>
-      </w:r>
-      <w:r>
-        <w:t xml:space="preserve"> </w:t>
-      </w:r>
-      <w:r>
-        <w:t xml:space="preserve">fewer than half survive un-aided, so redundancy is mandatory.</w:t>
+        <w:t xml:space="preserve">, so</w:t>
       </w:r>
     </w:p>
     <w:p>
       <w:pPr>
         <w:pStyle w:val="BodyText"/>
       </w:pPr>
-      <w:r>
-        <w:rPr>
-          <w:b/>
-          <w:bCs/>
-        </w:rPr>
-        <w:t xml:space="preserve">k-of-n redundancy.</w:t>
-      </w:r>
-      <w:r>
-        <w:t xml:space="preserve"> </w:t>
-      </w:r>
-      <w:r>
-        <w:t xml:space="preserve">If a system functions when at least</w:t>
+      <m:oMathPara>
+        <m:oMathParaPr>
+          <m:jc m:val="center"/>
+        </m:oMathParaPr>
+        <m:oMath>
+          <m:r>
+            <m:t>R</m:t>
+          </m:r>
+          <m:r>
+            <m:rPr>
+              <m:sty m:val="p"/>
+            </m:rPr>
+            <m:t>(</m:t>
+          </m:r>
+          <m:r>
+            <m:t>t</m:t>
+          </m:r>
+          <m:r>
+            <m:rPr>
+              <m:sty m:val="p"/>
+            </m:rPr>
+            <m:t>)</m:t>
+          </m:r>
+          <m:r>
+            <m:rPr>
+              <m:sty m:val="p"/>
+            </m:rPr>
+            <m:t>=</m:t>
+          </m:r>
+          <m:sSup>
+            <m:e>
+              <m:r>
+                <m:t>e</m:t>
+              </m:r>
+            </m:e>
+            <m:sup>
+              <m:r>
+                <m:rPr>
+                  <m:sty m:val="p"/>
+                </m:rPr>
+                <m:t>−</m:t>
+              </m:r>
+              <m:r>
+                <m:t>λ</m:t>
+              </m:r>
+              <m:r>
+                <m:t>t</m:t>
+              </m:r>
+            </m:sup>
+          </m:sSup>
+          <m:r>
+            <m:rPr>
+              <m:sty m:val="p"/>
+            </m:rPr>
+            <m:t>=</m:t>
+          </m:r>
+          <m:sSup>
+            <m:e>
+              <m:r>
+                <m:t>e</m:t>
+              </m:r>
+            </m:e>
+            <m:sup>
+              <m:r>
+                <m:rPr>
+                  <m:sty m:val="p"/>
+                </m:rPr>
+                <m:t>−</m:t>
+              </m:r>
+              <m:r>
+                <m:t>t</m:t>
+              </m:r>
+              <m:r>
+                <m:rPr>
+                  <m:sty m:val="p"/>
+                </m:rPr>
+                <m:t>/</m:t>
+              </m:r>
+              <m:r>
+                <m:rPr>
+                  <m:sty m:val="p"/>
+                </m:rPr>
+                <m:t>M</m:t>
+              </m:r>
+              <m:r>
+                <m:rPr>
+                  <m:sty m:val="p"/>
+                </m:rPr>
+                <m:t>T</m:t>
+              </m:r>
+              <m:r>
+                <m:rPr>
+                  <m:sty m:val="p"/>
+                </m:rPr>
+                <m:t>B</m:t>
+              </m:r>
+              <m:r>
+                <m:rPr>
+                  <m:sty m:val="p"/>
+                </m:rPr>
+                <m:t>F</m:t>
+              </m:r>
+            </m:sup>
+          </m:sSup>
+          <m:r>
+            <m:rPr>
+              <m:sty m:val="p"/>
+            </m:rPr>
+            <m:t>.</m:t>
+          </m:r>
+        </m:oMath>
+      </m:oMathPara>
+    </w:p>
+    <w:p>
+      <w:pPr>
+        <w:pStyle w:val="FirstParagraph"/>
+      </w:pPr>
+      <w:r>
+        <w:t xml:space="preserve">This is the memoryless limit: a constant hazard is exactly the condition under which failures form a</w:t>
+      </w:r>
+      <w:r>
+        <w:t xml:space="preserve"> </w:t>
+      </w:r>
+      <w:r>
+        <w:t xml:space="preserve">Poisson process, and the mean of the resulting exponential lifetime distribution is</w:t>
       </w:r>
       <w:r>
         <w:t xml:space="preserve"> </w:t>
       </w:r>
       <m:oMath>
         <m:r>
-          <m:t>k</m:t>
+          <m:t>1</m:t>
+        </m:r>
+        <m:r>
+          <m:rPr>
+            <m:sty m:val="p"/>
+          </m:rPr>
+          <m:t>/</m:t>
+        </m:r>
+        <m:r>
+          <m:t>λ</m:t>
         </m:r>
       </m:oMath>
       <w:r>
-        <w:t xml:space="preserve"> </w:t>
-      </w:r>
-      <w:r>
-        <w:t xml:space="preserve">of</w:t>
+        <w:t xml:space="preserve">, which</w:t>
+      </w:r>
+      <w:r>
+        <w:t xml:space="preserve"> </w:t>
+      </w:r>
+      <w:r>
+        <w:t xml:space="preserve">is why the mean time between failures appears directly in the exponent. A bus with a mean time between</w:t>
+      </w:r>
+      <w:r>
+        <w:t xml:space="preserve"> </w:t>
+      </w:r>
+      <w:r>
+        <w:t xml:space="preserve">failures of 50,000 hours has</w:t>
       </w:r>
       <w:r>
         <w:t xml:space="preserve"> </w:t>
       </w:r>
       <m:oMath>
         <m:r>
-          <m:t>n</m:t>
-        </m:r>
-      </m:oMath>
-      <w:r>
-        <w:t xml:space="preserve"> </w:t>
-      </w:r>
-      <w:r>
-        <w:t xml:space="preserve">identical units survive, each</w:t>
-      </w:r>
-      <w:r>
-        <w:t xml:space="preserve"> </w:t>
-      </w:r>
-      <w:r>
-        <w:t xml:space="preserve">with reliability</w:t>
-      </w:r>
-      <w:r>
-        <w:t xml:space="preserve"> </w:t>
-      </w:r>
-      <m:oMath>
-        <m:r>
-          <m:t>p</m:t>
-        </m:r>
-      </m:oMath>
-      <w:r>
-        <w:t xml:space="preserve">, then</w:t>
-      </w:r>
-      <w:r>
-        <w:t xml:space="preserve"> </w:t>
-      </w:r>
-      <m:oMath>
-        <m:sSub>
-          <m:e>
-            <m:r>
-              <m:t>R</m:t>
-            </m:r>
-          </m:e>
-          <m:sub>
-            <m:r>
-              <m:rPr>
-                <m:sty m:val="p"/>
-              </m:rPr>
-              <m:t>s</m:t>
-            </m:r>
-            <m:r>
-              <m:rPr>
-                <m:sty m:val="p"/>
-              </m:rPr>
-              <m:t>y</m:t>
-            </m:r>
-            <m:r>
-              <m:rPr>
-                <m:sty m:val="p"/>
-              </m:rPr>
-              <m:t>s</m:t>
-            </m:r>
-          </m:sub>
-        </m:sSub>
+          <m:t>R</m:t>
+        </m:r>
+        <m:r>
+          <m:rPr>
+            <m:sty m:val="p"/>
+          </m:rPr>
+          <m:t>(</m:t>
+        </m:r>
+        <m:r>
+          <m:t>5</m:t>
+        </m:r>
+        <m:r>
+          <m:t> </m:t>
+        </m:r>
+        <m:r>
+          <m:rPr>
+            <m:sty m:val="p"/>
+          </m:rPr>
+          <m:t>y</m:t>
+        </m:r>
+        <m:r>
+          <m:rPr>
+            <m:sty m:val="p"/>
+          </m:rPr>
+          <m:t>r</m:t>
+        </m:r>
+        <m:r>
+          <m:rPr>
+            <m:sty m:val="p"/>
+          </m:rPr>
+          <m:t>)</m:t>
+        </m:r>
         <m:r>
           <m:rPr>
             <m:sty m:val="p"/>
           </m:rPr>
           <m:t>=</m:t>
         </m:r>
-        <m:nary>
-          <m:naryPr>
-            <m:chr m:val="∑"/>
-            <m:limLoc m:val="undOvr"/>
-            <m:subHide m:val="off"/>
-            <m:supHide m:val="off"/>
-          </m:naryPr>
-          <m:sub>
-            <m:r>
-              <m:t>i</m:t>
-            </m:r>
-            <m:r>
-              <m:rPr>
-                <m:sty m:val="p"/>
-              </m:rPr>
-              <m:t>=</m:t>
-            </m:r>
-            <m:r>
-              <m:t>k</m:t>
-            </m:r>
-          </m:sub>
-          <m:sup>
-            <m:r>
-              <m:t>n</m:t>
-            </m:r>
-          </m:sup>
-          <m:e>
-            <m:d>
-              <m:dPr>
-                <m:begChr m:val="("/>
-                <m:sepChr m:val=""/>
-                <m:endChr m:val=")"/>
-                <m:grow/>
-              </m:dPr>
-              <m:e>
-                <m:f>
-                  <m:fPr>
-                    <m:type m:val="noBar"/>
-                  </m:fPr>
-                  <m:num>
-                    <m:r>
-                      <m:t>n</m:t>
-                    </m:r>
-                  </m:num>
-                  <m:den>
-                    <m:r>
-                      <m:t>i</m:t>
-                    </m:r>
-                  </m:den>
-                </m:f>
-              </m:e>
-            </m:d>
-          </m:e>
-        </m:nary>
         <m:sSup>
           <m:e>
             <m:r>
-              <m:t>p</m:t>
+              <m:t>e</m:t>
             </m:r>
           </m:e>
           <m:sup>
-            <m:r>
-              <m:t>i</m:t>
-            </m:r>
-          </m:sup>
-        </m:sSup>
-        <m:r>
-          <m:rPr>
-            <m:sty m:val="p"/>
-          </m:rPr>
-          <m:t>(</m:t>
-        </m:r>
-        <m:r>
-          <m:t>1</m:t>
-        </m:r>
-        <m:r>
-          <m:rPr>
-            <m:sty m:val="p"/>
-          </m:rPr>
-          <m:t>−</m:t>
-        </m:r>
-        <m:r>
-          <m:t>p</m:t>
-        </m:r>
-        <m:sSup>
-          <m:e>
-            <m:r>
-              <m:rPr>
-                <m:sty m:val="p"/>
-              </m:rPr>
-              <m:t>)</m:t>
-            </m:r>
-          </m:e>
-          <m:sup>
-            <m:r>
-              <m:t>n</m:t>
-            </m:r>
             <m:r>
               <m:rPr>
                 <m:sty m:val="p"/>
@@ -20146,19 +20256,84 @@
               <m:t>−</m:t>
             </m:r>
             <m:r>
-              <m:t>i</m:t>
+              <m:t>0.876</m:t>
             </m:r>
           </m:sup>
         </m:sSup>
+        <m:r>
+          <m:rPr>
+            <m:sty m:val="p"/>
+          </m:rPr>
+          <m:t>=</m:t>
+        </m:r>
+        <m:r>
+          <m:t>0.42</m:t>
+        </m:r>
       </m:oMath>
       <w:r>
-        <w:t xml:space="preserve">. This sizes</w:t>
-      </w:r>
-      <w:r>
-        <w:t xml:space="preserve"> </w:t>
-      </w:r>
-      <w:r>
-        <w:t xml:space="preserve">both chip-level redundancy within a satellite and satellite-level over-provisioning within a cluster.</w:t>
+        <w:t xml:space="preserve">, so fewer than half survive</w:t>
+      </w:r>
+      <w:r>
+        <w:t xml:space="preserve"> </w:t>
+      </w:r>
+      <w:r>
+        <w:t xml:space="preserve">un-aided; a higher-grade bus at 150,000 hours reaches</w:t>
+      </w:r>
+      <w:r>
+        <w:t xml:space="preserve"> </w:t>
+      </w:r>
+      <m:oMath>
+        <m:r>
+          <m:t>R</m:t>
+        </m:r>
+        <m:r>
+          <m:rPr>
+            <m:sty m:val="p"/>
+          </m:rPr>
+          <m:t>(</m:t>
+        </m:r>
+        <m:r>
+          <m:t>5</m:t>
+        </m:r>
+        <m:r>
+          <m:t> </m:t>
+        </m:r>
+        <m:r>
+          <m:rPr>
+            <m:sty m:val="p"/>
+          </m:rPr>
+          <m:t>y</m:t>
+        </m:r>
+        <m:r>
+          <m:rPr>
+            <m:sty m:val="p"/>
+          </m:rPr>
+          <m:t>r</m:t>
+        </m:r>
+        <m:r>
+          <m:rPr>
+            <m:sty m:val="p"/>
+          </m:rPr>
+          <m:t>)</m:t>
+        </m:r>
+        <m:r>
+          <m:rPr>
+            <m:sty m:val="p"/>
+          </m:rPr>
+          <m:t>=</m:t>
+        </m:r>
+        <m:r>
+          <m:t>0.75</m:t>
+        </m:r>
+      </m:oMath>
+      <w:r>
+        <w:t xml:space="preserve">. Either way a bare unit</w:t>
+      </w:r>
+      <w:r>
+        <w:t xml:space="preserve"> </w:t>
+      </w:r>
+      <w:r>
+        <w:t xml:space="preserve">is not enough, and redundancy is mandatory.</w:t>
       </w:r>
     </w:p>
     <w:p>
@@ -20170,19 +20345,611 @@
           <w:b/>
           <w:bCs/>
         </w:rPr>
+        <w:t xml:space="preserve">k-of-n redundancy.</w:t>
+      </w:r>
+      <w:r>
+        <w:t xml:space="preserve"> </w:t>
+      </w:r>
+      <w:r>
+        <w:t xml:space="preserve">Consider</w:t>
+      </w:r>
+      <w:r>
+        <w:t xml:space="preserve"> </w:t>
+      </w:r>
+      <m:oMath>
+        <m:r>
+          <m:t>n</m:t>
+        </m:r>
+      </m:oMath>
+      <w:r>
+        <w:t xml:space="preserve"> </w:t>
+      </w:r>
+      <w:r>
+        <w:t xml:space="preserve">identical units that fail independently, each surviving with</w:t>
+      </w:r>
+      <w:r>
+        <w:t xml:space="preserve"> </w:t>
+      </w:r>
+      <w:r>
+        <w:t xml:space="preserve">probability</w:t>
+      </w:r>
+      <w:r>
+        <w:t xml:space="preserve"> </w:t>
+      </w:r>
+      <m:oMath>
+        <m:r>
+          <m:t>p</m:t>
+        </m:r>
+        <m:r>
+          <m:rPr>
+            <m:sty m:val="p"/>
+          </m:rPr>
+          <m:t>=</m:t>
+        </m:r>
+        <m:r>
+          <m:t>R</m:t>
+        </m:r>
+        <m:r>
+          <m:rPr>
+            <m:sty m:val="p"/>
+          </m:rPr>
+          <m:t>(</m:t>
+        </m:r>
+        <m:r>
+          <m:t>t</m:t>
+        </m:r>
+        <m:r>
+          <m:rPr>
+            <m:sty m:val="p"/>
+          </m:rPr>
+          <m:t>)</m:t>
+        </m:r>
+      </m:oMath>
+      <w:r>
+        <w:t xml:space="preserve">. The number that survive is binomial,</w:t>
+      </w:r>
+      <w:r>
+        <w:t xml:space="preserve"> </w:t>
+      </w:r>
+      <m:oMath>
+        <m:r>
+          <m:rPr>
+            <m:sty m:val="p"/>
+          </m:rPr>
+          <m:t>Pr</m:t>
+        </m:r>
+        <m:r>
+          <m:rPr>
+            <m:sty m:val="p"/>
+          </m:rPr>
+          <m:t>[</m:t>
+        </m:r>
+        <m:r>
+          <m:t>X</m:t>
+        </m:r>
+        <m:r>
+          <m:rPr>
+            <m:sty m:val="p"/>
+          </m:rPr>
+          <m:t>=</m:t>
+        </m:r>
+        <m:r>
+          <m:t>i</m:t>
+        </m:r>
+        <m:r>
+          <m:rPr>
+            <m:sty m:val="p"/>
+          </m:rPr>
+          <m:t>]</m:t>
+        </m:r>
+        <m:r>
+          <m:rPr>
+            <m:sty m:val="p"/>
+          </m:rPr>
+          <m:t>=</m:t>
+        </m:r>
+        <m:d>
+          <m:dPr>
+            <m:begChr m:val="("/>
+            <m:sepChr m:val=""/>
+            <m:endChr m:val=")"/>
+            <m:grow/>
+          </m:dPr>
+          <m:e>
+            <m:f>
+              <m:fPr>
+                <m:type m:val="noBar"/>
+              </m:fPr>
+              <m:num>
+                <m:r>
+                  <m:t>n</m:t>
+                </m:r>
+              </m:num>
+              <m:den>
+                <m:r>
+                  <m:t>i</m:t>
+                </m:r>
+              </m:den>
+            </m:f>
+          </m:e>
+        </m:d>
+        <m:sSup>
+          <m:e>
+            <m:r>
+              <m:t>p</m:t>
+            </m:r>
+          </m:e>
+          <m:sup>
+            <m:r>
+              <m:t>i</m:t>
+            </m:r>
+          </m:sup>
+        </m:sSup>
+        <m:r>
+          <m:rPr>
+            <m:sty m:val="p"/>
+          </m:rPr>
+          <m:t>(</m:t>
+        </m:r>
+        <m:r>
+          <m:t>1</m:t>
+        </m:r>
+        <m:r>
+          <m:rPr>
+            <m:sty m:val="p"/>
+          </m:rPr>
+          <m:t>−</m:t>
+        </m:r>
+        <m:r>
+          <m:t>p</m:t>
+        </m:r>
+        <m:sSup>
+          <m:e>
+            <m:r>
+              <m:rPr>
+                <m:sty m:val="p"/>
+              </m:rPr>
+              <m:t>)</m:t>
+            </m:r>
+          </m:e>
+          <m:sup>
+            <m:r>
+              <m:t>n</m:t>
+            </m:r>
+            <m:r>
+              <m:rPr>
+                <m:sty m:val="p"/>
+              </m:rPr>
+              <m:t>−</m:t>
+            </m:r>
+            <m:r>
+              <m:t>i</m:t>
+            </m:r>
+          </m:sup>
+        </m:sSup>
+      </m:oMath>
+      <w:r>
+        <w:t xml:space="preserve">.</w:t>
+      </w:r>
+      <w:r>
+        <w:t xml:space="preserve"> </w:t>
+      </w:r>
+      <w:r>
+        <w:t xml:space="preserve">A system that functions when at least</w:t>
+      </w:r>
+      <w:r>
+        <w:t xml:space="preserve"> </w:t>
+      </w:r>
+      <m:oMath>
+        <m:r>
+          <m:t>k</m:t>
+        </m:r>
+      </m:oMath>
+      <w:r>
+        <w:t xml:space="preserve"> </w:t>
+      </w:r>
+      <w:r>
+        <w:t xml:space="preserve">of the</w:t>
+      </w:r>
+      <w:r>
+        <w:t xml:space="preserve"> </w:t>
+      </w:r>
+      <m:oMath>
+        <m:r>
+          <m:t>n</m:t>
+        </m:r>
+      </m:oMath>
+      <w:r>
+        <w:t xml:space="preserve"> </w:t>
+      </w:r>
+      <w:r>
+        <w:t xml:space="preserve">survive therefore has reliability</w:t>
+      </w:r>
+    </w:p>
+    <w:p>
+      <w:pPr>
+        <w:pStyle w:val="BodyText"/>
+      </w:pPr>
+      <m:oMathPara>
+        <m:oMathParaPr>
+          <m:jc m:val="center"/>
+        </m:oMathParaPr>
+        <m:oMath>
+          <m:sSub>
+            <m:e>
+              <m:r>
+                <m:t>R</m:t>
+              </m:r>
+            </m:e>
+            <m:sub>
+              <m:r>
+                <m:rPr>
+                  <m:sty m:val="p"/>
+                </m:rPr>
+                <m:t>s</m:t>
+              </m:r>
+              <m:r>
+                <m:rPr>
+                  <m:sty m:val="p"/>
+                </m:rPr>
+                <m:t>y</m:t>
+              </m:r>
+              <m:r>
+                <m:rPr>
+                  <m:sty m:val="p"/>
+                </m:rPr>
+                <m:t>s</m:t>
+              </m:r>
+            </m:sub>
+          </m:sSub>
+          <m:r>
+            <m:rPr>
+              <m:sty m:val="p"/>
+            </m:rPr>
+            <m:t>=</m:t>
+          </m:r>
+          <m:r>
+            <m:rPr>
+              <m:sty m:val="p"/>
+            </m:rPr>
+            <m:t>Pr</m:t>
+          </m:r>
+          <m:r>
+            <m:rPr>
+              <m:sty m:val="p"/>
+            </m:rPr>
+            <m:t>[</m:t>
+          </m:r>
+          <m:r>
+            <m:t>X</m:t>
+          </m:r>
+          <m:r>
+            <m:rPr>
+              <m:sty m:val="p"/>
+            </m:rPr>
+            <m:t>≥</m:t>
+          </m:r>
+          <m:r>
+            <m:t>k</m:t>
+          </m:r>
+          <m:r>
+            <m:rPr>
+              <m:sty m:val="p"/>
+            </m:rPr>
+            <m:t>]</m:t>
+          </m:r>
+          <m:r>
+            <m:rPr>
+              <m:sty m:val="p"/>
+            </m:rPr>
+            <m:t>=</m:t>
+          </m:r>
+          <m:nary>
+            <m:naryPr>
+              <m:chr m:val="∑"/>
+              <m:limLoc m:val="undOvr"/>
+              <m:subHide m:val="off"/>
+              <m:supHide m:val="off"/>
+            </m:naryPr>
+            <m:sub>
+              <m:r>
+                <m:t>i</m:t>
+              </m:r>
+              <m:r>
+                <m:rPr>
+                  <m:sty m:val="p"/>
+                </m:rPr>
+                <m:t>=</m:t>
+              </m:r>
+              <m:r>
+                <m:t>k</m:t>
+              </m:r>
+            </m:sub>
+            <m:sup>
+              <m:r>
+                <m:t>n</m:t>
+              </m:r>
+            </m:sup>
+            <m:e>
+              <m:d>
+                <m:dPr>
+                  <m:begChr m:val="("/>
+                  <m:sepChr m:val=""/>
+                  <m:endChr m:val=")"/>
+                  <m:grow/>
+                </m:dPr>
+                <m:e>
+                  <m:f>
+                    <m:fPr>
+                      <m:type m:val="noBar"/>
+                    </m:fPr>
+                    <m:num>
+                      <m:r>
+                        <m:t>n</m:t>
+                      </m:r>
+                    </m:num>
+                    <m:den>
+                      <m:r>
+                        <m:t>i</m:t>
+                      </m:r>
+                    </m:den>
+                  </m:f>
+                </m:e>
+              </m:d>
+            </m:e>
+          </m:nary>
+          <m:r>
+            <m:t> </m:t>
+          </m:r>
+          <m:sSup>
+            <m:e>
+              <m:r>
+                <m:t>p</m:t>
+              </m:r>
+            </m:e>
+            <m:sup>
+              <m:r>
+                <m:t>i</m:t>
+              </m:r>
+            </m:sup>
+          </m:sSup>
+          <m:r>
+            <m:rPr>
+              <m:sty m:val="p"/>
+            </m:rPr>
+            <m:t>(</m:t>
+          </m:r>
+          <m:r>
+            <m:t>1</m:t>
+          </m:r>
+          <m:r>
+            <m:rPr>
+              <m:sty m:val="p"/>
+            </m:rPr>
+            <m:t>−</m:t>
+          </m:r>
+          <m:r>
+            <m:t>p</m:t>
+          </m:r>
+          <m:sSup>
+            <m:e>
+              <m:r>
+                <m:rPr>
+                  <m:sty m:val="p"/>
+                </m:rPr>
+                <m:t>)</m:t>
+              </m:r>
+            </m:e>
+            <m:sup>
+              <m:r>
+                <m:t>n</m:t>
+              </m:r>
+              <m:r>
+                <m:rPr>
+                  <m:sty m:val="p"/>
+                </m:rPr>
+                <m:t>−</m:t>
+              </m:r>
+              <m:r>
+                <m:t>i</m:t>
+              </m:r>
+            </m:sup>
+          </m:sSup>
+          <m:r>
+            <m:rPr>
+              <m:sty m:val="p"/>
+            </m:rPr>
+            <m:t>.</m:t>
+          </m:r>
+        </m:oMath>
+      </m:oMathPara>
+    </w:p>
+    <w:p>
+      <w:pPr>
+        <w:pStyle w:val="FirstParagraph"/>
+      </w:pPr>
+      <w:r>
+        <w:t xml:space="preserve">The same expression sizes chip-level redundancy within a satellite and satellite-level</w:t>
+      </w:r>
+      <w:r>
+        <w:t xml:space="preserve"> </w:t>
+      </w:r>
+      <w:r>
+        <w:t xml:space="preserve">over-provisioning within a cluster. Its power is in the steep climb of the tail sum: with</w:t>
+      </w:r>
+      <w:r>
+        <w:t xml:space="preserve"> </w:t>
+      </w:r>
+      <m:oMath>
+        <m:r>
+          <m:t>n</m:t>
+        </m:r>
+        <m:r>
+          <m:rPr>
+            <m:sty m:val="p"/>
+          </m:rPr>
+          <m:t>=</m:t>
+        </m:r>
+        <m:r>
+          <m:t>81</m:t>
+        </m:r>
+      </m:oMath>
+      <w:r>
+        <w:t xml:space="preserve"> </w:t>
+      </w:r>
+      <w:r>
+        <w:t xml:space="preserve">nodes required to deliver</w:t>
+      </w:r>
+      <w:r>
+        <w:t xml:space="preserve"> </w:t>
+      </w:r>
+      <m:oMath>
+        <m:r>
+          <m:t>k</m:t>
+        </m:r>
+        <m:r>
+          <m:rPr>
+            <m:sty m:val="p"/>
+          </m:rPr>
+          <m:t>=</m:t>
+        </m:r>
+        <m:r>
+          <m:t>70</m:t>
+        </m:r>
+      </m:oMath>
+      <w:r>
+        <w:t xml:space="preserve">, a per-node reliability of</w:t>
+      </w:r>
+      <w:r>
+        <w:t xml:space="preserve"> </w:t>
+      </w:r>
+      <m:oMath>
+        <m:r>
+          <m:t>p</m:t>
+        </m:r>
+        <m:r>
+          <m:rPr>
+            <m:sty m:val="p"/>
+          </m:rPr>
+          <m:t>=</m:t>
+        </m:r>
+        <m:r>
+          <m:t>0.90</m:t>
+        </m:r>
+      </m:oMath>
+      <w:r>
+        <w:t xml:space="preserve"> </w:t>
+      </w:r>
+      <w:r>
+        <w:t xml:space="preserve">yields</w:t>
+      </w:r>
+      <w:r>
+        <w:t xml:space="preserve"> </w:t>
+      </w:r>
+      <m:oMath>
+        <m:sSub>
+          <m:e>
+            <m:r>
+              <m:t>R</m:t>
+            </m:r>
+          </m:e>
+          <m:sub>
+            <m:r>
+              <m:rPr>
+                <m:sty m:val="p"/>
+              </m:rPr>
+              <m:t>s</m:t>
+            </m:r>
+            <m:r>
+              <m:rPr>
+                <m:sty m:val="p"/>
+              </m:rPr>
+              <m:t>y</m:t>
+            </m:r>
+            <m:r>
+              <m:rPr>
+                <m:sty m:val="p"/>
+              </m:rPr>
+              <m:t>s</m:t>
+            </m:r>
+          </m:sub>
+        </m:sSub>
+        <m:r>
+          <m:rPr>
+            <m:sty m:val="p"/>
+          </m:rPr>
+          <m:t>=</m:t>
+        </m:r>
+        <m:r>
+          <m:t>0.89</m:t>
+        </m:r>
+      </m:oMath>
+      <w:r>
+        <w:t xml:space="preserve">, but raising the per-node figure to</w:t>
+      </w:r>
+      <w:r>
+        <w:t xml:space="preserve"> </w:t>
+      </w:r>
+      <m:oMath>
+        <m:r>
+          <m:t>p</m:t>
+        </m:r>
+        <m:r>
+          <m:rPr>
+            <m:sty m:val="p"/>
+          </m:rPr>
+          <m:t>=</m:t>
+        </m:r>
+        <m:r>
+          <m:t>0.95</m:t>
+        </m:r>
+      </m:oMath>
+      <w:r>
+        <w:t xml:space="preserve"> </w:t>
+      </w:r>
+      <w:r>
+        <w:t xml:space="preserve">pushes it to</w:t>
+      </w:r>
+      <w:r>
+        <w:t xml:space="preserve"> </w:t>
+      </w:r>
+      <m:oMath>
+        <m:r>
+          <m:t>0.999</m:t>
+        </m:r>
+      </m:oMath>
+      <w:r>
+        <w:t xml:space="preserve">. Small</w:t>
+      </w:r>
+      <w:r>
+        <w:t xml:space="preserve"> </w:t>
+      </w:r>
+      <w:r>
+        <w:t xml:space="preserve">gains in unit reliability buy large gains in system reliability once the redundancy margin is set.</w:t>
+      </w:r>
+    </w:p>
+    <w:p>
+      <w:pPr>
+        <w:pStyle w:val="BodyText"/>
+      </w:pPr>
+      <w:r>
+        <w:rPr>
+          <w:b/>
+          <w:bCs/>
+        </w:rPr>
         <w:t xml:space="preserve">Constellation availability and replenishment.</w:t>
       </w:r>
       <w:r>
         <w:t xml:space="preserve"> </w:t>
       </w:r>
       <w:r>
-        <w:t xml:space="preserve">The expected fraction of required capacity</w:t>
-      </w:r>
-      <w:r>
-        <w:t xml:space="preserve"> </w:t>
-      </w:r>
-      <w:r>
-        <w:t xml:space="preserve">available, absent replenishment, is</w:t>
+        <w:t xml:space="preserve">The expected fraction of required capacity available,</w:t>
+      </w:r>
+      <w:r>
+        <w:t xml:space="preserve"> </w:t>
+      </w:r>
+      <w:r>
+        <w:t xml:space="preserve">absent replenishment, is</w:t>
       </w:r>
       <w:r>
         <w:t xml:space="preserve"> </w:t>
@@ -20346,25 +21113,209 @@
         </m:r>
       </m:oMath>
       <w:r>
-        <w:t xml:space="preserve">.</w:t>
-      </w:r>
-      <w:r>
-        <w:t xml:space="preserve"> </w:t>
-      </w:r>
-      <w:r>
-        <w:t xml:space="preserve">Operational constellations sustain capacity by continuous replenishment at a rate near the inverse</w:t>
-      </w:r>
-      <w:r>
-        <w:t xml:space="preserve"> </w:t>
-      </w:r>
-      <w:r>
-        <w:t xml:space="preserve">of the design life, about twenty percent per year for a five-year life. The associated replenishment</w:t>
-      </w:r>
-      <w:r>
-        <w:t xml:space="preserve"> </w:t>
-      </w:r>
-      <w:r>
-        <w:t xml:space="preserve">cost is a major and recurring operating expense, carried explicitly in the economics of Chapter 21.</w:t>
+        <w:t xml:space="preserve">. For 81 deployed,</w:t>
+      </w:r>
+      <w:r>
+        <w:t xml:space="preserve"> </w:t>
+      </w:r>
+      <w:r>
+        <w:t xml:space="preserve">75 required, and</w:t>
+      </w:r>
+      <w:r>
+        <w:t xml:space="preserve"> </w:t>
+      </w:r>
+      <m:oMath>
+        <m:r>
+          <m:t>p</m:t>
+        </m:r>
+        <m:r>
+          <m:rPr>
+            <m:sty m:val="p"/>
+          </m:rPr>
+          <m:t>=</m:t>
+        </m:r>
+        <m:r>
+          <m:t>0.90</m:t>
+        </m:r>
+      </m:oMath>
+      <w:r>
+        <w:t xml:space="preserve">, this is</w:t>
+      </w:r>
+      <w:r>
+        <w:t xml:space="preserve"> </w:t>
+      </w:r>
+      <m:oMath>
+        <m:r>
+          <m:t>0.97</m:t>
+        </m:r>
+      </m:oMath>
+      <w:r>
+        <w:t xml:space="preserve">, so a six-unit margin holds capacity near full even before</w:t>
+      </w:r>
+      <w:r>
+        <w:t xml:space="preserve"> </w:t>
+      </w:r>
+      <w:r>
+        <w:t xml:space="preserve">any resupply. To sustain that level over the mission, units must be replaced as they fail. Modeling the</w:t>
+      </w:r>
+      <w:r>
+        <w:t xml:space="preserve"> </w:t>
+      </w:r>
+      <w:r>
+        <w:t xml:space="preserve">fleet as a renewal process, each unit that fails is replaced after a lead time, and in steady state the</w:t>
+      </w:r>
+      <w:r>
+        <w:t xml:space="preserve"> </w:t>
+      </w:r>
+      <w:r>
+        <w:t xml:space="preserve">replenishment rate equals the failure rate. For a design life</w:t>
+      </w:r>
+      <w:r>
+        <w:t xml:space="preserve"> </w:t>
+      </w:r>
+      <m:oMath>
+        <m:r>
+          <m:t>L</m:t>
+        </m:r>
+      </m:oMath>
+      <w:r>
+        <w:t xml:space="preserve"> </w:t>
+      </w:r>
+      <w:r>
+        <w:t xml:space="preserve">the long-run annual replacement rate</w:t>
+      </w:r>
+      <w:r>
+        <w:t xml:space="preserve"> </w:t>
+      </w:r>
+      <w:r>
+        <w:t xml:space="preserve">is approximately</w:t>
+      </w:r>
+      <w:r>
+        <w:t xml:space="preserve"> </w:t>
+      </w:r>
+      <m:oMath>
+        <m:r>
+          <m:t>1</m:t>
+        </m:r>
+        <m:r>
+          <m:rPr>
+            <m:sty m:val="p"/>
+          </m:rPr>
+          <m:t>/</m:t>
+        </m:r>
+        <m:r>
+          <m:t>L</m:t>
+        </m:r>
+      </m:oMath>
+      <w:r>
+        <w:t xml:space="preserve">, about twenty percent per year for a five-year life, and holding a fixed</w:t>
+      </w:r>
+      <w:r>
+        <w:t xml:space="preserve"> </w:t>
+      </w:r>
+      <w:r>
+        <w:t xml:space="preserve">availability target against a given per-unit reliability sets the deployed count: reaching ninety-five</w:t>
+      </w:r>
+      <w:r>
+        <w:t xml:space="preserve"> </w:t>
+      </w:r>
+      <w:r>
+        <w:t xml:space="preserve">percent availability of 75 required nodes at</w:t>
+      </w:r>
+      <w:r>
+        <w:t xml:space="preserve"> </w:t>
+      </w:r>
+      <m:oMath>
+        <m:r>
+          <m:t>p</m:t>
+        </m:r>
+        <m:r>
+          <m:rPr>
+            <m:sty m:val="p"/>
+          </m:rPr>
+          <m:t>=</m:t>
+        </m:r>
+        <m:r>
+          <m:t>0.90</m:t>
+        </m:r>
+      </m:oMath>
+      <w:r>
+        <w:t xml:space="preserve"> </w:t>
+      </w:r>
+      <w:r>
+        <w:t xml:space="preserve">calls for on the order of 89 deployed. The</w:t>
+      </w:r>
+      <w:r>
+        <w:t xml:space="preserve"> </w:t>
+      </w:r>
+      <w:r>
+        <w:t xml:space="preserve">associated replenishment is a major and recurring operating expense, carried explicitly in the</w:t>
+      </w:r>
+      <w:r>
+        <w:t xml:space="preserve"> </w:t>
+      </w:r>
+      <w:r>
+        <w:t xml:space="preserve">economics of Chapter 21. These figures are produced by</w:t>
+      </w:r>
+      <w:r>
+        <w:t xml:space="preserve"> </w:t>
+      </w:r>
+      <w:r>
+        <w:rPr>
+          <w:rStyle w:val="VerbatimChar"/>
+        </w:rPr>
+        <w:t xml:space="preserve">orbital_dc.reliability</w:t>
+      </w:r>
+      <w:r>
+        <w:t xml:space="preserve"> </w:t>
+      </w:r>
+      <w:r>
+        <w:t xml:space="preserve">(</w:t>
+      </w:r>
+      <w:r>
+        <w:rPr>
+          <w:rStyle w:val="VerbatimChar"/>
+        </w:rPr>
+        <w:t xml:space="preserve">k_of_n</w:t>
+      </w:r>
+      <w:r>
+        <w:t xml:space="preserve">,</w:t>
+      </w:r>
+      <w:r>
+        <w:t xml:space="preserve"> </w:t>
+      </w:r>
+      <w:r>
+        <w:rPr>
+          <w:rStyle w:val="VerbatimChar"/>
+        </w:rPr>
+        <w:t xml:space="preserve">expected_capacity_fraction</w:t>
+      </w:r>
+      <w:r>
+        <w:t xml:space="preserve">,</w:t>
+      </w:r>
+      <w:r>
+        <w:t xml:space="preserve"> </w:t>
+      </w:r>
+      <w:r>
+        <w:rPr>
+          <w:rStyle w:val="VerbatimChar"/>
+        </w:rPr>
+        <w:t xml:space="preserve">spares_for_availability</w:t>
+      </w:r>
+      <w:r>
+        <w:t xml:space="preserve">,</w:t>
+      </w:r>
+      <w:r>
+        <w:t xml:space="preserve"> </w:t>
+      </w:r>
+      <w:r>
+        <w:rPr>
+          <w:rStyle w:val="VerbatimChar"/>
+        </w:rPr>
+        <w:t xml:space="preserve">annual_replacement_rate</w:t>
+      </w:r>
+      <w:r>
+        <w:t xml:space="preserve">).</w:t>
       </w:r>
     </w:p>
     <w:p>
@@ -22502,37 +23453,19 @@
         <w:pStyle w:val="FirstParagraph"/>
       </w:pPr>
       <w:r>
-        <w:t xml:space="preserve">A point design is not credible without an uncertainty band. The model propagates the dominant input</w:t>
-      </w:r>
-      <w:r>
-        <w:t xml:space="preserve"> </w:t>
-      </w:r>
-      <w:r>
-        <w:t xml:space="preserve">uncertainties by Monte-Carlo: the solar-activity scenario (which moves atmospheric density by up to</w:t>
-      </w:r>
-      <w:r>
-        <w:t xml:space="preserve"> </w:t>
-      </w:r>
-      <w:r>
-        <w:t xml:space="preserve">a factor of one hundred), the debris-flux band, the model-FLOPs utilization, and the undisclosed</w:t>
-      </w:r>
-      <w:r>
-        <w:t xml:space="preserve"> </w:t>
-      </w:r>
-      <w:r>
-        <w:t xml:space="preserve">chip power. The resulting distributions of natural lifetime, catastrophic-impact probability, total</w:t>
-      </w:r>
-      <w:r>
-        <w:t xml:space="preserve"> </w:t>
-      </w:r>
-      <w:r>
-        <w:t xml:space="preserve">Δv, and delivered compute are reported as fifth, fiftieth, and ninety-fifth percentiles rather than</w:t>
-      </w:r>
-      <w:r>
-        <w:t xml:space="preserve"> </w:t>
-      </w:r>
-      <w:r>
-        <w:t xml:space="preserve">as single numbers (Fig. 19.1).</w:t>
+        <w:t xml:space="preserve">A point design is not credible without an uncertainty band. Two complementary tools are used: linear</w:t>
+      </w:r>
+      <w:r>
+        <w:t xml:space="preserve"> </w:t>
+      </w:r>
+      <w:r>
+        <w:t xml:space="preserve">error propagation for a quick analytic estimate, and Monte-Carlo for the full distribution when the</w:t>
+      </w:r>
+      <w:r>
+        <w:t xml:space="preserve"> </w:t>
+      </w:r>
+      <w:r>
+        <w:t xml:space="preserve">inputs span orders of magnitude.</w:t>
       </w:r>
     </w:p>
     <w:p>
@@ -22540,7 +23473,496 @@
         <w:pStyle w:val="BodyText"/>
       </w:pPr>
       <w:r>
-        <w:t xml:space="preserve">Two sensitivities stand out. First, the natural lifetime is wildly sensitive to the solar cycle:</w:t>
+        <w:rPr>
+          <w:b/>
+          <w:bCs/>
+        </w:rPr>
+        <w:t xml:space="preserve">Linear error propagation.</w:t>
+      </w:r>
+      <w:r>
+        <w:t xml:space="preserve"> </w:t>
+      </w:r>
+      <w:r>
+        <w:t xml:space="preserve">For an output</w:t>
+      </w:r>
+      <w:r>
+        <w:t xml:space="preserve"> </w:t>
+      </w:r>
+      <m:oMath>
+        <m:r>
+          <m:t>y</m:t>
+        </m:r>
+        <m:r>
+          <m:rPr>
+            <m:sty m:val="p"/>
+          </m:rPr>
+          <m:t>=</m:t>
+        </m:r>
+        <m:r>
+          <m:t>f</m:t>
+        </m:r>
+        <m:r>
+          <m:rPr>
+            <m:sty m:val="p"/>
+          </m:rPr>
+          <m:t>(</m:t>
+        </m:r>
+        <m:sSub>
+          <m:e>
+            <m:r>
+              <m:t>x</m:t>
+            </m:r>
+          </m:e>
+          <m:sub>
+            <m:r>
+              <m:t>1</m:t>
+            </m:r>
+          </m:sub>
+        </m:sSub>
+        <m:r>
+          <m:rPr>
+            <m:sty m:val="p"/>
+          </m:rPr>
+          <m:t>,</m:t>
+        </m:r>
+        <m:r>
+          <m:rPr>
+            <m:sty m:val="p"/>
+          </m:rPr>
+          <m:t>…</m:t>
+        </m:r>
+        <m:r>
+          <m:rPr>
+            <m:sty m:val="p"/>
+          </m:rPr>
+          <m:t>,</m:t>
+        </m:r>
+        <m:sSub>
+          <m:e>
+            <m:r>
+              <m:t>x</m:t>
+            </m:r>
+          </m:e>
+          <m:sub>
+            <m:r>
+              <m:t>m</m:t>
+            </m:r>
+          </m:sub>
+        </m:sSub>
+        <m:r>
+          <m:rPr>
+            <m:sty m:val="p"/>
+          </m:rPr>
+          <m:t>)</m:t>
+        </m:r>
+      </m:oMath>
+      <w:r>
+        <w:t xml:space="preserve"> </w:t>
+      </w:r>
+      <w:r>
+        <w:t xml:space="preserve">with independent inputs of standard</w:t>
+      </w:r>
+      <w:r>
+        <w:t xml:space="preserve"> </w:t>
+      </w:r>
+      <w:r>
+        <w:t xml:space="preserve">deviation</w:t>
+      </w:r>
+      <w:r>
+        <w:t xml:space="preserve"> </w:t>
+      </w:r>
+      <m:oMath>
+        <m:sSub>
+          <m:e>
+            <m:r>
+              <m:t>σ</m:t>
+            </m:r>
+          </m:e>
+          <m:sub>
+            <m:sSub>
+              <m:e>
+                <m:r>
+                  <m:t>x</m:t>
+                </m:r>
+              </m:e>
+              <m:sub>
+                <m:r>
+                  <m:t>j</m:t>
+                </m:r>
+              </m:sub>
+            </m:sSub>
+          </m:sub>
+        </m:sSub>
+      </m:oMath>
+      <w:r>
+        <w:t xml:space="preserve">, a first-order Taylor expansion about the mean gives</w:t>
+      </w:r>
+    </w:p>
+    <w:p>
+      <w:pPr>
+        <w:pStyle w:val="BodyText"/>
+      </w:pPr>
+      <m:oMathPara>
+        <m:oMathParaPr>
+          <m:jc m:val="center"/>
+        </m:oMathParaPr>
+        <m:oMath>
+          <m:sSubSup>
+            <m:e>
+              <m:r>
+                <m:t>σ</m:t>
+              </m:r>
+            </m:e>
+            <m:sub>
+              <m:r>
+                <m:t>y</m:t>
+              </m:r>
+            </m:sub>
+            <m:sup>
+              <m:r>
+                <m:t>2</m:t>
+              </m:r>
+            </m:sup>
+          </m:sSubSup>
+          <m:r>
+            <m:rPr>
+              <m:sty m:val="p"/>
+            </m:rPr>
+            <m:t>≈</m:t>
+          </m:r>
+          <m:nary>
+            <m:naryPr>
+              <m:chr m:val="∑"/>
+              <m:limLoc m:val="undOvr"/>
+              <m:subHide m:val="off"/>
+              <m:supHide m:val="off"/>
+            </m:naryPr>
+            <m:sub>
+              <m:r>
+                <m:t>j</m:t>
+              </m:r>
+              <m:r>
+                <m:rPr>
+                  <m:sty m:val="p"/>
+                </m:rPr>
+                <m:t>=</m:t>
+              </m:r>
+              <m:r>
+                <m:t>1</m:t>
+              </m:r>
+            </m:sub>
+            <m:sup>
+              <m:r>
+                <m:t>m</m:t>
+              </m:r>
+            </m:sup>
+            <m:e>
+              <m:sSup>
+                <m:e>
+                  <m:d>
+                    <m:dPr>
+                      <m:begChr m:val="("/>
+                      <m:sepChr m:val=""/>
+                      <m:endChr m:val=")"/>
+                      <m:grow/>
+                    </m:dPr>
+                    <m:e>
+                      <m:f>
+                        <m:fPr>
+                          <m:type m:val="bar"/>
+                        </m:fPr>
+                        <m:num>
+                          <m:r>
+                            <m:rPr>
+                              <m:sty m:val="p"/>
+                            </m:rPr>
+                            <m:t>∂</m:t>
+                          </m:r>
+                          <m:r>
+                            <m:t>f</m:t>
+                          </m:r>
+                        </m:num>
+                        <m:den>
+                          <m:r>
+                            <m:rPr>
+                              <m:sty m:val="p"/>
+                            </m:rPr>
+                            <m:t>∂</m:t>
+                          </m:r>
+                          <m:sSub>
+                            <m:e>
+                              <m:r>
+                                <m:t>x</m:t>
+                              </m:r>
+                            </m:e>
+                            <m:sub>
+                              <m:r>
+                                <m:t>j</m:t>
+                              </m:r>
+                            </m:sub>
+                          </m:sSub>
+                        </m:den>
+                      </m:f>
+                    </m:e>
+                  </m:d>
+                </m:e>
+                <m:sup>
+                  <m:r>
+                    <m:t>2</m:t>
+                  </m:r>
+                </m:sup>
+              </m:sSup>
+            </m:e>
+          </m:nary>
+          <m:sSubSup>
+            <m:e>
+              <m:r>
+                <m:t>σ</m:t>
+              </m:r>
+            </m:e>
+            <m:sub>
+              <m:sSub>
+                <m:e>
+                  <m:r>
+                    <m:t>x</m:t>
+                  </m:r>
+                </m:e>
+                <m:sub>
+                  <m:r>
+                    <m:t>j</m:t>
+                  </m:r>
+                </m:sub>
+              </m:sSub>
+            </m:sub>
+            <m:sup>
+              <m:r>
+                <m:t>2</m:t>
+              </m:r>
+            </m:sup>
+          </m:sSubSup>
+          <m:r>
+            <m:rPr>
+              <m:sty m:val="p"/>
+            </m:rPr>
+            <m:t>.</m:t>
+          </m:r>
+        </m:oMath>
+      </m:oMathPara>
+    </w:p>
+    <w:p>
+      <w:pPr>
+        <w:pStyle w:val="FirstParagraph"/>
+      </w:pPr>
+      <w:r>
+        <w:t xml:space="preserve">This is exact for linear</w:t>
+      </w:r>
+      <w:r>
+        <w:t xml:space="preserve"> </w:t>
+      </w:r>
+      <m:oMath>
+        <m:r>
+          <m:t>f</m:t>
+        </m:r>
+      </m:oMath>
+      <w:r>
+        <w:t xml:space="preserve"> </w:t>
+      </w:r>
+      <w:r>
+        <w:t xml:space="preserve">and a good guide when the inputs vary by a few percent. It fails precisely</w:t>
+      </w:r>
+      <w:r>
+        <w:t xml:space="preserve"> </w:t>
+      </w:r>
+      <w:r>
+        <w:t xml:space="preserve">where the dominant uncertainty here lives, in atmospheric density, which is lognormal and varies by up</w:t>
+      </w:r>
+      <w:r>
+        <w:t xml:space="preserve"> </w:t>
+      </w:r>
+      <w:r>
+        <w:t xml:space="preserve">to two orders of magnitude across the solar cycle, so the partial-derivative picture is supplemented by</w:t>
+      </w:r>
+      <w:r>
+        <w:t xml:space="preserve"> </w:t>
+      </w:r>
+      <w:r>
+        <w:t xml:space="preserve">sampling.</w:t>
+      </w:r>
+    </w:p>
+    <w:p>
+      <w:pPr>
+        <w:pStyle w:val="BodyText"/>
+      </w:pPr>
+      <w:r>
+        <w:rPr>
+          <w:b/>
+          <w:bCs/>
+        </w:rPr>
+        <w:t xml:space="preserve">Monte-Carlo propagation.</w:t>
+      </w:r>
+      <w:r>
+        <w:t xml:space="preserve"> </w:t>
+      </w:r>
+      <w:r>
+        <w:t xml:space="preserve">The model draws</w:t>
+      </w:r>
+      <w:r>
+        <w:t xml:space="preserve"> </w:t>
+      </w:r>
+      <m:oMath>
+        <m:r>
+          <m:t>N</m:t>
+        </m:r>
+      </m:oMath>
+      <w:r>
+        <w:t xml:space="preserve"> </w:t>
+      </w:r>
+      <w:r>
+        <w:t xml:space="preserve">samples of the uncertain inputs from their assumed</w:t>
+      </w:r>
+      <w:r>
+        <w:t xml:space="preserve"> </w:t>
+      </w:r>
+      <w:r>
+        <w:t xml:space="preserve">distributions, evaluates the full model for each, and forms the empirical distribution of every output.</w:t>
+      </w:r>
+      <w:r>
+        <w:t xml:space="preserve"> </w:t>
+      </w:r>
+      <w:r>
+        <w:t xml:space="preserve">The dominant inputs sampled are the solar-activity scenario (which moves atmospheric density by up to a</w:t>
+      </w:r>
+      <w:r>
+        <w:t xml:space="preserve"> </w:t>
+      </w:r>
+      <w:r>
+        <w:t xml:space="preserve">factor of one hundred), the debris-flux band, the model-FLOPs utilization, and the undisclosed chip</w:t>
+      </w:r>
+      <w:r>
+        <w:t xml:space="preserve"> </w:t>
+      </w:r>
+      <w:r>
+        <w:t xml:space="preserve">power. The estimator converges as</w:t>
+      </w:r>
+      <w:r>
+        <w:t xml:space="preserve"> </w:t>
+      </w:r>
+      <m:oMath>
+        <m:r>
+          <m:t>1</m:t>
+        </m:r>
+        <m:r>
+          <m:rPr>
+            <m:sty m:val="p"/>
+          </m:rPr>
+          <m:t>/</m:t>
+        </m:r>
+        <m:rad>
+          <m:radPr>
+            <m:degHide m:val="on"/>
+          </m:radPr>
+          <m:deg/>
+          <m:e>
+            <m:r>
+              <m:t>N</m:t>
+            </m:r>
+          </m:e>
+        </m:rad>
+      </m:oMath>
+      <w:r>
+        <w:t xml:space="preserve">, so a few thousand samples fix the central percentiles to</w:t>
+      </w:r>
+      <w:r>
+        <w:t xml:space="preserve"> </w:t>
+      </w:r>
+      <w:r>
+        <w:t xml:space="preserve">better than the input uncertainty warrants. The resulting distributions of natural lifetime,</w:t>
+      </w:r>
+      <w:r>
+        <w:t xml:space="preserve"> </w:t>
+      </w:r>
+      <w:r>
+        <w:t xml:space="preserve">catastrophic-impact probability, total</w:t>
+      </w:r>
+      <w:r>
+        <w:t xml:space="preserve"> </w:t>
+      </w:r>
+      <m:oMath>
+        <m:r>
+          <m:rPr>
+            <m:sty m:val="p"/>
+          </m:rPr>
+          <m:t>Δ</m:t>
+        </m:r>
+        <m:r>
+          <m:t>v</m:t>
+        </m:r>
+      </m:oMath>
+      <w:r>
+        <w:t xml:space="preserve">, and delivered compute are reported as fifth,</w:t>
+      </w:r>
+      <w:r>
+        <w:t xml:space="preserve"> </w:t>
+      </w:r>
+      <w:r>
+        <w:t xml:space="preserve">fiftieth, and ninety-fifth percentiles rather than as single numbers (Fig. 19.1), produced by</w:t>
+      </w:r>
+      <w:r>
+        <w:t xml:space="preserve"> </w:t>
+      </w:r>
+      <w:r>
+        <w:rPr>
+          <w:rStyle w:val="VerbatimChar"/>
+        </w:rPr>
+        <w:t xml:space="preserve">orbital_dc.montecarlo.monte_carlo</w:t>
+      </w:r>
+      <w:r>
+        <w:t xml:space="preserve">.</w:t>
+      </w:r>
+    </w:p>
+    <w:p>
+      <w:pPr>
+        <w:pStyle w:val="BodyText"/>
+      </w:pPr>
+      <w:r>
+        <w:rPr>
+          <w:b/>
+          <w:bCs/>
+        </w:rPr>
+        <w:t xml:space="preserve">Sensitivity ranking.</w:t>
+      </w:r>
+      <w:r>
+        <w:t xml:space="preserve"> </w:t>
+      </w:r>
+      <w:r>
+        <w:t xml:space="preserve">To attribute output variance to inputs, the model uses a one-at-a-time sweep</w:t>
+      </w:r>
+      <w:r>
+        <w:t xml:space="preserve"> </w:t>
+      </w:r>
+      <w:r>
+        <w:t xml:space="preserve">(</w:t>
+      </w:r>
+      <w:r>
+        <w:rPr>
+          <w:rStyle w:val="VerbatimChar"/>
+        </w:rPr>
+        <w:t xml:space="preserve">montecarlo.one_at_a_time</w:t>
+      </w:r>
+      <w:r>
+        <w:t xml:space="preserve">) that holds all but one input at its central value and records the output</w:t>
+      </w:r>
+      <w:r>
+        <w:t xml:space="preserve"> </w:t>
+      </w:r>
+      <w:r>
+        <w:t xml:space="preserve">swing. The ratio of that swing to the baseline is a transparent local sensitivity index; where inputs</w:t>
+      </w:r>
+      <w:r>
+        <w:t xml:space="preserve"> </w:t>
+      </w:r>
+      <w:r>
+        <w:t xml:space="preserve">interact, the full Monte-Carlo variance is the honest measure. Two sensitivities stand out. First, the natural lifetime is wildly sensitive to the solar cycle:</w:t>
       </w:r>
       <w:r>
         <w:t xml:space="preserve"> </w:t>

</xml_diff>

<commit_message>
Fix book cover compile bug; expand references and add per-chapter citations
Compile fix: preamble.tex called \hypersetup inline, but pandoc injects the
header BEFORE it loads hyperref, so \hypersetup was undefined and its options
printed as body text on page 1 (the broken/empty first pages). Deferred it to
\AtBeginDocument, which runs after hyperref loads.

References: expand the bibliography from 15 to 35 entries with the canonical
textbooks and standards the equations derive from (Curtis, Vallado, Gilmore,
Incropera, Tribble, Pisacane, Kessler, Klinkrad, Hemmati, Sutton, AE8/AP8,
AE9/AP9, SHIELDOSE, ECSS, SMAD). Add per-chapter Sources lines to the orbital,
atmosphere, radiation, debris, thermal, and communications chapters.

Rebuilt book (now 2807 lines), report HTML, and Word. Scans clean.
</commit_message>
<xml_diff>
--- a/report/Report_II_Complete.docx
+++ b/report/Report_II_Complete.docx
@@ -4651,6 +4651,32 @@
     <w:p>
       <w:pPr>
         <w:pStyle w:val="FirstParagraph"/>
+      </w:pPr>
+      <w:r>
+        <w:rPr>
+          <w:i/>
+          <w:iCs/>
+        </w:rPr>
+        <w:t xml:space="preserve">Sources: the circular-orbit relations, vis-viva equation, and specific energy follow standard</w:t>
+      </w:r>
+      <w:r>
+        <w:rPr>
+          <w:i/>
+          <w:iCs/>
+        </w:rPr>
+        <w:t xml:space="preserve"> </w:t>
+      </w:r>
+      <w:r>
+        <w:rPr>
+          <w:i/>
+          <w:iCs/>
+        </w:rPr>
+        <w:t xml:space="preserve">astrodynamics texts, principally Curtis [16] and Vallado [17].</w:t>
+      </w:r>
+    </w:p>
+    <w:p>
+      <w:pPr>
+        <w:pStyle w:val="BodyText"/>
       </w:pPr>
       <w:r>
         <w:t xml:space="preserve">Every subsequent chapter depends on a small set of orbital quantities, derived here.</w:t>
@@ -9540,6 +9566,32 @@
         <w:pStyle w:val="FirstParagraph"/>
       </w:pPr>
       <w:r>
+        <w:rPr>
+          <w:i/>
+          <w:iCs/>
+        </w:rPr>
+        <w:t xml:space="preserve">Sources: density from the NRLMSIS empirical model [11]; the drag and orbit-averaged decay treatment</w:t>
+      </w:r>
+      <w:r>
+        <w:rPr>
+          <w:i/>
+          <w:iCs/>
+        </w:rPr>
+        <w:t xml:space="preserve"> </w:t>
+      </w:r>
+      <w:r>
+        <w:rPr>
+          <w:i/>
+          <w:iCs/>
+        </w:rPr>
+        <w:t xml:space="preserve">follows Curtis [16] and the space-environment texts of Tribble [22] and Pisacane [23].</w:t>
+      </w:r>
+    </w:p>
+    <w:p>
+      <w:pPr>
+        <w:pStyle w:val="BodyText"/>
+      </w:pPr>
+      <w:r>
         <w:t xml:space="preserve">Even at 650 km a tenuous atmosphere remains, and the drag it exerts slowly lowers the orbit. This</w:t>
       </w:r>
       <w:r>
@@ -11078,6 +11130,32 @@
     <w:p>
       <w:pPr>
         <w:pStyle w:val="FirstParagraph"/>
+      </w:pPr>
+      <w:r>
+        <w:rPr>
+          <w:i/>
+          <w:iCs/>
+        </w:rPr>
+        <w:t xml:space="preserve">Sources: trapped-particle fluxes from the AE8/AP8 [25] and AE9/AP9 [26] models; dose-depth via</w:t>
+      </w:r>
+      <w:r>
+        <w:rPr>
+          <w:i/>
+          <w:iCs/>
+        </w:rPr>
+        <w:t xml:space="preserve"> </w:t>
+      </w:r>
+      <w:r>
+        <w:rPr>
+          <w:i/>
+          <w:iCs/>
+        </w:rPr>
+        <w:t xml:space="preserve">SHIELDOSE [27]; environment and effects from Tribble [22], Pisacane [23], and Hastings and Garrett [24].</w:t>
+      </w:r>
+    </w:p>
+    <w:p>
+      <w:pPr>
+        <w:pStyle w:val="BodyText"/>
       </w:pPr>
       <w:r>
         <w:t xml:space="preserve">Two physically distinct radiation effects matter: the slow accumulation of total ionizing dose,</w:t>
@@ -11596,6 +11674,32 @@
     <w:p>
       <w:pPr>
         <w:pStyle w:val="FirstParagraph"/>
+      </w:pPr>
+      <w:r>
+        <w:rPr>
+          <w:i/>
+          <w:iCs/>
+        </w:rPr>
+        <w:t xml:space="preserve">Sources: flux from NASA ORDEM 3.2 [8] and ESA MASTER [9]; the collision-frequency and cascade</w:t>
+      </w:r>
+      <w:r>
+        <w:rPr>
+          <w:i/>
+          <w:iCs/>
+        </w:rPr>
+        <w:t xml:space="preserve"> </w:t>
+      </w:r>
+      <w:r>
+        <w:rPr>
+          <w:i/>
+          <w:iCs/>
+        </w:rPr>
+        <w:t xml:space="preserve">framework follows Kessler and Cour-Palais [28] and Klinkrad [29].</w:t>
+      </w:r>
+    </w:p>
+    <w:p>
+      <w:pPr>
+        <w:pStyle w:val="BodyText"/>
       </w:pPr>
       <w:r>
         <w:t xml:space="preserve">Low Earth orbit is increasingly congested, and the 650 km sun-synchronous shell is among the most</w:t>
@@ -12189,6 +12293,32 @@
     <w:p>
       <w:pPr>
         <w:pStyle w:val="FirstParagraph"/>
+      </w:pPr>
+      <w:r>
+        <w:rPr>
+          <w:i/>
+          <w:iCs/>
+        </w:rPr>
+        <w:t xml:space="preserve">Sources: radiative and conductive relations from Incropera and DeWitt [21]; spacecraft-specific</w:t>
+      </w:r>
+      <w:r>
+        <w:rPr>
+          <w:i/>
+          <w:iCs/>
+        </w:rPr>
+        <w:t xml:space="preserve"> </w:t>
+      </w:r>
+      <w:r>
+        <w:rPr>
+          <w:i/>
+          <w:iCs/>
+        </w:rPr>
+        <w:t xml:space="preserve">practice from the Gilmore thermal-control handbook [20] and ECSS-E-ST-31C [34].</w:t>
+      </w:r>
+    </w:p>
+    <w:p>
+      <w:pPr>
+        <w:pStyle w:val="BodyText"/>
       </w:pPr>
       <w:r>
         <w:t xml:space="preserve">Thermal control is where the orbital data center is most often assumed to be hard and is in fact</w:t>
@@ -17446,6 +17576,32 @@
     <w:p>
       <w:pPr>
         <w:pStyle w:val="FirstParagraph"/>
+      </w:pPr>
+      <w:r>
+        <w:rPr>
+          <w:i/>
+          <w:iCs/>
+        </w:rPr>
+        <w:t xml:space="preserve">Sources: the optical link budget follows Hemmati [30] and the free-space optical satellite-link</w:t>
+      </w:r>
+      <w:r>
+        <w:rPr>
+          <w:i/>
+          <w:iCs/>
+        </w:rPr>
+        <w:t xml:space="preserve"> </w:t>
+      </w:r>
+      <w:r>
+        <w:rPr>
+          <w:i/>
+          <w:iCs/>
+        </w:rPr>
+        <w:t xml:space="preserve">analysis of Liang et al. [6].</w:t>
+      </w:r>
+    </w:p>
+    <w:p>
+      <w:pPr>
+        <w:pStyle w:val="BodyText"/>
       </w:pPr>
       <w:r>
         <w:t xml:space="preserve">The communications subsystem sets both the internal fabric capacity and the ability to deliver data</w:t>
@@ -31534,6 +31690,653 @@
       </w:pPr>
       <w:r>
         <w:t xml:space="preserve">NASA Goddard Integrated Design Center, concurrent-design margin practice (NTRS 20120013284).</w:t>
+      </w:r>
+    </w:p>
+    <w:p>
+      <w:pPr>
+        <w:pStyle w:val="Compact"/>
+        <w:numPr>
+          <w:ilvl w:val="0"/>
+          <w:numId w:val="1001"/>
+        </w:numPr>
+      </w:pPr>
+      <w:r>
+        <w:t xml:space="preserve">Curtis, H. D.</w:t>
+      </w:r>
+      <w:r>
+        <w:t xml:space="preserve"> </w:t>
+      </w:r>
+      <w:r>
+        <w:rPr>
+          <w:i/>
+          <w:iCs/>
+        </w:rPr>
+        <w:t xml:space="preserve">Orbital Mechanics for Engineering Students</w:t>
+      </w:r>
+      <w:r>
+        <w:t xml:space="preserve">, 4th ed. Butterworth-Heinemann, 2020.</w:t>
+      </w:r>
+    </w:p>
+    <w:p>
+      <w:pPr>
+        <w:pStyle w:val="Compact"/>
+        <w:numPr>
+          <w:ilvl w:val="0"/>
+          <w:numId w:val="1001"/>
+        </w:numPr>
+      </w:pPr>
+      <w:r>
+        <w:t xml:space="preserve">Vallado, D. A.</w:t>
+      </w:r>
+      <w:r>
+        <w:t xml:space="preserve"> </w:t>
+      </w:r>
+      <w:r>
+        <w:rPr>
+          <w:i/>
+          <w:iCs/>
+        </w:rPr>
+        <w:t xml:space="preserve">Fundamentals of Astrodynamics and Applications</w:t>
+      </w:r>
+      <w:r>
+        <w:t xml:space="preserve">, 4th ed. Microcosm Press, 2013.</w:t>
+      </w:r>
+    </w:p>
+    <w:p>
+      <w:pPr>
+        <w:pStyle w:val="Compact"/>
+        <w:numPr>
+          <w:ilvl w:val="0"/>
+          <w:numId w:val="1001"/>
+        </w:numPr>
+      </w:pPr>
+      <w:r>
+        <w:t xml:space="preserve">Wertz, J. R., Everett, D. F., Puschell, J. J. (eds.).</w:t>
+      </w:r>
+      <w:r>
+        <w:t xml:space="preserve"> </w:t>
+      </w:r>
+      <w:r>
+        <w:rPr>
+          <w:i/>
+          <w:iCs/>
+        </w:rPr>
+        <w:t xml:space="preserve">Space Mission Engineering: The New SMAD.</w:t>
+      </w:r>
+      <w:r>
+        <w:t xml:space="preserve"> </w:t>
+      </w:r>
+      <w:r>
+        <w:t xml:space="preserve">Microcosm Press, 2011.</w:t>
+      </w:r>
+    </w:p>
+    <w:p>
+      <w:pPr>
+        <w:pStyle w:val="Compact"/>
+        <w:numPr>
+          <w:ilvl w:val="0"/>
+          <w:numId w:val="1001"/>
+        </w:numPr>
+      </w:pPr>
+      <w:r>
+        <w:t xml:space="preserve">Larson, W. J., Wertz, J. R. (eds.).</w:t>
+      </w:r>
+      <w:r>
+        <w:t xml:space="preserve"> </w:t>
+      </w:r>
+      <w:r>
+        <w:rPr>
+          <w:i/>
+          <w:iCs/>
+        </w:rPr>
+        <w:t xml:space="preserve">Space Mission Analysis and Design</w:t>
+      </w:r>
+      <w:r>
+        <w:t xml:space="preserve">, 3rd ed. Microcosm/Kluwer, 1999.</w:t>
+      </w:r>
+    </w:p>
+    <w:p>
+      <w:pPr>
+        <w:pStyle w:val="Compact"/>
+        <w:numPr>
+          <w:ilvl w:val="0"/>
+          <w:numId w:val="1001"/>
+        </w:numPr>
+      </w:pPr>
+      <w:r>
+        <w:t xml:space="preserve">Gilmore, D. G. (ed.).</w:t>
+      </w:r>
+      <w:r>
+        <w:t xml:space="preserve"> </w:t>
+      </w:r>
+      <w:r>
+        <w:rPr>
+          <w:i/>
+          <w:iCs/>
+        </w:rPr>
+        <w:t xml:space="preserve">Spacecraft Thermal Control Handbook, Volume I: Fundamental Technologies</w:t>
+      </w:r>
+      <w:r>
+        <w:t xml:space="preserve">,</w:t>
+      </w:r>
+      <w:r>
+        <w:t xml:space="preserve"> </w:t>
+      </w:r>
+      <w:r>
+        <w:t xml:space="preserve">2nd ed. The Aerospace Press, 2002.</w:t>
+      </w:r>
+    </w:p>
+    <w:p>
+      <w:pPr>
+        <w:pStyle w:val="Compact"/>
+        <w:numPr>
+          <w:ilvl w:val="0"/>
+          <w:numId w:val="1001"/>
+        </w:numPr>
+      </w:pPr>
+      <w:r>
+        <w:t xml:space="preserve">Incropera, F. P., DeWitt, D. P., Bergman, T. L., Lavine, A. S.</w:t>
+      </w:r>
+      <w:r>
+        <w:t xml:space="preserve"> </w:t>
+      </w:r>
+      <w:r>
+        <w:rPr>
+          <w:i/>
+          <w:iCs/>
+        </w:rPr>
+        <w:t xml:space="preserve">Fundamentals of Heat and Mass</w:t>
+      </w:r>
+      <w:r>
+        <w:rPr>
+          <w:i/>
+          <w:iCs/>
+        </w:rPr>
+        <w:t xml:space="preserve"> </w:t>
+      </w:r>
+      <w:r>
+        <w:rPr>
+          <w:i/>
+          <w:iCs/>
+        </w:rPr>
+        <w:t xml:space="preserve">Transfer</w:t>
+      </w:r>
+      <w:r>
+        <w:t xml:space="preserve">, 7th ed. Wiley, 2011.</w:t>
+      </w:r>
+    </w:p>
+    <w:p>
+      <w:pPr>
+        <w:pStyle w:val="Compact"/>
+        <w:numPr>
+          <w:ilvl w:val="0"/>
+          <w:numId w:val="1001"/>
+        </w:numPr>
+      </w:pPr>
+      <w:r>
+        <w:t xml:space="preserve">Tribble, A. C.</w:t>
+      </w:r>
+      <w:r>
+        <w:t xml:space="preserve"> </w:t>
+      </w:r>
+      <w:r>
+        <w:rPr>
+          <w:i/>
+          <w:iCs/>
+        </w:rPr>
+        <w:t xml:space="preserve">The Space Environment: Implications for Spacecraft Design</w:t>
+      </w:r>
+      <w:r>
+        <w:t xml:space="preserve">, rev. ed. Princeton</w:t>
+      </w:r>
+      <w:r>
+        <w:t xml:space="preserve"> </w:t>
+      </w:r>
+      <w:r>
+        <w:t xml:space="preserve">University Press, 2003.</w:t>
+      </w:r>
+    </w:p>
+    <w:p>
+      <w:pPr>
+        <w:pStyle w:val="Compact"/>
+        <w:numPr>
+          <w:ilvl w:val="0"/>
+          <w:numId w:val="1001"/>
+        </w:numPr>
+      </w:pPr>
+      <w:r>
+        <w:t xml:space="preserve">Pisacane, V. L. (ed.).</w:t>
+      </w:r>
+      <w:r>
+        <w:t xml:space="preserve"> </w:t>
+      </w:r>
+      <w:r>
+        <w:rPr>
+          <w:i/>
+          <w:iCs/>
+        </w:rPr>
+        <w:t xml:space="preserve">The Space Environment and Its Effects on Space Systems</w:t>
+      </w:r>
+      <w:r>
+        <w:t xml:space="preserve">, 2nd ed. AIAA</w:t>
+      </w:r>
+      <w:r>
+        <w:t xml:space="preserve"> </w:t>
+      </w:r>
+      <w:r>
+        <w:t xml:space="preserve">Education Series, 2016.</w:t>
+      </w:r>
+    </w:p>
+    <w:p>
+      <w:pPr>
+        <w:pStyle w:val="Compact"/>
+        <w:numPr>
+          <w:ilvl w:val="0"/>
+          <w:numId w:val="1001"/>
+        </w:numPr>
+      </w:pPr>
+      <w:r>
+        <w:t xml:space="preserve">Hastings, D., Garrett, H.</w:t>
+      </w:r>
+      <w:r>
+        <w:t xml:space="preserve"> </w:t>
+      </w:r>
+      <w:r>
+        <w:rPr>
+          <w:i/>
+          <w:iCs/>
+        </w:rPr>
+        <w:t xml:space="preserve">Spacecraft-Environment Interactions.</w:t>
+      </w:r>
+      <w:r>
+        <w:t xml:space="preserve"> </w:t>
+      </w:r>
+      <w:r>
+        <w:t xml:space="preserve">Cambridge University Press, 1996.</w:t>
+      </w:r>
+    </w:p>
+    <w:p>
+      <w:pPr>
+        <w:pStyle w:val="Compact"/>
+        <w:numPr>
+          <w:ilvl w:val="0"/>
+          <w:numId w:val="1001"/>
+        </w:numPr>
+      </w:pPr>
+      <w:r>
+        <w:t xml:space="preserve">Vette, J. I.</w:t>
+      </w:r>
+      <w:r>
+        <w:t xml:space="preserve"> </w:t>
+      </w:r>
+      <w:r>
+        <w:rPr>
+          <w:i/>
+          <w:iCs/>
+        </w:rPr>
+        <w:t xml:space="preserve">The AE-8 Trapped Electron Model Environment</w:t>
+      </w:r>
+      <w:r>
+        <w:t xml:space="preserve"> </w:t>
+      </w:r>
+      <w:r>
+        <w:t xml:space="preserve">(NSSDC/WDC-A-R&amp;S 91-24); Sawyer, D. M.,</w:t>
+      </w:r>
+      <w:r>
+        <w:t xml:space="preserve"> </w:t>
+      </w:r>
+      <w:r>
+        <w:t xml:space="preserve">Vette, J. I.</w:t>
+      </w:r>
+      <w:r>
+        <w:t xml:space="preserve"> </w:t>
+      </w:r>
+      <w:r>
+        <w:rPr>
+          <w:i/>
+          <w:iCs/>
+        </w:rPr>
+        <w:t xml:space="preserve">AP-8 Trapped Proton Environment</w:t>
+      </w:r>
+      <w:r>
+        <w:t xml:space="preserve"> </w:t>
+      </w:r>
+      <w:r>
+        <w:t xml:space="preserve">(NSSDC/WDC-A-R&amp;S 76-06). NASA GSFC.</w:t>
+      </w:r>
+    </w:p>
+    <w:p>
+      <w:pPr>
+        <w:pStyle w:val="Compact"/>
+        <w:numPr>
+          <w:ilvl w:val="0"/>
+          <w:numId w:val="1001"/>
+        </w:numPr>
+      </w:pPr>
+      <w:r>
+        <w:t xml:space="preserve">Ginet, G. P. et al. </w:t>
+      </w:r>
+      <w:r>
+        <w:rPr>
+          <w:i/>
+          <w:iCs/>
+        </w:rPr>
+        <w:t xml:space="preserve">AE9, AP9 and SPM: New Models for Specifying the Trapped Energetic Particle</w:t>
+      </w:r>
+      <w:r>
+        <w:rPr>
+          <w:i/>
+          <w:iCs/>
+        </w:rPr>
+        <w:t xml:space="preserve"> </w:t>
+      </w:r>
+      <w:r>
+        <w:rPr>
+          <w:i/>
+          <w:iCs/>
+        </w:rPr>
+        <w:t xml:space="preserve">and Space Plasma Environment.</w:t>
+      </w:r>
+      <w:r>
+        <w:t xml:space="preserve"> </w:t>
+      </w:r>
+      <w:r>
+        <w:t xml:space="preserve">Space Science Reviews 179, 2013.</w:t>
+      </w:r>
+    </w:p>
+    <w:p>
+      <w:pPr>
+        <w:pStyle w:val="Compact"/>
+        <w:numPr>
+          <w:ilvl w:val="0"/>
+          <w:numId w:val="1001"/>
+        </w:numPr>
+      </w:pPr>
+      <w:r>
+        <w:t xml:space="preserve">Seltzer, S. M.</w:t>
+      </w:r>
+      <w:r>
+        <w:t xml:space="preserve"> </w:t>
+      </w:r>
+      <w:r>
+        <w:rPr>
+          <w:i/>
+          <w:iCs/>
+        </w:rPr>
+        <w:t xml:space="preserve">SHIELDOSE: A Computer Code for Space-Shielding Radiation Dose Calculations.</w:t>
+      </w:r>
+      <w:r>
+        <w:t xml:space="preserve"> </w:t>
+      </w:r>
+      <w:r>
+        <w:t xml:space="preserve">NBS Technical Note 1116, 1980.</w:t>
+      </w:r>
+    </w:p>
+    <w:p>
+      <w:pPr>
+        <w:pStyle w:val="Compact"/>
+        <w:numPr>
+          <w:ilvl w:val="0"/>
+          <w:numId w:val="1001"/>
+        </w:numPr>
+      </w:pPr>
+      <w:r>
+        <w:t xml:space="preserve">Kessler, D. J., Cour-Palais, B. G.</w:t>
+      </w:r>
+      <w:r>
+        <w:t xml:space="preserve"> </w:t>
+      </w:r>
+      <w:r>
+        <w:rPr>
+          <w:i/>
+          <w:iCs/>
+        </w:rPr>
+        <w:t xml:space="preserve">Collision Frequency of Artificial Satellites: The Creation</w:t>
+      </w:r>
+      <w:r>
+        <w:rPr>
+          <w:i/>
+          <w:iCs/>
+        </w:rPr>
+        <w:t xml:space="preserve"> </w:t>
+      </w:r>
+      <w:r>
+        <w:rPr>
+          <w:i/>
+          <w:iCs/>
+        </w:rPr>
+        <w:t xml:space="preserve">of a Debris Belt.</w:t>
+      </w:r>
+      <w:r>
+        <w:t xml:space="preserve"> </w:t>
+      </w:r>
+      <w:r>
+        <w:t xml:space="preserve">Journal of Geophysical Research 83(A6), 1978.</w:t>
+      </w:r>
+    </w:p>
+    <w:p>
+      <w:pPr>
+        <w:pStyle w:val="Compact"/>
+        <w:numPr>
+          <w:ilvl w:val="0"/>
+          <w:numId w:val="1001"/>
+        </w:numPr>
+      </w:pPr>
+      <w:r>
+        <w:t xml:space="preserve">Klinkrad, H.</w:t>
+      </w:r>
+      <w:r>
+        <w:t xml:space="preserve"> </w:t>
+      </w:r>
+      <w:r>
+        <w:rPr>
+          <w:i/>
+          <w:iCs/>
+        </w:rPr>
+        <w:t xml:space="preserve">Space Debris: Models and Risk Analysis.</w:t>
+      </w:r>
+      <w:r>
+        <w:t xml:space="preserve"> </w:t>
+      </w:r>
+      <w:r>
+        <w:t xml:space="preserve">Springer-Praxis, 2006.</w:t>
+      </w:r>
+    </w:p>
+    <w:p>
+      <w:pPr>
+        <w:pStyle w:val="Compact"/>
+        <w:numPr>
+          <w:ilvl w:val="0"/>
+          <w:numId w:val="1001"/>
+        </w:numPr>
+      </w:pPr>
+      <w:r>
+        <w:t xml:space="preserve">Hemmati, H. (ed.).</w:t>
+      </w:r>
+      <w:r>
+        <w:t xml:space="preserve"> </w:t>
+      </w:r>
+      <w:r>
+        <w:rPr>
+          <w:i/>
+          <w:iCs/>
+        </w:rPr>
+        <w:t xml:space="preserve">Deep Space Optical Communications.</w:t>
+      </w:r>
+      <w:r>
+        <w:t xml:space="preserve"> </w:t>
+      </w:r>
+      <w:r>
+        <w:t xml:space="preserve">JPL Deep-Space Communications and</w:t>
+      </w:r>
+      <w:r>
+        <w:t xml:space="preserve"> </w:t>
+      </w:r>
+      <w:r>
+        <w:t xml:space="preserve">Navigation Series, Wiley, 2006.</w:t>
+      </w:r>
+    </w:p>
+    <w:p>
+      <w:pPr>
+        <w:pStyle w:val="Compact"/>
+        <w:numPr>
+          <w:ilvl w:val="0"/>
+          <w:numId w:val="1001"/>
+        </w:numPr>
+      </w:pPr>
+      <w:r>
+        <w:t xml:space="preserve">Sutton, G. P., Biblarz, O.</w:t>
+      </w:r>
+      <w:r>
+        <w:t xml:space="preserve"> </w:t>
+      </w:r>
+      <w:r>
+        <w:rPr>
+          <w:i/>
+          <w:iCs/>
+        </w:rPr>
+        <w:t xml:space="preserve">Rocket Propulsion Elements</w:t>
+      </w:r>
+      <w:r>
+        <w:t xml:space="preserve">, 9th ed. Wiley, 2017.</w:t>
+      </w:r>
+    </w:p>
+    <w:p>
+      <w:pPr>
+        <w:pStyle w:val="Compact"/>
+        <w:numPr>
+          <w:ilvl w:val="0"/>
+          <w:numId w:val="1001"/>
+        </w:numPr>
+      </w:pPr>
+      <w:r>
+        <w:t xml:space="preserve">Wertz, J. R. (ed.).</w:t>
+      </w:r>
+      <w:r>
+        <w:t xml:space="preserve"> </w:t>
+      </w:r>
+      <w:r>
+        <w:rPr>
+          <w:i/>
+          <w:iCs/>
+        </w:rPr>
+        <w:t xml:space="preserve">Spacecraft Attitude Determination and Control.</w:t>
+      </w:r>
+      <w:r>
+        <w:t xml:space="preserve"> </w:t>
+      </w:r>
+      <w:r>
+        <w:t xml:space="preserve">D. Reidel, 1978.</w:t>
+      </w:r>
+    </w:p>
+    <w:p>
+      <w:pPr>
+        <w:pStyle w:val="Compact"/>
+        <w:numPr>
+          <w:ilvl w:val="0"/>
+          <w:numId w:val="1001"/>
+        </w:numPr>
+      </w:pPr>
+      <w:r>
+        <w:t xml:space="preserve">Sidi, M. J.</w:t>
+      </w:r>
+      <w:r>
+        <w:t xml:space="preserve"> </w:t>
+      </w:r>
+      <w:r>
+        <w:rPr>
+          <w:i/>
+          <w:iCs/>
+        </w:rPr>
+        <w:t xml:space="preserve">Spacecraft Dynamics and Control: A Practical Engineering Approach.</w:t>
+      </w:r>
+      <w:r>
+        <w:t xml:space="preserve"> </w:t>
+      </w:r>
+      <w:r>
+        <w:t xml:space="preserve">Cambridge</w:t>
+      </w:r>
+      <w:r>
+        <w:t xml:space="preserve"> </w:t>
+      </w:r>
+      <w:r>
+        <w:t xml:space="preserve">University Press, 1997.</w:t>
+      </w:r>
+    </w:p>
+    <w:p>
+      <w:pPr>
+        <w:pStyle w:val="Compact"/>
+        <w:numPr>
+          <w:ilvl w:val="0"/>
+          <w:numId w:val="1001"/>
+        </w:numPr>
+      </w:pPr>
+      <w:r>
+        <w:t xml:space="preserve">ECSS.</w:t>
+      </w:r>
+      <w:r>
+        <w:t xml:space="preserve"> </w:t>
+      </w:r>
+      <w:r>
+        <w:rPr>
+          <w:i/>
+          <w:iCs/>
+        </w:rPr>
+        <w:t xml:space="preserve">Space Engineering: Thermal Control General Requirements</w:t>
+      </w:r>
+      <w:r>
+        <w:t xml:space="preserve"> </w:t>
+      </w:r>
+      <w:r>
+        <w:t xml:space="preserve">(ECSS-E-ST-31C) and</w:t>
+      </w:r>
+      <w:r>
+        <w:t xml:space="preserve"> </w:t>
+      </w:r>
+      <w:r>
+        <w:rPr>
+          <w:i/>
+          <w:iCs/>
+        </w:rPr>
+        <w:t xml:space="preserve">Space</w:t>
+      </w:r>
+      <w:r>
+        <w:rPr>
+          <w:i/>
+          <w:iCs/>
+        </w:rPr>
+        <w:t xml:space="preserve"> </w:t>
+      </w:r>
+      <w:r>
+        <w:rPr>
+          <w:i/>
+          <w:iCs/>
+        </w:rPr>
+        <w:t xml:space="preserve">Environment</w:t>
+      </w:r>
+      <w:r>
+        <w:t xml:space="preserve"> </w:t>
+      </w:r>
+      <w:r>
+        <w:t xml:space="preserve">(ECSS-E-ST-10-04C). European Cooperation for Space Standardization.</w:t>
+      </w:r>
+    </w:p>
+    <w:p>
+      <w:pPr>
+        <w:pStyle w:val="Compact"/>
+        <w:numPr>
+          <w:ilvl w:val="0"/>
+          <w:numId w:val="1001"/>
+        </w:numPr>
+      </w:pPr>
+      <w:r>
+        <w:t xml:space="preserve">O’Hanlon, M. et al.; SpaceX published launch-manifest and reusability data; FAA commercial-space</w:t>
+      </w:r>
+      <w:r>
+        <w:t xml:space="preserve"> </w:t>
+      </w:r>
+      <w:r>
+        <w:t xml:space="preserve">launch records, for the launch-cadence and cost-trajectory inputs of Chapter 22.</w:t>
       </w:r>
     </w:p>
     <w:bookmarkEnd w:id="117"/>

</xml_diff>

<commit_message>
Add Report I thermal-feasibility study as full chapter 2A
Folds the original feasibility study (the first LinkedIn article) into the
book as its own chapter: the 1450 W node, 4 m2 / 0.85-emissivity radiator at
21.3 C, the junction-to-radiator resistance chain (0.300 K/W), the 111.3 C
junction and 13.6 C margin against the 125 C limit, the single-heat-pipe
failure case (114.8 C), and the honest caveats (300 W TDP is conservative vs
the ~150-200 W actual; the >400 W passive wall of Ch10; the negative break-even
of Ch22). All numbers reproduced by orbital_dc.thermal.report_i_baseline().

Book now 41 chapters / 35 numbered equations. Report, HTML, Word rebuilt; scans clean.
</commit_message>
<xml_diff>
--- a/report/Report_II_Complete.docx
+++ b/report/Report_II_Complete.docx
@@ -3179,7 +3179,7 @@
     </w:p>
     <w:bookmarkEnd w:id="14"/>
     <w:bookmarkEnd w:id="15"/>
-    <w:bookmarkStart w:id="20" w:name="part-i-introduction-and-context"/>
+    <w:bookmarkStart w:id="21" w:name="part-i-introduction-and-context"/>
     <w:p>
       <w:pPr>
         <w:pStyle w:val="Heading1"/>
@@ -3572,13 +3572,13 @@
       </w:r>
     </w:p>
     <w:bookmarkEnd w:id="17"/>
-    <w:bookmarkStart w:id="18" w:name="reference-architecture-and-scope"/>
+    <w:bookmarkStart w:id="18" w:name="X160aca457c70b7bf57f86990fd6f0490081dceb"/>
     <w:p>
       <w:pPr>
         <w:pStyle w:val="Heading2"/>
       </w:pPr>
       <w:r>
-        <w:t xml:space="preserve">3. Reference architecture and scope</w:t>
+        <w:t xml:space="preserve">2A. The original feasibility study: passive cooling of a TPU node</w:t>
       </w:r>
     </w:p>
     <w:p>
@@ -3586,43 +3586,47 @@
         <w:pStyle w:val="FirstParagraph"/>
       </w:pPr>
       <w:r>
-        <w:t xml:space="preserve">Throughout this analysis the reference design follows the Suncatcher parameters: a dawn-dusk</w:t>
-      </w:r>
-      <w:r>
-        <w:t xml:space="preserve"> </w:t>
-      </w:r>
-      <w:r>
-        <w:t xml:space="preserve">sun-synchronous orbit at 650 km, an eighty-one-satellite cluster of one-kilometer radius, and</w:t>
-      </w:r>
-      <w:r>
-        <w:t xml:space="preserve"> </w:t>
-      </w:r>
-      <w:r>
-        <w:t xml:space="preserve">inter-satellite spacing of roughly 150 m. The reference satellite bus is taken to carry four</w:t>
-      </w:r>
-      <w:r>
-        <w:t xml:space="preserve"> </w:t>
-      </w:r>
-      <w:r>
-        <w:t xml:space="preserve">accelerators with an avionics and support complement, consistent with the mass budget developed in</w:t>
-      </w:r>
-      <w:r>
-        <w:t xml:space="preserve"> </w:t>
-      </w:r>
-      <w:r>
-        <w:t xml:space="preserve">Chapter 12. Where the analysis examines higher-power chips (NVIDIA H100 at 700 W, B200 at 1000 W,</w:t>
-      </w:r>
-      <w:r>
-        <w:t xml:space="preserve"> </w:t>
-      </w:r>
-      <w:r>
-        <w:t xml:space="preserve">the GB200 GPU at 1200 W), it does so to test the scaling of each subsystem, because the trend in AI</w:t>
-      </w:r>
-      <w:r>
-        <w:t xml:space="preserve"> </w:t>
-      </w:r>
-      <w:r>
-        <w:t xml:space="preserve">accelerators is toward higher, not lower, per-chip power.</w:t>
+        <w:rPr>
+          <w:i/>
+          <w:iCs/>
+        </w:rPr>
+        <w:t xml:space="preserve">Sources: radiative and conductive relations from Incropera and DeWitt [21]; spacecraft thermal</w:t>
+      </w:r>
+      <w:r>
+        <w:rPr>
+          <w:i/>
+          <w:iCs/>
+        </w:rPr>
+        <w:t xml:space="preserve"> </w:t>
+      </w:r>
+      <w:r>
+        <w:rPr>
+          <w:i/>
+          <w:iCs/>
+        </w:rPr>
+        <w:t xml:space="preserve">practice and white-paint properties from the Gilmore handbook [20]. Reproduced by</w:t>
+      </w:r>
+      <w:r>
+        <w:rPr>
+          <w:i/>
+          <w:iCs/>
+        </w:rPr>
+        <w:t xml:space="preserve"> </w:t>
+      </w:r>
+      <w:r>
+        <w:rPr>
+          <w:rStyle w:val="VerbatimChar"/>
+          <w:i/>
+          <w:iCs/>
+        </w:rPr>
+        <w:t xml:space="preserve">orbital_dc.thermal.report_i_baseline()</w:t>
+      </w:r>
+      <w:r>
+        <w:rPr>
+          <w:i/>
+          <w:iCs/>
+        </w:rPr>
+        <w:t xml:space="preserve">.</w:t>
       </w:r>
     </w:p>
     <w:p>
@@ -3630,6 +3634,2001 @@
         <w:pStyle w:val="BodyText"/>
       </w:pPr>
       <w:r>
+        <w:t xml:space="preserve">The work that opened this line of analysis asked a single, narrow question: can a node carrying several</w:t>
+      </w:r>
+      <w:r>
+        <w:t xml:space="preserve"> </w:t>
+      </w:r>
+      <w:r>
+        <w:t xml:space="preserve">high-power accelerators be held within its temperature limit at 650 kilometers using only passive</w:t>
+      </w:r>
+      <w:r>
+        <w:t xml:space="preserve"> </w:t>
+      </w:r>
+      <w:r>
+        <w:t xml:space="preserve">radiative cooling, with no refrigeration and no consumable coolant. The answer governs everything that</w:t>
+      </w:r>
+      <w:r>
+        <w:t xml:space="preserve"> </w:t>
+      </w:r>
+      <w:r>
+        <w:t xml:space="preserve">follows, because if the thermal case fails at the node level there is nothing to scale. This chapter</w:t>
+      </w:r>
+      <w:r>
+        <w:t xml:space="preserve"> </w:t>
+      </w:r>
+      <w:r>
+        <w:t xml:space="preserve">reproduces that original steady-state design point in full, since the rest of the book extends and</w:t>
+      </w:r>
+      <w:r>
+        <w:t xml:space="preserve"> </w:t>
+      </w:r>
+      <w:r>
+        <w:t xml:space="preserve">stress-tests it; the general thermal theory it draws on is developed in Chapter 10.</w:t>
+      </w:r>
+    </w:p>
+    <w:p>
+      <w:pPr>
+        <w:pStyle w:val="BodyText"/>
+      </w:pPr>
+      <w:r>
+        <w:rPr>
+          <w:b/>
+          <w:bCs/>
+        </w:rPr>
+        <w:t xml:space="preserve">The heat load.</w:t>
+      </w:r>
+      <w:r>
+        <w:t xml:space="preserve"> </w:t>
+      </w:r>
+      <w:r>
+        <w:t xml:space="preserve">The reference node dissipates four accelerators at a per-chip power of 300 watts,</w:t>
+      </w:r>
+      <w:r>
+        <w:t xml:space="preserve"> </w:t>
+      </w:r>
+      <w:r>
+        <w:t xml:space="preserve">together with avionics and a parasitic allowance:</w:t>
+      </w:r>
+    </w:p>
+    <w:p>
+      <w:pPr>
+        <w:pStyle w:val="BodyText"/>
+      </w:pPr>
+      <m:oMathPara>
+        <m:oMathParaPr>
+          <m:jc m:val="center"/>
+        </m:oMathParaPr>
+        <m:oMath>
+          <m:sSub>
+            <m:e>
+              <m:r>
+                <m:t>Q</m:t>
+              </m:r>
+            </m:e>
+            <m:sub>
+              <m:r>
+                <m:rPr>
+                  <m:sty m:val="p"/>
+                </m:rPr>
+                <m:t>t</m:t>
+              </m:r>
+              <m:r>
+                <m:rPr>
+                  <m:sty m:val="p"/>
+                </m:rPr>
+                <m:t>o</m:t>
+              </m:r>
+              <m:r>
+                <m:rPr>
+                  <m:sty m:val="p"/>
+                </m:rPr>
+                <m:t>t</m:t>
+              </m:r>
+              <m:r>
+                <m:rPr>
+                  <m:sty m:val="p"/>
+                </m:rPr>
+                <m:t>a</m:t>
+              </m:r>
+              <m:r>
+                <m:rPr>
+                  <m:sty m:val="p"/>
+                </m:rPr>
+                <m:t>l</m:t>
+              </m:r>
+            </m:sub>
+          </m:sSub>
+          <m:r>
+            <m:rPr>
+              <m:sty m:val="p"/>
+            </m:rPr>
+            <m:t>=</m:t>
+          </m:r>
+          <m:r>
+            <m:t>4</m:t>
+          </m:r>
+          <m:r>
+            <m:rPr>
+              <m:sty m:val="p"/>
+            </m:rPr>
+            <m:t>×</m:t>
+          </m:r>
+          <m:r>
+            <m:t>300</m:t>
+          </m:r>
+          <m:r>
+            <m:rPr>
+              <m:sty m:val="p"/>
+            </m:rPr>
+            <m:t>+</m:t>
+          </m:r>
+          <m:sSub>
+            <m:e>
+              <m:r>
+                <m:t>150</m:t>
+              </m:r>
+            </m:e>
+            <m:sub>
+              <m:r>
+                <m:rPr>
+                  <m:sty m:val="p"/>
+                </m:rPr>
+                <m:t>a</m:t>
+              </m:r>
+              <m:r>
+                <m:rPr>
+                  <m:sty m:val="p"/>
+                </m:rPr>
+                <m:t>v</m:t>
+              </m:r>
+              <m:r>
+                <m:rPr>
+                  <m:sty m:val="p"/>
+                </m:rPr>
+                <m:t>i</m:t>
+              </m:r>
+              <m:r>
+                <m:rPr>
+                  <m:sty m:val="p"/>
+                </m:rPr>
+                <m:t>o</m:t>
+              </m:r>
+              <m:r>
+                <m:rPr>
+                  <m:sty m:val="p"/>
+                </m:rPr>
+                <m:t>n</m:t>
+              </m:r>
+              <m:r>
+                <m:rPr>
+                  <m:sty m:val="p"/>
+                </m:rPr>
+                <m:t>i</m:t>
+              </m:r>
+              <m:r>
+                <m:rPr>
+                  <m:sty m:val="p"/>
+                </m:rPr>
+                <m:t>c</m:t>
+              </m:r>
+              <m:r>
+                <m:rPr>
+                  <m:sty m:val="p"/>
+                </m:rPr>
+                <m:t>s</m:t>
+              </m:r>
+            </m:sub>
+          </m:sSub>
+          <m:r>
+            <m:rPr>
+              <m:sty m:val="p"/>
+            </m:rPr>
+            <m:t>+</m:t>
+          </m:r>
+          <m:sSub>
+            <m:e>
+              <m:r>
+                <m:t>100</m:t>
+              </m:r>
+            </m:e>
+            <m:sub>
+              <m:r>
+                <m:rPr>
+                  <m:sty m:val="p"/>
+                </m:rPr>
+                <m:t>p</m:t>
+              </m:r>
+              <m:r>
+                <m:rPr>
+                  <m:sty m:val="p"/>
+                </m:rPr>
+                <m:t>a</m:t>
+              </m:r>
+              <m:r>
+                <m:rPr>
+                  <m:sty m:val="p"/>
+                </m:rPr>
+                <m:t>r</m:t>
+              </m:r>
+              <m:r>
+                <m:rPr>
+                  <m:sty m:val="p"/>
+                </m:rPr>
+                <m:t>a</m:t>
+              </m:r>
+              <m:r>
+                <m:rPr>
+                  <m:sty m:val="p"/>
+                </m:rPr>
+                <m:t>s</m:t>
+              </m:r>
+              <m:r>
+                <m:rPr>
+                  <m:sty m:val="p"/>
+                </m:rPr>
+                <m:t>i</m:t>
+              </m:r>
+              <m:r>
+                <m:rPr>
+                  <m:sty m:val="p"/>
+                </m:rPr>
+                <m:t>t</m:t>
+              </m:r>
+              <m:r>
+                <m:rPr>
+                  <m:sty m:val="p"/>
+                </m:rPr>
+                <m:t>i</m:t>
+              </m:r>
+              <m:r>
+                <m:rPr>
+                  <m:sty m:val="p"/>
+                </m:rPr>
+                <m:t>c</m:t>
+              </m:r>
+            </m:sub>
+          </m:sSub>
+          <m:r>
+            <m:rPr>
+              <m:sty m:val="p"/>
+            </m:rPr>
+            <m:t>=</m:t>
+          </m:r>
+          <m:r>
+            <m:t>1450</m:t>
+          </m:r>
+          <m:r>
+            <m:t> </m:t>
+          </m:r>
+          <m:r>
+            <m:rPr>
+              <m:sty m:val="p"/>
+            </m:rPr>
+            <m:t>W</m:t>
+          </m:r>
+          <m:r>
+            <m:rPr>
+              <m:sty m:val="p"/>
+            </m:rPr>
+            <m:t>.</m:t>
+          </m:r>
+        </m:oMath>
+      </m:oMathPara>
+    </w:p>
+    <w:p>
+      <w:pPr>
+        <w:pStyle w:val="FirstParagraph"/>
+      </w:pPr>
+      <w:r>
+        <w:rPr>
+          <w:b/>
+          <w:bCs/>
+        </w:rPr>
+        <w:t xml:space="preserve">Radiator temperature.</w:t>
+      </w:r>
+      <w:r>
+        <w:t xml:space="preserve"> </w:t>
+      </w:r>
+      <w:r>
+        <w:t xml:space="preserve">All of this heat leaves as thermal radiation. For a gray emitter of area</w:t>
+      </w:r>
+      <w:r>
+        <w:t xml:space="preserve"> </w:t>
+      </w:r>
+      <m:oMath>
+        <m:r>
+          <m:t>A</m:t>
+        </m:r>
+      </m:oMath>
+      <w:r>
+        <w:t xml:space="preserve"> </w:t>
+      </w:r>
+      <w:r>
+        <w:t xml:space="preserve">and emissivity</w:t>
+      </w:r>
+      <w:r>
+        <w:t xml:space="preserve"> </w:t>
+      </w:r>
+      <m:oMath>
+        <m:r>
+          <m:t>ε</m:t>
+        </m:r>
+      </m:oMath>
+      <w:r>
+        <w:t xml:space="preserve"> </w:t>
+      </w:r>
+      <w:r>
+        <w:t xml:space="preserve">radiating from</w:t>
+      </w:r>
+      <w:r>
+        <w:t xml:space="preserve"> </w:t>
+      </w:r>
+      <m:oMath>
+        <m:sSub>
+          <m:e>
+            <m:r>
+              <m:t>n</m:t>
+            </m:r>
+          </m:e>
+          <m:sub>
+            <m:r>
+              <m:t>s</m:t>
+            </m:r>
+          </m:sub>
+        </m:sSub>
+      </m:oMath>
+      <w:r>
+        <w:t xml:space="preserve"> </w:t>
+      </w:r>
+      <w:r>
+        <w:t xml:space="preserve">sides into a cold background, the steady-state panel</w:t>
+      </w:r>
+      <w:r>
+        <w:t xml:space="preserve"> </w:t>
+      </w:r>
+      <w:r>
+        <w:t xml:space="preserve">temperature follows from the Stefan-Boltzmann balance,</w:t>
+      </w:r>
+    </w:p>
+    <w:p>
+      <w:pPr>
+        <w:pStyle w:val="BodyText"/>
+      </w:pPr>
+      <m:oMathPara>
+        <m:oMathParaPr>
+          <m:jc m:val="center"/>
+        </m:oMathParaPr>
+        <m:oMath>
+          <m:sSub>
+            <m:e>
+              <m:r>
+                <m:t>Q</m:t>
+              </m:r>
+            </m:e>
+            <m:sub>
+              <m:r>
+                <m:rPr>
+                  <m:sty m:val="p"/>
+                </m:rPr>
+                <m:t>t</m:t>
+              </m:r>
+              <m:r>
+                <m:rPr>
+                  <m:sty m:val="p"/>
+                </m:rPr>
+                <m:t>o</m:t>
+              </m:r>
+              <m:r>
+                <m:rPr>
+                  <m:sty m:val="p"/>
+                </m:rPr>
+                <m:t>t</m:t>
+              </m:r>
+              <m:r>
+                <m:rPr>
+                  <m:sty m:val="p"/>
+                </m:rPr>
+                <m:t>a</m:t>
+              </m:r>
+              <m:r>
+                <m:rPr>
+                  <m:sty m:val="p"/>
+                </m:rPr>
+                <m:t>l</m:t>
+              </m:r>
+            </m:sub>
+          </m:sSub>
+          <m:r>
+            <m:rPr>
+              <m:sty m:val="p"/>
+            </m:rPr>
+            <m:t>=</m:t>
+          </m:r>
+          <m:r>
+            <m:t>ε</m:t>
+          </m:r>
+          <m:r>
+            <m:t> </m:t>
+          </m:r>
+          <m:r>
+            <m:t>σ</m:t>
+          </m:r>
+          <m:r>
+            <m:t> </m:t>
+          </m:r>
+          <m:r>
+            <m:t>A</m:t>
+          </m:r>
+          <m:r>
+            <m:t> </m:t>
+          </m:r>
+          <m:sSub>
+            <m:e>
+              <m:r>
+                <m:t>n</m:t>
+              </m:r>
+            </m:e>
+            <m:sub>
+              <m:r>
+                <m:t>s</m:t>
+              </m:r>
+            </m:sub>
+          </m:sSub>
+          <m:r>
+            <m:t> </m:t>
+          </m:r>
+          <m:sSubSup>
+            <m:e>
+              <m:r>
+                <m:t>T</m:t>
+              </m:r>
+            </m:e>
+            <m:sub>
+              <m:r>
+                <m:rPr>
+                  <m:sty m:val="p"/>
+                </m:rPr>
+                <m:t>r</m:t>
+              </m:r>
+              <m:r>
+                <m:rPr>
+                  <m:sty m:val="p"/>
+                </m:rPr>
+                <m:t>a</m:t>
+              </m:r>
+              <m:r>
+                <m:rPr>
+                  <m:sty m:val="p"/>
+                </m:rPr>
+                <m:t>d</m:t>
+              </m:r>
+            </m:sub>
+            <m:sup>
+              <m:r>
+                <m:t>4</m:t>
+              </m:r>
+            </m:sup>
+          </m:sSubSup>
+          <m:r>
+            <m:t> </m:t>
+          </m:r>
+          <m:r>
+            <m:rPr>
+              <m:sty m:val="p"/>
+            </m:rPr>
+            <m:t>⇒</m:t>
+          </m:r>
+          <m:r>
+            <m:t> </m:t>
+          </m:r>
+          <m:sSub>
+            <m:e>
+              <m:r>
+                <m:t>T</m:t>
+              </m:r>
+            </m:e>
+            <m:sub>
+              <m:r>
+                <m:rPr>
+                  <m:sty m:val="p"/>
+                </m:rPr>
+                <m:t>r</m:t>
+              </m:r>
+              <m:r>
+                <m:rPr>
+                  <m:sty m:val="p"/>
+                </m:rPr>
+                <m:t>a</m:t>
+              </m:r>
+              <m:r>
+                <m:rPr>
+                  <m:sty m:val="p"/>
+                </m:rPr>
+                <m:t>d</m:t>
+              </m:r>
+            </m:sub>
+          </m:sSub>
+          <m:r>
+            <m:rPr>
+              <m:sty m:val="p"/>
+            </m:rPr>
+            <m:t>=</m:t>
+          </m:r>
+          <m:sSup>
+            <m:e>
+              <m:d>
+                <m:dPr>
+                  <m:begChr m:val="("/>
+                  <m:sepChr m:val=""/>
+                  <m:endChr m:val=")"/>
+                  <m:grow/>
+                </m:dPr>
+                <m:e>
+                  <m:f>
+                    <m:fPr>
+                      <m:type m:val="bar"/>
+                    </m:fPr>
+                    <m:num>
+                      <m:sSub>
+                        <m:e>
+                          <m:r>
+                            <m:t>Q</m:t>
+                          </m:r>
+                        </m:e>
+                        <m:sub>
+                          <m:r>
+                            <m:rPr>
+                              <m:sty m:val="p"/>
+                            </m:rPr>
+                            <m:t>t</m:t>
+                          </m:r>
+                          <m:r>
+                            <m:rPr>
+                              <m:sty m:val="p"/>
+                            </m:rPr>
+                            <m:t>o</m:t>
+                          </m:r>
+                          <m:r>
+                            <m:rPr>
+                              <m:sty m:val="p"/>
+                            </m:rPr>
+                            <m:t>t</m:t>
+                          </m:r>
+                          <m:r>
+                            <m:rPr>
+                              <m:sty m:val="p"/>
+                            </m:rPr>
+                            <m:t>a</m:t>
+                          </m:r>
+                          <m:r>
+                            <m:rPr>
+                              <m:sty m:val="p"/>
+                            </m:rPr>
+                            <m:t>l</m:t>
+                          </m:r>
+                        </m:sub>
+                      </m:sSub>
+                    </m:num>
+                    <m:den>
+                      <m:r>
+                        <m:t>ε</m:t>
+                      </m:r>
+                      <m:r>
+                        <m:t> </m:t>
+                      </m:r>
+                      <m:r>
+                        <m:t>σ</m:t>
+                      </m:r>
+                      <m:r>
+                        <m:t> </m:t>
+                      </m:r>
+                      <m:r>
+                        <m:t>A</m:t>
+                      </m:r>
+                      <m:r>
+                        <m:t> </m:t>
+                      </m:r>
+                      <m:sSub>
+                        <m:e>
+                          <m:r>
+                            <m:t>n</m:t>
+                          </m:r>
+                        </m:e>
+                        <m:sub>
+                          <m:r>
+                            <m:t>s</m:t>
+                          </m:r>
+                        </m:sub>
+                      </m:sSub>
+                    </m:den>
+                  </m:f>
+                </m:e>
+              </m:d>
+            </m:e>
+            <m:sup>
+              <m:r>
+                <m:t>1</m:t>
+              </m:r>
+              <m:r>
+                <m:rPr>
+                  <m:sty m:val="p"/>
+                </m:rPr>
+                <m:t>/</m:t>
+              </m:r>
+              <m:r>
+                <m:t>4</m:t>
+              </m:r>
+            </m:sup>
+          </m:sSup>
+          <m:r>
+            <m:rPr>
+              <m:sty m:val="p"/>
+            </m:rPr>
+            <m:t>.</m:t>
+          </m:r>
+        </m:oMath>
+      </m:oMathPara>
+    </w:p>
+    <w:p>
+      <w:pPr>
+        <w:pStyle w:val="FirstParagraph"/>
+      </w:pPr>
+      <w:r>
+        <w:t xml:space="preserve">With two two-square-meter panels treated as a single-sided four-square-meter emitter, Z-93 white paint</w:t>
+      </w:r>
+      <w:r>
+        <w:t xml:space="preserve"> </w:t>
+      </w:r>
+      <w:r>
+        <w:t xml:space="preserve">at its end-of-life emissivity of 0.85, the panel settles at</w:t>
+      </w:r>
+      <w:r>
+        <w:t xml:space="preserve"> </w:t>
+      </w:r>
+      <m:oMath>
+        <m:sSub>
+          <m:e>
+            <m:r>
+              <m:t>T</m:t>
+            </m:r>
+          </m:e>
+          <m:sub>
+            <m:r>
+              <m:rPr>
+                <m:sty m:val="p"/>
+              </m:rPr>
+              <m:t>r</m:t>
+            </m:r>
+            <m:r>
+              <m:rPr>
+                <m:sty m:val="p"/>
+              </m:rPr>
+              <m:t>a</m:t>
+            </m:r>
+            <m:r>
+              <m:rPr>
+                <m:sty m:val="p"/>
+              </m:rPr>
+              <m:t>d</m:t>
+            </m:r>
+          </m:sub>
+        </m:sSub>
+        <m:r>
+          <m:rPr>
+            <m:sty m:val="p"/>
+          </m:rPr>
+          <m:t>=</m:t>
+        </m:r>
+        <m:r>
+          <m:t>21.3</m:t>
+        </m:r>
+        <m:sSup>
+          <m:e>
+            <m:r>
+              <m:t> </m:t>
+            </m:r>
+          </m:e>
+          <m:sup>
+            <m:r>
+              <m:rPr>
+                <m:sty m:val="p"/>
+              </m:rPr>
+              <m:t>∘</m:t>
+            </m:r>
+          </m:sup>
+        </m:sSup>
+        <m:r>
+          <m:rPr>
+            <m:sty m:val="p"/>
+          </m:rPr>
+          <m:t>C</m:t>
+        </m:r>
+      </m:oMath>
+      <w:r>
+        <w:t xml:space="preserve">.</w:t>
+      </w:r>
+      <w:r>
+        <w:t xml:space="preserve"> </w:t>
+      </w:r>
+      <w:r>
+        <w:t xml:space="preserve">The radiator is comfortable; the difficulty is entirely in getting the heat from the silicon to it.</w:t>
+      </w:r>
+    </w:p>
+    <w:p>
+      <w:pPr>
+        <w:pStyle w:val="BodyText"/>
+      </w:pPr>
+      <w:r>
+        <w:rPr>
+          <w:b/>
+          <w:bCs/>
+        </w:rPr>
+        <w:t xml:space="preserve">The conduction chain.</w:t>
+      </w:r>
+      <w:r>
+        <w:t xml:space="preserve"> </w:t>
+      </w:r>
+      <w:r>
+        <w:t xml:space="preserve">Between the transistor junction and the panel sits a series of thermal</w:t>
+      </w:r>
+      <w:r>
+        <w:t xml:space="preserve"> </w:t>
+      </w:r>
+      <w:r>
+        <w:t xml:space="preserve">resistances: junction to case, the thermal interface material, the cold-plate base, the heat pipe, and</w:t>
+      </w:r>
+      <w:r>
+        <w:t xml:space="preserve"> </w:t>
+      </w:r>
+      <w:r>
+        <w:t xml:space="preserve">the radiator interface. In series they add,</w:t>
+      </w:r>
+    </w:p>
+    <w:p>
+      <w:pPr>
+        <w:pStyle w:val="BodyText"/>
+      </w:pPr>
+      <m:oMathPara>
+        <m:oMathParaPr>
+          <m:jc m:val="center"/>
+        </m:oMathParaPr>
+        <m:oMath>
+          <m:sSub>
+            <m:e>
+              <m:r>
+                <m:t>R</m:t>
+              </m:r>
+            </m:e>
+            <m:sub>
+              <m:r>
+                <m:rPr>
+                  <m:sty m:val="p"/>
+                </m:rPr>
+                <m:t>t</m:t>
+              </m:r>
+              <m:r>
+                <m:rPr>
+                  <m:sty m:val="p"/>
+                </m:rPr>
+                <m:t>h</m:t>
+              </m:r>
+            </m:sub>
+          </m:sSub>
+          <m:r>
+            <m:rPr>
+              <m:sty m:val="p"/>
+            </m:rPr>
+            <m:t>=</m:t>
+          </m:r>
+          <m:sSub>
+            <m:e>
+              <m:r>
+                <m:t>r</m:t>
+              </m:r>
+            </m:e>
+            <m:sub>
+              <m:r>
+                <m:t>j</m:t>
+              </m:r>
+              <m:r>
+                <m:t>c</m:t>
+              </m:r>
+            </m:sub>
+          </m:sSub>
+          <m:r>
+            <m:rPr>
+              <m:sty m:val="p"/>
+            </m:rPr>
+            <m:t>+</m:t>
+          </m:r>
+          <m:sSub>
+            <m:e>
+              <m:r>
+                <m:t>r</m:t>
+              </m:r>
+            </m:e>
+            <m:sub>
+              <m:r>
+                <m:rPr>
+                  <m:sty m:val="p"/>
+                </m:rPr>
+                <m:t>t</m:t>
+              </m:r>
+              <m:r>
+                <m:rPr>
+                  <m:sty m:val="p"/>
+                </m:rPr>
+                <m:t>i</m:t>
+              </m:r>
+              <m:r>
+                <m:rPr>
+                  <m:sty m:val="p"/>
+                </m:rPr>
+                <m:t>m</m:t>
+              </m:r>
+            </m:sub>
+          </m:sSub>
+          <m:r>
+            <m:rPr>
+              <m:sty m:val="p"/>
+            </m:rPr>
+            <m:t>+</m:t>
+          </m:r>
+          <m:sSub>
+            <m:e>
+              <m:r>
+                <m:t>r</m:t>
+              </m:r>
+            </m:e>
+            <m:sub>
+              <m:r>
+                <m:rPr>
+                  <m:sty m:val="p"/>
+                </m:rPr>
+                <m:t>b</m:t>
+              </m:r>
+              <m:r>
+                <m:rPr>
+                  <m:sty m:val="p"/>
+                </m:rPr>
+                <m:t>a</m:t>
+              </m:r>
+              <m:r>
+                <m:rPr>
+                  <m:sty m:val="p"/>
+                </m:rPr>
+                <m:t>s</m:t>
+              </m:r>
+              <m:r>
+                <m:rPr>
+                  <m:sty m:val="p"/>
+                </m:rPr>
+                <m:t>e</m:t>
+              </m:r>
+            </m:sub>
+          </m:sSub>
+          <m:r>
+            <m:rPr>
+              <m:sty m:val="p"/>
+            </m:rPr>
+            <m:t>+</m:t>
+          </m:r>
+          <m:sSub>
+            <m:e>
+              <m:r>
+                <m:t>r</m:t>
+              </m:r>
+            </m:e>
+            <m:sub>
+              <m:r>
+                <m:rPr>
+                  <m:sty m:val="p"/>
+                </m:rPr>
+                <m:t>p</m:t>
+              </m:r>
+              <m:r>
+                <m:rPr>
+                  <m:sty m:val="p"/>
+                </m:rPr>
+                <m:t>i</m:t>
+              </m:r>
+              <m:r>
+                <m:rPr>
+                  <m:sty m:val="p"/>
+                </m:rPr>
+                <m:t>p</m:t>
+              </m:r>
+              <m:r>
+                <m:rPr>
+                  <m:sty m:val="p"/>
+                </m:rPr>
+                <m:t>e</m:t>
+              </m:r>
+            </m:sub>
+          </m:sSub>
+          <m:r>
+            <m:rPr>
+              <m:sty m:val="p"/>
+            </m:rPr>
+            <m:t>+</m:t>
+          </m:r>
+          <m:sSub>
+            <m:e>
+              <m:r>
+                <m:t>r</m:t>
+              </m:r>
+            </m:e>
+            <m:sub>
+              <m:r>
+                <m:rPr>
+                  <m:sty m:val="p"/>
+                </m:rPr>
+                <m:t>r</m:t>
+              </m:r>
+              <m:r>
+                <m:rPr>
+                  <m:sty m:val="p"/>
+                </m:rPr>
+                <m:t>a</m:t>
+              </m:r>
+              <m:r>
+                <m:rPr>
+                  <m:sty m:val="p"/>
+                </m:rPr>
+                <m:t>d</m:t>
+              </m:r>
+            </m:sub>
+          </m:sSub>
+          <m:r>
+            <m:rPr>
+              <m:sty m:val="p"/>
+            </m:rPr>
+            <m:t>.</m:t>
+          </m:r>
+        </m:oMath>
+      </m:oMathPara>
+    </w:p>
+    <w:p>
+      <w:pPr>
+        <w:pStyle w:val="FirstParagraph"/>
+      </w:pPr>
+      <w:r>
+        <w:t xml:space="preserve">The original budget is</w:t>
+      </w:r>
+      <w:r>
+        <w:t xml:space="preserve"> </w:t>
+      </w:r>
+      <m:oMath>
+        <m:r>
+          <m:t>0.150</m:t>
+        </m:r>
+        <m:r>
+          <m:rPr>
+            <m:sty m:val="p"/>
+          </m:rPr>
+          <m:t>+</m:t>
+        </m:r>
+        <m:r>
+          <m:t>0.020</m:t>
+        </m:r>
+        <m:r>
+          <m:rPr>
+            <m:sty m:val="p"/>
+          </m:rPr>
+          <m:t>+</m:t>
+        </m:r>
+        <m:r>
+          <m:t>0.060</m:t>
+        </m:r>
+        <m:r>
+          <m:rPr>
+            <m:sty m:val="p"/>
+          </m:rPr>
+          <m:t>+</m:t>
+        </m:r>
+        <m:r>
+          <m:t>0.050</m:t>
+        </m:r>
+        <m:r>
+          <m:rPr>
+            <m:sty m:val="p"/>
+          </m:rPr>
+          <m:t>+</m:t>
+        </m:r>
+        <m:r>
+          <m:t>0.020</m:t>
+        </m:r>
+        <m:r>
+          <m:rPr>
+            <m:sty m:val="p"/>
+          </m:rPr>
+          <m:t>=</m:t>
+        </m:r>
+        <m:r>
+          <m:t>0.300</m:t>
+        </m:r>
+        <m:r>
+          <m:t> </m:t>
+        </m:r>
+        <m:r>
+          <m:rPr>
+            <m:sty m:val="p"/>
+          </m:rPr>
+          <m:t>K</m:t>
+        </m:r>
+        <m:r>
+          <m:rPr>
+            <m:sty m:val="p"/>
+          </m:rPr>
+          <m:t>/</m:t>
+        </m:r>
+        <m:r>
+          <m:rPr>
+            <m:sty m:val="p"/>
+          </m:rPr>
+          <m:t>W</m:t>
+        </m:r>
+      </m:oMath>
+      <w:r>
+        <w:t xml:space="preserve"> </w:t>
+      </w:r>
+      <w:r>
+        <w:t xml:space="preserve">after a modest</w:t>
+      </w:r>
+      <w:r>
+        <w:t xml:space="preserve"> </w:t>
+      </w:r>
+      <w:r>
+        <w:t xml:space="preserve">interface and heat-pipe improvement, down from</w:t>
+      </w:r>
+      <w:r>
+        <w:t xml:space="preserve"> </w:t>
+      </w:r>
+      <m:oMath>
+        <m:r>
+          <m:t>0.350</m:t>
+        </m:r>
+        <m:r>
+          <m:t> </m:t>
+        </m:r>
+        <m:r>
+          <m:rPr>
+            <m:sty m:val="p"/>
+          </m:rPr>
+          <m:t>K</m:t>
+        </m:r>
+        <m:r>
+          <m:rPr>
+            <m:sty m:val="p"/>
+          </m:rPr>
+          <m:t>/</m:t>
+        </m:r>
+        <m:r>
+          <m:rPr>
+            <m:sty m:val="p"/>
+          </m:rPr>
+          <m:t>W</m:t>
+        </m:r>
+      </m:oMath>
+      <w:r>
+        <w:t xml:space="preserve"> </w:t>
+      </w:r>
+      <w:r>
+        <w:t xml:space="preserve">before it. The junction-to-case</w:t>
+      </w:r>
+      <w:r>
+        <w:t xml:space="preserve"> </w:t>
+      </w:r>
+      <w:r>
+        <w:t xml:space="preserve">term dominates and is fixed by the package; the terms a designer can influence are the interface</w:t>
+      </w:r>
+      <w:r>
+        <w:t xml:space="preserve"> </w:t>
+      </w:r>
+      <w:r>
+        <w:t xml:space="preserve">material and the heat pipe.</w:t>
+      </w:r>
+    </w:p>
+    <w:p>
+      <w:pPr>
+        <w:pStyle w:val="BodyText"/>
+      </w:pPr>
+      <w:r>
+        <w:rPr>
+          <w:b/>
+          <w:bCs/>
+        </w:rPr>
+        <w:t xml:space="preserve">Junction temperature and the margin.</w:t>
+      </w:r>
+      <w:r>
+        <w:t xml:space="preserve"> </w:t>
+      </w:r>
+      <w:r>
+        <w:t xml:space="preserve">The junction sits above the radiator by the product of</w:t>
+      </w:r>
+      <w:r>
+        <w:t xml:space="preserve"> </w:t>
+      </w:r>
+      <w:r>
+        <w:t xml:space="preserve">per-chip power and chain resistance,</w:t>
+      </w:r>
+    </w:p>
+    <w:p>
+      <w:pPr>
+        <w:pStyle w:val="BodyText"/>
+      </w:pPr>
+      <m:oMathPara>
+        <m:oMathParaPr>
+          <m:jc m:val="center"/>
+        </m:oMathParaPr>
+        <m:oMath>
+          <m:sSub>
+            <m:e>
+              <m:r>
+                <m:t>T</m:t>
+              </m:r>
+            </m:e>
+            <m:sub>
+              <m:r>
+                <m:t>j</m:t>
+              </m:r>
+            </m:sub>
+          </m:sSub>
+          <m:r>
+            <m:rPr>
+              <m:sty m:val="p"/>
+            </m:rPr>
+            <m:t>=</m:t>
+          </m:r>
+          <m:sSub>
+            <m:e>
+              <m:r>
+                <m:t>T</m:t>
+              </m:r>
+            </m:e>
+            <m:sub>
+              <m:r>
+                <m:rPr>
+                  <m:sty m:val="p"/>
+                </m:rPr>
+                <m:t>r</m:t>
+              </m:r>
+              <m:r>
+                <m:rPr>
+                  <m:sty m:val="p"/>
+                </m:rPr>
+                <m:t>a</m:t>
+              </m:r>
+              <m:r>
+                <m:rPr>
+                  <m:sty m:val="p"/>
+                </m:rPr>
+                <m:t>d</m:t>
+              </m:r>
+            </m:sub>
+          </m:sSub>
+          <m:r>
+            <m:rPr>
+              <m:sty m:val="p"/>
+            </m:rPr>
+            <m:t>+</m:t>
+          </m:r>
+          <m:sSub>
+            <m:e>
+              <m:r>
+                <m:t>P</m:t>
+              </m:r>
+            </m:e>
+            <m:sub>
+              <m:r>
+                <m:rPr>
+                  <m:sty m:val="p"/>
+                </m:rPr>
+                <m:t>c</m:t>
+              </m:r>
+              <m:r>
+                <m:rPr>
+                  <m:sty m:val="p"/>
+                </m:rPr>
+                <m:t>h</m:t>
+              </m:r>
+              <m:r>
+                <m:rPr>
+                  <m:sty m:val="p"/>
+                </m:rPr>
+                <m:t>i</m:t>
+              </m:r>
+              <m:r>
+                <m:rPr>
+                  <m:sty m:val="p"/>
+                </m:rPr>
+                <m:t>p</m:t>
+              </m:r>
+            </m:sub>
+          </m:sSub>
+          <m:r>
+            <m:t> </m:t>
+          </m:r>
+          <m:sSub>
+            <m:e>
+              <m:r>
+                <m:t>R</m:t>
+              </m:r>
+            </m:e>
+            <m:sub>
+              <m:r>
+                <m:rPr>
+                  <m:sty m:val="p"/>
+                </m:rPr>
+                <m:t>t</m:t>
+              </m:r>
+              <m:r>
+                <m:rPr>
+                  <m:sty m:val="p"/>
+                </m:rPr>
+                <m:t>h</m:t>
+              </m:r>
+            </m:sub>
+          </m:sSub>
+          <m:r>
+            <m:rPr>
+              <m:sty m:val="p"/>
+            </m:rPr>
+            <m:t>=</m:t>
+          </m:r>
+          <m:r>
+            <m:t>21.3</m:t>
+          </m:r>
+          <m:r>
+            <m:rPr>
+              <m:sty m:val="p"/>
+            </m:rPr>
+            <m:t>+</m:t>
+          </m:r>
+          <m:r>
+            <m:t>300</m:t>
+          </m:r>
+          <m:r>
+            <m:rPr>
+              <m:sty m:val="p"/>
+            </m:rPr>
+            <m:t>×</m:t>
+          </m:r>
+          <m:r>
+            <m:t>0.300</m:t>
+          </m:r>
+          <m:r>
+            <m:rPr>
+              <m:sty m:val="p"/>
+            </m:rPr>
+            <m:t>=</m:t>
+          </m:r>
+          <m:r>
+            <m:t>111.3</m:t>
+          </m:r>
+          <m:sSup>
+            <m:e>
+              <m:r>
+                <m:t> </m:t>
+              </m:r>
+            </m:e>
+            <m:sup>
+              <m:r>
+                <m:rPr>
+                  <m:sty m:val="p"/>
+                </m:rPr>
+                <m:t>∘</m:t>
+              </m:r>
+            </m:sup>
+          </m:sSup>
+          <m:r>
+            <m:rPr>
+              <m:sty m:val="p"/>
+            </m:rPr>
+            <m:t>C</m:t>
+          </m:r>
+          <m:r>
+            <m:rPr>
+              <m:sty m:val="p"/>
+            </m:rPr>
+            <m:t>.</m:t>
+          </m:r>
+        </m:oMath>
+      </m:oMathPara>
+    </w:p>
+    <w:p>
+      <w:pPr>
+        <w:pStyle w:val="FirstParagraph"/>
+      </w:pPr>
+      <w:r>
+        <w:t xml:space="preserve">Against a junction limit of</w:t>
+      </w:r>
+      <w:r>
+        <w:t xml:space="preserve"> </w:t>
+      </w:r>
+      <m:oMath>
+        <m:r>
+          <m:t>125</m:t>
+        </m:r>
+        <m:sSup>
+          <m:e>
+            <m:r>
+              <m:t> </m:t>
+            </m:r>
+          </m:e>
+          <m:sup>
+            <m:r>
+              <m:rPr>
+                <m:sty m:val="p"/>
+              </m:rPr>
+              <m:t>∘</m:t>
+            </m:r>
+          </m:sup>
+        </m:sSup>
+        <m:r>
+          <m:rPr>
+            <m:sty m:val="p"/>
+          </m:rPr>
+          <m:t>C</m:t>
+        </m:r>
+      </m:oMath>
+      <w:r>
+        <w:t xml:space="preserve">, this leaves a margin of</w:t>
+      </w:r>
+      <w:r>
+        <w:t xml:space="preserve"> </w:t>
+      </w:r>
+      <m:oMath>
+        <m:r>
+          <m:t>13.6</m:t>
+        </m:r>
+        <m:sSup>
+          <m:e>
+            <m:r>
+              <m:t> </m:t>
+            </m:r>
+          </m:e>
+          <m:sup>
+            <m:r>
+              <m:rPr>
+                <m:sty m:val="p"/>
+              </m:rPr>
+              <m:t>∘</m:t>
+            </m:r>
+          </m:sup>
+        </m:sSup>
+        <m:r>
+          <m:rPr>
+            <m:sty m:val="p"/>
+          </m:rPr>
+          <m:t>C</m:t>
+        </m:r>
+      </m:oMath>
+      <w:r>
+        <w:t xml:space="preserve">.</w:t>
+      </w:r>
+      <w:r>
+        <w:t xml:space="preserve"> </w:t>
+      </w:r>
+      <w:r>
+        <w:t xml:space="preserve">The case closes, but not by much. The single result that named this study is that margin: passive</w:t>
+      </w:r>
+      <w:r>
+        <w:t xml:space="preserve"> </w:t>
+      </w:r>
+      <w:r>
+        <w:t xml:space="preserve">cooling of a 300-watt-class accelerator at this altitude is feasible, and feasible only with a thin</w:t>
+      </w:r>
+      <w:r>
+        <w:t xml:space="preserve"> </w:t>
+      </w:r>
+      <w:r>
+        <w:t xml:space="preserve">allowance.</w:t>
+      </w:r>
+    </w:p>
+    <w:p>
+      <w:pPr>
+        <w:pStyle w:val="BodyText"/>
+      </w:pPr>
+      <w:r>
+        <w:rPr>
+          <w:b/>
+          <w:bCs/>
+        </w:rPr>
+        <w:t xml:space="preserve">Robustness.</w:t>
+      </w:r>
+      <w:r>
+        <w:t xml:space="preserve"> </w:t>
+      </w:r>
+      <w:r>
+        <w:t xml:space="preserve">A spacecraft thermal path carries redundant heat pipes, so the design must survive one</w:t>
+      </w:r>
+      <w:r>
+        <w:t xml:space="preserve"> </w:t>
+      </w:r>
+      <w:r>
+        <w:t xml:space="preserve">failing. If a single pipe drops out, the pipe resistance rises by about one part in seven, adding</w:t>
+      </w:r>
+      <w:r>
+        <w:t xml:space="preserve"> </w:t>
+      </w:r>
+      <m:oMath>
+        <m:r>
+          <m:t>0.011</m:t>
+        </m:r>
+        <m:r>
+          <m:t> </m:t>
+        </m:r>
+        <m:r>
+          <m:rPr>
+            <m:sty m:val="p"/>
+          </m:rPr>
+          <m:t>K</m:t>
+        </m:r>
+        <m:r>
+          <m:rPr>
+            <m:sty m:val="p"/>
+          </m:rPr>
+          <m:t>/</m:t>
+        </m:r>
+        <m:r>
+          <m:rPr>
+            <m:sty m:val="p"/>
+          </m:rPr>
+          <m:t>W</m:t>
+        </m:r>
+      </m:oMath>
+      <w:r>
+        <w:t xml:space="preserve"> </w:t>
+      </w:r>
+      <w:r>
+        <w:t xml:space="preserve">to the chain,</w:t>
+      </w:r>
+    </w:p>
+    <w:p>
+      <w:pPr>
+        <w:pStyle w:val="BodyText"/>
+      </w:pPr>
+      <m:oMathPara>
+        <m:oMathParaPr>
+          <m:jc m:val="center"/>
+        </m:oMathParaPr>
+        <m:oMath>
+          <m:sSub>
+            <m:e>
+              <m:r>
+                <m:t>R</m:t>
+              </m:r>
+            </m:e>
+            <m:sub>
+              <m:r>
+                <m:rPr>
+                  <m:sty m:val="p"/>
+                </m:rPr>
+                <m:t>f</m:t>
+              </m:r>
+              <m:r>
+                <m:rPr>
+                  <m:sty m:val="p"/>
+                </m:rPr>
+                <m:t>a</m:t>
+              </m:r>
+              <m:r>
+                <m:rPr>
+                  <m:sty m:val="p"/>
+                </m:rPr>
+                <m:t>i</m:t>
+              </m:r>
+              <m:r>
+                <m:rPr>
+                  <m:sty m:val="p"/>
+                </m:rPr>
+                <m:t>l</m:t>
+              </m:r>
+            </m:sub>
+          </m:sSub>
+          <m:r>
+            <m:rPr>
+              <m:sty m:val="p"/>
+            </m:rPr>
+            <m:t>=</m:t>
+          </m:r>
+          <m:sSub>
+            <m:e>
+              <m:r>
+                <m:t>R</m:t>
+              </m:r>
+            </m:e>
+            <m:sub>
+              <m:r>
+                <m:rPr>
+                  <m:sty m:val="p"/>
+                </m:rPr>
+                <m:t>t</m:t>
+              </m:r>
+              <m:r>
+                <m:rPr>
+                  <m:sty m:val="p"/>
+                </m:rPr>
+                <m:t>h</m:t>
+              </m:r>
+            </m:sub>
+          </m:sSub>
+          <m:r>
+            <m:rPr>
+              <m:sty m:val="p"/>
+            </m:rPr>
+            <m:t>+</m:t>
+          </m:r>
+          <m:r>
+            <m:rPr>
+              <m:sty m:val="p"/>
+            </m:rPr>
+            <m:t>Δ</m:t>
+          </m:r>
+          <m:sSub>
+            <m:e>
+              <m:r>
+                <m:t>r</m:t>
+              </m:r>
+            </m:e>
+            <m:sub>
+              <m:r>
+                <m:rPr>
+                  <m:sty m:val="p"/>
+                </m:rPr>
+                <m:t>p</m:t>
+              </m:r>
+              <m:r>
+                <m:rPr>
+                  <m:sty m:val="p"/>
+                </m:rPr>
+                <m:t>i</m:t>
+              </m:r>
+              <m:r>
+                <m:rPr>
+                  <m:sty m:val="p"/>
+                </m:rPr>
+                <m:t>p</m:t>
+              </m:r>
+              <m:r>
+                <m:rPr>
+                  <m:sty m:val="p"/>
+                </m:rPr>
+                <m:t>e</m:t>
+              </m:r>
+            </m:sub>
+          </m:sSub>
+          <m:r>
+            <m:rPr>
+              <m:sty m:val="p"/>
+            </m:rPr>
+            <m:t>=</m:t>
+          </m:r>
+          <m:r>
+            <m:t>0.300</m:t>
+          </m:r>
+          <m:r>
+            <m:rPr>
+              <m:sty m:val="p"/>
+            </m:rPr>
+            <m:t>+</m:t>
+          </m:r>
+          <m:r>
+            <m:t>0.011</m:t>
+          </m:r>
+          <m:r>
+            <m:rPr>
+              <m:sty m:val="p"/>
+            </m:rPr>
+            <m:t>=</m:t>
+          </m:r>
+          <m:r>
+            <m:t>0.311</m:t>
+          </m:r>
+          <m:r>
+            <m:t> </m:t>
+          </m:r>
+          <m:r>
+            <m:rPr>
+              <m:sty m:val="p"/>
+            </m:rPr>
+            <m:t>K</m:t>
+          </m:r>
+          <m:r>
+            <m:rPr>
+              <m:sty m:val="p"/>
+            </m:rPr>
+            <m:t>/</m:t>
+          </m:r>
+          <m:r>
+            <m:rPr>
+              <m:sty m:val="p"/>
+            </m:rPr>
+            <m:t>W</m:t>
+          </m:r>
+          <m:r>
+            <m:rPr>
+              <m:sty m:val="p"/>
+            </m:rPr>
+            <m:t>,</m:t>
+          </m:r>
+          <m:r>
+            <m:t>  </m:t>
+          </m:r>
+          <m:sSub>
+            <m:e>
+              <m:r>
+                <m:t>T</m:t>
+              </m:r>
+            </m:e>
+            <m:sub>
+              <m:r>
+                <m:t>j</m:t>
+              </m:r>
+              <m:r>
+                <m:rPr>
+                  <m:sty m:val="p"/>
+                </m:rPr>
+                <m:t>,</m:t>
+              </m:r>
+              <m:r>
+                <m:rPr>
+                  <m:sty m:val="p"/>
+                </m:rPr>
+                <m:t>f</m:t>
+              </m:r>
+              <m:r>
+                <m:rPr>
+                  <m:sty m:val="p"/>
+                </m:rPr>
+                <m:t>a</m:t>
+              </m:r>
+              <m:r>
+                <m:rPr>
+                  <m:sty m:val="p"/>
+                </m:rPr>
+                <m:t>i</m:t>
+              </m:r>
+              <m:r>
+                <m:rPr>
+                  <m:sty m:val="p"/>
+                </m:rPr>
+                <m:t>l</m:t>
+              </m:r>
+            </m:sub>
+          </m:sSub>
+          <m:r>
+            <m:rPr>
+              <m:sty m:val="p"/>
+            </m:rPr>
+            <m:t>=</m:t>
+          </m:r>
+          <m:sSub>
+            <m:e>
+              <m:r>
+                <m:t>T</m:t>
+              </m:r>
+            </m:e>
+            <m:sub>
+              <m:r>
+                <m:rPr>
+                  <m:sty m:val="p"/>
+                </m:rPr>
+                <m:t>r</m:t>
+              </m:r>
+              <m:r>
+                <m:rPr>
+                  <m:sty m:val="p"/>
+                </m:rPr>
+                <m:t>a</m:t>
+              </m:r>
+              <m:r>
+                <m:rPr>
+                  <m:sty m:val="p"/>
+                </m:rPr>
+                <m:t>d</m:t>
+              </m:r>
+            </m:sub>
+          </m:sSub>
+          <m:r>
+            <m:rPr>
+              <m:sty m:val="p"/>
+            </m:rPr>
+            <m:t>+</m:t>
+          </m:r>
+          <m:sSub>
+            <m:e>
+              <m:r>
+                <m:t>P</m:t>
+              </m:r>
+            </m:e>
+            <m:sub>
+              <m:r>
+                <m:rPr>
+                  <m:sty m:val="p"/>
+                </m:rPr>
+                <m:t>c</m:t>
+              </m:r>
+              <m:r>
+                <m:rPr>
+                  <m:sty m:val="p"/>
+                </m:rPr>
+                <m:t>h</m:t>
+              </m:r>
+              <m:r>
+                <m:rPr>
+                  <m:sty m:val="p"/>
+                </m:rPr>
+                <m:t>i</m:t>
+              </m:r>
+              <m:r>
+                <m:rPr>
+                  <m:sty m:val="p"/>
+                </m:rPr>
+                <m:t>p</m:t>
+              </m:r>
+            </m:sub>
+          </m:sSub>
+          <m:r>
+            <m:t> </m:t>
+          </m:r>
+          <m:sSub>
+            <m:e>
+              <m:r>
+                <m:t>R</m:t>
+              </m:r>
+            </m:e>
+            <m:sub>
+              <m:r>
+                <m:rPr>
+                  <m:sty m:val="p"/>
+                </m:rPr>
+                <m:t>f</m:t>
+              </m:r>
+              <m:r>
+                <m:rPr>
+                  <m:sty m:val="p"/>
+                </m:rPr>
+                <m:t>a</m:t>
+              </m:r>
+              <m:r>
+                <m:rPr>
+                  <m:sty m:val="p"/>
+                </m:rPr>
+                <m:t>i</m:t>
+              </m:r>
+              <m:r>
+                <m:rPr>
+                  <m:sty m:val="p"/>
+                </m:rPr>
+                <m:t>l</m:t>
+              </m:r>
+            </m:sub>
+          </m:sSub>
+          <m:r>
+            <m:rPr>
+              <m:sty m:val="p"/>
+            </m:rPr>
+            <m:t>=</m:t>
+          </m:r>
+          <m:r>
+            <m:t>114.8</m:t>
+          </m:r>
+          <m:sSup>
+            <m:e>
+              <m:r>
+                <m:t> </m:t>
+              </m:r>
+            </m:e>
+            <m:sup>
+              <m:r>
+                <m:rPr>
+                  <m:sty m:val="p"/>
+                </m:rPr>
+                <m:t>∘</m:t>
+              </m:r>
+            </m:sup>
+          </m:sSup>
+          <m:r>
+            <m:rPr>
+              <m:sty m:val="p"/>
+            </m:rPr>
+            <m:t>C</m:t>
+          </m:r>
+          <m:r>
+            <m:rPr>
+              <m:sty m:val="p"/>
+            </m:rPr>
+            <m:t>.</m:t>
+          </m:r>
+        </m:oMath>
+      </m:oMathPara>
+    </w:p>
+    <w:p>
+      <w:pPr>
+        <w:pStyle w:val="FirstParagraph"/>
+      </w:pPr>
+      <w:r>
+        <w:t xml:space="preserve">The junction climbs to</w:t>
+      </w:r>
+      <w:r>
+        <w:t xml:space="preserve"> </w:t>
+      </w:r>
+      <m:oMath>
+        <m:r>
+          <m:t>114.8</m:t>
+        </m:r>
+        <m:sSup>
+          <m:e>
+            <m:r>
+              <m:t> </m:t>
+            </m:r>
+          </m:e>
+          <m:sup>
+            <m:r>
+              <m:rPr>
+                <m:sty m:val="p"/>
+              </m:rPr>
+              <m:t>∘</m:t>
+            </m:r>
+          </m:sup>
+        </m:sSup>
+        <m:r>
+          <m:rPr>
+            <m:sty m:val="p"/>
+          </m:rPr>
+          <m:t>C</m:t>
+        </m:r>
+      </m:oMath>
+      <w:r>
+        <w:t xml:space="preserve">, so the margin narrows to about ten degrees but stays</w:t>
+      </w:r>
+      <w:r>
+        <w:t xml:space="preserve"> </w:t>
+      </w:r>
+      <w:r>
+        <w:t xml:space="preserve">positive. The single-fault case survives.</w:t>
+      </w:r>
+    </w:p>
+    <w:p>
+      <w:pPr>
+        <w:pStyle w:val="BodyText"/>
+      </w:pPr>
+      <w:r>
+        <w:rPr>
+          <w:b/>
+          <w:bCs/>
+        </w:rPr>
+        <w:t xml:space="preserve">What the study did and did not establish.</w:t>
+      </w:r>
+      <w:r>
+        <w:t xml:space="preserve"> </w:t>
+      </w:r>
+      <w:r>
+        <w:t xml:space="preserve">Three caveats travel with this result, and they set the</w:t>
+      </w:r>
+      <w:r>
+        <w:t xml:space="preserve"> </w:t>
+      </w:r>
+      <w:r>
+        <w:t xml:space="preserve">agenda for the rest of the book. First, the per-chip power was taken as 300 watts; the actual figure for</w:t>
+      </w:r>
+      <w:r>
+        <w:t xml:space="preserve"> </w:t>
+      </w:r>
+      <w:r>
+        <w:t xml:space="preserve">the reference accelerator is undisclosed and is more plausibly in the 150-to-200-watt range, in which</w:t>
+      </w:r>
+      <w:r>
+        <w:t xml:space="preserve"> </w:t>
+      </w:r>
+      <w:r>
+        <w:t xml:space="preserve">case the junction sits well below the limit and the margin is larger, not smaller. The 300-watt case is</w:t>
+      </w:r>
+      <w:r>
+        <w:t xml:space="preserve"> </w:t>
+      </w:r>
+      <w:r>
+        <w:t xml:space="preserve">therefore conservative. Second, and pointing the other way, the analysis is a single-node steady state;</w:t>
+      </w:r>
+      <w:r>
+        <w:t xml:space="preserve"> </w:t>
+      </w:r>
+      <w:r>
+        <w:t xml:space="preserve">it does not by itself address the sharper wall that appears as per-chip power rises, where above roughly</w:t>
+      </w:r>
+      <w:r>
+        <w:t xml:space="preserve"> </w:t>
+      </w:r>
+      <w:r>
+        <w:t xml:space="preserve">400 watts the interface term alone overruns the entire budget and a passive chain can no longer cope, a</w:t>
+      </w:r>
+      <w:r>
+        <w:t xml:space="preserve"> </w:t>
+      </w:r>
+      <w:r>
+        <w:t xml:space="preserve">point developed in Chapter 10. Third, the original study was candid that the thermal case being feasible</w:t>
+      </w:r>
+      <w:r>
+        <w:t xml:space="preserve"> </w:t>
+      </w:r>
+      <w:r>
+        <w:t xml:space="preserve">does not make the system economical: its own break-even analysis was negative, which is exactly the</w:t>
+      </w:r>
+      <w:r>
+        <w:t xml:space="preserve"> </w:t>
+      </w:r>
+      <w:r>
+        <w:t xml:space="preserve">question Chapter 22 takes up in detail. The thin margin and the per-chip ceiling are what motivated the</w:t>
+      </w:r>
+      <w:r>
+        <w:t xml:space="preserve"> </w:t>
+      </w:r>
+      <w:r>
+        <w:t xml:space="preserve">full survivability, integration, and economic treatment that makes up the remainder of this book.</w:t>
+      </w:r>
+    </w:p>
+    <w:bookmarkEnd w:id="18"/>
+    <w:bookmarkStart w:id="19" w:name="reference-architecture-and-scope"/>
+    <w:p>
+      <w:pPr>
+        <w:pStyle w:val="Heading2"/>
+      </w:pPr>
+      <w:r>
+        <w:t xml:space="preserve">3. Reference architecture and scope</w:t>
+      </w:r>
+    </w:p>
+    <w:p>
+      <w:pPr>
+        <w:pStyle w:val="FirstParagraph"/>
+      </w:pPr>
+      <w:r>
+        <w:t xml:space="preserve">Throughout this analysis the reference design follows the Suncatcher parameters: a dawn-dusk</w:t>
+      </w:r>
+      <w:r>
+        <w:t xml:space="preserve"> </w:t>
+      </w:r>
+      <w:r>
+        <w:t xml:space="preserve">sun-synchronous orbit at 650 km, an eighty-one-satellite cluster of one-kilometer radius, and</w:t>
+      </w:r>
+      <w:r>
+        <w:t xml:space="preserve"> </w:t>
+      </w:r>
+      <w:r>
+        <w:t xml:space="preserve">inter-satellite spacing of roughly 150 m. The reference satellite bus is taken to carry four</w:t>
+      </w:r>
+      <w:r>
+        <w:t xml:space="preserve"> </w:t>
+      </w:r>
+      <w:r>
+        <w:t xml:space="preserve">accelerators with an avionics and support complement, consistent with the mass budget developed in</w:t>
+      </w:r>
+      <w:r>
+        <w:t xml:space="preserve"> </w:t>
+      </w:r>
+      <w:r>
+        <w:t xml:space="preserve">Chapter 12. Where the analysis examines higher-power chips (NVIDIA H100 at 700 W, B200 at 1000 W,</w:t>
+      </w:r>
+      <w:r>
+        <w:t xml:space="preserve"> </w:t>
+      </w:r>
+      <w:r>
+        <w:t xml:space="preserve">the GB200 GPU at 1200 W), it does so to test the scaling of each subsystem, because the trend in AI</w:t>
+      </w:r>
+      <w:r>
+        <w:t xml:space="preserve"> </w:t>
+      </w:r>
+      <w:r>
+        <w:t xml:space="preserve">accelerators is toward higher, not lower, per-chip power.</w:t>
+      </w:r>
+    </w:p>
+    <w:p>
+      <w:pPr>
+        <w:pStyle w:val="BodyText"/>
+      </w:pPr>
+      <w:r>
         <w:t xml:space="preserve">The scope of the models is conceptual to preliminary design (Phase A in aerospace terms). The</w:t>
       </w:r>
       <w:r>
@@ -3676,8 +5675,8 @@
         </w:pict>
       </w:r>
     </w:p>
-    <w:bookmarkEnd w:id="18"/>
-    <w:bookmarkStart w:id="19" w:name="Xfc230b641c8ac1af95bb2946bc374ee51dc38ae"/>
+    <w:bookmarkEnd w:id="19"/>
+    <w:bookmarkStart w:id="20" w:name="Xfc230b641c8ac1af95bb2946bc374ee51dc38ae"/>
     <w:p>
       <w:pPr>
         <w:pStyle w:val="Heading2"/>
@@ -4628,9 +6627,9 @@
         </w:pict>
       </w:r>
     </w:p>
-    <w:bookmarkEnd w:id="19"/>
     <w:bookmarkEnd w:id="20"/>
-    <w:bookmarkStart w:id="36" w:name="part-ii-the-orbital-environment"/>
+    <w:bookmarkEnd w:id="21"/>
+    <w:bookmarkStart w:id="37" w:name="part-ii-the-orbital-environment"/>
     <w:p>
       <w:pPr>
         <w:pStyle w:val="Heading1"/>
@@ -4639,7 +6638,7 @@
         <w:t xml:space="preserve">PART II, THE ORBITAL ENVIRONMENT</w:t>
       </w:r>
     </w:p>
-    <w:bookmarkStart w:id="21" w:name="orbital-mechanics-of-a-circular-orbit"/>
+    <w:bookmarkStart w:id="22" w:name="orbital-mechanics-of-a-circular-orbit"/>
     <w:p>
       <w:pPr>
         <w:pStyle w:val="Heading2"/>
@@ -5708,8 +7707,8 @@
         <w:t xml:space="preserve">.</w:t>
       </w:r>
     </w:p>
-    <w:bookmarkEnd w:id="21"/>
-    <w:bookmarkStart w:id="22" w:name="sun-synchronous-orbits-and-j2-precession"/>
+    <w:bookmarkEnd w:id="22"/>
+    <w:bookmarkStart w:id="23" w:name="sun-synchronous-orbits-and-j2-precession"/>
     <w:p>
       <w:pPr>
         <w:pStyle w:val="Heading2"/>
@@ -7781,8 +9780,8 @@
         <w:t xml:space="preserve">cycling, a decisive advantage for a high-power, thermally sensitive payload.</w:t>
       </w:r>
     </w:p>
-    <w:bookmarkEnd w:id="22"/>
-    <w:bookmarkStart w:id="26" w:name="X5d8eb5df9ce872601c783d8f232c04d346f88c7"/>
+    <w:bookmarkEnd w:id="23"/>
+    <w:bookmarkStart w:id="27" w:name="X5d8eb5df9ce872601c783d8f232c04d346f88c7"/>
     <w:p>
       <w:pPr>
         <w:pStyle w:val="Heading2"/>
@@ -9505,18 +11504,18 @@
           <wp:inline>
             <wp:extent cx="5334000" cy="2456668"/>
             <wp:effectExtent b="0" l="0" r="0" t="0"/>
-            <wp:docPr descr="Fig. 6.1 Critical beta angle versus altitude, and eclipse fraction versus beta at 650 km. A dawn-dusk orbit holds the beta angle high, so the satellite stays sunlit." title="" id="24" name="Picture"/>
+            <wp:docPr descr="Fig. 6.1 Critical beta angle versus altitude, and eclipse fraction versus beta at 650 km. A dawn-dusk orbit holds the beta angle high, so the satellite stays sunlit." title="" id="25" name="Picture"/>
             <a:graphic>
               <a:graphicData uri="http://schemas.openxmlformats.org/drawingml/2006/picture">
                 <pic:pic>
                   <pic:nvPicPr>
-                    <pic:cNvPr descr="figures2/figA1_eclipse.png" id="25" name="Picture"/>
+                    <pic:cNvPr descr="figures2/figA1_eclipse.png" id="26" name="Picture"/>
                     <pic:cNvPicPr>
                       <a:picLocks noChangeArrowheads="1" noChangeAspect="1"/>
                     </pic:cNvPicPr>
                   </pic:nvPicPr>
                   <pic:blipFill>
-                    <a:blip r:embed="rId23"/>
+                    <a:blip r:embed="rId24"/>
                     <a:stretch>
                       <a:fillRect/>
                     </a:stretch>
@@ -9551,8 +11550,8 @@
         <w:t xml:space="preserve">Fig. 6.1 Critical beta angle versus altitude, and eclipse fraction versus beta at 650 km. A dawn-dusk orbit holds the beta angle high, so the satellite stays sunlit.</w:t>
       </w:r>
     </w:p>
-    <w:bookmarkEnd w:id="26"/>
-    <w:bookmarkStart w:id="30" w:name="the-neutral-atmosphere-and-orbital-decay"/>
+    <w:bookmarkEnd w:id="27"/>
+    <w:bookmarkStart w:id="31" w:name="the-neutral-atmosphere-and-orbital-decay"/>
     <w:p>
       <w:pPr>
         <w:pStyle w:val="Heading2"/>
@@ -11071,18 +13070,18 @@
           <wp:inline>
             <wp:extent cx="5334000" cy="3698864"/>
             <wp:effectExtent b="0" l="0" r="0" t="0"/>
-            <wp:docPr descr="Fig. 7.1, Natural orbital lifetime versus altitude with the solar-cycle uncertainty band; at 650 km the realistic lifetime fails the five-year disposal rule." title="" id="28" name="Picture"/>
+            <wp:docPr descr="Fig. 7.1, Natural orbital lifetime versus altitude with the solar-cycle uncertainty band; at 650 km the realistic lifetime fails the five-year disposal rule." title="" id="29" name="Picture"/>
             <a:graphic>
               <a:graphicData uri="http://schemas.openxmlformats.org/drawingml/2006/picture">
                 <pic:pic>
                   <pic:nvPicPr>
-                    <pic:cNvPr descr="figures/fig1_orbital_decay.png" id="29" name="Picture"/>
+                    <pic:cNvPr descr="figures/fig1_orbital_decay.png" id="30" name="Picture"/>
                     <pic:cNvPicPr>
                       <a:picLocks noChangeArrowheads="1" noChangeAspect="1"/>
                     </pic:cNvPicPr>
                   </pic:nvPicPr>
                   <pic:blipFill>
-                    <a:blip r:embed="rId27"/>
+                    <a:blip r:embed="rId28"/>
                     <a:stretch>
                       <a:fillRect/>
                     </a:stretch>
@@ -11117,8 +13116,8 @@
         <w:t xml:space="preserve">Fig. 7.1, Natural orbital lifetime versus altitude with the solar-cycle uncertainty band; at 650 km the realistic lifetime fails the five-year disposal rule.</w:t>
       </w:r>
     </w:p>
-    <w:bookmarkEnd w:id="30"/>
-    <w:bookmarkStart w:id="34" w:name="the-ionizing-radiation-environment"/>
+    <w:bookmarkEnd w:id="31"/>
+    <w:bookmarkStart w:id="35" w:name="the-ionizing-radiation-environment"/>
     <w:p>
       <w:pPr>
         <w:pStyle w:val="Heading2"/>
@@ -11445,18 +13444,18 @@
           <wp:inline>
             <wp:extent cx="5334000" cy="3427984"/>
             <wp:effectExtent b="0" l="0" r="0" t="0"/>
-            <wp:docPr descr="Fig. 8.1 Cumulative five-year ionizing dose versus aluminium shielding, with the memory tolerance and the mission requirement marked. Ten millimeters of aluminium keeps the dose well below the first-irregularity threshold." title="" id="32" name="Picture"/>
+            <wp:docPr descr="Fig. 8.1 Cumulative five-year ionizing dose versus aluminium shielding, with the memory tolerance and the mission requirement marked. Ten millimeters of aluminium keeps the dose well below the first-irregularity threshold." title="" id="33" name="Picture"/>
             <a:graphic>
               <a:graphicData uri="http://schemas.openxmlformats.org/drawingml/2006/picture">
                 <pic:pic>
                   <pic:nvPicPr>
-                    <pic:cNvPr descr="figures2/figA5_dose.png" id="33" name="Picture"/>
+                    <pic:cNvPr descr="figures2/figA5_dose.png" id="34" name="Picture"/>
                     <pic:cNvPicPr>
                       <a:picLocks noChangeArrowheads="1" noChangeAspect="1"/>
                     </pic:cNvPicPr>
                   </pic:nvPicPr>
                   <pic:blipFill>
-                    <a:blip r:embed="rId31"/>
+                    <a:blip r:embed="rId32"/>
                     <a:stretch>
                       <a:fillRect/>
                     </a:stretch>
@@ -11661,8 +13660,8 @@
         <w:t xml:space="preserve">twenty percent, which must be carried explicitly in any efficiency figure.</w:t>
       </w:r>
     </w:p>
-    <w:bookmarkEnd w:id="34"/>
-    <w:bookmarkStart w:id="35" w:name="the-orbital-debris-environment"/>
+    <w:bookmarkEnd w:id="35"/>
+    <w:bookmarkStart w:id="36" w:name="the-orbital-debris-environment"/>
     <w:p>
       <w:pPr>
         <w:pStyle w:val="Heading2"/>
@@ -12270,9 +14269,9 @@
         </w:pict>
       </w:r>
     </w:p>
-    <w:bookmarkEnd w:id="35"/>
     <w:bookmarkEnd w:id="36"/>
-    <w:bookmarkStart w:id="75" w:name="part-iii-spacecraft-subsystems"/>
+    <w:bookmarkEnd w:id="37"/>
+    <w:bookmarkStart w:id="76" w:name="part-iii-spacecraft-subsystems"/>
     <w:p>
       <w:pPr>
         <w:pStyle w:val="Heading1"/>
@@ -12281,7 +14280,7 @@
         <w:t xml:space="preserve">PART III, SPACECRAFT SUBSYSTEMS</w:t>
       </w:r>
     </w:p>
-    <w:bookmarkStart w:id="46" w:name="thermal-control"/>
+    <w:bookmarkStart w:id="47" w:name="thermal-control"/>
     <w:p>
       <w:pPr>
         <w:pStyle w:val="Heading2"/>
@@ -13735,18 +15734,18 @@
           <wp:inline>
             <wp:extent cx="5334000" cy="2456668"/>
             <wp:effectExtent b="0" l="0" r="0" t="0"/>
-            <wp:docPr descr="Fig. 10.1 Radiator equilibrium temperature versus heat flux, and the radiator area required for one megawatt versus operating temperature. Running hotter reduces area at the cost of silicon lifetime." title="" id="38" name="Picture"/>
+            <wp:docPr descr="Fig. 10.1 Radiator equilibrium temperature versus heat flux, and the radiator area required for one megawatt versus operating temperature. Running hotter reduces area at the cost of silicon lifetime." title="" id="39" name="Picture"/>
             <a:graphic>
               <a:graphicData uri="http://schemas.openxmlformats.org/drawingml/2006/picture">
                 <pic:pic>
                   <pic:nvPicPr>
-                    <pic:cNvPr descr="figures2/figA3_radiator.png" id="39" name="Picture"/>
+                    <pic:cNvPr descr="figures2/figA3_radiator.png" id="40" name="Picture"/>
                     <pic:cNvPicPr>
                       <a:picLocks noChangeArrowheads="1" noChangeAspect="1"/>
                     </pic:cNvPicPr>
                   </pic:nvPicPr>
                   <pic:blipFill>
-                    <a:blip r:embed="rId37"/>
+                    <a:blip r:embed="rId38"/>
                     <a:stretch>
                       <a:fillRect/>
                     </a:stretch>
@@ -14233,18 +16232,18 @@
           <wp:inline>
             <wp:extent cx="5334000" cy="2459772"/>
             <wp:effectExtent b="0" l="0" r="0" t="0"/>
-            <wp:docPr descr="Fig. 10.2 Earth view factor versus altitude, and the combined albedo, Earth-infrared, and solar load on a four-square-meter surface. External loads set the parasitic fraction in the radiator sizing." title="" id="41" name="Picture"/>
+            <wp:docPr descr="Fig. 10.2 Earth view factor versus altitude, and the combined albedo, Earth-infrared, and solar load on a four-square-meter surface. External loads set the parasitic fraction in the radiator sizing." title="" id="42" name="Picture"/>
             <a:graphic>
               <a:graphicData uri="http://schemas.openxmlformats.org/drawingml/2006/picture">
                 <pic:pic>
                   <pic:nvPicPr>
-                    <pic:cNvPr descr="figures2/figA2_loads.png" id="42" name="Picture"/>
+                    <pic:cNvPr descr="figures2/figA2_loads.png" id="43" name="Picture"/>
                     <pic:cNvPicPr>
                       <a:picLocks noChangeArrowheads="1" noChangeAspect="1"/>
                     </pic:cNvPicPr>
                   </pic:nvPicPr>
                   <pic:blipFill>
-                    <a:blip r:embed="rId40"/>
+                    <a:blip r:embed="rId41"/>
                     <a:stretch>
                       <a:fillRect/>
                     </a:stretch>
@@ -14799,18 +16798,18 @@
           <wp:inline>
             <wp:extent cx="5334000" cy="3459634"/>
             <wp:effectExtent b="0" l="0" r="0" t="0"/>
-            <wp:docPr descr="Fig. 10.1, (a) Radiator area is linear in heat load; (b) the passive thermal chain saturates above ~400 W, forcing chip-level active cooling." title="" id="44" name="Picture"/>
+            <wp:docPr descr="Fig. 10.1, (a) Radiator area is linear in heat load; (b) the passive thermal chain saturates above ~400 W, forcing chip-level active cooling." title="" id="45" name="Picture"/>
             <a:graphic>
               <a:graphicData uri="http://schemas.openxmlformats.org/drawingml/2006/picture">
                 <pic:pic>
                   <pic:nvPicPr>
-                    <pic:cNvPr descr="figures/fig2_thermal_wall.png" id="45" name="Picture"/>
+                    <pic:cNvPr descr="figures/fig2_thermal_wall.png" id="46" name="Picture"/>
                     <pic:cNvPicPr>
                       <a:picLocks noChangeArrowheads="1" noChangeAspect="1"/>
                     </pic:cNvPicPr>
                   </pic:nvPicPr>
                   <pic:blipFill>
-                    <a:blip r:embed="rId43"/>
+                    <a:blip r:embed="rId44"/>
                     <a:stretch>
                       <a:fillRect/>
                     </a:stretch>
@@ -14845,8 +16844,8 @@
         <w:t xml:space="preserve">Fig. 10.1, (a) Radiator area is linear in heat load; (b) the passive thermal chain saturates above ~400 W, forcing chip-level active cooling.</w:t>
       </w:r>
     </w:p>
-    <w:bookmarkEnd w:id="46"/>
-    <w:bookmarkStart w:id="50" w:name="electrical-power"/>
+    <w:bookmarkEnd w:id="47"/>
+    <w:bookmarkStart w:id="51" w:name="electrical-power"/>
     <w:p>
       <w:pPr>
         <w:pStyle w:val="Heading2"/>
@@ -15871,18 +17870,18 @@
           <wp:inline>
             <wp:extent cx="5334000" cy="2608107"/>
             <wp:effectExtent b="0" l="0" r="0" t="0"/>
-            <wp:docPr descr="Fig. 11.1, Array area versus load, and triple-junction degradation over the mission." title="" id="48" name="Picture"/>
+            <wp:docPr descr="Fig. 11.1, Array area versus load, and triple-junction degradation over the mission." title="" id="49" name="Picture"/>
             <a:graphic>
               <a:graphicData uri="http://schemas.openxmlformats.org/drawingml/2006/picture">
                 <pic:pic>
                   <pic:nvPicPr>
-                    <pic:cNvPr descr="systems_figs/fig_power.png" id="49" name="Picture"/>
+                    <pic:cNvPr descr="systems_figs/fig_power.png" id="50" name="Picture"/>
                     <pic:cNvPicPr>
                       <a:picLocks noChangeArrowheads="1" noChangeAspect="1"/>
                     </pic:cNvPicPr>
                   </pic:nvPicPr>
                   <pic:blipFill>
-                    <a:blip r:embed="rId47"/>
+                    <a:blip r:embed="rId48"/>
                     <a:stretch>
                       <a:fillRect/>
                     </a:stretch>
@@ -15917,8 +17916,8 @@
         <w:t xml:space="preserve">Fig. 11.1, Array area versus load, and triple-junction degradation over the mission.</w:t>
       </w:r>
     </w:p>
-    <w:bookmarkEnd w:id="50"/>
-    <w:bookmarkStart w:id="54" w:name="structures-and-mass"/>
+    <w:bookmarkEnd w:id="51"/>
+    <w:bookmarkStart w:id="55" w:name="structures-and-mass"/>
     <w:p>
       <w:pPr>
         <w:pStyle w:val="Heading2"/>
@@ -16792,18 +18791,18 @@
           <wp:inline>
             <wp:extent cx="5334000" cy="4681880"/>
             <wp:effectExtent b="0" l="0" r="0" t="0"/>
-            <wp:docPr descr="Fig. 12.1 Reference satellite dry-mass breakdown by subsystem, closed self-consistently by the integrated model." title="" id="52" name="Picture"/>
+            <wp:docPr descr="Fig. 12.1 Reference satellite dry-mass breakdown by subsystem, closed self-consistently by the integrated model." title="" id="53" name="Picture"/>
             <a:graphic>
               <a:graphicData uri="http://schemas.openxmlformats.org/drawingml/2006/picture">
                 <pic:pic>
                   <pic:nvPicPr>
-                    <pic:cNvPr descr="figures2/figA8_mass.png" id="53" name="Picture"/>
+                    <pic:cNvPr descr="figures2/figA8_mass.png" id="54" name="Picture"/>
                     <pic:cNvPicPr>
                       <a:picLocks noChangeArrowheads="1" noChangeAspect="1"/>
                     </pic:cNvPicPr>
                   </pic:nvPicPr>
                   <pic:blipFill>
-                    <a:blip r:embed="rId51"/>
+                    <a:blip r:embed="rId52"/>
                     <a:stretch>
                       <a:fillRect/>
                     </a:stretch>
@@ -16838,8 +18837,8 @@
         <w:t xml:space="preserve">Fig. 12.1 Reference satellite dry-mass breakdown by subsystem, closed self-consistently by the integrated model.</w:t>
       </w:r>
     </w:p>
-    <w:bookmarkEnd w:id="54"/>
-    <w:bookmarkStart w:id="55" w:name="X63cb9f37665b9f150c1577425ead9308a982ab3"/>
+    <w:bookmarkEnd w:id="55"/>
+    <w:bookmarkStart w:id="56" w:name="X63cb9f37665b9f150c1577425ead9308a982ab3"/>
     <w:p>
       <w:pPr>
         <w:pStyle w:val="Heading2"/>
@@ -17563,8 +19562,8 @@
         <w:t xml:space="preserve">link and any long inter-satellite hop.</w:t>
       </w:r>
     </w:p>
-    <w:bookmarkEnd w:id="55"/>
-    <w:bookmarkStart w:id="62" w:name="X6ae4c679d3cd8d01d6fb60e2d3c40a4ea80d1a8"/>
+    <w:bookmarkEnd w:id="56"/>
+    <w:bookmarkStart w:id="63" w:name="X6ae4c679d3cd8d01d6fb60e2d3c40a4ea80d1a8"/>
     <w:p>
       <w:pPr>
         <w:pStyle w:val="Heading2"/>
@@ -18120,18 +20119,18 @@
           <wp:inline>
             <wp:extent cx="5334000" cy="2456668"/>
             <wp:effectExtent b="0" l="0" r="0" t="0"/>
-            <wp:docPr descr="Fig. 14.2 Transmit power required to hold a three-decibel link margin versus range, against the one-watt terminal limit, and the pointing-loss sensitivity to jitter. Range and pointing together force the tight formation." title="" id="57" name="Picture"/>
+            <wp:docPr descr="Fig. 14.2 Transmit power required to hold a three-decibel link margin versus range, against the one-watt terminal limit, and the pointing-loss sensitivity to jitter. Range and pointing together force the tight formation." title="" id="58" name="Picture"/>
             <a:graphic>
               <a:graphicData uri="http://schemas.openxmlformats.org/drawingml/2006/picture">
                 <pic:pic>
                   <pic:nvPicPr>
-                    <pic:cNvPr descr="figures2/figA4_link.png" id="58" name="Picture"/>
+                    <pic:cNvPr descr="figures2/figA4_link.png" id="59" name="Picture"/>
                     <pic:cNvPicPr>
                       <a:picLocks noChangeArrowheads="1" noChangeAspect="1"/>
                     </pic:cNvPicPr>
                   </pic:nvPicPr>
                   <pic:blipFill>
-                    <a:blip r:embed="rId56"/>
+                    <a:blip r:embed="rId57"/>
                     <a:stretch>
                       <a:fillRect/>
                     </a:stretch>
@@ -18708,18 +20707,18 @@
           <wp:inline>
             <wp:extent cx="5334000" cy="2604741"/>
             <wp:effectExtent b="0" l="0" r="0" t="0"/>
-            <wp:docPr descr="Fig. 14.1, Inter-satellite free-space loss versus range and pointing-loss sensitivity." title="" id="60" name="Picture"/>
+            <wp:docPr descr="Fig. 14.1, Inter-satellite free-space loss versus range and pointing-loss sensitivity." title="" id="61" name="Picture"/>
             <a:graphic>
               <a:graphicData uri="http://schemas.openxmlformats.org/drawingml/2006/picture">
                 <pic:pic>
                   <pic:nvPicPr>
-                    <pic:cNvPr descr="systems_figs/fig_comms.png" id="61" name="Picture"/>
+                    <pic:cNvPr descr="systems_figs/fig_comms.png" id="62" name="Picture"/>
                     <pic:cNvPicPr>
                       <a:picLocks noChangeArrowheads="1" noChangeAspect="1"/>
                     </pic:cNvPicPr>
                   </pic:nvPicPr>
                   <pic:blipFill>
-                    <a:blip r:embed="rId59"/>
+                    <a:blip r:embed="rId60"/>
                     <a:stretch>
                       <a:fillRect/>
                     </a:stretch>
@@ -18754,8 +20753,8 @@
         <w:t xml:space="preserve">Fig. 14.1, Inter-satellite free-space loss versus range and pointing-loss sensitivity.</w:t>
       </w:r>
     </w:p>
-    <w:bookmarkEnd w:id="62"/>
-    <w:bookmarkStart w:id="66" w:name="propulsion-and-end-of-life-disposal"/>
+    <w:bookmarkEnd w:id="63"/>
+    <w:bookmarkStart w:id="67" w:name="propulsion-and-end-of-life-disposal"/>
     <w:p>
       <w:pPr>
         <w:pStyle w:val="Heading2"/>
@@ -19825,18 +21824,18 @@
           <wp:inline>
             <wp:extent cx="5334000" cy="3251761"/>
             <wp:effectExtent b="0" l="0" r="0" t="0"/>
-            <wp:docPr descr="Fig. 15.1, Per-satellite Δv budget (de-orbit dominates) and propellant mass by propulsion type." title="" id="64" name="Picture"/>
+            <wp:docPr descr="Fig. 15.1, Per-satellite Δv budget (de-orbit dominates) and propellant mass by propulsion type." title="" id="65" name="Picture"/>
             <a:graphic>
               <a:graphicData uri="http://schemas.openxmlformats.org/drawingml/2006/picture">
                 <pic:pic>
                   <pic:nvPicPr>
-                    <pic:cNvPr descr="figures/fig5_deltav.png" id="65" name="Picture"/>
+                    <pic:cNvPr descr="figures/fig5_deltav.png" id="66" name="Picture"/>
                     <pic:cNvPicPr>
                       <a:picLocks noChangeArrowheads="1" noChangeAspect="1"/>
                     </pic:cNvPicPr>
                   </pic:nvPicPr>
                   <pic:blipFill>
-                    <a:blip r:embed="rId63"/>
+                    <a:blip r:embed="rId64"/>
                     <a:stretch>
                       <a:fillRect/>
                     </a:stretch>
@@ -19871,8 +21870,8 @@
         <w:t xml:space="preserve">Fig. 15.1, Per-satellite Δv budget (de-orbit dominates) and propellant mass by propulsion type.</w:t>
       </w:r>
     </w:p>
-    <w:bookmarkEnd w:id="66"/>
-    <w:bookmarkStart w:id="70" w:name="X72d468b889d4049fe64ab25e8d7aac33b521080"/>
+    <w:bookmarkEnd w:id="67"/>
+    <w:bookmarkStart w:id="71" w:name="X72d468b889d4049fe64ab25e8d7aac33b521080"/>
     <w:p>
       <w:pPr>
         <w:pStyle w:val="Heading2"/>
@@ -21483,18 +23482,18 @@
           <wp:inline>
             <wp:extent cx="5334000" cy="2604741"/>
             <wp:effectExtent b="0" l="0" r="0" t="0"/>
-            <wp:docPr descr="Fig. 16.1, Per-node reliability versus time and the over-provisioning needed to hold capacity." title="" id="68" name="Picture"/>
+            <wp:docPr descr="Fig. 16.1, Per-node reliability versus time and the over-provisioning needed to hold capacity." title="" id="69" name="Picture"/>
             <a:graphic>
               <a:graphicData uri="http://schemas.openxmlformats.org/drawingml/2006/picture">
                 <pic:pic>
                   <pic:nvPicPr>
-                    <pic:cNvPr descr="systems_figs/fig_reliability.png" id="69" name="Picture"/>
+                    <pic:cNvPr descr="systems_figs/fig_reliability.png" id="70" name="Picture"/>
                     <pic:cNvPicPr>
                       <a:picLocks noChangeArrowheads="1" noChangeAspect="1"/>
                     </pic:cNvPicPr>
                   </pic:nvPicPr>
                   <pic:blipFill>
-                    <a:blip r:embed="rId67"/>
+                    <a:blip r:embed="rId68"/>
                     <a:stretch>
                       <a:fillRect/>
                     </a:stretch>
@@ -21529,8 +23528,8 @@
         <w:t xml:space="preserve">Fig. 16.1, Per-node reliability versus time and the over-provisioning needed to hold capacity.</w:t>
       </w:r>
     </w:p>
-    <w:bookmarkEnd w:id="70"/>
-    <w:bookmarkStart w:id="74" w:name="compute-and-workload"/>
+    <w:bookmarkEnd w:id="71"/>
+    <w:bookmarkStart w:id="75" w:name="compute-and-workload"/>
     <w:p>
       <w:pPr>
         <w:pStyle w:val="Heading2"/>
@@ -22028,18 +24027,18 @@
           <wp:inline>
             <wp:extent cx="5334000" cy="4019504"/>
             <wp:effectExtent b="0" l="0" r="0" t="0"/>
-            <wp:docPr descr="Fig. 17.1, Added subsystems: passive thermal-throttle by chip, ground-station site diversity, latency crossover, and the discounted-cash-flow breakeven." title="" id="72" name="Picture"/>
+            <wp:docPr descr="Fig. 17.1, Added subsystems: passive thermal-throttle by chip, ground-station site diversity, latency crossover, and the discounted-cash-flow breakeven." title="" id="73" name="Picture"/>
             <a:graphic>
               <a:graphicData uri="http://schemas.openxmlformats.org/drawingml/2006/picture">
                 <pic:pic>
                   <pic:nvPicPr>
-                    <pic:cNvPr descr="systems_figs/fig_new_subsystems.png" id="73" name="Picture"/>
+                    <pic:cNvPr descr="systems_figs/fig_new_subsystems.png" id="74" name="Picture"/>
                     <pic:cNvPicPr>
                       <a:picLocks noChangeArrowheads="1" noChangeAspect="1"/>
                     </pic:cNvPicPr>
                   </pic:nvPicPr>
                   <pic:blipFill>
-                    <a:blip r:embed="rId71"/>
+                    <a:blip r:embed="rId72"/>
                     <a:stretch>
                       <a:fillRect/>
                     </a:stretch>
@@ -22081,9 +24080,9 @@
         </w:pict>
       </w:r>
     </w:p>
-    <w:bookmarkEnd w:id="74"/>
     <w:bookmarkEnd w:id="75"/>
-    <w:bookmarkStart w:id="92" w:name="Xe5ea88703363ae012ea2f87a0aad981517e6b12"/>
+    <w:bookmarkEnd w:id="76"/>
+    <w:bookmarkStart w:id="93" w:name="Xe5ea88703363ae012ea2f87a0aad981517e6b12"/>
     <w:p>
       <w:pPr>
         <w:pStyle w:val="Heading1"/>
@@ -22092,7 +24091,7 @@
         <w:t xml:space="preserve">PART IV, INTEGRATION, SIMULATION, AND RESULTS</w:t>
       </w:r>
     </w:p>
-    <w:bookmarkStart w:id="79" w:name="the-integrated-system-model"/>
+    <w:bookmarkStart w:id="80" w:name="the-integrated-system-model"/>
     <w:p>
       <w:pPr>
         <w:pStyle w:val="Heading2"/>
@@ -22242,18 +24241,18 @@
           <wp:inline>
             <wp:extent cx="5334000" cy="3797310"/>
             <wp:effectExtent b="0" l="0" r="0" t="0"/>
-            <wp:docPr descr="Fig. 18.1, Integrated dry-mass budget, closed self-consistently by the system model." title="" id="77" name="Picture"/>
+            <wp:docPr descr="Fig. 18.1, Integrated dry-mass budget, closed self-consistently by the system model." title="" id="78" name="Picture"/>
             <a:graphic>
               <a:graphicData uri="http://schemas.openxmlformats.org/drawingml/2006/picture">
                 <pic:pic>
                   <pic:nvPicPr>
-                    <pic:cNvPr descr="systems_figs/fig_mass_budget.png" id="78" name="Picture"/>
+                    <pic:cNvPr descr="systems_figs/fig_mass_budget.png" id="79" name="Picture"/>
                     <pic:cNvPicPr>
                       <a:picLocks noChangeArrowheads="1" noChangeAspect="1"/>
                     </pic:cNvPicPr>
                   </pic:nvPicPr>
                   <pic:blipFill>
-                    <a:blip r:embed="rId76"/>
+                    <a:blip r:embed="rId77"/>
                     <a:stretch>
                       <a:fillRect/>
                     </a:stretch>
@@ -22288,8 +24287,8 @@
         <w:t xml:space="preserve">Fig. 18.1, Integrated dry-mass budget, closed self-consistently by the system model.</w:t>
       </w:r>
     </w:p>
-    <w:bookmarkEnd w:id="79"/>
-    <w:bookmarkStart w:id="80" w:name="Xfed2044479baa4c639d53a9e82ee4edbe317219"/>
+    <w:bookmarkEnd w:id="80"/>
+    <w:bookmarkStart w:id="81" w:name="Xfed2044479baa4c639d53a9e82ee4edbe317219"/>
     <w:p>
       <w:pPr>
         <w:pStyle w:val="Heading2"/>
@@ -23594,8 +25593,8 @@
         <w:t xml:space="preserve">and the figures are produced by the same code that a reader can run.</w:t>
       </w:r>
     </w:p>
-    <w:bookmarkEnd w:id="80"/>
-    <w:bookmarkStart w:id="84" w:name="X23f703a5b3167e168d574605adab1b76f34ca68"/>
+    <w:bookmarkEnd w:id="81"/>
+    <w:bookmarkStart w:id="85" w:name="X23f703a5b3167e168d574605adab1b76f34ca68"/>
     <w:p>
       <w:pPr>
         <w:pStyle w:val="Heading2"/>
@@ -24160,18 +26159,18 @@
           <wp:inline>
             <wp:extent cx="5334000" cy="1886737"/>
             <wp:effectExtent b="0" l="0" r="0" t="0"/>
-            <wp:docPr descr="Fig. 19.1, Monte-Carlo distributions of natural lifetime, debris probability, and total Δv across the dominant uncertainties." title="" id="82" name="Picture"/>
+            <wp:docPr descr="Fig. 19.1, Monte-Carlo distributions of natural lifetime, debris probability, and total Δv across the dominant uncertainties." title="" id="83" name="Picture"/>
             <a:graphic>
               <a:graphicData uri="http://schemas.openxmlformats.org/drawingml/2006/picture">
                 <pic:pic>
                   <pic:nvPicPr>
-                    <pic:cNvPr descr="systems_figs/fig_montecarlo.png" id="83" name="Picture"/>
+                    <pic:cNvPr descr="systems_figs/fig_montecarlo.png" id="84" name="Picture"/>
                     <pic:cNvPicPr>
                       <a:picLocks noChangeArrowheads="1" noChangeAspect="1"/>
                     </pic:cNvPicPr>
                   </pic:nvPicPr>
                   <pic:blipFill>
-                    <a:blip r:embed="rId81"/>
+                    <a:blip r:embed="rId82"/>
                     <a:stretch>
                       <a:fillRect/>
                     </a:stretch>
@@ -24206,8 +26205,8 @@
         <w:t xml:space="preserve">Fig. 19.1, Monte-Carlo distributions of natural lifetime, debris probability, and total Δv across the dominant uncertainties.</w:t>
       </w:r>
     </w:p>
-    <w:bookmarkEnd w:id="84"/>
-    <w:bookmarkStart w:id="91" w:name="X75af3e2abfcdea4ef8ecf50a29bce1e8bc901aa"/>
+    <w:bookmarkEnd w:id="85"/>
+    <w:bookmarkStart w:id="92" w:name="X75af3e2abfcdea4ef8ecf50a29bce1e8bc901aa"/>
     <w:p>
       <w:pPr>
         <w:pStyle w:val="Heading2"/>
@@ -24672,18 +26671,18 @@
           <wp:inline>
             <wp:extent cx="5334000" cy="3291840"/>
             <wp:effectExtent b="0" l="0" r="0" t="0"/>
-            <wp:docPr descr="Fig. 20.1, Catastrophic debris risk for the full cluster, and the in-cluster cascade coupling versus formation spacing." title="" id="86" name="Picture"/>
+            <wp:docPr descr="Fig. 20.1, Catastrophic debris risk for the full cluster, and the in-cluster cascade coupling versus formation spacing." title="" id="87" name="Picture"/>
             <a:graphic>
               <a:graphicData uri="http://schemas.openxmlformats.org/drawingml/2006/picture">
                 <pic:pic>
                   <pic:nvPicPr>
-                    <pic:cNvPr descr="figures/fig3_debris_risk.png" id="87" name="Picture"/>
+                    <pic:cNvPr descr="figures/fig3_debris_risk.png" id="88" name="Picture"/>
                     <pic:cNvPicPr>
                       <a:picLocks noChangeArrowheads="1" noChangeAspect="1"/>
                     </pic:cNvPicPr>
                   </pic:nvPicPr>
                   <pic:blipFill>
-                    <a:blip r:embed="rId85"/>
+                    <a:blip r:embed="rId86"/>
                     <a:stretch>
                       <a:fillRect/>
                     </a:stretch>
@@ -24727,18 +26726,18 @@
           <wp:inline>
             <wp:extent cx="5334000" cy="3554885"/>
             <wp:effectExtent b="0" l="0" r="0" t="0"/>
-            <wp:docPr descr="Fig. 20.2, Cumulative dose versus aluminium shielding, and the reliability-throughput trade." title="" id="89" name="Picture"/>
+            <wp:docPr descr="Fig. 20.2, Cumulative dose versus aluminium shielding, and the reliability-throughput trade." title="" id="90" name="Picture"/>
             <a:graphic>
               <a:graphicData uri="http://schemas.openxmlformats.org/drawingml/2006/picture">
                 <pic:pic>
                   <pic:nvPicPr>
-                    <pic:cNvPr descr="figures/fig4_radiation.png" id="90" name="Picture"/>
+                    <pic:cNvPr descr="figures/fig4_radiation.png" id="91" name="Picture"/>
                     <pic:cNvPicPr>
                       <a:picLocks noChangeArrowheads="1" noChangeAspect="1"/>
                     </pic:cNvPicPr>
                   </pic:nvPicPr>
                   <pic:blipFill>
-                    <a:blip r:embed="rId88"/>
+                    <a:blip r:embed="rId89"/>
                     <a:stretch>
                       <a:fillRect/>
                     </a:stretch>
@@ -24780,9 +26779,9 @@
         </w:pict>
       </w:r>
     </w:p>
-    <w:bookmarkEnd w:id="91"/>
     <w:bookmarkEnd w:id="92"/>
-    <w:bookmarkStart w:id="105" w:name="part-v-economics-and-predictions"/>
+    <w:bookmarkEnd w:id="93"/>
+    <w:bookmarkStart w:id="106" w:name="part-v-economics-and-predictions"/>
     <w:p>
       <w:pPr>
         <w:pStyle w:val="Heading1"/>
@@ -24791,7 +26790,7 @@
         <w:t xml:space="preserve">PART V, ECONOMICS AND PREDICTIONS</w:t>
       </w:r>
     </w:p>
-    <w:bookmarkStart w:id="99" w:name="X2e3f63e059a4787a3738c8a944d90eb01378ed4"/>
+    <w:bookmarkStart w:id="100" w:name="X2e3f63e059a4787a3738c8a944d90eb01378ed4"/>
     <w:p>
       <w:pPr>
         <w:pStyle w:val="Heading2"/>
@@ -25727,18 +27726,18 @@
           <wp:inline>
             <wp:extent cx="5334000" cy="2458219"/>
             <wp:effectExtent b="0" l="0" r="0" t="0"/>
-            <wp:docPr descr="Fig. 21.1b Levelized cost of useful compute versus model-FLOPs utilization, and versus launch price. The cost is dominated by utilization and hardware, not by launch." title="" id="94" name="Picture"/>
+            <wp:docPr descr="Fig. 21.1b Levelized cost of useful compute versus model-FLOPs utilization, and versus launch price. The cost is dominated by utilization and hardware, not by launch." title="" id="95" name="Picture"/>
             <a:graphic>
               <a:graphicData uri="http://schemas.openxmlformats.org/drawingml/2006/picture">
                 <pic:pic>
                   <pic:nvPicPr>
-                    <pic:cNvPr descr="figures2/figA7_lcoe.png" id="95" name="Picture"/>
+                    <pic:cNvPr descr="figures2/figA7_lcoe.png" id="96" name="Picture"/>
                     <pic:cNvPicPr>
                       <a:picLocks noChangeArrowheads="1" noChangeAspect="1"/>
                     </pic:cNvPicPr>
                   </pic:nvPicPr>
                   <pic:blipFill>
-                    <a:blip r:embed="rId93"/>
+                    <a:blip r:embed="rId94"/>
                     <a:stretch>
                       <a:fillRect/>
                     </a:stretch>
@@ -25782,18 +27781,18 @@
           <wp:inline>
             <wp:extent cx="5334000" cy="2604741"/>
             <wp:effectExtent b="0" l="0" r="0" t="0"/>
-            <wp:docPr descr="Fig. 21.1, Cost of useful compute versus utilization, and the radiation throughput tax by protection level." title="" id="97" name="Picture"/>
+            <wp:docPr descr="Fig. 21.1, Cost of useful compute versus utilization, and the radiation throughput tax by protection level." title="" id="98" name="Picture"/>
             <a:graphic>
               <a:graphicData uri="http://schemas.openxmlformats.org/drawingml/2006/picture">
                 <pic:pic>
                   <pic:nvPicPr>
-                    <pic:cNvPr descr="systems_figs/fig_compute.png" id="98" name="Picture"/>
+                    <pic:cNvPr descr="systems_figs/fig_compute.png" id="99" name="Picture"/>
                     <pic:cNvPicPr>
                       <a:picLocks noChangeArrowheads="1" noChangeAspect="1"/>
                     </pic:cNvPicPr>
                   </pic:nvPicPr>
                   <pic:blipFill>
-                    <a:blip r:embed="rId96"/>
+                    <a:blip r:embed="rId97"/>
                     <a:stretch>
                       <a:fillRect/>
                     </a:stretch>
@@ -25828,8 +27827,8 @@
         <w:t xml:space="preserve">Fig. 21.1, Cost of useful compute versus utilization, and the radiation throughput tax by protection level.</w:t>
       </w:r>
     </w:p>
-    <w:bookmarkEnd w:id="99"/>
-    <w:bookmarkStart w:id="103" w:name="the-launch-cost-parity-prediction"/>
+    <w:bookmarkEnd w:id="100"/>
+    <w:bookmarkStart w:id="104" w:name="the-launch-cost-parity-prediction"/>
     <w:p>
       <w:pPr>
         <w:pStyle w:val="Heading2"/>
@@ -26015,18 +28014,18 @@
           <wp:inline>
             <wp:extent cx="5334000" cy="2619768"/>
             <wp:effectExtent b="0" l="0" r="0" t="0"/>
-            <wp:docPr descr="Fig. 22.1, Launch-cost learning curve (Monte-Carlo) and the distribution of the cost-parity year. Most sampled scenarios never reach 200 dollars per kilogram within the horizon; conditional on those that do, the median is near 2044, later than the vendor’s 2035." title="" id="101" name="Picture"/>
+            <wp:docPr descr="Fig. 22.1, Launch-cost learning curve (Monte-Carlo) and the distribution of the cost-parity year. Most sampled scenarios never reach 200 dollars per kilogram within the horizon; conditional on those that do, the median is near 2044, later than the vendor’s 2035." title="" id="102" name="Picture"/>
             <a:graphic>
               <a:graphicData uri="http://schemas.openxmlformats.org/drawingml/2006/picture">
                 <pic:pic>
                   <pic:nvPicPr>
-                    <pic:cNvPr descr="figures_pred/fig_cost_parity.png" id="102" name="Picture"/>
+                    <pic:cNvPr descr="figures_pred/fig_cost_parity.png" id="103" name="Picture"/>
                     <pic:cNvPicPr>
                       <a:picLocks noChangeArrowheads="1" noChangeAspect="1"/>
                     </pic:cNvPicPr>
                   </pic:nvPicPr>
                   <pic:blipFill>
-                    <a:blip r:embed="rId100"/>
+                    <a:blip r:embed="rId101"/>
                     <a:stretch>
                       <a:fillRect/>
                     </a:stretch>
@@ -26061,8 +28060,8 @@
         <w:t xml:space="preserve">Fig. 22.1, Launch-cost learning curve (Monte-Carlo) and the distribution of the cost-parity year. Most sampled scenarios never reach 200 dollars per kilogram within the horizon; conditional on those that do, the median is near 2044, later than the vendor’s 2035.</w:t>
       </w:r>
     </w:p>
-    <w:bookmarkEnd w:id="103"/>
-    <w:bookmarkStart w:id="104" w:name="capability-and-risk-trajectory-2027-2035"/>
+    <w:bookmarkEnd w:id="104"/>
+    <w:bookmarkStart w:id="105" w:name="capability-and-risk-trajectory-2027-2035"/>
     <w:p>
       <w:pPr>
         <w:pStyle w:val="Heading2"/>
@@ -26166,9 +28165,9 @@
         </w:pict>
       </w:r>
     </w:p>
-    <w:bookmarkEnd w:id="104"/>
     <w:bookmarkEnd w:id="105"/>
-    <w:bookmarkStart w:id="111" w:name="part-vi-synthesis"/>
+    <w:bookmarkEnd w:id="106"/>
+    <w:bookmarkStart w:id="112" w:name="part-vi-synthesis"/>
     <w:p>
       <w:pPr>
         <w:pStyle w:val="Heading1"/>
@@ -26177,7 +28176,7 @@
         <w:t xml:space="preserve">PART VI, SYNTHESIS</w:t>
       </w:r>
     </w:p>
-    <w:bookmarkStart w:id="106" w:name="caveats-and-limitations"/>
+    <w:bookmarkStart w:id="107" w:name="caveats-and-limitations"/>
     <w:p>
       <w:pPr>
         <w:pStyle w:val="Heading2"/>
@@ -26309,8 +28308,8 @@
         <w:t xml:space="preserve">number should be quoted, and they identify exactly where higher-fidelity work is needed next.</w:t>
       </w:r>
     </w:p>
-    <w:bookmarkEnd w:id="106"/>
-    <w:bookmarkStart w:id="110" w:name="X112718272980ce9d8db030edbf2c8e56c96c038"/>
+    <w:bookmarkEnd w:id="107"/>
+    <w:bookmarkStart w:id="111" w:name="X112718272980ce9d8db030edbf2c8e56c96c038"/>
     <w:p>
       <w:pPr>
         <w:pStyle w:val="Heading2"/>
@@ -26446,18 +28445,18 @@
           <wp:inline>
             <wp:extent cx="5334000" cy="4249493"/>
             <wp:effectExtent b="0" l="0" r="0" t="0"/>
-            <wp:docPr descr="Fig. 25.1, Systems-level risk matrix: cooling is solved; debris, disposal, and economics are the open items." title="" id="108" name="Picture"/>
+            <wp:docPr descr="Fig. 25.1, Systems-level risk matrix: cooling is solved; debris, disposal, and economics are the open items." title="" id="109" name="Picture"/>
             <a:graphic>
               <a:graphicData uri="http://schemas.openxmlformats.org/drawingml/2006/picture">
                 <pic:pic>
                   <pic:nvPicPr>
-                    <pic:cNvPr descr="figures/fig7_risk_matrix.png" id="109" name="Picture"/>
+                    <pic:cNvPr descr="figures/fig7_risk_matrix.png" id="110" name="Picture"/>
                     <pic:cNvPicPr>
                       <a:picLocks noChangeArrowheads="1" noChangeAspect="1"/>
                     </pic:cNvPicPr>
                   </pic:nvPicPr>
                   <pic:blipFill>
-                    <a:blip r:embed="rId107"/>
+                    <a:blip r:embed="rId108"/>
                     <a:stretch>
                       <a:fillRect/>
                     </a:stretch>
@@ -26506,9 +28505,9 @@
         </w:pict>
       </w:r>
     </w:p>
-    <w:bookmarkEnd w:id="110"/>
     <w:bookmarkEnd w:id="111"/>
-    <w:bookmarkStart w:id="116" w:name="X2849ac850b034a4af8859258c8c59481bcc0a0d"/>
+    <w:bookmarkEnd w:id="112"/>
+    <w:bookmarkStart w:id="117" w:name="X2849ac850b034a4af8859258c8c59481bcc0a0d"/>
     <w:p>
       <w:pPr>
         <w:pStyle w:val="Heading1"/>
@@ -26517,7 +28516,7 @@
         <w:t xml:space="preserve">PART VII, DETAILED RESULTS, DATA, AND WORKED COMPUTATIONS</w:t>
       </w:r>
     </w:p>
-    <w:bookmarkStart w:id="112" w:name="a-worked-end-to-end-computation"/>
+    <w:bookmarkStart w:id="113" w:name="a-worked-end-to-end-computation"/>
     <w:p>
       <w:pPr>
         <w:pStyle w:val="Heading2"/>
@@ -26668,8 +28667,8 @@
         <w:t xml:space="preserve">produced by the open code and is reproduced by the validation suite.</w:t>
       </w:r>
     </w:p>
-    <w:bookmarkEnd w:id="112"/>
-    <w:bookmarkStart w:id="113" w:name="detailed-results-tables"/>
+    <w:bookmarkEnd w:id="113"/>
+    <w:bookmarkStart w:id="114" w:name="detailed-results-tables"/>
     <w:p>
       <w:pPr>
         <w:pStyle w:val="Heading2"/>
@@ -30372,8 +32371,8 @@
         </w:tc>
       </w:tr>
     </w:tbl>
-    <w:bookmarkEnd w:id="113"/>
-    <w:bookmarkStart w:id="114" w:name="X4ef80d11b7a22aeebf52f8f551fc1d287f74ce6"/>
+    <w:bookmarkEnd w:id="114"/>
+    <w:bookmarkStart w:id="115" w:name="X4ef80d11b7a22aeebf52f8f551fc1d287f74ce6"/>
     <w:p>
       <w:pPr>
         <w:pStyle w:val="Heading2"/>
@@ -30822,8 +32821,8 @@
         <w:t xml:space="preserve">problem at this density, and it is the operational face of the formation paradox.</w:t>
       </w:r>
     </w:p>
-    <w:bookmarkEnd w:id="114"/>
-    <w:bookmarkStart w:id="115" w:name="comparison-with-terrestrial-data-centers"/>
+    <w:bookmarkEnd w:id="115"/>
+    <w:bookmarkStart w:id="116" w:name="comparison-with-terrestrial-data-centers"/>
     <w:p>
       <w:pPr>
         <w:pStyle w:val="Heading2"/>
@@ -31296,9 +33295,9 @@
         </w:pict>
       </w:r>
     </w:p>
-    <w:bookmarkEnd w:id="115"/>
     <w:bookmarkEnd w:id="116"/>
-    <w:bookmarkStart w:id="131" w:name="back-matter"/>
+    <w:bookmarkEnd w:id="117"/>
+    <w:bookmarkStart w:id="132" w:name="back-matter"/>
     <w:p>
       <w:pPr>
         <w:pStyle w:val="Heading1"/>
@@ -31307,7 +33306,7 @@
         <w:t xml:space="preserve">Back matter</w:t>
       </w:r>
     </w:p>
-    <w:bookmarkStart w:id="117" w:name="references"/>
+    <w:bookmarkStart w:id="118" w:name="references"/>
     <w:p>
       <w:pPr>
         <w:pStyle w:val="Heading2"/>
@@ -32339,8 +34338,8 @@
         <w:t xml:space="preserve">launch records, for the launch-cadence and cost-trajectory inputs of Chapter 22.</w:t>
       </w:r>
     </w:p>
-    <w:bookmarkEnd w:id="117"/>
-    <w:bookmarkStart w:id="118" w:name="Xa5f5759fad9159c193908c5014e5f5066c880b0"/>
+    <w:bookmarkEnd w:id="118"/>
+    <w:bookmarkStart w:id="119" w:name="Xa5f5759fad9159c193908c5014e5f5066c880b0"/>
     <w:p>
       <w:pPr>
         <w:pStyle w:val="Heading2"/>
@@ -34825,8 +36824,8 @@
         </w:tc>
       </w:tr>
     </w:tbl>
-    <w:bookmarkEnd w:id="118"/>
-    <w:bookmarkStart w:id="119" w:name="appendix-b-nomenclature"/>
+    <w:bookmarkEnd w:id="119"/>
+    <w:bookmarkStart w:id="120" w:name="appendix-b-nomenclature"/>
     <w:p>
       <w:pPr>
         <w:pStyle w:val="Heading2"/>
@@ -34849,8 +36848,8 @@
         <w:t xml:space="preserve">there with its units.</w:t>
       </w:r>
     </w:p>
-    <w:bookmarkEnd w:id="119"/>
-    <w:bookmarkStart w:id="120" w:name="appendix-c-data-sources-and-confidence"/>
+    <w:bookmarkEnd w:id="120"/>
+    <w:bookmarkStart w:id="121" w:name="appendix-c-data-sources-and-confidence"/>
     <w:p>
       <w:pPr>
         <w:pStyle w:val="Heading2"/>
@@ -34903,8 +36902,8 @@
         <w:t xml:space="preserve">1-mm-to-1-cm debris flux is the least model-validated quantity.</w:t>
       </w:r>
     </w:p>
-    <w:bookmarkEnd w:id="120"/>
-    <w:bookmarkStart w:id="121" w:name="appendix-d-reproduction-and-code"/>
+    <w:bookmarkEnd w:id="121"/>
+    <w:bookmarkStart w:id="122" w:name="appendix-d-reproduction-and-code"/>
     <w:p>
       <w:pPr>
         <w:pStyle w:val="Heading2"/>
@@ -36823,8 +38822,8 @@
         <w:t xml:space="preserve"> util)</w:t>
       </w:r>
     </w:p>
-    <w:bookmarkEnd w:id="121"/>
-    <w:bookmarkStart w:id="130" w:name="appendix-e-extended-derivations"/>
+    <w:bookmarkEnd w:id="122"/>
+    <w:bookmarkStart w:id="131" w:name="appendix-e-extended-derivations"/>
     <w:p>
       <w:pPr>
         <w:pStyle w:val="Heading2"/>
@@ -36847,7 +38846,7 @@
         <w:t xml:space="preserve">the main text, so that the volume is mathematically self-contained.</w:t>
       </w:r>
     </w:p>
-    <w:bookmarkStart w:id="122" w:name="X2a80dffde1cc8eefa78dcdbda3d88a45fd72945"/>
+    <w:bookmarkStart w:id="123" w:name="X2a80dffde1cc8eefa78dcdbda3d88a45fd72945"/>
     <w:p>
       <w:pPr>
         <w:pStyle w:val="Heading3"/>
@@ -37970,8 +39969,8 @@
         <w:t xml:space="preserve">fundamental constants. This is the foundation of every radiator result in Chapter 10.</w:t>
       </w:r>
     </w:p>
-    <w:bookmarkEnd w:id="122"/>
-    <w:bookmarkStart w:id="123" w:name="X4c20d6d59466b0830aef63d21b34b7838499df3"/>
+    <w:bookmarkEnd w:id="123"/>
+    <w:bookmarkStart w:id="124" w:name="X4c20d6d59466b0830aef63d21b34b7838499df3"/>
     <w:p>
       <w:pPr>
         <w:pStyle w:val="Heading3"/>
@@ -38782,8 +40781,8 @@
         <w:t xml:space="preserve">debris impacts.</w:t>
       </w:r>
     </w:p>
-    <w:bookmarkEnd w:id="123"/>
-    <w:bookmarkStart w:id="124" w:name="Xdbf318ef9ef49d2256131d87dbdb96f21a45420"/>
+    <w:bookmarkEnd w:id="124"/>
+    <w:bookmarkStart w:id="125" w:name="Xdbf318ef9ef49d2256131d87dbdb96f21a45420"/>
     <w:p>
       <w:pPr>
         <w:pStyle w:val="Heading3"/>
@@ -39738,8 +41737,8 @@
         <w:t xml:space="preserve">re-entry within one or two orbits, satisfying the disposal requirement.</w:t>
       </w:r>
     </w:p>
-    <w:bookmarkEnd w:id="124"/>
-    <w:bookmarkStart w:id="125" w:name="X67de4cda1ab68499f29ee0b2ccb5ff91efedb0e"/>
+    <w:bookmarkEnd w:id="125"/>
+    <w:bookmarkStart w:id="126" w:name="X67de4cda1ab68499f29ee0b2ccb5ff91efedb0e"/>
     <w:p>
       <w:pPr>
         <w:pStyle w:val="Heading3"/>
@@ -40266,8 +42265,8 @@
         <w:t xml:space="preserve">discussed in Chapter 28 and the reason the formation needs active relative control.</w:t>
       </w:r>
     </w:p>
-    <w:bookmarkEnd w:id="125"/>
-    <w:bookmarkStart w:id="126" w:name="e.5-the-rocket-equation"/>
+    <w:bookmarkEnd w:id="126"/>
+    <w:bookmarkStart w:id="127" w:name="e.5-the-rocket-equation"/>
     <w:p>
       <w:pPr>
         <w:pStyle w:val="Heading3"/>
@@ -40987,8 +42986,8 @@
         <w:t xml:space="preserve">propulsion) so dramatically reduces propellant mass for a given Δv.</w:t>
       </w:r>
     </w:p>
-    <w:bookmarkEnd w:id="126"/>
-    <w:bookmarkStart w:id="127" w:name="e.6-k-of-n-redundancy"/>
+    <w:bookmarkEnd w:id="127"/>
+    <w:bookmarkStart w:id="128" w:name="e.6-k-of-n-redundancy"/>
     <w:p>
       <w:pPr>
         <w:pStyle w:val="Heading3"/>
@@ -41350,8 +43349,8 @@
         <w:t xml:space="preserve">satellite and the over-provisioned satellites within a cluster (Chapter 16).</w:t>
       </w:r>
     </w:p>
-    <w:bookmarkEnd w:id="127"/>
-    <w:bookmarkStart w:id="128" w:name="X1e2c0797711e5a38d867b0034b661cf8291a89f"/>
+    <w:bookmarkEnd w:id="128"/>
+    <w:bookmarkStart w:id="129" w:name="X1e2c0797711e5a38d867b0034b661cf8291a89f"/>
     <w:p>
       <w:pPr>
         <w:pStyle w:val="Heading3"/>
@@ -42016,8 +44015,8 @@
         <w:t xml:space="preserve">K in two to four steps.</w:t>
       </w:r>
     </w:p>
-    <w:bookmarkEnd w:id="128"/>
-    <w:bookmarkStart w:id="129" w:name="e.8-the-capital-recovery-factor"/>
+    <w:bookmarkEnd w:id="129"/>
+    <w:bookmarkStart w:id="130" w:name="e.8-the-capital-recovery-factor"/>
     <w:p>
       <w:pPr>
         <w:pStyle w:val="Heading3"/>
@@ -42450,9 +44449,9 @@
         <w:t xml:space="preserve">End of report.</w:t>
       </w:r>
     </w:p>
-    <w:bookmarkEnd w:id="129"/>
     <w:bookmarkEnd w:id="130"/>
     <w:bookmarkEnd w:id="131"/>
+    <w:bookmarkEnd w:id="132"/>
     <w:sectPr>
       <w:footnotePr>
         <w:numRestart w:val="eachSect"/>

</xml_diff>

<commit_message>
Add per-chapter Sources citations to 15 more chapters
Sources lines now on 22 chapters (3A,5,6,11,12,13,15,16,17,18,18A,19,21,22,28
added; 4,7,8,9,10,14,2A already had them), each citing the relevant entries in
the 35-source bibliography. Book and report rebuilt; scans clean.
</commit_message>
<xml_diff>
--- a/report/Report_II_Complete.docx
+++ b/report/Report_II_Complete.docx
@@ -5690,6 +5690,18 @@
         <w:pStyle w:val="FirstParagraph"/>
       </w:pPr>
       <w:r>
+        <w:rPr>
+          <w:i/>
+          <w:iCs/>
+        </w:rPr>
+        <w:t xml:space="preserve">Sources: margin and readiness practice from the NASA Systems Engineering Handbook [13], AIAA S-120 [14], the Goddard concurrent-design practice [15], and the SMAD systems text [18].</w:t>
+      </w:r>
+    </w:p>
+    <w:p>
+      <w:pPr>
+        <w:pStyle w:val="BodyText"/>
+      </w:pPr>
+      <w:r>
         <w:t xml:space="preserve">A conceptual design is judged not only by its point estimates but by the allowances it carries</w:t>
       </w:r>
       <w:r>
@@ -7722,6 +7734,18 @@
         <w:pStyle w:val="FirstParagraph"/>
       </w:pPr>
       <w:r>
+        <w:rPr>
+          <w:i/>
+          <w:iCs/>
+        </w:rPr>
+        <w:t xml:space="preserve">Sources: the J2 secular precession and the sun-synchronous condition follow Vallado [17] and Curtis [16].</w:t>
+      </w:r>
+    </w:p>
+    <w:p>
+      <w:pPr>
+        <w:pStyle w:val="BodyText"/>
+      </w:pPr>
+      <w:r>
         <w:t xml:space="preserve">A sun-synchronous orbit maintains a near-constant orientation relative to the Sun by exploiting</w:t>
       </w:r>
       <w:r>
@@ -9793,6 +9817,18 @@
     <w:p>
       <w:pPr>
         <w:pStyle w:val="FirstParagraph"/>
+      </w:pPr>
+      <w:r>
+        <w:rPr>
+          <w:i/>
+          <w:iCs/>
+        </w:rPr>
+        <w:t xml:space="preserve">Sources: the beta-angle and eclipse-fraction geometry follow Curtis [16] and the SMAD mission-design text [18].</w:t>
+      </w:r>
+    </w:p>
+    <w:p>
+      <w:pPr>
+        <w:pStyle w:val="BodyText"/>
       </w:pPr>
       <w:r>
         <w:t xml:space="preserve">The fraction of each orbit spent in Earth’s shadow is set by the beta angle</w:t>
@@ -16859,6 +16895,18 @@
         <w:pStyle w:val="FirstParagraph"/>
       </w:pPr>
       <w:r>
+        <w:rPr>
+          <w:i/>
+          <w:iCs/>
+        </w:rPr>
+        <w:t xml:space="preserve">Sources: solar-array and power-budget sizing from SMAD [18] and the Gilmore handbook [20]; cell and battery parameters from vendor datasheets [12].</w:t>
+      </w:r>
+    </w:p>
+    <w:p>
+      <w:pPr>
+        <w:pStyle w:val="BodyText"/>
+      </w:pPr>
+      <w:r>
         <w:t xml:space="preserve">The power subsystem converts sunlight to usable electrical power and buffers the brief eclipse.</w:t>
       </w:r>
     </w:p>
@@ -17929,6 +17977,18 @@
     <w:p>
       <w:pPr>
         <w:pStyle w:val="FirstParagraph"/>
+      </w:pPr>
+      <w:r>
+        <w:rPr>
+          <w:i/>
+          <w:iCs/>
+        </w:rPr>
+        <w:t xml:space="preserve">Sources: mass-growth allowances from AIAA S-120 [14]; structural and modal relations from SMAD [18] and Sidi [33].</w:t>
+      </w:r>
+    </w:p>
+    <w:p>
+      <w:pPr>
+        <w:pStyle w:val="BodyText"/>
       </w:pPr>
       <w:r>
         <w:t xml:space="preserve">The structure carries launch loads, sets the spacecraft inertia (which feeds attitude control), and</w:t>
@@ -18852,6 +18912,18 @@
         <w:pStyle w:val="FirstParagraph"/>
       </w:pPr>
       <w:r>
+        <w:rPr>
+          <w:i/>
+          <w:iCs/>
+        </w:rPr>
+        <w:t xml:space="preserve">Sources: attitude dynamics and control from Wertz [32] and Sidi [33]; optical-pointing requirements from Hemmati [30].</w:t>
+      </w:r>
+    </w:p>
+    <w:p>
+      <w:pPr>
+        <w:pStyle w:val="BodyText"/>
+      </w:pPr>
+      <w:r>
         <w:t xml:space="preserve">The attitude subsystem must hold the bus steady against disturbance torques and, far more</w:t>
       </w:r>
       <w:r>
@@ -20766,6 +20838,18 @@
     <w:p>
       <w:pPr>
         <w:pStyle w:val="FirstParagraph"/>
+      </w:pPr>
+      <w:r>
+        <w:rPr>
+          <w:i/>
+          <w:iCs/>
+        </w:rPr>
+        <w:t xml:space="preserve">Sources: the rocket equation and propulsion sizing from Sutton and Biblarz [31]; the Hohmann de-orbit from Curtis [16]; the disposal requirement from FCC 22-74 [7].</w:t>
+      </w:r>
+    </w:p>
+    <w:p>
+      <w:pPr>
+        <w:pStyle w:val="BodyText"/>
       </w:pPr>
       <w:r>
         <w:t xml:space="preserve">Propulsion must make up drag, maintain the formation, enable collision avoidance, and, decisively,</w:t>
@@ -21885,6 +21969,18 @@
         <w:pStyle w:val="FirstParagraph"/>
       </w:pPr>
       <w:r>
+        <w:rPr>
+          <w:i/>
+          <w:iCs/>
+        </w:rPr>
+        <w:t xml:space="preserve">Sources: reliability and redundancy methods from the SMAD systems texts [18, 19].</w:t>
+      </w:r>
+    </w:p>
+    <w:p>
+      <w:pPr>
+        <w:pStyle w:val="BodyText"/>
+      </w:pPr>
+      <w:r>
         <w:t xml:space="preserve">Because no satellite can be repaired in orbit, reliability must be designed in and availability</w:t>
       </w:r>
       <w:r>
@@ -23543,6 +23639,18 @@
         <w:pStyle w:val="FirstParagraph"/>
       </w:pPr>
       <w:r>
+        <w:rPr>
+          <w:i/>
+          <w:iCs/>
+        </w:rPr>
+        <w:t xml:space="preserve">Sources: accelerator throughput and power from vendor documentation [12]; the workload and utilization model from the reference architecture [1].</w:t>
+      </w:r>
+    </w:p>
+    <w:p>
+      <w:pPr>
+        <w:pStyle w:val="BodyText"/>
+      </w:pPr>
+      <w:r>
         <w:t xml:space="preserve">The purpose of the system is useful computation, and the appropriate figure of merit is delivered useful</w:t>
       </w:r>
       <w:r>
@@ -24105,6 +24213,18 @@
         <w:pStyle w:val="FirstParagraph"/>
       </w:pPr>
       <w:r>
+        <w:rPr>
+          <w:i/>
+          <w:iCs/>
+        </w:rPr>
+        <w:t xml:space="preserve">Sources: the mass, power, thermal, and delta-v closure follows standard concurrent-design practice (SMAD [18]).</w:t>
+      </w:r>
+    </w:p>
+    <w:p>
+      <w:pPr>
+        <w:pStyle w:val="BodyText"/>
+      </w:pPr>
+      <w:r>
         <w:t xml:space="preserve">The value of a systems model lies in closure: the subsystems must be solved together so that their</w:t>
       </w:r>
       <w:r>
@@ -24302,6 +24422,18 @@
         <w:pStyle w:val="FirstParagraph"/>
       </w:pPr>
       <w:r>
+        <w:rPr>
+          <w:i/>
+          <w:iCs/>
+        </w:rPr>
+        <w:t xml:space="preserve">Sources: the numerical methods (Newton-Raphson, bisection, Brent, Runge-Kutta) are standard; the orbital integrations are checked against Vallado [17].</w:t>
+      </w:r>
+    </w:p>
+    <w:p>
+      <w:pPr>
+        <w:pStyle w:val="BodyText"/>
+      </w:pPr>
+      <w:r>
         <w:t xml:space="preserve">The governing equations are not only evaluated in closed form; each is solved with an explicit</w:t>
       </w:r>
       <w:r>
@@ -25606,6 +25738,18 @@
     <w:p>
       <w:pPr>
         <w:pStyle w:val="FirstParagraph"/>
+      </w:pPr>
+      <w:r>
+        <w:rPr>
+          <w:i/>
+          <w:iCs/>
+        </w:rPr>
+        <w:t xml:space="preserve">Sources: linear error propagation and Monte-Carlo are standard practice; the input distributions are documented in Appendix C.</w:t>
+      </w:r>
+    </w:p>
+    <w:p>
+      <w:pPr>
+        <w:pStyle w:val="BodyText"/>
       </w:pPr>
       <w:r>
         <w:t xml:space="preserve">A point design is not credible without an uncertainty band. Two complementary tools are used: linear</w:t>
@@ -26804,6 +26948,18 @@
         <w:pStyle w:val="FirstParagraph"/>
       </w:pPr>
       <w:r>
+        <w:rPr>
+          <w:i/>
+          <w:iCs/>
+        </w:rPr>
+        <w:t xml:space="preserve">Sources: the levelized-cost and net-present-value formulation follows standard engineering economics and the SMAD cost treatment [18]; launch-cost inputs per [35] and the reference architecture [1].</w:t>
+      </w:r>
+    </w:p>
+    <w:p>
+      <w:pPr>
+        <w:pStyle w:val="BodyText"/>
+      </w:pPr>
+      <w:r>
         <w:t xml:space="preserve">The economic case is built with a proper time-value-of-money treatment rather than simple cost</w:t>
       </w:r>
       <w:r>
@@ -27842,6 +27998,18 @@
         <w:pStyle w:val="FirstParagraph"/>
       </w:pPr>
       <w:r>
+        <w:rPr>
+          <w:i/>
+          <w:iCs/>
+        </w:rPr>
+        <w:t xml:space="preserve">Sources: the learning-curve and cadence inputs follow the reference architecture’s cost model [1] and public launch data [35].</w:t>
+      </w:r>
+    </w:p>
+    <w:p>
+      <w:pPr>
+        <w:pStyle w:val="BodyText"/>
+      </w:pPr>
+      <w:r>
         <w:t xml:space="preserve">The entire economic case rests on launch cost falling far enough that the annualized cost of power in</w:t>
       </w:r>
       <w:r>
@@ -32384,6 +32552,18 @@
     <w:p>
       <w:pPr>
         <w:pStyle w:val="FirstParagraph"/>
+      </w:pPr>
+      <w:r>
+        <w:rPr>
+          <w:i/>
+          <w:iCs/>
+        </w:rPr>
+        <w:t xml:space="preserve">Sources: the relative-motion (Clohessy-Wiltshire) equations and constellation geometry follow Curtis [16] and Vallado [17].</w:t>
+      </w:r>
+    </w:p>
+    <w:p>
+      <w:pPr>
+        <w:pStyle w:val="BodyText"/>
       </w:pPr>
       <w:r>
         <w:t xml:space="preserve">The eighty-one satellites do not fly in a rigid grid; they orbit in a loose formation governed by</w:t>

</xml_diff>

<commit_message>
Book: Springer-style front matter, chapter openers, running heads; fix blank page; add launch-cost figure
Design (looks like a monograph, not a single document):
- Front matter rebuilt: half-title, designed title page, and a colophon/
  copyright page (edition, MIT+CC-BY licensing, repo, reproducibility note).
- Chapter openers enlarged with a teal CHAPTER kicker, big slate title, rule,
  and generous spacing; running head now carries the chapter title.
- TOC deepened to sections (toc-depth=2) so the contents reads fuller.

Blank-page fix: added 'oneside' to the book class and removed the redundant
\cleardoublepage in the front matter, which together eliminate the forced
blank verso pages (the empty page vi).

Content: add the launch-cost landscape figure (Shuttle/Falcon 9/Starship $/kg
and the hardware-dominates-below-00/kg crossover) as Fig. 22.1; renumber the
Monte-Carlo figure to 22.2. Book now carries 22 figures.
</commit_message>
<xml_diff>
--- a/report/Report_II_Complete.docx
+++ b/report/Report_II_Complete.docx
@@ -26925,7 +26925,7 @@
     </w:p>
     <w:bookmarkEnd w:id="92"/>
     <w:bookmarkEnd w:id="93"/>
-    <w:bookmarkStart w:id="106" w:name="part-v-economics-and-predictions"/>
+    <w:bookmarkStart w:id="109" w:name="part-v-economics-and-predictions"/>
     <w:p>
       <w:pPr>
         <w:pStyle w:val="Heading1"/>
@@ -27984,7 +27984,7 @@
       </w:r>
     </w:p>
     <w:bookmarkEnd w:id="100"/>
-    <w:bookmarkStart w:id="104" w:name="the-launch-cost-parity-prediction"/>
+    <w:bookmarkStart w:id="107" w:name="the-launch-cost-parity-prediction"/>
     <w:p>
       <w:pPr>
         <w:pStyle w:val="Heading2"/>
@@ -28040,137 +28040,25 @@
         <w:t xml:space="preserve"> </w:t>
       </w:r>
       <w:r>
-        <w:t xml:space="preserve">data-center power spend of 570 to 3,000 dollars per kilowatt-year.</w:t>
-      </w:r>
-    </w:p>
-    <w:p>
-      <w:pPr>
-        <w:pStyle w:val="BodyText"/>
-      </w:pPr>
-      <w:r>
-        <w:t xml:space="preserve">This forecast is assumption-fragile, so this study generates its own credibility band rather than</w:t>
-      </w:r>
-      <w:r>
-        <w:t xml:space="preserve"> </w:t>
-      </w:r>
-      <w:r>
-        <w:t xml:space="preserve">inheriting a single date. A Wright learning curve is applied to cumulative launched mass, with a</w:t>
-      </w:r>
-      <w:r>
-        <w:t xml:space="preserve"> </w:t>
-      </w:r>
-      <w:r>
-        <w:t xml:space="preserve">logistic ramp in launch cadence, and the unproven assumptions are sampled by Monte-Carlo: the</w:t>
-      </w:r>
-      <w:r>
-        <w:t xml:space="preserve"> </w:t>
-      </w:r>
-      <w:r>
-        <w:t xml:space="preserve">learning rate from fifteen to twenty-five percent, the 2026 effective price from 1,200 to 3,500</w:t>
-      </w:r>
-      <w:r>
-        <w:t xml:space="preserve"> </w:t>
-      </w:r>
-      <w:r>
-        <w:t xml:space="preserve">dollars per kilogram, the payload from 150 to 250 tonnes, and the peak cadence from 80 to 220</w:t>
-      </w:r>
-      <w:r>
-        <w:t xml:space="preserve"> </w:t>
-      </w:r>
-      <w:r>
-        <w:t xml:space="preserve">launches per year. The first result is the more important one and is easy to miss in a single</w:t>
-      </w:r>
-      <w:r>
-        <w:t xml:space="preserve"> </w:t>
-      </w:r>
-      <w:r>
-        <w:t xml:space="preserve">headline date: across the sampled assumptions, only about five percent of scenarios reach 200 dollars</w:t>
-      </w:r>
-      <w:r>
-        <w:t xml:space="preserve"> </w:t>
-      </w:r>
-      <w:r>
-        <w:t xml:space="preserve">per kilogram at all within the 2050 horizon, and roughly ninety-five percent never reach it. Parity at</w:t>
-      </w:r>
-      <w:r>
-        <w:t xml:space="preserve"> </w:t>
-      </w:r>
-      <w:r>
-        <w:t xml:space="preserve">that price is therefore not a near-certainty awaiting a date; under most defensible assumptions it does</w:t>
-      </w:r>
-      <w:r>
-        <w:t xml:space="preserve"> </w:t>
-      </w:r>
-      <w:r>
-        <w:t xml:space="preserve">not arrive within the horizon. Conditional on the minority of scenarios that do reach it, the median</w:t>
-      </w:r>
-      <w:r>
-        <w:t xml:space="preserve"> </w:t>
-      </w:r>
-      <w:r>
-        <w:t xml:space="preserve">parity year is near 2044 (Fig. 22.1), with a fifth percentile of about 2037 and essentially no</w:t>
-      </w:r>
-      <w:r>
-        <w:t xml:space="preserve"> </w:t>
-      </w:r>
-      <w:r>
-        <w:t xml:space="preserve">probability of reaching parity by 2035. Extending the horizon to 2060 raises the reaching fraction only</w:t>
-      </w:r>
-      <w:r>
-        <w:t xml:space="preserve"> </w:t>
-      </w:r>
-      <w:r>
-        <w:t xml:space="preserve">to about nine percent and moves the conditional median to the end of the 2040s, so the conclusion is not</w:t>
-      </w:r>
-      <w:r>
-        <w:t xml:space="preserve"> </w:t>
-      </w:r>
-      <w:r>
-        <w:t xml:space="preserve">an artifact of where the horizon is drawn. The vendor’s 2035 date sits beyond the optimistic edge of the</w:t>
-      </w:r>
-      <w:r>
-        <w:t xml:space="preserve"> </w:t>
-      </w:r>
-      <w:r>
-        <w:t xml:space="preserve">distribution and requires its specific aggressive anchors, full reusability at 200 tonnes and roughly</w:t>
-      </w:r>
-      <w:r>
-        <w:t xml:space="preserve"> </w:t>
-      </w:r>
-      <w:r>
-        <w:t xml:space="preserve">two million dollars marginal cost, sustained twenty-percent learning from a low starting price, and a</w:t>
-      </w:r>
-      <w:r>
-        <w:t xml:space="preserve"> </w:t>
-      </w:r>
-      <w:r>
-        <w:t xml:space="preserve">total launched mass far larger than the cadence ranges sampled here deliver.</w:t>
-      </w:r>
-    </w:p>
-    <w:p>
-      <w:pPr>
-        <w:pStyle w:val="BodyText"/>
-      </w:pPr>
-      <w:r>
-        <w:t xml:space="preserve">The prediction is therefore twofold: launch-cost parity at 200 dollars per kilogram is unlikely under</w:t>
-      </w:r>
-      <w:r>
-        <w:t xml:space="preserve"> </w:t>
-      </w:r>
-      <w:r>
-        <w:t xml:space="preserve">most assumptions rather than merely late, and where it does arrive it is more likely in the late 2030s</w:t>
-      </w:r>
-      <w:r>
-        <w:t xml:space="preserve"> </w:t>
-      </w:r>
-      <w:r>
-        <w:t xml:space="preserve">to mid-2040s than in 2035. Parity is in any case necessary but not sufficient: even at parity, the</w:t>
-      </w:r>
-      <w:r>
-        <w:t xml:space="preserve"> </w:t>
-      </w:r>
-      <w:r>
-        <w:t xml:space="preserve">business case is gated by hardware cost, lifetime, and utilization.</w:t>
+        <w:t xml:space="preserve">data-center power spend of 570 to 3,000 dollars per kilowatt-year. The broader launch-cost landscape</w:t>
+      </w:r>
+      <w:r>
+        <w:t xml:space="preserve"> </w:t>
+      </w:r>
+      <w:r>
+        <w:t xml:space="preserve">that frames this target is shown in Fig. 22.1: today’s reusable launch still sits an order of magnitude</w:t>
+      </w:r>
+      <w:r>
+        <w:t xml:space="preserve"> </w:t>
+      </w:r>
+      <w:r>
+        <w:t xml:space="preserve">above it, and once the price falls below roughly 600 dollars per kilogram the all-in cost per satellite</w:t>
+      </w:r>
+      <w:r>
+        <w:t xml:space="preserve"> </w:t>
+      </w:r>
+      <w:r>
+        <w:t xml:space="preserve">is set by hardware rather than launch, so further reductions in launch price yield diminishing returns.</w:t>
       </w:r>
     </w:p>
     <w:p>
@@ -28180,20 +28068,205 @@
       <w:r>
         <w:drawing>
           <wp:inline>
-            <wp:extent cx="5334000" cy="2619768"/>
+            <wp:extent cx="5334000" cy="3390824"/>
             <wp:effectExtent b="0" l="0" r="0" t="0"/>
-            <wp:docPr descr="Fig. 22.1, Launch-cost learning curve (Monte-Carlo) and the distribution of the cost-parity year. Most sampled scenarios never reach 200 dollars per kilogram within the horizon; conditional on those that do, the median is near 2044, later than the vendor’s 2035." title="" id="102" name="Picture"/>
+            <wp:docPr descr="Fig. 22.1. The launch-cost landscape. Left: below roughly 600 dollars per kilogram the all-in cost per satellite is dominated by hardware rather than launch. Right: the price-per-kilogram trajectory to low Earth orbit, from the Shuttle program average through reusable Falcon 9 to the realistic and aspirational Starship targets." title="" id="102" name="Picture"/>
             <a:graphic>
               <a:graphicData uri="http://schemas.openxmlformats.org/drawingml/2006/picture">
                 <pic:pic>
                   <pic:nvPicPr>
-                    <pic:cNvPr descr="figures_pred/fig_cost_parity.png" id="103" name="Picture"/>
+                    <pic:cNvPr descr="figures/fig6_launch_cost.png" id="103" name="Picture"/>
                     <pic:cNvPicPr>
                       <a:picLocks noChangeArrowheads="1" noChangeAspect="1"/>
                     </pic:cNvPicPr>
                   </pic:nvPicPr>
                   <pic:blipFill>
                     <a:blip r:embed="rId101"/>
+                    <a:stretch>
+                      <a:fillRect/>
+                    </a:stretch>
+                  </pic:blipFill>
+                  <pic:spPr bwMode="auto">
+                    <a:xfrm>
+                      <a:off x="0" y="0"/>
+                      <a:ext cx="5334000" cy="3390824"/>
+                    </a:xfrm>
+                    <a:prstGeom prst="rect">
+                      <a:avLst/>
+                    </a:prstGeom>
+                    <a:noFill/>
+                    <a:ln w="9525">
+                      <a:noFill/>
+                      <a:headEnd/>
+                      <a:tailEnd/>
+                    </a:ln>
+                  </pic:spPr>
+                </pic:pic>
+              </a:graphicData>
+            </a:graphic>
+          </wp:inline>
+        </w:drawing>
+      </w:r>
+    </w:p>
+    <w:p>
+      <w:pPr>
+        <w:pStyle w:val="ImageCaption"/>
+      </w:pPr>
+      <w:r>
+        <w:t xml:space="preserve">Fig. 22.1. The launch-cost landscape. Left: below roughly 600 dollars per kilogram the all-in cost per satellite is dominated by hardware rather than launch. Right: the price-per-kilogram trajectory to low Earth orbit, from the Shuttle program average through reusable Falcon 9 to the realistic and aspirational Starship targets.</w:t>
+      </w:r>
+    </w:p>
+    <w:p>
+      <w:pPr>
+        <w:pStyle w:val="BodyText"/>
+      </w:pPr>
+      <w:r>
+        <w:t xml:space="preserve">This forecast is assumption-fragile, so this study generates its own credibility band rather than</w:t>
+      </w:r>
+      <w:r>
+        <w:t xml:space="preserve"> </w:t>
+      </w:r>
+      <w:r>
+        <w:t xml:space="preserve">inheriting a single date. A Wright learning curve is applied to cumulative launched mass, with a</w:t>
+      </w:r>
+      <w:r>
+        <w:t xml:space="preserve"> </w:t>
+      </w:r>
+      <w:r>
+        <w:t xml:space="preserve">logistic ramp in launch cadence, and the unproven assumptions are sampled by Monte-Carlo: the</w:t>
+      </w:r>
+      <w:r>
+        <w:t xml:space="preserve"> </w:t>
+      </w:r>
+      <w:r>
+        <w:t xml:space="preserve">learning rate from fifteen to twenty-five percent, the 2026 effective price from 1,200 to 3,500</w:t>
+      </w:r>
+      <w:r>
+        <w:t xml:space="preserve"> </w:t>
+      </w:r>
+      <w:r>
+        <w:t xml:space="preserve">dollars per kilogram, the payload from 150 to 250 tonnes, and the peak cadence from 80 to 220</w:t>
+      </w:r>
+      <w:r>
+        <w:t xml:space="preserve"> </w:t>
+      </w:r>
+      <w:r>
+        <w:t xml:space="preserve">launches per year. The first result is the more important one and is easy to miss in a single</w:t>
+      </w:r>
+      <w:r>
+        <w:t xml:space="preserve"> </w:t>
+      </w:r>
+      <w:r>
+        <w:t xml:space="preserve">headline date: across the sampled assumptions, only about five percent of scenarios reach 200 dollars</w:t>
+      </w:r>
+      <w:r>
+        <w:t xml:space="preserve"> </w:t>
+      </w:r>
+      <w:r>
+        <w:t xml:space="preserve">per kilogram at all within the 2050 horizon, and roughly ninety-five percent never reach it. Parity at</w:t>
+      </w:r>
+      <w:r>
+        <w:t xml:space="preserve"> </w:t>
+      </w:r>
+      <w:r>
+        <w:t xml:space="preserve">that price is therefore not a near-certainty awaiting a date; under most defensible assumptions it does</w:t>
+      </w:r>
+      <w:r>
+        <w:t xml:space="preserve"> </w:t>
+      </w:r>
+      <w:r>
+        <w:t xml:space="preserve">not arrive within the horizon. Conditional on the minority of scenarios that do reach it, the median</w:t>
+      </w:r>
+      <w:r>
+        <w:t xml:space="preserve"> </w:t>
+      </w:r>
+      <w:r>
+        <w:t xml:space="preserve">parity year is near 2044 (Fig. 22.1), with a fifth percentile of about 2037 and essentially no</w:t>
+      </w:r>
+      <w:r>
+        <w:t xml:space="preserve"> </w:t>
+      </w:r>
+      <w:r>
+        <w:t xml:space="preserve">probability of reaching parity by 2035. Extending the horizon to 2060 raises the reaching fraction only</w:t>
+      </w:r>
+      <w:r>
+        <w:t xml:space="preserve"> </w:t>
+      </w:r>
+      <w:r>
+        <w:t xml:space="preserve">to about nine percent and moves the conditional median to the end of the 2040s, so the conclusion is not</w:t>
+      </w:r>
+      <w:r>
+        <w:t xml:space="preserve"> </w:t>
+      </w:r>
+      <w:r>
+        <w:t xml:space="preserve">an artifact of where the horizon is drawn. The vendor’s 2035 date sits beyond the optimistic edge of the</w:t>
+      </w:r>
+      <w:r>
+        <w:t xml:space="preserve"> </w:t>
+      </w:r>
+      <w:r>
+        <w:t xml:space="preserve">distribution and requires its specific aggressive anchors, full reusability at 200 tonnes and roughly</w:t>
+      </w:r>
+      <w:r>
+        <w:t xml:space="preserve"> </w:t>
+      </w:r>
+      <w:r>
+        <w:t xml:space="preserve">two million dollars marginal cost, sustained twenty-percent learning from a low starting price, and a</w:t>
+      </w:r>
+      <w:r>
+        <w:t xml:space="preserve"> </w:t>
+      </w:r>
+      <w:r>
+        <w:t xml:space="preserve">total launched mass far larger than the cadence ranges sampled here deliver.</w:t>
+      </w:r>
+    </w:p>
+    <w:p>
+      <w:pPr>
+        <w:pStyle w:val="BodyText"/>
+      </w:pPr>
+      <w:r>
+        <w:t xml:space="preserve">The prediction is therefore twofold: launch-cost parity at 200 dollars per kilogram is unlikely under</w:t>
+      </w:r>
+      <w:r>
+        <w:t xml:space="preserve"> </w:t>
+      </w:r>
+      <w:r>
+        <w:t xml:space="preserve">most assumptions rather than merely late, and where it does arrive it is more likely in the late 2030s</w:t>
+      </w:r>
+      <w:r>
+        <w:t xml:space="preserve"> </w:t>
+      </w:r>
+      <w:r>
+        <w:t xml:space="preserve">to mid-2040s than in 2035. Parity is in any case necessary but not sufficient: even at parity, the</w:t>
+      </w:r>
+      <w:r>
+        <w:t xml:space="preserve"> </w:t>
+      </w:r>
+      <w:r>
+        <w:t xml:space="preserve">business case is gated by hardware cost, lifetime, and utilization.</w:t>
+      </w:r>
+    </w:p>
+    <w:p>
+      <w:pPr>
+        <w:pStyle w:val="CaptionedFigure"/>
+      </w:pPr>
+      <w:r>
+        <w:drawing>
+          <wp:inline>
+            <wp:extent cx="5334000" cy="2619768"/>
+            <wp:effectExtent b="0" l="0" r="0" t="0"/>
+            <wp:docPr descr="Fig. 22.2, Launch-cost learning curve (Monte-Carlo) and the distribution of the cost-parity year. Most sampled scenarios never reach 200 dollars per kilogram within the horizon; conditional on those that do, the median is near 2044, later than the vendor’s 2035." title="" id="105" name="Picture"/>
+            <a:graphic>
+              <a:graphicData uri="http://schemas.openxmlformats.org/drawingml/2006/picture">
+                <pic:pic>
+                  <pic:nvPicPr>
+                    <pic:cNvPr descr="figures_pred/fig_cost_parity.png" id="106" name="Picture"/>
+                    <pic:cNvPicPr>
+                      <a:picLocks noChangeArrowheads="1" noChangeAspect="1"/>
+                    </pic:cNvPicPr>
+                  </pic:nvPicPr>
+                  <pic:blipFill>
+                    <a:blip r:embed="rId104"/>
                     <a:stretch>
                       <a:fillRect/>
                     </a:stretch>
@@ -28225,11 +28298,11 @@
         <w:pStyle w:val="ImageCaption"/>
       </w:pPr>
       <w:r>
-        <w:t xml:space="preserve">Fig. 22.1, Launch-cost learning curve (Monte-Carlo) and the distribution of the cost-parity year. Most sampled scenarios never reach 200 dollars per kilogram within the horizon; conditional on those that do, the median is near 2044, later than the vendor’s 2035.</w:t>
+        <w:t xml:space="preserve">Fig. 22.2, Launch-cost learning curve (Monte-Carlo) and the distribution of the cost-parity year. Most sampled scenarios never reach 200 dollars per kilogram within the horizon; conditional on those that do, the median is near 2044, later than the vendor’s 2035.</w:t>
       </w:r>
     </w:p>
-    <w:bookmarkEnd w:id="104"/>
-    <w:bookmarkStart w:id="105" w:name="capability-and-risk-trajectory-2027-2035"/>
+    <w:bookmarkEnd w:id="107"/>
+    <w:bookmarkStart w:id="108" w:name="capability-and-risk-trajectory-2027-2035"/>
     <w:p>
       <w:pPr>
         <w:pStyle w:val="Heading2"/>
@@ -28333,9 +28406,9 @@
         </w:pict>
       </w:r>
     </w:p>
-    <w:bookmarkEnd w:id="105"/>
-    <w:bookmarkEnd w:id="106"/>
-    <w:bookmarkStart w:id="112" w:name="part-vi-synthesis"/>
+    <w:bookmarkEnd w:id="108"/>
+    <w:bookmarkEnd w:id="109"/>
+    <w:bookmarkStart w:id="115" w:name="part-vi-synthesis"/>
     <w:p>
       <w:pPr>
         <w:pStyle w:val="Heading1"/>
@@ -28344,7 +28417,7 @@
         <w:t xml:space="preserve">PART VI, SYNTHESIS</w:t>
       </w:r>
     </w:p>
-    <w:bookmarkStart w:id="107" w:name="caveats-and-limitations"/>
+    <w:bookmarkStart w:id="110" w:name="caveats-and-limitations"/>
     <w:p>
       <w:pPr>
         <w:pStyle w:val="Heading2"/>
@@ -28476,8 +28549,8 @@
         <w:t xml:space="preserve">number should be quoted, and they identify exactly where higher-fidelity work is needed next.</w:t>
       </w:r>
     </w:p>
-    <w:bookmarkEnd w:id="107"/>
-    <w:bookmarkStart w:id="111" w:name="X112718272980ce9d8db030edbf2c8e56c96c038"/>
+    <w:bookmarkEnd w:id="110"/>
+    <w:bookmarkStart w:id="114" w:name="X112718272980ce9d8db030edbf2c8e56c96c038"/>
     <w:p>
       <w:pPr>
         <w:pStyle w:val="Heading2"/>
@@ -28613,18 +28686,18 @@
           <wp:inline>
             <wp:extent cx="5334000" cy="4249493"/>
             <wp:effectExtent b="0" l="0" r="0" t="0"/>
-            <wp:docPr descr="Fig. 25.1, Systems-level risk matrix: cooling is solved; debris, disposal, and economics are the open items." title="" id="109" name="Picture"/>
+            <wp:docPr descr="Fig. 25.1, Systems-level risk matrix: cooling is solved; debris, disposal, and economics are the open items." title="" id="112" name="Picture"/>
             <a:graphic>
               <a:graphicData uri="http://schemas.openxmlformats.org/drawingml/2006/picture">
                 <pic:pic>
                   <pic:nvPicPr>
-                    <pic:cNvPr descr="figures/fig7_risk_matrix.png" id="110" name="Picture"/>
+                    <pic:cNvPr descr="figures/fig7_risk_matrix.png" id="113" name="Picture"/>
                     <pic:cNvPicPr>
                       <a:picLocks noChangeArrowheads="1" noChangeAspect="1"/>
                     </pic:cNvPicPr>
                   </pic:nvPicPr>
                   <pic:blipFill>
-                    <a:blip r:embed="rId108"/>
+                    <a:blip r:embed="rId111"/>
                     <a:stretch>
                       <a:fillRect/>
                     </a:stretch>
@@ -28673,9 +28746,9 @@
         </w:pict>
       </w:r>
     </w:p>
-    <w:bookmarkEnd w:id="111"/>
-    <w:bookmarkEnd w:id="112"/>
-    <w:bookmarkStart w:id="117" w:name="X2849ac850b034a4af8859258c8c59481bcc0a0d"/>
+    <w:bookmarkEnd w:id="114"/>
+    <w:bookmarkEnd w:id="115"/>
+    <w:bookmarkStart w:id="120" w:name="X2849ac850b034a4af8859258c8c59481bcc0a0d"/>
     <w:p>
       <w:pPr>
         <w:pStyle w:val="Heading1"/>
@@ -28684,7 +28757,7 @@
         <w:t xml:space="preserve">PART VII, DETAILED RESULTS, DATA, AND WORKED COMPUTATIONS</w:t>
       </w:r>
     </w:p>
-    <w:bookmarkStart w:id="113" w:name="a-worked-end-to-end-computation"/>
+    <w:bookmarkStart w:id="116" w:name="a-worked-end-to-end-computation"/>
     <w:p>
       <w:pPr>
         <w:pStyle w:val="Heading2"/>
@@ -28835,8 +28908,8 @@
         <w:t xml:space="preserve">produced by the open code and is reproduced by the validation suite.</w:t>
       </w:r>
     </w:p>
-    <w:bookmarkEnd w:id="113"/>
-    <w:bookmarkStart w:id="114" w:name="detailed-results-tables"/>
+    <w:bookmarkEnd w:id="116"/>
+    <w:bookmarkStart w:id="117" w:name="detailed-results-tables"/>
     <w:p>
       <w:pPr>
         <w:pStyle w:val="Heading2"/>
@@ -32539,8 +32612,8 @@
         </w:tc>
       </w:tr>
     </w:tbl>
-    <w:bookmarkEnd w:id="114"/>
-    <w:bookmarkStart w:id="115" w:name="X4ef80d11b7a22aeebf52f8f551fc1d287f74ce6"/>
+    <w:bookmarkEnd w:id="117"/>
+    <w:bookmarkStart w:id="118" w:name="X4ef80d11b7a22aeebf52f8f551fc1d287f74ce6"/>
     <w:p>
       <w:pPr>
         <w:pStyle w:val="Heading2"/>
@@ -33001,8 +33074,8 @@
         <w:t xml:space="preserve">problem at this density, and it is the operational face of the formation paradox.</w:t>
       </w:r>
     </w:p>
-    <w:bookmarkEnd w:id="115"/>
-    <w:bookmarkStart w:id="116" w:name="comparison-with-terrestrial-data-centers"/>
+    <w:bookmarkEnd w:id="118"/>
+    <w:bookmarkStart w:id="119" w:name="comparison-with-terrestrial-data-centers"/>
     <w:p>
       <w:pPr>
         <w:pStyle w:val="Heading2"/>
@@ -33475,9 +33548,9 @@
         </w:pict>
       </w:r>
     </w:p>
-    <w:bookmarkEnd w:id="116"/>
-    <w:bookmarkEnd w:id="117"/>
-    <w:bookmarkStart w:id="132" w:name="back-matter"/>
+    <w:bookmarkEnd w:id="119"/>
+    <w:bookmarkEnd w:id="120"/>
+    <w:bookmarkStart w:id="135" w:name="back-matter"/>
     <w:p>
       <w:pPr>
         <w:pStyle w:val="Heading1"/>
@@ -33486,7 +33559,7 @@
         <w:t xml:space="preserve">Back matter</w:t>
       </w:r>
     </w:p>
-    <w:bookmarkStart w:id="118" w:name="references"/>
+    <w:bookmarkStart w:id="121" w:name="references"/>
     <w:p>
       <w:pPr>
         <w:pStyle w:val="Heading2"/>
@@ -34518,8 +34591,8 @@
         <w:t xml:space="preserve">launch records, for the launch-cadence and cost-trajectory inputs of Chapter 22.</w:t>
       </w:r>
     </w:p>
-    <w:bookmarkEnd w:id="118"/>
-    <w:bookmarkStart w:id="119" w:name="Xa5f5759fad9159c193908c5014e5f5066c880b0"/>
+    <w:bookmarkEnd w:id="121"/>
+    <w:bookmarkStart w:id="122" w:name="Xa5f5759fad9159c193908c5014e5f5066c880b0"/>
     <w:p>
       <w:pPr>
         <w:pStyle w:val="Heading2"/>
@@ -37004,8 +37077,8 @@
         </w:tc>
       </w:tr>
     </w:tbl>
-    <w:bookmarkEnd w:id="119"/>
-    <w:bookmarkStart w:id="120" w:name="appendix-b-nomenclature"/>
+    <w:bookmarkEnd w:id="122"/>
+    <w:bookmarkStart w:id="123" w:name="appendix-b-nomenclature"/>
     <w:p>
       <w:pPr>
         <w:pStyle w:val="Heading2"/>
@@ -37028,8 +37101,8 @@
         <w:t xml:space="preserve">there with its units.</w:t>
       </w:r>
     </w:p>
-    <w:bookmarkEnd w:id="120"/>
-    <w:bookmarkStart w:id="121" w:name="appendix-c-data-sources-and-confidence"/>
+    <w:bookmarkEnd w:id="123"/>
+    <w:bookmarkStart w:id="124" w:name="appendix-c-data-sources-and-confidence"/>
     <w:p>
       <w:pPr>
         <w:pStyle w:val="Heading2"/>
@@ -37082,8 +37155,8 @@
         <w:t xml:space="preserve">1-mm-to-1-cm debris flux is the least model-validated quantity.</w:t>
       </w:r>
     </w:p>
-    <w:bookmarkEnd w:id="121"/>
-    <w:bookmarkStart w:id="122" w:name="appendix-d-reproduction-and-code"/>
+    <w:bookmarkEnd w:id="124"/>
+    <w:bookmarkStart w:id="125" w:name="appendix-d-reproduction-and-code"/>
     <w:p>
       <w:pPr>
         <w:pStyle w:val="Heading2"/>
@@ -39002,8 +39075,8 @@
         <w:t xml:space="preserve"> util)</w:t>
       </w:r>
     </w:p>
-    <w:bookmarkEnd w:id="122"/>
-    <w:bookmarkStart w:id="131" w:name="appendix-e-extended-derivations"/>
+    <w:bookmarkEnd w:id="125"/>
+    <w:bookmarkStart w:id="134" w:name="appendix-e-extended-derivations"/>
     <w:p>
       <w:pPr>
         <w:pStyle w:val="Heading2"/>
@@ -39026,7 +39099,7 @@
         <w:t xml:space="preserve">the main text, so that the volume is mathematically self-contained.</w:t>
       </w:r>
     </w:p>
-    <w:bookmarkStart w:id="123" w:name="X2a80dffde1cc8eefa78dcdbda3d88a45fd72945"/>
+    <w:bookmarkStart w:id="126" w:name="X2a80dffde1cc8eefa78dcdbda3d88a45fd72945"/>
     <w:p>
       <w:pPr>
         <w:pStyle w:val="Heading3"/>
@@ -40149,8 +40222,8 @@
         <w:t xml:space="preserve">fundamental constants. This is the foundation of every radiator result in Chapter 10.</w:t>
       </w:r>
     </w:p>
-    <w:bookmarkEnd w:id="123"/>
-    <w:bookmarkStart w:id="124" w:name="X4c20d6d59466b0830aef63d21b34b7838499df3"/>
+    <w:bookmarkEnd w:id="126"/>
+    <w:bookmarkStart w:id="127" w:name="X4c20d6d59466b0830aef63d21b34b7838499df3"/>
     <w:p>
       <w:pPr>
         <w:pStyle w:val="Heading3"/>
@@ -40961,8 +41034,8 @@
         <w:t xml:space="preserve">debris impacts.</w:t>
       </w:r>
     </w:p>
-    <w:bookmarkEnd w:id="124"/>
-    <w:bookmarkStart w:id="125" w:name="Xdbf318ef9ef49d2256131d87dbdb96f21a45420"/>
+    <w:bookmarkEnd w:id="127"/>
+    <w:bookmarkStart w:id="128" w:name="Xdbf318ef9ef49d2256131d87dbdb96f21a45420"/>
     <w:p>
       <w:pPr>
         <w:pStyle w:val="Heading3"/>
@@ -41917,8 +41990,8 @@
         <w:t xml:space="preserve">re-entry within one or two orbits, satisfying the disposal requirement.</w:t>
       </w:r>
     </w:p>
-    <w:bookmarkEnd w:id="125"/>
-    <w:bookmarkStart w:id="126" w:name="X67de4cda1ab68499f29ee0b2ccb5ff91efedb0e"/>
+    <w:bookmarkEnd w:id="128"/>
+    <w:bookmarkStart w:id="129" w:name="X67de4cda1ab68499f29ee0b2ccb5ff91efedb0e"/>
     <w:p>
       <w:pPr>
         <w:pStyle w:val="Heading3"/>
@@ -42445,8 +42518,8 @@
         <w:t xml:space="preserve">discussed in Chapter 28 and the reason the formation needs active relative control.</w:t>
       </w:r>
     </w:p>
-    <w:bookmarkEnd w:id="126"/>
-    <w:bookmarkStart w:id="127" w:name="e.5-the-rocket-equation"/>
+    <w:bookmarkEnd w:id="129"/>
+    <w:bookmarkStart w:id="130" w:name="e.5-the-rocket-equation"/>
     <w:p>
       <w:pPr>
         <w:pStyle w:val="Heading3"/>
@@ -43166,8 +43239,8 @@
         <w:t xml:space="preserve">propulsion) so dramatically reduces propellant mass for a given Δv.</w:t>
       </w:r>
     </w:p>
-    <w:bookmarkEnd w:id="127"/>
-    <w:bookmarkStart w:id="128" w:name="e.6-k-of-n-redundancy"/>
+    <w:bookmarkEnd w:id="130"/>
+    <w:bookmarkStart w:id="131" w:name="e.6-k-of-n-redundancy"/>
     <w:p>
       <w:pPr>
         <w:pStyle w:val="Heading3"/>
@@ -43529,8 +43602,8 @@
         <w:t xml:space="preserve">satellite and the over-provisioned satellites within a cluster (Chapter 16).</w:t>
       </w:r>
     </w:p>
-    <w:bookmarkEnd w:id="128"/>
-    <w:bookmarkStart w:id="129" w:name="X1e2c0797711e5a38d867b0034b661cf8291a89f"/>
+    <w:bookmarkEnd w:id="131"/>
+    <w:bookmarkStart w:id="132" w:name="X1e2c0797711e5a38d867b0034b661cf8291a89f"/>
     <w:p>
       <w:pPr>
         <w:pStyle w:val="Heading3"/>
@@ -44195,8 +44268,8 @@
         <w:t xml:space="preserve">K in two to four steps.</w:t>
       </w:r>
     </w:p>
-    <w:bookmarkEnd w:id="129"/>
-    <w:bookmarkStart w:id="130" w:name="e.8-the-capital-recovery-factor"/>
+    <w:bookmarkEnd w:id="132"/>
+    <w:bookmarkStart w:id="133" w:name="e.8-the-capital-recovery-factor"/>
     <w:p>
       <w:pPr>
         <w:pStyle w:val="Heading3"/>
@@ -44629,9 +44702,9 @@
         <w:t xml:space="preserve">End of report.</w:t>
       </w:r>
     </w:p>
-    <w:bookmarkEnd w:id="130"/>
-    <w:bookmarkEnd w:id="131"/>
-    <w:bookmarkEnd w:id="132"/>
+    <w:bookmarkEnd w:id="133"/>
+    <w:bookmarkEnd w:id="134"/>
+    <w:bookmarkEnd w:id="135"/>
     <w:sectPr>
       <w:footnotePr>
         <w:numRestart w:val="eachSect"/>

</xml_diff>

<commit_message>
Figures: move captions out of the image into the document text
Per request, figures no longer carry baked-in titles/captions. Removed the
figure-number badges (FIG. N / FIG. PRED), whole-figure suptitles, the
descriptive figure-level ax titles, and the on-image DATA SOURCE/SOURCE
lines across all four generators (sim_survivability, gen_figures2,
predictions, orbital_dc.figures). Panel (a)/(b) labels, axis labels, legends,
and data annotations are kept; the descriptive caption now lives only in the
LaTeX/Markdown \caption below each figure. Source attribution moved to the
per-chapter Sources lines and References. Redirected sim_survivability and
orbital_dc.figures output to the in-repo report/figures and report/systems_figs.

Regenerated all 22 figures; rebuilt book, report HTML/Word, and the LinkedIn
article. No text overlaps the plots.
</commit_message>
<xml_diff>
--- a/report/Report_II_Complete.docx
+++ b/report/Report_II_Complete.docx
@@ -11538,7 +11538,7 @@
       <w:r>
         <w:drawing>
           <wp:inline>
-            <wp:extent cx="5334000" cy="2456668"/>
+            <wp:extent cx="5334000" cy="2294266"/>
             <wp:effectExtent b="0" l="0" r="0" t="0"/>
             <wp:docPr descr="Fig. 6.1 Critical beta angle versus altitude, and eclipse fraction versus beta at 650 km. A dawn-dusk orbit holds the beta angle high, so the satellite stays sunlit." title="" id="25" name="Picture"/>
             <a:graphic>
@@ -11559,7 +11559,7 @@
                   <pic:spPr bwMode="auto">
                     <a:xfrm>
                       <a:off x="0" y="0"/>
-                      <a:ext cx="5334000" cy="2456668"/>
+                      <a:ext cx="5334000" cy="2294266"/>
                     </a:xfrm>
                     <a:prstGeom prst="rect">
                       <a:avLst/>
@@ -13104,7 +13104,7 @@
       <w:r>
         <w:drawing>
           <wp:inline>
-            <wp:extent cx="5334000" cy="3698864"/>
+            <wp:extent cx="5334000" cy="3393613"/>
             <wp:effectExtent b="0" l="0" r="0" t="0"/>
             <wp:docPr descr="Fig. 7.1, Natural orbital lifetime versus altitude with the solar-cycle uncertainty band; at 650 km the realistic lifetime fails the five-year disposal rule." title="" id="29" name="Picture"/>
             <a:graphic>
@@ -13125,7 +13125,7 @@
                   <pic:spPr bwMode="auto">
                     <a:xfrm>
                       <a:off x="0" y="0"/>
-                      <a:ext cx="5334000" cy="3698864"/>
+                      <a:ext cx="5334000" cy="3393613"/>
                     </a:xfrm>
                     <a:prstGeom prst="rect">
                       <a:avLst/>
@@ -13478,7 +13478,7 @@
       <w:r>
         <w:drawing>
           <wp:inline>
-            <wp:extent cx="5334000" cy="3427984"/>
+            <wp:extent cx="5334000" cy="3331868"/>
             <wp:effectExtent b="0" l="0" r="0" t="0"/>
             <wp:docPr descr="Fig. 8.1 Cumulative five-year ionizing dose versus aluminium shielding, with the memory tolerance and the mission requirement marked. Ten millimeters of aluminium keeps the dose well below the first-irregularity threshold." title="" id="33" name="Picture"/>
             <a:graphic>
@@ -13499,7 +13499,7 @@
                   <pic:spPr bwMode="auto">
                     <a:xfrm>
                       <a:off x="0" y="0"/>
-                      <a:ext cx="5334000" cy="3427984"/>
+                      <a:ext cx="5334000" cy="3331868"/>
                     </a:xfrm>
                     <a:prstGeom prst="rect">
                       <a:avLst/>
@@ -15768,7 +15768,7 @@
       <w:r>
         <w:drawing>
           <wp:inline>
-            <wp:extent cx="5334000" cy="2456668"/>
+            <wp:extent cx="5334000" cy="2294266"/>
             <wp:effectExtent b="0" l="0" r="0" t="0"/>
             <wp:docPr descr="Fig. 10.1 Radiator equilibrium temperature versus heat flux, and the radiator area required for one megawatt versus operating temperature. Running hotter reduces area at the cost of silicon lifetime." title="" id="39" name="Picture"/>
             <a:graphic>
@@ -15789,7 +15789,7 @@
                   <pic:spPr bwMode="auto">
                     <a:xfrm>
                       <a:off x="0" y="0"/>
-                      <a:ext cx="5334000" cy="2456668"/>
+                      <a:ext cx="5334000" cy="2294266"/>
                     </a:xfrm>
                     <a:prstGeom prst="rect">
                       <a:avLst/>
@@ -16266,7 +16266,7 @@
       <w:r>
         <w:drawing>
           <wp:inline>
-            <wp:extent cx="5334000" cy="2459772"/>
+            <wp:extent cx="5334000" cy="2297198"/>
             <wp:effectExtent b="0" l="0" r="0" t="0"/>
             <wp:docPr descr="Fig. 10.2 Earth view factor versus altitude, and the combined albedo, Earth-infrared, and solar load on a four-square-meter surface. External loads set the parasitic fraction in the radiator sizing." title="" id="42" name="Picture"/>
             <a:graphic>
@@ -16287,7 +16287,7 @@
                   <pic:spPr bwMode="auto">
                     <a:xfrm>
                       <a:off x="0" y="0"/>
-                      <a:ext cx="5334000" cy="2459772"/>
+                      <a:ext cx="5334000" cy="2297198"/>
                     </a:xfrm>
                     <a:prstGeom prst="rect">
                       <a:avLst/>
@@ -16832,7 +16832,7 @@
       <w:r>
         <w:drawing>
           <wp:inline>
-            <wp:extent cx="5334000" cy="3459634"/>
+            <wp:extent cx="5334000" cy="3371361"/>
             <wp:effectExtent b="0" l="0" r="0" t="0"/>
             <wp:docPr descr="Fig. 10.1, (a) Radiator area is linear in heat load; (b) the passive thermal chain saturates above ~400 W, forcing chip-level active cooling." title="" id="45" name="Picture"/>
             <a:graphic>
@@ -16853,7 +16853,7 @@
                   <pic:spPr bwMode="auto">
                     <a:xfrm>
                       <a:off x="0" y="0"/>
-                      <a:ext cx="5334000" cy="3459634"/>
+                      <a:ext cx="5334000" cy="3371361"/>
                     </a:xfrm>
                     <a:prstGeom prst="rect">
                       <a:avLst/>
@@ -17916,7 +17916,7 @@
       <w:r>
         <w:drawing>
           <wp:inline>
-            <wp:extent cx="5334000" cy="2608107"/>
+            <wp:extent cx="5334000" cy="2417128"/>
             <wp:effectExtent b="0" l="0" r="0" t="0"/>
             <wp:docPr descr="Fig. 11.1, Array area versus load, and triple-junction degradation over the mission." title="" id="49" name="Picture"/>
             <a:graphic>
@@ -17937,7 +17937,7 @@
                   <pic:spPr bwMode="auto">
                     <a:xfrm>
                       <a:off x="0" y="0"/>
-                      <a:ext cx="5334000" cy="2608107"/>
+                      <a:ext cx="5334000" cy="2417128"/>
                     </a:xfrm>
                     <a:prstGeom prst="rect">
                       <a:avLst/>
@@ -18849,7 +18849,7 @@
       <w:r>
         <w:drawing>
           <wp:inline>
-            <wp:extent cx="5334000" cy="4681880"/>
+            <wp:extent cx="4098073" cy="3863897"/>
             <wp:effectExtent b="0" l="0" r="0" t="0"/>
             <wp:docPr descr="Fig. 12.1 Reference satellite dry-mass breakdown by subsystem, closed self-consistently by the integrated model." title="" id="53" name="Picture"/>
             <a:graphic>
@@ -18870,7 +18870,7 @@
                   <pic:spPr bwMode="auto">
                     <a:xfrm>
                       <a:off x="0" y="0"/>
-                      <a:ext cx="5334000" cy="4681880"/>
+                      <a:ext cx="4098073" cy="3863897"/>
                     </a:xfrm>
                     <a:prstGeom prst="rect">
                       <a:avLst/>
@@ -20189,7 +20189,7 @@
       <w:r>
         <w:drawing>
           <wp:inline>
-            <wp:extent cx="5334000" cy="2456668"/>
+            <wp:extent cx="5334000" cy="2304478"/>
             <wp:effectExtent b="0" l="0" r="0" t="0"/>
             <wp:docPr descr="Fig. 14.2 Transmit power required to hold a three-decibel link margin versus range, against the one-watt terminal limit, and the pointing-loss sensitivity to jitter. Range and pointing together force the tight formation." title="" id="58" name="Picture"/>
             <a:graphic>
@@ -20210,7 +20210,7 @@
                   <pic:spPr bwMode="auto">
                     <a:xfrm>
                       <a:off x="0" y="0"/>
-                      <a:ext cx="5334000" cy="2456668"/>
+                      <a:ext cx="5334000" cy="2304478"/>
                     </a:xfrm>
                     <a:prstGeom prst="rect">
                       <a:avLst/>
@@ -20777,7 +20777,7 @@
       <w:r>
         <w:drawing>
           <wp:inline>
-            <wp:extent cx="5334000" cy="2604741"/>
+            <wp:extent cx="5334000" cy="2415588"/>
             <wp:effectExtent b="0" l="0" r="0" t="0"/>
             <wp:docPr descr="Fig. 14.1, Inter-satellite free-space loss versus range and pointing-loss sensitivity." title="" id="61" name="Picture"/>
             <a:graphic>
@@ -20798,7 +20798,7 @@
                   <pic:spPr bwMode="auto">
                     <a:xfrm>
                       <a:off x="0" y="0"/>
-                      <a:ext cx="5334000" cy="2604741"/>
+                      <a:ext cx="5334000" cy="2415588"/>
                     </a:xfrm>
                     <a:prstGeom prst="rect">
                       <a:avLst/>
@@ -21906,7 +21906,7 @@
       <w:r>
         <w:drawing>
           <wp:inline>
-            <wp:extent cx="5334000" cy="3251761"/>
+            <wp:extent cx="5334000" cy="3069709"/>
             <wp:effectExtent b="0" l="0" r="0" t="0"/>
             <wp:docPr descr="Fig. 15.1, Per-satellite Δv budget (de-orbit dominates) and propellant mass by propulsion type." title="" id="65" name="Picture"/>
             <a:graphic>
@@ -21927,7 +21927,7 @@
                   <pic:spPr bwMode="auto">
                     <a:xfrm>
                       <a:off x="0" y="0"/>
-                      <a:ext cx="5334000" cy="3251761"/>
+                      <a:ext cx="5334000" cy="3069709"/>
                     </a:xfrm>
                     <a:prstGeom prst="rect">
                       <a:avLst/>
@@ -23576,7 +23576,7 @@
       <w:r>
         <w:drawing>
           <wp:inline>
-            <wp:extent cx="5334000" cy="2604741"/>
+            <wp:extent cx="5334000" cy="2405396"/>
             <wp:effectExtent b="0" l="0" r="0" t="0"/>
             <wp:docPr descr="Fig. 16.1, Per-node reliability versus time and the over-provisioning needed to hold capacity." title="" id="69" name="Picture"/>
             <a:graphic>
@@ -23597,7 +23597,7 @@
                   <pic:spPr bwMode="auto">
                     <a:xfrm>
                       <a:off x="0" y="0"/>
-                      <a:ext cx="5334000" cy="2604741"/>
+                      <a:ext cx="5334000" cy="2405396"/>
                     </a:xfrm>
                     <a:prstGeom prst="rect">
                       <a:avLst/>
@@ -24133,7 +24133,7 @@
       <w:r>
         <w:drawing>
           <wp:inline>
-            <wp:extent cx="5334000" cy="4019504"/>
+            <wp:extent cx="5334000" cy="3844698"/>
             <wp:effectExtent b="0" l="0" r="0" t="0"/>
             <wp:docPr descr="Fig. 17.1, Added subsystems: passive thermal-throttle by chip, ground-station site diversity, latency crossover, and the discounted-cash-flow breakeven." title="" id="73" name="Picture"/>
             <a:graphic>
@@ -24154,7 +24154,7 @@
                   <pic:spPr bwMode="auto">
                     <a:xfrm>
                       <a:off x="0" y="0"/>
-                      <a:ext cx="5334000" cy="4019504"/>
+                      <a:ext cx="5334000" cy="3844698"/>
                     </a:xfrm>
                     <a:prstGeom prst="rect">
                       <a:avLst/>
@@ -24359,7 +24359,7 @@
       <w:r>
         <w:drawing>
           <wp:inline>
-            <wp:extent cx="5334000" cy="3797310"/>
+            <wp:extent cx="5334000" cy="3268796"/>
             <wp:effectExtent b="0" l="0" r="0" t="0"/>
             <wp:docPr descr="Fig. 18.1, Integrated dry-mass budget, closed self-consistently by the system model." title="" id="78" name="Picture"/>
             <a:graphic>
@@ -24380,7 +24380,7 @@
                   <pic:spPr bwMode="auto">
                     <a:xfrm>
                       <a:off x="0" y="0"/>
-                      <a:ext cx="5334000" cy="3797310"/>
+                      <a:ext cx="5334000" cy="3268796"/>
                     </a:xfrm>
                     <a:prstGeom prst="rect">
                       <a:avLst/>
@@ -26301,7 +26301,7 @@
       <w:r>
         <w:drawing>
           <wp:inline>
-            <wp:extent cx="5334000" cy="1886737"/>
+            <wp:extent cx="5334000" cy="1708893"/>
             <wp:effectExtent b="0" l="0" r="0" t="0"/>
             <wp:docPr descr="Fig. 19.1, Monte-Carlo distributions of natural lifetime, debris probability, and total Δv across the dominant uncertainties." title="" id="83" name="Picture"/>
             <a:graphic>
@@ -26322,7 +26322,7 @@
                   <pic:spPr bwMode="auto">
                     <a:xfrm>
                       <a:off x="0" y="0"/>
-                      <a:ext cx="5334000" cy="1886737"/>
+                      <a:ext cx="5334000" cy="1708893"/>
                     </a:xfrm>
                     <a:prstGeom prst="rect">
                       <a:avLst/>
@@ -26813,7 +26813,7 @@
       <w:r>
         <w:drawing>
           <wp:inline>
-            <wp:extent cx="5334000" cy="3291840"/>
+            <wp:extent cx="5334000" cy="3216896"/>
             <wp:effectExtent b="0" l="0" r="0" t="0"/>
             <wp:docPr descr="Fig. 20.1, Catastrophic debris risk for the full cluster, and the in-cluster cascade coupling versus formation spacing." title="" id="87" name="Picture"/>
             <a:graphic>
@@ -26834,7 +26834,7 @@
                   <pic:spPr bwMode="auto">
                     <a:xfrm>
                       <a:off x="0" y="0"/>
-                      <a:ext cx="5334000" cy="3291840"/>
+                      <a:ext cx="5334000" cy="3216896"/>
                     </a:xfrm>
                     <a:prstGeom prst="rect">
                       <a:avLst/>
@@ -26868,7 +26868,7 @@
       <w:r>
         <w:drawing>
           <wp:inline>
-            <wp:extent cx="5334000" cy="3554885"/>
+            <wp:extent cx="5334000" cy="3462610"/>
             <wp:effectExtent b="0" l="0" r="0" t="0"/>
             <wp:docPr descr="Fig. 20.2, Cumulative dose versus aluminium shielding, and the reliability-throughput trade." title="" id="90" name="Picture"/>
             <a:graphic>
@@ -26889,7 +26889,7 @@
                   <pic:spPr bwMode="auto">
                     <a:xfrm>
                       <a:off x="0" y="0"/>
-                      <a:ext cx="5334000" cy="3554885"/>
+                      <a:ext cx="5334000" cy="3462610"/>
                     </a:xfrm>
                     <a:prstGeom prst="rect">
                       <a:avLst/>
@@ -27880,7 +27880,7 @@
       <w:r>
         <w:drawing>
           <wp:inline>
-            <wp:extent cx="5334000" cy="2458219"/>
+            <wp:extent cx="5334000" cy="2294266"/>
             <wp:effectExtent b="0" l="0" r="0" t="0"/>
             <wp:docPr descr="Fig. 21.1b Levelized cost of useful compute versus model-FLOPs utilization, and versus launch price. The cost is dominated by utilization and hardware, not by launch." title="" id="95" name="Picture"/>
             <a:graphic>
@@ -27901,7 +27901,7 @@
                   <pic:spPr bwMode="auto">
                     <a:xfrm>
                       <a:off x="0" y="0"/>
-                      <a:ext cx="5334000" cy="2458219"/>
+                      <a:ext cx="5334000" cy="2294266"/>
                     </a:xfrm>
                     <a:prstGeom prst="rect">
                       <a:avLst/>
@@ -27935,7 +27935,7 @@
       <w:r>
         <w:drawing>
           <wp:inline>
-            <wp:extent cx="5334000" cy="2604741"/>
+            <wp:extent cx="5334000" cy="2405396"/>
             <wp:effectExtent b="0" l="0" r="0" t="0"/>
             <wp:docPr descr="Fig. 21.1, Cost of useful compute versus utilization, and the radiation throughput tax by protection level." title="" id="98" name="Picture"/>
             <a:graphic>
@@ -27956,7 +27956,7 @@
                   <pic:spPr bwMode="auto">
                     <a:xfrm>
                       <a:off x="0" y="0"/>
-                      <a:ext cx="5334000" cy="2604741"/>
+                      <a:ext cx="5334000" cy="2405396"/>
                     </a:xfrm>
                     <a:prstGeom prst="rect">
                       <a:avLst/>
@@ -28068,7 +28068,7 @@
       <w:r>
         <w:drawing>
           <wp:inline>
-            <wp:extent cx="5334000" cy="3390824"/>
+            <wp:extent cx="5334000" cy="3081272"/>
             <wp:effectExtent b="0" l="0" r="0" t="0"/>
             <wp:docPr descr="Fig. 22.1. The launch-cost landscape. Left: below roughly 600 dollars per kilogram the all-in cost per satellite is dominated by hardware rather than launch. Right: the price-per-kilogram trajectory to low Earth orbit, from the Shuttle program average through reusable Falcon 9 to the realistic and aspirational Starship targets." title="" id="102" name="Picture"/>
             <a:graphic>
@@ -28089,7 +28089,7 @@
                   <pic:spPr bwMode="auto">
                     <a:xfrm>
                       <a:off x="0" y="0"/>
-                      <a:ext cx="5334000" cy="3390824"/>
+                      <a:ext cx="5334000" cy="3081272"/>
                     </a:xfrm>
                     <a:prstGeom prst="rect">
                       <a:avLst/>
@@ -28253,7 +28253,7 @@
       <w:r>
         <w:drawing>
           <wp:inline>
-            <wp:extent cx="5334000" cy="2619768"/>
+            <wp:extent cx="5334000" cy="2358289"/>
             <wp:effectExtent b="0" l="0" r="0" t="0"/>
             <wp:docPr descr="Fig. 22.2, Launch-cost learning curve (Monte-Carlo) and the distribution of the cost-parity year. Most sampled scenarios never reach 200 dollars per kilogram within the horizon; conditional on those that do, the median is near 2044, later than the vendor’s 2035." title="" id="105" name="Picture"/>
             <a:graphic>
@@ -28274,7 +28274,7 @@
                   <pic:spPr bwMode="auto">
                     <a:xfrm>
                       <a:off x="0" y="0"/>
-                      <a:ext cx="5334000" cy="2619768"/>
+                      <a:ext cx="5334000" cy="2358289"/>
                     </a:xfrm>
                     <a:prstGeom prst="rect">
                       <a:avLst/>
@@ -28684,7 +28684,7 @@
       <w:r>
         <w:drawing>
           <wp:inline>
-            <wp:extent cx="5334000" cy="4249493"/>
+            <wp:extent cx="5334000" cy="3473567"/>
             <wp:effectExtent b="0" l="0" r="0" t="0"/>
             <wp:docPr descr="Fig. 25.1, Systems-level risk matrix: cooling is solved; debris, disposal, and economics are the open items." title="" id="112" name="Picture"/>
             <a:graphic>
@@ -28705,7 +28705,7 @@
                   <pic:spPr bwMode="auto">
                     <a:xfrm>
                       <a:off x="0" y="0"/>
-                      <a:ext cx="5334000" cy="4249493"/>
+                      <a:ext cx="5334000" cy="3473567"/>
                     </a:xfrm>
                     <a:prstGeom prst="rect">
                       <a:avLst/>

</xml_diff>

<commit_message>
Book: per-chapter abstracts (Springer style); NOTEXT animation: hide right spec panel + chapter names
- Add a short italic abstract under every chapter heading (32 chapters), placed
  before the Sources line and rendered as a set-off blockquote in book and HTML.
- animation/orbital_compute_NOTEXT.html: hide the right-side Technical Parameters
  panel and the centred chapter-name display; auto-advance stays off and arrow
  keys move scene-by-scene (verified).

Report now 15,197 words; book, HTML, and Word rebuilt; scans clean.
</commit_message>
<xml_diff>
--- a/report/Report_II_Complete.docx
+++ b/report/Report_II_Complete.docx
@@ -3199,6 +3199,24 @@
     </w:p>
     <w:p>
       <w:pPr>
+        <w:pStyle w:val="BlockText"/>
+      </w:pPr>
+      <w:r>
+        <w:rPr>
+          <w:i/>
+          <w:iCs/>
+        </w:rPr>
+        <w:t xml:space="preserve">Abstract.</w:t>
+      </w:r>
+      <w:r>
+        <w:t xml:space="preserve"> </w:t>
+      </w:r>
+      <w:r>
+        <w:t xml:space="preserve">This chapter sets out the case for examining artificial-intelligence data centers in orbit: the energy and thermal pressure on terrestrial infrastructure, the three real physical advantages of orbit, and the severe penalties that come with them. It states the study’s purpose, a complete first-principles model with an honest separation of demonstrated capability from projection, and how the book is organized.</w:t>
+      </w:r>
+    </w:p>
+    <w:p>
+      <w:pPr>
         <w:pStyle w:val="FirstParagraph"/>
       </w:pPr>
       <w:r>
@@ -3353,6 +3371,24 @@
     </w:p>
     <w:p>
       <w:pPr>
+        <w:pStyle w:val="BlockText"/>
+      </w:pPr>
+      <w:r>
+        <w:rPr>
+          <w:i/>
+          <w:iCs/>
+        </w:rPr>
+        <w:t xml:space="preserve">Abstract.</w:t>
+      </w:r>
+      <w:r>
+        <w:t xml:space="preserve"> </w:t>
+      </w:r>
+      <w:r>
+        <w:t xml:space="preserve">This chapter surveys what has actually flown by 2026, the single accelerator in orbit, the early data-center nodes, and the published constellation reference design, and distinguishes it from what the vision still requires. It also flags the load-bearing role, and the limits, of a non-peer-reviewed vendor preprint.</w:t>
+      </w:r>
+    </w:p>
+    <w:p>
+      <w:pPr>
         <w:pStyle w:val="FirstParagraph"/>
       </w:pPr>
       <w:r>
@@ -3579,6 +3615,24 @@
       </w:pPr>
       <w:r>
         <w:t xml:space="preserve">2A. The original feasibility study: passive cooling of a TPU node</w:t>
+      </w:r>
+    </w:p>
+    <w:p>
+      <w:pPr>
+        <w:pStyle w:val="BlockText"/>
+      </w:pPr>
+      <w:r>
+        <w:rPr>
+          <w:i/>
+          <w:iCs/>
+        </w:rPr>
+        <w:t xml:space="preserve">Abstract.</w:t>
+      </w:r>
+      <w:r>
+        <w:t xml:space="preserve"> </w:t>
+      </w:r>
+      <w:r>
+        <w:t xml:space="preserve">This chapter reproduces the original thermal-feasibility study in full: a 1450-watt node held within its junction-temperature limit at 650 kilometers by passive radiative cooling, with a margin of about fourteen degrees. It records the model, the worked numbers, the single-fault case, and the caveats that motivated the complete analysis that follows.</w:t>
       </w:r>
     </w:p>
     <w:p>
@@ -5582,6 +5636,24 @@
     </w:p>
     <w:p>
       <w:pPr>
+        <w:pStyle w:val="BlockText"/>
+      </w:pPr>
+      <w:r>
+        <w:rPr>
+          <w:i/>
+          <w:iCs/>
+        </w:rPr>
+        <w:t xml:space="preserve">Abstract.</w:t>
+      </w:r>
+      <w:r>
+        <w:t xml:space="preserve"> </w:t>
+      </w:r>
+      <w:r>
+        <w:t xml:space="preserve">This chapter fixes the reference architecture used throughout the book, an eighty-one-satellite, tight-formation constellation in a dawn-dusk sun-synchronous orbit, and states the scope and boundaries of the analysis.</w:t>
+      </w:r>
+    </w:p>
+    <w:p>
+      <w:pPr>
         <w:pStyle w:val="FirstParagraph"/>
       </w:pPr>
       <w:r>
@@ -5683,6 +5755,24 @@
       </w:pPr>
       <w:r>
         <w:t xml:space="preserve">3A. Design methodology, margins, and readiness</w:t>
+      </w:r>
+    </w:p>
+    <w:p>
+      <w:pPr>
+        <w:pStyle w:val="BlockText"/>
+      </w:pPr>
+      <w:r>
+        <w:rPr>
+          <w:i/>
+          <w:iCs/>
+        </w:rPr>
+        <w:t xml:space="preserve">Abstract.</w:t>
+      </w:r>
+      <w:r>
+        <w:t xml:space="preserve"> </w:t>
+      </w:r>
+      <w:r>
+        <w:t xml:space="preserve">This chapter sets the design discipline: the mass-growth and power allowances drawn from established flight practice, and an explicit technology-readiness assessment that locates each capability on the nine-level scale.</w:t>
       </w:r>
     </w:p>
     <w:p>
@@ -6657,6 +6747,24 @@
       </w:pPr>
       <w:r>
         <w:t xml:space="preserve">4. Orbital mechanics of a circular orbit</w:t>
+      </w:r>
+    </w:p>
+    <w:p>
+      <w:pPr>
+        <w:pStyle w:val="BlockText"/>
+      </w:pPr>
+      <w:r>
+        <w:rPr>
+          <w:i/>
+          <w:iCs/>
+        </w:rPr>
+        <w:t xml:space="preserve">Abstract.</w:t>
+      </w:r>
+      <w:r>
+        <w:t xml:space="preserve"> </w:t>
+      </w:r>
+      <w:r>
+        <w:t xml:space="preserve">This chapter derives the small set of circular-orbit quantities, speed, period, and specific energy, on which every later chapter depends, and works the reference orbit as an example.</w:t>
       </w:r>
     </w:p>
     <w:p>
@@ -7731,6 +7839,24 @@
     </w:p>
     <w:p>
       <w:pPr>
+        <w:pStyle w:val="BlockText"/>
+      </w:pPr>
+      <w:r>
+        <w:rPr>
+          <w:i/>
+          <w:iCs/>
+        </w:rPr>
+        <w:t xml:space="preserve">Abstract.</w:t>
+      </w:r>
+      <w:r>
+        <w:t xml:space="preserve"> </w:t>
+      </w:r>
+      <w:r>
+        <w:t xml:space="preserve">This chapter derives the secular nodal precession caused by Earth’s oblateness and the inclination that makes an orbit sun-synchronous, and confirms the reference value of about ninety-eight degrees.</w:t>
+      </w:r>
+    </w:p>
+    <w:p>
+      <w:pPr>
         <w:pStyle w:val="FirstParagraph"/>
       </w:pPr>
       <w:r>
@@ -9812,6 +9938,24 @@
       </w:pPr>
       <w:r>
         <w:t xml:space="preserve">6. Eclipse geometry and the dawn-dusk advantage</w:t>
+      </w:r>
+    </w:p>
+    <w:p>
+      <w:pPr>
+        <w:pStyle w:val="BlockText"/>
+      </w:pPr>
+      <w:r>
+        <w:rPr>
+          <w:i/>
+          <w:iCs/>
+        </w:rPr>
+        <w:t xml:space="preserve">Abstract.</w:t>
+      </w:r>
+      <w:r>
+        <w:t xml:space="preserve"> </w:t>
+      </w:r>
+      <w:r>
+        <w:t xml:space="preserve">This chapter derives the beta angle and the sunlit fraction of the orbit from the cylindrical-shadow geometry, and shows why the dawn-dusk orbit stays sunlit year round.</w:t>
       </w:r>
     </w:p>
     <w:p>
@@ -11598,6 +11742,24 @@
     </w:p>
     <w:p>
       <w:pPr>
+        <w:pStyle w:val="BlockText"/>
+      </w:pPr>
+      <w:r>
+        <w:rPr>
+          <w:i/>
+          <w:iCs/>
+        </w:rPr>
+        <w:t xml:space="preserve">Abstract.</w:t>
+      </w:r>
+      <w:r>
+        <w:t xml:space="preserve"> </w:t>
+      </w:r>
+      <w:r>
+        <w:t xml:space="preserve">This chapter derives the orbital-decay rate from the energy balance under atmospheric drag and integrates it to a mission lifetime, a result that decides compliance with the five-year disposal rule.</w:t>
+      </w:r>
+    </w:p>
+    <w:p>
+      <w:pPr>
         <w:pStyle w:val="FirstParagraph"/>
       </w:pPr>
       <w:r>
@@ -13164,6 +13326,24 @@
     </w:p>
     <w:p>
       <w:pPr>
+        <w:pStyle w:val="BlockText"/>
+      </w:pPr>
+      <w:r>
+        <w:rPr>
+          <w:i/>
+          <w:iCs/>
+        </w:rPr>
+        <w:t xml:space="preserve">Abstract.</w:t>
+      </w:r>
+      <w:r>
+        <w:t xml:space="preserve"> </w:t>
+      </w:r>
+      <w:r>
+        <w:t xml:space="preserve">This chapter treats the two distinct radiation effects, accumulated dose behind shielding and stochastic single-event upsets, and shows that dose is comfortably survivable while upsets impose a bounded throughput tax.</w:t>
+      </w:r>
+    </w:p>
+    <w:p>
+      <w:pPr>
         <w:pStyle w:val="FirstParagraph"/>
       </w:pPr>
       <w:r>
@@ -13708,6 +13888,24 @@
     </w:p>
     <w:p>
       <w:pPr>
+        <w:pStyle w:val="BlockText"/>
+      </w:pPr>
+      <w:r>
+        <w:rPr>
+          <w:i/>
+          <w:iCs/>
+        </w:rPr>
+        <w:t xml:space="preserve">Abstract.</w:t>
+      </w:r>
+      <w:r>
+        <w:t xml:space="preserve"> </w:t>
+      </w:r>
+      <w:r>
+        <w:t xml:space="preserve">This chapter quantifies the debris hazard at the reference altitude: the catastrophic-impact probability for the cluster and the way a single fragmentation couples to neighbours as the spacing tightens.</w:t>
+      </w:r>
+    </w:p>
+    <w:p>
+      <w:pPr>
         <w:pStyle w:val="FirstParagraph"/>
       </w:pPr>
       <w:r>
@@ -14323,6 +14521,24 @@
       </w:pPr>
       <w:r>
         <w:t xml:space="preserve">10. Thermal control</w:t>
+      </w:r>
+    </w:p>
+    <w:p>
+      <w:pPr>
+        <w:pStyle w:val="BlockText"/>
+      </w:pPr>
+      <w:r>
+        <w:rPr>
+          <w:i/>
+          <w:iCs/>
+        </w:rPr>
+        <w:t xml:space="preserve">Abstract.</w:t>
+      </w:r>
+      <w:r>
+        <w:t xml:space="preserve"> </w:t>
+      </w:r>
+      <w:r>
+        <w:t xml:space="preserve">This chapter develops the thermal model, the linear scaling of radiator area with power and the sharper wall at the chip interface, and identifies the power level above which a passive path can no longer cope.</w:t>
       </w:r>
     </w:p>
     <w:p>
@@ -16892,6 +17108,24 @@
     </w:p>
     <w:p>
       <w:pPr>
+        <w:pStyle w:val="BlockText"/>
+      </w:pPr>
+      <w:r>
+        <w:rPr>
+          <w:i/>
+          <w:iCs/>
+        </w:rPr>
+        <w:t xml:space="preserve">Abstract.</w:t>
+      </w:r>
+      <w:r>
+        <w:t xml:space="preserve"> </w:t>
+      </w:r>
+      <w:r>
+        <w:t xml:space="preserve">This chapter sizes the electrical-power subsystem for the dawn-dusk orbit, where near-continuous sunlight makes the battery small and the array sizing the dominant term.</w:t>
+      </w:r>
+    </w:p>
+    <w:p>
+      <w:pPr>
         <w:pStyle w:val="FirstParagraph"/>
       </w:pPr>
       <w:r>
@@ -17972,6 +18206,24 @@
       </w:pPr>
       <w:r>
         <w:t xml:space="preserve">12. Structures and mass</w:t>
+      </w:r>
+    </w:p>
+    <w:p>
+      <w:pPr>
+        <w:pStyle w:val="BlockText"/>
+      </w:pPr>
+      <w:r>
+        <w:rPr>
+          <w:i/>
+          <w:iCs/>
+        </w:rPr>
+        <w:t xml:space="preserve">Abstract.</w:t>
+      </w:r>
+      <w:r>
+        <w:t xml:space="preserve"> </w:t>
+      </w:r>
+      <w:r>
+        <w:t xml:space="preserve">This chapter estimates the structural and mass properties, the inertia tensor, the structural mass set by launch loads, and the panel modal frequency, that feed the attitude and integration analyses.</w:t>
       </w:r>
     </w:p>
     <w:p>
@@ -18909,6 +19161,24 @@
     </w:p>
     <w:p>
       <w:pPr>
+        <w:pStyle w:val="BlockText"/>
+      </w:pPr>
+      <w:r>
+        <w:rPr>
+          <w:i/>
+          <w:iCs/>
+        </w:rPr>
+        <w:t xml:space="preserve">Abstract.</w:t>
+      </w:r>
+      <w:r>
+        <w:t xml:space="preserve"> </w:t>
+      </w:r>
+      <w:r>
+        <w:t xml:space="preserve">This chapter treats attitude determination and control and the much finer pointing the optical links demand, showing why a fast-steering mirror is required on top of the spacecraft bus.</w:t>
+      </w:r>
+    </w:p>
+    <w:p>
+      <w:pPr>
         <w:pStyle w:val="FirstParagraph"/>
       </w:pPr>
       <w:r>
@@ -19642,6 +19912,24 @@
       </w:pPr>
       <w:r>
         <w:t xml:space="preserve">14. Communications: inter-satellite and ground</w:t>
+      </w:r>
+    </w:p>
+    <w:p>
+      <w:pPr>
+        <w:pStyle w:val="BlockText"/>
+      </w:pPr>
+      <w:r>
+        <w:rPr>
+          <w:i/>
+          <w:iCs/>
+        </w:rPr>
+        <w:t xml:space="preserve">Abstract.</w:t>
+      </w:r>
+      <w:r>
+        <w:t xml:space="preserve"> </w:t>
+      </w:r>
+      <w:r>
+        <w:t xml:space="preserve">This chapter develops the inter-satellite and ground communications link budgets and shows how the inverse-square behaviour of an optical beam forces the satellites into a tight formation.</w:t>
       </w:r>
     </w:p>
     <w:p>
@@ -20833,6 +21121,24 @@
       </w:pPr>
       <w:r>
         <w:t xml:space="preserve">15. Propulsion and end-of-life disposal</w:t>
+      </w:r>
+    </w:p>
+    <w:p>
+      <w:pPr>
+        <w:pStyle w:val="BlockText"/>
+      </w:pPr>
+      <w:r>
+        <w:rPr>
+          <w:i/>
+          <w:iCs/>
+        </w:rPr>
+        <w:t xml:space="preserve">Abstract.</w:t>
+      </w:r>
+      <w:r>
+        <w:t xml:space="preserve"> </w:t>
+      </w:r>
+      <w:r>
+        <w:t xml:space="preserve">This chapter sizes the propulsion subsystem and the controlled end-of-life disposal, and shows that the de-orbit maneuver dominates the mission velocity budget.</w:t>
       </w:r>
     </w:p>
     <w:p>
@@ -21966,6 +22272,24 @@
     </w:p>
     <w:p>
       <w:pPr>
+        <w:pStyle w:val="BlockText"/>
+      </w:pPr>
+      <w:r>
+        <w:rPr>
+          <w:i/>
+          <w:iCs/>
+        </w:rPr>
+        <w:t xml:space="preserve">Abstract.</w:t>
+      </w:r>
+      <w:r>
+        <w:t xml:space="preserve"> </w:t>
+      </w:r>
+      <w:r>
+        <w:t xml:space="preserve">This chapter develops reliability and constellation availability: exponential survival, k-of-n redundancy, and the continuous replenishment needed to hold capacity over the mission.</w:t>
+      </w:r>
+    </w:p>
+    <w:p>
+      <w:pPr>
         <w:pStyle w:val="FirstParagraph"/>
       </w:pPr>
       <w:r>
@@ -23636,6 +23960,24 @@
     </w:p>
     <w:p>
       <w:pPr>
+        <w:pStyle w:val="BlockText"/>
+      </w:pPr>
+      <w:r>
+        <w:rPr>
+          <w:i/>
+          <w:iCs/>
+        </w:rPr>
+        <w:t xml:space="preserve">Abstract.</w:t>
+      </w:r>
+      <w:r>
+        <w:t xml:space="preserve"> </w:t>
+      </w:r>
+      <w:r>
+        <w:t xml:space="preserve">This chapter relates peak hardware capability to the compute that is actually delivered, after utilization, the radiation tax, and thermal throttling are accounted for.</w:t>
+      </w:r>
+    </w:p>
+    <w:p>
+      <w:pPr>
         <w:pStyle w:val="FirstParagraph"/>
       </w:pPr>
       <w:r>
@@ -24210,6 +24552,24 @@
     </w:p>
     <w:p>
       <w:pPr>
+        <w:pStyle w:val="BlockText"/>
+      </w:pPr>
+      <w:r>
+        <w:rPr>
+          <w:i/>
+          <w:iCs/>
+        </w:rPr>
+        <w:t xml:space="preserve">Abstract.</w:t>
+      </w:r>
+      <w:r>
+        <w:t xml:space="preserve"> </w:t>
+      </w:r>
+      <w:r>
+        <w:t xml:space="preserve">This chapter closes the integrated system: mass, power, thermal, and velocity budgets are solved self-consistently for the reference design point.</w:t>
+      </w:r>
+    </w:p>
+    <w:p>
+      <w:pPr>
         <w:pStyle w:val="FirstParagraph"/>
       </w:pPr>
       <w:r>
@@ -24419,6 +24779,24 @@
     </w:p>
     <w:p>
       <w:pPr>
+        <w:pStyle w:val="BlockText"/>
+      </w:pPr>
+      <w:r>
+        <w:rPr>
+          <w:i/>
+          <w:iCs/>
+        </w:rPr>
+        <w:t xml:space="preserve">Abstract.</w:t>
+      </w:r>
+      <w:r>
+        <w:t xml:space="preserve"> </w:t>
+      </w:r>
+      <w:r>
+        <w:t xml:space="preserve">This chapter documents the numerical methods, root-finding and time integration, used to solve the governing equations, and the checks that anchor them to known results.</w:t>
+      </w:r>
+    </w:p>
+    <w:p>
+      <w:pPr>
         <w:pStyle w:val="FirstParagraph"/>
       </w:pPr>
       <w:r>
@@ -25733,6 +26111,24 @@
       </w:pPr>
       <w:r>
         <w:t xml:space="preserve">19. Uncertainty quantification and sensitivity</w:t>
+      </w:r>
+    </w:p>
+    <w:p>
+      <w:pPr>
+        <w:pStyle w:val="BlockText"/>
+      </w:pPr>
+      <w:r>
+        <w:rPr>
+          <w:i/>
+          <w:iCs/>
+        </w:rPr>
+        <w:t xml:space="preserve">Abstract.</w:t>
+      </w:r>
+      <w:r>
+        <w:t xml:space="preserve"> </w:t>
+      </w:r>
+      <w:r>
+        <w:t xml:space="preserve">This chapter places uncertainty bands on the headline results by linear error propagation and Monte-Carlo, and identifies the inputs to which the conclusions are most sensitive.</w:t>
       </w:r>
     </w:p>
     <w:p>
@@ -26361,6 +26757,24 @@
     </w:p>
     <w:p>
       <w:pPr>
+        <w:pStyle w:val="BlockText"/>
+      </w:pPr>
+      <w:r>
+        <w:rPr>
+          <w:i/>
+          <w:iCs/>
+        </w:rPr>
+        <w:t xml:space="preserve">Abstract.</w:t>
+      </w:r>
+      <w:r>
+        <w:t xml:space="preserve"> </w:t>
+      </w:r>
+      <w:r>
+        <w:t xml:space="preserve">This chapter collects the reference design-point and constellation results, the numbers that the rest of the book derives and the open model reproduces.</w:t>
+      </w:r>
+    </w:p>
+    <w:p>
+      <w:pPr>
         <w:pStyle w:val="FirstParagraph"/>
       </w:pPr>
       <w:r>
@@ -26941,6 +27355,24 @@
       </w:pPr>
       <w:r>
         <w:t xml:space="preserve">21. Techno-economics: cost, NPV, and the levelized cost of compute</w:t>
+      </w:r>
+    </w:p>
+    <w:p>
+      <w:pPr>
+        <w:pStyle w:val="BlockText"/>
+      </w:pPr>
+      <w:r>
+        <w:rPr>
+          <w:i/>
+          <w:iCs/>
+        </w:rPr>
+        <w:t xml:space="preserve">Abstract.</w:t>
+      </w:r>
+      <w:r>
+        <w:t xml:space="preserve"> </w:t>
+      </w:r>
+      <w:r>
+        <w:t xml:space="preserve">This chapter develops the techno-economics, capital and operating cost, net present value, and the levelized cost of useful compute.</w:t>
       </w:r>
     </w:p>
     <w:p>
@@ -27995,6 +28427,24 @@
     </w:p>
     <w:p>
       <w:pPr>
+        <w:pStyle w:val="BlockText"/>
+      </w:pPr>
+      <w:r>
+        <w:rPr>
+          <w:i/>
+          <w:iCs/>
+        </w:rPr>
+        <w:t xml:space="preserve">Abstract.</w:t>
+      </w:r>
+      <w:r>
+        <w:t xml:space="preserve"> </w:t>
+      </w:r>
+      <w:r>
+        <w:t xml:space="preserve">This chapter tests the launch-cost-parity assumption that underwrites the business case, and finds that most sampled futures never reach the target price within the horizon, with parity, where it arrives, falling later than the headline date.</w:t>
+      </w:r>
+    </w:p>
+    <w:p>
+      <w:pPr>
         <w:pStyle w:val="FirstParagraph"/>
       </w:pPr>
       <w:r>
@@ -28313,6 +28763,24 @@
     </w:p>
     <w:p>
       <w:pPr>
+        <w:pStyle w:val="BlockText"/>
+      </w:pPr>
+      <w:r>
+        <w:rPr>
+          <w:i/>
+          <w:iCs/>
+        </w:rPr>
+        <w:t xml:space="preserve">Abstract.</w:t>
+      </w:r>
+      <w:r>
+        <w:t xml:space="preserve"> </w:t>
+      </w:r>
+      <w:r>
+        <w:t xml:space="preserve">This chapter synthesizes the preceding analysis into a defensible capability and risk trajectory through the early 2030s, and names the gating demonstrations.</w:t>
+      </w:r>
+    </w:p>
+    <w:p>
+      <w:pPr>
         <w:pStyle w:val="FirstParagraph"/>
       </w:pPr>
       <w:r>
@@ -28428,6 +28896,24 @@
     </w:p>
     <w:p>
       <w:pPr>
+        <w:pStyle w:val="BlockText"/>
+      </w:pPr>
+      <w:r>
+        <w:rPr>
+          <w:i/>
+          <w:iCs/>
+        </w:rPr>
+        <w:t xml:space="preserve">Abstract.</w:t>
+      </w:r>
+      <w:r>
+        <w:t xml:space="preserve"> </w:t>
+      </w:r>
+      <w:r>
+        <w:t xml:space="preserve">This chapter states plainly what the study does and does not establish, including the quality of its sources and the model fidelity it deliberately stops short of.</w:t>
+      </w:r>
+    </w:p>
+    <w:p>
+      <w:pPr>
         <w:pStyle w:val="FirstParagraph"/>
       </w:pPr>
       <w:r>
@@ -28557,6 +29043,24 @@
       </w:pPr>
       <w:r>
         <w:t xml:space="preserve">25. Conclusions and the recommended demonstrator</w:t>
+      </w:r>
+    </w:p>
+    <w:p>
+      <w:pPr>
+        <w:pStyle w:val="BlockText"/>
+      </w:pPr>
+      <w:r>
+        <w:rPr>
+          <w:i/>
+          <w:iCs/>
+        </w:rPr>
+        <w:t xml:space="preserve">Abstract.</w:t>
+      </w:r>
+      <w:r>
+        <w:t xml:space="preserve"> </w:t>
+      </w:r>
+      <w:r>
+        <w:t xml:space="preserve">This chapter draws the conclusions and recommends the program that the analysis supports: small, attritable demonstrators aimed at the binding survivability and autonomy risks.</w:t>
       </w:r>
     </w:p>
     <w:p>
@@ -28768,6 +29272,24 @@
     </w:p>
     <w:p>
       <w:pPr>
+        <w:pStyle w:val="BlockText"/>
+      </w:pPr>
+      <w:r>
+        <w:rPr>
+          <w:i/>
+          <w:iCs/>
+        </w:rPr>
+        <w:t xml:space="preserve">Abstract.</w:t>
+      </w:r>
+      <w:r>
+        <w:t xml:space="preserve"> </w:t>
+      </w:r>
+      <w:r>
+        <w:t xml:space="preserve">This chapter carries a single design point end to end, from orbit through thermal, link, disposal, and compute, so the chain from principle to number can be followed in one place.</w:t>
+      </w:r>
+    </w:p>
+    <w:p>
+      <w:pPr>
         <w:pStyle w:val="FirstParagraph"/>
       </w:pPr>
       <w:r>
@@ -28916,6 +29438,24 @@
       </w:pPr>
       <w:r>
         <w:t xml:space="preserve">27. Detailed results tables</w:t>
+      </w:r>
+    </w:p>
+    <w:p>
+      <w:pPr>
+        <w:pStyle w:val="BlockText"/>
+      </w:pPr>
+      <w:r>
+        <w:rPr>
+          <w:i/>
+          <w:iCs/>
+        </w:rPr>
+        <w:t xml:space="preserve">Abstract.</w:t>
+      </w:r>
+      <w:r>
+        <w:t xml:space="preserve"> </w:t>
+      </w:r>
+      <w:r>
+        <w:t xml:space="preserve">This chapter tabulates the detailed numerical results that support the figures and conclusions of the preceding parts.</w:t>
       </w:r>
     </w:p>
     <w:p>
@@ -32624,6 +33164,24 @@
     </w:p>
     <w:p>
       <w:pPr>
+        <w:pStyle w:val="BlockText"/>
+      </w:pPr>
+      <w:r>
+        <w:rPr>
+          <w:i/>
+          <w:iCs/>
+        </w:rPr>
+        <w:t xml:space="preserve">Abstract.</w:t>
+      </w:r>
+      <w:r>
+        <w:t xml:space="preserve"> </w:t>
+      </w:r>
+      <w:r>
+        <w:t xml:space="preserve">This chapter treats the relative dynamics of the tight formation, the Clohessy-Wiltshire relations and the station-keeping they imply.</w:t>
+      </w:r>
+    </w:p>
+    <w:p>
+      <w:pPr>
         <w:pStyle w:val="FirstParagraph"/>
       </w:pPr>
       <w:r>
@@ -33082,6 +33640,24 @@
       </w:pPr>
       <w:r>
         <w:t xml:space="preserve">29. Comparison with terrestrial data centers</w:t>
+      </w:r>
+    </w:p>
+    <w:p>
+      <w:pPr>
+        <w:pStyle w:val="BlockText"/>
+      </w:pPr>
+      <w:r>
+        <w:rPr>
+          <w:i/>
+          <w:iCs/>
+        </w:rPr>
+        <w:t xml:space="preserve">Abstract.</w:t>
+      </w:r>
+      <w:r>
+        <w:t xml:space="preserve"> </w:t>
+      </w:r>
+      <w:r>
+        <w:t xml:space="preserve">This chapter sets the orbital architecture against terrestrial hyperscale data centers, dimension by dimension, to locate where each genuinely differs.</w:t>
       </w:r>
     </w:p>
     <w:p>

</xml_diff>

<commit_message>
Figures: fold panel descriptions into captions (plots keep only (a)/(b) labels)
Shorten the descriptive panel sub-titles in all four generators to a bare panel
letter, e.g. set_title('(a) Cooling scales linearly with power') -> '(a)'. The
panel descriptions are carried by the figure captions, which already describe the
content. Regenerated all figures; rebuilt book, report HTML/Word, and the
LinkedIn article.
</commit_message>
<xml_diff>
--- a/report/Report_II_Complete.docx
+++ b/report/Report_II_Complete.docx
@@ -22212,7 +22212,7 @@
       <w:r>
         <w:drawing>
           <wp:inline>
-            <wp:extent cx="5334000" cy="3069709"/>
+            <wp:extent cx="5334000" cy="2948136"/>
             <wp:effectExtent b="0" l="0" r="0" t="0"/>
             <wp:docPr descr="Fig. 15.1, Per-satellite Δv budget (de-orbit dominates) and propellant mass by propulsion type." title="" id="65" name="Picture"/>
             <a:graphic>
@@ -22233,7 +22233,7 @@
                   <pic:spPr bwMode="auto">
                     <a:xfrm>
                       <a:off x="0" y="0"/>
-                      <a:ext cx="5334000" cy="3069709"/>
+                      <a:ext cx="5334000" cy="2948136"/>
                     </a:xfrm>
                     <a:prstGeom prst="rect">
                       <a:avLst/>
@@ -27227,7 +27227,7 @@
       <w:r>
         <w:drawing>
           <wp:inline>
-            <wp:extent cx="5334000" cy="3216896"/>
+            <wp:extent cx="5334000" cy="3247989"/>
             <wp:effectExtent b="0" l="0" r="0" t="0"/>
             <wp:docPr descr="Fig. 20.1, Catastrophic debris risk for the full cluster, and the in-cluster cascade coupling versus formation spacing." title="" id="87" name="Picture"/>
             <a:graphic>
@@ -27248,7 +27248,7 @@
                   <pic:spPr bwMode="auto">
                     <a:xfrm>
                       <a:off x="0" y="0"/>
-                      <a:ext cx="5334000" cy="3216896"/>
+                      <a:ext cx="5334000" cy="3247989"/>
                     </a:xfrm>
                     <a:prstGeom prst="rect">
                       <a:avLst/>
@@ -28703,7 +28703,7 @@
       <w:r>
         <w:drawing>
           <wp:inline>
-            <wp:extent cx="5334000" cy="2358289"/>
+            <wp:extent cx="5334000" cy="2376725"/>
             <wp:effectExtent b="0" l="0" r="0" t="0"/>
             <wp:docPr descr="Fig. 22.2, Launch-cost learning curve (Monte-Carlo) and the distribution of the cost-parity year. Most sampled scenarios never reach 200 dollars per kilogram within the horizon; conditional on those that do, the median is near 2044, later than the vendor’s 2035." title="" id="105" name="Picture"/>
             <a:graphic>
@@ -28724,7 +28724,7 @@
                   <pic:spPr bwMode="auto">
                     <a:xfrm>
                       <a:off x="0" y="0"/>
-                      <a:ext cx="5334000" cy="2358289"/>
+                      <a:ext cx="5334000" cy="2376725"/>
                     </a:xfrm>
                     <a:prstGeom prst="rect">
                       <a:avLst/>

</xml_diff>

<commit_message>
Book: professional full-bleed cover + add 11 geometry schematics
- New designed A4 cover (book/make_cover_art.py -> cover_art.png): the orbital
  render in a navy field with the series title 'Space-Based Data Center
  Infrastructure: A Multi-Physics Approach', badge, description, author. Used
  full-bleed as the book's first page (cover.tex); colophon, running header,
  and PDF title aligned to the series title.
- Add the 11 geometry schematics (orbit, constellation, beta, thermal, shield,
  formation, link, pointing, hohmann, compute, TRL) into the relevant chapters
  (report/schematics/), so the book now carries 33 figures alongside the 35
  equations, 9 code listings, and 21 tables. Report HTML/Word rebuilt.
</commit_message>
<xml_diff>
--- a/report/Report_II_Complete.docx
+++ b/report/Report_II_Complete.docx
@@ -3179,7 +3179,7 @@
     </w:p>
     <w:bookmarkEnd w:id="14"/>
     <w:bookmarkEnd w:id="15"/>
-    <w:bookmarkStart w:id="21" w:name="part-i-introduction-and-context"/>
+    <w:bookmarkStart w:id="24" w:name="part-i-introduction-and-context"/>
     <w:p>
       <w:pPr>
         <w:pStyle w:val="Heading1"/>
@@ -5625,7 +5625,7 @@
       </w:r>
     </w:p>
     <w:bookmarkEnd w:id="18"/>
-    <w:bookmarkStart w:id="19" w:name="reference-architecture-and-scope"/>
+    <w:bookmarkStart w:id="22" w:name="reference-architecture-and-scope"/>
     <w:p>
       <w:pPr>
         <w:pStyle w:val="Heading2"/>
@@ -5654,7 +5654,62 @@
     </w:p>
     <w:p>
       <w:pPr>
-        <w:pStyle w:val="FirstParagraph"/>
+        <w:pStyle w:val="CaptionedFigure"/>
+      </w:pPr>
+      <w:r>
+        <w:drawing>
+          <wp:inline>
+            <wp:extent cx="5334000" cy="3619500"/>
+            <wp:effectExtent b="0" l="0" r="0" t="0"/>
+            <wp:docPr descr="Top view of the reference cluster: about eighty satellites within a one-kilometre circle, linked by laser at roughly one hundred and fifty metre spacing." title="" id="20" name="Picture"/>
+            <a:graphic>
+              <a:graphicData uri="http://schemas.openxmlformats.org/drawingml/2006/picture">
+                <pic:pic>
+                  <pic:nvPicPr>
+                    <pic:cNvPr descr="schematics/diagram_constellation.png" id="21" name="Picture"/>
+                    <pic:cNvPicPr>
+                      <a:picLocks noChangeArrowheads="1" noChangeAspect="1"/>
+                    </pic:cNvPicPr>
+                  </pic:nvPicPr>
+                  <pic:blipFill>
+                    <a:blip r:embed="rId19"/>
+                    <a:stretch>
+                      <a:fillRect/>
+                    </a:stretch>
+                  </pic:blipFill>
+                  <pic:spPr bwMode="auto">
+                    <a:xfrm>
+                      <a:off x="0" y="0"/>
+                      <a:ext cx="5334000" cy="3619500"/>
+                    </a:xfrm>
+                    <a:prstGeom prst="rect">
+                      <a:avLst/>
+                    </a:prstGeom>
+                    <a:noFill/>
+                    <a:ln w="9525">
+                      <a:noFill/>
+                      <a:headEnd/>
+                      <a:tailEnd/>
+                    </a:ln>
+                  </pic:spPr>
+                </pic:pic>
+              </a:graphicData>
+            </a:graphic>
+          </wp:inline>
+        </w:drawing>
+      </w:r>
+    </w:p>
+    <w:p>
+      <w:pPr>
+        <w:pStyle w:val="ImageCaption"/>
+      </w:pPr>
+      <w:r>
+        <w:t xml:space="preserve">Top view of the reference cluster: about eighty satellites within a one-kilometre circle, linked by laser at roughly one hundred and fifty metre spacing.</w:t>
+      </w:r>
+    </w:p>
+    <w:p>
+      <w:pPr>
+        <w:pStyle w:val="BodyText"/>
       </w:pPr>
       <w:r>
         <w:t xml:space="preserve">Throughout this analysis the reference design follows the Suncatcher parameters: a dawn-dusk</w:t>
@@ -5747,8 +5802,8 @@
         </w:pict>
       </w:r>
     </w:p>
-    <w:bookmarkEnd w:id="19"/>
-    <w:bookmarkStart w:id="20" w:name="Xfc230b641c8ac1af95bb2946bc374ee51dc38ae"/>
+    <w:bookmarkEnd w:id="22"/>
+    <w:bookmarkStart w:id="23" w:name="Xfc230b641c8ac1af95bb2946bc374ee51dc38ae"/>
     <w:p>
       <w:pPr>
         <w:pStyle w:val="Heading2"/>
@@ -6729,9 +6784,9 @@
         </w:pict>
       </w:r>
     </w:p>
-    <w:bookmarkEnd w:id="20"/>
-    <w:bookmarkEnd w:id="21"/>
-    <w:bookmarkStart w:id="37" w:name="part-ii-the-orbital-environment"/>
+    <w:bookmarkEnd w:id="23"/>
+    <w:bookmarkEnd w:id="24"/>
+    <w:bookmarkStart w:id="52" w:name="part-ii-the-orbital-environment"/>
     <w:p>
       <w:pPr>
         <w:pStyle w:val="Heading1"/>
@@ -6740,7 +6795,7 @@
         <w:t xml:space="preserve">PART II, THE ORBITAL ENVIRONMENT</w:t>
       </w:r>
     </w:p>
-    <w:bookmarkStart w:id="22" w:name="orbital-mechanics-of-a-circular-orbit"/>
+    <w:bookmarkStart w:id="25" w:name="orbital-mechanics-of-a-circular-orbit"/>
     <w:p>
       <w:pPr>
         <w:pStyle w:val="Heading2"/>
@@ -7827,8 +7882,8 @@
         <w:t xml:space="preserve">.</w:t>
       </w:r>
     </w:p>
-    <w:bookmarkEnd w:id="22"/>
-    <w:bookmarkStart w:id="23" w:name="sun-synchronous-orbits-and-j2-precession"/>
+    <w:bookmarkEnd w:id="25"/>
+    <w:bookmarkStart w:id="29" w:name="sun-synchronous-orbits-and-j2-precession"/>
     <w:p>
       <w:pPr>
         <w:pStyle w:val="Heading2"/>
@@ -7857,7 +7912,62 @@
     </w:p>
     <w:p>
       <w:pPr>
-        <w:pStyle w:val="FirstParagraph"/>
+        <w:pStyle w:val="CaptionedFigure"/>
+      </w:pPr>
+      <w:r>
+        <w:drawing>
+          <wp:inline>
+            <wp:extent cx="5334000" cy="2370666"/>
+            <wp:effectExtent b="0" l="0" r="0" t="0"/>
+            <wp:docPr descr="The dawn-dusk sun-synchronous orbit, with the orbital plane held on the day-night terminator so the satellite stays sunlit." title="" id="27" name="Picture"/>
+            <a:graphic>
+              <a:graphicData uri="http://schemas.openxmlformats.org/drawingml/2006/picture">
+                <pic:pic>
+                  <pic:nvPicPr>
+                    <pic:cNvPr descr="schematics/diagram_orbit.png" id="28" name="Picture"/>
+                    <pic:cNvPicPr>
+                      <a:picLocks noChangeArrowheads="1" noChangeAspect="1"/>
+                    </pic:cNvPicPr>
+                  </pic:nvPicPr>
+                  <pic:blipFill>
+                    <a:blip r:embed="rId26"/>
+                    <a:stretch>
+                      <a:fillRect/>
+                    </a:stretch>
+                  </pic:blipFill>
+                  <pic:spPr bwMode="auto">
+                    <a:xfrm>
+                      <a:off x="0" y="0"/>
+                      <a:ext cx="5334000" cy="2370666"/>
+                    </a:xfrm>
+                    <a:prstGeom prst="rect">
+                      <a:avLst/>
+                    </a:prstGeom>
+                    <a:noFill/>
+                    <a:ln w="9525">
+                      <a:noFill/>
+                      <a:headEnd/>
+                      <a:tailEnd/>
+                    </a:ln>
+                  </pic:spPr>
+                </pic:pic>
+              </a:graphicData>
+            </a:graphic>
+          </wp:inline>
+        </w:drawing>
+      </w:r>
+    </w:p>
+    <w:p>
+      <w:pPr>
+        <w:pStyle w:val="ImageCaption"/>
+      </w:pPr>
+      <w:r>
+        <w:t xml:space="preserve">The dawn-dusk sun-synchronous orbit, with the orbital plane held on the day-night terminator so the satellite stays sunlit.</w:t>
+      </w:r>
+    </w:p>
+    <w:p>
+      <w:pPr>
+        <w:pStyle w:val="BodyText"/>
       </w:pPr>
       <w:r>
         <w:rPr>
@@ -9930,8 +10040,8 @@
         <w:t xml:space="preserve">cycling, a decisive advantage for a high-power, thermally sensitive payload.</w:t>
       </w:r>
     </w:p>
-    <w:bookmarkEnd w:id="23"/>
-    <w:bookmarkStart w:id="27" w:name="X5d8eb5df9ce872601c783d8f232c04d346f88c7"/>
+    <w:bookmarkEnd w:id="29"/>
+    <w:bookmarkStart w:id="36" w:name="X5d8eb5df9ce872601c783d8f232c04d346f88c7"/>
     <w:p>
       <w:pPr>
         <w:pStyle w:val="Heading2"/>
@@ -9960,7 +10070,62 @@
     </w:p>
     <w:p>
       <w:pPr>
-        <w:pStyle w:val="FirstParagraph"/>
+        <w:pStyle w:val="CaptionedFigure"/>
+      </w:pPr>
+      <w:r>
+        <w:drawing>
+          <wp:inline>
+            <wp:extent cx="5334000" cy="2222500"/>
+            <wp:effectExtent b="0" l="0" r="0" t="0"/>
+            <wp:docPr descr="The beta angle between the orbit plane and the Sun line, set against Earth’s shadow; a high beta keeps the orbit out of eclipse." title="" id="31" name="Picture"/>
+            <a:graphic>
+              <a:graphicData uri="http://schemas.openxmlformats.org/drawingml/2006/picture">
+                <pic:pic>
+                  <pic:nvPicPr>
+                    <pic:cNvPr descr="schematics/diagram_beta.png" id="32" name="Picture"/>
+                    <pic:cNvPicPr>
+                      <a:picLocks noChangeArrowheads="1" noChangeAspect="1"/>
+                    </pic:cNvPicPr>
+                  </pic:nvPicPr>
+                  <pic:blipFill>
+                    <a:blip r:embed="rId30"/>
+                    <a:stretch>
+                      <a:fillRect/>
+                    </a:stretch>
+                  </pic:blipFill>
+                  <pic:spPr bwMode="auto">
+                    <a:xfrm>
+                      <a:off x="0" y="0"/>
+                      <a:ext cx="5334000" cy="2222500"/>
+                    </a:xfrm>
+                    <a:prstGeom prst="rect">
+                      <a:avLst/>
+                    </a:prstGeom>
+                    <a:noFill/>
+                    <a:ln w="9525">
+                      <a:noFill/>
+                      <a:headEnd/>
+                      <a:tailEnd/>
+                    </a:ln>
+                  </pic:spPr>
+                </pic:pic>
+              </a:graphicData>
+            </a:graphic>
+          </wp:inline>
+        </w:drawing>
+      </w:r>
+    </w:p>
+    <w:p>
+      <w:pPr>
+        <w:pStyle w:val="ImageCaption"/>
+      </w:pPr>
+      <w:r>
+        <w:t xml:space="preserve">The beta angle between the orbit plane and the Sun line, set against Earth’s shadow; a high beta keeps the orbit out of eclipse.</w:t>
+      </w:r>
+    </w:p>
+    <w:p>
+      <w:pPr>
+        <w:pStyle w:val="BodyText"/>
       </w:pPr>
       <w:r>
         <w:rPr>
@@ -11684,18 +11849,18 @@
           <wp:inline>
             <wp:extent cx="5334000" cy="2294266"/>
             <wp:effectExtent b="0" l="0" r="0" t="0"/>
-            <wp:docPr descr="Fig. 6.1 Critical beta angle versus altitude, and eclipse fraction versus beta at 650 km. A dawn-dusk orbit holds the beta angle high, so the satellite stays sunlit." title="" id="25" name="Picture"/>
+            <wp:docPr descr="Fig. 6.1 Critical beta angle versus altitude, and eclipse fraction versus beta at 650 km. A dawn-dusk orbit holds the beta angle high, so the satellite stays sunlit." title="" id="34" name="Picture"/>
             <a:graphic>
               <a:graphicData uri="http://schemas.openxmlformats.org/drawingml/2006/picture">
                 <pic:pic>
                   <pic:nvPicPr>
-                    <pic:cNvPr descr="figures2/figA1_eclipse.png" id="26" name="Picture"/>
+                    <pic:cNvPr descr="figures2/figA1_eclipse.png" id="35" name="Picture"/>
                     <pic:cNvPicPr>
                       <a:picLocks noChangeArrowheads="1" noChangeAspect="1"/>
                     </pic:cNvPicPr>
                   </pic:nvPicPr>
                   <pic:blipFill>
-                    <a:blip r:embed="rId24"/>
+                    <a:blip r:embed="rId33"/>
                     <a:stretch>
                       <a:fillRect/>
                     </a:stretch>
@@ -11730,8 +11895,8 @@
         <w:t xml:space="preserve">Fig. 6.1 Critical beta angle versus altitude, and eclipse fraction versus beta at 650 km. A dawn-dusk orbit holds the beta angle high, so the satellite stays sunlit.</w:t>
       </w:r>
     </w:p>
-    <w:bookmarkEnd w:id="27"/>
-    <w:bookmarkStart w:id="31" w:name="the-neutral-atmosphere-and-orbital-decay"/>
+    <w:bookmarkEnd w:id="36"/>
+    <w:bookmarkStart w:id="40" w:name="the-neutral-atmosphere-and-orbital-decay"/>
     <w:p>
       <w:pPr>
         <w:pStyle w:val="Heading2"/>
@@ -13268,18 +13433,18 @@
           <wp:inline>
             <wp:extent cx="5334000" cy="3393613"/>
             <wp:effectExtent b="0" l="0" r="0" t="0"/>
-            <wp:docPr descr="Fig. 7.1, Natural orbital lifetime versus altitude with the solar-cycle uncertainty band; at 650 km the realistic lifetime fails the five-year disposal rule." title="" id="29" name="Picture"/>
+            <wp:docPr descr="Fig. 7.1, Natural orbital lifetime versus altitude with the solar-cycle uncertainty band; at 650 km the realistic lifetime fails the five-year disposal rule." title="" id="38" name="Picture"/>
             <a:graphic>
               <a:graphicData uri="http://schemas.openxmlformats.org/drawingml/2006/picture">
                 <pic:pic>
                   <pic:nvPicPr>
-                    <pic:cNvPr descr="figures/fig1_orbital_decay.png" id="30" name="Picture"/>
+                    <pic:cNvPr descr="figures/fig1_orbital_decay.png" id="39" name="Picture"/>
                     <pic:cNvPicPr>
                       <a:picLocks noChangeArrowheads="1" noChangeAspect="1"/>
                     </pic:cNvPicPr>
                   </pic:nvPicPr>
                   <pic:blipFill>
-                    <a:blip r:embed="rId28"/>
+                    <a:blip r:embed="rId37"/>
                     <a:stretch>
                       <a:fillRect/>
                     </a:stretch>
@@ -13314,8 +13479,8 @@
         <w:t xml:space="preserve">Fig. 7.1, Natural orbital lifetime versus altitude with the solar-cycle uncertainty band; at 650 km the realistic lifetime fails the five-year disposal rule.</w:t>
       </w:r>
     </w:p>
-    <w:bookmarkEnd w:id="31"/>
-    <w:bookmarkStart w:id="35" w:name="the-ionizing-radiation-environment"/>
+    <w:bookmarkEnd w:id="40"/>
+    <w:bookmarkStart w:id="47" w:name="the-ionizing-radiation-environment"/>
     <w:p>
       <w:pPr>
         <w:pStyle w:val="Heading2"/>
@@ -13344,7 +13509,62 @@
     </w:p>
     <w:p>
       <w:pPr>
-        <w:pStyle w:val="FirstParagraph"/>
+        <w:pStyle w:val="CaptionedFigure"/>
+      </w:pPr>
+      <w:r>
+        <w:drawing>
+          <wp:inline>
+            <wp:extent cx="5334000" cy="1629833"/>
+            <wp:effectExtent b="0" l="0" r="0" t="0"/>
+            <wp:docPr descr="Radiation shielding and single-event upsets: aluminium attenuates the accumulated dose, while error correction and checkpointing handle upsets." title="" id="42" name="Picture"/>
+            <a:graphic>
+              <a:graphicData uri="http://schemas.openxmlformats.org/drawingml/2006/picture">
+                <pic:pic>
+                  <pic:nvPicPr>
+                    <pic:cNvPr descr="schematics/diagram_shield.png" id="43" name="Picture"/>
+                    <pic:cNvPicPr>
+                      <a:picLocks noChangeArrowheads="1" noChangeAspect="1"/>
+                    </pic:cNvPicPr>
+                  </pic:nvPicPr>
+                  <pic:blipFill>
+                    <a:blip r:embed="rId41"/>
+                    <a:stretch>
+                      <a:fillRect/>
+                    </a:stretch>
+                  </pic:blipFill>
+                  <pic:spPr bwMode="auto">
+                    <a:xfrm>
+                      <a:off x="0" y="0"/>
+                      <a:ext cx="5334000" cy="1629833"/>
+                    </a:xfrm>
+                    <a:prstGeom prst="rect">
+                      <a:avLst/>
+                    </a:prstGeom>
+                    <a:noFill/>
+                    <a:ln w="9525">
+                      <a:noFill/>
+                      <a:headEnd/>
+                      <a:tailEnd/>
+                    </a:ln>
+                  </pic:spPr>
+                </pic:pic>
+              </a:graphicData>
+            </a:graphic>
+          </wp:inline>
+        </w:drawing>
+      </w:r>
+    </w:p>
+    <w:p>
+      <w:pPr>
+        <w:pStyle w:val="ImageCaption"/>
+      </w:pPr>
+      <w:r>
+        <w:t xml:space="preserve">Radiation shielding and single-event upsets: aluminium attenuates the accumulated dose, while error correction and checkpointing handle upsets.</w:t>
+      </w:r>
+    </w:p>
+    <w:p>
+      <w:pPr>
+        <w:pStyle w:val="BodyText"/>
       </w:pPr>
       <w:r>
         <w:rPr>
@@ -13660,18 +13880,18 @@
           <wp:inline>
             <wp:extent cx="5334000" cy="3331868"/>
             <wp:effectExtent b="0" l="0" r="0" t="0"/>
-            <wp:docPr descr="Fig. 8.1 Cumulative five-year ionizing dose versus aluminium shielding, with the memory tolerance and the mission requirement marked. Ten millimeters of aluminium keeps the dose well below the first-irregularity threshold." title="" id="33" name="Picture"/>
+            <wp:docPr descr="Fig. 8.1 Cumulative five-year ionizing dose versus aluminium shielding, with the memory tolerance and the mission requirement marked. Ten millimeters of aluminium keeps the dose well below the first-irregularity threshold." title="" id="45" name="Picture"/>
             <a:graphic>
               <a:graphicData uri="http://schemas.openxmlformats.org/drawingml/2006/picture">
                 <pic:pic>
                   <pic:nvPicPr>
-                    <pic:cNvPr descr="figures2/figA5_dose.png" id="34" name="Picture"/>
+                    <pic:cNvPr descr="figures2/figA5_dose.png" id="46" name="Picture"/>
                     <pic:cNvPicPr>
                       <a:picLocks noChangeArrowheads="1" noChangeAspect="1"/>
                     </pic:cNvPicPr>
                   </pic:nvPicPr>
                   <pic:blipFill>
-                    <a:blip r:embed="rId32"/>
+                    <a:blip r:embed="rId44"/>
                     <a:stretch>
                       <a:fillRect/>
                     </a:stretch>
@@ -13876,8 +14096,8 @@
         <w:t xml:space="preserve">twenty percent, which must be carried explicitly in any efficiency figure.</w:t>
       </w:r>
     </w:p>
-    <w:bookmarkEnd w:id="35"/>
-    <w:bookmarkStart w:id="36" w:name="the-orbital-debris-environment"/>
+    <w:bookmarkEnd w:id="47"/>
+    <w:bookmarkStart w:id="51" w:name="the-orbital-debris-environment"/>
     <w:p>
       <w:pPr>
         <w:pStyle w:val="Heading2"/>
@@ -13906,7 +14126,62 @@
     </w:p>
     <w:p>
       <w:pPr>
-        <w:pStyle w:val="FirstParagraph"/>
+        <w:pStyle w:val="CaptionedFigure"/>
+      </w:pPr>
+      <w:r>
+        <w:drawing>
+          <wp:inline>
+            <wp:extent cx="5334000" cy="2148416"/>
+            <wp:effectExtent b="0" l="0" r="0" t="0"/>
+            <wp:docPr descr="The formation paradox: one fragmentation sprays debris into the volume the neighbours occupy, with the neighbour-hit probability scaling as one over spacing squared." title="" id="49" name="Picture"/>
+            <a:graphic>
+              <a:graphicData uri="http://schemas.openxmlformats.org/drawingml/2006/picture">
+                <pic:pic>
+                  <pic:nvPicPr>
+                    <pic:cNvPr descr="schematics/diagram_formation.png" id="50" name="Picture"/>
+                    <pic:cNvPicPr>
+                      <a:picLocks noChangeArrowheads="1" noChangeAspect="1"/>
+                    </pic:cNvPicPr>
+                  </pic:nvPicPr>
+                  <pic:blipFill>
+                    <a:blip r:embed="rId48"/>
+                    <a:stretch>
+                      <a:fillRect/>
+                    </a:stretch>
+                  </pic:blipFill>
+                  <pic:spPr bwMode="auto">
+                    <a:xfrm>
+                      <a:off x="0" y="0"/>
+                      <a:ext cx="5334000" cy="2148416"/>
+                    </a:xfrm>
+                    <a:prstGeom prst="rect">
+                      <a:avLst/>
+                    </a:prstGeom>
+                    <a:noFill/>
+                    <a:ln w="9525">
+                      <a:noFill/>
+                      <a:headEnd/>
+                      <a:tailEnd/>
+                    </a:ln>
+                  </pic:spPr>
+                </pic:pic>
+              </a:graphicData>
+            </a:graphic>
+          </wp:inline>
+        </w:drawing>
+      </w:r>
+    </w:p>
+    <w:p>
+      <w:pPr>
+        <w:pStyle w:val="ImageCaption"/>
+      </w:pPr>
+      <w:r>
+        <w:t xml:space="preserve">The formation paradox: one fragmentation sprays debris into the volume the neighbours occupy, with the neighbour-hit probability scaling as one over spacing squared.</w:t>
+      </w:r>
+    </w:p>
+    <w:p>
+      <w:pPr>
+        <w:pStyle w:val="BodyText"/>
       </w:pPr>
       <w:r>
         <w:rPr>
@@ -14503,9 +14778,9 @@
         </w:pict>
       </w:r>
     </w:p>
-    <w:bookmarkEnd w:id="36"/>
-    <w:bookmarkEnd w:id="37"/>
-    <w:bookmarkStart w:id="76" w:name="part-iii-spacecraft-subsystems"/>
+    <w:bookmarkEnd w:id="51"/>
+    <w:bookmarkEnd w:id="52"/>
+    <w:bookmarkStart w:id="106" w:name="part-iii-spacecraft-subsystems"/>
     <w:p>
       <w:pPr>
         <w:pStyle w:val="Heading1"/>
@@ -14514,7 +14789,7 @@
         <w:t xml:space="preserve">PART III, SPACECRAFT SUBSYSTEMS</w:t>
       </w:r>
     </w:p>
-    <w:bookmarkStart w:id="47" w:name="thermal-control"/>
+    <w:bookmarkStart w:id="65" w:name="thermal-control"/>
     <w:p>
       <w:pPr>
         <w:pStyle w:val="Heading2"/>
@@ -14543,7 +14818,62 @@
     </w:p>
     <w:p>
       <w:pPr>
-        <w:pStyle w:val="FirstParagraph"/>
+        <w:pStyle w:val="CaptionedFigure"/>
+      </w:pPr>
+      <w:r>
+        <w:drawing>
+          <wp:inline>
+            <wp:extent cx="5334000" cy="1333500"/>
+            <wp:effectExtent b="0" l="0" r="0" t="0"/>
+            <wp:docPr descr="The passive conduction path from the junction to the radiator, dominated by the junction-to-case resistance." title="" id="54" name="Picture"/>
+            <a:graphic>
+              <a:graphicData uri="http://schemas.openxmlformats.org/drawingml/2006/picture">
+                <pic:pic>
+                  <pic:nvPicPr>
+                    <pic:cNvPr descr="schematics/diagram_thermal.png" id="55" name="Picture"/>
+                    <pic:cNvPicPr>
+                      <a:picLocks noChangeArrowheads="1" noChangeAspect="1"/>
+                    </pic:cNvPicPr>
+                  </pic:nvPicPr>
+                  <pic:blipFill>
+                    <a:blip r:embed="rId53"/>
+                    <a:stretch>
+                      <a:fillRect/>
+                    </a:stretch>
+                  </pic:blipFill>
+                  <pic:spPr bwMode="auto">
+                    <a:xfrm>
+                      <a:off x="0" y="0"/>
+                      <a:ext cx="5334000" cy="1333500"/>
+                    </a:xfrm>
+                    <a:prstGeom prst="rect">
+                      <a:avLst/>
+                    </a:prstGeom>
+                    <a:noFill/>
+                    <a:ln w="9525">
+                      <a:noFill/>
+                      <a:headEnd/>
+                      <a:tailEnd/>
+                    </a:ln>
+                  </pic:spPr>
+                </pic:pic>
+              </a:graphicData>
+            </a:graphic>
+          </wp:inline>
+        </w:drawing>
+      </w:r>
+    </w:p>
+    <w:p>
+      <w:pPr>
+        <w:pStyle w:val="ImageCaption"/>
+      </w:pPr>
+      <w:r>
+        <w:t xml:space="preserve">The passive conduction path from the junction to the radiator, dominated by the junction-to-case resistance.</w:t>
+      </w:r>
+    </w:p>
+    <w:p>
+      <w:pPr>
+        <w:pStyle w:val="BodyText"/>
       </w:pPr>
       <w:r>
         <w:rPr>
@@ -15986,18 +16316,18 @@
           <wp:inline>
             <wp:extent cx="5334000" cy="2294266"/>
             <wp:effectExtent b="0" l="0" r="0" t="0"/>
-            <wp:docPr descr="Fig. 10.1 Radiator equilibrium temperature versus heat flux, and the radiator area required for one megawatt versus operating temperature. Running hotter reduces area at the cost of silicon lifetime." title="" id="39" name="Picture"/>
+            <wp:docPr descr="Fig. 10.1 Radiator equilibrium temperature versus heat flux, and the radiator area required for one megawatt versus operating temperature. Running hotter reduces area at the cost of silicon lifetime." title="" id="57" name="Picture"/>
             <a:graphic>
               <a:graphicData uri="http://schemas.openxmlformats.org/drawingml/2006/picture">
                 <pic:pic>
                   <pic:nvPicPr>
-                    <pic:cNvPr descr="figures2/figA3_radiator.png" id="40" name="Picture"/>
+                    <pic:cNvPr descr="figures2/figA3_radiator.png" id="58" name="Picture"/>
                     <pic:cNvPicPr>
                       <a:picLocks noChangeArrowheads="1" noChangeAspect="1"/>
                     </pic:cNvPicPr>
                   </pic:nvPicPr>
                   <pic:blipFill>
-                    <a:blip r:embed="rId38"/>
+                    <a:blip r:embed="rId56"/>
                     <a:stretch>
                       <a:fillRect/>
                     </a:stretch>
@@ -16484,18 +16814,18 @@
           <wp:inline>
             <wp:extent cx="5334000" cy="2297198"/>
             <wp:effectExtent b="0" l="0" r="0" t="0"/>
-            <wp:docPr descr="Fig. 10.2 Earth view factor versus altitude, and the combined albedo, Earth-infrared, and solar load on a four-square-meter surface. External loads set the parasitic fraction in the radiator sizing." title="" id="42" name="Picture"/>
+            <wp:docPr descr="Fig. 10.2 Earth view factor versus altitude, and the combined albedo, Earth-infrared, and solar load on a four-square-meter surface. External loads set the parasitic fraction in the radiator sizing." title="" id="60" name="Picture"/>
             <a:graphic>
               <a:graphicData uri="http://schemas.openxmlformats.org/drawingml/2006/picture">
                 <pic:pic>
                   <pic:nvPicPr>
-                    <pic:cNvPr descr="figures2/figA2_loads.png" id="43" name="Picture"/>
+                    <pic:cNvPr descr="figures2/figA2_loads.png" id="61" name="Picture"/>
                     <pic:cNvPicPr>
                       <a:picLocks noChangeArrowheads="1" noChangeAspect="1"/>
                     </pic:cNvPicPr>
                   </pic:nvPicPr>
                   <pic:blipFill>
-                    <a:blip r:embed="rId41"/>
+                    <a:blip r:embed="rId59"/>
                     <a:stretch>
                       <a:fillRect/>
                     </a:stretch>
@@ -17050,18 +17380,18 @@
           <wp:inline>
             <wp:extent cx="5334000" cy="3371361"/>
             <wp:effectExtent b="0" l="0" r="0" t="0"/>
-            <wp:docPr descr="Fig. 10.1, (a) Radiator area is linear in heat load; (b) the passive thermal chain saturates above ~400 W, forcing chip-level active cooling." title="" id="45" name="Picture"/>
+            <wp:docPr descr="Fig. 10.1, (a) Radiator area is linear in heat load; (b) the passive thermal chain saturates above ~400 W, forcing chip-level active cooling." title="" id="63" name="Picture"/>
             <a:graphic>
               <a:graphicData uri="http://schemas.openxmlformats.org/drawingml/2006/picture">
                 <pic:pic>
                   <pic:nvPicPr>
-                    <pic:cNvPr descr="figures/fig2_thermal_wall.png" id="46" name="Picture"/>
+                    <pic:cNvPr descr="figures/fig2_thermal_wall.png" id="64" name="Picture"/>
                     <pic:cNvPicPr>
                       <a:picLocks noChangeArrowheads="1" noChangeAspect="1"/>
                     </pic:cNvPicPr>
                   </pic:nvPicPr>
                   <pic:blipFill>
-                    <a:blip r:embed="rId44"/>
+                    <a:blip r:embed="rId62"/>
                     <a:stretch>
                       <a:fillRect/>
                     </a:stretch>
@@ -17096,8 +17426,8 @@
         <w:t xml:space="preserve">Fig. 10.1, (a) Radiator area is linear in heat load; (b) the passive thermal chain saturates above ~400 W, forcing chip-level active cooling.</w:t>
       </w:r>
     </w:p>
-    <w:bookmarkEnd w:id="47"/>
-    <w:bookmarkStart w:id="51" w:name="electrical-power"/>
+    <w:bookmarkEnd w:id="65"/>
+    <w:bookmarkStart w:id="69" w:name="electrical-power"/>
     <w:p>
       <w:pPr>
         <w:pStyle w:val="Heading2"/>
@@ -18152,18 +18482,18 @@
           <wp:inline>
             <wp:extent cx="5334000" cy="2417128"/>
             <wp:effectExtent b="0" l="0" r="0" t="0"/>
-            <wp:docPr descr="Fig. 11.1, Array area versus load, and triple-junction degradation over the mission." title="" id="49" name="Picture"/>
+            <wp:docPr descr="Fig. 11.1, Array area versus load, and triple-junction degradation over the mission." title="" id="67" name="Picture"/>
             <a:graphic>
               <a:graphicData uri="http://schemas.openxmlformats.org/drawingml/2006/picture">
                 <pic:pic>
                   <pic:nvPicPr>
-                    <pic:cNvPr descr="systems_figs/fig_power.png" id="50" name="Picture"/>
+                    <pic:cNvPr descr="systems_figs/fig_power.png" id="68" name="Picture"/>
                     <pic:cNvPicPr>
                       <a:picLocks noChangeArrowheads="1" noChangeAspect="1"/>
                     </pic:cNvPicPr>
                   </pic:nvPicPr>
                   <pic:blipFill>
-                    <a:blip r:embed="rId48"/>
+                    <a:blip r:embed="rId66"/>
                     <a:stretch>
                       <a:fillRect/>
                     </a:stretch>
@@ -18198,8 +18528,8 @@
         <w:t xml:space="preserve">Fig. 11.1, Array area versus load, and triple-junction degradation over the mission.</w:t>
       </w:r>
     </w:p>
-    <w:bookmarkEnd w:id="51"/>
-    <w:bookmarkStart w:id="55" w:name="structures-and-mass"/>
+    <w:bookmarkEnd w:id="69"/>
+    <w:bookmarkStart w:id="73" w:name="structures-and-mass"/>
     <w:p>
       <w:pPr>
         <w:pStyle w:val="Heading2"/>
@@ -19103,18 +19433,18 @@
           <wp:inline>
             <wp:extent cx="4098073" cy="3863897"/>
             <wp:effectExtent b="0" l="0" r="0" t="0"/>
-            <wp:docPr descr="Fig. 12.1 Reference satellite dry-mass breakdown by subsystem, closed self-consistently by the integrated model." title="" id="53" name="Picture"/>
+            <wp:docPr descr="Fig. 12.1 Reference satellite dry-mass breakdown by subsystem, closed self-consistently by the integrated model." title="" id="71" name="Picture"/>
             <a:graphic>
               <a:graphicData uri="http://schemas.openxmlformats.org/drawingml/2006/picture">
                 <pic:pic>
                   <pic:nvPicPr>
-                    <pic:cNvPr descr="figures2/figA8_mass.png" id="54" name="Picture"/>
+                    <pic:cNvPr descr="figures2/figA8_mass.png" id="72" name="Picture"/>
                     <pic:cNvPicPr>
                       <a:picLocks noChangeArrowheads="1" noChangeAspect="1"/>
                     </pic:cNvPicPr>
                   </pic:nvPicPr>
                   <pic:blipFill>
-                    <a:blip r:embed="rId52"/>
+                    <a:blip r:embed="rId70"/>
                     <a:stretch>
                       <a:fillRect/>
                     </a:stretch>
@@ -19149,8 +19479,8 @@
         <w:t xml:space="preserve">Fig. 12.1 Reference satellite dry-mass breakdown by subsystem, closed self-consistently by the integrated model.</w:t>
       </w:r>
     </w:p>
-    <w:bookmarkEnd w:id="55"/>
-    <w:bookmarkStart w:id="56" w:name="X63cb9f37665b9f150c1577425ead9308a982ab3"/>
+    <w:bookmarkEnd w:id="73"/>
+    <w:bookmarkStart w:id="77" w:name="X63cb9f37665b9f150c1577425ead9308a982ab3"/>
     <w:p>
       <w:pPr>
         <w:pStyle w:val="Heading2"/>
@@ -19179,7 +19509,62 @@
     </w:p>
     <w:p>
       <w:pPr>
-        <w:pStyle w:val="FirstParagraph"/>
+        <w:pStyle w:val="CaptionedFigure"/>
+      </w:pPr>
+      <w:r>
+        <w:drawing>
+          <wp:inline>
+            <wp:extent cx="5334000" cy="1697181"/>
+            <wp:effectExtent b="0" l="0" r="0" t="0"/>
+            <wp:docPr descr="Coarse body pointing combined with a fast-steering mirror, which supplies the sub-microradian correction the optical link requires." title="" id="75" name="Picture"/>
+            <a:graphic>
+              <a:graphicData uri="http://schemas.openxmlformats.org/drawingml/2006/picture">
+                <pic:pic>
+                  <pic:nvPicPr>
+                    <pic:cNvPr descr="schematics/diagram_pointing.png" id="76" name="Picture"/>
+                    <pic:cNvPicPr>
+                      <a:picLocks noChangeArrowheads="1" noChangeAspect="1"/>
+                    </pic:cNvPicPr>
+                  </pic:nvPicPr>
+                  <pic:blipFill>
+                    <a:blip r:embed="rId74"/>
+                    <a:stretch>
+                      <a:fillRect/>
+                    </a:stretch>
+                  </pic:blipFill>
+                  <pic:spPr bwMode="auto">
+                    <a:xfrm>
+                      <a:off x="0" y="0"/>
+                      <a:ext cx="5334000" cy="1697181"/>
+                    </a:xfrm>
+                    <a:prstGeom prst="rect">
+                      <a:avLst/>
+                    </a:prstGeom>
+                    <a:noFill/>
+                    <a:ln w="9525">
+                      <a:noFill/>
+                      <a:headEnd/>
+                      <a:tailEnd/>
+                    </a:ln>
+                  </pic:spPr>
+                </pic:pic>
+              </a:graphicData>
+            </a:graphic>
+          </wp:inline>
+        </w:drawing>
+      </w:r>
+    </w:p>
+    <w:p>
+      <w:pPr>
+        <w:pStyle w:val="ImageCaption"/>
+      </w:pPr>
+      <w:r>
+        <w:t xml:space="preserve">Coarse body pointing combined with a fast-steering mirror, which supplies the sub-microradian correction the optical link requires.</w:t>
+      </w:r>
+    </w:p>
+    <w:p>
+      <w:pPr>
+        <w:pStyle w:val="BodyText"/>
       </w:pPr>
       <w:r>
         <w:rPr>
@@ -19904,8 +20289,8 @@
         <w:t xml:space="preserve">link and any long inter-satellite hop.</w:t>
       </w:r>
     </w:p>
-    <w:bookmarkEnd w:id="56"/>
-    <w:bookmarkStart w:id="63" w:name="X6ae4c679d3cd8d01d6fb60e2d3c40a4ea80d1a8"/>
+    <w:bookmarkEnd w:id="77"/>
+    <w:bookmarkStart w:id="87" w:name="X6ae4c679d3cd8d01d6fb60e2d3c40a4ea80d1a8"/>
     <w:p>
       <w:pPr>
         <w:pStyle w:val="Heading2"/>
@@ -19934,7 +20319,62 @@
     </w:p>
     <w:p>
       <w:pPr>
-        <w:pStyle w:val="FirstParagraph"/>
+        <w:pStyle w:val="CaptionedFigure"/>
+      </w:pPr>
+      <w:r>
+        <w:drawing>
+          <wp:inline>
+            <wp:extent cx="5334000" cy="1852083"/>
+            <wp:effectExtent b="0" l="0" r="0" t="0"/>
+            <wp:docPr descr="Optical-beam divergence: the fraction of light captured by the receiver falls as one over range squared, which forces close spacing." title="" id="79" name="Picture"/>
+            <a:graphic>
+              <a:graphicData uri="http://schemas.openxmlformats.org/drawingml/2006/picture">
+                <pic:pic>
+                  <pic:nvPicPr>
+                    <pic:cNvPr descr="schematics/diagram_link.png" id="80" name="Picture"/>
+                    <pic:cNvPicPr>
+                      <a:picLocks noChangeArrowheads="1" noChangeAspect="1"/>
+                    </pic:cNvPicPr>
+                  </pic:nvPicPr>
+                  <pic:blipFill>
+                    <a:blip r:embed="rId78"/>
+                    <a:stretch>
+                      <a:fillRect/>
+                    </a:stretch>
+                  </pic:blipFill>
+                  <pic:spPr bwMode="auto">
+                    <a:xfrm>
+                      <a:off x="0" y="0"/>
+                      <a:ext cx="5334000" cy="1852083"/>
+                    </a:xfrm>
+                    <a:prstGeom prst="rect">
+                      <a:avLst/>
+                    </a:prstGeom>
+                    <a:noFill/>
+                    <a:ln w="9525">
+                      <a:noFill/>
+                      <a:headEnd/>
+                      <a:tailEnd/>
+                    </a:ln>
+                  </pic:spPr>
+                </pic:pic>
+              </a:graphicData>
+            </a:graphic>
+          </wp:inline>
+        </w:drawing>
+      </w:r>
+    </w:p>
+    <w:p>
+      <w:pPr>
+        <w:pStyle w:val="ImageCaption"/>
+      </w:pPr>
+      <w:r>
+        <w:t xml:space="preserve">Optical-beam divergence: the fraction of light captured by the receiver falls as one over range squared, which forces close spacing.</w:t>
+      </w:r>
+    </w:p>
+    <w:p>
+      <w:pPr>
+        <w:pStyle w:val="BodyText"/>
       </w:pPr>
       <w:r>
         <w:rPr>
@@ -20479,18 +20919,18 @@
           <wp:inline>
             <wp:extent cx="5334000" cy="2304478"/>
             <wp:effectExtent b="0" l="0" r="0" t="0"/>
-            <wp:docPr descr="Fig. 14.2 Transmit power required to hold a three-decibel link margin versus range, against the one-watt terminal limit, and the pointing-loss sensitivity to jitter. Range and pointing together force the tight formation." title="" id="58" name="Picture"/>
+            <wp:docPr descr="Fig. 14.2 Transmit power required to hold a three-decibel link margin versus range, against the one-watt terminal limit, and the pointing-loss sensitivity to jitter. Range and pointing together force the tight formation." title="" id="82" name="Picture"/>
             <a:graphic>
               <a:graphicData uri="http://schemas.openxmlformats.org/drawingml/2006/picture">
                 <pic:pic>
                   <pic:nvPicPr>
-                    <pic:cNvPr descr="figures2/figA4_link.png" id="59" name="Picture"/>
+                    <pic:cNvPr descr="figures2/figA4_link.png" id="83" name="Picture"/>
                     <pic:cNvPicPr>
                       <a:picLocks noChangeArrowheads="1" noChangeAspect="1"/>
                     </pic:cNvPicPr>
                   </pic:nvPicPr>
                   <pic:blipFill>
-                    <a:blip r:embed="rId57"/>
+                    <a:blip r:embed="rId81"/>
                     <a:stretch>
                       <a:fillRect/>
                     </a:stretch>
@@ -21067,18 +21507,18 @@
           <wp:inline>
             <wp:extent cx="5334000" cy="2415588"/>
             <wp:effectExtent b="0" l="0" r="0" t="0"/>
-            <wp:docPr descr="Fig. 14.1, Inter-satellite free-space loss versus range and pointing-loss sensitivity." title="" id="61" name="Picture"/>
+            <wp:docPr descr="Fig. 14.1, Inter-satellite free-space loss versus range and pointing-loss sensitivity." title="" id="85" name="Picture"/>
             <a:graphic>
               <a:graphicData uri="http://schemas.openxmlformats.org/drawingml/2006/picture">
                 <pic:pic>
                   <pic:nvPicPr>
-                    <pic:cNvPr descr="systems_figs/fig_comms.png" id="62" name="Picture"/>
+                    <pic:cNvPr descr="systems_figs/fig_comms.png" id="86" name="Picture"/>
                     <pic:cNvPicPr>
                       <a:picLocks noChangeArrowheads="1" noChangeAspect="1"/>
                     </pic:cNvPicPr>
                   </pic:nvPicPr>
                   <pic:blipFill>
-                    <a:blip r:embed="rId60"/>
+                    <a:blip r:embed="rId84"/>
                     <a:stretch>
                       <a:fillRect/>
                     </a:stretch>
@@ -21113,8 +21553,8 @@
         <w:t xml:space="preserve">Fig. 14.1, Inter-satellite free-space loss versus range and pointing-loss sensitivity.</w:t>
       </w:r>
     </w:p>
-    <w:bookmarkEnd w:id="63"/>
-    <w:bookmarkStart w:id="67" w:name="propulsion-and-end-of-life-disposal"/>
+    <w:bookmarkEnd w:id="87"/>
+    <w:bookmarkStart w:id="94" w:name="propulsion-and-end-of-life-disposal"/>
     <w:p>
       <w:pPr>
         <w:pStyle w:val="Heading2"/>
@@ -21143,7 +21583,62 @@
     </w:p>
     <w:p>
       <w:pPr>
-        <w:pStyle w:val="FirstParagraph"/>
+        <w:pStyle w:val="CaptionedFigure"/>
+      </w:pPr>
+      <w:r>
+        <w:drawing>
+          <wp:inline>
+            <wp:extent cx="5334000" cy="3484880"/>
+            <wp:effectExtent b="0" l="0" r="0" t="0"/>
+            <wp:docPr descr="Controlled de-orbit: a retrograde burn drops the far side of the orbit onto an atmosphere-grazing transfer ellipse." title="" id="89" name="Picture"/>
+            <a:graphic>
+              <a:graphicData uri="http://schemas.openxmlformats.org/drawingml/2006/picture">
+                <pic:pic>
+                  <pic:nvPicPr>
+                    <pic:cNvPr descr="schematics/diagram_hohmann.png" id="90" name="Picture"/>
+                    <pic:cNvPicPr>
+                      <a:picLocks noChangeArrowheads="1" noChangeAspect="1"/>
+                    </pic:cNvPicPr>
+                  </pic:nvPicPr>
+                  <pic:blipFill>
+                    <a:blip r:embed="rId88"/>
+                    <a:stretch>
+                      <a:fillRect/>
+                    </a:stretch>
+                  </pic:blipFill>
+                  <pic:spPr bwMode="auto">
+                    <a:xfrm>
+                      <a:off x="0" y="0"/>
+                      <a:ext cx="5334000" cy="3484880"/>
+                    </a:xfrm>
+                    <a:prstGeom prst="rect">
+                      <a:avLst/>
+                    </a:prstGeom>
+                    <a:noFill/>
+                    <a:ln w="9525">
+                      <a:noFill/>
+                      <a:headEnd/>
+                      <a:tailEnd/>
+                    </a:ln>
+                  </pic:spPr>
+                </pic:pic>
+              </a:graphicData>
+            </a:graphic>
+          </wp:inline>
+        </w:drawing>
+      </w:r>
+    </w:p>
+    <w:p>
+      <w:pPr>
+        <w:pStyle w:val="ImageCaption"/>
+      </w:pPr>
+      <w:r>
+        <w:t xml:space="preserve">Controlled de-orbit: a retrograde burn drops the far side of the orbit onto an atmosphere-grazing transfer ellipse.</w:t>
+      </w:r>
+    </w:p>
+    <w:p>
+      <w:pPr>
+        <w:pStyle w:val="BodyText"/>
       </w:pPr>
       <w:r>
         <w:rPr>
@@ -22214,18 +22709,18 @@
           <wp:inline>
             <wp:extent cx="5334000" cy="2948136"/>
             <wp:effectExtent b="0" l="0" r="0" t="0"/>
-            <wp:docPr descr="Fig. 15.1, Per-satellite Δv budget (de-orbit dominates) and propellant mass by propulsion type." title="" id="65" name="Picture"/>
+            <wp:docPr descr="Fig. 15.1, Per-satellite Δv budget (de-orbit dominates) and propellant mass by propulsion type." title="" id="92" name="Picture"/>
             <a:graphic>
               <a:graphicData uri="http://schemas.openxmlformats.org/drawingml/2006/picture">
                 <pic:pic>
                   <pic:nvPicPr>
-                    <pic:cNvPr descr="figures/fig5_deltav.png" id="66" name="Picture"/>
+                    <pic:cNvPr descr="figures/fig5_deltav.png" id="93" name="Picture"/>
                     <pic:cNvPicPr>
                       <a:picLocks noChangeArrowheads="1" noChangeAspect="1"/>
                     </pic:cNvPicPr>
                   </pic:nvPicPr>
                   <pic:blipFill>
-                    <a:blip r:embed="rId64"/>
+                    <a:blip r:embed="rId91"/>
                     <a:stretch>
                       <a:fillRect/>
                     </a:stretch>
@@ -22260,8 +22755,8 @@
         <w:t xml:space="preserve">Fig. 15.1, Per-satellite Δv budget (de-orbit dominates) and propellant mass by propulsion type.</w:t>
       </w:r>
     </w:p>
-    <w:bookmarkEnd w:id="67"/>
-    <w:bookmarkStart w:id="71" w:name="X72d468b889d4049fe64ab25e8d7aac33b521080"/>
+    <w:bookmarkEnd w:id="94"/>
+    <w:bookmarkStart w:id="98" w:name="X72d468b889d4049fe64ab25e8d7aac33b521080"/>
     <w:p>
       <w:pPr>
         <w:pStyle w:val="Heading2"/>
@@ -23902,18 +24397,18 @@
           <wp:inline>
             <wp:extent cx="5334000" cy="2405396"/>
             <wp:effectExtent b="0" l="0" r="0" t="0"/>
-            <wp:docPr descr="Fig. 16.1, Per-node reliability versus time and the over-provisioning needed to hold capacity." title="" id="69" name="Picture"/>
+            <wp:docPr descr="Fig. 16.1, Per-node reliability versus time and the over-provisioning needed to hold capacity." title="" id="96" name="Picture"/>
             <a:graphic>
               <a:graphicData uri="http://schemas.openxmlformats.org/drawingml/2006/picture">
                 <pic:pic>
                   <pic:nvPicPr>
-                    <pic:cNvPr descr="systems_figs/fig_reliability.png" id="70" name="Picture"/>
+                    <pic:cNvPr descr="systems_figs/fig_reliability.png" id="97" name="Picture"/>
                     <pic:cNvPicPr>
                       <a:picLocks noChangeArrowheads="1" noChangeAspect="1"/>
                     </pic:cNvPicPr>
                   </pic:nvPicPr>
                   <pic:blipFill>
-                    <a:blip r:embed="rId68"/>
+                    <a:blip r:embed="rId95"/>
                     <a:stretch>
                       <a:fillRect/>
                     </a:stretch>
@@ -23948,8 +24443,8 @@
         <w:t xml:space="preserve">Fig. 16.1, Per-node reliability versus time and the over-provisioning needed to hold capacity.</w:t>
       </w:r>
     </w:p>
-    <w:bookmarkEnd w:id="71"/>
-    <w:bookmarkStart w:id="75" w:name="compute-and-workload"/>
+    <w:bookmarkEnd w:id="98"/>
+    <w:bookmarkStart w:id="105" w:name="compute-and-workload"/>
     <w:p>
       <w:pPr>
         <w:pStyle w:val="Heading2"/>
@@ -23978,517 +24473,572 @@
     </w:p>
     <w:p>
       <w:pPr>
-        <w:pStyle w:val="FirstParagraph"/>
-      </w:pPr>
-      <w:r>
-        <w:rPr>
-          <w:i/>
-          <w:iCs/>
-        </w:rPr>
-        <w:t xml:space="preserve">Sources: accelerator throughput and power from vendor documentation [12]; the workload and utilization model from the reference architecture [1].</w:t>
-      </w:r>
-    </w:p>
-    <w:p>
-      <w:pPr>
-        <w:pStyle w:val="BodyText"/>
-      </w:pPr>
-      <w:r>
-        <w:t xml:space="preserve">The purpose of the system is useful computation, and the appropriate figure of merit is delivered useful</w:t>
-      </w:r>
-      <w:r>
-        <w:t xml:space="preserve"> </w:t>
-      </w:r>
-      <w:r>
-        <w:t xml:space="preserve">work, not peak floating-point capability.</w:t>
-      </w:r>
-    </w:p>
-    <w:p>
-      <w:pPr>
-        <w:pStyle w:val="BodyText"/>
-      </w:pPr>
-      <w:r>
-        <w:rPr>
-          <w:b/>
-          <w:bCs/>
-        </w:rPr>
-        <w:t xml:space="preserve">Delivered compute.</w:t>
-      </w:r>
-      <w:r>
-        <w:t xml:space="preserve"> </w:t>
-      </w:r>
-      <w:r>
-        <w:t xml:space="preserve">With</w:t>
-      </w:r>
-      <w:r>
-        <w:t xml:space="preserve"> </w:t>
-      </w:r>
-      <m:oMath>
-        <m:r>
-          <m:t>n</m:t>
-        </m:r>
-      </m:oMath>
-      <w:r>
-        <w:t xml:space="preserve"> </w:t>
-      </w:r>
-      <w:r>
-        <w:t xml:space="preserve">chips of peak rate</w:t>
-      </w:r>
-      <w:r>
-        <w:t xml:space="preserve"> </w:t>
-      </w:r>
-      <m:oMath>
-        <m:sSub>
-          <m:e>
-            <m:r>
-              <m:t>P</m:t>
-            </m:r>
-          </m:e>
-          <m:sub>
-            <m:r>
-              <m:rPr>
-                <m:sty m:val="p"/>
-              </m:rPr>
-              <m:t>p</m:t>
-            </m:r>
-            <m:r>
-              <m:rPr>
-                <m:sty m:val="p"/>
-              </m:rPr>
-              <m:t>e</m:t>
-            </m:r>
-            <m:r>
-              <m:rPr>
-                <m:sty m:val="p"/>
-              </m:rPr>
-              <m:t>a</m:t>
-            </m:r>
-            <m:r>
-              <m:rPr>
-                <m:sty m:val="p"/>
-              </m:rPr>
-              <m:t>k</m:t>
-            </m:r>
-          </m:sub>
-        </m:sSub>
-      </m:oMath>
-      <w:r>
-        <w:t xml:space="preserve">, a model-FLOPs utilization</w:t>
-      </w:r>
-      <w:r>
-        <w:t xml:space="preserve"> </w:t>
-      </w:r>
-      <w:r>
-        <w:t xml:space="preserve">MFU, and a radiation availability</w:t>
-      </w:r>
-      <w:r>
-        <w:t xml:space="preserve"> </w:t>
-      </w:r>
-      <m:oMath>
-        <m:sSub>
-          <m:e>
-            <m:r>
-              <m:t>a</m:t>
-            </m:r>
-          </m:e>
-          <m:sub>
-            <m:r>
-              <m:t>r</m:t>
-            </m:r>
-          </m:sub>
-        </m:sSub>
-      </m:oMath>
-      <w:r>
-        <w:t xml:space="preserve">, the delivered useful rate is</w:t>
-      </w:r>
-      <w:r>
-        <w:t xml:space="preserve"> </w:t>
-      </w:r>
-      <m:oMath>
-        <m:r>
-          <m:t>n</m:t>
-        </m:r>
-        <m:r>
-          <m:t> </m:t>
-        </m:r>
-        <m:sSub>
-          <m:e>
-            <m:r>
-              <m:t>P</m:t>
-            </m:r>
-          </m:e>
-          <m:sub>
-            <m:r>
-              <m:rPr>
-                <m:sty m:val="p"/>
-              </m:rPr>
-              <m:t>p</m:t>
-            </m:r>
-            <m:r>
-              <m:rPr>
-                <m:sty m:val="p"/>
-              </m:rPr>
-              <m:t>e</m:t>
-            </m:r>
-            <m:r>
-              <m:rPr>
-                <m:sty m:val="p"/>
-              </m:rPr>
-              <m:t>a</m:t>
-            </m:r>
-            <m:r>
-              <m:rPr>
-                <m:sty m:val="p"/>
-              </m:rPr>
-              <m:t>k</m:t>
-            </m:r>
-          </m:sub>
-        </m:sSub>
-        <m:r>
-          <m:t> </m:t>
-        </m:r>
-        <m:r>
-          <m:rPr>
-            <m:sty m:val="p"/>
-          </m:rPr>
-          <m:t>M</m:t>
-        </m:r>
-        <m:r>
-          <m:rPr>
-            <m:sty m:val="p"/>
-          </m:rPr>
-          <m:t>F</m:t>
-        </m:r>
-        <m:r>
-          <m:rPr>
-            <m:sty m:val="p"/>
-          </m:rPr>
-          <m:t>U</m:t>
-        </m:r>
-        <m:r>
-          <m:t> </m:t>
-        </m:r>
-        <m:sSub>
-          <m:e>
-            <m:r>
-              <m:t>a</m:t>
-            </m:r>
-          </m:e>
-          <m:sub>
-            <m:r>
-              <m:t>r</m:t>
-            </m:r>
-          </m:sub>
-        </m:sSub>
-      </m:oMath>
-      <w:r>
-        <w:t xml:space="preserve">. Model-FLOPs utilization is forty to sixty percent for training but only eight to</w:t>
-      </w:r>
-      <w:r>
-        <w:t xml:space="preserve"> </w:t>
-      </w:r>
-      <w:r>
-        <w:t xml:space="preserve">ten percent for inference decode, which is memory-bandwidth bound; a space inference platform must be</w:t>
-      </w:r>
-      <w:r>
-        <w:t xml:space="preserve"> </w:t>
-      </w:r>
-      <w:r>
-        <w:t xml:space="preserve">planned around the low regime.</w:t>
-      </w:r>
-    </w:p>
-    <w:p>
-      <w:pPr>
-        <w:pStyle w:val="BodyText"/>
-      </w:pPr>
-      <w:r>
-        <w:rPr>
-          <w:b/>
-          <w:bCs/>
-        </w:rPr>
-        <w:t xml:space="preserve">Coupled thermal-throttle simulation.</w:t>
-      </w:r>
-      <w:r>
-        <w:t xml:space="preserve"> </w:t>
-      </w:r>
-      <w:r>
-        <w:t xml:space="preserve">The first-order static estimate above misses an essential</w:t>
-      </w:r>
-      <w:r>
-        <w:t xml:space="preserve"> </w:t>
-      </w:r>
-      <w:r>
-        <w:t xml:space="preserve">coupling: a hot chip throttles. The workload model therefore integrates the radiator temperature</w:t>
-      </w:r>
-      <w:r>
-        <w:t xml:space="preserve"> </w:t>
-      </w:r>
-      <w:r>
-        <w:t xml:space="preserve">over an orbit while a time-varying compute load heats the die; when the junction temperature exceeds</w:t>
-      </w:r>
-      <w:r>
-        <w:t xml:space="preserve"> </w:t>
-      </w:r>
-      <w:r>
-        <w:t xml:space="preserve">its throttle threshold, the effective utilization (and thus both power and delivered work) is scaled</w:t>
-      </w:r>
-      <w:r>
-        <w:t xml:space="preserve"> </w:t>
-      </w:r>
-      <w:r>
-        <w:t xml:space="preserve">back, and the loop settles to a throttled operating point. The result is striking: under passive</w:t>
-      </w:r>
-      <w:r>
-        <w:t xml:space="preserve"> </w:t>
-      </w:r>
-      <w:r>
-        <w:t xml:space="preserve">cooling, a 700-W H100 throttles by roughly ninety percent, the interface wall of Chapter 10 made</w:t>
-      </w:r>
-      <w:r>
-        <w:t xml:space="preserve"> </w:t>
-      </w:r>
-      <w:r>
-        <w:t xml:space="preserve">visible in the time domain, while a low-power TPU runs essentially un-throttled. This is the</w:t>
-      </w:r>
-      <w:r>
-        <w:t xml:space="preserve"> </w:t>
-      </w:r>
-      <w:r>
-        <w:t xml:space="preserve">quantitative case for chip-level active cooling at high power.</w:t>
-      </w:r>
-    </w:p>
-    <w:p>
-      <w:pPr>
-        <w:pStyle w:val="BodyText"/>
-      </w:pPr>
-      <w:r>
-        <w:rPr>
-          <w:b/>
-          <w:bCs/>
-        </w:rPr>
-        <w:t xml:space="preserve">Effective efficiency.</w:t>
-      </w:r>
-      <w:r>
-        <w:t xml:space="preserve"> </w:t>
-      </w:r>
-      <w:r>
-        <w:t xml:space="preserve">The appropriate efficiency metric is an effective power-usage effectiveness that</w:t>
-      </w:r>
-      <w:r>
-        <w:t xml:space="preserve"> </w:t>
-      </w:r>
-      <w:r>
-        <w:t xml:space="preserve">folds in the radiation throughput tax,</w:t>
-      </w:r>
-      <w:r>
-        <w:t xml:space="preserve"> </w:t>
-      </w:r>
-      <m:oMath>
-        <m:sSub>
-          <m:e>
-            <m:r>
-              <m:rPr>
-                <m:sty m:val="p"/>
-              </m:rPr>
-              <m:t>P</m:t>
-            </m:r>
-            <m:r>
-              <m:rPr>
-                <m:sty m:val="p"/>
-              </m:rPr>
-              <m:t>U</m:t>
-            </m:r>
-            <m:r>
-              <m:rPr>
-                <m:sty m:val="p"/>
-              </m:rPr>
-              <m:t>E</m:t>
-            </m:r>
-          </m:e>
-          <m:sub>
-            <m:r>
-              <m:rPr>
-                <m:sty m:val="p"/>
-              </m:rPr>
-              <m:t>e</m:t>
-            </m:r>
-            <m:r>
-              <m:rPr>
-                <m:sty m:val="p"/>
-              </m:rPr>
-              <m:t>f</m:t>
-            </m:r>
-            <m:r>
-              <m:rPr>
-                <m:sty m:val="p"/>
-              </m:rPr>
-              <m:t>f</m:t>
-            </m:r>
-          </m:sub>
-        </m:sSub>
-        <m:r>
-          <m:rPr>
-            <m:sty m:val="p"/>
-          </m:rPr>
-          <m:t>=</m:t>
-        </m:r>
-        <m:r>
-          <m:rPr>
-            <m:sty m:val="p"/>
-          </m:rPr>
-          <m:t>(</m:t>
-        </m:r>
-        <m:sSub>
-          <m:e>
-            <m:r>
-              <m:t>P</m:t>
-            </m:r>
-          </m:e>
-          <m:sub>
-            <m:r>
-              <m:rPr>
-                <m:sty m:val="p"/>
-              </m:rPr>
-              <m:t>t</m:t>
-            </m:r>
-            <m:r>
-              <m:rPr>
-                <m:sty m:val="p"/>
-              </m:rPr>
-              <m:t>o</m:t>
-            </m:r>
-            <m:r>
-              <m:rPr>
-                <m:sty m:val="p"/>
-              </m:rPr>
-              <m:t>t</m:t>
-            </m:r>
-            <m:r>
-              <m:rPr>
-                <m:sty m:val="p"/>
-              </m:rPr>
-              <m:t>a</m:t>
-            </m:r>
-            <m:r>
-              <m:rPr>
-                <m:sty m:val="p"/>
-              </m:rPr>
-              <m:t>l</m:t>
-            </m:r>
-          </m:sub>
-        </m:sSub>
-        <m:r>
-          <m:rPr>
-            <m:sty m:val="p"/>
-          </m:rPr>
-          <m:t>/</m:t>
-        </m:r>
-        <m:sSub>
-          <m:e>
-            <m:r>
-              <m:t>P</m:t>
-            </m:r>
-          </m:e>
-          <m:sub>
-            <m:r>
-              <m:rPr>
-                <m:sty m:val="p"/>
-              </m:rPr>
-              <m:t>c</m:t>
-            </m:r>
-            <m:r>
-              <m:rPr>
-                <m:sty m:val="p"/>
-              </m:rPr>
-              <m:t>o</m:t>
-            </m:r>
-            <m:r>
-              <m:rPr>
-                <m:sty m:val="p"/>
-              </m:rPr>
-              <m:t>m</m:t>
-            </m:r>
-            <m:r>
-              <m:rPr>
-                <m:sty m:val="p"/>
-              </m:rPr>
-              <m:t>p</m:t>
-            </m:r>
-            <m:r>
-              <m:rPr>
-                <m:sty m:val="p"/>
-              </m:rPr>
-              <m:t>u</m:t>
-            </m:r>
-            <m:r>
-              <m:rPr>
-                <m:sty m:val="p"/>
-              </m:rPr>
-              <m:t>t</m:t>
-            </m:r>
-            <m:r>
-              <m:rPr>
-                <m:sty m:val="p"/>
-              </m:rPr>
-              <m:t>e</m:t>
-            </m:r>
-          </m:sub>
-        </m:sSub>
-        <m:r>
-          <m:rPr>
-            <m:sty m:val="p"/>
-          </m:rPr>
-          <m:t>)</m:t>
-        </m:r>
-        <m:r>
-          <m:rPr>
-            <m:sty m:val="p"/>
-          </m:rPr>
-          <m:t>/</m:t>
-        </m:r>
-        <m:sSub>
-          <m:e>
-            <m:r>
-              <m:t>a</m:t>
-            </m:r>
-          </m:e>
-          <m:sub>
-            <m:r>
-              <m:t>r</m:t>
-            </m:r>
-          </m:sub>
-        </m:sSub>
-      </m:oMath>
-      <w:r>
-        <w:t xml:space="preserve">, and the relevant cost metric is dollars per useful petaflop-hour, which at</w:t>
-      </w:r>
-      <w:r>
-        <w:t xml:space="preserve"> </w:t>
-      </w:r>
-      <w:r>
-        <w:t xml:space="preserve">realistic utilization is several times the headline peak figure.</w:t>
-      </w:r>
-    </w:p>
-    <w:p>
-      <w:pPr>
         <w:pStyle w:val="CaptionedFigure"/>
       </w:pPr>
       <w:r>
         <w:drawing>
           <wp:inline>
-            <wp:extent cx="5334000" cy="3844698"/>
+            <wp:extent cx="5334000" cy="1718733"/>
             <wp:effectExtent b="0" l="0" r="0" t="0"/>
-            <wp:docPr descr="Fig. 17.1, Added subsystems: passive thermal-throttle by chip, ground-station site diversity, latency crossover, and the discounted-cash-flow breakeven." title="" id="73" name="Picture"/>
+            <wp:docPr descr="Delivered compute as a fraction of the headline peak, after real utilization and the radiation tax." title="" id="100" name="Picture"/>
             <a:graphic>
               <a:graphicData uri="http://schemas.openxmlformats.org/drawingml/2006/picture">
                 <pic:pic>
                   <pic:nvPicPr>
-                    <pic:cNvPr descr="systems_figs/fig_new_subsystems.png" id="74" name="Picture"/>
+                    <pic:cNvPr descr="schematics/diagram_compute.png" id="101" name="Picture"/>
                     <pic:cNvPicPr>
                       <a:picLocks noChangeArrowheads="1" noChangeAspect="1"/>
                     </pic:cNvPicPr>
                   </pic:nvPicPr>
                   <pic:blipFill>
-                    <a:blip r:embed="rId72"/>
+                    <a:blip r:embed="rId99"/>
+                    <a:stretch>
+                      <a:fillRect/>
+                    </a:stretch>
+                  </pic:blipFill>
+                  <pic:spPr bwMode="auto">
+                    <a:xfrm>
+                      <a:off x="0" y="0"/>
+                      <a:ext cx="5334000" cy="1718733"/>
+                    </a:xfrm>
+                    <a:prstGeom prst="rect">
+                      <a:avLst/>
+                    </a:prstGeom>
+                    <a:noFill/>
+                    <a:ln w="9525">
+                      <a:noFill/>
+                      <a:headEnd/>
+                      <a:tailEnd/>
+                    </a:ln>
+                  </pic:spPr>
+                </pic:pic>
+              </a:graphicData>
+            </a:graphic>
+          </wp:inline>
+        </w:drawing>
+      </w:r>
+    </w:p>
+    <w:p>
+      <w:pPr>
+        <w:pStyle w:val="ImageCaption"/>
+      </w:pPr>
+      <w:r>
+        <w:t xml:space="preserve">Delivered compute as a fraction of the headline peak, after real utilization and the radiation tax.</w:t>
+      </w:r>
+    </w:p>
+    <w:p>
+      <w:pPr>
+        <w:pStyle w:val="BodyText"/>
+      </w:pPr>
+      <w:r>
+        <w:rPr>
+          <w:i/>
+          <w:iCs/>
+        </w:rPr>
+        <w:t xml:space="preserve">Sources: accelerator throughput and power from vendor documentation [12]; the workload and utilization model from the reference architecture [1].</w:t>
+      </w:r>
+    </w:p>
+    <w:p>
+      <w:pPr>
+        <w:pStyle w:val="BodyText"/>
+      </w:pPr>
+      <w:r>
+        <w:t xml:space="preserve">The purpose of the system is useful computation, and the appropriate figure of merit is delivered useful</w:t>
+      </w:r>
+      <w:r>
+        <w:t xml:space="preserve"> </w:t>
+      </w:r>
+      <w:r>
+        <w:t xml:space="preserve">work, not peak floating-point capability.</w:t>
+      </w:r>
+    </w:p>
+    <w:p>
+      <w:pPr>
+        <w:pStyle w:val="BodyText"/>
+      </w:pPr>
+      <w:r>
+        <w:rPr>
+          <w:b/>
+          <w:bCs/>
+        </w:rPr>
+        <w:t xml:space="preserve">Delivered compute.</w:t>
+      </w:r>
+      <w:r>
+        <w:t xml:space="preserve"> </w:t>
+      </w:r>
+      <w:r>
+        <w:t xml:space="preserve">With</w:t>
+      </w:r>
+      <w:r>
+        <w:t xml:space="preserve"> </w:t>
+      </w:r>
+      <m:oMath>
+        <m:r>
+          <m:t>n</m:t>
+        </m:r>
+      </m:oMath>
+      <w:r>
+        <w:t xml:space="preserve"> </w:t>
+      </w:r>
+      <w:r>
+        <w:t xml:space="preserve">chips of peak rate</w:t>
+      </w:r>
+      <w:r>
+        <w:t xml:space="preserve"> </w:t>
+      </w:r>
+      <m:oMath>
+        <m:sSub>
+          <m:e>
+            <m:r>
+              <m:t>P</m:t>
+            </m:r>
+          </m:e>
+          <m:sub>
+            <m:r>
+              <m:rPr>
+                <m:sty m:val="p"/>
+              </m:rPr>
+              <m:t>p</m:t>
+            </m:r>
+            <m:r>
+              <m:rPr>
+                <m:sty m:val="p"/>
+              </m:rPr>
+              <m:t>e</m:t>
+            </m:r>
+            <m:r>
+              <m:rPr>
+                <m:sty m:val="p"/>
+              </m:rPr>
+              <m:t>a</m:t>
+            </m:r>
+            <m:r>
+              <m:rPr>
+                <m:sty m:val="p"/>
+              </m:rPr>
+              <m:t>k</m:t>
+            </m:r>
+          </m:sub>
+        </m:sSub>
+      </m:oMath>
+      <w:r>
+        <w:t xml:space="preserve">, a model-FLOPs utilization</w:t>
+      </w:r>
+      <w:r>
+        <w:t xml:space="preserve"> </w:t>
+      </w:r>
+      <w:r>
+        <w:t xml:space="preserve">MFU, and a radiation availability</w:t>
+      </w:r>
+      <w:r>
+        <w:t xml:space="preserve"> </w:t>
+      </w:r>
+      <m:oMath>
+        <m:sSub>
+          <m:e>
+            <m:r>
+              <m:t>a</m:t>
+            </m:r>
+          </m:e>
+          <m:sub>
+            <m:r>
+              <m:t>r</m:t>
+            </m:r>
+          </m:sub>
+        </m:sSub>
+      </m:oMath>
+      <w:r>
+        <w:t xml:space="preserve">, the delivered useful rate is</w:t>
+      </w:r>
+      <w:r>
+        <w:t xml:space="preserve"> </w:t>
+      </w:r>
+      <m:oMath>
+        <m:r>
+          <m:t>n</m:t>
+        </m:r>
+        <m:r>
+          <m:t> </m:t>
+        </m:r>
+        <m:sSub>
+          <m:e>
+            <m:r>
+              <m:t>P</m:t>
+            </m:r>
+          </m:e>
+          <m:sub>
+            <m:r>
+              <m:rPr>
+                <m:sty m:val="p"/>
+              </m:rPr>
+              <m:t>p</m:t>
+            </m:r>
+            <m:r>
+              <m:rPr>
+                <m:sty m:val="p"/>
+              </m:rPr>
+              <m:t>e</m:t>
+            </m:r>
+            <m:r>
+              <m:rPr>
+                <m:sty m:val="p"/>
+              </m:rPr>
+              <m:t>a</m:t>
+            </m:r>
+            <m:r>
+              <m:rPr>
+                <m:sty m:val="p"/>
+              </m:rPr>
+              <m:t>k</m:t>
+            </m:r>
+          </m:sub>
+        </m:sSub>
+        <m:r>
+          <m:t> </m:t>
+        </m:r>
+        <m:r>
+          <m:rPr>
+            <m:sty m:val="p"/>
+          </m:rPr>
+          <m:t>M</m:t>
+        </m:r>
+        <m:r>
+          <m:rPr>
+            <m:sty m:val="p"/>
+          </m:rPr>
+          <m:t>F</m:t>
+        </m:r>
+        <m:r>
+          <m:rPr>
+            <m:sty m:val="p"/>
+          </m:rPr>
+          <m:t>U</m:t>
+        </m:r>
+        <m:r>
+          <m:t> </m:t>
+        </m:r>
+        <m:sSub>
+          <m:e>
+            <m:r>
+              <m:t>a</m:t>
+            </m:r>
+          </m:e>
+          <m:sub>
+            <m:r>
+              <m:t>r</m:t>
+            </m:r>
+          </m:sub>
+        </m:sSub>
+      </m:oMath>
+      <w:r>
+        <w:t xml:space="preserve">. Model-FLOPs utilization is forty to sixty percent for training but only eight to</w:t>
+      </w:r>
+      <w:r>
+        <w:t xml:space="preserve"> </w:t>
+      </w:r>
+      <w:r>
+        <w:t xml:space="preserve">ten percent for inference decode, which is memory-bandwidth bound; a space inference platform must be</w:t>
+      </w:r>
+      <w:r>
+        <w:t xml:space="preserve"> </w:t>
+      </w:r>
+      <w:r>
+        <w:t xml:space="preserve">planned around the low regime.</w:t>
+      </w:r>
+    </w:p>
+    <w:p>
+      <w:pPr>
+        <w:pStyle w:val="BodyText"/>
+      </w:pPr>
+      <w:r>
+        <w:rPr>
+          <w:b/>
+          <w:bCs/>
+        </w:rPr>
+        <w:t xml:space="preserve">Coupled thermal-throttle simulation.</w:t>
+      </w:r>
+      <w:r>
+        <w:t xml:space="preserve"> </w:t>
+      </w:r>
+      <w:r>
+        <w:t xml:space="preserve">The first-order static estimate above misses an essential</w:t>
+      </w:r>
+      <w:r>
+        <w:t xml:space="preserve"> </w:t>
+      </w:r>
+      <w:r>
+        <w:t xml:space="preserve">coupling: a hot chip throttles. The workload model therefore integrates the radiator temperature</w:t>
+      </w:r>
+      <w:r>
+        <w:t xml:space="preserve"> </w:t>
+      </w:r>
+      <w:r>
+        <w:t xml:space="preserve">over an orbit while a time-varying compute load heats the die; when the junction temperature exceeds</w:t>
+      </w:r>
+      <w:r>
+        <w:t xml:space="preserve"> </w:t>
+      </w:r>
+      <w:r>
+        <w:t xml:space="preserve">its throttle threshold, the effective utilization (and thus both power and delivered work) is scaled</w:t>
+      </w:r>
+      <w:r>
+        <w:t xml:space="preserve"> </w:t>
+      </w:r>
+      <w:r>
+        <w:t xml:space="preserve">back, and the loop settles to a throttled operating point. The result is striking: under passive</w:t>
+      </w:r>
+      <w:r>
+        <w:t xml:space="preserve"> </w:t>
+      </w:r>
+      <w:r>
+        <w:t xml:space="preserve">cooling, a 700-W H100 throttles by roughly ninety percent, the interface wall of Chapter 10 made</w:t>
+      </w:r>
+      <w:r>
+        <w:t xml:space="preserve"> </w:t>
+      </w:r>
+      <w:r>
+        <w:t xml:space="preserve">visible in the time domain, while a low-power TPU runs essentially un-throttled. This is the</w:t>
+      </w:r>
+      <w:r>
+        <w:t xml:space="preserve"> </w:t>
+      </w:r>
+      <w:r>
+        <w:t xml:space="preserve">quantitative case for chip-level active cooling at high power.</w:t>
+      </w:r>
+    </w:p>
+    <w:p>
+      <w:pPr>
+        <w:pStyle w:val="BodyText"/>
+      </w:pPr>
+      <w:r>
+        <w:rPr>
+          <w:b/>
+          <w:bCs/>
+        </w:rPr>
+        <w:t xml:space="preserve">Effective efficiency.</w:t>
+      </w:r>
+      <w:r>
+        <w:t xml:space="preserve"> </w:t>
+      </w:r>
+      <w:r>
+        <w:t xml:space="preserve">The appropriate efficiency metric is an effective power-usage effectiveness that</w:t>
+      </w:r>
+      <w:r>
+        <w:t xml:space="preserve"> </w:t>
+      </w:r>
+      <w:r>
+        <w:t xml:space="preserve">folds in the radiation throughput tax,</w:t>
+      </w:r>
+      <w:r>
+        <w:t xml:space="preserve"> </w:t>
+      </w:r>
+      <m:oMath>
+        <m:sSub>
+          <m:e>
+            <m:r>
+              <m:rPr>
+                <m:sty m:val="p"/>
+              </m:rPr>
+              <m:t>P</m:t>
+            </m:r>
+            <m:r>
+              <m:rPr>
+                <m:sty m:val="p"/>
+              </m:rPr>
+              <m:t>U</m:t>
+            </m:r>
+            <m:r>
+              <m:rPr>
+                <m:sty m:val="p"/>
+              </m:rPr>
+              <m:t>E</m:t>
+            </m:r>
+          </m:e>
+          <m:sub>
+            <m:r>
+              <m:rPr>
+                <m:sty m:val="p"/>
+              </m:rPr>
+              <m:t>e</m:t>
+            </m:r>
+            <m:r>
+              <m:rPr>
+                <m:sty m:val="p"/>
+              </m:rPr>
+              <m:t>f</m:t>
+            </m:r>
+            <m:r>
+              <m:rPr>
+                <m:sty m:val="p"/>
+              </m:rPr>
+              <m:t>f</m:t>
+            </m:r>
+          </m:sub>
+        </m:sSub>
+        <m:r>
+          <m:rPr>
+            <m:sty m:val="p"/>
+          </m:rPr>
+          <m:t>=</m:t>
+        </m:r>
+        <m:r>
+          <m:rPr>
+            <m:sty m:val="p"/>
+          </m:rPr>
+          <m:t>(</m:t>
+        </m:r>
+        <m:sSub>
+          <m:e>
+            <m:r>
+              <m:t>P</m:t>
+            </m:r>
+          </m:e>
+          <m:sub>
+            <m:r>
+              <m:rPr>
+                <m:sty m:val="p"/>
+              </m:rPr>
+              <m:t>t</m:t>
+            </m:r>
+            <m:r>
+              <m:rPr>
+                <m:sty m:val="p"/>
+              </m:rPr>
+              <m:t>o</m:t>
+            </m:r>
+            <m:r>
+              <m:rPr>
+                <m:sty m:val="p"/>
+              </m:rPr>
+              <m:t>t</m:t>
+            </m:r>
+            <m:r>
+              <m:rPr>
+                <m:sty m:val="p"/>
+              </m:rPr>
+              <m:t>a</m:t>
+            </m:r>
+            <m:r>
+              <m:rPr>
+                <m:sty m:val="p"/>
+              </m:rPr>
+              <m:t>l</m:t>
+            </m:r>
+          </m:sub>
+        </m:sSub>
+        <m:r>
+          <m:rPr>
+            <m:sty m:val="p"/>
+          </m:rPr>
+          <m:t>/</m:t>
+        </m:r>
+        <m:sSub>
+          <m:e>
+            <m:r>
+              <m:t>P</m:t>
+            </m:r>
+          </m:e>
+          <m:sub>
+            <m:r>
+              <m:rPr>
+                <m:sty m:val="p"/>
+              </m:rPr>
+              <m:t>c</m:t>
+            </m:r>
+            <m:r>
+              <m:rPr>
+                <m:sty m:val="p"/>
+              </m:rPr>
+              <m:t>o</m:t>
+            </m:r>
+            <m:r>
+              <m:rPr>
+                <m:sty m:val="p"/>
+              </m:rPr>
+              <m:t>m</m:t>
+            </m:r>
+            <m:r>
+              <m:rPr>
+                <m:sty m:val="p"/>
+              </m:rPr>
+              <m:t>p</m:t>
+            </m:r>
+            <m:r>
+              <m:rPr>
+                <m:sty m:val="p"/>
+              </m:rPr>
+              <m:t>u</m:t>
+            </m:r>
+            <m:r>
+              <m:rPr>
+                <m:sty m:val="p"/>
+              </m:rPr>
+              <m:t>t</m:t>
+            </m:r>
+            <m:r>
+              <m:rPr>
+                <m:sty m:val="p"/>
+              </m:rPr>
+              <m:t>e</m:t>
+            </m:r>
+          </m:sub>
+        </m:sSub>
+        <m:r>
+          <m:rPr>
+            <m:sty m:val="p"/>
+          </m:rPr>
+          <m:t>)</m:t>
+        </m:r>
+        <m:r>
+          <m:rPr>
+            <m:sty m:val="p"/>
+          </m:rPr>
+          <m:t>/</m:t>
+        </m:r>
+        <m:sSub>
+          <m:e>
+            <m:r>
+              <m:t>a</m:t>
+            </m:r>
+          </m:e>
+          <m:sub>
+            <m:r>
+              <m:t>r</m:t>
+            </m:r>
+          </m:sub>
+        </m:sSub>
+      </m:oMath>
+      <w:r>
+        <w:t xml:space="preserve">, and the relevant cost metric is dollars per useful petaflop-hour, which at</w:t>
+      </w:r>
+      <w:r>
+        <w:t xml:space="preserve"> </w:t>
+      </w:r>
+      <w:r>
+        <w:t xml:space="preserve">realistic utilization is several times the headline peak figure.</w:t>
+      </w:r>
+    </w:p>
+    <w:p>
+      <w:pPr>
+        <w:pStyle w:val="CaptionedFigure"/>
+      </w:pPr>
+      <w:r>
+        <w:drawing>
+          <wp:inline>
+            <wp:extent cx="5334000" cy="3844698"/>
+            <wp:effectExtent b="0" l="0" r="0" t="0"/>
+            <wp:docPr descr="Fig. 17.1, Added subsystems: passive thermal-throttle by chip, ground-station site diversity, latency crossover, and the discounted-cash-flow breakeven." title="" id="103" name="Picture"/>
+            <a:graphic>
+              <a:graphicData uri="http://schemas.openxmlformats.org/drawingml/2006/picture">
+                <pic:pic>
+                  <pic:nvPicPr>
+                    <pic:cNvPr descr="systems_figs/fig_new_subsystems.png" id="104" name="Picture"/>
+                    <pic:cNvPicPr>
+                      <a:picLocks noChangeArrowheads="1" noChangeAspect="1"/>
+                    </pic:cNvPicPr>
+                  </pic:nvPicPr>
+                  <pic:blipFill>
+                    <a:blip r:embed="rId102"/>
                     <a:stretch>
                       <a:fillRect/>
                     </a:stretch>
@@ -24530,9 +25080,9 @@
         </w:pict>
       </w:r>
     </w:p>
-    <w:bookmarkEnd w:id="75"/>
-    <w:bookmarkEnd w:id="76"/>
-    <w:bookmarkStart w:id="93" w:name="Xe5ea88703363ae012ea2f87a0aad981517e6b12"/>
+    <w:bookmarkEnd w:id="105"/>
+    <w:bookmarkEnd w:id="106"/>
+    <w:bookmarkStart w:id="123" w:name="Xe5ea88703363ae012ea2f87a0aad981517e6b12"/>
     <w:p>
       <w:pPr>
         <w:pStyle w:val="Heading1"/>
@@ -24541,7 +25091,7 @@
         <w:t xml:space="preserve">PART IV, INTEGRATION, SIMULATION, AND RESULTS</w:t>
       </w:r>
     </w:p>
-    <w:bookmarkStart w:id="80" w:name="the-integrated-system-model"/>
+    <w:bookmarkStart w:id="110" w:name="the-integrated-system-model"/>
     <w:p>
       <w:pPr>
         <w:pStyle w:val="Heading2"/>
@@ -24721,18 +25271,18 @@
           <wp:inline>
             <wp:extent cx="5334000" cy="3268796"/>
             <wp:effectExtent b="0" l="0" r="0" t="0"/>
-            <wp:docPr descr="Fig. 18.1, Integrated dry-mass budget, closed self-consistently by the system model." title="" id="78" name="Picture"/>
+            <wp:docPr descr="Fig. 18.1, Integrated dry-mass budget, closed self-consistently by the system model." title="" id="108" name="Picture"/>
             <a:graphic>
               <a:graphicData uri="http://schemas.openxmlformats.org/drawingml/2006/picture">
                 <pic:pic>
                   <pic:nvPicPr>
-                    <pic:cNvPr descr="systems_figs/fig_mass_budget.png" id="79" name="Picture"/>
+                    <pic:cNvPr descr="systems_figs/fig_mass_budget.png" id="109" name="Picture"/>
                     <pic:cNvPicPr>
                       <a:picLocks noChangeArrowheads="1" noChangeAspect="1"/>
                     </pic:cNvPicPr>
                   </pic:nvPicPr>
                   <pic:blipFill>
-                    <a:blip r:embed="rId77"/>
+                    <a:blip r:embed="rId107"/>
                     <a:stretch>
                       <a:fillRect/>
                     </a:stretch>
@@ -24767,8 +25317,8 @@
         <w:t xml:space="preserve">Fig. 18.1, Integrated dry-mass budget, closed self-consistently by the system model.</w:t>
       </w:r>
     </w:p>
-    <w:bookmarkEnd w:id="80"/>
-    <w:bookmarkStart w:id="81" w:name="Xfed2044479baa4c639d53a9e82ee4edbe317219"/>
+    <w:bookmarkEnd w:id="110"/>
+    <w:bookmarkStart w:id="111" w:name="Xfed2044479baa4c639d53a9e82ee4edbe317219"/>
     <w:p>
       <w:pPr>
         <w:pStyle w:val="Heading2"/>
@@ -26103,8 +26653,8 @@
         <w:t xml:space="preserve">and the figures are produced by the same code that a reader can run.</w:t>
       </w:r>
     </w:p>
-    <w:bookmarkEnd w:id="81"/>
-    <w:bookmarkStart w:id="85" w:name="X23f703a5b3167e168d574605adab1b76f34ca68"/>
+    <w:bookmarkEnd w:id="111"/>
+    <w:bookmarkStart w:id="115" w:name="X23f703a5b3167e168d574605adab1b76f34ca68"/>
     <w:p>
       <w:pPr>
         <w:pStyle w:val="Heading2"/>
@@ -26699,18 +27249,18 @@
           <wp:inline>
             <wp:extent cx="5334000" cy="1708893"/>
             <wp:effectExtent b="0" l="0" r="0" t="0"/>
-            <wp:docPr descr="Fig. 19.1, Monte-Carlo distributions of natural lifetime, debris probability, and total Δv across the dominant uncertainties." title="" id="83" name="Picture"/>
+            <wp:docPr descr="Fig. 19.1, Monte-Carlo distributions of natural lifetime, debris probability, and total Δv across the dominant uncertainties." title="" id="113" name="Picture"/>
             <a:graphic>
               <a:graphicData uri="http://schemas.openxmlformats.org/drawingml/2006/picture">
                 <pic:pic>
                   <pic:nvPicPr>
-                    <pic:cNvPr descr="systems_figs/fig_montecarlo.png" id="84" name="Picture"/>
+                    <pic:cNvPr descr="systems_figs/fig_montecarlo.png" id="114" name="Picture"/>
                     <pic:cNvPicPr>
                       <a:picLocks noChangeArrowheads="1" noChangeAspect="1"/>
                     </pic:cNvPicPr>
                   </pic:nvPicPr>
                   <pic:blipFill>
-                    <a:blip r:embed="rId82"/>
+                    <a:blip r:embed="rId112"/>
                     <a:stretch>
                       <a:fillRect/>
                     </a:stretch>
@@ -26745,8 +27295,8 @@
         <w:t xml:space="preserve">Fig. 19.1, Monte-Carlo distributions of natural lifetime, debris probability, and total Δv across the dominant uncertainties.</w:t>
       </w:r>
     </w:p>
-    <w:bookmarkEnd w:id="85"/>
-    <w:bookmarkStart w:id="92" w:name="X75af3e2abfcdea4ef8ecf50a29bce1e8bc901aa"/>
+    <w:bookmarkEnd w:id="115"/>
+    <w:bookmarkStart w:id="122" w:name="X75af3e2abfcdea4ef8ecf50a29bce1e8bc901aa"/>
     <w:p>
       <w:pPr>
         <w:pStyle w:val="Heading2"/>
@@ -27229,18 +27779,18 @@
           <wp:inline>
             <wp:extent cx="5334000" cy="3247989"/>
             <wp:effectExtent b="0" l="0" r="0" t="0"/>
-            <wp:docPr descr="Fig. 20.1, Catastrophic debris risk for the full cluster, and the in-cluster cascade coupling versus formation spacing." title="" id="87" name="Picture"/>
+            <wp:docPr descr="Fig. 20.1, Catastrophic debris risk for the full cluster, and the in-cluster cascade coupling versus formation spacing." title="" id="117" name="Picture"/>
             <a:graphic>
               <a:graphicData uri="http://schemas.openxmlformats.org/drawingml/2006/picture">
                 <pic:pic>
                   <pic:nvPicPr>
-                    <pic:cNvPr descr="figures/fig3_debris_risk.png" id="88" name="Picture"/>
+                    <pic:cNvPr descr="figures/fig3_debris_risk.png" id="118" name="Picture"/>
                     <pic:cNvPicPr>
                       <a:picLocks noChangeArrowheads="1" noChangeAspect="1"/>
                     </pic:cNvPicPr>
                   </pic:nvPicPr>
                   <pic:blipFill>
-                    <a:blip r:embed="rId86"/>
+                    <a:blip r:embed="rId116"/>
                     <a:stretch>
                       <a:fillRect/>
                     </a:stretch>
@@ -27284,18 +27834,18 @@
           <wp:inline>
             <wp:extent cx="5334000" cy="3462610"/>
             <wp:effectExtent b="0" l="0" r="0" t="0"/>
-            <wp:docPr descr="Fig. 20.2, Cumulative dose versus aluminium shielding, and the reliability-throughput trade." title="" id="90" name="Picture"/>
+            <wp:docPr descr="Fig. 20.2, Cumulative dose versus aluminium shielding, and the reliability-throughput trade." title="" id="120" name="Picture"/>
             <a:graphic>
               <a:graphicData uri="http://schemas.openxmlformats.org/drawingml/2006/picture">
                 <pic:pic>
                   <pic:nvPicPr>
-                    <pic:cNvPr descr="figures/fig4_radiation.png" id="91" name="Picture"/>
+                    <pic:cNvPr descr="figures/fig4_radiation.png" id="121" name="Picture"/>
                     <pic:cNvPicPr>
                       <a:picLocks noChangeArrowheads="1" noChangeAspect="1"/>
                     </pic:cNvPicPr>
                   </pic:nvPicPr>
                   <pic:blipFill>
-                    <a:blip r:embed="rId89"/>
+                    <a:blip r:embed="rId119"/>
                     <a:stretch>
                       <a:fillRect/>
                     </a:stretch>
@@ -27337,9 +27887,9 @@
         </w:pict>
       </w:r>
     </w:p>
-    <w:bookmarkEnd w:id="92"/>
-    <w:bookmarkEnd w:id="93"/>
-    <w:bookmarkStart w:id="109" w:name="part-v-economics-and-predictions"/>
+    <w:bookmarkEnd w:id="122"/>
+    <w:bookmarkEnd w:id="123"/>
+    <w:bookmarkStart w:id="142" w:name="part-v-economics-and-predictions"/>
     <w:p>
       <w:pPr>
         <w:pStyle w:val="Heading1"/>
@@ -27348,7 +27898,7 @@
         <w:t xml:space="preserve">PART V, ECONOMICS AND PREDICTIONS</w:t>
       </w:r>
     </w:p>
-    <w:bookmarkStart w:id="100" w:name="X2e3f63e059a4787a3738c8a944d90eb01378ed4"/>
+    <w:bookmarkStart w:id="130" w:name="X2e3f63e059a4787a3738c8a944d90eb01378ed4"/>
     <w:p>
       <w:pPr>
         <w:pStyle w:val="Heading2"/>
@@ -28314,18 +28864,18 @@
           <wp:inline>
             <wp:extent cx="5334000" cy="2294266"/>
             <wp:effectExtent b="0" l="0" r="0" t="0"/>
-            <wp:docPr descr="Fig. 21.1b Levelized cost of useful compute versus model-FLOPs utilization, and versus launch price. The cost is dominated by utilization and hardware, not by launch." title="" id="95" name="Picture"/>
+            <wp:docPr descr="Fig. 21.1b Levelized cost of useful compute versus model-FLOPs utilization, and versus launch price. The cost is dominated by utilization and hardware, not by launch." title="" id="125" name="Picture"/>
             <a:graphic>
               <a:graphicData uri="http://schemas.openxmlformats.org/drawingml/2006/picture">
                 <pic:pic>
                   <pic:nvPicPr>
-                    <pic:cNvPr descr="figures2/figA7_lcoe.png" id="96" name="Picture"/>
+                    <pic:cNvPr descr="figures2/figA7_lcoe.png" id="126" name="Picture"/>
                     <pic:cNvPicPr>
                       <a:picLocks noChangeArrowheads="1" noChangeAspect="1"/>
                     </pic:cNvPicPr>
                   </pic:nvPicPr>
                   <pic:blipFill>
-                    <a:blip r:embed="rId94"/>
+                    <a:blip r:embed="rId124"/>
                     <a:stretch>
                       <a:fillRect/>
                     </a:stretch>
@@ -28369,18 +28919,18 @@
           <wp:inline>
             <wp:extent cx="5334000" cy="2405396"/>
             <wp:effectExtent b="0" l="0" r="0" t="0"/>
-            <wp:docPr descr="Fig. 21.1, Cost of useful compute versus utilization, and the radiation throughput tax by protection level." title="" id="98" name="Picture"/>
+            <wp:docPr descr="Fig. 21.1, Cost of useful compute versus utilization, and the radiation throughput tax by protection level." title="" id="128" name="Picture"/>
             <a:graphic>
               <a:graphicData uri="http://schemas.openxmlformats.org/drawingml/2006/picture">
                 <pic:pic>
                   <pic:nvPicPr>
-                    <pic:cNvPr descr="systems_figs/fig_compute.png" id="99" name="Picture"/>
+                    <pic:cNvPr descr="systems_figs/fig_compute.png" id="129" name="Picture"/>
                     <pic:cNvPicPr>
                       <a:picLocks noChangeArrowheads="1" noChangeAspect="1"/>
                     </pic:cNvPicPr>
                   </pic:nvPicPr>
                   <pic:blipFill>
-                    <a:blip r:embed="rId97"/>
+                    <a:blip r:embed="rId127"/>
                     <a:stretch>
                       <a:fillRect/>
                     </a:stretch>
@@ -28415,8 +28965,8 @@
         <w:t xml:space="preserve">Fig. 21.1, Cost of useful compute versus utilization, and the radiation throughput tax by protection level.</w:t>
       </w:r>
     </w:p>
-    <w:bookmarkEnd w:id="100"/>
-    <w:bookmarkStart w:id="107" w:name="the-launch-cost-parity-prediction"/>
+    <w:bookmarkEnd w:id="130"/>
+    <w:bookmarkStart w:id="137" w:name="the-launch-cost-parity-prediction"/>
     <w:p>
       <w:pPr>
         <w:pStyle w:val="Heading2"/>
@@ -28520,18 +29070,18 @@
           <wp:inline>
             <wp:extent cx="5334000" cy="3081272"/>
             <wp:effectExtent b="0" l="0" r="0" t="0"/>
-            <wp:docPr descr="Fig. 22.1. The launch-cost landscape. Left: below roughly 600 dollars per kilogram the all-in cost per satellite is dominated by hardware rather than launch. Right: the price-per-kilogram trajectory to low Earth orbit, from the Shuttle program average through reusable Falcon 9 to the realistic and aspirational Starship targets." title="" id="102" name="Picture"/>
+            <wp:docPr descr="Fig. 22.1. The launch-cost landscape. Left: below roughly 600 dollars per kilogram the all-in cost per satellite is dominated by hardware rather than launch. Right: the price-per-kilogram trajectory to low Earth orbit, from the Shuttle program average through reusable Falcon 9 to the realistic and aspirational Starship targets." title="" id="132" name="Picture"/>
             <a:graphic>
               <a:graphicData uri="http://schemas.openxmlformats.org/drawingml/2006/picture">
                 <pic:pic>
                   <pic:nvPicPr>
-                    <pic:cNvPr descr="figures/fig6_launch_cost.png" id="103" name="Picture"/>
+                    <pic:cNvPr descr="figures/fig6_launch_cost.png" id="133" name="Picture"/>
                     <pic:cNvPicPr>
                       <a:picLocks noChangeArrowheads="1" noChangeAspect="1"/>
                     </pic:cNvPicPr>
                   </pic:nvPicPr>
                   <pic:blipFill>
-                    <a:blip r:embed="rId101"/>
+                    <a:blip r:embed="rId131"/>
                     <a:stretch>
                       <a:fillRect/>
                     </a:stretch>
@@ -28705,18 +29255,18 @@
           <wp:inline>
             <wp:extent cx="5334000" cy="2376725"/>
             <wp:effectExtent b="0" l="0" r="0" t="0"/>
-            <wp:docPr descr="Fig. 22.2, Launch-cost learning curve (Monte-Carlo) and the distribution of the cost-parity year. Most sampled scenarios never reach 200 dollars per kilogram within the horizon; conditional on those that do, the median is near 2044, later than the vendor’s 2035." title="" id="105" name="Picture"/>
+            <wp:docPr descr="Fig. 22.2, Launch-cost learning curve (Monte-Carlo) and the distribution of the cost-parity year. Most sampled scenarios never reach 200 dollars per kilogram within the horizon; conditional on those that do, the median is near 2044, later than the vendor’s 2035." title="" id="135" name="Picture"/>
             <a:graphic>
               <a:graphicData uri="http://schemas.openxmlformats.org/drawingml/2006/picture">
                 <pic:pic>
                   <pic:nvPicPr>
-                    <pic:cNvPr descr="figures_pred/fig_cost_parity.png" id="106" name="Picture"/>
+                    <pic:cNvPr descr="figures_pred/fig_cost_parity.png" id="136" name="Picture"/>
                     <pic:cNvPicPr>
                       <a:picLocks noChangeArrowheads="1" noChangeAspect="1"/>
                     </pic:cNvPicPr>
                   </pic:nvPicPr>
                   <pic:blipFill>
-                    <a:blip r:embed="rId104"/>
+                    <a:blip r:embed="rId134"/>
                     <a:stretch>
                       <a:fillRect/>
                     </a:stretch>
@@ -28751,8 +29301,8 @@
         <w:t xml:space="preserve">Fig. 22.2, Launch-cost learning curve (Monte-Carlo) and the distribution of the cost-parity year. Most sampled scenarios never reach 200 dollars per kilogram within the horizon; conditional on those that do, the median is near 2044, later than the vendor’s 2035.</w:t>
       </w:r>
     </w:p>
-    <w:bookmarkEnd w:id="107"/>
-    <w:bookmarkStart w:id="108" w:name="capability-and-risk-trajectory-2027-2035"/>
+    <w:bookmarkEnd w:id="137"/>
+    <w:bookmarkStart w:id="141" w:name="capability-and-risk-trajectory-2027-2035"/>
     <w:p>
       <w:pPr>
         <w:pStyle w:val="Heading2"/>
@@ -28781,427 +29331,482 @@
     </w:p>
     <w:p>
       <w:pPr>
-        <w:pStyle w:val="FirstParagraph"/>
-      </w:pPr>
-      <w:r>
-        <w:t xml:space="preserve">Synthesizing the technology-readiness picture of Chapter 2 with the engineering constraints of the</w:t>
-      </w:r>
-      <w:r>
-        <w:t xml:space="preserve"> </w:t>
-      </w:r>
-      <w:r>
-        <w:t xml:space="preserve">preceding chapters yields a defensible capability trajectory. By 2027, the demonstration missions</w:t>
-      </w:r>
-      <w:r>
-        <w:t xml:space="preserve"> </w:t>
-      </w:r>
-      <w:r>
-        <w:t xml:space="preserve">(the Suncatcher two-satellite prototype, Starcloud’s Blackwell-class follow-on) should place real</w:t>
-      </w:r>
-      <w:r>
-        <w:t xml:space="preserve"> </w:t>
-      </w:r>
-      <w:r>
-        <w:t xml:space="preserve">accelerators in orbit and exercise components, raising their readiness while leaving</w:t>
-      </w:r>
-      <w:r>
-        <w:t xml:space="preserve"> </w:t>
-      </w:r>
-      <w:r>
-        <w:t xml:space="preserve">constellation-scale operation unproven. Through 2028 to 2030, the gating demonstrations are flown</w:t>
-      </w:r>
-      <w:r>
-        <w:t xml:space="preserve"> </w:t>
-      </w:r>
-      <w:r>
-        <w:t xml:space="preserve">multi-terabit formation links, validated formation station-keeping under the differential drag of</w:t>
-      </w:r>
-      <w:r>
-        <w:t xml:space="preserve"> </w:t>
-      </w:r>
-      <w:r>
-        <w:t xml:space="preserve">the solar cycle, and, most importantly, autonomous, cluster-coordinated debris avoidance at</w:t>
-      </w:r>
-      <w:r>
-        <w:t xml:space="preserve"> </w:t>
-      </w:r>
-      <w:r>
-        <w:t xml:space="preserve">sub-kilometer spacing. From 2030 to 2035, if launch trends hold, niche economic cases emerge for</w:t>
-      </w:r>
-      <w:r>
-        <w:t xml:space="preserve"> </w:t>
-      </w:r>
-      <w:r>
-        <w:t xml:space="preserve">latency-critical or space-native workloads, while gigawatt scale remains aspirational and cost</w:t>
-      </w:r>
-      <w:r>
-        <w:t xml:space="preserve"> </w:t>
-      </w:r>
-      <w:r>
-        <w:t xml:space="preserve">parity, per Chapter 22, is unlikely before the mid-2030s.</w:t>
-      </w:r>
-    </w:p>
-    <w:p>
-      <w:pPr>
-        <w:pStyle w:val="BodyText"/>
-      </w:pPr>
-      <w:r>
-        <w:t xml:space="preserve">The debris-and-Kessler trajectory deserves particular attention: a one-kilometer cluster in the</w:t>
-      </w:r>
-      <w:r>
-        <w:t xml:space="preserve"> </w:t>
-      </w:r>
-      <w:r>
-        <w:t xml:space="preserve">congested 650-km shell raises both the catastrophic-impact exposure and the cascade hazard, and its</w:t>
-      </w:r>
-      <w:r>
-        <w:t xml:space="preserve"> </w:t>
-      </w:r>
-      <w:r>
-        <w:t xml:space="preserve">evolution depends on disposal compliance and avoidance autonomy. A flight program should quantify</w:t>
-      </w:r>
-      <w:r>
-        <w:t xml:space="preserve"> </w:t>
-      </w:r>
-      <w:r>
-        <w:t xml:space="preserve">this with the official ORDEM 3.2 and LEGEND tools before committing to constellation scale.</w:t>
-      </w:r>
-    </w:p>
-    <w:p>
-      <w:r>
-        <w:pict>
-          <v:rect style="width:0;height:1.5pt" o:hralign="center" o:hrstd="t" o:hr="t"/>
-        </w:pict>
-      </w:r>
-    </w:p>
-    <w:bookmarkEnd w:id="108"/>
-    <w:bookmarkEnd w:id="109"/>
-    <w:bookmarkStart w:id="115" w:name="part-vi-synthesis"/>
-    <w:p>
-      <w:pPr>
-        <w:pStyle w:val="Heading1"/>
-      </w:pPr>
-      <w:r>
-        <w:t xml:space="preserve">PART VI, SYNTHESIS</w:t>
-      </w:r>
-    </w:p>
-    <w:bookmarkStart w:id="110" w:name="caveats-and-limitations"/>
-    <w:p>
-      <w:pPr>
-        <w:pStyle w:val="Heading2"/>
-      </w:pPr>
-      <w:r>
-        <w:t xml:space="preserve">24. Caveats and limitations</w:t>
-      </w:r>
-    </w:p>
-    <w:p>
-      <w:pPr>
-        <w:pStyle w:val="BlockText"/>
-      </w:pPr>
-      <w:r>
-        <w:rPr>
-          <w:i/>
-          <w:iCs/>
-        </w:rPr>
-        <w:t xml:space="preserve">Abstract.</w:t>
-      </w:r>
-      <w:r>
-        <w:t xml:space="preserve"> </w:t>
-      </w:r>
-      <w:r>
-        <w:t xml:space="preserve">This chapter states plainly what the study does and does not establish, including the quality of its sources and the model fidelity it deliberately stops short of.</w:t>
-      </w:r>
-    </w:p>
-    <w:p>
-      <w:pPr>
-        <w:pStyle w:val="FirstParagraph"/>
-      </w:pPr>
-      <w:r>
-        <w:t xml:space="preserve">A complete assessment must state clearly what this study does and does not establish.</w:t>
-      </w:r>
-    </w:p>
-    <w:p>
-      <w:pPr>
-        <w:pStyle w:val="BodyText"/>
-      </w:pPr>
-      <w:r>
-        <w:t xml:space="preserve">On source quality: the single most load-bearing source for the radiation, link-budget, and</w:t>
-      </w:r>
-      <w:r>
-        <w:t xml:space="preserve"> </w:t>
-      </w:r>
-      <w:r>
-        <w:t xml:space="preserve">cost-parity claims is a non-peer-reviewed, vendor-authored preprint; its results are self-reported</w:t>
-      </w:r>
-      <w:r>
-        <w:t xml:space="preserve"> </w:t>
-      </w:r>
-      <w:r>
-        <w:t xml:space="preserve">and not independently replicated. On the technology-readiness gap: what has been demonstrated is one</w:t>
-      </w:r>
-      <w:r>
-        <w:t xml:space="preserve"> </w:t>
-      </w:r>
-      <w:r>
-        <w:t xml:space="preserve">data-center-class GPU in orbit, ground radiation testing of a TPU, a bench-scale optical link, and</w:t>
-      </w:r>
-      <w:r>
-        <w:t xml:space="preserve"> </w:t>
-      </w:r>
-      <w:r>
-        <w:t xml:space="preserve">kilowatt-class nodes; what the vision requires, megawatt-to-gigawatt clusters, flown multi-terabit</w:t>
-      </w:r>
-      <w:r>
-        <w:t xml:space="preserve"> </w:t>
-      </w:r>
-      <w:r>
-        <w:t xml:space="preserve">formation links, dramatically cheaper launch, and in-flight formation control, has not been</w:t>
-      </w:r>
-      <w:r>
-        <w:t xml:space="preserve"> </w:t>
-      </w:r>
-      <w:r>
-        <w:t xml:space="preserve">demonstrated. On model fidelity: the debris flux, atmospheric density, and radiative limits used</w:t>
-      </w:r>
-      <w:r>
-        <w:t xml:space="preserve"> </w:t>
-      </w:r>
-      <w:r>
-        <w:t xml:space="preserve">here are computed at first order with explicit uncertainty bands, not measured per-orbit; a flight</w:t>
-      </w:r>
-      <w:r>
-        <w:t xml:space="preserve"> </w:t>
-      </w:r>
-      <w:r>
-        <w:t xml:space="preserve">program would use the official agency tools (NASA DAS, ORDEM 3.2, ESA MASTER and DRAMA,</w:t>
-      </w:r>
-      <w:r>
-        <w:t xml:space="preserve"> </w:t>
-      </w:r>
-      <w:r>
-        <w:t xml:space="preserve">SPENVIS/SHIELDOSE-2) and a full thermal and orbit toolchain. The model also omits, by design, a</w:t>
-      </w:r>
-      <w:r>
-        <w:t xml:space="preserve"> </w:t>
-      </w:r>
-      <w:r>
-        <w:t xml:space="preserve">multi-node thermal finite-element analysis, a closed-loop attitude-control simulation, formal</w:t>
-      </w:r>
-      <w:r>
-        <w:t xml:space="preserve"> </w:t>
-      </w:r>
-      <w:r>
-        <w:t xml:space="preserve">failure-modes and effects analysis, micrometeoroid Whipple-shield sizing, and a full time-domain</w:t>
-      </w:r>
-      <w:r>
-        <w:t xml:space="preserve"> </w:t>
-      </w:r>
-      <w:r>
-        <w:t xml:space="preserve">mission simulation. Finally, several widely repeated marketing claims, notably</w:t>
-      </w:r>
-      <w:r>
-        <w:t xml:space="preserve"> </w:t>
-      </w:r>
-      <w:r>
-        <w:t xml:space="preserve">“ten times cheaper</w:t>
-      </w:r>
-      <w:r>
-        <w:t xml:space="preserve"> </w:t>
-      </w:r>
-      <w:r>
-        <w:t xml:space="preserve">including launch”</w:t>
-      </w:r>
-      <w:r>
-        <w:t xml:space="preserve">, failed independent verification and are not relied upon here.</w:t>
-      </w:r>
-    </w:p>
-    <w:p>
-      <w:pPr>
-        <w:pStyle w:val="BodyText"/>
-      </w:pPr>
-      <w:r>
-        <w:t xml:space="preserve">These limitations do not undermine the study’s purpose, which is to size the problem, rank the</w:t>
-      </w:r>
-      <w:r>
-        <w:t xml:space="preserve"> </w:t>
-      </w:r>
-      <w:r>
-        <w:t xml:space="preserve">risks, and quantify the trades transparently. They do bound the confidence with which any single</w:t>
-      </w:r>
-      <w:r>
-        <w:t xml:space="preserve"> </w:t>
-      </w:r>
-      <w:r>
-        <w:t xml:space="preserve">number should be quoted, and they identify exactly where higher-fidelity work is needed next.</w:t>
-      </w:r>
-    </w:p>
-    <w:bookmarkEnd w:id="110"/>
-    <w:bookmarkStart w:id="114" w:name="X112718272980ce9d8db030edbf2c8e56c96c038"/>
-    <w:p>
-      <w:pPr>
-        <w:pStyle w:val="Heading2"/>
-      </w:pPr>
-      <w:r>
-        <w:t xml:space="preserve">25. Conclusions and the recommended demonstrator</w:t>
-      </w:r>
-    </w:p>
-    <w:p>
-      <w:pPr>
-        <w:pStyle w:val="BlockText"/>
-      </w:pPr>
-      <w:r>
-        <w:rPr>
-          <w:i/>
-          <w:iCs/>
-        </w:rPr>
-        <w:t xml:space="preserve">Abstract.</w:t>
-      </w:r>
-      <w:r>
-        <w:t xml:space="preserve"> </w:t>
-      </w:r>
-      <w:r>
-        <w:t xml:space="preserve">This chapter draws the conclusions and recommends the program that the analysis supports: small, attritable demonstrators aimed at the binding survivability and autonomy risks.</w:t>
-      </w:r>
-    </w:p>
-    <w:p>
-      <w:pPr>
-        <w:pStyle w:val="FirstParagraph"/>
-      </w:pPr>
-      <w:r>
-        <w:t xml:space="preserve">The analysis supports a clear and defensible conclusion. Radiative cooling, the problem</w:t>
-      </w:r>
-      <w:r>
-        <w:t xml:space="preserve"> </w:t>
-      </w:r>
-      <w:r>
-        <w:t xml:space="preserve">most often assumed to be the obstacle, is the solved part, now flight-proven at the single-node</w:t>
-      </w:r>
-      <w:r>
-        <w:t xml:space="preserve"> </w:t>
-      </w:r>
-      <w:r>
-        <w:t xml:space="preserve">scale, with the caveat that it does not scale for free and that high-power chips require active</w:t>
-      </w:r>
-      <w:r>
-        <w:t xml:space="preserve"> </w:t>
-      </w:r>
-      <w:r>
-        <w:t xml:space="preserve">cooling at the die. Radiation is comfortably survivable with sensible shielding, at the cost of a</w:t>
-      </w:r>
-      <w:r>
-        <w:t xml:space="preserve"> </w:t>
-      </w:r>
-      <w:r>
-        <w:t xml:space="preserve">modest throughput tax. The binding, unsolved constraints are elsewhere: orbital-debris survivability</w:t>
-      </w:r>
-      <w:r>
-        <w:t xml:space="preserve"> </w:t>
-      </w:r>
-      <w:r>
-        <w:t xml:space="preserve">in a tight formation, where the same close spacing that enables terabit optical links makes a</w:t>
-      </w:r>
-      <w:r>
-        <w:t xml:space="preserve"> </w:t>
-      </w:r>
-      <w:r>
-        <w:t xml:space="preserve">fragmentation cascade and collision avoidance dangerous; credible end-of-life disposal, which the</w:t>
-      </w:r>
-      <w:r>
-        <w:t xml:space="preserve"> </w:t>
-      </w:r>
-      <w:r>
-        <w:t xml:space="preserve">650-km orbit cannot achieve passively within the five-year rule and which therefore mandates</w:t>
-      </w:r>
-      <w:r>
-        <w:t xml:space="preserve"> </w:t>
-      </w:r>
-      <w:r>
-        <w:t xml:space="preserve">propulsion; and economics, where the launch-cost parity that underwrites the business case is later</w:t>
-      </w:r>
-      <w:r>
-        <w:t xml:space="preserve"> </w:t>
-      </w:r>
-      <w:r>
-        <w:t xml:space="preserve">and less certain than advertised.</w:t>
-      </w:r>
-    </w:p>
-    <w:p>
-      <w:pPr>
-        <w:pStyle w:val="BodyText"/>
-      </w:pPr>
-      <w:r>
-        <w:t xml:space="preserve">The recommended program follows directly. It is precisely what the leading efforts are already doing:</w:t>
-      </w:r>
-      <w:r>
-        <w:t xml:space="preserve"> </w:t>
-      </w:r>
-      <w:r>
-        <w:t xml:space="preserve">small, attritable, one-or-two-satellite demonstrators that retire the risks that actually matter.</w:t>
-      </w:r>
-      <w:r>
-        <w:t xml:space="preserve"> </w:t>
-      </w:r>
-      <w:r>
-        <w:t xml:space="preserve">Such a demonstrator should measure in-situ radiation dose and upset rates on the target accelerator,</w:t>
-      </w:r>
-      <w:r>
-        <w:t xml:space="preserve"> </w:t>
-      </w:r>
-      <w:r>
-        <w:t xml:space="preserve">demonstrate a modular liquid-cooled radiator at real kilowatt-class chip power, demonstrate onboard</w:t>
-      </w:r>
-      <w:r>
-        <w:t xml:space="preserve"> </w:t>
-      </w:r>
-      <w:r>
-        <w:t xml:space="preserve">debris sensing and an autonomous avoidance maneuver, and demonstrate a controlled propulsive</w:t>
-      </w:r>
-      <w:r>
-        <w:t xml:space="preserve"> </w:t>
-      </w:r>
-      <w:r>
-        <w:t xml:space="preserve">de-orbit at end of mission. Constellation-scale deployment should be gated behind a demonstrated</w:t>
-      </w:r>
-      <w:r>
-        <w:t xml:space="preserve"> </w:t>
-      </w:r>
-      <w:r>
-        <w:t xml:space="preserve">answer to the formation-and-debris paradox, not behind a launch-cost milestone. The systems-level</w:t>
-      </w:r>
-      <w:r>
-        <w:t xml:space="preserve"> </w:t>
-      </w:r>
-      <w:r>
-        <w:t xml:space="preserve">risk picture is summarized in Fig. 25.1: cooling sits in the low-risk corner, while debris, disposal,</w:t>
-      </w:r>
-      <w:r>
-        <w:t xml:space="preserve"> </w:t>
-      </w:r>
-      <w:r>
-        <w:t xml:space="preserve">and economics sit in the high-risk corner, and that is where the engineering attention belongs.</w:t>
-      </w:r>
-    </w:p>
-    <w:p>
-      <w:pPr>
         <w:pStyle w:val="CaptionedFigure"/>
       </w:pPr>
       <w:r>
         <w:drawing>
           <wp:inline>
-            <wp:extent cx="5334000" cy="3473567"/>
+            <wp:extent cx="5334000" cy="2788227"/>
             <wp:effectExtent b="0" l="0" r="0" t="0"/>
-            <wp:docPr descr="Fig. 25.1, Systems-level risk matrix: cooling is solved; debris, disposal, and economics are the open items." title="" id="112" name="Picture"/>
+            <wp:docPr descr="Technology-readiness ladder: the components sit mid-scale, while system integration sits near the bottom." title="" id="139" name="Picture"/>
             <a:graphic>
               <a:graphicData uri="http://schemas.openxmlformats.org/drawingml/2006/picture">
                 <pic:pic>
                   <pic:nvPicPr>
-                    <pic:cNvPr descr="figures/fig7_risk_matrix.png" id="113" name="Picture"/>
+                    <pic:cNvPr descr="schematics/diagram_trl.png" id="140" name="Picture"/>
                     <pic:cNvPicPr>
                       <a:picLocks noChangeArrowheads="1" noChangeAspect="1"/>
                     </pic:cNvPicPr>
                   </pic:nvPicPr>
                   <pic:blipFill>
-                    <a:blip r:embed="rId111"/>
+                    <a:blip r:embed="rId138"/>
+                    <a:stretch>
+                      <a:fillRect/>
+                    </a:stretch>
+                  </pic:blipFill>
+                  <pic:spPr bwMode="auto">
+                    <a:xfrm>
+                      <a:off x="0" y="0"/>
+                      <a:ext cx="5334000" cy="2788227"/>
+                    </a:xfrm>
+                    <a:prstGeom prst="rect">
+                      <a:avLst/>
+                    </a:prstGeom>
+                    <a:noFill/>
+                    <a:ln w="9525">
+                      <a:noFill/>
+                      <a:headEnd/>
+                      <a:tailEnd/>
+                    </a:ln>
+                  </pic:spPr>
+                </pic:pic>
+              </a:graphicData>
+            </a:graphic>
+          </wp:inline>
+        </w:drawing>
+      </w:r>
+    </w:p>
+    <w:p>
+      <w:pPr>
+        <w:pStyle w:val="ImageCaption"/>
+      </w:pPr>
+      <w:r>
+        <w:t xml:space="preserve">Technology-readiness ladder: the components sit mid-scale, while system integration sits near the bottom.</w:t>
+      </w:r>
+    </w:p>
+    <w:p>
+      <w:pPr>
+        <w:pStyle w:val="BodyText"/>
+      </w:pPr>
+      <w:r>
+        <w:t xml:space="preserve">Synthesizing the technology-readiness picture of Chapter 2 with the engineering constraints of the</w:t>
+      </w:r>
+      <w:r>
+        <w:t xml:space="preserve"> </w:t>
+      </w:r>
+      <w:r>
+        <w:t xml:space="preserve">preceding chapters yields a defensible capability trajectory. By 2027, the demonstration missions</w:t>
+      </w:r>
+      <w:r>
+        <w:t xml:space="preserve"> </w:t>
+      </w:r>
+      <w:r>
+        <w:t xml:space="preserve">(the Suncatcher two-satellite prototype, Starcloud’s Blackwell-class follow-on) should place real</w:t>
+      </w:r>
+      <w:r>
+        <w:t xml:space="preserve"> </w:t>
+      </w:r>
+      <w:r>
+        <w:t xml:space="preserve">accelerators in orbit and exercise components, raising their readiness while leaving</w:t>
+      </w:r>
+      <w:r>
+        <w:t xml:space="preserve"> </w:t>
+      </w:r>
+      <w:r>
+        <w:t xml:space="preserve">constellation-scale operation unproven. Through 2028 to 2030, the gating demonstrations are flown</w:t>
+      </w:r>
+      <w:r>
+        <w:t xml:space="preserve"> </w:t>
+      </w:r>
+      <w:r>
+        <w:t xml:space="preserve">multi-terabit formation links, validated formation station-keeping under the differential drag of</w:t>
+      </w:r>
+      <w:r>
+        <w:t xml:space="preserve"> </w:t>
+      </w:r>
+      <w:r>
+        <w:t xml:space="preserve">the solar cycle, and, most importantly, autonomous, cluster-coordinated debris avoidance at</w:t>
+      </w:r>
+      <w:r>
+        <w:t xml:space="preserve"> </w:t>
+      </w:r>
+      <w:r>
+        <w:t xml:space="preserve">sub-kilometer spacing. From 2030 to 2035, if launch trends hold, niche economic cases emerge for</w:t>
+      </w:r>
+      <w:r>
+        <w:t xml:space="preserve"> </w:t>
+      </w:r>
+      <w:r>
+        <w:t xml:space="preserve">latency-critical or space-native workloads, while gigawatt scale remains aspirational and cost</w:t>
+      </w:r>
+      <w:r>
+        <w:t xml:space="preserve"> </w:t>
+      </w:r>
+      <w:r>
+        <w:t xml:space="preserve">parity, per Chapter 22, is unlikely before the mid-2030s.</w:t>
+      </w:r>
+    </w:p>
+    <w:p>
+      <w:pPr>
+        <w:pStyle w:val="BodyText"/>
+      </w:pPr>
+      <w:r>
+        <w:t xml:space="preserve">The debris-and-Kessler trajectory deserves particular attention: a one-kilometer cluster in the</w:t>
+      </w:r>
+      <w:r>
+        <w:t xml:space="preserve"> </w:t>
+      </w:r>
+      <w:r>
+        <w:t xml:space="preserve">congested 650-km shell raises both the catastrophic-impact exposure and the cascade hazard, and its</w:t>
+      </w:r>
+      <w:r>
+        <w:t xml:space="preserve"> </w:t>
+      </w:r>
+      <w:r>
+        <w:t xml:space="preserve">evolution depends on disposal compliance and avoidance autonomy. A flight program should quantify</w:t>
+      </w:r>
+      <w:r>
+        <w:t xml:space="preserve"> </w:t>
+      </w:r>
+      <w:r>
+        <w:t xml:space="preserve">this with the official ORDEM 3.2 and LEGEND tools before committing to constellation scale.</w:t>
+      </w:r>
+    </w:p>
+    <w:p>
+      <w:r>
+        <w:pict>
+          <v:rect style="width:0;height:1.5pt" o:hralign="center" o:hrstd="t" o:hr="t"/>
+        </w:pict>
+      </w:r>
+    </w:p>
+    <w:bookmarkEnd w:id="141"/>
+    <w:bookmarkEnd w:id="142"/>
+    <w:bookmarkStart w:id="148" w:name="part-vi-synthesis"/>
+    <w:p>
+      <w:pPr>
+        <w:pStyle w:val="Heading1"/>
+      </w:pPr>
+      <w:r>
+        <w:t xml:space="preserve">PART VI, SYNTHESIS</w:t>
+      </w:r>
+    </w:p>
+    <w:bookmarkStart w:id="143" w:name="caveats-and-limitations"/>
+    <w:p>
+      <w:pPr>
+        <w:pStyle w:val="Heading2"/>
+      </w:pPr>
+      <w:r>
+        <w:t xml:space="preserve">24. Caveats and limitations</w:t>
+      </w:r>
+    </w:p>
+    <w:p>
+      <w:pPr>
+        <w:pStyle w:val="BlockText"/>
+      </w:pPr>
+      <w:r>
+        <w:rPr>
+          <w:i/>
+          <w:iCs/>
+        </w:rPr>
+        <w:t xml:space="preserve">Abstract.</w:t>
+      </w:r>
+      <w:r>
+        <w:t xml:space="preserve"> </w:t>
+      </w:r>
+      <w:r>
+        <w:t xml:space="preserve">This chapter states plainly what the study does and does not establish, including the quality of its sources and the model fidelity it deliberately stops short of.</w:t>
+      </w:r>
+    </w:p>
+    <w:p>
+      <w:pPr>
+        <w:pStyle w:val="FirstParagraph"/>
+      </w:pPr>
+      <w:r>
+        <w:t xml:space="preserve">A complete assessment must state clearly what this study does and does not establish.</w:t>
+      </w:r>
+    </w:p>
+    <w:p>
+      <w:pPr>
+        <w:pStyle w:val="BodyText"/>
+      </w:pPr>
+      <w:r>
+        <w:t xml:space="preserve">On source quality: the single most load-bearing source for the radiation, link-budget, and</w:t>
+      </w:r>
+      <w:r>
+        <w:t xml:space="preserve"> </w:t>
+      </w:r>
+      <w:r>
+        <w:t xml:space="preserve">cost-parity claims is a non-peer-reviewed, vendor-authored preprint; its results are self-reported</w:t>
+      </w:r>
+      <w:r>
+        <w:t xml:space="preserve"> </w:t>
+      </w:r>
+      <w:r>
+        <w:t xml:space="preserve">and not independently replicated. On the technology-readiness gap: what has been demonstrated is one</w:t>
+      </w:r>
+      <w:r>
+        <w:t xml:space="preserve"> </w:t>
+      </w:r>
+      <w:r>
+        <w:t xml:space="preserve">data-center-class GPU in orbit, ground radiation testing of a TPU, a bench-scale optical link, and</w:t>
+      </w:r>
+      <w:r>
+        <w:t xml:space="preserve"> </w:t>
+      </w:r>
+      <w:r>
+        <w:t xml:space="preserve">kilowatt-class nodes; what the vision requires, megawatt-to-gigawatt clusters, flown multi-terabit</w:t>
+      </w:r>
+      <w:r>
+        <w:t xml:space="preserve"> </w:t>
+      </w:r>
+      <w:r>
+        <w:t xml:space="preserve">formation links, dramatically cheaper launch, and in-flight formation control, has not been</w:t>
+      </w:r>
+      <w:r>
+        <w:t xml:space="preserve"> </w:t>
+      </w:r>
+      <w:r>
+        <w:t xml:space="preserve">demonstrated. On model fidelity: the debris flux, atmospheric density, and radiative limits used</w:t>
+      </w:r>
+      <w:r>
+        <w:t xml:space="preserve"> </w:t>
+      </w:r>
+      <w:r>
+        <w:t xml:space="preserve">here are computed at first order with explicit uncertainty bands, not measured per-orbit; a flight</w:t>
+      </w:r>
+      <w:r>
+        <w:t xml:space="preserve"> </w:t>
+      </w:r>
+      <w:r>
+        <w:t xml:space="preserve">program would use the official agency tools (NASA DAS, ORDEM 3.2, ESA MASTER and DRAMA,</w:t>
+      </w:r>
+      <w:r>
+        <w:t xml:space="preserve"> </w:t>
+      </w:r>
+      <w:r>
+        <w:t xml:space="preserve">SPENVIS/SHIELDOSE-2) and a full thermal and orbit toolchain. The model also omits, by design, a</w:t>
+      </w:r>
+      <w:r>
+        <w:t xml:space="preserve"> </w:t>
+      </w:r>
+      <w:r>
+        <w:t xml:space="preserve">multi-node thermal finite-element analysis, a closed-loop attitude-control simulation, formal</w:t>
+      </w:r>
+      <w:r>
+        <w:t xml:space="preserve"> </w:t>
+      </w:r>
+      <w:r>
+        <w:t xml:space="preserve">failure-modes and effects analysis, micrometeoroid Whipple-shield sizing, and a full time-domain</w:t>
+      </w:r>
+      <w:r>
+        <w:t xml:space="preserve"> </w:t>
+      </w:r>
+      <w:r>
+        <w:t xml:space="preserve">mission simulation. Finally, several widely repeated marketing claims, notably</w:t>
+      </w:r>
+      <w:r>
+        <w:t xml:space="preserve"> </w:t>
+      </w:r>
+      <w:r>
+        <w:t xml:space="preserve">“ten times cheaper</w:t>
+      </w:r>
+      <w:r>
+        <w:t xml:space="preserve"> </w:t>
+      </w:r>
+      <w:r>
+        <w:t xml:space="preserve">including launch”</w:t>
+      </w:r>
+      <w:r>
+        <w:t xml:space="preserve">, failed independent verification and are not relied upon here.</w:t>
+      </w:r>
+    </w:p>
+    <w:p>
+      <w:pPr>
+        <w:pStyle w:val="BodyText"/>
+      </w:pPr>
+      <w:r>
+        <w:t xml:space="preserve">These limitations do not undermine the study’s purpose, which is to size the problem, rank the</w:t>
+      </w:r>
+      <w:r>
+        <w:t xml:space="preserve"> </w:t>
+      </w:r>
+      <w:r>
+        <w:t xml:space="preserve">risks, and quantify the trades transparently. They do bound the confidence with which any single</w:t>
+      </w:r>
+      <w:r>
+        <w:t xml:space="preserve"> </w:t>
+      </w:r>
+      <w:r>
+        <w:t xml:space="preserve">number should be quoted, and they identify exactly where higher-fidelity work is needed next.</w:t>
+      </w:r>
+    </w:p>
+    <w:bookmarkEnd w:id="143"/>
+    <w:bookmarkStart w:id="147" w:name="X112718272980ce9d8db030edbf2c8e56c96c038"/>
+    <w:p>
+      <w:pPr>
+        <w:pStyle w:val="Heading2"/>
+      </w:pPr>
+      <w:r>
+        <w:t xml:space="preserve">25. Conclusions and the recommended demonstrator</w:t>
+      </w:r>
+    </w:p>
+    <w:p>
+      <w:pPr>
+        <w:pStyle w:val="BlockText"/>
+      </w:pPr>
+      <w:r>
+        <w:rPr>
+          <w:i/>
+          <w:iCs/>
+        </w:rPr>
+        <w:t xml:space="preserve">Abstract.</w:t>
+      </w:r>
+      <w:r>
+        <w:t xml:space="preserve"> </w:t>
+      </w:r>
+      <w:r>
+        <w:t xml:space="preserve">This chapter draws the conclusions and recommends the program that the analysis supports: small, attritable demonstrators aimed at the binding survivability and autonomy risks.</w:t>
+      </w:r>
+    </w:p>
+    <w:p>
+      <w:pPr>
+        <w:pStyle w:val="FirstParagraph"/>
+      </w:pPr>
+      <w:r>
+        <w:t xml:space="preserve">The analysis supports a clear and defensible conclusion. Radiative cooling, the problem</w:t>
+      </w:r>
+      <w:r>
+        <w:t xml:space="preserve"> </w:t>
+      </w:r>
+      <w:r>
+        <w:t xml:space="preserve">most often assumed to be the obstacle, is the solved part, now flight-proven at the single-node</w:t>
+      </w:r>
+      <w:r>
+        <w:t xml:space="preserve"> </w:t>
+      </w:r>
+      <w:r>
+        <w:t xml:space="preserve">scale, with the caveat that it does not scale for free and that high-power chips require active</w:t>
+      </w:r>
+      <w:r>
+        <w:t xml:space="preserve"> </w:t>
+      </w:r>
+      <w:r>
+        <w:t xml:space="preserve">cooling at the die. Radiation is comfortably survivable with sensible shielding, at the cost of a</w:t>
+      </w:r>
+      <w:r>
+        <w:t xml:space="preserve"> </w:t>
+      </w:r>
+      <w:r>
+        <w:t xml:space="preserve">modest throughput tax. The binding, unsolved constraints are elsewhere: orbital-debris survivability</w:t>
+      </w:r>
+      <w:r>
+        <w:t xml:space="preserve"> </w:t>
+      </w:r>
+      <w:r>
+        <w:t xml:space="preserve">in a tight formation, where the same close spacing that enables terabit optical links makes a</w:t>
+      </w:r>
+      <w:r>
+        <w:t xml:space="preserve"> </w:t>
+      </w:r>
+      <w:r>
+        <w:t xml:space="preserve">fragmentation cascade and collision avoidance dangerous; credible end-of-life disposal, which the</w:t>
+      </w:r>
+      <w:r>
+        <w:t xml:space="preserve"> </w:t>
+      </w:r>
+      <w:r>
+        <w:t xml:space="preserve">650-km orbit cannot achieve passively within the five-year rule and which therefore mandates</w:t>
+      </w:r>
+      <w:r>
+        <w:t xml:space="preserve"> </w:t>
+      </w:r>
+      <w:r>
+        <w:t xml:space="preserve">propulsion; and economics, where the launch-cost parity that underwrites the business case is later</w:t>
+      </w:r>
+      <w:r>
+        <w:t xml:space="preserve"> </w:t>
+      </w:r>
+      <w:r>
+        <w:t xml:space="preserve">and less certain than advertised.</w:t>
+      </w:r>
+    </w:p>
+    <w:p>
+      <w:pPr>
+        <w:pStyle w:val="BodyText"/>
+      </w:pPr>
+      <w:r>
+        <w:t xml:space="preserve">The recommended program follows directly. It is precisely what the leading efforts are already doing:</w:t>
+      </w:r>
+      <w:r>
+        <w:t xml:space="preserve"> </w:t>
+      </w:r>
+      <w:r>
+        <w:t xml:space="preserve">small, attritable, one-or-two-satellite demonstrators that retire the risks that actually matter.</w:t>
+      </w:r>
+      <w:r>
+        <w:t xml:space="preserve"> </w:t>
+      </w:r>
+      <w:r>
+        <w:t xml:space="preserve">Such a demonstrator should measure in-situ radiation dose and upset rates on the target accelerator,</w:t>
+      </w:r>
+      <w:r>
+        <w:t xml:space="preserve"> </w:t>
+      </w:r>
+      <w:r>
+        <w:t xml:space="preserve">demonstrate a modular liquid-cooled radiator at real kilowatt-class chip power, demonstrate onboard</w:t>
+      </w:r>
+      <w:r>
+        <w:t xml:space="preserve"> </w:t>
+      </w:r>
+      <w:r>
+        <w:t xml:space="preserve">debris sensing and an autonomous avoidance maneuver, and demonstrate a controlled propulsive</w:t>
+      </w:r>
+      <w:r>
+        <w:t xml:space="preserve"> </w:t>
+      </w:r>
+      <w:r>
+        <w:t xml:space="preserve">de-orbit at end of mission. Constellation-scale deployment should be gated behind a demonstrated</w:t>
+      </w:r>
+      <w:r>
+        <w:t xml:space="preserve"> </w:t>
+      </w:r>
+      <w:r>
+        <w:t xml:space="preserve">answer to the formation-and-debris paradox, not behind a launch-cost milestone. The systems-level</w:t>
+      </w:r>
+      <w:r>
+        <w:t xml:space="preserve"> </w:t>
+      </w:r>
+      <w:r>
+        <w:t xml:space="preserve">risk picture is summarized in Fig. 25.1: cooling sits in the low-risk corner, while debris, disposal,</w:t>
+      </w:r>
+      <w:r>
+        <w:t xml:space="preserve"> </w:t>
+      </w:r>
+      <w:r>
+        <w:t xml:space="preserve">and economics sit in the high-risk corner, and that is where the engineering attention belongs.</w:t>
+      </w:r>
+    </w:p>
+    <w:p>
+      <w:pPr>
+        <w:pStyle w:val="CaptionedFigure"/>
+      </w:pPr>
+      <w:r>
+        <w:drawing>
+          <wp:inline>
+            <wp:extent cx="5334000" cy="3473567"/>
+            <wp:effectExtent b="0" l="0" r="0" t="0"/>
+            <wp:docPr descr="Fig. 25.1, Systems-level risk matrix: cooling is solved; debris, disposal, and economics are the open items." title="" id="145" name="Picture"/>
+            <a:graphic>
+              <a:graphicData uri="http://schemas.openxmlformats.org/drawingml/2006/picture">
+                <pic:pic>
+                  <pic:nvPicPr>
+                    <pic:cNvPr descr="figures/fig7_risk_matrix.png" id="146" name="Picture"/>
+                    <pic:cNvPicPr>
+                      <a:picLocks noChangeArrowheads="1" noChangeAspect="1"/>
+                    </pic:cNvPicPr>
+                  </pic:nvPicPr>
+                  <pic:blipFill>
+                    <a:blip r:embed="rId144"/>
                     <a:stretch>
                       <a:fillRect/>
                     </a:stretch>
@@ -29250,9 +29855,9 @@
         </w:pict>
       </w:r>
     </w:p>
-    <w:bookmarkEnd w:id="114"/>
-    <w:bookmarkEnd w:id="115"/>
-    <w:bookmarkStart w:id="120" w:name="X2849ac850b034a4af8859258c8c59481bcc0a0d"/>
+    <w:bookmarkEnd w:id="147"/>
+    <w:bookmarkEnd w:id="148"/>
+    <w:bookmarkStart w:id="153" w:name="X2849ac850b034a4af8859258c8c59481bcc0a0d"/>
     <w:p>
       <w:pPr>
         <w:pStyle w:val="Heading1"/>
@@ -29261,7 +29866,7 @@
         <w:t xml:space="preserve">PART VII, DETAILED RESULTS, DATA, AND WORKED COMPUTATIONS</w:t>
       </w:r>
     </w:p>
-    <w:bookmarkStart w:id="116" w:name="a-worked-end-to-end-computation"/>
+    <w:bookmarkStart w:id="149" w:name="a-worked-end-to-end-computation"/>
     <w:p>
       <w:pPr>
         <w:pStyle w:val="Heading2"/>
@@ -29430,8 +30035,8 @@
         <w:t xml:space="preserve">produced by the open code and is reproduced by the validation suite.</w:t>
       </w:r>
     </w:p>
-    <w:bookmarkEnd w:id="116"/>
-    <w:bookmarkStart w:id="117" w:name="detailed-results-tables"/>
+    <w:bookmarkEnd w:id="149"/>
+    <w:bookmarkStart w:id="150" w:name="detailed-results-tables"/>
     <w:p>
       <w:pPr>
         <w:pStyle w:val="Heading2"/>
@@ -33152,8 +33757,8 @@
         </w:tc>
       </w:tr>
     </w:tbl>
-    <w:bookmarkEnd w:id="117"/>
-    <w:bookmarkStart w:id="118" w:name="X4ef80d11b7a22aeebf52f8f551fc1d287f74ce6"/>
+    <w:bookmarkEnd w:id="150"/>
+    <w:bookmarkStart w:id="151" w:name="X4ef80d11b7a22aeebf52f8f551fc1d287f74ce6"/>
     <w:p>
       <w:pPr>
         <w:pStyle w:val="Heading2"/>
@@ -33632,8 +34237,8 @@
         <w:t xml:space="preserve">problem at this density, and it is the operational face of the formation paradox.</w:t>
       </w:r>
     </w:p>
-    <w:bookmarkEnd w:id="118"/>
-    <w:bookmarkStart w:id="119" w:name="comparison-with-terrestrial-data-centers"/>
+    <w:bookmarkEnd w:id="151"/>
+    <w:bookmarkStart w:id="152" w:name="comparison-with-terrestrial-data-centers"/>
     <w:p>
       <w:pPr>
         <w:pStyle w:val="Heading2"/>
@@ -34124,9 +34729,9 @@
         </w:pict>
       </w:r>
     </w:p>
-    <w:bookmarkEnd w:id="119"/>
-    <w:bookmarkEnd w:id="120"/>
-    <w:bookmarkStart w:id="135" w:name="back-matter"/>
+    <w:bookmarkEnd w:id="152"/>
+    <w:bookmarkEnd w:id="153"/>
+    <w:bookmarkStart w:id="168" w:name="back-matter"/>
     <w:p>
       <w:pPr>
         <w:pStyle w:val="Heading1"/>
@@ -34135,7 +34740,7 @@
         <w:t xml:space="preserve">Back matter</w:t>
       </w:r>
     </w:p>
-    <w:bookmarkStart w:id="121" w:name="references"/>
+    <w:bookmarkStart w:id="154" w:name="references"/>
     <w:p>
       <w:pPr>
         <w:pStyle w:val="Heading2"/>
@@ -35167,8 +35772,8 @@
         <w:t xml:space="preserve">launch records, for the launch-cadence and cost-trajectory inputs of Chapter 22.</w:t>
       </w:r>
     </w:p>
-    <w:bookmarkEnd w:id="121"/>
-    <w:bookmarkStart w:id="122" w:name="Xa5f5759fad9159c193908c5014e5f5066c880b0"/>
+    <w:bookmarkEnd w:id="154"/>
+    <w:bookmarkStart w:id="155" w:name="Xa5f5759fad9159c193908c5014e5f5066c880b0"/>
     <w:p>
       <w:pPr>
         <w:pStyle w:val="Heading2"/>
@@ -37653,8 +38258,8 @@
         </w:tc>
       </w:tr>
     </w:tbl>
-    <w:bookmarkEnd w:id="122"/>
-    <w:bookmarkStart w:id="123" w:name="appendix-b-nomenclature"/>
+    <w:bookmarkEnd w:id="155"/>
+    <w:bookmarkStart w:id="156" w:name="appendix-b-nomenclature"/>
     <w:p>
       <w:pPr>
         <w:pStyle w:val="Heading2"/>
@@ -37677,8 +38282,8 @@
         <w:t xml:space="preserve">there with its units.</w:t>
       </w:r>
     </w:p>
-    <w:bookmarkEnd w:id="123"/>
-    <w:bookmarkStart w:id="124" w:name="appendix-c-data-sources-and-confidence"/>
+    <w:bookmarkEnd w:id="156"/>
+    <w:bookmarkStart w:id="157" w:name="appendix-c-data-sources-and-confidence"/>
     <w:p>
       <w:pPr>
         <w:pStyle w:val="Heading2"/>
@@ -37731,8 +38336,8 @@
         <w:t xml:space="preserve">1-mm-to-1-cm debris flux is the least model-validated quantity.</w:t>
       </w:r>
     </w:p>
-    <w:bookmarkEnd w:id="124"/>
-    <w:bookmarkStart w:id="125" w:name="appendix-d-reproduction-and-code"/>
+    <w:bookmarkEnd w:id="157"/>
+    <w:bookmarkStart w:id="158" w:name="appendix-d-reproduction-and-code"/>
     <w:p>
       <w:pPr>
         <w:pStyle w:val="Heading2"/>
@@ -39651,8 +40256,8 @@
         <w:t xml:space="preserve"> util)</w:t>
       </w:r>
     </w:p>
-    <w:bookmarkEnd w:id="125"/>
-    <w:bookmarkStart w:id="134" w:name="appendix-e-extended-derivations"/>
+    <w:bookmarkEnd w:id="158"/>
+    <w:bookmarkStart w:id="167" w:name="appendix-e-extended-derivations"/>
     <w:p>
       <w:pPr>
         <w:pStyle w:val="Heading2"/>
@@ -39675,7 +40280,7 @@
         <w:t xml:space="preserve">the main text, so that the volume is mathematically self-contained.</w:t>
       </w:r>
     </w:p>
-    <w:bookmarkStart w:id="126" w:name="X2a80dffde1cc8eefa78dcdbda3d88a45fd72945"/>
+    <w:bookmarkStart w:id="159" w:name="X2a80dffde1cc8eefa78dcdbda3d88a45fd72945"/>
     <w:p>
       <w:pPr>
         <w:pStyle w:val="Heading3"/>
@@ -40798,8 +41403,8 @@
         <w:t xml:space="preserve">fundamental constants. This is the foundation of every radiator result in Chapter 10.</w:t>
       </w:r>
     </w:p>
-    <w:bookmarkEnd w:id="126"/>
-    <w:bookmarkStart w:id="127" w:name="X4c20d6d59466b0830aef63d21b34b7838499df3"/>
+    <w:bookmarkEnd w:id="159"/>
+    <w:bookmarkStart w:id="160" w:name="X4c20d6d59466b0830aef63d21b34b7838499df3"/>
     <w:p>
       <w:pPr>
         <w:pStyle w:val="Heading3"/>
@@ -41610,8 +42215,8 @@
         <w:t xml:space="preserve">debris impacts.</w:t>
       </w:r>
     </w:p>
-    <w:bookmarkEnd w:id="127"/>
-    <w:bookmarkStart w:id="128" w:name="Xdbf318ef9ef49d2256131d87dbdb96f21a45420"/>
+    <w:bookmarkEnd w:id="160"/>
+    <w:bookmarkStart w:id="161" w:name="Xdbf318ef9ef49d2256131d87dbdb96f21a45420"/>
     <w:p>
       <w:pPr>
         <w:pStyle w:val="Heading3"/>
@@ -42566,8 +43171,8 @@
         <w:t xml:space="preserve">re-entry within one or two orbits, satisfying the disposal requirement.</w:t>
       </w:r>
     </w:p>
-    <w:bookmarkEnd w:id="128"/>
-    <w:bookmarkStart w:id="129" w:name="X67de4cda1ab68499f29ee0b2ccb5ff91efedb0e"/>
+    <w:bookmarkEnd w:id="161"/>
+    <w:bookmarkStart w:id="162" w:name="X67de4cda1ab68499f29ee0b2ccb5ff91efedb0e"/>
     <w:p>
       <w:pPr>
         <w:pStyle w:val="Heading3"/>
@@ -43094,8 +43699,8 @@
         <w:t xml:space="preserve">discussed in Chapter 28 and the reason the formation needs active relative control.</w:t>
       </w:r>
     </w:p>
-    <w:bookmarkEnd w:id="129"/>
-    <w:bookmarkStart w:id="130" w:name="e.5-the-rocket-equation"/>
+    <w:bookmarkEnd w:id="162"/>
+    <w:bookmarkStart w:id="163" w:name="e.5-the-rocket-equation"/>
     <w:p>
       <w:pPr>
         <w:pStyle w:val="Heading3"/>
@@ -43815,8 +44420,8 @@
         <w:t xml:space="preserve">propulsion) so dramatically reduces propellant mass for a given Δv.</w:t>
       </w:r>
     </w:p>
-    <w:bookmarkEnd w:id="130"/>
-    <w:bookmarkStart w:id="131" w:name="e.6-k-of-n-redundancy"/>
+    <w:bookmarkEnd w:id="163"/>
+    <w:bookmarkStart w:id="164" w:name="e.6-k-of-n-redundancy"/>
     <w:p>
       <w:pPr>
         <w:pStyle w:val="Heading3"/>
@@ -44178,8 +44783,8 @@
         <w:t xml:space="preserve">satellite and the over-provisioned satellites within a cluster (Chapter 16).</w:t>
       </w:r>
     </w:p>
-    <w:bookmarkEnd w:id="131"/>
-    <w:bookmarkStart w:id="132" w:name="X1e2c0797711e5a38d867b0034b661cf8291a89f"/>
+    <w:bookmarkEnd w:id="164"/>
+    <w:bookmarkStart w:id="165" w:name="X1e2c0797711e5a38d867b0034b661cf8291a89f"/>
     <w:p>
       <w:pPr>
         <w:pStyle w:val="Heading3"/>
@@ -44844,8 +45449,8 @@
         <w:t xml:space="preserve">K in two to four steps.</w:t>
       </w:r>
     </w:p>
-    <w:bookmarkEnd w:id="132"/>
-    <w:bookmarkStart w:id="133" w:name="e.8-the-capital-recovery-factor"/>
+    <w:bookmarkEnd w:id="165"/>
+    <w:bookmarkStart w:id="166" w:name="e.8-the-capital-recovery-factor"/>
     <w:p>
       <w:pPr>
         <w:pStyle w:val="Heading3"/>
@@ -45278,9 +45883,9 @@
         <w:t xml:space="preserve">End of report.</w:t>
       </w:r>
     </w:p>
-    <w:bookmarkEnd w:id="133"/>
-    <w:bookmarkEnd w:id="134"/>
-    <w:bookmarkEnd w:id="135"/>
+    <w:bookmarkEnd w:id="166"/>
+    <w:bookmarkEnd w:id="167"/>
+    <w:bookmarkEnd w:id="168"/>
     <w:sectPr>
       <w:footnotePr>
         <w:numRestart w:val="eachSect"/>

</xml_diff>

<commit_message>
Book: clean cover (drop github link and designation), remove report-style ending, Title-Case chapter headings
- Cover art: remove the GitHub URL and the 'Research Scientist III' line; keep
  the author and an Edition I / 2026 line.
- Remove the '*End of report.*' line so the book ends as a book.
- Convert all chapter and appendix headings to book-style Title Case
  (acronyms, digit tokens, and small words handled correctly).
</commit_message>
<xml_diff>
--- a/report/Report_II_Complete.docx
+++ b/report/Report_II_Complete.docx
@@ -267,7 +267,7 @@
         <w:pStyle w:val="Heading2"/>
       </w:pPr>
       <w:r>
-        <w:t xml:space="preserve">Table of contents</w:t>
+        <w:t xml:space="preserve">Table of Contents</w:t>
       </w:r>
     </w:p>
     <w:p>
@@ -2249,7 +2249,7 @@
         <w:pStyle w:val="Heading2"/>
       </w:pPr>
       <w:r>
-        <w:t xml:space="preserve">Physical constants</w:t>
+        <w:t xml:space="preserve">Physical Constants</w:t>
       </w:r>
     </w:p>
     <w:tbl>
@@ -3194,7 +3194,7 @@
         <w:pStyle w:val="Heading2"/>
       </w:pPr>
       <w:r>
-        <w:t xml:space="preserve">1. Introduction and motivation</w:t>
+        <w:t xml:space="preserve">1. Introduction and Motivation</w:t>
       </w:r>
     </w:p>
     <w:p>
@@ -3366,7 +3366,7 @@
         <w:pStyle w:val="Heading2"/>
       </w:pPr>
       <w:r>
-        <w:t xml:space="preserve">2. The state of the art (2025-2026)</w:t>
+        <w:t xml:space="preserve">2. The State of the Art (2025-2026)</w:t>
       </w:r>
     </w:p>
     <w:p>
@@ -3614,7 +3614,7 @@
         <w:pStyle w:val="Heading2"/>
       </w:pPr>
       <w:r>
-        <w:t xml:space="preserve">2A. The original feasibility study: passive cooling of a TPU node</w:t>
+        <w:t xml:space="preserve">2A. The Original Feasibility Study: Passive Cooling of a TPU Node</w:t>
       </w:r>
     </w:p>
     <w:p>
@@ -5631,7 +5631,7 @@
         <w:pStyle w:val="Heading2"/>
       </w:pPr>
       <w:r>
-        <w:t xml:space="preserve">3. Reference architecture and scope</w:t>
+        <w:t xml:space="preserve">3. Reference Architecture and Scope</w:t>
       </w:r>
     </w:p>
     <w:p>
@@ -5809,7 +5809,7 @@
         <w:pStyle w:val="Heading2"/>
       </w:pPr>
       <w:r>
-        <w:t xml:space="preserve">3A. Design methodology, margins, and readiness</w:t>
+        <w:t xml:space="preserve">3A. Design Methodology, Margins, and Readiness</w:t>
       </w:r>
     </w:p>
     <w:p>
@@ -6801,7 +6801,7 @@
         <w:pStyle w:val="Heading2"/>
       </w:pPr>
       <w:r>
-        <w:t xml:space="preserve">4. Orbital mechanics of a circular orbit</w:t>
+        <w:t xml:space="preserve">4. Orbital Mechanics of a Circular Orbit</w:t>
       </w:r>
     </w:p>
     <w:p>
@@ -7889,7 +7889,7 @@
         <w:pStyle w:val="Heading2"/>
       </w:pPr>
       <w:r>
-        <w:t xml:space="preserve">5. Sun-synchronous orbits and J2 precession</w:t>
+        <w:t xml:space="preserve">5. Sun-Synchronous Orbits and J2 Precession</w:t>
       </w:r>
     </w:p>
     <w:p>
@@ -10047,7 +10047,7 @@
         <w:pStyle w:val="Heading2"/>
       </w:pPr>
       <w:r>
-        <w:t xml:space="preserve">6. Eclipse geometry and the dawn-dusk advantage</w:t>
+        <w:t xml:space="preserve">6. Eclipse Geometry and the Dawn-Dusk Advantage</w:t>
       </w:r>
     </w:p>
     <w:p>
@@ -11902,7 +11902,7 @@
         <w:pStyle w:val="Heading2"/>
       </w:pPr>
       <w:r>
-        <w:t xml:space="preserve">7. The neutral atmosphere and orbital decay</w:t>
+        <w:t xml:space="preserve">7. The Neutral Atmosphere and Orbital Decay</w:t>
       </w:r>
     </w:p>
     <w:p>
@@ -13486,7 +13486,7 @@
         <w:pStyle w:val="Heading2"/>
       </w:pPr>
       <w:r>
-        <w:t xml:space="preserve">8. The ionizing-radiation environment</w:t>
+        <w:t xml:space="preserve">8. The Ionizing-Radiation Environment</w:t>
       </w:r>
     </w:p>
     <w:p>
@@ -14103,7 +14103,7 @@
         <w:pStyle w:val="Heading2"/>
       </w:pPr>
       <w:r>
-        <w:t xml:space="preserve">9. The orbital-debris environment</w:t>
+        <w:t xml:space="preserve">9. The Orbital-Debris Environment</w:t>
       </w:r>
     </w:p>
     <w:p>
@@ -14795,7 +14795,7 @@
         <w:pStyle w:val="Heading2"/>
       </w:pPr>
       <w:r>
-        <w:t xml:space="preserve">10. Thermal control</w:t>
+        <w:t xml:space="preserve">10. Thermal Control</w:t>
       </w:r>
     </w:p>
     <w:p>
@@ -17433,7 +17433,7 @@
         <w:pStyle w:val="Heading2"/>
       </w:pPr>
       <w:r>
-        <w:t xml:space="preserve">11. Electrical power</w:t>
+        <w:t xml:space="preserve">11. Electrical Power</w:t>
       </w:r>
     </w:p>
     <w:p>
@@ -18535,7 +18535,7 @@
         <w:pStyle w:val="Heading2"/>
       </w:pPr>
       <w:r>
-        <w:t xml:space="preserve">12. Structures and mass</w:t>
+        <w:t xml:space="preserve">12. Structures and Mass</w:t>
       </w:r>
     </w:p>
     <w:p>
@@ -19486,7 +19486,7 @@
         <w:pStyle w:val="Heading2"/>
       </w:pPr>
       <w:r>
-        <w:t xml:space="preserve">13. Attitude determination and control; optical pointing</w:t>
+        <w:t xml:space="preserve">13. Attitude Determination and Control; Optical Pointing</w:t>
       </w:r>
     </w:p>
     <w:p>
@@ -20296,7 +20296,7 @@
         <w:pStyle w:val="Heading2"/>
       </w:pPr>
       <w:r>
-        <w:t xml:space="preserve">14. Communications: inter-satellite and ground</w:t>
+        <w:t xml:space="preserve">14. Communications: Inter-Satellite and Ground</w:t>
       </w:r>
     </w:p>
     <w:p>
@@ -21560,7 +21560,7 @@
         <w:pStyle w:val="Heading2"/>
       </w:pPr>
       <w:r>
-        <w:t xml:space="preserve">15. Propulsion and end-of-life disposal</w:t>
+        <w:t xml:space="preserve">15. Propulsion and End-of-Life Disposal</w:t>
       </w:r>
     </w:p>
     <w:p>
@@ -22762,7 +22762,7 @@
         <w:pStyle w:val="Heading2"/>
       </w:pPr>
       <w:r>
-        <w:t xml:space="preserve">16. Reliability and constellation availability</w:t>
+        <w:t xml:space="preserve">16. Reliability and Constellation Availability</w:t>
       </w:r>
     </w:p>
     <w:p>
@@ -24450,7 +24450,7 @@
         <w:pStyle w:val="Heading2"/>
       </w:pPr>
       <w:r>
-        <w:t xml:space="preserve">17. Compute and workload</w:t>
+        <w:t xml:space="preserve">17. Compute and Workload</w:t>
       </w:r>
     </w:p>
     <w:p>
@@ -25097,7 +25097,7 @@
         <w:pStyle w:val="Heading2"/>
       </w:pPr>
       <w:r>
-        <w:t xml:space="preserve">18. The integrated system model</w:t>
+        <w:t xml:space="preserve">18. The Integrated System Model</w:t>
       </w:r>
     </w:p>
     <w:p>
@@ -25324,7 +25324,7 @@
         <w:pStyle w:val="Heading2"/>
       </w:pPr>
       <w:r>
-        <w:t xml:space="preserve">18A. Computational methods and numerical solvers</w:t>
+        <w:t xml:space="preserve">18A. Computational Methods and Numerical Solvers</w:t>
       </w:r>
     </w:p>
     <w:p>
@@ -26660,7 +26660,7 @@
         <w:pStyle w:val="Heading2"/>
       </w:pPr>
       <w:r>
-        <w:t xml:space="preserve">19. Uncertainty quantification and sensitivity</w:t>
+        <w:t xml:space="preserve">19. Uncertainty Quantification and Sensitivity</w:t>
       </w:r>
     </w:p>
     <w:p>
@@ -27302,7 +27302,7 @@
         <w:pStyle w:val="Heading2"/>
       </w:pPr>
       <w:r>
-        <w:t xml:space="preserve">20. Results: reference design point and constellation</w:t>
+        <w:t xml:space="preserve">20. Results: Reference Design Point and Constellation</w:t>
       </w:r>
     </w:p>
     <w:p>
@@ -27904,7 +27904,7 @@
         <w:pStyle w:val="Heading2"/>
       </w:pPr>
       <w:r>
-        <w:t xml:space="preserve">21. Techno-economics: cost, NPV, and the levelized cost of compute</w:t>
+        <w:t xml:space="preserve">21. Techno-Economics: Cost, NPV, and the Levelized Cost of Compute</w:t>
       </w:r>
     </w:p>
     <w:p>
@@ -28972,7 +28972,7 @@
         <w:pStyle w:val="Heading2"/>
       </w:pPr>
       <w:r>
-        <w:t xml:space="preserve">22. The launch-cost-parity prediction</w:t>
+        <w:t xml:space="preserve">22. The Launch-Cost-Parity Prediction</w:t>
       </w:r>
     </w:p>
     <w:p>
@@ -29308,7 +29308,7 @@
         <w:pStyle w:val="Heading2"/>
       </w:pPr>
       <w:r>
-        <w:t xml:space="preserve">23. Capability and risk trajectory, 2027-2035</w:t>
+        <w:t xml:space="preserve">23. Capability and Risk Trajectory, 2027-2035</w:t>
       </w:r>
     </w:p>
     <w:p>
@@ -29496,7 +29496,7 @@
         <w:pStyle w:val="Heading2"/>
       </w:pPr>
       <w:r>
-        <w:t xml:space="preserve">24. Caveats and limitations</w:t>
+        <w:t xml:space="preserve">24. Caveats and Limitations</w:t>
       </w:r>
     </w:p>
     <w:p>
@@ -29647,7 +29647,7 @@
         <w:pStyle w:val="Heading2"/>
       </w:pPr>
       <w:r>
-        <w:t xml:space="preserve">25. Conclusions and the recommended demonstrator</w:t>
+        <w:t xml:space="preserve">25. Conclusions and the Recommended Demonstrator</w:t>
       </w:r>
     </w:p>
     <w:p>
@@ -29872,7 +29872,7 @@
         <w:pStyle w:val="Heading2"/>
       </w:pPr>
       <w:r>
-        <w:t xml:space="preserve">26. A worked end-to-end computation</w:t>
+        <w:t xml:space="preserve">26. A Worked End-to-End Computation</w:t>
       </w:r>
     </w:p>
     <w:p>
@@ -30042,7 +30042,7 @@
         <w:pStyle w:val="Heading2"/>
       </w:pPr>
       <w:r>
-        <w:t xml:space="preserve">27. Detailed results tables</w:t>
+        <w:t xml:space="preserve">27. Detailed Results Tables</w:t>
       </w:r>
     </w:p>
     <w:p>
@@ -33764,7 +33764,7 @@
         <w:pStyle w:val="Heading2"/>
       </w:pPr>
       <w:r>
-        <w:t xml:space="preserve">28. Constellation design and relative dynamics</w:t>
+        <w:t xml:space="preserve">28. Constellation Design and Relative Dynamics</w:t>
       </w:r>
     </w:p>
     <w:p>
@@ -34244,7 +34244,7 @@
         <w:pStyle w:val="Heading2"/>
       </w:pPr>
       <w:r>
-        <w:t xml:space="preserve">29. Comparison with terrestrial data centers</w:t>
+        <w:t xml:space="preserve">29. Comparison with Terrestrial Data Centers</w:t>
       </w:r>
     </w:p>
     <w:p>
@@ -35779,7 +35779,7 @@
         <w:pStyle w:val="Heading2"/>
       </w:pPr>
       <w:r>
-        <w:t xml:space="preserve">Appendix A, Master list of governing equations</w:t>
+        <w:t xml:space="preserve">Appendix A, Master List of Governing Equations</w:t>
       </w:r>
     </w:p>
     <w:tbl>
@@ -38289,7 +38289,7 @@
         <w:pStyle w:val="Heading2"/>
       </w:pPr>
       <w:r>
-        <w:t xml:space="preserve">Appendix C, Data sources and confidence</w:t>
+        <w:t xml:space="preserve">Appendix C, Data Sources and Confidence</w:t>
       </w:r>
     </w:p>
     <w:p>
@@ -38343,7 +38343,7 @@
         <w:pStyle w:val="Heading2"/>
       </w:pPr>
       <w:r>
-        <w:t xml:space="preserve">Appendix D, Reproduction and code</w:t>
+        <w:t xml:space="preserve">Appendix D, Reproduction and Code</w:t>
       </w:r>
     </w:p>
     <w:p>
@@ -40263,7 +40263,7 @@
         <w:pStyle w:val="Heading2"/>
       </w:pPr>
       <w:r>
-        <w:t xml:space="preserve">Appendix E, Extended derivations</w:t>
+        <w:t xml:space="preserve">Appendix E, Extended Derivations</w:t>
       </w:r>
     </w:p>
     <w:p>
@@ -45869,18 +45869,6 @@
       </w:r>
       <w:r>
         <w:t xml:space="preserve">cost over its operational life.</w:t>
-      </w:r>
-    </w:p>
-    <w:p>
-      <w:pPr>
-        <w:pStyle w:val="BodyText"/>
-      </w:pPr>
-      <w:r>
-        <w:rPr>
-          <w:i/>
-          <w:iCs/>
-        </w:rPr>
-        <w:t xml:space="preserve">End of report.</w:t>
       </w:r>
     </w:p>
     <w:bookmarkEnd w:id="166"/>

</xml_diff>

<commit_message>
Ch4: expand orbital mechanics to graduate depth (two-body, angular momentum, conic orbit, Kepler III, ground track)
Add the general two-body equation of motion (4.4), conservation of specific
angular momentum (4.5), the conic orbit equation (4.6) with circular as the
e=0 special case, Kepler's third law (4.7), and a ground-track/revisit note.
A depth exemplar for the chapter-by-chapter expansion.
</commit_message>
<xml_diff>
--- a/report/Report_II_Complete.docx
+++ b/report/Report_II_Complete.docx
@@ -7462,6 +7462,1186 @@
       </m:oMath>
       <w:r>
         <w:t xml:space="preserve">.</w:t>
+      </w:r>
+    </w:p>
+    <w:p>
+      <w:pPr>
+        <w:pStyle w:val="BodyText"/>
+      </w:pPr>
+      <w:r>
+        <w:rPr>
+          <w:b/>
+          <w:bCs/>
+        </w:rPr>
+        <w:t xml:space="preserve">The two-body problem.</w:t>
+      </w:r>
+      <w:r>
+        <w:t xml:space="preserve"> </w:t>
+      </w:r>
+      <w:r>
+        <w:t xml:space="preserve">The circular relations above are special cases of the two-body problem.</w:t>
+      </w:r>
+      <w:r>
+        <w:t xml:space="preserve"> </w:t>
+      </w:r>
+      <w:r>
+        <w:t xml:space="preserve">Newton’s law of gravitation and the second law give the relative acceleration of the satellite with</w:t>
+      </w:r>
+      <w:r>
+        <w:t xml:space="preserve"> </w:t>
+      </w:r>
+      <w:r>
+        <w:t xml:space="preserve">respect to Earth,</w:t>
+      </w:r>
+    </w:p>
+    <w:p>
+      <w:pPr>
+        <w:pStyle w:val="BodyText"/>
+      </w:pPr>
+      <m:oMathPara>
+        <m:oMathParaPr>
+          <m:jc m:val="center"/>
+        </m:oMathParaPr>
+        <m:oMath>
+          <m:acc>
+            <m:accPr>
+              <m:chr m:val="̈"/>
+            </m:accPr>
+            <m:e>
+              <m:r>
+                <m:rPr>
+                  <m:sty m:val="bi"/>
+                </m:rPr>
+                <m:t>r</m:t>
+              </m:r>
+            </m:e>
+          </m:acc>
+          <m:r>
+            <m:rPr>
+              <m:sty m:val="p"/>
+            </m:rPr>
+            <m:t>=</m:t>
+          </m:r>
+          <m:r>
+            <m:rPr>
+              <m:sty m:val="p"/>
+            </m:rPr>
+            <m:t>−</m:t>
+          </m:r>
+          <m:f>
+            <m:fPr>
+              <m:type m:val="bar"/>
+            </m:fPr>
+            <m:num>
+              <m:r>
+                <m:t>μ</m:t>
+              </m:r>
+            </m:num>
+            <m:den>
+              <m:sSup>
+                <m:e>
+                  <m:r>
+                    <m:t>r</m:t>
+                  </m:r>
+                </m:e>
+                <m:sup>
+                  <m:r>
+                    <m:t>3</m:t>
+                  </m:r>
+                </m:sup>
+              </m:sSup>
+            </m:den>
+          </m:f>
+          <m:r>
+            <m:t> </m:t>
+          </m:r>
+          <m:r>
+            <m:rPr>
+              <m:sty m:val="bi"/>
+            </m:rPr>
+            <m:t>r</m:t>
+          </m:r>
+          <m:r>
+            <m:rPr>
+              <m:sty m:val="p"/>
+            </m:rPr>
+            <m:t>,</m:t>
+          </m:r>
+          <m:r>
+            <m:t>  </m:t>
+          </m:r>
+          <m:r>
+            <m:t>μ</m:t>
+          </m:r>
+          <m:r>
+            <m:rPr>
+              <m:sty m:val="p"/>
+            </m:rPr>
+            <m:t>=</m:t>
+          </m:r>
+          <m:r>
+            <m:t>G</m:t>
+          </m:r>
+          <m:r>
+            <m:rPr>
+              <m:sty m:val="p"/>
+            </m:rPr>
+            <m:t>(</m:t>
+          </m:r>
+          <m:sSub>
+            <m:e>
+              <m:r>
+                <m:t>M</m:t>
+              </m:r>
+            </m:e>
+            <m:sub>
+              <m:r>
+                <m:rPr>
+                  <m:sty m:val="p"/>
+                </m:rPr>
+                <m:t>⊕</m:t>
+              </m:r>
+            </m:sub>
+          </m:sSub>
+          <m:r>
+            <m:rPr>
+              <m:sty m:val="p"/>
+            </m:rPr>
+            <m:t>+</m:t>
+          </m:r>
+          <m:r>
+            <m:t>m</m:t>
+          </m:r>
+          <m:r>
+            <m:rPr>
+              <m:sty m:val="p"/>
+            </m:rPr>
+            <m:t>)</m:t>
+          </m:r>
+          <m:r>
+            <m:rPr>
+              <m:sty m:val="p"/>
+            </m:rPr>
+            <m:t>≈</m:t>
+          </m:r>
+          <m:r>
+            <m:t>G</m:t>
+          </m:r>
+          <m:sSub>
+            <m:e>
+              <m:r>
+                <m:t>M</m:t>
+              </m:r>
+            </m:e>
+            <m:sub>
+              <m:r>
+                <m:rPr>
+                  <m:sty m:val="p"/>
+                </m:rPr>
+                <m:t>⊕</m:t>
+              </m:r>
+            </m:sub>
+          </m:sSub>
+          <m:r>
+            <m:rPr>
+              <m:sty m:val="p"/>
+            </m:rPr>
+            <m:t>,</m:t>
+          </m:r>
+        </m:oMath>
+      </m:oMathPara>
+    </w:p>
+    <w:p>
+      <w:pPr>
+        <w:pStyle w:val="FirstParagraph"/>
+      </w:pPr>
+      <w:r>
+        <w:t xml:space="preserve">where the approximation holds because the satellite mass is negligible against Earth’s. Taking the</w:t>
+      </w:r>
+      <w:r>
+        <w:t xml:space="preserve"> </w:t>
+      </w:r>
+      <w:r>
+        <w:t xml:space="preserve">cross product of (4.4) with</w:t>
+      </w:r>
+      <w:r>
+        <w:t xml:space="preserve"> </w:t>
+      </w:r>
+      <m:oMath>
+        <m:r>
+          <m:rPr>
+            <m:sty m:val="bi"/>
+          </m:rPr>
+          <m:t>r</m:t>
+        </m:r>
+      </m:oMath>
+      <w:r>
+        <w:t xml:space="preserve"> </w:t>
+      </w:r>
+      <w:r>
+        <w:t xml:space="preserve">shows that the specific angular momentum is conserved,</w:t>
+      </w:r>
+    </w:p>
+    <w:p>
+      <w:pPr>
+        <w:pStyle w:val="BodyText"/>
+      </w:pPr>
+      <m:oMathPara>
+        <m:oMathParaPr>
+          <m:jc m:val="center"/>
+        </m:oMathParaPr>
+        <m:oMath>
+          <m:r>
+            <m:rPr>
+              <m:sty m:val="bi"/>
+            </m:rPr>
+            <m:t>h</m:t>
+          </m:r>
+          <m:r>
+            <m:rPr>
+              <m:sty m:val="p"/>
+            </m:rPr>
+            <m:t>=</m:t>
+          </m:r>
+          <m:r>
+            <m:rPr>
+              <m:sty m:val="bi"/>
+            </m:rPr>
+            <m:t>r</m:t>
+          </m:r>
+          <m:r>
+            <m:rPr>
+              <m:sty m:val="p"/>
+            </m:rPr>
+            <m:t>×</m:t>
+          </m:r>
+          <m:acc>
+            <m:accPr>
+              <m:chr m:val="̇"/>
+            </m:accPr>
+            <m:e>
+              <m:r>
+                <m:rPr>
+                  <m:sty m:val="bi"/>
+                </m:rPr>
+                <m:t>r</m:t>
+              </m:r>
+            </m:e>
+          </m:acc>
+          <m:r>
+            <m:rPr>
+              <m:sty m:val="p"/>
+            </m:rPr>
+            <m:t>,</m:t>
+          </m:r>
+          <m:r>
+            <m:t>  </m:t>
+          </m:r>
+          <m:f>
+            <m:fPr>
+              <m:type m:val="bar"/>
+            </m:fPr>
+            <m:num>
+              <m:r>
+                <m:t>d</m:t>
+              </m:r>
+              <m:r>
+                <m:rPr>
+                  <m:sty m:val="bi"/>
+                </m:rPr>
+                <m:t>h</m:t>
+              </m:r>
+            </m:num>
+            <m:den>
+              <m:r>
+                <m:t>d</m:t>
+              </m:r>
+              <m:r>
+                <m:t>t</m:t>
+              </m:r>
+            </m:den>
+          </m:f>
+          <m:r>
+            <m:rPr>
+              <m:sty m:val="p"/>
+            </m:rPr>
+            <m:t>=</m:t>
+          </m:r>
+          <m:r>
+            <m:t>0</m:t>
+          </m:r>
+          <m:r>
+            <m:rPr>
+              <m:sty m:val="p"/>
+            </m:rPr>
+            <m:t>,</m:t>
+          </m:r>
+        </m:oMath>
+      </m:oMathPara>
+    </w:p>
+    <w:p>
+      <w:pPr>
+        <w:pStyle w:val="FirstParagraph"/>
+      </w:pPr>
+      <w:r>
+        <w:t xml:space="preserve">so the motion stays in a plane and the radius vector sweeps equal areas in equal times, which is</w:t>
+      </w:r>
+      <w:r>
+        <w:t xml:space="preserve"> </w:t>
+      </w:r>
+      <w:r>
+        <w:t xml:space="preserve">Kepler’s second law.</w:t>
+      </w:r>
+    </w:p>
+    <w:p>
+      <w:pPr>
+        <w:pStyle w:val="BodyText"/>
+      </w:pPr>
+      <w:r>
+        <w:rPr>
+          <w:b/>
+          <w:bCs/>
+        </w:rPr>
+        <w:t xml:space="preserve">The orbit equation.</w:t>
+      </w:r>
+      <w:r>
+        <w:t xml:space="preserve"> </w:t>
+      </w:r>
+      <w:r>
+        <w:t xml:space="preserve">Integrating (4.4) once, using the conserved eccentricity (Laplace-Runge-Lenz)</w:t>
+      </w:r>
+      <w:r>
+        <w:t xml:space="preserve"> </w:t>
+      </w:r>
+      <w:r>
+        <w:t xml:space="preserve">vector, yields the trajectory as a conic section written in focal polar form,</w:t>
+      </w:r>
+    </w:p>
+    <w:p>
+      <w:pPr>
+        <w:pStyle w:val="BodyText"/>
+      </w:pPr>
+      <m:oMathPara>
+        <m:oMathParaPr>
+          <m:jc m:val="center"/>
+        </m:oMathParaPr>
+        <m:oMath>
+          <m:r>
+            <m:t>r</m:t>
+          </m:r>
+          <m:r>
+            <m:rPr>
+              <m:sty m:val="p"/>
+            </m:rPr>
+            <m:t>(</m:t>
+          </m:r>
+          <m:r>
+            <m:t>θ</m:t>
+          </m:r>
+          <m:r>
+            <m:rPr>
+              <m:sty m:val="p"/>
+            </m:rPr>
+            <m:t>)</m:t>
+          </m:r>
+          <m:r>
+            <m:rPr>
+              <m:sty m:val="p"/>
+            </m:rPr>
+            <m:t>=</m:t>
+          </m:r>
+          <m:f>
+            <m:fPr>
+              <m:type m:val="bar"/>
+            </m:fPr>
+            <m:num>
+              <m:sSup>
+                <m:e>
+                  <m:r>
+                    <m:t>h</m:t>
+                  </m:r>
+                </m:e>
+                <m:sup>
+                  <m:r>
+                    <m:t>2</m:t>
+                  </m:r>
+                </m:sup>
+              </m:sSup>
+              <m:r>
+                <m:rPr>
+                  <m:sty m:val="p"/>
+                </m:rPr>
+                <m:t>/</m:t>
+              </m:r>
+              <m:r>
+                <m:t>μ</m:t>
+              </m:r>
+            </m:num>
+            <m:den>
+              <m:r>
+                <m:t>1</m:t>
+              </m:r>
+              <m:r>
+                <m:rPr>
+                  <m:sty m:val="p"/>
+                </m:rPr>
+                <m:t>+</m:t>
+              </m:r>
+              <m:r>
+                <m:t>e</m:t>
+              </m:r>
+              <m:r>
+                <m:rPr>
+                  <m:sty m:val="p"/>
+                </m:rPr>
+                <m:t>cos</m:t>
+              </m:r>
+              <m:r>
+                <m:t>θ</m:t>
+              </m:r>
+            </m:den>
+          </m:f>
+          <m:r>
+            <m:rPr>
+              <m:sty m:val="p"/>
+            </m:rPr>
+            <m:t>=</m:t>
+          </m:r>
+          <m:f>
+            <m:fPr>
+              <m:type m:val="bar"/>
+            </m:fPr>
+            <m:num>
+              <m:r>
+                <m:t>p</m:t>
+              </m:r>
+            </m:num>
+            <m:den>
+              <m:r>
+                <m:t>1</m:t>
+              </m:r>
+              <m:r>
+                <m:rPr>
+                  <m:sty m:val="p"/>
+                </m:rPr>
+                <m:t>+</m:t>
+              </m:r>
+              <m:r>
+                <m:t>e</m:t>
+              </m:r>
+              <m:r>
+                <m:rPr>
+                  <m:sty m:val="p"/>
+                </m:rPr>
+                <m:t>cos</m:t>
+              </m:r>
+              <m:r>
+                <m:t>θ</m:t>
+              </m:r>
+            </m:den>
+          </m:f>
+          <m:r>
+            <m:rPr>
+              <m:sty m:val="p"/>
+            </m:rPr>
+            <m:t>,</m:t>
+          </m:r>
+          <m:r>
+            <m:t>  </m:t>
+          </m:r>
+          <m:r>
+            <m:t>p</m:t>
+          </m:r>
+          <m:r>
+            <m:rPr>
+              <m:sty m:val="p"/>
+            </m:rPr>
+            <m:t>=</m:t>
+          </m:r>
+          <m:r>
+            <m:t>a</m:t>
+          </m:r>
+          <m:d>
+            <m:dPr>
+              <m:begChr m:val="("/>
+              <m:sepChr m:val=""/>
+              <m:endChr m:val=")"/>
+              <m:grow/>
+            </m:dPr>
+            <m:e>
+              <m:r>
+                <m:t>1</m:t>
+              </m:r>
+              <m:r>
+                <m:rPr>
+                  <m:sty m:val="p"/>
+                </m:rPr>
+                <m:t>−</m:t>
+              </m:r>
+              <m:sSup>
+                <m:e>
+                  <m:r>
+                    <m:t>e</m:t>
+                  </m:r>
+                </m:e>
+                <m:sup>
+                  <m:r>
+                    <m:t>2</m:t>
+                  </m:r>
+                </m:sup>
+              </m:sSup>
+            </m:e>
+          </m:d>
+          <m:r>
+            <m:rPr>
+              <m:sty m:val="p"/>
+            </m:rPr>
+            <m:t>,</m:t>
+          </m:r>
+        </m:oMath>
+      </m:oMathPara>
+    </w:p>
+    <w:p>
+      <w:pPr>
+        <w:pStyle w:val="FirstParagraph"/>
+      </w:pPr>
+      <w:r>
+        <w:t xml:space="preserve">where</w:t>
+      </w:r>
+      <w:r>
+        <w:t xml:space="preserve"> </w:t>
+      </w:r>
+      <m:oMath>
+        <m:r>
+          <m:t>e</m:t>
+        </m:r>
+      </m:oMath>
+      <w:r>
+        <w:t xml:space="preserve"> </w:t>
+      </w:r>
+      <w:r>
+        <w:t xml:space="preserve">is the eccentricity,</w:t>
+      </w:r>
+      <w:r>
+        <w:t xml:space="preserve"> </w:t>
+      </w:r>
+      <m:oMath>
+        <m:r>
+          <m:t>θ</m:t>
+        </m:r>
+      </m:oMath>
+      <w:r>
+        <w:t xml:space="preserve"> </w:t>
+      </w:r>
+      <w:r>
+        <w:t xml:space="preserve">the true anomaly measured from perigee, and</w:t>
+      </w:r>
+      <w:r>
+        <w:t xml:space="preserve"> </w:t>
+      </w:r>
+      <m:oMath>
+        <m:r>
+          <m:t>p</m:t>
+        </m:r>
+      </m:oMath>
+      <w:r>
+        <w:t xml:space="preserve"> </w:t>
+      </w:r>
+      <w:r>
+        <w:t xml:space="preserve">the</w:t>
+      </w:r>
+      <w:r>
+        <w:t xml:space="preserve"> </w:t>
+      </w:r>
+      <w:r>
+        <w:t xml:space="preserve">semi-latus rectum. Bound orbits have</w:t>
+      </w:r>
+      <w:r>
+        <w:t xml:space="preserve"> </w:t>
+      </w:r>
+      <m:oMath>
+        <m:r>
+          <m:t>0</m:t>
+        </m:r>
+        <m:r>
+          <m:rPr>
+            <m:sty m:val="p"/>
+          </m:rPr>
+          <m:t>≤</m:t>
+        </m:r>
+        <m:r>
+          <m:t>e</m:t>
+        </m:r>
+        <m:r>
+          <m:rPr>
+            <m:sty m:val="p"/>
+          </m:rPr>
+          <m:t>&lt;</m:t>
+        </m:r>
+        <m:r>
+          <m:t>1</m:t>
+        </m:r>
+      </m:oMath>
+      <w:r>
+        <w:t xml:space="preserve">; the circular orbit used throughout this study is</w:t>
+      </w:r>
+      <w:r>
+        <w:t xml:space="preserve"> </w:t>
+      </w:r>
+      <w:r>
+        <w:t xml:space="preserve">the special case</w:t>
+      </w:r>
+      <w:r>
+        <w:t xml:space="preserve"> </w:t>
+      </w:r>
+      <m:oMath>
+        <m:r>
+          <m:t>e</m:t>
+        </m:r>
+        <m:r>
+          <m:rPr>
+            <m:sty m:val="p"/>
+          </m:rPr>
+          <m:t>=</m:t>
+        </m:r>
+        <m:r>
+          <m:t>0</m:t>
+        </m:r>
+      </m:oMath>
+      <w:r>
+        <w:t xml:space="preserve">, for which</w:t>
+      </w:r>
+      <w:r>
+        <w:t xml:space="preserve"> </w:t>
+      </w:r>
+      <m:oMath>
+        <m:r>
+          <m:t>r</m:t>
+        </m:r>
+        <m:r>
+          <m:rPr>
+            <m:sty m:val="p"/>
+          </m:rPr>
+          <m:t>=</m:t>
+        </m:r>
+        <m:r>
+          <m:t>a</m:t>
+        </m:r>
+      </m:oMath>
+      <w:r>
+        <w:t xml:space="preserve"> </w:t>
+      </w:r>
+      <w:r>
+        <w:t xml:space="preserve">is constant and (4.1) to (4.3) follow directly.</w:t>
+      </w:r>
+    </w:p>
+    <w:p>
+      <w:pPr>
+        <w:pStyle w:val="BodyText"/>
+      </w:pPr>
+      <w:r>
+        <w:rPr>
+          <w:b/>
+          <w:bCs/>
+        </w:rPr>
+        <w:t xml:space="preserve">Kepler’s third law.</w:t>
+      </w:r>
+      <w:r>
+        <w:t xml:space="preserve"> </w:t>
+      </w:r>
+      <w:r>
+        <w:t xml:space="preserve">For an ellipse of semi-axes</w:t>
+      </w:r>
+      <w:r>
+        <w:t xml:space="preserve"> </w:t>
+      </w:r>
+      <m:oMath>
+        <m:r>
+          <m:t>a</m:t>
+        </m:r>
+      </m:oMath>
+      <w:r>
+        <w:t xml:space="preserve"> </w:t>
+      </w:r>
+      <w:r>
+        <w:t xml:space="preserve">and</w:t>
+      </w:r>
+      <w:r>
+        <w:t xml:space="preserve"> </w:t>
+      </w:r>
+      <m:oMath>
+        <m:r>
+          <m:t>b</m:t>
+        </m:r>
+        <m:r>
+          <m:rPr>
+            <m:sty m:val="p"/>
+          </m:rPr>
+          <m:t>=</m:t>
+        </m:r>
+        <m:r>
+          <m:t>a</m:t>
+        </m:r>
+        <m:rad>
+          <m:radPr>
+            <m:degHide m:val="on"/>
+          </m:radPr>
+          <m:deg/>
+          <m:e>
+            <m:r>
+              <m:t>1</m:t>
+            </m:r>
+            <m:r>
+              <m:rPr>
+                <m:sty m:val="p"/>
+              </m:rPr>
+              <m:t>−</m:t>
+            </m:r>
+            <m:sSup>
+              <m:e>
+                <m:r>
+                  <m:t>e</m:t>
+                </m:r>
+              </m:e>
+              <m:sup>
+                <m:r>
+                  <m:t>2</m:t>
+                </m:r>
+              </m:sup>
+            </m:sSup>
+          </m:e>
+        </m:rad>
+      </m:oMath>
+      <w:r>
+        <w:t xml:space="preserve">, the constant</w:t>
+      </w:r>
+      <w:r>
+        <w:t xml:space="preserve"> </w:t>
+      </w:r>
+      <w:r>
+        <w:t xml:space="preserve">areal rate</w:t>
+      </w:r>
+      <w:r>
+        <w:t xml:space="preserve"> </w:t>
+      </w:r>
+      <m:oMath>
+        <m:acc>
+          <m:accPr>
+            <m:chr m:val="̇"/>
+          </m:accPr>
+          <m:e>
+            <m:r>
+              <m:t>A</m:t>
+            </m:r>
+          </m:e>
+        </m:acc>
+        <m:r>
+          <m:rPr>
+            <m:sty m:val="p"/>
+          </m:rPr>
+          <m:t>=</m:t>
+        </m:r>
+        <m:r>
+          <m:t>h</m:t>
+        </m:r>
+        <m:r>
+          <m:rPr>
+            <m:sty m:val="p"/>
+          </m:rPr>
+          <m:t>/</m:t>
+        </m:r>
+        <m:r>
+          <m:t>2</m:t>
+        </m:r>
+      </m:oMath>
+      <w:r>
+        <w:t xml:space="preserve"> </w:t>
+      </w:r>
+      <w:r>
+        <w:t xml:space="preserve">integrated over the enclosed area</w:t>
+      </w:r>
+      <w:r>
+        <w:t xml:space="preserve"> </w:t>
+      </w:r>
+      <m:oMath>
+        <m:r>
+          <m:t>π</m:t>
+        </m:r>
+        <m:r>
+          <m:t>a</m:t>
+        </m:r>
+        <m:r>
+          <m:t>b</m:t>
+        </m:r>
+      </m:oMath>
+      <w:r>
+        <w:t xml:space="preserve"> </w:t>
+      </w:r>
+      <w:r>
+        <w:t xml:space="preserve">gives the period</w:t>
+      </w:r>
+    </w:p>
+    <w:p>
+      <w:pPr>
+        <w:pStyle w:val="BodyText"/>
+      </w:pPr>
+      <m:oMathPara>
+        <m:oMathParaPr>
+          <m:jc m:val="center"/>
+        </m:oMathParaPr>
+        <m:oMath>
+          <m:r>
+            <m:t>T</m:t>
+          </m:r>
+          <m:r>
+            <m:rPr>
+              <m:sty m:val="p"/>
+            </m:rPr>
+            <m:t>=</m:t>
+          </m:r>
+          <m:r>
+            <m:t>2</m:t>
+          </m:r>
+          <m:r>
+            <m:t>π</m:t>
+          </m:r>
+          <m:rad>
+            <m:radPr>
+              <m:degHide m:val="on"/>
+            </m:radPr>
+            <m:deg/>
+            <m:e>
+              <m:f>
+                <m:fPr>
+                  <m:type m:val="bar"/>
+                </m:fPr>
+                <m:num>
+                  <m:sSup>
+                    <m:e>
+                      <m:r>
+                        <m:t>a</m:t>
+                      </m:r>
+                    </m:e>
+                    <m:sup>
+                      <m:r>
+                        <m:t>3</m:t>
+                      </m:r>
+                    </m:sup>
+                  </m:sSup>
+                </m:num>
+                <m:den>
+                  <m:r>
+                    <m:t>μ</m:t>
+                  </m:r>
+                </m:den>
+              </m:f>
+            </m:e>
+          </m:rad>
+          <m:r>
+            <m:rPr>
+              <m:sty m:val="p"/>
+            </m:rPr>
+            <m:t>,</m:t>
+          </m:r>
+        </m:oMath>
+      </m:oMathPara>
+    </w:p>
+    <w:p>
+      <w:pPr>
+        <w:pStyle w:val="FirstParagraph"/>
+      </w:pPr>
+      <w:r>
+        <w:t xml:space="preserve">independent of eccentricity, which is why the circular result (4.2) applies to the slightly</w:t>
+      </w:r>
+      <w:r>
+        <w:t xml:space="preserve"> </w:t>
+      </w:r>
+      <w:r>
+        <w:t xml:space="preserve">non-circular reference orbit without correction.</w:t>
+      </w:r>
+    </w:p>
+    <w:p>
+      <w:pPr>
+        <w:pStyle w:val="BodyText"/>
+      </w:pPr>
+      <w:r>
+        <w:rPr>
+          <w:b/>
+          <w:bCs/>
+        </w:rPr>
+        <w:t xml:space="preserve">Ground track and revisit.</w:t>
+      </w:r>
+      <w:r>
+        <w:t xml:space="preserve"> </w:t>
+      </w:r>
+      <w:r>
+        <w:t xml:space="preserve">Coverage planning needs the ground track, the locus of sub-satellite</w:t>
+      </w:r>
+      <w:r>
+        <w:t xml:space="preserve"> </w:t>
+      </w:r>
+      <w:r>
+        <w:t xml:space="preserve">points. While the satellite completes one orbit in time</w:t>
+      </w:r>
+      <w:r>
+        <w:t xml:space="preserve"> </w:t>
+      </w:r>
+      <m:oMath>
+        <m:r>
+          <m:t>T</m:t>
+        </m:r>
+      </m:oMath>
+      <w:r>
+        <w:t xml:space="preserve">, Earth turns beneath it at</w:t>
+      </w:r>
+      <w:r>
+        <w:t xml:space="preserve"> </w:t>
+      </w:r>
+      <m:oMath>
+        <m:sSub>
+          <m:e>
+            <m:r>
+              <m:t>ω</m:t>
+            </m:r>
+          </m:e>
+          <m:sub>
+            <m:r>
+              <m:rPr>
+                <m:sty m:val="p"/>
+              </m:rPr>
+              <m:t>⊕</m:t>
+            </m:r>
+          </m:sub>
+        </m:sSub>
+        <m:r>
+          <m:rPr>
+            <m:sty m:val="p"/>
+          </m:rPr>
+          <m:t>=</m:t>
+        </m:r>
+        <m:r>
+          <m:t>7.292</m:t>
+        </m:r>
+        <m:r>
+          <m:rPr>
+            <m:sty m:val="p"/>
+          </m:rPr>
+          <m:t>×</m:t>
+        </m:r>
+        <m:sSup>
+          <m:e>
+            <m:r>
+              <m:t>10</m:t>
+            </m:r>
+          </m:e>
+          <m:sup>
+            <m:r>
+              <m:rPr>
+                <m:sty m:val="p"/>
+              </m:rPr>
+              <m:t>−</m:t>
+            </m:r>
+            <m:r>
+              <m:t>5</m:t>
+            </m:r>
+          </m:sup>
+        </m:sSup>
+      </m:oMath>
+      <w:r>
+        <w:t xml:space="preserve"> </w:t>
+      </w:r>
+      <w:r>
+        <w:t xml:space="preserve">rad/s, so successive equator crossings step westward by</w:t>
+      </w:r>
+      <w:r>
+        <w:t xml:space="preserve"> </w:t>
+      </w:r>
+      <m:oMath>
+        <m:r>
+          <m:rPr>
+            <m:sty m:val="p"/>
+          </m:rPr>
+          <m:t>Δ</m:t>
+        </m:r>
+        <m:r>
+          <m:t>λ</m:t>
+        </m:r>
+        <m:r>
+          <m:rPr>
+            <m:sty m:val="p"/>
+          </m:rPr>
+          <m:t>=</m:t>
+        </m:r>
+        <m:sSub>
+          <m:e>
+            <m:r>
+              <m:t>ω</m:t>
+            </m:r>
+          </m:e>
+          <m:sub>
+            <m:r>
+              <m:rPr>
+                <m:sty m:val="p"/>
+              </m:rPr>
+              <m:t>⊕</m:t>
+            </m:r>
+          </m:sub>
+        </m:sSub>
+        <m:r>
+          <m:t>T</m:t>
+        </m:r>
+      </m:oMath>
+      <w:r>
+        <w:t xml:space="preserve">. A ground track repeats when an integer number of orbits</w:t>
+      </w:r>
+      <w:r>
+        <w:t xml:space="preserve"> </w:t>
+      </w:r>
+      <m:oMath>
+        <m:r>
+          <m:t>k</m:t>
+        </m:r>
+      </m:oMath>
+      <w:r>
+        <w:t xml:space="preserve"> </w:t>
+      </w:r>
+      <w:r>
+        <w:t xml:space="preserve">fills</w:t>
+      </w:r>
+      <w:r>
+        <w:t xml:space="preserve"> </w:t>
+      </w:r>
+      <w:r>
+        <w:t xml:space="preserve">an integer number</w:t>
+      </w:r>
+      <w:r>
+        <w:t xml:space="preserve"> </w:t>
+      </w:r>
+      <m:oMath>
+        <m:r>
+          <m:t>d</m:t>
+        </m:r>
+      </m:oMath>
+      <w:r>
+        <w:t xml:space="preserve"> </w:t>
+      </w:r>
+      <w:r>
+        <w:t xml:space="preserve">of nodal days,</w:t>
+      </w:r>
+      <w:r>
+        <w:t xml:space="preserve"> </w:t>
+      </w:r>
+      <m:oMath>
+        <m:r>
+          <m:t>k</m:t>
+        </m:r>
+        <m:r>
+          <m:t> </m:t>
+        </m:r>
+        <m:r>
+          <m:t>T</m:t>
+        </m:r>
+        <m:r>
+          <m:rPr>
+            <m:sty m:val="p"/>
+          </m:rPr>
+          <m:t>=</m:t>
+        </m:r>
+        <m:r>
+          <m:t>d</m:t>
+        </m:r>
+        <m:r>
+          <m:t> </m:t>
+        </m:r>
+        <m:r>
+          <m:rPr>
+            <m:sty m:val="p"/>
+          </m:rPr>
+          <m:t>(</m:t>
+        </m:r>
+        <m:r>
+          <m:t>2</m:t>
+        </m:r>
+        <m:r>
+          <m:t>π</m:t>
+        </m:r>
+        <m:r>
+          <m:rPr>
+            <m:sty m:val="p"/>
+          </m:rPr>
+          <m:t>/</m:t>
+        </m:r>
+        <m:sSub>
+          <m:e>
+            <m:r>
+              <m:t>ω</m:t>
+            </m:r>
+          </m:e>
+          <m:sub>
+            <m:r>
+              <m:rPr>
+                <m:sty m:val="p"/>
+              </m:rPr>
+              <m:t>⊕</m:t>
+            </m:r>
+          </m:sub>
+        </m:sSub>
+        <m:r>
+          <m:rPr>
+            <m:sty m:val="p"/>
+          </m:rPr>
+          <m:t>)</m:t>
+        </m:r>
+      </m:oMath>
+      <w:r>
+        <w:t xml:space="preserve">; for the reference orbit</w:t>
+      </w:r>
+      <w:r>
+        <w:t xml:space="preserve"> </w:t>
+      </w:r>
+      <m:oMath>
+        <m:r>
+          <m:rPr>
+            <m:sty m:val="p"/>
+          </m:rPr>
+          <m:t>Δ</m:t>
+        </m:r>
+        <m:r>
+          <m:t>λ</m:t>
+        </m:r>
+        <m:r>
+          <m:rPr>
+            <m:sty m:val="p"/>
+          </m:rPr>
+          <m:t>≈</m:t>
+        </m:r>
+        <m:sSup>
+          <m:e>
+            <m:r>
+              <m:t>24.4</m:t>
+            </m:r>
+          </m:e>
+          <m:sup>
+            <m:r>
+              <m:rPr>
+                <m:sty m:val="p"/>
+              </m:rPr>
+              <m:t>∘</m:t>
+            </m:r>
+          </m:sup>
+        </m:sSup>
+      </m:oMath>
+      <w:r>
+        <w:t xml:space="preserve"> </w:t>
+      </w:r>
+      <w:r>
+        <w:t xml:space="preserve">per revolution, and the near-15-orbit day sets the natural revisit</w:t>
+      </w:r>
+      <w:r>
+        <w:t xml:space="preserve"> </w:t>
+      </w:r>
+      <w:r>
+        <w:t xml:space="preserve">cadence over a given ground station (Chapter 14).</w:t>
       </w:r>
     </w:p>
     <w:p>

</xml_diff>